<commit_message>
feat: mandate code block output in prompt, fix nested TAB2 tags, pipe wordbox splitting, and inline PIC rendering
</commit_message>
<xml_diff>
--- a/output/uln_document.docx
+++ b/output/uln_document.docx
@@ -16,21 +16,24 @@
           <w:b/>
           <w:sz w:val="24"/>
         </w:rPr>
-        <w:t>SECTION A: PHONETICS</w:t>
-      </w:r>
-    </w:p>
-    <w:p>
-      <w:pPr>
+        <w:t>TEST FOR UNIT 1</w:t>
+      </w:r>
+    </w:p>
+    <w:p>
+      <w:pPr>
+        <w:keepNext/>
         <w:spacing w:before="120" w:after="80"/>
         <w:rPr>
-          <w:sz w:val="24"/>
-        </w:rPr>
-      </w:pPr>
-      <w:r>
-        <w:rPr>
-          <w:sz w:val="24"/>
-        </w:rPr>
-        <w:t>Choose the word whose underlined part is pronounced differently:</w:t>
+          <w:b/>
+          <w:sz w:val="24"/>
+        </w:rPr>
+      </w:pPr>
+      <w:r>
+        <w:rPr>
+          <w:b/>
+          <w:sz w:val="24"/>
+        </w:rPr>
+        <w:t>I. Choose the word whose underlined part is pronounced differently from the others.</w:t>
       </w:r>
     </w:p>
     <w:p>
@@ -65,63 +68,1304 @@
           <w:sz w:val="24"/>
           <w:u w:val="single"/>
         </w:rPr>
-        <w:t>c</w:t>
-      </w:r>
-      <w:r>
-        <w:rPr>
-          <w:sz w:val="24"/>
-        </w:rPr>
-        <w:t xml:space="preserve">at \t B. </w:t>
+        <w:t>e</w:t>
+      </w:r>
+      <w:r>
+        <w:rPr>
+          <w:sz w:val="24"/>
+        </w:rPr>
+        <w:t xml:space="preserve">xciting  B. </w:t>
       </w:r>
       <w:r>
         <w:rPr>
           <w:sz w:val="24"/>
           <w:u w:val="single"/>
         </w:rPr>
-        <w:t>c</w:t>
-      </w:r>
-      <w:r>
-        <w:rPr>
-          <w:sz w:val="24"/>
-        </w:rPr>
-        <w:t xml:space="preserve">ity \t C. </w:t>
+        <w:t>e</w:t>
+      </w:r>
+      <w:r>
+        <w:rPr>
+          <w:sz w:val="24"/>
+        </w:rPr>
+        <w:t xml:space="preserve">xcellent  C. </w:t>
       </w:r>
       <w:r>
         <w:rPr>
           <w:sz w:val="24"/>
           <w:u w:val="single"/>
         </w:rPr>
-        <w:t>c</w:t>
-      </w:r>
-      <w:r>
-        <w:rPr>
-          <w:sz w:val="24"/>
-        </w:rPr>
-        <w:t xml:space="preserve">ar \t D. </w:t>
+        <w:t>e</w:t>
+      </w:r>
+      <w:r>
+        <w:rPr>
+          <w:sz w:val="24"/>
+        </w:rPr>
+        <w:t xml:space="preserve">xperience  D. </w:t>
       </w:r>
       <w:r>
         <w:rPr>
           <w:sz w:val="24"/>
           <w:u w:val="single"/>
         </w:rPr>
-        <w:t>c</w:t>
-      </w:r>
-      <w:r>
-        <w:rPr>
-          <w:sz w:val="24"/>
-        </w:rPr>
-        <w:t>up</w:t>
-      </w:r>
-    </w:p>
-    <w:p>
-      <w:pPr>
+        <w:t>e</w:t>
+      </w:r>
+      <w:r>
+        <w:rPr>
+          <w:sz w:val="24"/>
+        </w:rPr>
+        <w:t>xpensive</w:t>
+      </w:r>
+    </w:p>
+    <w:p>
+      <w:pPr>
+        <w:spacing w:before="80" w:after="60"/>
+        <w:ind w:left="283"/>
+        <w:rPr>
+          <w:sz w:val="24"/>
+          <w:u w:val="single"/>
+        </w:rPr>
+      </w:pPr>
+      <w:r>
+        <w:rPr>
+          <w:sz w:val="24"/>
+        </w:rPr>
+        <w:t xml:space="preserve">2. </w:t>
+      </w:r>
+      <w:r>
+        <w:rPr>
+          <w:b/>
+          <w:sz w:val="24"/>
+        </w:rPr>
+        <w:t xml:space="preserve">A. </w:t>
+      </w:r>
+      <w:r>
+        <w:rPr>
+          <w:sz w:val="24"/>
+        </w:rPr>
+        <w:t xml:space="preserve"> hobb</w:t>
+      </w:r>
+      <w:r>
+        <w:rPr>
+          <w:sz w:val="24"/>
+          <w:u w:val="single"/>
+        </w:rPr>
+        <w:t xml:space="preserve">y  </w:t>
+      </w:r>
+      <w:r>
+        <w:rPr>
+          <w:b/>
+          <w:sz w:val="24"/>
+          <w:u w:val="single"/>
+        </w:rPr>
+        <w:t xml:space="preserve">B. </w:t>
+      </w:r>
+      <w:r>
+        <w:rPr>
+          <w:sz w:val="24"/>
+        </w:rPr>
+        <w:t xml:space="preserve"> c</w:t>
+      </w:r>
+      <w:r>
+        <w:rPr>
+          <w:sz w:val="24"/>
+          <w:u w:val="single"/>
+        </w:rPr>
+        <w:t>y</w:t>
+      </w:r>
+      <w:r>
+        <w:rPr>
+          <w:sz w:val="24"/>
+        </w:rPr>
+        <w:t>cle  C. b</w:t>
+      </w:r>
+      <w:r>
+        <w:rPr>
+          <w:sz w:val="24"/>
+          <w:u w:val="single"/>
+        </w:rPr>
+        <w:t>y</w:t>
+      </w:r>
+      <w:r>
+        <w:rPr>
+          <w:sz w:val="24"/>
+        </w:rPr>
+        <w:t>e  D. wh</w:t>
+      </w:r>
+      <w:r>
+        <w:rPr>
+          <w:sz w:val="24"/>
+          <w:u w:val="single"/>
+        </w:rPr>
+        <w:t>y</w:t>
+      </w:r>
+    </w:p>
+    <w:p>
+      <w:pPr>
+        <w:spacing w:before="80" w:after="60"/>
+        <w:ind w:left="283"/>
+        <w:rPr>
+          <w:sz w:val="24"/>
+        </w:rPr>
+      </w:pPr>
+      <w:r>
+        <w:rPr>
+          <w:sz w:val="24"/>
+          <w:u w:val="single"/>
+        </w:rPr>
+        <w:t xml:space="preserve">3. </w:t>
+      </w:r>
+      <w:r>
+        <w:rPr>
+          <w:b/>
+          <w:sz w:val="24"/>
+          <w:u w:val="single"/>
+        </w:rPr>
+        <w:t xml:space="preserve">A. </w:t>
+      </w:r>
+      <w:r>
+        <w:rPr>
+          <w:sz w:val="24"/>
+        </w:rPr>
+        <w:t xml:space="preserve"> p</w:t>
+      </w:r>
+      <w:r>
+        <w:rPr>
+          <w:sz w:val="24"/>
+          <w:u w:val="single"/>
+        </w:rPr>
+        <w:t>o</w:t>
+      </w:r>
+      <w:r>
+        <w:rPr>
+          <w:sz w:val="24"/>
+        </w:rPr>
+        <w:t>ttery  B. c</w:t>
+      </w:r>
+      <w:r>
+        <w:rPr>
+          <w:sz w:val="24"/>
+          <w:u w:val="single"/>
+        </w:rPr>
+        <w:t>o</w:t>
+      </w:r>
+      <w:r>
+        <w:rPr>
+          <w:sz w:val="24"/>
+        </w:rPr>
+        <w:t>llect  C. mel</w:t>
+      </w:r>
+      <w:r>
+        <w:rPr>
+          <w:sz w:val="24"/>
+          <w:u w:val="single"/>
+        </w:rPr>
+        <w:t>o</w:t>
+      </w:r>
+      <w:r>
+        <w:rPr>
+          <w:sz w:val="24"/>
+        </w:rPr>
+        <w:t>dy  D. m</w:t>
+      </w:r>
+      <w:r>
+        <w:rPr>
+          <w:sz w:val="24"/>
+          <w:u w:val="single"/>
+        </w:rPr>
+        <w:t>o</w:t>
+      </w:r>
+      <w:r>
+        <w:rPr>
+          <w:sz w:val="24"/>
+        </w:rPr>
+        <w:t>nopoly</w:t>
+      </w:r>
+    </w:p>
+    <w:p>
+      <w:pPr>
+        <w:spacing w:before="80" w:after="60"/>
+        <w:ind w:left="283"/>
+        <w:rPr>
+          <w:sz w:val="24"/>
+        </w:rPr>
+      </w:pPr>
+      <w:r>
+        <w:rPr>
+          <w:sz w:val="24"/>
+        </w:rPr>
+        <w:t xml:space="preserve">4. </w:t>
+      </w:r>
+      <w:r>
+        <w:rPr>
+          <w:b/>
+          <w:sz w:val="24"/>
+        </w:rPr>
+        <w:t xml:space="preserve">A. </w:t>
+      </w:r>
+      <w:r>
+        <w:rPr>
+          <w:sz w:val="24"/>
+        </w:rPr>
+        <w:t xml:space="preserve"> h</w:t>
+      </w:r>
+      <w:r>
+        <w:rPr>
+          <w:sz w:val="24"/>
+          <w:u w:val="single"/>
+        </w:rPr>
+        <w:t>ea</w:t>
+      </w:r>
+      <w:r>
+        <w:rPr>
+          <w:sz w:val="24"/>
+        </w:rPr>
+        <w:t>rd  B. b</w:t>
+      </w:r>
+      <w:r>
+        <w:rPr>
+          <w:sz w:val="24"/>
+          <w:u w:val="single"/>
+        </w:rPr>
+        <w:t>i</w:t>
+      </w:r>
+      <w:r>
+        <w:rPr>
+          <w:sz w:val="24"/>
+        </w:rPr>
+        <w:t>rd  C. w</w:t>
+      </w:r>
+      <w:r>
+        <w:rPr>
+          <w:sz w:val="24"/>
+          <w:u w:val="single"/>
+        </w:rPr>
+        <w:t>o</w:t>
+      </w:r>
+      <w:r>
+        <w:rPr>
+          <w:sz w:val="24"/>
+        </w:rPr>
+        <w:t>rld  D. pict</w:t>
+      </w:r>
+      <w:r>
+        <w:rPr>
+          <w:sz w:val="24"/>
+          <w:u w:val="single"/>
+        </w:rPr>
+        <w:t>u</w:t>
+      </w:r>
+      <w:r>
+        <w:rPr>
+          <w:sz w:val="24"/>
+        </w:rPr>
+        <w:t>re</w:t>
+      </w:r>
+    </w:p>
+    <w:p>
+      <w:pPr>
+        <w:spacing w:before="80" w:after="60"/>
+        <w:ind w:left="283"/>
+        <w:rPr>
+          <w:sz w:val="24"/>
+        </w:rPr>
+      </w:pPr>
+      <w:r>
+        <w:rPr>
+          <w:sz w:val="24"/>
+        </w:rPr>
+        <w:t xml:space="preserve">5. </w:t>
+      </w:r>
+      <w:r>
+        <w:rPr>
+          <w:b/>
+          <w:sz w:val="24"/>
+        </w:rPr>
+        <w:t xml:space="preserve">A. </w:t>
+      </w:r>
+      <w:r>
+        <w:rPr>
+          <w:sz w:val="24"/>
+        </w:rPr>
+        <w:t xml:space="preserve"> bird-wat</w:t>
+      </w:r>
+      <w:r>
+        <w:rPr>
+          <w:sz w:val="24"/>
+          <w:u w:val="single"/>
+        </w:rPr>
+        <w:t>ch</w:t>
+      </w:r>
+      <w:r>
+        <w:rPr>
+          <w:sz w:val="24"/>
+        </w:rPr>
+        <w:t xml:space="preserve">ing  B. </w:t>
+      </w:r>
+      <w:r>
+        <w:rPr>
+          <w:sz w:val="24"/>
+          <w:u w:val="single"/>
+        </w:rPr>
+        <w:t>ch</w:t>
+      </w:r>
+      <w:r>
+        <w:rPr>
+          <w:sz w:val="24"/>
+        </w:rPr>
+        <w:t>ildren  C. s</w:t>
+      </w:r>
+      <w:r>
+        <w:rPr>
+          <w:sz w:val="24"/>
+          <w:u w:val="single"/>
+        </w:rPr>
+        <w:t>ch</w:t>
+      </w:r>
+      <w:r>
+        <w:rPr>
+          <w:sz w:val="24"/>
+        </w:rPr>
+        <w:t xml:space="preserve">ool  D. </w:t>
+      </w:r>
+      <w:r>
+        <w:rPr>
+          <w:sz w:val="24"/>
+          <w:u w:val="single"/>
+        </w:rPr>
+        <w:t>ch</w:t>
+      </w:r>
+      <w:r>
+        <w:rPr>
+          <w:sz w:val="24"/>
+        </w:rPr>
+        <w:t>allenge</w:t>
+      </w:r>
+    </w:p>
+    <w:p>
+      <w:pPr>
+        <w:keepNext/>
+        <w:spacing w:before="120" w:after="80"/>
+        <w:rPr>
+          <w:b/>
+          <w:sz w:val="24"/>
+        </w:rPr>
+      </w:pPr>
+      <w:r>
+        <w:rPr>
+          <w:b/>
+          <w:sz w:val="24"/>
+        </w:rPr>
+        <w:t>III. Choose the best answer a, b, c, or d to complete the sentence.</w:t>
+      </w:r>
+    </w:p>
+    <w:p>
+      <w:pPr>
+        <w:keepNext/>
+        <w:spacing w:before="120" w:after="80"/>
+        <w:rPr>
+          <w:b/>
+          <w:sz w:val="24"/>
+        </w:rPr>
+      </w:pPr>
+      <w:r>
+        <w:rPr>
+          <w:b/>
+          <w:sz w:val="24"/>
+        </w:rPr>
+        <w:t>1. My father can make beautiful pieces of art ______ empty eggshells.</w:t>
+      </w:r>
+    </w:p>
+    <w:p>
+      <w:pPr>
+        <w:spacing w:before="80" w:after="60"/>
+        <w:ind w:left="283"/>
+        <w:rPr>
+          <w:sz w:val="24"/>
+        </w:rPr>
+      </w:pPr>
+      <w:r>
+        <w:rPr>
+          <w:b/>
+          <w:sz w:val="24"/>
+        </w:rPr>
+        <w:t xml:space="preserve">A. </w:t>
+      </w:r>
+      <w:r>
+        <w:rPr>
+          <w:sz w:val="24"/>
+        </w:rPr>
+        <w:t xml:space="preserve"> of  B. from  C. in  D. into</w:t>
+      </w:r>
+    </w:p>
+    <w:p>
+      <w:pPr>
+        <w:keepNext/>
+        <w:spacing w:before="120" w:after="80"/>
+        <w:rPr>
+          <w:b/>
+          <w:sz w:val="24"/>
+        </w:rPr>
+      </w:pPr>
+      <w:r>
+        <w:rPr>
+          <w:b/>
+          <w:sz w:val="24"/>
+        </w:rPr>
+        <w:t>2. Why don't you take ______ a new hobby?</w:t>
+      </w:r>
+    </w:p>
+    <w:p>
+      <w:pPr>
+        <w:spacing w:before="80" w:after="60"/>
+        <w:ind w:left="283"/>
+        <w:rPr>
+          <w:sz w:val="24"/>
+        </w:rPr>
+      </w:pPr>
+      <w:r>
+        <w:rPr>
+          <w:b/>
+          <w:sz w:val="24"/>
+        </w:rPr>
+        <w:t xml:space="preserve">A. </w:t>
+      </w:r>
+      <w:r>
+        <w:rPr>
+          <w:sz w:val="24"/>
+        </w:rPr>
+        <w:t xml:space="preserve"> up  B. in  C. over  D. after</w:t>
+      </w:r>
+    </w:p>
+    <w:p>
+      <w:pPr>
+        <w:keepNext/>
+        <w:spacing w:before="120" w:after="80"/>
+        <w:rPr>
+          <w:b/>
+          <w:sz w:val="24"/>
+        </w:rPr>
+      </w:pPr>
+      <w:r>
+        <w:rPr>
+          <w:b/>
+          <w:sz w:val="24"/>
+        </w:rPr>
+        <w:t>3. Collecting cars is a(n) ______ hobby. It costs a lot of money.</w:t>
+      </w:r>
+    </w:p>
+    <w:p>
+      <w:pPr>
+        <w:spacing w:before="80" w:after="60"/>
+        <w:ind w:left="283"/>
+        <w:rPr>
+          <w:sz w:val="24"/>
+        </w:rPr>
+      </w:pPr>
+      <w:r>
+        <w:rPr>
+          <w:b/>
+          <w:sz w:val="24"/>
+        </w:rPr>
+        <w:t xml:space="preserve">A. </w:t>
+      </w:r>
+      <w:r>
+        <w:rPr>
+          <w:sz w:val="24"/>
+        </w:rPr>
+        <w:t xml:space="preserve"> interesting  B. cheap  C. expensive  D. unusual</w:t>
+      </w:r>
+    </w:p>
+    <w:p>
+      <w:pPr>
+        <w:keepNext/>
+        <w:spacing w:before="120" w:after="80"/>
+        <w:rPr>
+          <w:b/>
+          <w:sz w:val="24"/>
+        </w:rPr>
+      </w:pPr>
+      <w:r>
+        <w:rPr>
+          <w:b/>
+          <w:sz w:val="24"/>
+        </w:rPr>
+        <w:t>4. More people are ______ birds today than ever before.</w:t>
+      </w:r>
+    </w:p>
+    <w:p>
+      <w:pPr>
+        <w:spacing w:before="80" w:after="60"/>
+        <w:ind w:left="283"/>
+        <w:rPr>
+          <w:sz w:val="24"/>
+        </w:rPr>
+      </w:pPr>
+      <w:r>
+        <w:rPr>
+          <w:b/>
+          <w:sz w:val="24"/>
+        </w:rPr>
+        <w:t xml:space="preserve">A. </w:t>
+      </w:r>
+      <w:r>
+        <w:rPr>
+          <w:sz w:val="24"/>
+        </w:rPr>
+        <w:t xml:space="preserve"> seeing  B. looking  C. hearing  D. watching</w:t>
+      </w:r>
+    </w:p>
+    <w:p>
+      <w:pPr>
+        <w:keepNext/>
+        <w:spacing w:before="120" w:after="80"/>
+        <w:rPr>
+          <w:b/>
+          <w:sz w:val="24"/>
+        </w:rPr>
+      </w:pPr>
+      <w:r>
+        <w:rPr>
+          <w:b/>
+          <w:sz w:val="24"/>
+        </w:rPr>
+        <w:t>IV. Complete the sentences with the correct form or tense of the verb play, go, do or collect.</w:t>
+      </w:r>
+    </w:p>
+    <w:p>
+      <w:pPr>
+        <w:spacing w:before="120" w:after="80"/>
+        <w:rPr>
+          <w:sz w:val="24"/>
+        </w:rPr>
+      </w:pPr>
+      <w:r>
+        <w:rPr>
+          <w:sz w:val="24"/>
+        </w:rPr>
+        <w:t>1. ______ Alex ______ computer games at the weekend?</w:t>
+      </w:r>
+    </w:p>
+    <w:p>
+      <w:pPr>
+        <w:keepNext/>
+        <w:spacing w:before="120" w:after="80"/>
+        <w:rPr>
+          <w:b/>
+          <w:sz w:val="24"/>
+        </w:rPr>
+      </w:pPr>
+      <w:r>
+        <w:rPr>
+          <w:b/>
+          <w:sz w:val="24"/>
+        </w:rPr>
+        <w:t>2. We ______ camping in Dam Sen Park yesterday.</w:t>
+      </w:r>
+    </w:p>
+    <w:p>
+      <w:pPr>
+        <w:spacing w:before="120" w:after="80"/>
+        <w:rPr>
+          <w:sz w:val="24"/>
+        </w:rPr>
+      </w:pPr>
+      <w:r>
+        <w:rPr>
+          <w:sz w:val="24"/>
+        </w:rPr>
+        <w:t>3. ______ you ______ coins some day in the future?</w:t>
+      </w:r>
+    </w:p>
+    <w:p>
+      <w:pPr>
+        <w:keepNext/>
+        <w:spacing w:before="120" w:after="80"/>
+        <w:rPr>
+          <w:b/>
+          <w:sz w:val="24"/>
+        </w:rPr>
+      </w:pPr>
+      <w:r>
+        <w:rPr>
+          <w:b/>
+          <w:sz w:val="24"/>
+        </w:rPr>
+        <w:t>4. Do you want ______ mountain biking with me this weekend?</w:t>
+      </w:r>
+    </w:p>
+    <w:p>
+      <w:pPr>
+        <w:keepNext/>
+        <w:spacing w:before="120" w:after="80"/>
+        <w:rPr>
+          <w:b/>
+          <w:sz w:val="24"/>
+        </w:rPr>
+      </w:pPr>
+      <w:r>
+        <w:rPr>
+          <w:b/>
+          <w:sz w:val="24"/>
+        </w:rPr>
+        <w:t>VI. There is one mistake in each sentence. Underline and correct the mistake.</w:t>
+      </w:r>
+    </w:p>
+    <w:p>
+      <w:pPr>
+        <w:keepNext/>
         <w:tabs>
-          <w:tab w:val="left" w:pos="2877"/>
-          <w:tab w:val="left" w:pos="4797"/>
-          <w:tab w:val="left" w:pos="6717"/>
+          <w:tab w:val="left" w:pos="4677"/>
+        </w:tabs>
+        <w:spacing w:before="60" w:after="60"/>
+        <w:rPr>
+          <w:sz w:val="24"/>
+        </w:rPr>
+      </w:pPr>
+      <w:r>
+        <w:rPr>
+          <w:sz w:val="24"/>
+        </w:rPr>
+        <w:t>1. Nam is my classmates. He watches TV every night.  ______</w:t>
+      </w:r>
+      <w:r>
+        <w:rPr>
+          <w:sz w:val="24"/>
+        </w:rPr>
+        <w:tab/>
+      </w:r>
+    </w:p>
+    <w:p>
+      <w:pPr>
+        <w:keepNext/>
+        <w:tabs>
+          <w:tab w:val="left" w:pos="4677"/>
+        </w:tabs>
+        <w:spacing w:before="60" w:after="60"/>
+        <w:rPr>
+          <w:sz w:val="24"/>
+        </w:rPr>
+      </w:pPr>
+      <w:r>
+        <w:rPr>
+          <w:sz w:val="24"/>
+        </w:rPr>
+        <w:t>2. I think collecting stamps are interesting.  ______</w:t>
+      </w:r>
+      <w:r>
+        <w:rPr>
+          <w:sz w:val="24"/>
+        </w:rPr>
+        <w:tab/>
+      </w:r>
+    </w:p>
+    <w:p>
+      <w:pPr>
+        <w:keepNext/>
+        <w:tabs>
+          <w:tab w:val="left" w:pos="4677"/>
+        </w:tabs>
+        <w:spacing w:before="60" w:after="60"/>
+        <w:rPr>
+          <w:sz w:val="24"/>
+        </w:rPr>
+      </w:pPr>
+      <w:r>
+        <w:rPr>
+          <w:sz w:val="24"/>
+        </w:rPr>
+        <w:t>3. My dad cooks very good. He loves preparing meals for our family.  ______</w:t>
+      </w:r>
+      <w:r>
+        <w:rPr>
+          <w:sz w:val="24"/>
+        </w:rPr>
+        <w:tab/>
+      </w:r>
+    </w:p>
+    <w:p>
+      <w:pPr>
+        <w:keepNext/>
+        <w:tabs>
+          <w:tab w:val="left" w:pos="4677"/>
+        </w:tabs>
+        <w:spacing w:before="60" w:after="60"/>
+        <w:rPr>
+          <w:sz w:val="24"/>
+        </w:rPr>
+      </w:pPr>
+      <w:r>
+        <w:rPr>
+          <w:sz w:val="24"/>
+        </w:rPr>
+        <w:t>4. I enjoy to ride my bike to school.  ______</w:t>
+      </w:r>
+      <w:r>
+        <w:rPr>
+          <w:sz w:val="24"/>
+        </w:rPr>
+        <w:tab/>
+      </w:r>
+    </w:p>
+    <w:p>
+      <w:pPr>
+        <w:keepNext/>
+        <w:spacing w:before="120" w:after="80"/>
+        <w:rPr>
+          <w:b/>
+          <w:sz w:val="24"/>
+        </w:rPr>
+      </w:pPr>
+      <w:r>
+        <w:rPr>
+          <w:b/>
+          <w:sz w:val="24"/>
+        </w:rPr>
+        <w:t>VIII. Choose the word which best fits each gap.</w:t>
+      </w:r>
+    </w:p>
+    <w:p>
+      <w:pPr>
+        <w:keepNext/>
+        <w:spacing w:before="120" w:after="120"/>
+        <w:ind w:left="567" w:right="567"/>
+        <w:rPr>
+          <w:i/>
+          <w:sz w:val="24"/>
+        </w:rPr>
+      </w:pPr>
+      <w:r>
+        <w:rPr>
+          <w:i/>
+          <w:sz w:val="24"/>
+        </w:rPr>
+        <w:t>Many people (1)______ crafting with paper. The materials are readily available and don't cost much; and no super special talents are needed. Anyone (2)______ be a paper crafter.</w:t>
+      </w:r>
+    </w:p>
+    <w:p>
+      <w:pPr>
+        <w:keepNext/>
+        <w:spacing w:before="120" w:after="120"/>
+        <w:ind w:left="567" w:right="567"/>
+        <w:rPr>
+          <w:i/>
+          <w:sz w:val="24"/>
+        </w:rPr>
+      </w:pPr>
+    </w:p>
+    <w:p>
+      <w:pPr>
+        <w:keepNext/>
+        <w:spacing w:before="120" w:after="120"/>
+        <w:ind w:left="567" w:right="567"/>
+        <w:rPr>
+          <w:i/>
+          <w:sz w:val="24"/>
+        </w:rPr>
+      </w:pPr>
+      <w:r>
+        <w:rPr>
+          <w:i/>
+          <w:sz w:val="24"/>
+        </w:rPr>
+        <w:t xml:space="preserve">There are many different paper craft techniques. Origami is one of ancient techniques developed in Japan where squares of paper are (3)______ and formed into various objects such as flowers, animals, and boxes. Card (4)______ is also a favourite paper craft technique. Birthday cards are the most popular greeting cards, </w:t>
+      </w:r>
+      <w:r>
+        <w:rPr>
+          <w:i/>
+          <w:sz w:val="24"/>
+        </w:rPr>
+        <w:lastRenderedPageBreak/>
+        <w:t>followed by Christmas cards. Receiving a (5)______ card is a special gift, because of the time and effort someone spent making it. It lets the recipient know just how much you care (6)______ them.</w:t>
+      </w:r>
+    </w:p>
+    <w:p>
+      <w:pPr>
+        <w:spacing w:before="80" w:after="60"/>
+        <w:ind w:left="283"/>
+        <w:rPr>
+          <w:sz w:val="24"/>
+        </w:rPr>
+      </w:pPr>
+      <w:r>
+        <w:rPr>
+          <w:sz w:val="24"/>
+        </w:rPr>
+        <w:t xml:space="preserve">1. </w:t>
+      </w:r>
+      <w:r>
+        <w:rPr>
+          <w:b/>
+          <w:sz w:val="24"/>
+        </w:rPr>
+        <w:t xml:space="preserve">A. </w:t>
+      </w:r>
+      <w:r>
+        <w:rPr>
+          <w:sz w:val="24"/>
+        </w:rPr>
+        <w:t xml:space="preserve"> enjoy  B. decide  C. want  D. learn</w:t>
+      </w:r>
+    </w:p>
+    <w:p>
+      <w:pPr>
+        <w:spacing w:before="80" w:after="60"/>
+        <w:ind w:left="283"/>
+        <w:rPr>
+          <w:sz w:val="24"/>
+        </w:rPr>
+      </w:pPr>
+      <w:r>
+        <w:rPr>
+          <w:sz w:val="24"/>
+        </w:rPr>
+        <w:t xml:space="preserve">2. </w:t>
+      </w:r>
+      <w:r>
+        <w:rPr>
+          <w:b/>
+          <w:sz w:val="24"/>
+        </w:rPr>
+        <w:t xml:space="preserve">A. </w:t>
+      </w:r>
+      <w:r>
+        <w:rPr>
+          <w:sz w:val="24"/>
+        </w:rPr>
+        <w:t xml:space="preserve"> must  B. should  C. can  D. will</w:t>
+      </w:r>
+    </w:p>
+    <w:p>
+      <w:pPr>
+        <w:spacing w:before="80" w:after="60"/>
+        <w:ind w:left="283"/>
+        <w:rPr>
+          <w:sz w:val="24"/>
+        </w:rPr>
+      </w:pPr>
+      <w:r>
+        <w:rPr>
+          <w:sz w:val="24"/>
+        </w:rPr>
+        <w:t xml:space="preserve">3. </w:t>
+      </w:r>
+      <w:r>
+        <w:rPr>
+          <w:b/>
+          <w:sz w:val="24"/>
+        </w:rPr>
+        <w:t xml:space="preserve">A. </w:t>
+      </w:r>
+      <w:r>
+        <w:rPr>
+          <w:sz w:val="24"/>
+        </w:rPr>
+        <w:t xml:space="preserve"> wrapped  B. folded  C. torn  D. taken</w:t>
+      </w:r>
+    </w:p>
+    <w:p>
+      <w:pPr>
+        <w:keepNext/>
+        <w:spacing w:before="120" w:after="80"/>
+        <w:rPr>
+          <w:b/>
+          <w:sz w:val="24"/>
+        </w:rPr>
+      </w:pPr>
+      <w:r>
+        <w:rPr>
+          <w:b/>
+          <w:sz w:val="24"/>
+        </w:rPr>
+        <w:t>X. Write sentences, using the cues given.</w:t>
+      </w:r>
+    </w:p>
+    <w:p>
+      <w:pPr>
+        <w:keepNext/>
+        <w:spacing w:before="120" w:after="80"/>
+        <w:rPr>
+          <w:b/>
+          <w:sz w:val="24"/>
+        </w:rPr>
+      </w:pPr>
+      <w:r>
+        <w:rPr>
+          <w:b/>
+          <w:sz w:val="24"/>
+        </w:rPr>
+        <w:t>1. I/ enjoy/ play/ sports/ because/ it/ good/ health</w:t>
+      </w:r>
+    </w:p>
+    <w:p>
+      <w:pPr>
+        <w:spacing w:before="80" w:after="60"/>
+        <w:ind w:left="283"/>
+        <w:rPr>
+          <w:sz w:val="24"/>
+        </w:rPr>
+      </w:pPr>
+      <w:r>
+        <w:rPr>
+          <w:sz w:val="24"/>
+        </w:rPr>
+        <w:t>__________________________________________________________________________________</w:t>
+      </w:r>
+    </w:p>
+    <w:p>
+      <w:pPr>
+        <w:spacing w:before="120" w:after="80"/>
+        <w:rPr>
+          <w:sz w:val="24"/>
+        </w:rPr>
+      </w:pPr>
+      <w:r>
+        <w:rPr>
+          <w:sz w:val="24"/>
+        </w:rPr>
+        <w:t>2. your children/ go/ camp/ every summer holiday?</w:t>
+      </w:r>
+    </w:p>
+    <w:p>
+      <w:pPr>
+        <w:spacing w:before="80" w:after="60"/>
+        <w:ind w:left="283"/>
+        <w:rPr>
+          <w:sz w:val="24"/>
+        </w:rPr>
+      </w:pPr>
+      <w:r>
+        <w:rPr>
+          <w:sz w:val="24"/>
+        </w:rPr>
+        <w:t>__________________________________________________________________________________</w:t>
+      </w:r>
+    </w:p>
+    <w:p>
+      <w:pPr>
+        <w:keepNext/>
+        <w:spacing w:before="120" w:after="80"/>
+        <w:rPr>
+          <w:b/>
+          <w:sz w:val="24"/>
+        </w:rPr>
+      </w:pPr>
+      <w:r>
+        <w:rPr>
+          <w:b/>
+          <w:sz w:val="24"/>
+        </w:rPr>
+        <w:t>3. I/ think/ photography/ can/ expensive hobby</w:t>
+      </w:r>
+    </w:p>
+    <w:p>
+      <w:pPr>
+        <w:spacing w:before="80" w:after="60"/>
+        <w:ind w:left="283"/>
+        <w:rPr>
+          <w:sz w:val="24"/>
+        </w:rPr>
+      </w:pPr>
+      <w:r>
+        <w:rPr>
+          <w:sz w:val="24"/>
+        </w:rPr>
+        <w:t>__________________________________________________________________________________</w:t>
+      </w:r>
+    </w:p>
+    <w:p>
+      <w:pPr>
+        <w:keepNext/>
+        <w:spacing w:before="360" w:after="240"/>
+        <w:rPr>
+          <w:sz w:val="24"/>
+        </w:rPr>
+      </w:pPr>
+      <w:r>
+        <w:rPr>
+          <w:b/>
+          <w:sz w:val="24"/>
+        </w:rPr>
+        <w:t xml:space="preserve">A. </w:t>
+      </w:r>
+      <w:r>
+        <w:rPr>
+          <w:sz w:val="24"/>
+        </w:rPr>
+        <w:t xml:space="preserve"> PHONETICS</w:t>
+      </w:r>
+    </w:p>
+    <w:p>
+      <w:pPr>
+        <w:keepNext/>
+        <w:spacing w:before="120" w:after="80"/>
+        <w:rPr>
+          <w:b/>
+          <w:sz w:val="24"/>
+        </w:rPr>
+      </w:pPr>
+      <w:r>
+        <w:rPr>
+          <w:b/>
+          <w:sz w:val="24"/>
+        </w:rPr>
+        <w:t>I. Underline the sound /f/ and circle the sound /v/.</w:t>
+      </w:r>
+    </w:p>
+    <w:p>
+      <w:pPr>
+        <w:spacing w:before="80" w:after="60"/>
+        <w:ind w:left="283"/>
+        <w:rPr>
+          <w:sz w:val="24"/>
+        </w:rPr>
+      </w:pPr>
+      <w:r>
+        <w:rPr>
+          <w:sz w:val="24"/>
+        </w:rPr>
+        <w:t>fun    fine    coffee    over    graph</w:t>
+      </w:r>
+    </w:p>
+    <w:p>
+      <w:pPr>
+        <w:spacing w:before="80" w:after="60"/>
+        <w:ind w:left="283"/>
+        <w:rPr>
+          <w:sz w:val="24"/>
+        </w:rPr>
+      </w:pPr>
+      <w:r>
+        <w:rPr>
+          <w:sz w:val="24"/>
+        </w:rPr>
+        <w:t>phone    brave    verb    stuff    clever</w:t>
+      </w:r>
+    </w:p>
+    <w:p>
+      <w:pPr>
+        <w:spacing w:before="80" w:after="60"/>
+        <w:ind w:left="283"/>
+        <w:rPr>
+          <w:sz w:val="24"/>
+        </w:rPr>
+      </w:pPr>
+      <w:r>
+        <w:rPr>
+          <w:sz w:val="24"/>
+        </w:rPr>
+        <w:t>enough    laughing    leaf    leave    vitamin</w:t>
+      </w:r>
+    </w:p>
+    <w:p>
+      <w:pPr>
+        <w:spacing w:before="80" w:after="60"/>
+        <w:ind w:left="283"/>
+        <w:rPr>
+          <w:sz w:val="24"/>
+        </w:rPr>
+      </w:pPr>
+      <w:r>
+        <w:rPr>
+          <w:sz w:val="24"/>
+        </w:rPr>
+        <w:t>view    few    valley    save    valve</w:t>
+      </w:r>
+    </w:p>
+    <w:p>
+      <w:pPr>
+        <w:keepNext/>
+        <w:spacing w:before="120" w:after="80"/>
+        <w:rPr>
+          <w:b/>
+          <w:sz w:val="24"/>
+        </w:rPr>
+      </w:pPr>
+      <w:r>
+        <w:rPr>
+          <w:b/>
+          <w:sz w:val="24"/>
+        </w:rPr>
+        <w:t>II. Say the sentences out loud. Then write the words with the sound /f/ and /v/ in the table.</w:t>
+      </w:r>
+    </w:p>
+    <w:p>
+      <w:pPr>
+        <w:keepNext/>
+        <w:spacing w:before="120" w:after="80"/>
+        <w:rPr>
+          <w:b/>
+          <w:sz w:val="24"/>
+        </w:rPr>
+      </w:pPr>
+      <w:r>
+        <w:rPr>
+          <w:b/>
+          <w:sz w:val="24"/>
+        </w:rPr>
+        <w:t>1. I feel so bad. Maybe I should take a rest for some minutes.</w:t>
+      </w:r>
+    </w:p>
+    <w:p>
+      <w:pPr>
+        <w:keepNext/>
+        <w:spacing w:before="120" w:after="80"/>
+        <w:rPr>
+          <w:b/>
+          <w:sz w:val="24"/>
+        </w:rPr>
+      </w:pPr>
+      <w:r>
+        <w:rPr>
+          <w:b/>
+          <w:sz w:val="24"/>
+        </w:rPr>
+        <w:t>2. His wife is laughing at the picture of the knight on the floor.</w:t>
+      </w:r>
+    </w:p>
+    <w:p>
+      <w:pPr>
+        <w:keepNext/>
+        <w:spacing w:before="120" w:after="80"/>
+        <w:rPr>
+          <w:b/>
+          <w:sz w:val="24"/>
+        </w:rPr>
+      </w:pPr>
+      <w:r>
+        <w:rPr>
+          <w:b/>
+          <w:sz w:val="24"/>
+        </w:rPr>
+        <w:t>3. Live our life and hold our fate.</w:t>
+      </w:r>
+    </w:p>
+    <w:p>
+      <w:pPr>
+        <w:keepNext/>
+        <w:spacing w:before="120" w:after="80"/>
+        <w:rPr>
+          <w:b/>
+          <w:sz w:val="24"/>
+        </w:rPr>
+      </w:pPr>
+      <w:r>
+        <w:rPr>
+          <w:b/>
+          <w:sz w:val="24"/>
+        </w:rPr>
+        <w:t>4. Which is the best movie in Fast and Furious series?</w:t>
+      </w:r>
+    </w:p>
+    <w:p>
+      <w:pPr>
+        <w:keepNext/>
+        <w:spacing w:before="120" w:after="80"/>
+        <w:rPr>
+          <w:b/>
+          <w:sz w:val="24"/>
+        </w:rPr>
+      </w:pPr>
+      <w:r>
+        <w:rPr>
+          <w:b/>
+          <w:sz w:val="24"/>
+        </w:rPr>
+        <w:t>5. The invitation cards are beautiful and creative.</w:t>
+      </w:r>
+    </w:p>
+    <w:p>
+      <w:pPr>
+        <w:keepNext/>
+        <w:spacing w:before="120" w:after="80"/>
+        <w:rPr>
+          <w:b/>
+          <w:sz w:val="24"/>
+        </w:rPr>
+      </w:pPr>
+      <w:r>
+        <w:rPr>
+          <w:b/>
+          <w:sz w:val="24"/>
+        </w:rPr>
+        <w:t>6. What animals have the rough skin? - Elephants, frogs, etc.</w:t>
+      </w:r>
+    </w:p>
+    <w:p>
+      <w:pPr>
+        <w:keepNext/>
+        <w:tabs>
+          <w:tab w:val="left" w:pos="4677"/>
+        </w:tabs>
+        <w:spacing w:before="60" w:after="60"/>
+        <w:rPr>
+          <w:sz w:val="24"/>
+        </w:rPr>
+      </w:pPr>
+      <w:r>
+        <w:rPr>
+          <w:sz w:val="24"/>
+        </w:rPr>
+        <w:t>/f/ | /v/</w:t>
+      </w:r>
+      <w:r>
+        <w:rPr>
+          <w:sz w:val="24"/>
+        </w:rPr>
+        <w:tab/>
+      </w:r>
+    </w:p>
+    <w:p>
+      <w:pPr>
+        <w:keepNext/>
+        <w:tabs>
+          <w:tab w:val="left" w:pos="4677"/>
+        </w:tabs>
+        <w:spacing w:before="60" w:after="60"/>
+        <w:rPr>
+          <w:sz w:val="24"/>
+        </w:rPr>
+      </w:pPr>
+      <w:r>
+        <w:rPr>
+          <w:sz w:val="24"/>
+        </w:rPr>
+        <w:t>_____ | _____</w:t>
+      </w:r>
+      <w:r>
+        <w:rPr>
+          <w:sz w:val="24"/>
+        </w:rPr>
+        <w:tab/>
+      </w:r>
+    </w:p>
+    <w:p>
+      <w:pPr>
+        <w:keepNext/>
+        <w:spacing w:before="120" w:after="80"/>
+        <w:rPr>
+          <w:b/>
+          <w:sz w:val="24"/>
+        </w:rPr>
+      </w:pPr>
+      <w:r>
+        <w:rPr>
+          <w:b/>
+          <w:sz w:val="24"/>
+        </w:rPr>
+        <w:t>I. Look at the pictures and name the activities.</w:t>
+      </w:r>
+    </w:p>
+    <w:p>
+      <w:pPr>
+        <w:keepNext/>
+        <w:tabs>
+          <w:tab w:val="left" w:pos="2637"/>
+          <w:tab w:val="left" w:pos="4077"/>
+          <w:tab w:val="left" w:pos="5517"/>
+          <w:tab w:val="left" w:pos="6957"/>
         </w:tabs>
         <w:spacing w:before="80" w:after="0" w:line="240" w:lineRule="auto"/>
-        <w:ind w:left="957"/>
+        <w:ind w:left="1197"/>
         <w:rPr>
           <w:b/>
           <w:sz w:val="24"/>
@@ -136,18 +1380,18 @@
         <mc:AlternateContent>
           <mc:Choice Requires="wps">
             <w:drawing>
-              <wp:anchor distT="0" distB="0" distL="114300" distR="114300" simplePos="0" relativeHeight="251659264" behindDoc="0" locked="0" layoutInCell="1" allowOverlap="1" wp14:anchorId="035A3BCE" wp14:editId="68C7F5EB">
+              <wp:anchor distT="0" distB="0" distL="114300" distR="114300" simplePos="0" relativeHeight="251659264" behindDoc="0" locked="0" layoutInCell="1" allowOverlap="1">
                 <wp:simplePos x="0" y="0"/>
                 <wp:positionH relativeFrom="margin">
-                  <wp:posOffset>531495</wp:posOffset>
+                  <wp:posOffset>683895</wp:posOffset>
                 </wp:positionH>
                 <wp:positionV relativeFrom="paragraph">
                   <wp:posOffset>-76200</wp:posOffset>
                 </wp:positionV>
-                <wp:extent cx="4876800" cy="762000"/>
-                <wp:effectExtent l="0" t="0" r="19050" b="19050"/>
+                <wp:extent cx="4572000" cy="965200"/>
+                <wp:effectExtent l="0" t="0" r="19050" b="25400"/>
                 <wp:wrapNone/>
-                <wp:docPr id="246447987" name="Rectangle: Rounded Corners 1"/>
+                <wp:docPr id="2070517684" name="Rectangle: Rounded Corners 1"/>
                 <wp:cNvGraphicFramePr/>
                 <a:graphic xmlns:a="http://schemas.openxmlformats.org/drawingml/2006/main">
                   <a:graphicData uri="http://schemas.microsoft.com/office/word/2010/wordprocessingShape">
@@ -156,7 +1400,7 @@
                       <wps:spPr>
                         <a:xfrm>
                           <a:off x="0" y="0"/>
-                          <a:ext cx="4876800" cy="762000"/>
+                          <a:ext cx="4572000" cy="965200"/>
                         </a:xfrm>
                         <a:prstGeom prst="roundRect">
                           <a:avLst/>
@@ -210,7 +1454,7 @@
           </mc:Choice>
           <mc:Fallback>
             <w:pict>
-              <v:roundrect w14:anchorId="7ECABA82" id="Rectangle: Rounded Corners 1" o:spid="_x0000_s1026" style="position:absolute;margin-left:41.85pt;margin-top:-6pt;width:384pt;height:60pt;z-index:251659264;visibility:visible;mso-wrap-style:square;mso-wrap-distance-left:9pt;mso-wrap-distance-top:0;mso-wrap-distance-right:9pt;mso-wrap-distance-bottom:0;mso-position-horizontal:absolute;mso-position-horizontal-relative:margin;mso-position-vertical:absolute;mso-position-vertical-relative:text;v-text-anchor:middle" arcsize="10923f" o:gfxdata="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" filled="f" fillcolor="#156082 [3204]" strokeweight="1pt">
+              <v:roundrect w14:anchorId="7352CDD4" id="Rectangle: Rounded Corners 1" o:spid="_x0000_s1026" style="position:absolute;margin-left:53.85pt;margin-top:-6pt;width:5in;height:76pt;z-index:251659264;visibility:visible;mso-wrap-style:square;mso-wrap-distance-left:9pt;mso-wrap-distance-top:0;mso-wrap-distance-right:9pt;mso-wrap-distance-bottom:0;mso-position-horizontal:absolute;mso-position-horizontal-relative:margin;mso-position-vertical:absolute;mso-position-vertical-relative:text;v-text-anchor:middle" arcsize="10923f" o:gfxdata="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" filled="f" fillcolor="#156082 [3204]" strokeweight="1pt">
                 <v:stroke joinstyle="miter"/>
                 <w10:wrap anchorx="margin"/>
               </v:roundrect>
@@ -223,7 +1467,7 @@
           <w:b/>
           <w:sz w:val="24"/>
         </w:rPr>
-        <w:t>**Word</w:t>
+        <w:t>cooking</w:t>
       </w:r>
       <w:r>
         <w:rPr>
@@ -236,7 +1480,7 @@
           <w:b/>
           <w:sz w:val="24"/>
         </w:rPr>
-        <w:t>Bank:**</w:t>
+        <w:t>|</w:t>
       </w:r>
       <w:r>
         <w:rPr>
@@ -249,7 +1493,7 @@
           <w:b/>
           <w:sz w:val="24"/>
         </w:rPr>
-        <w:t>[</w:t>
+        <w:t>horse</w:t>
       </w:r>
       <w:r>
         <w:rPr>
@@ -262,23 +1506,64 @@
           <w:b/>
           <w:sz w:val="24"/>
         </w:rPr>
-        <w:t>photosynthesis</w:t>
-      </w:r>
-    </w:p>
-    <w:p>
-      <w:pPr>
+        <w:t>riding</w:t>
+      </w:r>
+      <w:r>
+        <w:rPr>
+          <w:sz w:val="24"/>
+        </w:rPr>
+        <w:tab/>
+      </w:r>
+      <w:r>
+        <w:rPr>
+          <w:b/>
+          <w:sz w:val="24"/>
+        </w:rPr>
+        <w:t>|</w:t>
+      </w:r>
+    </w:p>
+    <w:p>
+      <w:pPr>
+        <w:keepNext/>
         <w:tabs>
-          <w:tab w:val="left" w:pos="2877"/>
-          <w:tab w:val="left" w:pos="4797"/>
-          <w:tab w:val="left" w:pos="6717"/>
+          <w:tab w:val="left" w:pos="2637"/>
+          <w:tab w:val="left" w:pos="4077"/>
+          <w:tab w:val="left" w:pos="5517"/>
+          <w:tab w:val="left" w:pos="6957"/>
         </w:tabs>
         <w:spacing w:before="80" w:after="0" w:line="240" w:lineRule="auto"/>
-        <w:ind w:left="957"/>
-        <w:rPr>
-          <w:b/>
-          <w:sz w:val="24"/>
-        </w:rPr>
-      </w:pPr>
+        <w:ind w:left="1197"/>
+        <w:rPr>
+          <w:b/>
+          <w:sz w:val="24"/>
+        </w:rPr>
+      </w:pPr>
+      <w:r>
+        <w:rPr>
+          <w:b/>
+          <w:sz w:val="24"/>
+        </w:rPr>
+        <w:t>collecting</w:t>
+      </w:r>
+      <w:r>
+        <w:rPr>
+          <w:sz w:val="24"/>
+        </w:rPr>
+        <w:tab/>
+      </w:r>
+      <w:r>
+        <w:rPr>
+          <w:b/>
+          <w:sz w:val="24"/>
+        </w:rPr>
+        <w:t>coins</w:t>
+      </w:r>
+      <w:r>
+        <w:rPr>
+          <w:sz w:val="24"/>
+        </w:rPr>
+        <w:tab/>
+      </w:r>
       <w:r>
         <w:rPr>
           <w:b/>
@@ -297,7 +1582,7 @@
           <w:b/>
           <w:sz w:val="24"/>
         </w:rPr>
-        <w:t>chlorophyll</w:t>
+        <w:t>jogging</w:t>
       </w:r>
       <w:r>
         <w:rPr>
@@ -312,6 +1597,30 @@
         </w:rPr>
         <w:t>|</w:t>
       </w:r>
+    </w:p>
+    <w:p>
+      <w:pPr>
+        <w:keepNext/>
+        <w:tabs>
+          <w:tab w:val="left" w:pos="2637"/>
+          <w:tab w:val="left" w:pos="4077"/>
+          <w:tab w:val="left" w:pos="5517"/>
+          <w:tab w:val="left" w:pos="6957"/>
+        </w:tabs>
+        <w:spacing w:before="80" w:after="0" w:line="240" w:lineRule="auto"/>
+        <w:ind w:left="1197"/>
+        <w:rPr>
+          <w:b/>
+          <w:sz w:val="24"/>
+        </w:rPr>
+      </w:pPr>
+      <w:r>
+        <w:rPr>
+          <w:b/>
+          <w:sz w:val="24"/>
+        </w:rPr>
+        <w:t>making</w:t>
+      </w:r>
       <w:r>
         <w:rPr>
           <w:sz w:val="24"/>
@@ -323,74 +1632,280 @@
           <w:b/>
           <w:sz w:val="24"/>
         </w:rPr>
-        <w:t>sunlight</w:t>
-      </w:r>
-    </w:p>
-    <w:p>
-      <w:pPr>
+        <w:t>models</w:t>
+      </w:r>
+      <w:r>
+        <w:rPr>
+          <w:sz w:val="24"/>
+        </w:rPr>
+        <w:tab/>
+      </w:r>
+      <w:r>
+        <w:rPr>
+          <w:b/>
+          <w:sz w:val="24"/>
+        </w:rPr>
+        <w:t>|</w:t>
+      </w:r>
+      <w:r>
+        <w:rPr>
+          <w:sz w:val="24"/>
+        </w:rPr>
+        <w:tab/>
+      </w:r>
+      <w:r>
+        <w:rPr>
+          <w:b/>
+          <w:sz w:val="24"/>
+        </w:rPr>
+        <w:t>building</w:t>
+      </w:r>
+      <w:r>
+        <w:rPr>
+          <w:sz w:val="24"/>
+        </w:rPr>
+        <w:tab/>
+      </w:r>
+      <w:r>
+        <w:rPr>
+          <w:b/>
+          <w:sz w:val="24"/>
+        </w:rPr>
+        <w:t>dollhouses</w:t>
+      </w:r>
+    </w:p>
+    <w:p>
+      <w:pPr>
+        <w:keepNext/>
         <w:tabs>
-          <w:tab w:val="left" w:pos="2877"/>
-          <w:tab w:val="left" w:pos="4797"/>
-          <w:tab w:val="left" w:pos="6717"/>
+          <w:tab w:val="left" w:pos="2637"/>
+          <w:tab w:val="left" w:pos="4077"/>
+          <w:tab w:val="left" w:pos="5517"/>
+          <w:tab w:val="left" w:pos="6957"/>
         </w:tabs>
         <w:spacing w:before="80" w:after="0" w:line="480" w:lineRule="auto"/>
-        <w:ind w:left="957"/>
-        <w:rPr>
-          <w:b/>
-          <w:sz w:val="24"/>
-        </w:rPr>
-      </w:pPr>
-      <w:r>
-        <w:rPr>
-          <w:b/>
-          <w:sz w:val="24"/>
-        </w:rPr>
-        <w:t>]</w:t>
-      </w:r>
-    </w:p>
-    <w:p>
-      <w:pPr>
-        <w:keepNext/>
+        <w:ind w:left="1197"/>
+        <w:rPr>
+          <w:b/>
+          <w:sz w:val="24"/>
+        </w:rPr>
+      </w:pPr>
+      <w:r>
+        <w:rPr>
+          <w:b/>
+          <w:sz w:val="24"/>
+        </w:rPr>
+        <w:t>|</w:t>
+      </w:r>
+      <w:r>
+        <w:rPr>
+          <w:sz w:val="24"/>
+        </w:rPr>
+        <w:tab/>
+      </w:r>
+      <w:r>
+        <w:rPr>
+          <w:b/>
+          <w:sz w:val="24"/>
+        </w:rPr>
+        <w:t>gardening</w:t>
+      </w:r>
+      <w:r>
+        <w:rPr>
+          <w:sz w:val="24"/>
+        </w:rPr>
+        <w:tab/>
+      </w:r>
+      <w:r>
+        <w:rPr>
+          <w:b/>
+          <w:sz w:val="24"/>
+        </w:rPr>
+        <w:t>|</w:t>
+      </w:r>
+      <w:r>
+        <w:rPr>
+          <w:sz w:val="24"/>
+        </w:rPr>
+        <w:tab/>
+      </w:r>
+      <w:r>
+        <w:rPr>
+          <w:b/>
+          <w:sz w:val="24"/>
+        </w:rPr>
+        <w:t>doing</w:t>
+      </w:r>
+      <w:r>
+        <w:rPr>
+          <w:sz w:val="24"/>
+        </w:rPr>
+        <w:tab/>
+      </w:r>
+      <w:r>
+        <w:rPr>
+          <w:b/>
+          <w:sz w:val="24"/>
+        </w:rPr>
+        <w:t>yoga</w:t>
+      </w:r>
+    </w:p>
+    <w:p>
+      <w:pPr>
+        <w:spacing w:before="80" w:after="60" w:line="240" w:lineRule="auto"/>
+        <w:ind w:left="283"/>
+        <w:rPr>
+          <w:sz w:val="24"/>
+        </w:rPr>
+      </w:pPr>
+      <w:r>
+        <w:rPr>
+          <w:sz w:val="24"/>
+        </w:rPr>
+        <w:t>1. [PIC: "A child making models" | pos:inline | size:small] _____</w:t>
+      </w:r>
+    </w:p>
+    <w:p>
+      <w:pPr>
+        <w:spacing w:before="80" w:after="60" w:line="240" w:lineRule="auto"/>
+        <w:ind w:left="283"/>
+        <w:rPr>
+          <w:sz w:val="24"/>
+        </w:rPr>
+      </w:pPr>
+      <w:r>
+        <w:rPr>
+          <w:sz w:val="24"/>
+        </w:rPr>
+        <w:t>2. [PIC: "A child with a dollhouse" | pos:inline | size:small] _____</w:t>
+      </w:r>
+    </w:p>
+    <w:p>
+      <w:pPr>
+        <w:spacing w:before="80" w:after="60" w:line="240" w:lineRule="auto"/>
+        <w:ind w:left="283"/>
+        <w:rPr>
+          <w:sz w:val="24"/>
+        </w:rPr>
+      </w:pPr>
+      <w:r>
+        <w:rPr>
+          <w:sz w:val="24"/>
+        </w:rPr>
+        <w:t>3. [PIC: "Hands gardening a plant" | pos:inline | size:small] _____</w:t>
+      </w:r>
+    </w:p>
+    <w:p>
+      <w:pPr>
+        <w:spacing w:before="80" w:after="60" w:line="240" w:lineRule="auto"/>
+        <w:ind w:left="283"/>
+        <w:rPr>
+          <w:sz w:val="24"/>
+        </w:rPr>
+      </w:pPr>
+      <w:r>
+        <w:rPr>
+          <w:sz w:val="24"/>
+        </w:rPr>
+        <w:t>4. [PIC: "A person cooking" | pos:inline | size:small] _____</w:t>
+      </w:r>
+    </w:p>
+    <w:p>
+      <w:pPr>
+        <w:spacing w:before="80" w:after="60" w:line="240" w:lineRule="auto"/>
+        <w:ind w:left="283"/>
+        <w:rPr>
+          <w:sz w:val="24"/>
+        </w:rPr>
+      </w:pPr>
+      <w:r>
+        <w:rPr>
+          <w:sz w:val="24"/>
+        </w:rPr>
+        <w:t>5. [PIC: "A person doing yoga outdoors" | pos:inline | size:small] _____</w:t>
+      </w:r>
+    </w:p>
+    <w:p>
+      <w:pPr>
+        <w:spacing w:before="80" w:after="60" w:line="240" w:lineRule="auto"/>
+        <w:ind w:left="283"/>
+        <w:rPr>
+          <w:sz w:val="24"/>
+        </w:rPr>
+      </w:pPr>
+      <w:r>
+        <w:rPr>
+          <w:sz w:val="24"/>
+        </w:rPr>
+        <w:t>6. [PIC: "Two people jogging" | pos:inline | size:small] _____</w:t>
+      </w:r>
+    </w:p>
+    <w:p>
+      <w:pPr>
+        <w:spacing w:before="80" w:after="60" w:line="240" w:lineRule="auto"/>
+        <w:ind w:left="283"/>
+        <w:rPr>
+          <w:sz w:val="24"/>
+        </w:rPr>
+      </w:pPr>
+      <w:r>
+        <w:rPr>
+          <w:sz w:val="24"/>
+        </w:rPr>
+        <w:t>7. [PIC: "A close-up of collecting coins" | pos:inline | size:small] _____</w:t>
+      </w:r>
+    </w:p>
+    <w:p>
+      <w:pPr>
+        <w:spacing w:before="80" w:after="60" w:line="240" w:lineRule="auto"/>
+        <w:ind w:left="283"/>
+        <w:rPr>
+          <w:sz w:val="24"/>
+        </w:rPr>
+      </w:pPr>
+      <w:r>
+        <w:rPr>
+          <w:sz w:val="24"/>
+        </w:rPr>
+        <w:t>8. [PIC: "A person horse riding" | pos:inline | size:small] _____</w:t>
+      </w:r>
+    </w:p>
+    <w:p>
+      <w:pPr>
         <w:spacing w:before="120" w:after="80" w:line="240" w:lineRule="auto"/>
         <w:rPr>
-          <w:b/>
-          <w:sz w:val="24"/>
-        </w:rPr>
-      </w:pPr>
-      <w:r>
-        <w:rPr>
-          <w:b/>
-          <w:sz w:val="24"/>
-        </w:rPr>
-        <w:t>2. Look at the diagram and answer:</w:t>
-      </w:r>
-    </w:p>
-    <w:p>
-      <w:pPr>
-        <w:keepNext/>
+          <w:sz w:val="24"/>
+        </w:rPr>
+      </w:pPr>
+      <w:r>
+        <w:rPr>
+          <w:b/>
+          <w:sz w:val="24"/>
+        </w:rPr>
+        <w:t xml:space="preserve">A. </w:t>
+      </w:r>
+      <w:r>
+        <w:rPr>
+          <w:sz w:val="24"/>
+        </w:rPr>
+        <w:t xml:space="preserve"> Match each word with its meaning.</w:t>
+      </w:r>
+    </w:p>
+    <w:p>
+      <w:pPr>
         <w:tabs>
           <w:tab w:val="left" w:pos="4677"/>
         </w:tabs>
         <w:spacing w:before="60" w:after="60" w:line="240" w:lineRule="auto"/>
         <w:rPr>
-          <w:b/>
-          <w:i/>
-          <w:color w:val="808080"/>
-          <w:sz w:val="20"/>
-        </w:rPr>
-      </w:pPr>
-      <w:r>
-        <w:rPr>
-          <w:b/>
-          <w:sz w:val="24"/>
-        </w:rPr>
-        <w:t xml:space="preserve">A) </w:t>
-      </w:r>
-      <w:r>
-        <w:rPr>
-          <w:sz w:val="24"/>
-        </w:rPr>
-        <w:t xml:space="preserve"> Identify the labeled organ: ____ \t [PIC: "Labeled diagram of a plant leaf" | pos:right | size:medium]</w:t>
+          <w:sz w:val="24"/>
+        </w:rPr>
+      </w:pPr>
+      <w:r>
+        <w:rPr>
+          <w:sz w:val="24"/>
+        </w:rPr>
+        <w:t>1. rest  A. an activity that you enjoy doing</w:t>
       </w:r>
       <w:r>
         <w:rPr>
@@ -398,157 +1913,137 @@
         </w:rPr>
         <w:tab/>
       </w:r>
-      <w:r>
-        <w:rPr>
-          <w:rFonts w:ascii="Segoe UI Emoji" w:hAnsi="Segoe UI Emoji" w:cs="Segoe UI Emoji"/>
-          <w:b/>
-          <w:i/>
-          <w:color w:val="808080"/>
-          <w:sz w:val="20"/>
-        </w:rPr>
-        <w:t>🖼️</w:t>
-      </w:r>
-      <w:r>
-        <w:rPr>
-          <w:b/>
-          <w:i/>
-          <w:color w:val="808080"/>
-          <w:sz w:val="20"/>
-        </w:rPr>
-        <w:t xml:space="preserve"> [ DIAGRAM / IMAGE: Labeled diagram of a plant leaf ]</w:t>
-      </w:r>
-    </w:p>
-    <w:p>
-      <w:pPr>
+    </w:p>
+    <w:p>
+      <w:pPr>
+        <w:tabs>
+          <w:tab w:val="left" w:pos="4677"/>
+        </w:tabs>
         <w:spacing w:before="60" w:after="60" w:line="240" w:lineRule="auto"/>
-        <w:ind w:left="567"/>
-        <w:rPr>
-          <w:sz w:val="24"/>
-        </w:rPr>
-      </w:pPr>
-      <w:r>
-        <w:rPr>
-          <w:sz w:val="24"/>
-        </w:rPr>
-        <w:t>i) What gas is released? ____</w:t>
-      </w:r>
-    </w:p>
-    <w:p>
-      <w:pPr>
-        <w:spacing w:before="120" w:after="120" w:line="240" w:lineRule="auto"/>
-        <w:ind w:left="567" w:right="567"/>
-        <w:rPr>
-          <w:i/>
-          <w:sz w:val="24"/>
-        </w:rPr>
-      </w:pPr>
-      <w:r>
-        <w:rPr>
-          <w:i/>
-          <w:sz w:val="24"/>
-        </w:rPr>
-        <w:t>Reading Passage:</w:t>
-      </w:r>
-    </w:p>
-    <w:p>
-      <w:pPr>
-        <w:spacing w:before="120" w:after="120" w:line="240" w:lineRule="auto"/>
-        <w:ind w:left="567" w:right="567"/>
-        <w:rPr>
-          <w:i/>
-          <w:sz w:val="24"/>
-        </w:rPr>
-      </w:pPr>
-      <w:r>
-        <w:rPr>
-          <w:i/>
-          <w:sz w:val="24"/>
-        </w:rPr>
-        <w:t xml:space="preserve">Photosynthesis is the chemical process by which plants use </w:t>
-      </w:r>
-      <w:r>
-        <w:rPr>
-          <w:b/>
-          <w:i/>
-          <w:sz w:val="24"/>
-        </w:rPr>
-        <w:t>sunlight</w:t>
-      </w:r>
-      <w:r>
-        <w:rPr>
-          <w:i/>
-          <w:sz w:val="24"/>
-        </w:rPr>
-        <w:t xml:space="preserve"> to synthesize nutrients from carbon dioxide and water.</w:t>
-      </w:r>
-    </w:p>
-    <w:p>
-      <w:pPr>
-        <w:keepNext/>
-        <w:spacing w:before="280" w:line="240" w:lineRule="auto"/>
-        <w:rPr>
-          <w:b/>
-          <w:sz w:val="24"/>
-        </w:rPr>
-      </w:pPr>
-      <w:r>
-        <w:rPr>
-          <w:b/>
-          <w:sz w:val="24"/>
-        </w:rPr>
-        <w:t>SECTION B: MULTIPLE CHOICE</w:t>
-      </w:r>
-    </w:p>
-    <w:p>
-      <w:pPr>
-        <w:keepNext/>
-        <w:spacing w:before="120" w:after="80" w:line="240" w:lineRule="auto"/>
-        <w:rPr>
-          <w:b/>
-          <w:sz w:val="24"/>
-        </w:rPr>
-      </w:pPr>
-      <w:r>
-        <w:rPr>
-          <w:b/>
-          <w:sz w:val="24"/>
-        </w:rPr>
-        <w:t>3. Water boils at ____ degrees Celsius under standard atmospheric pressure.</w:t>
-      </w:r>
-    </w:p>
-    <w:p>
-      <w:pPr>
-        <w:spacing w:before="80" w:after="60" w:line="240" w:lineRule="auto"/>
-        <w:ind w:left="283"/>
-        <w:rPr>
-          <w:sz w:val="24"/>
-        </w:rPr>
-      </w:pPr>
-      <w:r>
-        <w:rPr>
-          <w:b/>
-          <w:sz w:val="24"/>
-        </w:rPr>
-        <w:t xml:space="preserve">A. </w:t>
-      </w:r>
-      <w:r>
-        <w:rPr>
-          <w:sz w:val="24"/>
-        </w:rPr>
-        <w:t xml:space="preserve"> 90°C \t B. 100°C \t C. 110°C \t D. 120°C</w:t>
-      </w:r>
-    </w:p>
-    <w:p>
-      <w:pPr>
-        <w:spacing w:before="80" w:after="60" w:line="240" w:lineRule="auto"/>
-        <w:ind w:left="283"/>
+        <w:rPr>
+          <w:sz w:val="24"/>
+        </w:rPr>
+      </w:pPr>
+      <w:r>
+        <w:rPr>
+          <w:sz w:val="24"/>
+        </w:rPr>
+        <w:t>2. recreation  B. a strong feeling of excitement and interest in something</w:t>
+      </w:r>
+      <w:r>
+        <w:rPr>
+          <w:sz w:val="24"/>
+        </w:rPr>
+        <w:tab/>
+      </w:r>
+    </w:p>
+    <w:p>
+      <w:pPr>
+        <w:tabs>
+          <w:tab w:val="left" w:pos="4677"/>
+        </w:tabs>
+        <w:spacing w:before="60" w:after="60" w:line="240" w:lineRule="auto"/>
+        <w:rPr>
+          <w:sz w:val="24"/>
+        </w:rPr>
+      </w:pPr>
+      <w:r>
+        <w:rPr>
+          <w:sz w:val="24"/>
+        </w:rPr>
+        <w:t>3. interest  C. a feeling of happiness, enjoyment, or satisfaction</w:t>
+      </w:r>
+      <w:r>
+        <w:rPr>
+          <w:sz w:val="24"/>
+        </w:rPr>
+        <w:tab/>
+      </w:r>
+    </w:p>
+    <w:p>
+      <w:pPr>
+        <w:tabs>
+          <w:tab w:val="left" w:pos="4677"/>
+        </w:tabs>
+        <w:spacing w:before="60" w:after="60" w:line="240" w:lineRule="auto"/>
+        <w:rPr>
+          <w:sz w:val="24"/>
+        </w:rPr>
+      </w:pPr>
+      <w:r>
+        <w:rPr>
+          <w:sz w:val="24"/>
+        </w:rPr>
+        <w:t>4. enthusiasm  D. a period of relaxing, sleeping or doing nothing</w:t>
+      </w:r>
+      <w:r>
+        <w:rPr>
+          <w:sz w:val="24"/>
+        </w:rPr>
+        <w:tab/>
+      </w:r>
+    </w:p>
+    <w:p>
+      <w:pPr>
+        <w:tabs>
+          <w:tab w:val="left" w:pos="4677"/>
+        </w:tabs>
+        <w:spacing w:before="60" w:after="60" w:line="240" w:lineRule="auto"/>
+        <w:rPr>
+          <w:sz w:val="24"/>
+        </w:rPr>
+      </w:pPr>
+      <w:r>
+        <w:rPr>
+          <w:sz w:val="24"/>
+        </w:rPr>
+        <w:t>5. relaxation  E. the fact of people doing things for enjoyment</w:t>
+      </w:r>
+      <w:r>
+        <w:rPr>
+          <w:sz w:val="24"/>
+        </w:rPr>
+        <w:tab/>
+      </w:r>
+    </w:p>
+    <w:p>
+      <w:pPr>
+        <w:tabs>
+          <w:tab w:val="left" w:pos="4677"/>
+        </w:tabs>
+        <w:spacing w:before="60" w:after="60" w:line="240" w:lineRule="auto"/>
+        <w:rPr>
+          <w:sz w:val="24"/>
+        </w:rPr>
+      </w:pPr>
+      <w:r>
+        <w:rPr>
+          <w:sz w:val="24"/>
+        </w:rPr>
+        <w:t>6. pleasure  F. a way of resting and enjoying yourself</w:t>
+      </w:r>
+      <w:r>
+        <w:rPr>
+          <w:sz w:val="24"/>
+        </w:rPr>
+        <w:tab/>
+      </w:r>
+    </w:p>
+    <w:p>
+      <w:pPr>
+        <w:spacing w:before="60" w:after="60" w:line="240" w:lineRule="auto"/>
         <w:rPr>
           <w:sz w:val="24"/>
         </w:rPr>
       </w:pPr>
     </w:p>
     <w:sectPr>
-      <w:footerReference w:type="default" r:id="rId6"/>
+      <w:headerReference w:type="even" r:id="rId6"/>
+      <w:headerReference w:type="default" r:id="rId7"/>
+      <w:footerReference w:type="even" r:id="rId8"/>
+      <w:footerReference w:type="default" r:id="rId9"/>
+      <w:headerReference w:type="first" r:id="rId10"/>
+      <w:footerReference w:type="first" r:id="rId11"/>
       <w:pgSz w:w="11907" w:h="16840" w:code="9"/>
       <w:pgMar w:top="1134" w:right="850" w:bottom="1134" w:left="1701" w:header="720" w:footer="720" w:gutter="0"/>
       <w:cols w:space="720"/>
@@ -584,6 +2079,16 @@
 </file>
 
 <file path=word/footer1.xml><?xml version="1.0" encoding="utf-8"?>
+<w:ftr xmlns:wpc="http://schemas.microsoft.com/office/word/2010/wordprocessingCanvas" xmlns:cx="http://schemas.microsoft.com/office/drawing/2014/chartex" xmlns:cx1="http://schemas.microsoft.com/office/drawing/2015/9/8/chartex" xmlns:cx2="http://schemas.microsoft.com/office/drawing/2015/10/21/chartex" xmlns:cx3="http://schemas.microsoft.com/office/drawing/2016/5/9/chartex" xmlns:cx4="http://schemas.microsoft.com/office/drawing/2016/5/10/chartex" xmlns:cx5="http://schemas.microsoft.com/office/drawing/2016/5/11/chartex" xmlns:cx6="http://schemas.microsoft.com/office/drawing/2016/5/12/chartex" xmlns:cx7="http://schemas.microsoft.com/office/drawing/2016/5/13/chartex" xmlns:cx8="http://schemas.microsoft.com/office/drawing/2016/5/14/chartex" xmlns:mc="http://schemas.openxmlformats.org/markup-compatibility/2006" xmlns:aink="http://schemas.microsoft.com/office/drawing/2016/ink" xmlns:am3d="http://schemas.microsoft.com/office/drawing/2017/model3d" xmlns:o="urn:schemas-microsoft-com:office:office" xmlns:oel="http://schemas.microsoft.com/office/2019/extlst" xmlns:r="http://schemas.openxmlformats.org/officeDocument/2006/relationships" xmlns:m="http://schemas.openxmlformats.org/officeDocument/2006/math" xmlns:v="urn:schemas-microsoft-com:vml" xmlns:wp14="http://schemas.microsoft.com/office/word/2010/wordprocessingDrawing" xmlns:wp="http://schemas.openxmlformats.org/drawingml/2006/wordprocessingDrawing" xmlns:w10="urn:schemas-microsoft-com:office:word" xmlns:w="http://schemas.openxmlformats.org/wordprocessingml/2006/main" xmlns:w14="http://schemas.microsoft.com/office/word/2010/wordml" xmlns:w15="http://schemas.microsoft.com/office/word/2012/wordml" xmlns:w16cex="http://schemas.microsoft.com/office/word/2018/wordml/cex" xmlns:w16cid="http://schemas.microsoft.com/office/word/2016/wordml/cid" xmlns:w16="http://schemas.microsoft.com/office/word/2018/wordml" xmlns:w16du="http://schemas.microsoft.com/office/word/2023/wordml/word16du" xmlns:w16sdtdh="http://schemas.microsoft.com/office/word/2020/wordml/sdtdatahash" xmlns:w16sdtfl="http://schemas.microsoft.com/office/word/2024/wordml/sdtformatlock" xmlns:w16se="http://schemas.microsoft.com/office/word/2015/wordml/symex" xmlns:wpg="http://schemas.microsoft.com/office/word/2010/wordprocessingGroup" xmlns:wpi="http://schemas.microsoft.com/office/word/2010/wordprocessingInk" xmlns:wne="http://schemas.microsoft.com/office/word/2006/wordml" xmlns:wps="http://schemas.microsoft.com/office/word/2010/wordprocessingShape" mc:Ignorable="w14 w15 w16se w16cid w16 w16cex w16sdtdh w16sdtfl w16du wp14">
+  <w:p>
+    <w:pPr>
+      <w:pStyle w:val="Footer"/>
+    </w:pPr>
+  </w:p>
+</w:ftr>
+</file>
+
+<file path=word/footer2.xml><?xml version="1.0" encoding="utf-8"?>
 <w:ftr xmlns:wpc="http://schemas.microsoft.com/office/word/2010/wordprocessingCanvas" xmlns:cx="http://schemas.microsoft.com/office/drawing/2014/chartex" xmlns:cx1="http://schemas.microsoft.com/office/drawing/2015/9/8/chartex" xmlns:cx2="http://schemas.microsoft.com/office/drawing/2015/10/21/chartex" xmlns:cx3="http://schemas.microsoft.com/office/drawing/2016/5/9/chartex" xmlns:cx4="http://schemas.microsoft.com/office/drawing/2016/5/10/chartex" xmlns:cx5="http://schemas.microsoft.com/office/drawing/2016/5/11/chartex" xmlns:cx6="http://schemas.microsoft.com/office/drawing/2016/5/12/chartex" xmlns:cx7="http://schemas.microsoft.com/office/drawing/2016/5/13/chartex" xmlns:cx8="http://schemas.microsoft.com/office/drawing/2016/5/14/chartex" xmlns:mc="http://schemas.openxmlformats.org/markup-compatibility/2006" xmlns:aink="http://schemas.microsoft.com/office/drawing/2016/ink" xmlns:am3d="http://schemas.microsoft.com/office/drawing/2017/model3d" xmlns:o="urn:schemas-microsoft-com:office:office" xmlns:oel="http://schemas.microsoft.com/office/2019/extlst" xmlns:r="http://schemas.openxmlformats.org/officeDocument/2006/relationships" xmlns:m="http://schemas.openxmlformats.org/officeDocument/2006/math" xmlns:v="urn:schemas-microsoft-com:vml" xmlns:wp14="http://schemas.microsoft.com/office/word/2010/wordprocessingDrawing" xmlns:wp="http://schemas.openxmlformats.org/drawingml/2006/wordprocessingDrawing" xmlns:w10="urn:schemas-microsoft-com:office:word" xmlns:w="http://schemas.openxmlformats.org/wordprocessingml/2006/main" xmlns:w14="http://schemas.microsoft.com/office/word/2010/wordml" xmlns:w15="http://schemas.microsoft.com/office/word/2012/wordml" xmlns:w16cex="http://schemas.microsoft.com/office/word/2018/wordml/cex" xmlns:w16cid="http://schemas.microsoft.com/office/word/2016/wordml/cid" xmlns:w16="http://schemas.microsoft.com/office/word/2018/wordml" xmlns:w16du="http://schemas.microsoft.com/office/word/2023/wordml/word16du" xmlns:w16sdtdh="http://schemas.microsoft.com/office/word/2020/wordml/sdtdatahash" xmlns:w16sdtfl="http://schemas.microsoft.com/office/word/2024/wordml/sdtformatlock" xmlns:w16se="http://schemas.microsoft.com/office/word/2015/wordml/symex" xmlns:wpg="http://schemas.microsoft.com/office/word/2010/wordprocessingGroup" xmlns:wpi="http://schemas.microsoft.com/office/word/2010/wordprocessingInk" xmlns:wne="http://schemas.microsoft.com/office/word/2006/wordml" xmlns:wps="http://schemas.microsoft.com/office/word/2010/wordprocessingShape" mc:Ignorable="w14 w15 w16se w16cid w16 w16cex w16sdtdh w16sdtfl w16du wp14">
   <w:p>
     <w:pPr>
@@ -661,6 +2166,16 @@
 </w:ftr>
 </file>
 
+<file path=word/footer3.xml><?xml version="1.0" encoding="utf-8"?>
+<w:ftr xmlns:wpc="http://schemas.microsoft.com/office/word/2010/wordprocessingCanvas" xmlns:cx="http://schemas.microsoft.com/office/drawing/2014/chartex" xmlns:cx1="http://schemas.microsoft.com/office/drawing/2015/9/8/chartex" xmlns:cx2="http://schemas.microsoft.com/office/drawing/2015/10/21/chartex" xmlns:cx3="http://schemas.microsoft.com/office/drawing/2016/5/9/chartex" xmlns:cx4="http://schemas.microsoft.com/office/drawing/2016/5/10/chartex" xmlns:cx5="http://schemas.microsoft.com/office/drawing/2016/5/11/chartex" xmlns:cx6="http://schemas.microsoft.com/office/drawing/2016/5/12/chartex" xmlns:cx7="http://schemas.microsoft.com/office/drawing/2016/5/13/chartex" xmlns:cx8="http://schemas.microsoft.com/office/drawing/2016/5/14/chartex" xmlns:mc="http://schemas.openxmlformats.org/markup-compatibility/2006" xmlns:aink="http://schemas.microsoft.com/office/drawing/2016/ink" xmlns:am3d="http://schemas.microsoft.com/office/drawing/2017/model3d" xmlns:o="urn:schemas-microsoft-com:office:office" xmlns:oel="http://schemas.microsoft.com/office/2019/extlst" xmlns:r="http://schemas.openxmlformats.org/officeDocument/2006/relationships" xmlns:m="http://schemas.openxmlformats.org/officeDocument/2006/math" xmlns:v="urn:schemas-microsoft-com:vml" xmlns:wp14="http://schemas.microsoft.com/office/word/2010/wordprocessingDrawing" xmlns:wp="http://schemas.openxmlformats.org/drawingml/2006/wordprocessingDrawing" xmlns:w10="urn:schemas-microsoft-com:office:word" xmlns:w="http://schemas.openxmlformats.org/wordprocessingml/2006/main" xmlns:w14="http://schemas.microsoft.com/office/word/2010/wordml" xmlns:w15="http://schemas.microsoft.com/office/word/2012/wordml" xmlns:w16cex="http://schemas.microsoft.com/office/word/2018/wordml/cex" xmlns:w16cid="http://schemas.microsoft.com/office/word/2016/wordml/cid" xmlns:w16="http://schemas.microsoft.com/office/word/2018/wordml" xmlns:w16du="http://schemas.microsoft.com/office/word/2023/wordml/word16du" xmlns:w16sdtdh="http://schemas.microsoft.com/office/word/2020/wordml/sdtdatahash" xmlns:w16sdtfl="http://schemas.microsoft.com/office/word/2024/wordml/sdtformatlock" xmlns:w16se="http://schemas.microsoft.com/office/word/2015/wordml/symex" xmlns:wpg="http://schemas.microsoft.com/office/word/2010/wordprocessingGroup" xmlns:wpi="http://schemas.microsoft.com/office/word/2010/wordprocessingInk" xmlns:wne="http://schemas.microsoft.com/office/word/2006/wordml" xmlns:wps="http://schemas.microsoft.com/office/word/2010/wordprocessingShape" mc:Ignorable="w14 w15 w16se w16cid w16 w16cex w16sdtdh w16sdtfl w16du wp14">
+  <w:p>
+    <w:pPr>
+      <w:pStyle w:val="Footer"/>
+    </w:pPr>
+  </w:p>
+</w:ftr>
+</file>
+
 <file path=word/footnotes.xml><?xml version="1.0" encoding="utf-8"?>
 <w:footnotes xmlns:wpc="http://schemas.microsoft.com/office/word/2010/wordprocessingCanvas" xmlns:cx="http://schemas.microsoft.com/office/drawing/2014/chartex" xmlns:cx1="http://schemas.microsoft.com/office/drawing/2015/9/8/chartex" xmlns:cx2="http://schemas.microsoft.com/office/drawing/2015/10/21/chartex" xmlns:cx3="http://schemas.microsoft.com/office/drawing/2016/5/9/chartex" xmlns:cx4="http://schemas.microsoft.com/office/drawing/2016/5/10/chartex" xmlns:cx5="http://schemas.microsoft.com/office/drawing/2016/5/11/chartex" xmlns:cx6="http://schemas.microsoft.com/office/drawing/2016/5/12/chartex" xmlns:cx7="http://schemas.microsoft.com/office/drawing/2016/5/13/chartex" xmlns:cx8="http://schemas.microsoft.com/office/drawing/2016/5/14/chartex" xmlns:mc="http://schemas.openxmlformats.org/markup-compatibility/2006" xmlns:aink="http://schemas.microsoft.com/office/drawing/2016/ink" xmlns:am3d="http://schemas.microsoft.com/office/drawing/2017/model3d" xmlns:o="urn:schemas-microsoft-com:office:office" xmlns:oel="http://schemas.microsoft.com/office/2019/extlst" xmlns:r="http://schemas.openxmlformats.org/officeDocument/2006/relationships" xmlns:m="http://schemas.openxmlformats.org/officeDocument/2006/math" xmlns:v="urn:schemas-microsoft-com:vml" xmlns:wp14="http://schemas.microsoft.com/office/word/2010/wordprocessingDrawing" xmlns:wp="http://schemas.openxmlformats.org/drawingml/2006/wordprocessingDrawing" xmlns:w10="urn:schemas-microsoft-com:office:word" xmlns:w="http://schemas.openxmlformats.org/wordprocessingml/2006/main" xmlns:w14="http://schemas.microsoft.com/office/word/2010/wordml" xmlns:w15="http://schemas.microsoft.com/office/word/2012/wordml" xmlns:w16cex="http://schemas.microsoft.com/office/word/2018/wordml/cex" xmlns:w16cid="http://schemas.microsoft.com/office/word/2016/wordml/cid" xmlns:w16="http://schemas.microsoft.com/office/word/2018/wordml" xmlns:w16du="http://schemas.microsoft.com/office/word/2023/wordml/word16du" xmlns:w16sdtdh="http://schemas.microsoft.com/office/word/2020/wordml/sdtdatahash" xmlns:w16sdtfl="http://schemas.microsoft.com/office/word/2024/wordml/sdtformatlock" xmlns:w16se="http://schemas.microsoft.com/office/word/2015/wordml/symex" xmlns:wpg="http://schemas.microsoft.com/office/word/2010/wordprocessingGroup" xmlns:wpi="http://schemas.microsoft.com/office/word/2010/wordprocessingInk" xmlns:wne="http://schemas.microsoft.com/office/word/2006/wordml" xmlns:wps="http://schemas.microsoft.com/office/word/2010/wordprocessingShape" mc:Ignorable="w14 w15 w16se w16cid w16 w16cex w16sdtdh w16sdtfl w16du wp14">
   <w:footnote w:type="separator" w:id="-1">
@@ -684,6 +2199,36 @@
     </w:p>
   </w:footnote>
 </w:footnotes>
+</file>
+
+<file path=word/header1.xml><?xml version="1.0" encoding="utf-8"?>
+<w:hdr xmlns:wpc="http://schemas.microsoft.com/office/word/2010/wordprocessingCanvas" xmlns:cx="http://schemas.microsoft.com/office/drawing/2014/chartex" xmlns:cx1="http://schemas.microsoft.com/office/drawing/2015/9/8/chartex" xmlns:cx2="http://schemas.microsoft.com/office/drawing/2015/10/21/chartex" xmlns:cx3="http://schemas.microsoft.com/office/drawing/2016/5/9/chartex" xmlns:cx4="http://schemas.microsoft.com/office/drawing/2016/5/10/chartex" xmlns:cx5="http://schemas.microsoft.com/office/drawing/2016/5/11/chartex" xmlns:cx6="http://schemas.microsoft.com/office/drawing/2016/5/12/chartex" xmlns:cx7="http://schemas.microsoft.com/office/drawing/2016/5/13/chartex" xmlns:cx8="http://schemas.microsoft.com/office/drawing/2016/5/14/chartex" xmlns:mc="http://schemas.openxmlformats.org/markup-compatibility/2006" xmlns:aink="http://schemas.microsoft.com/office/drawing/2016/ink" xmlns:am3d="http://schemas.microsoft.com/office/drawing/2017/model3d" xmlns:o="urn:schemas-microsoft-com:office:office" xmlns:oel="http://schemas.microsoft.com/office/2019/extlst" xmlns:r="http://schemas.openxmlformats.org/officeDocument/2006/relationships" xmlns:m="http://schemas.openxmlformats.org/officeDocument/2006/math" xmlns:v="urn:schemas-microsoft-com:vml" xmlns:wp14="http://schemas.microsoft.com/office/word/2010/wordprocessingDrawing" xmlns:wp="http://schemas.openxmlformats.org/drawingml/2006/wordprocessingDrawing" xmlns:w10="urn:schemas-microsoft-com:office:word" xmlns:w="http://schemas.openxmlformats.org/wordprocessingml/2006/main" xmlns:w14="http://schemas.microsoft.com/office/word/2010/wordml" xmlns:w15="http://schemas.microsoft.com/office/word/2012/wordml" xmlns:w16cex="http://schemas.microsoft.com/office/word/2018/wordml/cex" xmlns:w16cid="http://schemas.microsoft.com/office/word/2016/wordml/cid" xmlns:w16="http://schemas.microsoft.com/office/word/2018/wordml" xmlns:w16du="http://schemas.microsoft.com/office/word/2023/wordml/word16du" xmlns:w16sdtdh="http://schemas.microsoft.com/office/word/2020/wordml/sdtdatahash" xmlns:w16sdtfl="http://schemas.microsoft.com/office/word/2024/wordml/sdtformatlock" xmlns:w16se="http://schemas.microsoft.com/office/word/2015/wordml/symex" xmlns:wpg="http://schemas.microsoft.com/office/word/2010/wordprocessingGroup" xmlns:wpi="http://schemas.microsoft.com/office/word/2010/wordprocessingInk" xmlns:wne="http://schemas.microsoft.com/office/word/2006/wordml" xmlns:wps="http://schemas.microsoft.com/office/word/2010/wordprocessingShape" mc:Ignorable="w14 w15 w16se w16cid w16 w16cex w16sdtdh w16sdtfl w16du wp14">
+  <w:p>
+    <w:pPr>
+      <w:pStyle w:val="Header"/>
+    </w:pPr>
+  </w:p>
+</w:hdr>
+</file>
+
+<file path=word/header2.xml><?xml version="1.0" encoding="utf-8"?>
+<w:hdr xmlns:wpc="http://schemas.microsoft.com/office/word/2010/wordprocessingCanvas" xmlns:cx="http://schemas.microsoft.com/office/drawing/2014/chartex" xmlns:cx1="http://schemas.microsoft.com/office/drawing/2015/9/8/chartex" xmlns:cx2="http://schemas.microsoft.com/office/drawing/2015/10/21/chartex" xmlns:cx3="http://schemas.microsoft.com/office/drawing/2016/5/9/chartex" xmlns:cx4="http://schemas.microsoft.com/office/drawing/2016/5/10/chartex" xmlns:cx5="http://schemas.microsoft.com/office/drawing/2016/5/11/chartex" xmlns:cx6="http://schemas.microsoft.com/office/drawing/2016/5/12/chartex" xmlns:cx7="http://schemas.microsoft.com/office/drawing/2016/5/13/chartex" xmlns:cx8="http://schemas.microsoft.com/office/drawing/2016/5/14/chartex" xmlns:mc="http://schemas.openxmlformats.org/markup-compatibility/2006" xmlns:aink="http://schemas.microsoft.com/office/drawing/2016/ink" xmlns:am3d="http://schemas.microsoft.com/office/drawing/2017/model3d" xmlns:o="urn:schemas-microsoft-com:office:office" xmlns:oel="http://schemas.microsoft.com/office/2019/extlst" xmlns:r="http://schemas.openxmlformats.org/officeDocument/2006/relationships" xmlns:m="http://schemas.openxmlformats.org/officeDocument/2006/math" xmlns:v="urn:schemas-microsoft-com:vml" xmlns:wp14="http://schemas.microsoft.com/office/word/2010/wordprocessingDrawing" xmlns:wp="http://schemas.openxmlformats.org/drawingml/2006/wordprocessingDrawing" xmlns:w10="urn:schemas-microsoft-com:office:word" xmlns:w="http://schemas.openxmlformats.org/wordprocessingml/2006/main" xmlns:w14="http://schemas.microsoft.com/office/word/2010/wordml" xmlns:w15="http://schemas.microsoft.com/office/word/2012/wordml" xmlns:w16cex="http://schemas.microsoft.com/office/word/2018/wordml/cex" xmlns:w16cid="http://schemas.microsoft.com/office/word/2016/wordml/cid" xmlns:w16="http://schemas.microsoft.com/office/word/2018/wordml" xmlns:w16du="http://schemas.microsoft.com/office/word/2023/wordml/word16du" xmlns:w16sdtdh="http://schemas.microsoft.com/office/word/2020/wordml/sdtdatahash" xmlns:w16sdtfl="http://schemas.microsoft.com/office/word/2024/wordml/sdtformatlock" xmlns:w16se="http://schemas.microsoft.com/office/word/2015/wordml/symex" xmlns:wpg="http://schemas.microsoft.com/office/word/2010/wordprocessingGroup" xmlns:wpi="http://schemas.microsoft.com/office/word/2010/wordprocessingInk" xmlns:wne="http://schemas.microsoft.com/office/word/2006/wordml" xmlns:wps="http://schemas.microsoft.com/office/word/2010/wordprocessingShape" mc:Ignorable="w14 w15 w16se w16cid w16 w16cex w16sdtdh w16sdtfl w16du wp14">
+  <w:p>
+    <w:pPr>
+      <w:pStyle w:val="Header"/>
+    </w:pPr>
+  </w:p>
+</w:hdr>
+</file>
+
+<file path=word/header3.xml><?xml version="1.0" encoding="utf-8"?>
+<w:hdr xmlns:wpc="http://schemas.microsoft.com/office/word/2010/wordprocessingCanvas" xmlns:cx="http://schemas.microsoft.com/office/drawing/2014/chartex" xmlns:cx1="http://schemas.microsoft.com/office/drawing/2015/9/8/chartex" xmlns:cx2="http://schemas.microsoft.com/office/drawing/2015/10/21/chartex" xmlns:cx3="http://schemas.microsoft.com/office/drawing/2016/5/9/chartex" xmlns:cx4="http://schemas.microsoft.com/office/drawing/2016/5/10/chartex" xmlns:cx5="http://schemas.microsoft.com/office/drawing/2016/5/11/chartex" xmlns:cx6="http://schemas.microsoft.com/office/drawing/2016/5/12/chartex" xmlns:cx7="http://schemas.microsoft.com/office/drawing/2016/5/13/chartex" xmlns:cx8="http://schemas.microsoft.com/office/drawing/2016/5/14/chartex" xmlns:mc="http://schemas.openxmlformats.org/markup-compatibility/2006" xmlns:aink="http://schemas.microsoft.com/office/drawing/2016/ink" xmlns:am3d="http://schemas.microsoft.com/office/drawing/2017/model3d" xmlns:o="urn:schemas-microsoft-com:office:office" xmlns:oel="http://schemas.microsoft.com/office/2019/extlst" xmlns:r="http://schemas.openxmlformats.org/officeDocument/2006/relationships" xmlns:m="http://schemas.openxmlformats.org/officeDocument/2006/math" xmlns:v="urn:schemas-microsoft-com:vml" xmlns:wp14="http://schemas.microsoft.com/office/word/2010/wordprocessingDrawing" xmlns:wp="http://schemas.openxmlformats.org/drawingml/2006/wordprocessingDrawing" xmlns:w10="urn:schemas-microsoft-com:office:word" xmlns:w="http://schemas.openxmlformats.org/wordprocessingml/2006/main" xmlns:w14="http://schemas.microsoft.com/office/word/2010/wordml" xmlns:w15="http://schemas.microsoft.com/office/word/2012/wordml" xmlns:w16cex="http://schemas.microsoft.com/office/word/2018/wordml/cex" xmlns:w16cid="http://schemas.microsoft.com/office/word/2016/wordml/cid" xmlns:w16="http://schemas.microsoft.com/office/word/2018/wordml" xmlns:w16du="http://schemas.microsoft.com/office/word/2023/wordml/word16du" xmlns:w16sdtdh="http://schemas.microsoft.com/office/word/2020/wordml/sdtdatahash" xmlns:w16sdtfl="http://schemas.microsoft.com/office/word/2024/wordml/sdtformatlock" xmlns:w16se="http://schemas.microsoft.com/office/word/2015/wordml/symex" xmlns:wpg="http://schemas.microsoft.com/office/word/2010/wordprocessingGroup" xmlns:wpi="http://schemas.microsoft.com/office/word/2010/wordprocessingInk" xmlns:wne="http://schemas.microsoft.com/office/word/2006/wordml" xmlns:wps="http://schemas.microsoft.com/office/word/2010/wordprocessingShape" mc:Ignorable="w14 w15 w16se w16cid w16 w16cex w16sdtdh w16sdtfl w16du wp14">
+  <w:p>
+    <w:pPr>
+      <w:pStyle w:val="Header"/>
+    </w:pPr>
+  </w:p>
+</w:hdr>
 </file>
 
 <file path=word/styles.xml><?xml version="1.0" encoding="utf-8"?>
@@ -1094,7 +2639,7 @@
     <w:link w:val="Heading1Char"/>
     <w:uiPriority w:val="9"/>
     <w:qFormat/>
-    <w:rsid w:val="007C6337"/>
+    <w:rsid w:val="001F7F17"/>
     <w:pPr>
       <w:keepNext/>
       <w:keepLines/>
@@ -1117,7 +2662,7 @@
     <w:semiHidden/>
     <w:unhideWhenUsed/>
     <w:qFormat/>
-    <w:rsid w:val="007C6337"/>
+    <w:rsid w:val="001F7F17"/>
     <w:pPr>
       <w:keepNext/>
       <w:keepLines/>
@@ -1140,7 +2685,7 @@
     <w:semiHidden/>
     <w:unhideWhenUsed/>
     <w:qFormat/>
-    <w:rsid w:val="007C6337"/>
+    <w:rsid w:val="001F7F17"/>
     <w:pPr>
       <w:keepNext/>
       <w:keepLines/>
@@ -1163,7 +2708,7 @@
     <w:semiHidden/>
     <w:unhideWhenUsed/>
     <w:qFormat/>
-    <w:rsid w:val="007C6337"/>
+    <w:rsid w:val="001F7F17"/>
     <w:pPr>
       <w:keepNext/>
       <w:keepLines/>
@@ -1186,7 +2731,7 @@
     <w:semiHidden/>
     <w:unhideWhenUsed/>
     <w:qFormat/>
-    <w:rsid w:val="007C6337"/>
+    <w:rsid w:val="001F7F17"/>
     <w:pPr>
       <w:keepNext/>
       <w:keepLines/>
@@ -1207,7 +2752,7 @@
     <w:semiHidden/>
     <w:unhideWhenUsed/>
     <w:qFormat/>
-    <w:rsid w:val="007C6337"/>
+    <w:rsid w:val="001F7F17"/>
     <w:pPr>
       <w:keepNext/>
       <w:keepLines/>
@@ -1230,7 +2775,7 @@
     <w:semiHidden/>
     <w:unhideWhenUsed/>
     <w:qFormat/>
-    <w:rsid w:val="007C6337"/>
+    <w:rsid w:val="001F7F17"/>
     <w:pPr>
       <w:keepNext/>
       <w:keepLines/>
@@ -1251,7 +2796,7 @@
     <w:semiHidden/>
     <w:unhideWhenUsed/>
     <w:qFormat/>
-    <w:rsid w:val="007C6337"/>
+    <w:rsid w:val="001F7F17"/>
     <w:pPr>
       <w:keepNext/>
       <w:keepLines/>
@@ -1274,7 +2819,7 @@
     <w:semiHidden/>
     <w:unhideWhenUsed/>
     <w:qFormat/>
-    <w:rsid w:val="007C6337"/>
+    <w:rsid w:val="001F7F17"/>
     <w:pPr>
       <w:keepNext/>
       <w:keepLines/>
@@ -1318,7 +2863,7 @@
     <w:basedOn w:val="DefaultParagraphFont"/>
     <w:link w:val="Heading1"/>
     <w:uiPriority w:val="9"/>
-    <w:rsid w:val="007C6337"/>
+    <w:rsid w:val="001F7F17"/>
     <w:rPr>
       <w:rFonts w:asciiTheme="majorHAnsi" w:eastAsiaTheme="majorEastAsia" w:hAnsiTheme="majorHAnsi" w:cstheme="majorBidi"/>
       <w:color w:val="0F4761" w:themeColor="accent1" w:themeShade="BF"/>
@@ -1332,7 +2877,7 @@
     <w:link w:val="Heading2"/>
     <w:uiPriority w:val="9"/>
     <w:semiHidden/>
-    <w:rsid w:val="007C6337"/>
+    <w:rsid w:val="001F7F17"/>
     <w:rPr>
       <w:rFonts w:asciiTheme="majorHAnsi" w:eastAsiaTheme="majorEastAsia" w:hAnsiTheme="majorHAnsi" w:cstheme="majorBidi"/>
       <w:color w:val="0F4761" w:themeColor="accent1" w:themeShade="BF"/>
@@ -1346,7 +2891,7 @@
     <w:link w:val="Heading3"/>
     <w:uiPriority w:val="9"/>
     <w:semiHidden/>
-    <w:rsid w:val="007C6337"/>
+    <w:rsid w:val="001F7F17"/>
     <w:rPr>
       <w:rFonts w:asciiTheme="minorHAnsi" w:eastAsiaTheme="majorEastAsia" w:hAnsiTheme="minorHAnsi" w:cstheme="majorBidi"/>
       <w:color w:val="0F4761" w:themeColor="accent1" w:themeShade="BF"/>
@@ -1360,7 +2905,7 @@
     <w:link w:val="Heading4"/>
     <w:uiPriority w:val="9"/>
     <w:semiHidden/>
-    <w:rsid w:val="007C6337"/>
+    <w:rsid w:val="001F7F17"/>
     <w:rPr>
       <w:rFonts w:asciiTheme="minorHAnsi" w:eastAsiaTheme="majorEastAsia" w:hAnsiTheme="minorHAnsi" w:cstheme="majorBidi"/>
       <w:i/>
@@ -1374,7 +2919,7 @@
     <w:link w:val="Heading5"/>
     <w:uiPriority w:val="9"/>
     <w:semiHidden/>
-    <w:rsid w:val="007C6337"/>
+    <w:rsid w:val="001F7F17"/>
     <w:rPr>
       <w:rFonts w:asciiTheme="minorHAnsi" w:eastAsiaTheme="majorEastAsia" w:hAnsiTheme="minorHAnsi" w:cstheme="majorBidi"/>
       <w:color w:val="0F4761" w:themeColor="accent1" w:themeShade="BF"/>
@@ -1386,7 +2931,7 @@
     <w:link w:val="Heading6"/>
     <w:uiPriority w:val="9"/>
     <w:semiHidden/>
-    <w:rsid w:val="007C6337"/>
+    <w:rsid w:val="001F7F17"/>
     <w:rPr>
       <w:rFonts w:asciiTheme="minorHAnsi" w:eastAsiaTheme="majorEastAsia" w:hAnsiTheme="minorHAnsi" w:cstheme="majorBidi"/>
       <w:i/>
@@ -1400,7 +2945,7 @@
     <w:link w:val="Heading7"/>
     <w:uiPriority w:val="9"/>
     <w:semiHidden/>
-    <w:rsid w:val="007C6337"/>
+    <w:rsid w:val="001F7F17"/>
     <w:rPr>
       <w:rFonts w:asciiTheme="minorHAnsi" w:eastAsiaTheme="majorEastAsia" w:hAnsiTheme="minorHAnsi" w:cstheme="majorBidi"/>
       <w:color w:val="595959" w:themeColor="text1" w:themeTint="A6"/>
@@ -1412,7 +2957,7 @@
     <w:link w:val="Heading8"/>
     <w:uiPriority w:val="9"/>
     <w:semiHidden/>
-    <w:rsid w:val="007C6337"/>
+    <w:rsid w:val="001F7F17"/>
     <w:rPr>
       <w:rFonts w:asciiTheme="minorHAnsi" w:eastAsiaTheme="majorEastAsia" w:hAnsiTheme="minorHAnsi" w:cstheme="majorBidi"/>
       <w:i/>
@@ -1426,7 +2971,7 @@
     <w:link w:val="Heading9"/>
     <w:uiPriority w:val="9"/>
     <w:semiHidden/>
-    <w:rsid w:val="007C6337"/>
+    <w:rsid w:val="001F7F17"/>
     <w:rPr>
       <w:rFonts w:asciiTheme="minorHAnsi" w:eastAsiaTheme="majorEastAsia" w:hAnsiTheme="minorHAnsi" w:cstheme="majorBidi"/>
       <w:color w:val="272727" w:themeColor="text1" w:themeTint="D8"/>
@@ -1439,7 +2984,7 @@
     <w:link w:val="TitleChar"/>
     <w:uiPriority w:val="10"/>
     <w:qFormat/>
-    <w:rsid w:val="007C6337"/>
+    <w:rsid w:val="001F7F17"/>
     <w:pPr>
       <w:spacing w:after="80" w:line="240" w:lineRule="auto"/>
       <w:contextualSpacing/>
@@ -1457,7 +3002,7 @@
     <w:basedOn w:val="DefaultParagraphFont"/>
     <w:link w:val="Title"/>
     <w:uiPriority w:val="10"/>
-    <w:rsid w:val="007C6337"/>
+    <w:rsid w:val="001F7F17"/>
     <w:rPr>
       <w:rFonts w:asciiTheme="majorHAnsi" w:eastAsiaTheme="majorEastAsia" w:hAnsiTheme="majorHAnsi" w:cstheme="majorBidi"/>
       <w:spacing w:val="-10"/>
@@ -1473,7 +3018,7 @@
     <w:link w:val="SubtitleChar"/>
     <w:uiPriority w:val="11"/>
     <w:qFormat/>
-    <w:rsid w:val="007C6337"/>
+    <w:rsid w:val="001F7F17"/>
     <w:pPr>
       <w:numPr>
         <w:ilvl w:val="1"/>
@@ -1492,7 +3037,7 @@
     <w:basedOn w:val="DefaultParagraphFont"/>
     <w:link w:val="Subtitle"/>
     <w:uiPriority w:val="11"/>
-    <w:rsid w:val="007C6337"/>
+    <w:rsid w:val="001F7F17"/>
     <w:rPr>
       <w:rFonts w:asciiTheme="minorHAnsi" w:eastAsiaTheme="majorEastAsia" w:hAnsiTheme="minorHAnsi" w:cstheme="majorBidi"/>
       <w:color w:val="595959" w:themeColor="text1" w:themeTint="A6"/>
@@ -1508,7 +3053,7 @@
     <w:link w:val="QuoteChar"/>
     <w:uiPriority w:val="29"/>
     <w:qFormat/>
-    <w:rsid w:val="007C6337"/>
+    <w:rsid w:val="001F7F17"/>
     <w:pPr>
       <w:spacing w:before="160"/>
       <w:jc w:val="center"/>
@@ -1524,7 +3069,7 @@
     <w:basedOn w:val="DefaultParagraphFont"/>
     <w:link w:val="Quote"/>
     <w:uiPriority w:val="29"/>
-    <w:rsid w:val="007C6337"/>
+    <w:rsid w:val="001F7F17"/>
     <w:rPr>
       <w:i/>
       <w:iCs/>
@@ -1536,7 +3081,7 @@
     <w:basedOn w:val="Normal"/>
     <w:uiPriority w:val="34"/>
     <w:qFormat/>
-    <w:rsid w:val="007C6337"/>
+    <w:rsid w:val="001F7F17"/>
     <w:pPr>
       <w:ind w:left="720"/>
       <w:contextualSpacing/>
@@ -1547,7 +3092,7 @@
     <w:basedOn w:val="DefaultParagraphFont"/>
     <w:uiPriority w:val="21"/>
     <w:qFormat/>
-    <w:rsid w:val="007C6337"/>
+    <w:rsid w:val="001F7F17"/>
     <w:rPr>
       <w:i/>
       <w:iCs/>
@@ -1561,7 +3106,7 @@
     <w:link w:val="IntenseQuoteChar"/>
     <w:uiPriority w:val="30"/>
     <w:qFormat/>
-    <w:rsid w:val="007C6337"/>
+    <w:rsid w:val="001F7F17"/>
     <w:pPr>
       <w:pBdr>
         <w:top w:val="single" w:sz="4" w:space="10" w:color="0F4761" w:themeColor="accent1" w:themeShade="BF"/>
@@ -1582,7 +3127,7 @@
     <w:basedOn w:val="DefaultParagraphFont"/>
     <w:link w:val="IntenseQuote"/>
     <w:uiPriority w:val="30"/>
-    <w:rsid w:val="007C6337"/>
+    <w:rsid w:val="001F7F17"/>
     <w:rPr>
       <w:i/>
       <w:iCs/>
@@ -1594,7 +3139,7 @@
     <w:basedOn w:val="DefaultParagraphFont"/>
     <w:uiPriority w:val="32"/>
     <w:qFormat/>
-    <w:rsid w:val="007C6337"/>
+    <w:rsid w:val="001F7F17"/>
     <w:rPr>
       <w:b/>
       <w:bCs/>
@@ -1609,7 +3154,7 @@
     <w:link w:val="HeaderChar"/>
     <w:uiPriority w:val="99"/>
     <w:unhideWhenUsed/>
-    <w:rsid w:val="007C6337"/>
+    <w:rsid w:val="001F7F17"/>
     <w:pPr>
       <w:tabs>
         <w:tab w:val="center" w:pos="4680"/>
@@ -1623,7 +3168,7 @@
     <w:basedOn w:val="DefaultParagraphFont"/>
     <w:link w:val="Header"/>
     <w:uiPriority w:val="99"/>
-    <w:rsid w:val="007C6337"/>
+    <w:rsid w:val="001F7F17"/>
   </w:style>
   <w:style w:type="paragraph" w:styleId="Footer">
     <w:name w:val="footer"/>
@@ -1631,7 +3176,7 @@
     <w:link w:val="FooterChar"/>
     <w:uiPriority w:val="99"/>
     <w:unhideWhenUsed/>
-    <w:rsid w:val="007C6337"/>
+    <w:rsid w:val="001F7F17"/>
     <w:pPr>
       <w:tabs>
         <w:tab w:val="center" w:pos="4680"/>
@@ -1645,7 +3190,7 @@
     <w:basedOn w:val="DefaultParagraphFont"/>
     <w:link w:val="Footer"/>
     <w:uiPriority w:val="99"/>
-    <w:rsid w:val="007C6337"/>
+    <w:rsid w:val="001F7F17"/>
   </w:style>
 </w:styles>
 </file>

</xml_diff>

<commit_message>
feat: support recursive nested markdown, full A-Z option uppercase bolding, quote first line indents, and flush right answer blanks
</commit_message>
<xml_diff>
--- a/output/uln_document.docx
+++ b/output/uln_document.docx
@@ -21,7 +21,6 @@
     </w:p>
     <w:p>
       <w:pPr>
-        <w:keepNext/>
         <w:spacing w:before="120" w:after="80"/>
         <w:rPr>
           <w:b/>
@@ -38,6 +37,11 @@
     </w:p>
     <w:p>
       <w:pPr>
+        <w:tabs>
+          <w:tab w:val="left" w:pos="2551"/>
+          <w:tab w:val="left" w:pos="4819"/>
+          <w:tab w:val="left" w:pos="7087"/>
+        </w:tabs>
         <w:spacing w:before="80" w:after="60"/>
         <w:ind w:left="283"/>
         <w:rPr>
@@ -74,7 +78,26 @@
         <w:rPr>
           <w:sz w:val="24"/>
         </w:rPr>
-        <w:t xml:space="preserve">xciting  B. </w:t>
+        <w:t>xciting</w:t>
+      </w:r>
+      <w:r>
+        <w:rPr>
+          <w:sz w:val="24"/>
+        </w:rPr>
+        <w:tab/>
+      </w:r>
+      <w:r>
+        <w:rPr>
+          <w:b/>
+          <w:sz w:val="24"/>
+        </w:rPr>
+        <w:t xml:space="preserve">B. </w:t>
+      </w:r>
+      <w:r>
+        <w:rPr>
+          <w:sz w:val="24"/>
+        </w:rPr>
+        <w:t xml:space="preserve"> </w:t>
       </w:r>
       <w:r>
         <w:rPr>
@@ -87,7 +110,26 @@
         <w:rPr>
           <w:sz w:val="24"/>
         </w:rPr>
-        <w:t xml:space="preserve">xcellent  C. </w:t>
+        <w:t>xcellent</w:t>
+      </w:r>
+      <w:r>
+        <w:rPr>
+          <w:sz w:val="24"/>
+        </w:rPr>
+        <w:tab/>
+      </w:r>
+      <w:r>
+        <w:rPr>
+          <w:b/>
+          <w:sz w:val="24"/>
+        </w:rPr>
+        <w:t xml:space="preserve">C. </w:t>
+      </w:r>
+      <w:r>
+        <w:rPr>
+          <w:sz w:val="24"/>
+        </w:rPr>
+        <w:t xml:space="preserve"> </w:t>
       </w:r>
       <w:r>
         <w:rPr>
@@ -100,7 +142,26 @@
         <w:rPr>
           <w:sz w:val="24"/>
         </w:rPr>
-        <w:t xml:space="preserve">xperience  D. </w:t>
+        <w:t>xperience</w:t>
+      </w:r>
+      <w:r>
+        <w:rPr>
+          <w:sz w:val="24"/>
+        </w:rPr>
+        <w:tab/>
+      </w:r>
+      <w:r>
+        <w:rPr>
+          <w:b/>
+          <w:sz w:val="24"/>
+        </w:rPr>
+        <w:t xml:space="preserve">D. </w:t>
+      </w:r>
+      <w:r>
+        <w:rPr>
+          <w:sz w:val="24"/>
+        </w:rPr>
+        <w:t xml:space="preserve"> </w:t>
       </w:r>
       <w:r>
         <w:rPr>
@@ -118,52 +179,125 @@
     </w:p>
     <w:p>
       <w:pPr>
+        <w:tabs>
+          <w:tab w:val="left" w:pos="2551"/>
+          <w:tab w:val="left" w:pos="4819"/>
+          <w:tab w:val="left" w:pos="7087"/>
+        </w:tabs>
         <w:spacing w:before="80" w:after="60"/>
         <w:ind w:left="283"/>
         <w:rPr>
           <w:sz w:val="24"/>
+        </w:rPr>
+      </w:pPr>
+      <w:r>
+        <w:rPr>
+          <w:sz w:val="24"/>
+        </w:rPr>
+        <w:t xml:space="preserve">2. </w:t>
+      </w:r>
+      <w:r>
+        <w:rPr>
+          <w:b/>
+          <w:sz w:val="24"/>
+        </w:rPr>
+        <w:t xml:space="preserve">A. </w:t>
+      </w:r>
+      <w:r>
+        <w:rPr>
+          <w:sz w:val="24"/>
+        </w:rPr>
+        <w:t xml:space="preserve"> hobb</w:t>
+      </w:r>
+      <w:r>
+        <w:rPr>
+          <w:sz w:val="24"/>
           <w:u w:val="single"/>
         </w:rPr>
-      </w:pPr>
-      <w:r>
-        <w:rPr>
-          <w:sz w:val="24"/>
-        </w:rPr>
-        <w:t xml:space="preserve">2. </w:t>
-      </w:r>
-      <w:r>
-        <w:rPr>
-          <w:b/>
-          <w:sz w:val="24"/>
-        </w:rPr>
-        <w:t xml:space="preserve">A. </w:t>
-      </w:r>
-      <w:r>
-        <w:rPr>
-          <w:sz w:val="24"/>
-        </w:rPr>
-        <w:t xml:space="preserve"> hobb</w:t>
+        <w:t>y</w:t>
+      </w:r>
+      <w:r>
+        <w:rPr>
+          <w:sz w:val="24"/>
+        </w:rPr>
+        <w:tab/>
+      </w:r>
+      <w:r>
+        <w:rPr>
+          <w:b/>
+          <w:sz w:val="24"/>
+        </w:rPr>
+        <w:t xml:space="preserve">B. </w:t>
+      </w:r>
+      <w:r>
+        <w:rPr>
+          <w:sz w:val="24"/>
+        </w:rPr>
+        <w:t xml:space="preserve"> c</w:t>
       </w:r>
       <w:r>
         <w:rPr>
           <w:sz w:val="24"/>
           <w:u w:val="single"/>
         </w:rPr>
-        <w:t xml:space="preserve">y  </w:t>
-      </w:r>
-      <w:r>
-        <w:rPr>
-          <w:b/>
+        <w:t>y</w:t>
+      </w:r>
+      <w:r>
+        <w:rPr>
+          <w:sz w:val="24"/>
+        </w:rPr>
+        <w:t>cle</w:t>
+      </w:r>
+      <w:r>
+        <w:rPr>
+          <w:sz w:val="24"/>
+        </w:rPr>
+        <w:tab/>
+      </w:r>
+      <w:r>
+        <w:rPr>
+          <w:b/>
+          <w:sz w:val="24"/>
+        </w:rPr>
+        <w:t xml:space="preserve">C. </w:t>
+      </w:r>
+      <w:r>
+        <w:rPr>
+          <w:sz w:val="24"/>
+        </w:rPr>
+        <w:t xml:space="preserve"> b</w:t>
+      </w:r>
+      <w:r>
+        <w:rPr>
           <w:sz w:val="24"/>
           <w:u w:val="single"/>
         </w:rPr>
-        <w:t xml:space="preserve">B. </w:t>
-      </w:r>
-      <w:r>
-        <w:rPr>
-          <w:sz w:val="24"/>
-        </w:rPr>
-        <w:t xml:space="preserve"> c</w:t>
+        <w:t>y</w:t>
+      </w:r>
+      <w:r>
+        <w:rPr>
+          <w:sz w:val="24"/>
+        </w:rPr>
+        <w:t>e</w:t>
+      </w:r>
+      <w:r>
+        <w:rPr>
+          <w:sz w:val="24"/>
+        </w:rPr>
+        <w:tab/>
+      </w:r>
+      <w:r>
+        <w:rPr>
+          <w:b/>
+          <w:sz w:val="24"/>
+        </w:rPr>
+        <w:t xml:space="preserve">D. </w:t>
+      </w:r>
+      <w:r>
+        <w:rPr>
+          <w:sz w:val="24"/>
+        </w:rPr>
+        <w:t xml:space="preserve"> wh</w:t>
       </w:r>
       <w:r>
         <w:rPr>
@@ -172,35 +306,14 @@
         </w:rPr>
         <w:t>y</w:t>
       </w:r>
-      <w:r>
-        <w:rPr>
-          <w:sz w:val="24"/>
-        </w:rPr>
-        <w:t>cle  C. b</w:t>
-      </w:r>
-      <w:r>
-        <w:rPr>
-          <w:sz w:val="24"/>
-          <w:u w:val="single"/>
-        </w:rPr>
-        <w:t>y</w:t>
-      </w:r>
-      <w:r>
-        <w:rPr>
-          <w:sz w:val="24"/>
-        </w:rPr>
-        <w:t>e  D. wh</w:t>
-      </w:r>
-      <w:r>
-        <w:rPr>
-          <w:sz w:val="24"/>
-          <w:u w:val="single"/>
-        </w:rPr>
-        <w:t>y</w:t>
-      </w:r>
-    </w:p>
-    <w:p>
-      <w:pPr>
+    </w:p>
+    <w:p>
+      <w:pPr>
+        <w:tabs>
+          <w:tab w:val="left" w:pos="2551"/>
+          <w:tab w:val="left" w:pos="4819"/>
+          <w:tab w:val="left" w:pos="7087"/>
+        </w:tabs>
         <w:spacing w:before="80" w:after="60"/>
         <w:ind w:left="283"/>
         <w:rPr>
@@ -210,23 +323,85 @@
       <w:r>
         <w:rPr>
           <w:sz w:val="24"/>
+        </w:rPr>
+        <w:t xml:space="preserve">3. </w:t>
+      </w:r>
+      <w:r>
+        <w:rPr>
+          <w:b/>
+          <w:sz w:val="24"/>
+        </w:rPr>
+        <w:t xml:space="preserve">A. </w:t>
+      </w:r>
+      <w:r>
+        <w:rPr>
+          <w:sz w:val="24"/>
+        </w:rPr>
+        <w:t xml:space="preserve"> p</w:t>
+      </w:r>
+      <w:r>
+        <w:rPr>
+          <w:sz w:val="24"/>
           <w:u w:val="single"/>
         </w:rPr>
-        <w:t xml:space="preserve">3. </w:t>
-      </w:r>
-      <w:r>
-        <w:rPr>
-          <w:b/>
+        <w:t>o</w:t>
+      </w:r>
+      <w:r>
+        <w:rPr>
+          <w:sz w:val="24"/>
+        </w:rPr>
+        <w:t>ttery</w:t>
+      </w:r>
+      <w:r>
+        <w:rPr>
+          <w:sz w:val="24"/>
+        </w:rPr>
+        <w:tab/>
+      </w:r>
+      <w:r>
+        <w:rPr>
+          <w:b/>
+          <w:sz w:val="24"/>
+        </w:rPr>
+        <w:t xml:space="preserve">B. </w:t>
+      </w:r>
+      <w:r>
+        <w:rPr>
+          <w:sz w:val="24"/>
+        </w:rPr>
+        <w:t xml:space="preserve"> c</w:t>
+      </w:r>
+      <w:r>
+        <w:rPr>
           <w:sz w:val="24"/>
           <w:u w:val="single"/>
         </w:rPr>
-        <w:t xml:space="preserve">A. </w:t>
-      </w:r>
-      <w:r>
-        <w:rPr>
-          <w:sz w:val="24"/>
-        </w:rPr>
-        <w:t xml:space="preserve"> p</w:t>
+        <w:t>o</w:t>
+      </w:r>
+      <w:r>
+        <w:rPr>
+          <w:sz w:val="24"/>
+        </w:rPr>
+        <w:t>llect</w:t>
+      </w:r>
+      <w:r>
+        <w:rPr>
+          <w:sz w:val="24"/>
+        </w:rPr>
+        <w:tab/>
+      </w:r>
+      <w:r>
+        <w:rPr>
+          <w:b/>
+          <w:sz w:val="24"/>
+        </w:rPr>
+        <w:t xml:space="preserve">C. </w:t>
+      </w:r>
+      <w:r>
+        <w:rPr>
+          <w:sz w:val="24"/>
+        </w:rPr>
+        <w:t xml:space="preserve"> mel</w:t>
       </w:r>
       <w:r>
         <w:rPr>
@@ -239,7 +414,26 @@
         <w:rPr>
           <w:sz w:val="24"/>
         </w:rPr>
-        <w:t>ttery  B. c</w:t>
+        <w:t>dy</w:t>
+      </w:r>
+      <w:r>
+        <w:rPr>
+          <w:sz w:val="24"/>
+        </w:rPr>
+        <w:tab/>
+      </w:r>
+      <w:r>
+        <w:rPr>
+          <w:b/>
+          <w:sz w:val="24"/>
+        </w:rPr>
+        <w:t xml:space="preserve">D. </w:t>
+      </w:r>
+      <w:r>
+        <w:rPr>
+          <w:sz w:val="24"/>
+        </w:rPr>
+        <w:t xml:space="preserve"> m</w:t>
       </w:r>
       <w:r>
         <w:rPr>
@@ -252,37 +446,16 @@
         <w:rPr>
           <w:sz w:val="24"/>
         </w:rPr>
-        <w:t>llect  C. mel</w:t>
-      </w:r>
-      <w:r>
-        <w:rPr>
-          <w:sz w:val="24"/>
-          <w:u w:val="single"/>
-        </w:rPr>
-        <w:t>o</w:t>
-      </w:r>
-      <w:r>
-        <w:rPr>
-          <w:sz w:val="24"/>
-        </w:rPr>
-        <w:t>dy  D. m</w:t>
-      </w:r>
-      <w:r>
-        <w:rPr>
-          <w:sz w:val="24"/>
-          <w:u w:val="single"/>
-        </w:rPr>
-        <w:t>o</w:t>
-      </w:r>
-      <w:r>
-        <w:rPr>
-          <w:sz w:val="24"/>
-        </w:rPr>
         <w:t>nopoly</w:t>
       </w:r>
     </w:p>
     <w:p>
       <w:pPr>
+        <w:tabs>
+          <w:tab w:val="left" w:pos="2551"/>
+          <w:tab w:val="left" w:pos="4819"/>
+          <w:tab w:val="left" w:pos="7087"/>
+        </w:tabs>
         <w:spacing w:before="80" w:after="60"/>
         <w:ind w:left="283"/>
         <w:rPr>
@@ -319,7 +492,26 @@
         <w:rPr>
           <w:sz w:val="24"/>
         </w:rPr>
-        <w:t>rd  B. b</w:t>
+        <w:t>rd</w:t>
+      </w:r>
+      <w:r>
+        <w:rPr>
+          <w:sz w:val="24"/>
+        </w:rPr>
+        <w:tab/>
+      </w:r>
+      <w:r>
+        <w:rPr>
+          <w:b/>
+          <w:sz w:val="24"/>
+        </w:rPr>
+        <w:t xml:space="preserve">B. </w:t>
+      </w:r>
+      <w:r>
+        <w:rPr>
+          <w:sz w:val="24"/>
+        </w:rPr>
+        <w:t xml:space="preserve"> b</w:t>
       </w:r>
       <w:r>
         <w:rPr>
@@ -332,7 +524,26 @@
         <w:rPr>
           <w:sz w:val="24"/>
         </w:rPr>
-        <w:t>rd  C. w</w:t>
+        <w:t>rd</w:t>
+      </w:r>
+      <w:r>
+        <w:rPr>
+          <w:sz w:val="24"/>
+        </w:rPr>
+        <w:tab/>
+      </w:r>
+      <w:r>
+        <w:rPr>
+          <w:b/>
+          <w:sz w:val="24"/>
+        </w:rPr>
+        <w:t xml:space="preserve">C. </w:t>
+      </w:r>
+      <w:r>
+        <w:rPr>
+          <w:sz w:val="24"/>
+        </w:rPr>
+        <w:t xml:space="preserve"> w</w:t>
       </w:r>
       <w:r>
         <w:rPr>
@@ -345,7 +556,26 @@
         <w:rPr>
           <w:sz w:val="24"/>
         </w:rPr>
-        <w:t>rld  D. pict</w:t>
+        <w:t>rld</w:t>
+      </w:r>
+      <w:r>
+        <w:rPr>
+          <w:sz w:val="24"/>
+        </w:rPr>
+        <w:tab/>
+      </w:r>
+      <w:r>
+        <w:rPr>
+          <w:b/>
+          <w:sz w:val="24"/>
+        </w:rPr>
+        <w:t xml:space="preserve">D. </w:t>
+      </w:r>
+      <w:r>
+        <w:rPr>
+          <w:sz w:val="24"/>
+        </w:rPr>
+        <w:t xml:space="preserve"> pict</w:t>
       </w:r>
       <w:r>
         <w:rPr>
@@ -363,6 +593,11 @@
     </w:p>
     <w:p>
       <w:pPr>
+        <w:tabs>
+          <w:tab w:val="left" w:pos="2551"/>
+          <w:tab w:val="left" w:pos="4819"/>
+          <w:tab w:val="left" w:pos="7087"/>
+        </w:tabs>
         <w:spacing w:before="80" w:after="60"/>
         <w:ind w:left="283"/>
         <w:rPr>
@@ -399,7 +634,26 @@
         <w:rPr>
           <w:sz w:val="24"/>
         </w:rPr>
-        <w:t xml:space="preserve">ing  B. </w:t>
+        <w:t>ing</w:t>
+      </w:r>
+      <w:r>
+        <w:rPr>
+          <w:sz w:val="24"/>
+        </w:rPr>
+        <w:tab/>
+      </w:r>
+      <w:r>
+        <w:rPr>
+          <w:b/>
+          <w:sz w:val="24"/>
+        </w:rPr>
+        <w:t xml:space="preserve">B. </w:t>
+      </w:r>
+      <w:r>
+        <w:rPr>
+          <w:sz w:val="24"/>
+        </w:rPr>
+        <w:t xml:space="preserve"> </w:t>
       </w:r>
       <w:r>
         <w:rPr>
@@ -412,7 +666,26 @@
         <w:rPr>
           <w:sz w:val="24"/>
         </w:rPr>
-        <w:t>ildren  C. s</w:t>
+        <w:t>ildren</w:t>
+      </w:r>
+      <w:r>
+        <w:rPr>
+          <w:sz w:val="24"/>
+        </w:rPr>
+        <w:tab/>
+      </w:r>
+      <w:r>
+        <w:rPr>
+          <w:b/>
+          <w:sz w:val="24"/>
+        </w:rPr>
+        <w:t xml:space="preserve">C. </w:t>
+      </w:r>
+      <w:r>
+        <w:rPr>
+          <w:sz w:val="24"/>
+        </w:rPr>
+        <w:t xml:space="preserve"> s</w:t>
       </w:r>
       <w:r>
         <w:rPr>
@@ -425,7 +698,26 @@
         <w:rPr>
           <w:sz w:val="24"/>
         </w:rPr>
-        <w:t xml:space="preserve">ool  D. </w:t>
+        <w:t>ool</w:t>
+      </w:r>
+      <w:r>
+        <w:rPr>
+          <w:sz w:val="24"/>
+        </w:rPr>
+        <w:tab/>
+      </w:r>
+      <w:r>
+        <w:rPr>
+          <w:b/>
+          <w:sz w:val="24"/>
+        </w:rPr>
+        <w:t xml:space="preserve">D. </w:t>
+      </w:r>
+      <w:r>
+        <w:rPr>
+          <w:sz w:val="24"/>
+        </w:rPr>
+        <w:t xml:space="preserve"> </w:t>
       </w:r>
       <w:r>
         <w:rPr>
@@ -443,7 +735,6 @@
     </w:p>
     <w:p>
       <w:pPr>
-        <w:keepNext/>
         <w:spacing w:before="120" w:after="80"/>
         <w:rPr>
           <w:b/>
@@ -460,16 +751,13 @@
     </w:p>
     <w:p>
       <w:pPr>
-        <w:keepNext/>
         <w:spacing w:before="120" w:after="80"/>
         <w:rPr>
-          <w:b/>
-          <w:sz w:val="24"/>
-        </w:rPr>
-      </w:pPr>
-      <w:r>
-        <w:rPr>
-          <w:b/>
+          <w:sz w:val="24"/>
+        </w:rPr>
+      </w:pPr>
+      <w:r>
+        <w:rPr>
           <w:sz w:val="24"/>
         </w:rPr>
         <w:t>1. My father can make beautiful pieces of art ______ empty eggshells.</w:t>
@@ -477,6 +765,11 @@
     </w:p>
     <w:p>
       <w:pPr>
+        <w:tabs>
+          <w:tab w:val="left" w:pos="2551"/>
+          <w:tab w:val="left" w:pos="4819"/>
+          <w:tab w:val="left" w:pos="7087"/>
+        </w:tabs>
         <w:spacing w:before="80" w:after="60"/>
         <w:ind w:left="283"/>
         <w:rPr>
@@ -494,21 +787,75 @@
         <w:rPr>
           <w:sz w:val="24"/>
         </w:rPr>
-        <w:t xml:space="preserve"> of  B. from  C. in  D. into</w:t>
-      </w:r>
-    </w:p>
-    <w:p>
-      <w:pPr>
-        <w:keepNext/>
+        <w:t xml:space="preserve"> of</w:t>
+      </w:r>
+      <w:r>
+        <w:rPr>
+          <w:sz w:val="24"/>
+        </w:rPr>
+        <w:tab/>
+      </w:r>
+      <w:r>
+        <w:rPr>
+          <w:b/>
+          <w:sz w:val="24"/>
+        </w:rPr>
+        <w:t xml:space="preserve">B. </w:t>
+      </w:r>
+      <w:r>
+        <w:rPr>
+          <w:sz w:val="24"/>
+        </w:rPr>
+        <w:t xml:space="preserve"> from</w:t>
+      </w:r>
+      <w:r>
+        <w:rPr>
+          <w:sz w:val="24"/>
+        </w:rPr>
+        <w:tab/>
+      </w:r>
+      <w:r>
+        <w:rPr>
+          <w:b/>
+          <w:sz w:val="24"/>
+        </w:rPr>
+        <w:t xml:space="preserve">C. </w:t>
+      </w:r>
+      <w:r>
+        <w:rPr>
+          <w:sz w:val="24"/>
+        </w:rPr>
+        <w:t xml:space="preserve"> in</w:t>
+      </w:r>
+      <w:r>
+        <w:rPr>
+          <w:sz w:val="24"/>
+        </w:rPr>
+        <w:tab/>
+      </w:r>
+      <w:r>
+        <w:rPr>
+          <w:b/>
+          <w:sz w:val="24"/>
+        </w:rPr>
+        <w:t xml:space="preserve">D. </w:t>
+      </w:r>
+      <w:r>
+        <w:rPr>
+          <w:sz w:val="24"/>
+        </w:rPr>
+        <w:t xml:space="preserve"> into</w:t>
+      </w:r>
+    </w:p>
+    <w:p>
+      <w:pPr>
         <w:spacing w:before="120" w:after="80"/>
         <w:rPr>
-          <w:b/>
-          <w:sz w:val="24"/>
-        </w:rPr>
-      </w:pPr>
-      <w:r>
-        <w:rPr>
-          <w:b/>
+          <w:sz w:val="24"/>
+        </w:rPr>
+      </w:pPr>
+      <w:r>
+        <w:rPr>
           <w:sz w:val="24"/>
         </w:rPr>
         <w:t>2. Why don't you take ______ a new hobby?</w:t>
@@ -516,6 +863,11 @@
     </w:p>
     <w:p>
       <w:pPr>
+        <w:tabs>
+          <w:tab w:val="left" w:pos="2551"/>
+          <w:tab w:val="left" w:pos="4819"/>
+          <w:tab w:val="left" w:pos="7087"/>
+        </w:tabs>
         <w:spacing w:before="80" w:after="60"/>
         <w:ind w:left="283"/>
         <w:rPr>
@@ -533,21 +885,75 @@
         <w:rPr>
           <w:sz w:val="24"/>
         </w:rPr>
-        <w:t xml:space="preserve"> up  B. in  C. over  D. after</w:t>
-      </w:r>
-    </w:p>
-    <w:p>
-      <w:pPr>
-        <w:keepNext/>
+        <w:t xml:space="preserve"> up</w:t>
+      </w:r>
+      <w:r>
+        <w:rPr>
+          <w:sz w:val="24"/>
+        </w:rPr>
+        <w:tab/>
+      </w:r>
+      <w:r>
+        <w:rPr>
+          <w:b/>
+          <w:sz w:val="24"/>
+        </w:rPr>
+        <w:t xml:space="preserve">B. </w:t>
+      </w:r>
+      <w:r>
+        <w:rPr>
+          <w:sz w:val="24"/>
+        </w:rPr>
+        <w:t xml:space="preserve"> in</w:t>
+      </w:r>
+      <w:r>
+        <w:rPr>
+          <w:sz w:val="24"/>
+        </w:rPr>
+        <w:tab/>
+      </w:r>
+      <w:r>
+        <w:rPr>
+          <w:b/>
+          <w:sz w:val="24"/>
+        </w:rPr>
+        <w:t xml:space="preserve">C. </w:t>
+      </w:r>
+      <w:r>
+        <w:rPr>
+          <w:sz w:val="24"/>
+        </w:rPr>
+        <w:t xml:space="preserve"> over</w:t>
+      </w:r>
+      <w:r>
+        <w:rPr>
+          <w:sz w:val="24"/>
+        </w:rPr>
+        <w:tab/>
+      </w:r>
+      <w:r>
+        <w:rPr>
+          <w:b/>
+          <w:sz w:val="24"/>
+        </w:rPr>
+        <w:t xml:space="preserve">D. </w:t>
+      </w:r>
+      <w:r>
+        <w:rPr>
+          <w:sz w:val="24"/>
+        </w:rPr>
+        <w:t xml:space="preserve"> after</w:t>
+      </w:r>
+    </w:p>
+    <w:p>
+      <w:pPr>
         <w:spacing w:before="120" w:after="80"/>
         <w:rPr>
-          <w:b/>
-          <w:sz w:val="24"/>
-        </w:rPr>
-      </w:pPr>
-      <w:r>
-        <w:rPr>
-          <w:b/>
+          <w:sz w:val="24"/>
+        </w:rPr>
+      </w:pPr>
+      <w:r>
+        <w:rPr>
           <w:sz w:val="24"/>
         </w:rPr>
         <w:t>3. Collecting cars is a(n) ______ hobby. It costs a lot of money.</w:t>
@@ -555,6 +961,11 @@
     </w:p>
     <w:p>
       <w:pPr>
+        <w:tabs>
+          <w:tab w:val="left" w:pos="2551"/>
+          <w:tab w:val="left" w:pos="4819"/>
+          <w:tab w:val="left" w:pos="7087"/>
+        </w:tabs>
         <w:spacing w:before="80" w:after="60"/>
         <w:ind w:left="283"/>
         <w:rPr>
@@ -572,21 +983,75 @@
         <w:rPr>
           <w:sz w:val="24"/>
         </w:rPr>
-        <w:t xml:space="preserve"> interesting  B. cheap  C. expensive  D. unusual</w:t>
-      </w:r>
-    </w:p>
-    <w:p>
-      <w:pPr>
-        <w:keepNext/>
+        <w:t xml:space="preserve"> interesting</w:t>
+      </w:r>
+      <w:r>
+        <w:rPr>
+          <w:sz w:val="24"/>
+        </w:rPr>
+        <w:tab/>
+      </w:r>
+      <w:r>
+        <w:rPr>
+          <w:b/>
+          <w:sz w:val="24"/>
+        </w:rPr>
+        <w:t xml:space="preserve">B. </w:t>
+      </w:r>
+      <w:r>
+        <w:rPr>
+          <w:sz w:val="24"/>
+        </w:rPr>
+        <w:t xml:space="preserve"> cheap</w:t>
+      </w:r>
+      <w:r>
+        <w:rPr>
+          <w:sz w:val="24"/>
+        </w:rPr>
+        <w:tab/>
+      </w:r>
+      <w:r>
+        <w:rPr>
+          <w:b/>
+          <w:sz w:val="24"/>
+        </w:rPr>
+        <w:t xml:space="preserve">C. </w:t>
+      </w:r>
+      <w:r>
+        <w:rPr>
+          <w:sz w:val="24"/>
+        </w:rPr>
+        <w:t xml:space="preserve"> expensive</w:t>
+      </w:r>
+      <w:r>
+        <w:rPr>
+          <w:sz w:val="24"/>
+        </w:rPr>
+        <w:tab/>
+      </w:r>
+      <w:r>
+        <w:rPr>
+          <w:b/>
+          <w:sz w:val="24"/>
+        </w:rPr>
+        <w:t xml:space="preserve">D. </w:t>
+      </w:r>
+      <w:r>
+        <w:rPr>
+          <w:sz w:val="24"/>
+        </w:rPr>
+        <w:t xml:space="preserve"> unusual</w:t>
+      </w:r>
+    </w:p>
+    <w:p>
+      <w:pPr>
         <w:spacing w:before="120" w:after="80"/>
         <w:rPr>
-          <w:b/>
-          <w:sz w:val="24"/>
-        </w:rPr>
-      </w:pPr>
-      <w:r>
-        <w:rPr>
-          <w:b/>
+          <w:sz w:val="24"/>
+        </w:rPr>
+      </w:pPr>
+      <w:r>
+        <w:rPr>
           <w:sz w:val="24"/>
         </w:rPr>
         <w:t>4. More people are ______ birds today than ever before.</w:t>
@@ -594,6 +1059,11 @@
     </w:p>
     <w:p>
       <w:pPr>
+        <w:tabs>
+          <w:tab w:val="left" w:pos="2551"/>
+          <w:tab w:val="left" w:pos="4819"/>
+          <w:tab w:val="left" w:pos="7087"/>
+        </w:tabs>
         <w:spacing w:before="80" w:after="60"/>
         <w:ind w:left="283"/>
         <w:rPr>
@@ -611,24 +1081,143 @@
         <w:rPr>
           <w:sz w:val="24"/>
         </w:rPr>
-        <w:t xml:space="preserve"> seeing  B. looking  C. hearing  D. watching</w:t>
-      </w:r>
-    </w:p>
-    <w:p>
-      <w:pPr>
-        <w:keepNext/>
+        <w:t xml:space="preserve"> seeing</w:t>
+      </w:r>
+      <w:r>
+        <w:rPr>
+          <w:sz w:val="24"/>
+        </w:rPr>
+        <w:tab/>
+      </w:r>
+      <w:r>
+        <w:rPr>
+          <w:b/>
+          <w:sz w:val="24"/>
+        </w:rPr>
+        <w:t xml:space="preserve">B. </w:t>
+      </w:r>
+      <w:r>
+        <w:rPr>
+          <w:sz w:val="24"/>
+        </w:rPr>
+        <w:t xml:space="preserve"> looking</w:t>
+      </w:r>
+      <w:r>
+        <w:rPr>
+          <w:sz w:val="24"/>
+        </w:rPr>
+        <w:tab/>
+      </w:r>
+      <w:r>
+        <w:rPr>
+          <w:b/>
+          <w:sz w:val="24"/>
+        </w:rPr>
+        <w:t xml:space="preserve">C. </w:t>
+      </w:r>
+      <w:r>
+        <w:rPr>
+          <w:sz w:val="24"/>
+        </w:rPr>
+        <w:t xml:space="preserve"> hearing</w:t>
+      </w:r>
+      <w:r>
+        <w:rPr>
+          <w:sz w:val="24"/>
+        </w:rPr>
+        <w:tab/>
+      </w:r>
+      <w:r>
+        <w:rPr>
+          <w:b/>
+          <w:sz w:val="24"/>
+        </w:rPr>
+        <w:t xml:space="preserve">D. </w:t>
+      </w:r>
+      <w:r>
+        <w:rPr>
+          <w:sz w:val="24"/>
+        </w:rPr>
+        <w:t xml:space="preserve"> watching</w:t>
+      </w:r>
+    </w:p>
+    <w:p>
+      <w:pPr>
         <w:spacing w:before="120" w:after="80"/>
         <w:rPr>
-          <w:b/>
-          <w:sz w:val="24"/>
-        </w:rPr>
-      </w:pPr>
-      <w:r>
-        <w:rPr>
-          <w:b/>
-          <w:sz w:val="24"/>
-        </w:rPr>
-        <w:t>IV. Complete the sentences with the correct form or tense of the verb play, go, do or collect.</w:t>
+          <w:sz w:val="24"/>
+        </w:rPr>
+      </w:pPr>
+      <w:r>
+        <w:rPr>
+          <w:sz w:val="24"/>
+        </w:rPr>
+        <w:t>*</w:t>
+      </w:r>
+      <w:r>
+        <w:rPr>
+          <w:i/>
+          <w:sz w:val="24"/>
+        </w:rPr>
+        <w:t xml:space="preserve">IV. Complete the sentences with the correct form or tense of the verb </w:t>
+      </w:r>
+      <w:r>
+        <w:rPr>
+          <w:sz w:val="24"/>
+        </w:rPr>
+        <w:t>play</w:t>
+      </w:r>
+      <w:r>
+        <w:rPr>
+          <w:i/>
+          <w:sz w:val="24"/>
+        </w:rPr>
+        <w:t xml:space="preserve">, </w:t>
+      </w:r>
+      <w:r>
+        <w:rPr>
+          <w:sz w:val="24"/>
+        </w:rPr>
+        <w:t>go</w:t>
+      </w:r>
+      <w:r>
+        <w:rPr>
+          <w:i/>
+          <w:sz w:val="24"/>
+        </w:rPr>
+        <w:t xml:space="preserve">, </w:t>
+      </w:r>
+      <w:r>
+        <w:rPr>
+          <w:sz w:val="24"/>
+        </w:rPr>
+        <w:t>do</w:t>
+      </w:r>
+      <w:r>
+        <w:rPr>
+          <w:i/>
+          <w:sz w:val="24"/>
+        </w:rPr>
+        <w:t xml:space="preserve"> or </w:t>
+      </w:r>
+      <w:r>
+        <w:rPr>
+          <w:sz w:val="24"/>
+        </w:rPr>
+        <w:t>collect</w:t>
+      </w:r>
+      <w:r>
+        <w:rPr>
+          <w:i/>
+          <w:sz w:val="24"/>
+        </w:rPr>
+        <w:t>.</w:t>
+      </w:r>
+      <w:r>
+        <w:rPr>
+          <w:sz w:val="24"/>
+        </w:rPr>
+        <w:t>*</w:t>
       </w:r>
     </w:p>
     <w:p>
@@ -647,16 +1236,13 @@
     </w:p>
     <w:p>
       <w:pPr>
-        <w:keepNext/>
         <w:spacing w:before="120" w:after="80"/>
         <w:rPr>
-          <w:b/>
-          <w:sz w:val="24"/>
-        </w:rPr>
-      </w:pPr>
-      <w:r>
-        <w:rPr>
-          <w:b/>
+          <w:sz w:val="24"/>
+        </w:rPr>
+      </w:pPr>
+      <w:r>
+        <w:rPr>
           <w:sz w:val="24"/>
         </w:rPr>
         <w:t>2. We ______ camping in Dam Sen Park yesterday.</w:t>
@@ -678,16 +1264,13 @@
     </w:p>
     <w:p>
       <w:pPr>
-        <w:keepNext/>
         <w:spacing w:before="120" w:after="80"/>
         <w:rPr>
-          <w:b/>
-          <w:sz w:val="24"/>
-        </w:rPr>
-      </w:pPr>
-      <w:r>
-        <w:rPr>
-          <w:b/>
+          <w:sz w:val="24"/>
+        </w:rPr>
+      </w:pPr>
+      <w:r>
+        <w:rPr>
           <w:sz w:val="24"/>
         </w:rPr>
         <w:t>4. Do you want ______ mountain biking with me this weekend?</w:t>
@@ -695,7 +1278,6 @@
     </w:p>
     <w:p>
       <w:pPr>
-        <w:keepNext/>
         <w:spacing w:before="120" w:after="80"/>
         <w:rPr>
           <w:b/>
@@ -712,103 +1294,106 @@
     </w:p>
     <w:p>
       <w:pPr>
-        <w:keepNext/>
         <w:tabs>
-          <w:tab w:val="left" w:pos="4677"/>
+          <w:tab w:val="right" w:pos="9354"/>
         </w:tabs>
         <w:spacing w:before="60" w:after="60"/>
-        <w:rPr>
-          <w:sz w:val="24"/>
-        </w:rPr>
-      </w:pPr>
-      <w:r>
-        <w:rPr>
-          <w:sz w:val="24"/>
-        </w:rPr>
-        <w:t>1. Nam is my classmates. He watches TV every night.  ______</w:t>
-      </w:r>
-      <w:r>
-        <w:rPr>
-          <w:sz w:val="24"/>
-        </w:rPr>
-        <w:tab/>
-      </w:r>
-    </w:p>
-    <w:p>
-      <w:pPr>
-        <w:keepNext/>
+        <w:ind w:left="5669" w:hanging="5669"/>
+        <w:rPr>
+          <w:sz w:val="24"/>
+        </w:rPr>
+      </w:pPr>
+      <w:r>
+        <w:rPr>
+          <w:sz w:val="24"/>
+        </w:rPr>
+        <w:t>1. Nam is my classmates. He watches TV every night.</w:t>
+      </w:r>
+      <w:r>
+        <w:rPr>
+          <w:sz w:val="24"/>
+        </w:rPr>
+        <w:tab/>
+        <w:t>___________</w:t>
+      </w:r>
+    </w:p>
+    <w:p>
+      <w:pPr>
         <w:tabs>
-          <w:tab w:val="left" w:pos="4677"/>
+          <w:tab w:val="right" w:pos="9354"/>
         </w:tabs>
         <w:spacing w:before="60" w:after="60"/>
-        <w:rPr>
-          <w:sz w:val="24"/>
-        </w:rPr>
-      </w:pPr>
-      <w:r>
-        <w:rPr>
-          <w:sz w:val="24"/>
-        </w:rPr>
-        <w:t>2. I think collecting stamps are interesting.  ______</w:t>
-      </w:r>
-      <w:r>
-        <w:rPr>
-          <w:sz w:val="24"/>
-        </w:rPr>
-        <w:tab/>
-      </w:r>
-    </w:p>
-    <w:p>
-      <w:pPr>
-        <w:keepNext/>
+        <w:ind w:left="5669" w:hanging="5669"/>
+        <w:rPr>
+          <w:sz w:val="24"/>
+        </w:rPr>
+      </w:pPr>
+      <w:r>
+        <w:rPr>
+          <w:sz w:val="24"/>
+        </w:rPr>
+        <w:t>2. I think collecting stamps are interesting.</w:t>
+      </w:r>
+      <w:r>
+        <w:rPr>
+          <w:sz w:val="24"/>
+        </w:rPr>
+        <w:tab/>
+        <w:t>___________</w:t>
+      </w:r>
+    </w:p>
+    <w:p>
+      <w:pPr>
         <w:tabs>
-          <w:tab w:val="left" w:pos="4677"/>
+          <w:tab w:val="right" w:pos="9354"/>
         </w:tabs>
         <w:spacing w:before="60" w:after="60"/>
-        <w:rPr>
-          <w:sz w:val="24"/>
-        </w:rPr>
-      </w:pPr>
-      <w:r>
-        <w:rPr>
-          <w:sz w:val="24"/>
-        </w:rPr>
-        <w:t>3. My dad cooks very good. He loves preparing meals for our family.  ______</w:t>
-      </w:r>
-      <w:r>
-        <w:rPr>
-          <w:sz w:val="24"/>
-        </w:rPr>
-        <w:tab/>
-      </w:r>
-    </w:p>
-    <w:p>
-      <w:pPr>
-        <w:keepNext/>
+        <w:ind w:left="5669" w:hanging="5669"/>
+        <w:rPr>
+          <w:sz w:val="24"/>
+        </w:rPr>
+      </w:pPr>
+      <w:r>
+        <w:rPr>
+          <w:sz w:val="24"/>
+        </w:rPr>
+        <w:t>3. My dad cooks very good. He loves preparing meals for our family.</w:t>
+      </w:r>
+      <w:r>
+        <w:rPr>
+          <w:sz w:val="24"/>
+        </w:rPr>
+        <w:tab/>
+        <w:t>___________</w:t>
+      </w:r>
+    </w:p>
+    <w:p>
+      <w:pPr>
         <w:tabs>
-          <w:tab w:val="left" w:pos="4677"/>
+          <w:tab w:val="right" w:pos="9354"/>
         </w:tabs>
         <w:spacing w:before="60" w:after="60"/>
-        <w:rPr>
-          <w:sz w:val="24"/>
-        </w:rPr>
-      </w:pPr>
-      <w:r>
-        <w:rPr>
-          <w:sz w:val="24"/>
-        </w:rPr>
-        <w:t>4. I enjoy to ride my bike to school.  ______</w:t>
-      </w:r>
-      <w:r>
-        <w:rPr>
-          <w:sz w:val="24"/>
-        </w:rPr>
-        <w:tab/>
-      </w:r>
-    </w:p>
-    <w:p>
-      <w:pPr>
-        <w:keepNext/>
+        <w:ind w:left="4456" w:hanging="4456"/>
+        <w:rPr>
+          <w:sz w:val="24"/>
+        </w:rPr>
+      </w:pPr>
+      <w:r>
+        <w:rPr>
+          <w:sz w:val="24"/>
+        </w:rPr>
+        <w:t>4. I enjoy to ride my bike to school.</w:t>
+      </w:r>
+      <w:r>
+        <w:rPr>
+          <w:sz w:val="24"/>
+        </w:rPr>
+        <w:tab/>
+        <w:t>___________</w:t>
+      </w:r>
+    </w:p>
+    <w:p>
+      <w:pPr>
         <w:spacing w:before="120" w:after="80"/>
         <w:rPr>
           <w:b/>
@@ -825,17 +1410,14 @@
     </w:p>
     <w:p>
       <w:pPr>
-        <w:keepNext/>
         <w:spacing w:before="120" w:after="120"/>
-        <w:ind w:left="567" w:right="567"/>
-        <w:rPr>
-          <w:i/>
-          <w:sz w:val="24"/>
-        </w:rPr>
-      </w:pPr>
-      <w:r>
-        <w:rPr>
-          <w:i/>
+        <w:ind w:left="283" w:right="283"/>
+        <w:rPr>
+          <w:sz w:val="24"/>
+        </w:rPr>
+      </w:pPr>
+      <w:r>
+        <w:rPr>
           <w:sz w:val="24"/>
         </w:rPr>
         <w:t>Many people (1)______ crafting with paper. The materials are readily available and don't cost much; and no super special talents are needed. Anyone (2)______ be a paper crafter.</w:t>
@@ -843,43 +1425,26 @@
     </w:p>
     <w:p>
       <w:pPr>
-        <w:keepNext/>
         <w:spacing w:before="120" w:after="120"/>
-        <w:ind w:left="567" w:right="567"/>
-        <w:rPr>
-          <w:i/>
-          <w:sz w:val="24"/>
-        </w:rPr>
-      </w:pPr>
-    </w:p>
-    <w:p>
-      <w:pPr>
-        <w:keepNext/>
-        <w:spacing w:before="120" w:after="120"/>
-        <w:ind w:left="567" w:right="567"/>
-        <w:rPr>
-          <w:i/>
-          <w:sz w:val="24"/>
-        </w:rPr>
-      </w:pPr>
-      <w:r>
-        <w:rPr>
-          <w:i/>
-          <w:sz w:val="24"/>
-        </w:rPr>
-        <w:t xml:space="preserve">There are many different paper craft techniques. Origami is one of ancient techniques developed in Japan where squares of paper are (3)______ and formed into various objects such as flowers, animals, and boxes. Card (4)______ is also a favourite paper craft technique. Birthday cards are the most popular greeting cards, </w:t>
-      </w:r>
-      <w:r>
-        <w:rPr>
-          <w:i/>
-          <w:sz w:val="24"/>
-        </w:rPr>
-        <w:lastRenderedPageBreak/>
-        <w:t>followed by Christmas cards. Receiving a (5)______ card is a special gift, because of the time and effort someone spent making it. It lets the recipient know just how much you care (6)______ them.</w:t>
-      </w:r>
-    </w:p>
-    <w:p>
-      <w:pPr>
+        <w:ind w:left="283" w:right="283"/>
+        <w:rPr>
+          <w:sz w:val="24"/>
+        </w:rPr>
+      </w:pPr>
+      <w:r>
+        <w:rPr>
+          <w:sz w:val="24"/>
+        </w:rPr>
+        <w:t>There are many different paper craft techniques. Origami is one of ancient techniques developed in Japan where squares of paper are (3)______ and formed into various objects such as flowers, animals, and boxes. Card (4)______ is also a favourite paper craft technique. Birthday cards are the most popular greeting cards, followed by Christmas cards. Receiving a (5)______ card is a special gift, because of the time and effort someone spent making it. It lets the recipient know just how much you care (6)______ them.</w:t>
+      </w:r>
+    </w:p>
+    <w:p>
+      <w:pPr>
+        <w:tabs>
+          <w:tab w:val="left" w:pos="2551"/>
+          <w:tab w:val="left" w:pos="4819"/>
+          <w:tab w:val="left" w:pos="7087"/>
+        </w:tabs>
         <w:spacing w:before="80" w:after="60"/>
         <w:ind w:left="283"/>
         <w:rPr>
@@ -890,6 +1455,7 @@
         <w:rPr>
           <w:sz w:val="24"/>
         </w:rPr>
+        <w:lastRenderedPageBreak/>
         <w:t xml:space="preserve">1. </w:t>
       </w:r>
       <w:r>
@@ -903,11 +1469,73 @@
         <w:rPr>
           <w:sz w:val="24"/>
         </w:rPr>
-        <w:t xml:space="preserve"> enjoy  B. decide  C. want  D. learn</w:t>
-      </w:r>
-    </w:p>
-    <w:p>
-      <w:pPr>
+        <w:t xml:space="preserve"> enjoy</w:t>
+      </w:r>
+      <w:r>
+        <w:rPr>
+          <w:sz w:val="24"/>
+        </w:rPr>
+        <w:tab/>
+      </w:r>
+      <w:r>
+        <w:rPr>
+          <w:b/>
+          <w:sz w:val="24"/>
+        </w:rPr>
+        <w:t xml:space="preserve">B. </w:t>
+      </w:r>
+      <w:r>
+        <w:rPr>
+          <w:sz w:val="24"/>
+        </w:rPr>
+        <w:t xml:space="preserve"> decide</w:t>
+      </w:r>
+      <w:r>
+        <w:rPr>
+          <w:sz w:val="24"/>
+        </w:rPr>
+        <w:tab/>
+      </w:r>
+      <w:r>
+        <w:rPr>
+          <w:b/>
+          <w:sz w:val="24"/>
+        </w:rPr>
+        <w:t xml:space="preserve">C. </w:t>
+      </w:r>
+      <w:r>
+        <w:rPr>
+          <w:sz w:val="24"/>
+        </w:rPr>
+        <w:t xml:space="preserve"> want</w:t>
+      </w:r>
+      <w:r>
+        <w:rPr>
+          <w:sz w:val="24"/>
+        </w:rPr>
+        <w:tab/>
+      </w:r>
+      <w:r>
+        <w:rPr>
+          <w:b/>
+          <w:sz w:val="24"/>
+        </w:rPr>
+        <w:t xml:space="preserve">D. </w:t>
+      </w:r>
+      <w:r>
+        <w:rPr>
+          <w:sz w:val="24"/>
+        </w:rPr>
+        <w:t xml:space="preserve"> learn</w:t>
+      </w:r>
+    </w:p>
+    <w:p>
+      <w:pPr>
+        <w:tabs>
+          <w:tab w:val="left" w:pos="2551"/>
+          <w:tab w:val="left" w:pos="4819"/>
+          <w:tab w:val="left" w:pos="7087"/>
+        </w:tabs>
         <w:spacing w:before="80" w:after="60"/>
         <w:ind w:left="283"/>
         <w:rPr>
@@ -931,11 +1559,73 @@
         <w:rPr>
           <w:sz w:val="24"/>
         </w:rPr>
-        <w:t xml:space="preserve"> must  B. should  C. can  D. will</w:t>
-      </w:r>
-    </w:p>
-    <w:p>
-      <w:pPr>
+        <w:t xml:space="preserve"> must</w:t>
+      </w:r>
+      <w:r>
+        <w:rPr>
+          <w:sz w:val="24"/>
+        </w:rPr>
+        <w:tab/>
+      </w:r>
+      <w:r>
+        <w:rPr>
+          <w:b/>
+          <w:sz w:val="24"/>
+        </w:rPr>
+        <w:t xml:space="preserve">B. </w:t>
+      </w:r>
+      <w:r>
+        <w:rPr>
+          <w:sz w:val="24"/>
+        </w:rPr>
+        <w:t xml:space="preserve"> should</w:t>
+      </w:r>
+      <w:r>
+        <w:rPr>
+          <w:sz w:val="24"/>
+        </w:rPr>
+        <w:tab/>
+      </w:r>
+      <w:r>
+        <w:rPr>
+          <w:b/>
+          <w:sz w:val="24"/>
+        </w:rPr>
+        <w:t xml:space="preserve">C. </w:t>
+      </w:r>
+      <w:r>
+        <w:rPr>
+          <w:sz w:val="24"/>
+        </w:rPr>
+        <w:t xml:space="preserve"> can</w:t>
+      </w:r>
+      <w:r>
+        <w:rPr>
+          <w:sz w:val="24"/>
+        </w:rPr>
+        <w:tab/>
+      </w:r>
+      <w:r>
+        <w:rPr>
+          <w:b/>
+          <w:sz w:val="24"/>
+        </w:rPr>
+        <w:t xml:space="preserve">D. </w:t>
+      </w:r>
+      <w:r>
+        <w:rPr>
+          <w:sz w:val="24"/>
+        </w:rPr>
+        <w:t xml:space="preserve"> will</w:t>
+      </w:r>
+    </w:p>
+    <w:p>
+      <w:pPr>
+        <w:tabs>
+          <w:tab w:val="left" w:pos="2551"/>
+          <w:tab w:val="left" w:pos="4819"/>
+          <w:tab w:val="left" w:pos="7087"/>
+        </w:tabs>
         <w:spacing w:before="80" w:after="60"/>
         <w:ind w:left="283"/>
         <w:rPr>
@@ -959,12 +1649,68 @@
         <w:rPr>
           <w:sz w:val="24"/>
         </w:rPr>
-        <w:t xml:space="preserve"> wrapped  B. folded  C. torn  D. taken</w:t>
-      </w:r>
-    </w:p>
-    <w:p>
-      <w:pPr>
-        <w:keepNext/>
+        <w:t xml:space="preserve"> wrapped</w:t>
+      </w:r>
+      <w:r>
+        <w:rPr>
+          <w:sz w:val="24"/>
+        </w:rPr>
+        <w:tab/>
+      </w:r>
+      <w:r>
+        <w:rPr>
+          <w:b/>
+          <w:sz w:val="24"/>
+        </w:rPr>
+        <w:t xml:space="preserve">B. </w:t>
+      </w:r>
+      <w:r>
+        <w:rPr>
+          <w:sz w:val="24"/>
+        </w:rPr>
+        <w:t xml:space="preserve"> folded</w:t>
+      </w:r>
+      <w:r>
+        <w:rPr>
+          <w:sz w:val="24"/>
+        </w:rPr>
+        <w:tab/>
+      </w:r>
+      <w:r>
+        <w:rPr>
+          <w:b/>
+          <w:sz w:val="24"/>
+        </w:rPr>
+        <w:t xml:space="preserve">C. </w:t>
+      </w:r>
+      <w:r>
+        <w:rPr>
+          <w:sz w:val="24"/>
+        </w:rPr>
+        <w:t xml:space="preserve"> torn</w:t>
+      </w:r>
+      <w:r>
+        <w:rPr>
+          <w:sz w:val="24"/>
+        </w:rPr>
+        <w:tab/>
+      </w:r>
+      <w:r>
+        <w:rPr>
+          <w:b/>
+          <w:sz w:val="24"/>
+        </w:rPr>
+        <w:t xml:space="preserve">D. </w:t>
+      </w:r>
+      <w:r>
+        <w:rPr>
+          <w:sz w:val="24"/>
+        </w:rPr>
+        <w:t xml:space="preserve"> taken</w:t>
+      </w:r>
+    </w:p>
+    <w:p>
+      <w:pPr>
         <w:spacing w:before="120" w:after="80"/>
         <w:rPr>
           <w:b/>
@@ -981,16 +1727,13 @@
     </w:p>
     <w:p>
       <w:pPr>
-        <w:keepNext/>
         <w:spacing w:before="120" w:after="80"/>
         <w:rPr>
-          <w:b/>
-          <w:sz w:val="24"/>
-        </w:rPr>
-      </w:pPr>
-      <w:r>
-        <w:rPr>
-          <w:b/>
+          <w:sz w:val="24"/>
+        </w:rPr>
+      </w:pPr>
+      <w:r>
+        <w:rPr>
           <w:sz w:val="24"/>
         </w:rPr>
         <w:t>1. I/ enjoy/ play/ sports/ because/ it/ good/ health</w:t>
@@ -998,21 +1741,6 @@
     </w:p>
     <w:p>
       <w:pPr>
-        <w:spacing w:before="80" w:after="60"/>
-        <w:ind w:left="283"/>
-        <w:rPr>
-          <w:sz w:val="24"/>
-        </w:rPr>
-      </w:pPr>
-      <w:r>
-        <w:rPr>
-          <w:sz w:val="24"/>
-        </w:rPr>
-        <w:t>__________________________________________________________________________________</w:t>
-      </w:r>
-    </w:p>
-    <w:p>
-      <w:pPr>
         <w:spacing w:before="120" w:after="80"/>
         <w:rPr>
           <w:sz w:val="24"/>
@@ -1022,36 +1750,46 @@
         <w:rPr>
           <w:sz w:val="24"/>
         </w:rPr>
+        <w:t>______</w:t>
+      </w:r>
+    </w:p>
+    <w:p>
+      <w:pPr>
+        <w:spacing w:before="120" w:after="80"/>
+        <w:rPr>
+          <w:sz w:val="24"/>
+        </w:rPr>
+      </w:pPr>
+      <w:r>
+        <w:rPr>
+          <w:sz w:val="24"/>
+        </w:rPr>
         <w:t>2. your children/ go/ camp/ every summer holiday?</w:t>
       </w:r>
     </w:p>
     <w:p>
       <w:pPr>
-        <w:spacing w:before="80" w:after="60"/>
-        <w:ind w:left="283"/>
-        <w:rPr>
-          <w:sz w:val="24"/>
-        </w:rPr>
-      </w:pPr>
-      <w:r>
-        <w:rPr>
-          <w:sz w:val="24"/>
-        </w:rPr>
-        <w:t>__________________________________________________________________________________</w:t>
-      </w:r>
-    </w:p>
-    <w:p>
-      <w:pPr>
-        <w:keepNext/>
         <w:spacing w:before="120" w:after="80"/>
         <w:rPr>
-          <w:b/>
-          <w:sz w:val="24"/>
-        </w:rPr>
-      </w:pPr>
-      <w:r>
-        <w:rPr>
-          <w:b/>
+          <w:sz w:val="24"/>
+        </w:rPr>
+      </w:pPr>
+      <w:r>
+        <w:rPr>
+          <w:sz w:val="24"/>
+        </w:rPr>
+        <w:t>______</w:t>
+      </w:r>
+    </w:p>
+    <w:p>
+      <w:pPr>
+        <w:spacing w:before="120" w:after="80"/>
+        <w:rPr>
+          <w:sz w:val="24"/>
+        </w:rPr>
+      </w:pPr>
+      <w:r>
+        <w:rPr>
           <w:sz w:val="24"/>
         </w:rPr>
         <w:t>3. I/ think/ photography/ can/ expensive hobby</w:t>
@@ -1059,17 +1797,16 @@
     </w:p>
     <w:p>
       <w:pPr>
-        <w:spacing w:before="80" w:after="60"/>
-        <w:ind w:left="283"/>
-        <w:rPr>
-          <w:sz w:val="24"/>
-        </w:rPr>
-      </w:pPr>
-      <w:r>
-        <w:rPr>
-          <w:sz w:val="24"/>
-        </w:rPr>
-        <w:t>__________________________________________________________________________________</w:t>
+        <w:spacing w:before="120" w:after="80"/>
+        <w:rPr>
+          <w:sz w:val="24"/>
+        </w:rPr>
+      </w:pPr>
+      <w:r>
+        <w:rPr>
+          <w:sz w:val="24"/>
+        </w:rPr>
+        <w:t>______</w:t>
       </w:r>
     </w:p>
     <w:p>
@@ -1077,26 +1814,20 @@
         <w:keepNext/>
         <w:spacing w:before="360" w:after="240"/>
         <w:rPr>
-          <w:sz w:val="24"/>
-        </w:rPr>
-      </w:pPr>
-      <w:r>
-        <w:rPr>
-          <w:b/>
-          <w:sz w:val="24"/>
-        </w:rPr>
-        <w:t xml:space="preserve">A. </w:t>
-      </w:r>
-      <w:r>
-        <w:rPr>
-          <w:sz w:val="24"/>
-        </w:rPr>
-        <w:t xml:space="preserve"> PHONETICS</w:t>
-      </w:r>
-    </w:p>
-    <w:p>
-      <w:pPr>
-        <w:keepNext/>
+          <w:b/>
+          <w:sz w:val="24"/>
+        </w:rPr>
+      </w:pPr>
+      <w:r>
+        <w:rPr>
+          <w:b/>
+          <w:sz w:val="24"/>
+        </w:rPr>
+        <w:t>A.  PHONETICS</w:t>
+      </w:r>
+    </w:p>
+    <w:p>
+      <w:pPr>
         <w:spacing w:before="120" w:after="80"/>
         <w:rPr>
           <w:b/>
@@ -1113,69 +1844,200 @@
     </w:p>
     <w:p>
       <w:pPr>
-        <w:spacing w:before="80" w:after="60"/>
-        <w:ind w:left="283"/>
-        <w:rPr>
-          <w:sz w:val="24"/>
-        </w:rPr>
-      </w:pPr>
-      <w:r>
-        <w:rPr>
-          <w:sz w:val="24"/>
-        </w:rPr>
-        <w:t>fun    fine    coffee    over    graph</w:t>
-      </w:r>
-    </w:p>
-    <w:p>
-      <w:pPr>
-        <w:spacing w:before="80" w:after="60"/>
-        <w:ind w:left="283"/>
-        <w:rPr>
-          <w:sz w:val="24"/>
-        </w:rPr>
-      </w:pPr>
-      <w:r>
-        <w:rPr>
-          <w:sz w:val="24"/>
-        </w:rPr>
-        <w:t>phone    brave    verb    stuff    clever</w:t>
-      </w:r>
-    </w:p>
-    <w:p>
-      <w:pPr>
-        <w:spacing w:before="80" w:after="60"/>
-        <w:ind w:left="283"/>
-        <w:rPr>
-          <w:sz w:val="24"/>
-        </w:rPr>
-      </w:pPr>
-      <w:r>
-        <w:rPr>
-          <w:sz w:val="24"/>
-        </w:rPr>
-        <w:t>enough    laughing    leaf    leave    vitamin</w:t>
-      </w:r>
-    </w:p>
-    <w:p>
-      <w:pPr>
-        <w:spacing w:before="80" w:after="60"/>
-        <w:ind w:left="283"/>
-        <w:rPr>
-          <w:sz w:val="24"/>
-        </w:rPr>
-      </w:pPr>
-      <w:r>
-        <w:rPr>
-          <w:sz w:val="24"/>
-        </w:rPr>
-        <w:t>view    few    valley    save    valve</w:t>
-      </w:r>
-    </w:p>
-    <w:p>
-      <w:pPr>
-        <w:keepNext/>
+        <w:tabs>
+          <w:tab w:val="left" w:pos="1871"/>
+          <w:tab w:val="left" w:pos="3742"/>
+          <w:tab w:val="left" w:pos="5613"/>
+          <w:tab w:val="left" w:pos="7483"/>
+        </w:tabs>
         <w:spacing w:before="120" w:after="80"/>
         <w:rPr>
+          <w:sz w:val="24"/>
+        </w:rPr>
+      </w:pPr>
+      <w:r>
+        <w:rPr>
+          <w:sz w:val="24"/>
+        </w:rPr>
+        <w:t>fun</w:t>
+      </w:r>
+      <w:r>
+        <w:rPr>
+          <w:sz w:val="24"/>
+        </w:rPr>
+        <w:tab/>
+        <w:t>fine</w:t>
+      </w:r>
+      <w:r>
+        <w:rPr>
+          <w:sz w:val="24"/>
+        </w:rPr>
+        <w:tab/>
+        <w:t>coffee</w:t>
+      </w:r>
+      <w:r>
+        <w:rPr>
+          <w:sz w:val="24"/>
+        </w:rPr>
+        <w:tab/>
+        <w:t>over</w:t>
+      </w:r>
+      <w:r>
+        <w:rPr>
+          <w:sz w:val="24"/>
+        </w:rPr>
+        <w:tab/>
+        <w:t>graph</w:t>
+      </w:r>
+    </w:p>
+    <w:p>
+      <w:pPr>
+        <w:tabs>
+          <w:tab w:val="left" w:pos="1871"/>
+          <w:tab w:val="left" w:pos="3742"/>
+          <w:tab w:val="left" w:pos="5613"/>
+          <w:tab w:val="left" w:pos="7483"/>
+        </w:tabs>
+        <w:spacing w:before="120" w:after="80"/>
+        <w:rPr>
+          <w:sz w:val="24"/>
+        </w:rPr>
+      </w:pPr>
+      <w:r>
+        <w:rPr>
+          <w:sz w:val="24"/>
+        </w:rPr>
+        <w:t>phone</w:t>
+      </w:r>
+      <w:r>
+        <w:rPr>
+          <w:sz w:val="24"/>
+        </w:rPr>
+        <w:tab/>
+        <w:t>brave</w:t>
+      </w:r>
+      <w:r>
+        <w:rPr>
+          <w:sz w:val="24"/>
+        </w:rPr>
+        <w:tab/>
+        <w:t>verb</w:t>
+      </w:r>
+      <w:r>
+        <w:rPr>
+          <w:sz w:val="24"/>
+        </w:rPr>
+        <w:tab/>
+        <w:t>stuff</w:t>
+      </w:r>
+      <w:r>
+        <w:rPr>
+          <w:sz w:val="24"/>
+        </w:rPr>
+        <w:tab/>
+        <w:t>clever</w:t>
+      </w:r>
+    </w:p>
+    <w:p>
+      <w:pPr>
+        <w:tabs>
+          <w:tab w:val="left" w:pos="1871"/>
+          <w:tab w:val="left" w:pos="3742"/>
+          <w:tab w:val="left" w:pos="5613"/>
+          <w:tab w:val="left" w:pos="7483"/>
+        </w:tabs>
+        <w:spacing w:before="120" w:after="80"/>
+        <w:rPr>
+          <w:sz w:val="24"/>
+        </w:rPr>
+      </w:pPr>
+      <w:r>
+        <w:rPr>
+          <w:sz w:val="24"/>
+        </w:rPr>
+        <w:t>enough</w:t>
+      </w:r>
+      <w:r>
+        <w:rPr>
+          <w:sz w:val="24"/>
+        </w:rPr>
+        <w:tab/>
+        <w:t>laughing</w:t>
+      </w:r>
+      <w:r>
+        <w:rPr>
+          <w:sz w:val="24"/>
+        </w:rPr>
+        <w:tab/>
+        <w:t>leaf</w:t>
+      </w:r>
+      <w:r>
+        <w:rPr>
+          <w:sz w:val="24"/>
+        </w:rPr>
+        <w:tab/>
+        <w:t>leave</w:t>
+      </w:r>
+      <w:r>
+        <w:rPr>
+          <w:sz w:val="24"/>
+        </w:rPr>
+        <w:tab/>
+        <w:t>vitamin</w:t>
+      </w:r>
+    </w:p>
+    <w:p>
+      <w:pPr>
+        <w:tabs>
+          <w:tab w:val="left" w:pos="1871"/>
+          <w:tab w:val="left" w:pos="3742"/>
+          <w:tab w:val="left" w:pos="5613"/>
+          <w:tab w:val="left" w:pos="7483"/>
+        </w:tabs>
+        <w:spacing w:before="120" w:after="80"/>
+        <w:rPr>
+          <w:sz w:val="24"/>
+        </w:rPr>
+      </w:pPr>
+      <w:r>
+        <w:rPr>
+          <w:sz w:val="24"/>
+        </w:rPr>
+        <w:t>view</w:t>
+      </w:r>
+      <w:r>
+        <w:rPr>
+          <w:sz w:val="24"/>
+        </w:rPr>
+        <w:tab/>
+        <w:t>few</w:t>
+      </w:r>
+      <w:r>
+        <w:rPr>
+          <w:sz w:val="24"/>
+        </w:rPr>
+        <w:tab/>
+        <w:t>valley</w:t>
+      </w:r>
+      <w:r>
+        <w:rPr>
+          <w:sz w:val="24"/>
+        </w:rPr>
+        <w:tab/>
+        <w:t>save</w:t>
+      </w:r>
+      <w:r>
+        <w:rPr>
+          <w:sz w:val="24"/>
+        </w:rPr>
+        <w:tab/>
+        <w:t>valve</w:t>
+      </w:r>
+    </w:p>
+    <w:p>
+      <w:pPr>
+        <w:spacing w:before="120" w:after="80"/>
+        <w:rPr>
           <w:b/>
           <w:sz w:val="24"/>
         </w:rPr>
@@ -1190,16 +2052,13 @@
     </w:p>
     <w:p>
       <w:pPr>
-        <w:keepNext/>
         <w:spacing w:before="120" w:after="80"/>
         <w:rPr>
-          <w:b/>
-          <w:sz w:val="24"/>
-        </w:rPr>
-      </w:pPr>
-      <w:r>
-        <w:rPr>
-          <w:b/>
+          <w:sz w:val="24"/>
+        </w:rPr>
+      </w:pPr>
+      <w:r>
+        <w:rPr>
           <w:sz w:val="24"/>
         </w:rPr>
         <w:t>1. I feel so bad. Maybe I should take a rest for some minutes.</w:t>
@@ -1207,16 +2066,13 @@
     </w:p>
     <w:p>
       <w:pPr>
-        <w:keepNext/>
         <w:spacing w:before="120" w:after="80"/>
         <w:rPr>
-          <w:b/>
-          <w:sz w:val="24"/>
-        </w:rPr>
-      </w:pPr>
-      <w:r>
-        <w:rPr>
-          <w:b/>
+          <w:sz w:val="24"/>
+        </w:rPr>
+      </w:pPr>
+      <w:r>
+        <w:rPr>
           <w:sz w:val="24"/>
         </w:rPr>
         <w:t>2. His wife is laughing at the picture of the knight on the floor.</w:t>
@@ -1224,16 +2080,13 @@
     </w:p>
     <w:p>
       <w:pPr>
-        <w:keepNext/>
         <w:spacing w:before="120" w:after="80"/>
         <w:rPr>
-          <w:b/>
-          <w:sz w:val="24"/>
-        </w:rPr>
-      </w:pPr>
-      <w:r>
-        <w:rPr>
-          <w:b/>
+          <w:sz w:val="24"/>
+        </w:rPr>
+      </w:pPr>
+      <w:r>
+        <w:rPr>
           <w:sz w:val="24"/>
         </w:rPr>
         <w:t>3. Live our life and hold our fate.</w:t>
@@ -1241,33 +2094,40 @@
     </w:p>
     <w:p>
       <w:pPr>
-        <w:keepNext/>
         <w:spacing w:before="120" w:after="80"/>
         <w:rPr>
-          <w:b/>
-          <w:sz w:val="24"/>
-        </w:rPr>
-      </w:pPr>
-      <w:r>
-        <w:rPr>
-          <w:b/>
-          <w:sz w:val="24"/>
-        </w:rPr>
-        <w:t>4. Which is the best movie in Fast and Furious series?</w:t>
-      </w:r>
-    </w:p>
-    <w:p>
-      <w:pPr>
-        <w:keepNext/>
+          <w:sz w:val="24"/>
+        </w:rPr>
+      </w:pPr>
+      <w:r>
+        <w:rPr>
+          <w:sz w:val="24"/>
+        </w:rPr>
+        <w:t xml:space="preserve">4. Which is the best movie in </w:t>
+      </w:r>
+      <w:r>
+        <w:rPr>
+          <w:i/>
+          <w:sz w:val="24"/>
+        </w:rPr>
+        <w:t>Fast and Furious</w:t>
+      </w:r>
+      <w:r>
+        <w:rPr>
+          <w:sz w:val="24"/>
+        </w:rPr>
+        <w:t xml:space="preserve"> series?</w:t>
+      </w:r>
+    </w:p>
+    <w:p>
+      <w:pPr>
         <w:spacing w:before="120" w:after="80"/>
         <w:rPr>
-          <w:b/>
-          <w:sz w:val="24"/>
-        </w:rPr>
-      </w:pPr>
-      <w:r>
-        <w:rPr>
-          <w:b/>
+          <w:sz w:val="24"/>
+        </w:rPr>
+      </w:pPr>
+      <w:r>
+        <w:rPr>
           <w:sz w:val="24"/>
         </w:rPr>
         <w:t>5. The invitation cards are beautiful and creative.</w:t>
@@ -1275,16 +2135,13 @@
     </w:p>
     <w:p>
       <w:pPr>
-        <w:keepNext/>
         <w:spacing w:before="120" w:after="80"/>
         <w:rPr>
-          <w:b/>
-          <w:sz w:val="24"/>
-        </w:rPr>
-      </w:pPr>
-      <w:r>
-        <w:rPr>
-          <w:b/>
+          <w:sz w:val="24"/>
+        </w:rPr>
+      </w:pPr>
+      <w:r>
+        <w:rPr>
           <w:sz w:val="24"/>
         </w:rPr>
         <w:t>6. What animals have the rough skin? - Elephants, frogs, etc.</w:t>
@@ -1292,55 +2149,106 @@
     </w:p>
     <w:p>
       <w:pPr>
-        <w:keepNext/>
         <w:tabs>
-          <w:tab w:val="left" w:pos="4677"/>
+          <w:tab w:val="left" w:pos="1984"/>
         </w:tabs>
         <w:spacing w:before="60" w:after="60"/>
-        <w:rPr>
-          <w:sz w:val="24"/>
-        </w:rPr>
-      </w:pPr>
-      <w:r>
-        <w:rPr>
-          <w:sz w:val="24"/>
-        </w:rPr>
-        <w:t>/f/ | /v/</w:t>
-      </w:r>
-      <w:r>
-        <w:rPr>
-          <w:sz w:val="24"/>
-        </w:rPr>
-        <w:tab/>
-      </w:r>
-    </w:p>
-    <w:p>
-      <w:pPr>
-        <w:keepNext/>
+        <w:ind w:left="1984" w:hanging="1984"/>
+        <w:rPr>
+          <w:sz w:val="24"/>
+        </w:rPr>
+      </w:pPr>
+      <w:r>
+        <w:rPr>
+          <w:sz w:val="24"/>
+        </w:rPr>
+        <w:t>/f/</w:t>
+      </w:r>
+      <w:r>
+        <w:rPr>
+          <w:sz w:val="24"/>
+        </w:rPr>
+        <w:tab/>
+        <w:t>/v/</w:t>
+      </w:r>
+    </w:p>
+    <w:p>
+      <w:pPr>
         <w:tabs>
-          <w:tab w:val="left" w:pos="4677"/>
+          <w:tab w:val="right" w:pos="9354"/>
         </w:tabs>
         <w:spacing w:before="60" w:after="60"/>
-        <w:rPr>
-          <w:sz w:val="24"/>
-        </w:rPr>
-      </w:pPr>
-      <w:r>
-        <w:rPr>
-          <w:sz w:val="24"/>
-        </w:rPr>
-        <w:t>_____ | _____</w:t>
-      </w:r>
-      <w:r>
-        <w:rPr>
-          <w:sz w:val="24"/>
-        </w:rPr>
-        <w:tab/>
-      </w:r>
-    </w:p>
-    <w:p>
-      <w:pPr>
-        <w:keepNext/>
+        <w:ind w:left="1984" w:hanging="1984"/>
+        <w:rPr>
+          <w:sz w:val="24"/>
+        </w:rPr>
+      </w:pPr>
+      <w:r>
+        <w:rPr>
+          <w:sz w:val="24"/>
+        </w:rPr>
+        <w:t>______</w:t>
+      </w:r>
+      <w:r>
+        <w:rPr>
+          <w:sz w:val="24"/>
+        </w:rPr>
+        <w:tab/>
+        <w:t>___________</w:t>
+      </w:r>
+    </w:p>
+    <w:p>
+      <w:pPr>
+        <w:tabs>
+          <w:tab w:val="right" w:pos="9354"/>
+        </w:tabs>
+        <w:spacing w:before="60" w:after="60"/>
+        <w:ind w:left="1984" w:hanging="1984"/>
+        <w:rPr>
+          <w:sz w:val="24"/>
+        </w:rPr>
+      </w:pPr>
+      <w:r>
+        <w:rPr>
+          <w:sz w:val="24"/>
+        </w:rPr>
+        <w:t>______</w:t>
+      </w:r>
+      <w:r>
+        <w:rPr>
+          <w:sz w:val="24"/>
+        </w:rPr>
+        <w:tab/>
+        <w:t>___________</w:t>
+      </w:r>
+    </w:p>
+    <w:p>
+      <w:pPr>
+        <w:tabs>
+          <w:tab w:val="right" w:pos="9354"/>
+        </w:tabs>
+        <w:spacing w:before="60" w:after="60"/>
+        <w:ind w:left="1984" w:hanging="1984"/>
+        <w:rPr>
+          <w:sz w:val="24"/>
+        </w:rPr>
+      </w:pPr>
+      <w:r>
+        <w:rPr>
+          <w:sz w:val="24"/>
+        </w:rPr>
+        <w:t>______</w:t>
+      </w:r>
+      <w:r>
+        <w:rPr>
+          <w:sz w:val="24"/>
+        </w:rPr>
+        <w:tab/>
+        <w:t>___________</w:t>
+      </w:r>
+    </w:p>
+    <w:p>
+      <w:pPr>
         <w:spacing w:before="120" w:after="80"/>
         <w:rPr>
           <w:b/>
@@ -1357,15 +2265,13 @@
     </w:p>
     <w:p>
       <w:pPr>
-        <w:keepNext/>
         <w:tabs>
-          <w:tab w:val="left" w:pos="2637"/>
-          <w:tab w:val="left" w:pos="4077"/>
-          <w:tab w:val="left" w:pos="5517"/>
-          <w:tab w:val="left" w:pos="6957"/>
+          <w:tab w:val="left" w:pos="2817"/>
+          <w:tab w:val="left" w:pos="5337"/>
+          <w:tab w:val="left" w:pos="7857"/>
         </w:tabs>
         <w:spacing w:before="80" w:after="0" w:line="240" w:lineRule="auto"/>
-        <w:ind w:left="1197"/>
+        <w:ind w:left="297"/>
         <w:rPr>
           <w:b/>
           <w:sz w:val="24"/>
@@ -1380,18 +2286,18 @@
         <mc:AlternateContent>
           <mc:Choice Requires="wps">
             <w:drawing>
-              <wp:anchor distT="0" distB="0" distL="114300" distR="114300" simplePos="0" relativeHeight="251659264" behindDoc="0" locked="0" layoutInCell="1" allowOverlap="1">
+              <wp:anchor distT="0" distB="0" distL="114300" distR="114300" simplePos="0" relativeHeight="251659264" behindDoc="0" locked="0" layoutInCell="1" allowOverlap="1" wp14:anchorId="20BD9F55" wp14:editId="776DF09D">
                 <wp:simplePos x="0" y="0"/>
                 <wp:positionH relativeFrom="margin">
-                  <wp:posOffset>683895</wp:posOffset>
+                  <wp:posOffset>112395</wp:posOffset>
                 </wp:positionH>
                 <wp:positionV relativeFrom="paragraph">
                   <wp:posOffset>-76200</wp:posOffset>
                 </wp:positionV>
-                <wp:extent cx="4572000" cy="965200"/>
-                <wp:effectExtent l="0" t="0" r="19050" b="25400"/>
+                <wp:extent cx="5715000" cy="558800"/>
+                <wp:effectExtent l="0" t="0" r="19050" b="12700"/>
                 <wp:wrapNone/>
-                <wp:docPr id="2070517684" name="Rectangle: Rounded Corners 1"/>
+                <wp:docPr id="1935565881" name="Rectangle: Rounded Corners 1"/>
                 <wp:cNvGraphicFramePr/>
                 <a:graphic xmlns:a="http://schemas.openxmlformats.org/drawingml/2006/main">
                   <a:graphicData uri="http://schemas.microsoft.com/office/word/2010/wordprocessingShape">
@@ -1400,7 +2306,7 @@
                       <wps:spPr>
                         <a:xfrm>
                           <a:off x="0" y="0"/>
-                          <a:ext cx="4572000" cy="965200"/>
+                          <a:ext cx="5715000" cy="558800"/>
                         </a:xfrm>
                         <a:prstGeom prst="roundRect">
                           <a:avLst/>
@@ -1454,7 +2360,7 @@
           </mc:Choice>
           <mc:Fallback>
             <w:pict>
-              <v:roundrect w14:anchorId="7352CDD4" id="Rectangle: Rounded Corners 1" o:spid="_x0000_s1026" style="position:absolute;margin-left:53.85pt;margin-top:-6pt;width:5in;height:76pt;z-index:251659264;visibility:visible;mso-wrap-style:square;mso-wrap-distance-left:9pt;mso-wrap-distance-top:0;mso-wrap-distance-right:9pt;mso-wrap-distance-bottom:0;mso-position-horizontal:absolute;mso-position-horizontal-relative:margin;mso-position-vertical:absolute;mso-position-vertical-relative:text;v-text-anchor:middle" arcsize="10923f" o:gfxdata="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" filled="f" fillcolor="#156082 [3204]" strokeweight="1pt">
+              <v:roundrect w14:anchorId="7D46BFD9" id="Rectangle: Rounded Corners 1" o:spid="_x0000_s1026" style="position:absolute;margin-left:8.85pt;margin-top:-6pt;width:450pt;height:44pt;z-index:251659264;visibility:visible;mso-wrap-style:square;mso-wrap-distance-left:9pt;mso-wrap-distance-top:0;mso-wrap-distance-right:9pt;mso-wrap-distance-bottom:0;mso-position-horizontal:absolute;mso-position-horizontal-relative:margin;mso-position-vertical:absolute;mso-position-vertical-relative:text;v-text-anchor:middle" arcsize="10923f" o:gfxdata="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" filled="f" fillcolor="#156082 [3204]" strokeweight="1pt">
                 <v:stroke joinstyle="miter"/>
                 <w10:wrap anchorx="margin"/>
               </v:roundrect>
@@ -1480,222 +2386,68 @@
           <w:b/>
           <w:sz w:val="24"/>
         </w:rPr>
-        <w:t>|</w:t>
-      </w:r>
-      <w:r>
-        <w:rPr>
-          <w:sz w:val="24"/>
-        </w:rPr>
-        <w:tab/>
-      </w:r>
-      <w:r>
-        <w:rPr>
-          <w:b/>
-          <w:sz w:val="24"/>
-        </w:rPr>
-        <w:t>horse</w:t>
-      </w:r>
-      <w:r>
-        <w:rPr>
-          <w:sz w:val="24"/>
-        </w:rPr>
-        <w:tab/>
-      </w:r>
-      <w:r>
-        <w:rPr>
-          <w:b/>
-          <w:sz w:val="24"/>
-        </w:rPr>
-        <w:t>riding</w:t>
-      </w:r>
-      <w:r>
-        <w:rPr>
-          <w:sz w:val="24"/>
-        </w:rPr>
-        <w:tab/>
-      </w:r>
-      <w:r>
-        <w:rPr>
-          <w:b/>
-          <w:sz w:val="24"/>
-        </w:rPr>
-        <w:t>|</w:t>
-      </w:r>
-    </w:p>
-    <w:p>
-      <w:pPr>
-        <w:keepNext/>
+        <w:t>horse riding</w:t>
+      </w:r>
+      <w:r>
+        <w:rPr>
+          <w:sz w:val="24"/>
+        </w:rPr>
+        <w:tab/>
+      </w:r>
+      <w:r>
+        <w:rPr>
+          <w:b/>
+          <w:sz w:val="24"/>
+        </w:rPr>
+        <w:t>collecting coins</w:t>
+      </w:r>
+      <w:r>
+        <w:rPr>
+          <w:sz w:val="24"/>
+        </w:rPr>
+        <w:tab/>
+      </w:r>
+      <w:r>
+        <w:rPr>
+          <w:b/>
+          <w:sz w:val="24"/>
+        </w:rPr>
+        <w:t>jogging</w:t>
+      </w:r>
+    </w:p>
+    <w:p>
+      <w:pPr>
         <w:tabs>
-          <w:tab w:val="left" w:pos="2637"/>
-          <w:tab w:val="left" w:pos="4077"/>
-          <w:tab w:val="left" w:pos="5517"/>
-          <w:tab w:val="left" w:pos="6957"/>
-        </w:tabs>
-        <w:spacing w:before="80" w:after="0" w:line="240" w:lineRule="auto"/>
-        <w:ind w:left="1197"/>
-        <w:rPr>
-          <w:b/>
-          <w:sz w:val="24"/>
-        </w:rPr>
-      </w:pPr>
-      <w:r>
-        <w:rPr>
-          <w:b/>
-          <w:sz w:val="24"/>
-        </w:rPr>
-        <w:t>collecting</w:t>
-      </w:r>
-      <w:r>
-        <w:rPr>
-          <w:sz w:val="24"/>
-        </w:rPr>
-        <w:tab/>
-      </w:r>
-      <w:r>
-        <w:rPr>
-          <w:b/>
-          <w:sz w:val="24"/>
-        </w:rPr>
-        <w:t>coins</w:t>
-      </w:r>
-      <w:r>
-        <w:rPr>
-          <w:sz w:val="24"/>
-        </w:rPr>
-        <w:tab/>
-      </w:r>
-      <w:r>
-        <w:rPr>
-          <w:b/>
-          <w:sz w:val="24"/>
-        </w:rPr>
-        <w:t>|</w:t>
-      </w:r>
-      <w:r>
-        <w:rPr>
-          <w:sz w:val="24"/>
-        </w:rPr>
-        <w:tab/>
-      </w:r>
-      <w:r>
-        <w:rPr>
-          <w:b/>
-          <w:sz w:val="24"/>
-        </w:rPr>
-        <w:t>jogging</w:t>
-      </w:r>
-      <w:r>
-        <w:rPr>
-          <w:sz w:val="24"/>
-        </w:rPr>
-        <w:tab/>
-      </w:r>
-      <w:r>
-        <w:rPr>
-          <w:b/>
-          <w:sz w:val="24"/>
-        </w:rPr>
-        <w:t>|</w:t>
-      </w:r>
-    </w:p>
-    <w:p>
-      <w:pPr>
-        <w:keepNext/>
-        <w:tabs>
-          <w:tab w:val="left" w:pos="2637"/>
-          <w:tab w:val="left" w:pos="4077"/>
-          <w:tab w:val="left" w:pos="5517"/>
-          <w:tab w:val="left" w:pos="6957"/>
-        </w:tabs>
-        <w:spacing w:before="80" w:after="0" w:line="240" w:lineRule="auto"/>
-        <w:ind w:left="1197"/>
-        <w:rPr>
-          <w:b/>
-          <w:sz w:val="24"/>
-        </w:rPr>
-      </w:pPr>
-      <w:r>
-        <w:rPr>
-          <w:b/>
-          <w:sz w:val="24"/>
-        </w:rPr>
-        <w:t>making</w:t>
-      </w:r>
-      <w:r>
-        <w:rPr>
-          <w:sz w:val="24"/>
-        </w:rPr>
-        <w:tab/>
-      </w:r>
-      <w:r>
-        <w:rPr>
-          <w:b/>
-          <w:sz w:val="24"/>
-        </w:rPr>
-        <w:t>models</w:t>
-      </w:r>
-      <w:r>
-        <w:rPr>
-          <w:sz w:val="24"/>
-        </w:rPr>
-        <w:tab/>
-      </w:r>
-      <w:r>
-        <w:rPr>
-          <w:b/>
-          <w:sz w:val="24"/>
-        </w:rPr>
-        <w:t>|</w:t>
-      </w:r>
-      <w:r>
-        <w:rPr>
-          <w:sz w:val="24"/>
-        </w:rPr>
-        <w:tab/>
-      </w:r>
-      <w:r>
-        <w:rPr>
-          <w:b/>
-          <w:sz w:val="24"/>
-        </w:rPr>
-        <w:t>building</w:t>
-      </w:r>
-      <w:r>
-        <w:rPr>
-          <w:sz w:val="24"/>
-        </w:rPr>
-        <w:tab/>
-      </w:r>
-      <w:r>
-        <w:rPr>
-          <w:b/>
-          <w:sz w:val="24"/>
-        </w:rPr>
-        <w:t>dollhouses</w:t>
-      </w:r>
-    </w:p>
-    <w:p>
-      <w:pPr>
-        <w:keepNext/>
-        <w:tabs>
-          <w:tab w:val="left" w:pos="2637"/>
-          <w:tab w:val="left" w:pos="4077"/>
-          <w:tab w:val="left" w:pos="5517"/>
-          <w:tab w:val="left" w:pos="6957"/>
+          <w:tab w:val="left" w:pos="2817"/>
+          <w:tab w:val="left" w:pos="5337"/>
+          <w:tab w:val="left" w:pos="7857"/>
         </w:tabs>
         <w:spacing w:before="80" w:after="0" w:line="480" w:lineRule="auto"/>
-        <w:ind w:left="1197"/>
-        <w:rPr>
-          <w:b/>
-          <w:sz w:val="24"/>
-        </w:rPr>
-      </w:pPr>
-      <w:r>
-        <w:rPr>
-          <w:b/>
-          <w:sz w:val="24"/>
-        </w:rPr>
-        <w:t>|</w:t>
+        <w:ind w:left="297"/>
+        <w:rPr>
+          <w:b/>
+          <w:sz w:val="24"/>
+        </w:rPr>
+      </w:pPr>
+      <w:r>
+        <w:rPr>
+          <w:b/>
+          <w:sz w:val="24"/>
+        </w:rPr>
+        <w:t>making models</w:t>
+      </w:r>
+      <w:r>
+        <w:rPr>
+          <w:sz w:val="24"/>
+        </w:rPr>
+        <w:tab/>
+      </w:r>
+      <w:r>
+        <w:rPr>
+          <w:b/>
+          <w:sz w:val="24"/>
+        </w:rPr>
+        <w:t>building dollhouses</w:t>
       </w:r>
       <w:r>
         <w:rPr>
@@ -1721,312 +2473,323 @@
           <w:b/>
           <w:sz w:val="24"/>
         </w:rPr>
-        <w:t>|</w:t>
-      </w:r>
-      <w:r>
-        <w:rPr>
-          <w:sz w:val="24"/>
-        </w:rPr>
-        <w:tab/>
-      </w:r>
-      <w:r>
-        <w:rPr>
-          <w:b/>
-          <w:sz w:val="24"/>
-        </w:rPr>
-        <w:t>doing</w:t>
-      </w:r>
-      <w:r>
-        <w:rPr>
-          <w:sz w:val="24"/>
-        </w:rPr>
-        <w:tab/>
-      </w:r>
-      <w:r>
-        <w:rPr>
-          <w:b/>
-          <w:sz w:val="24"/>
-        </w:rPr>
-        <w:t>yoga</w:t>
-      </w:r>
-    </w:p>
-    <w:p>
-      <w:pPr>
-        <w:spacing w:before="80" w:after="60" w:line="240" w:lineRule="auto"/>
-        <w:ind w:left="283"/>
-        <w:rPr>
-          <w:sz w:val="24"/>
-        </w:rPr>
-      </w:pPr>
-      <w:r>
-        <w:rPr>
-          <w:sz w:val="24"/>
-        </w:rPr>
-        <w:t>1. [PIC: "A child making models" | pos:inline | size:small] _____</w:t>
-      </w:r>
-    </w:p>
-    <w:p>
-      <w:pPr>
-        <w:spacing w:before="80" w:after="60" w:line="240" w:lineRule="auto"/>
-        <w:ind w:left="283"/>
-        <w:rPr>
-          <w:sz w:val="24"/>
-        </w:rPr>
-      </w:pPr>
-      <w:r>
-        <w:rPr>
-          <w:sz w:val="24"/>
-        </w:rPr>
-        <w:t>2. [PIC: "A child with a dollhouse" | pos:inline | size:small] _____</w:t>
-      </w:r>
-    </w:p>
-    <w:p>
-      <w:pPr>
-        <w:spacing w:before="80" w:after="60" w:line="240" w:lineRule="auto"/>
-        <w:ind w:left="283"/>
-        <w:rPr>
-          <w:sz w:val="24"/>
-        </w:rPr>
-      </w:pPr>
-      <w:r>
-        <w:rPr>
-          <w:sz w:val="24"/>
-        </w:rPr>
-        <w:t>3. [PIC: "Hands gardening a plant" | pos:inline | size:small] _____</w:t>
-      </w:r>
-    </w:p>
-    <w:p>
-      <w:pPr>
-        <w:spacing w:before="80" w:after="60" w:line="240" w:lineRule="auto"/>
-        <w:ind w:left="283"/>
-        <w:rPr>
-          <w:sz w:val="24"/>
-        </w:rPr>
-      </w:pPr>
-      <w:r>
-        <w:rPr>
-          <w:sz w:val="24"/>
-        </w:rPr>
-        <w:t>4. [PIC: "A person cooking" | pos:inline | size:small] _____</w:t>
-      </w:r>
-    </w:p>
-    <w:p>
-      <w:pPr>
-        <w:spacing w:before="80" w:after="60" w:line="240" w:lineRule="auto"/>
-        <w:ind w:left="283"/>
-        <w:rPr>
-          <w:sz w:val="24"/>
-        </w:rPr>
-      </w:pPr>
-      <w:r>
-        <w:rPr>
-          <w:sz w:val="24"/>
-        </w:rPr>
-        <w:t>5. [PIC: "A person doing yoga outdoors" | pos:inline | size:small] _____</w:t>
-      </w:r>
-    </w:p>
-    <w:p>
-      <w:pPr>
-        <w:spacing w:before="80" w:after="60" w:line="240" w:lineRule="auto"/>
-        <w:ind w:left="283"/>
-        <w:rPr>
-          <w:sz w:val="24"/>
-        </w:rPr>
-      </w:pPr>
-      <w:r>
-        <w:rPr>
-          <w:sz w:val="24"/>
-        </w:rPr>
-        <w:t>6. [PIC: "Two people jogging" | pos:inline | size:small] _____</w:t>
-      </w:r>
-    </w:p>
-    <w:p>
-      <w:pPr>
-        <w:spacing w:before="80" w:after="60" w:line="240" w:lineRule="auto"/>
-        <w:ind w:left="283"/>
-        <w:rPr>
-          <w:sz w:val="24"/>
-        </w:rPr>
-      </w:pPr>
-      <w:r>
-        <w:rPr>
-          <w:sz w:val="24"/>
-        </w:rPr>
-        <w:t>7. [PIC: "A close-up of collecting coins" | pos:inline | size:small] _____</w:t>
-      </w:r>
-    </w:p>
-    <w:p>
-      <w:pPr>
-        <w:spacing w:before="80" w:after="60" w:line="240" w:lineRule="auto"/>
-        <w:ind w:left="283"/>
-        <w:rPr>
-          <w:sz w:val="24"/>
-        </w:rPr>
-      </w:pPr>
-      <w:r>
-        <w:rPr>
-          <w:sz w:val="24"/>
-        </w:rPr>
-        <w:t>8. [PIC: "A person horse riding" | pos:inline | size:small] _____</w:t>
-      </w:r>
-    </w:p>
-    <w:p>
-      <w:pPr>
-        <w:spacing w:before="120" w:after="80" w:line="240" w:lineRule="auto"/>
-        <w:rPr>
-          <w:sz w:val="24"/>
-        </w:rPr>
-      </w:pPr>
-      <w:r>
-        <w:rPr>
-          <w:b/>
-          <w:sz w:val="24"/>
-        </w:rPr>
-        <w:t xml:space="preserve">A. </w:t>
-      </w:r>
-      <w:r>
-        <w:rPr>
-          <w:sz w:val="24"/>
-        </w:rPr>
-        <w:t xml:space="preserve"> Match each word with its meaning.</w:t>
+        <w:t>doing yoga</w:t>
       </w:r>
     </w:p>
     <w:p>
       <w:pPr>
         <w:tabs>
-          <w:tab w:val="left" w:pos="4677"/>
+          <w:tab w:val="left" w:pos="3946"/>
         </w:tabs>
         <w:spacing w:before="60" w:after="60" w:line="240" w:lineRule="auto"/>
-        <w:rPr>
-          <w:sz w:val="24"/>
-        </w:rPr>
-      </w:pPr>
-      <w:r>
-        <w:rPr>
-          <w:sz w:val="24"/>
-        </w:rPr>
-        <w:t>1. rest  A. an activity that you enjoy doing</w:t>
-      </w:r>
-      <w:r>
-        <w:rPr>
-          <w:sz w:val="24"/>
-        </w:rPr>
-        <w:tab/>
+        <w:ind w:left="3946" w:hanging="3946"/>
+        <w:rPr>
+          <w:b/>
+          <w:i/>
+          <w:sz w:val="20"/>
+        </w:rPr>
+      </w:pPr>
+      <w:r>
+        <w:rPr>
+          <w:sz w:val="24"/>
+        </w:rPr>
+        <w:t>1. [PIC: "A child making models"</w:t>
+      </w:r>
+      <w:r>
+        <w:rPr>
+          <w:sz w:val="24"/>
+        </w:rPr>
+        <w:tab/>
+      </w:r>
+      <w:r>
+        <w:rPr>
+          <w:rFonts w:ascii="Segoe UI Emoji" w:hAnsi="Segoe UI Emoji" w:cs="Segoe UI Emoji"/>
+          <w:b/>
+          <w:i/>
+          <w:color w:val="808080"/>
+          <w:sz w:val="20"/>
+        </w:rPr>
+        <w:t>🖼️</w:t>
+      </w:r>
+      <w:r>
+        <w:rPr>
+          <w:b/>
+          <w:i/>
+          <w:color w:val="808080"/>
+          <w:sz w:val="20"/>
+        </w:rPr>
+        <w:t xml:space="preserve"> [ DIAGRAM / IMAGE: A child with dollhouse ]</w:t>
       </w:r>
     </w:p>
     <w:p>
       <w:pPr>
         <w:tabs>
-          <w:tab w:val="left" w:pos="4677"/>
+          <w:tab w:val="left" w:pos="2823"/>
         </w:tabs>
         <w:spacing w:before="60" w:after="60" w:line="240" w:lineRule="auto"/>
-        <w:rPr>
-          <w:sz w:val="24"/>
-        </w:rPr>
-      </w:pPr>
-      <w:r>
-        <w:rPr>
-          <w:sz w:val="24"/>
-        </w:rPr>
-        <w:t>2. recreation  B. a strong feeling of excitement and interest in something</w:t>
-      </w:r>
-      <w:r>
-        <w:rPr>
-          <w:sz w:val="24"/>
-        </w:rPr>
-        <w:tab/>
+        <w:ind w:left="2823" w:hanging="2823"/>
+        <w:rPr>
+          <w:b/>
+          <w:i/>
+          <w:sz w:val="20"/>
+        </w:rPr>
+      </w:pPr>
+      <w:r>
+        <w:rPr>
+          <w:sz w:val="24"/>
+        </w:rPr>
+        <w:t>5. [PIC: "Doing yoga"</w:t>
+      </w:r>
+      <w:r>
+        <w:rPr>
+          <w:sz w:val="24"/>
+        </w:rPr>
+        <w:tab/>
+      </w:r>
+      <w:r>
+        <w:rPr>
+          <w:rFonts w:ascii="Segoe UI Emoji" w:hAnsi="Segoe UI Emoji" w:cs="Segoe UI Emoji"/>
+          <w:b/>
+          <w:i/>
+          <w:color w:val="808080"/>
+          <w:sz w:val="20"/>
+        </w:rPr>
+        <w:t>🖼️</w:t>
+      </w:r>
+      <w:r>
+        <w:rPr>
+          <w:b/>
+          <w:i/>
+          <w:color w:val="808080"/>
+          <w:sz w:val="20"/>
+        </w:rPr>
+        <w:t xml:space="preserve"> [ DIAGRAM / IMAGE: Jogging ]</w:t>
+      </w:r>
+    </w:p>
+    <w:p>
+      <w:pPr>
+        <w:spacing w:before="120" w:after="80" w:line="240" w:lineRule="auto"/>
+        <w:rPr>
+          <w:b/>
+          <w:sz w:val="24"/>
+        </w:rPr>
+      </w:pPr>
+      <w:r>
+        <w:rPr>
+          <w:b/>
+          <w:sz w:val="24"/>
+        </w:rPr>
+        <w:t>A.  Match each word with its meaning.</w:t>
       </w:r>
     </w:p>
     <w:p>
       <w:pPr>
         <w:tabs>
-          <w:tab w:val="left" w:pos="4677"/>
+          <w:tab w:val="left" w:pos="2007"/>
         </w:tabs>
         <w:spacing w:before="60" w:after="60" w:line="240" w:lineRule="auto"/>
-        <w:rPr>
-          <w:sz w:val="24"/>
-        </w:rPr>
-      </w:pPr>
-      <w:r>
-        <w:rPr>
-          <w:sz w:val="24"/>
-        </w:rPr>
-        <w:t>3. interest  C. a feeling of happiness, enjoyment, or satisfaction</w:t>
-      </w:r>
-      <w:r>
-        <w:rPr>
-          <w:sz w:val="24"/>
-        </w:rPr>
-        <w:tab/>
+        <w:ind w:left="2007" w:hanging="2007"/>
+        <w:rPr>
+          <w:sz w:val="24"/>
+        </w:rPr>
+      </w:pPr>
+      <w:r>
+        <w:rPr>
+          <w:sz w:val="24"/>
+        </w:rPr>
+        <w:t>1. rest</w:t>
+      </w:r>
+      <w:r>
+        <w:rPr>
+          <w:sz w:val="24"/>
+        </w:rPr>
+        <w:tab/>
+      </w:r>
+      <w:r>
+        <w:rPr>
+          <w:b/>
+          <w:sz w:val="24"/>
+        </w:rPr>
+        <w:t xml:space="preserve">A. </w:t>
+      </w:r>
+      <w:r>
+        <w:rPr>
+          <w:sz w:val="24"/>
+        </w:rPr>
+        <w:t xml:space="preserve"> an activity that you enjoy doing</w:t>
       </w:r>
     </w:p>
     <w:p>
       <w:pPr>
         <w:tabs>
-          <w:tab w:val="left" w:pos="4677"/>
+          <w:tab w:val="left" w:pos="2007"/>
         </w:tabs>
         <w:spacing w:before="60" w:after="60" w:line="240" w:lineRule="auto"/>
-        <w:rPr>
-          <w:sz w:val="24"/>
-        </w:rPr>
-      </w:pPr>
-      <w:r>
-        <w:rPr>
-          <w:sz w:val="24"/>
-        </w:rPr>
-        <w:t>4. enthusiasm  D. a period of relaxing, sleeping or doing nothing</w:t>
-      </w:r>
-      <w:r>
-        <w:rPr>
-          <w:sz w:val="24"/>
-        </w:rPr>
-        <w:tab/>
+        <w:ind w:left="2007" w:hanging="2007"/>
+        <w:rPr>
+          <w:sz w:val="24"/>
+        </w:rPr>
+      </w:pPr>
+      <w:r>
+        <w:rPr>
+          <w:sz w:val="24"/>
+        </w:rPr>
+        <w:t>2. recreation</w:t>
+      </w:r>
+      <w:r>
+        <w:rPr>
+          <w:sz w:val="24"/>
+        </w:rPr>
+        <w:tab/>
+      </w:r>
+      <w:r>
+        <w:rPr>
+          <w:b/>
+          <w:sz w:val="24"/>
+        </w:rPr>
+        <w:t xml:space="preserve">B. </w:t>
+      </w:r>
+      <w:r>
+        <w:rPr>
+          <w:sz w:val="24"/>
+        </w:rPr>
+        <w:t xml:space="preserve"> a strong feeling of excitement and interest in something</w:t>
       </w:r>
     </w:p>
     <w:p>
       <w:pPr>
         <w:tabs>
-          <w:tab w:val="left" w:pos="4677"/>
+          <w:tab w:val="left" w:pos="2007"/>
         </w:tabs>
         <w:spacing w:before="60" w:after="60" w:line="240" w:lineRule="auto"/>
-        <w:rPr>
-          <w:sz w:val="24"/>
-        </w:rPr>
-      </w:pPr>
-      <w:r>
-        <w:rPr>
-          <w:sz w:val="24"/>
-        </w:rPr>
-        <w:t>5. relaxation  E. the fact of people doing things for enjoyment</w:t>
-      </w:r>
-      <w:r>
-        <w:rPr>
-          <w:sz w:val="24"/>
-        </w:rPr>
-        <w:tab/>
+        <w:ind w:left="2007" w:hanging="2007"/>
+        <w:rPr>
+          <w:sz w:val="24"/>
+        </w:rPr>
+      </w:pPr>
+      <w:r>
+        <w:rPr>
+          <w:sz w:val="24"/>
+        </w:rPr>
+        <w:t>3. interest</w:t>
+      </w:r>
+      <w:r>
+        <w:rPr>
+          <w:sz w:val="24"/>
+        </w:rPr>
+        <w:tab/>
+      </w:r>
+      <w:r>
+        <w:rPr>
+          <w:b/>
+          <w:sz w:val="24"/>
+        </w:rPr>
+        <w:t xml:space="preserve">C. </w:t>
+      </w:r>
+      <w:r>
+        <w:rPr>
+          <w:sz w:val="24"/>
+        </w:rPr>
+        <w:t xml:space="preserve"> a feeling of happiness, enjoyment, or satisfaction</w:t>
       </w:r>
     </w:p>
     <w:p>
       <w:pPr>
         <w:tabs>
-          <w:tab w:val="left" w:pos="4677"/>
+          <w:tab w:val="left" w:pos="2007"/>
         </w:tabs>
         <w:spacing w:before="60" w:after="60" w:line="240" w:lineRule="auto"/>
-        <w:rPr>
-          <w:sz w:val="24"/>
-        </w:rPr>
-      </w:pPr>
-      <w:r>
-        <w:rPr>
-          <w:sz w:val="24"/>
-        </w:rPr>
-        <w:t>6. pleasure  F. a way of resting and enjoying yourself</w:t>
-      </w:r>
-      <w:r>
-        <w:rPr>
-          <w:sz w:val="24"/>
-        </w:rPr>
-        <w:tab/>
+        <w:ind w:left="2007" w:hanging="2007"/>
+        <w:rPr>
+          <w:sz w:val="24"/>
+        </w:rPr>
+      </w:pPr>
+      <w:r>
+        <w:rPr>
+          <w:sz w:val="24"/>
+        </w:rPr>
+        <w:t>4. enthusiasm</w:t>
+      </w:r>
+      <w:r>
+        <w:rPr>
+          <w:sz w:val="24"/>
+        </w:rPr>
+        <w:tab/>
+      </w:r>
+      <w:r>
+        <w:rPr>
+          <w:b/>
+          <w:sz w:val="24"/>
+        </w:rPr>
+        <w:t xml:space="preserve">D. </w:t>
+      </w:r>
+      <w:r>
+        <w:rPr>
+          <w:sz w:val="24"/>
+        </w:rPr>
+        <w:t xml:space="preserve"> a period of relaxing, sleeping or doing nothing</w:t>
+      </w:r>
+    </w:p>
+    <w:p>
+      <w:pPr>
+        <w:tabs>
+          <w:tab w:val="left" w:pos="2007"/>
+        </w:tabs>
+        <w:spacing w:before="60" w:after="60" w:line="240" w:lineRule="auto"/>
+        <w:ind w:left="2007" w:hanging="2007"/>
+        <w:rPr>
+          <w:sz w:val="24"/>
+        </w:rPr>
+      </w:pPr>
+      <w:r>
+        <w:rPr>
+          <w:sz w:val="24"/>
+        </w:rPr>
+        <w:t>5. relaxation</w:t>
+      </w:r>
+      <w:r>
+        <w:rPr>
+          <w:sz w:val="24"/>
+        </w:rPr>
+        <w:tab/>
+      </w:r>
+      <w:r>
+        <w:rPr>
+          <w:b/>
+          <w:sz w:val="24"/>
+        </w:rPr>
+        <w:t xml:space="preserve">E. </w:t>
+      </w:r>
+      <w:r>
+        <w:rPr>
+          <w:sz w:val="24"/>
+        </w:rPr>
+        <w:t xml:space="preserve"> the fact of people doing things for enjoyment</w:t>
+      </w:r>
+    </w:p>
+    <w:p>
+      <w:pPr>
+        <w:tabs>
+          <w:tab w:val="left" w:pos="1984"/>
+        </w:tabs>
+        <w:spacing w:before="60" w:after="60" w:line="240" w:lineRule="auto"/>
+        <w:ind w:left="1984" w:hanging="1984"/>
+        <w:rPr>
+          <w:sz w:val="24"/>
+        </w:rPr>
+      </w:pPr>
+      <w:r>
+        <w:rPr>
+          <w:sz w:val="24"/>
+        </w:rPr>
+        <w:t>6. pleasure</w:t>
+      </w:r>
+      <w:r>
+        <w:rPr>
+          <w:sz w:val="24"/>
+        </w:rPr>
+        <w:tab/>
+        <w:t>f. a way of resting and enjoying yourself</w:t>
       </w:r>
     </w:p>
     <w:p>
@@ -2639,7 +3402,7 @@
     <w:link w:val="Heading1Char"/>
     <w:uiPriority w:val="9"/>
     <w:qFormat/>
-    <w:rsid w:val="001F7F17"/>
+    <w:rsid w:val="00796C09"/>
     <w:pPr>
       <w:keepNext/>
       <w:keepLines/>
@@ -2662,7 +3425,7 @@
     <w:semiHidden/>
     <w:unhideWhenUsed/>
     <w:qFormat/>
-    <w:rsid w:val="001F7F17"/>
+    <w:rsid w:val="00796C09"/>
     <w:pPr>
       <w:keepNext/>
       <w:keepLines/>
@@ -2685,7 +3448,7 @@
     <w:semiHidden/>
     <w:unhideWhenUsed/>
     <w:qFormat/>
-    <w:rsid w:val="001F7F17"/>
+    <w:rsid w:val="00796C09"/>
     <w:pPr>
       <w:keepNext/>
       <w:keepLines/>
@@ -2708,7 +3471,7 @@
     <w:semiHidden/>
     <w:unhideWhenUsed/>
     <w:qFormat/>
-    <w:rsid w:val="001F7F17"/>
+    <w:rsid w:val="00796C09"/>
     <w:pPr>
       <w:keepNext/>
       <w:keepLines/>
@@ -2731,7 +3494,7 @@
     <w:semiHidden/>
     <w:unhideWhenUsed/>
     <w:qFormat/>
-    <w:rsid w:val="001F7F17"/>
+    <w:rsid w:val="00796C09"/>
     <w:pPr>
       <w:keepNext/>
       <w:keepLines/>
@@ -2752,7 +3515,7 @@
     <w:semiHidden/>
     <w:unhideWhenUsed/>
     <w:qFormat/>
-    <w:rsid w:val="001F7F17"/>
+    <w:rsid w:val="00796C09"/>
     <w:pPr>
       <w:keepNext/>
       <w:keepLines/>
@@ -2775,7 +3538,7 @@
     <w:semiHidden/>
     <w:unhideWhenUsed/>
     <w:qFormat/>
-    <w:rsid w:val="001F7F17"/>
+    <w:rsid w:val="00796C09"/>
     <w:pPr>
       <w:keepNext/>
       <w:keepLines/>
@@ -2796,7 +3559,7 @@
     <w:semiHidden/>
     <w:unhideWhenUsed/>
     <w:qFormat/>
-    <w:rsid w:val="001F7F17"/>
+    <w:rsid w:val="00796C09"/>
     <w:pPr>
       <w:keepNext/>
       <w:keepLines/>
@@ -2819,7 +3582,7 @@
     <w:semiHidden/>
     <w:unhideWhenUsed/>
     <w:qFormat/>
-    <w:rsid w:val="001F7F17"/>
+    <w:rsid w:val="00796C09"/>
     <w:pPr>
       <w:keepNext/>
       <w:keepLines/>
@@ -2863,7 +3626,7 @@
     <w:basedOn w:val="DefaultParagraphFont"/>
     <w:link w:val="Heading1"/>
     <w:uiPriority w:val="9"/>
-    <w:rsid w:val="001F7F17"/>
+    <w:rsid w:val="00796C09"/>
     <w:rPr>
       <w:rFonts w:asciiTheme="majorHAnsi" w:eastAsiaTheme="majorEastAsia" w:hAnsiTheme="majorHAnsi" w:cstheme="majorBidi"/>
       <w:color w:val="0F4761" w:themeColor="accent1" w:themeShade="BF"/>
@@ -2877,7 +3640,7 @@
     <w:link w:val="Heading2"/>
     <w:uiPriority w:val="9"/>
     <w:semiHidden/>
-    <w:rsid w:val="001F7F17"/>
+    <w:rsid w:val="00796C09"/>
     <w:rPr>
       <w:rFonts w:asciiTheme="majorHAnsi" w:eastAsiaTheme="majorEastAsia" w:hAnsiTheme="majorHAnsi" w:cstheme="majorBidi"/>
       <w:color w:val="0F4761" w:themeColor="accent1" w:themeShade="BF"/>
@@ -2891,7 +3654,7 @@
     <w:link w:val="Heading3"/>
     <w:uiPriority w:val="9"/>
     <w:semiHidden/>
-    <w:rsid w:val="001F7F17"/>
+    <w:rsid w:val="00796C09"/>
     <w:rPr>
       <w:rFonts w:asciiTheme="minorHAnsi" w:eastAsiaTheme="majorEastAsia" w:hAnsiTheme="minorHAnsi" w:cstheme="majorBidi"/>
       <w:color w:val="0F4761" w:themeColor="accent1" w:themeShade="BF"/>
@@ -2905,7 +3668,7 @@
     <w:link w:val="Heading4"/>
     <w:uiPriority w:val="9"/>
     <w:semiHidden/>
-    <w:rsid w:val="001F7F17"/>
+    <w:rsid w:val="00796C09"/>
     <w:rPr>
       <w:rFonts w:asciiTheme="minorHAnsi" w:eastAsiaTheme="majorEastAsia" w:hAnsiTheme="minorHAnsi" w:cstheme="majorBidi"/>
       <w:i/>
@@ -2919,7 +3682,7 @@
     <w:link w:val="Heading5"/>
     <w:uiPriority w:val="9"/>
     <w:semiHidden/>
-    <w:rsid w:val="001F7F17"/>
+    <w:rsid w:val="00796C09"/>
     <w:rPr>
       <w:rFonts w:asciiTheme="minorHAnsi" w:eastAsiaTheme="majorEastAsia" w:hAnsiTheme="minorHAnsi" w:cstheme="majorBidi"/>
       <w:color w:val="0F4761" w:themeColor="accent1" w:themeShade="BF"/>
@@ -2931,7 +3694,7 @@
     <w:link w:val="Heading6"/>
     <w:uiPriority w:val="9"/>
     <w:semiHidden/>
-    <w:rsid w:val="001F7F17"/>
+    <w:rsid w:val="00796C09"/>
     <w:rPr>
       <w:rFonts w:asciiTheme="minorHAnsi" w:eastAsiaTheme="majorEastAsia" w:hAnsiTheme="minorHAnsi" w:cstheme="majorBidi"/>
       <w:i/>
@@ -2945,7 +3708,7 @@
     <w:link w:val="Heading7"/>
     <w:uiPriority w:val="9"/>
     <w:semiHidden/>
-    <w:rsid w:val="001F7F17"/>
+    <w:rsid w:val="00796C09"/>
     <w:rPr>
       <w:rFonts w:asciiTheme="minorHAnsi" w:eastAsiaTheme="majorEastAsia" w:hAnsiTheme="minorHAnsi" w:cstheme="majorBidi"/>
       <w:color w:val="595959" w:themeColor="text1" w:themeTint="A6"/>
@@ -2957,7 +3720,7 @@
     <w:link w:val="Heading8"/>
     <w:uiPriority w:val="9"/>
     <w:semiHidden/>
-    <w:rsid w:val="001F7F17"/>
+    <w:rsid w:val="00796C09"/>
     <w:rPr>
       <w:rFonts w:asciiTheme="minorHAnsi" w:eastAsiaTheme="majorEastAsia" w:hAnsiTheme="minorHAnsi" w:cstheme="majorBidi"/>
       <w:i/>
@@ -2971,7 +3734,7 @@
     <w:link w:val="Heading9"/>
     <w:uiPriority w:val="9"/>
     <w:semiHidden/>
-    <w:rsid w:val="001F7F17"/>
+    <w:rsid w:val="00796C09"/>
     <w:rPr>
       <w:rFonts w:asciiTheme="minorHAnsi" w:eastAsiaTheme="majorEastAsia" w:hAnsiTheme="minorHAnsi" w:cstheme="majorBidi"/>
       <w:color w:val="272727" w:themeColor="text1" w:themeTint="D8"/>
@@ -2984,7 +3747,7 @@
     <w:link w:val="TitleChar"/>
     <w:uiPriority w:val="10"/>
     <w:qFormat/>
-    <w:rsid w:val="001F7F17"/>
+    <w:rsid w:val="00796C09"/>
     <w:pPr>
       <w:spacing w:after="80" w:line="240" w:lineRule="auto"/>
       <w:contextualSpacing/>
@@ -3002,7 +3765,7 @@
     <w:basedOn w:val="DefaultParagraphFont"/>
     <w:link w:val="Title"/>
     <w:uiPriority w:val="10"/>
-    <w:rsid w:val="001F7F17"/>
+    <w:rsid w:val="00796C09"/>
     <w:rPr>
       <w:rFonts w:asciiTheme="majorHAnsi" w:eastAsiaTheme="majorEastAsia" w:hAnsiTheme="majorHAnsi" w:cstheme="majorBidi"/>
       <w:spacing w:val="-10"/>
@@ -3018,7 +3781,7 @@
     <w:link w:val="SubtitleChar"/>
     <w:uiPriority w:val="11"/>
     <w:qFormat/>
-    <w:rsid w:val="001F7F17"/>
+    <w:rsid w:val="00796C09"/>
     <w:pPr>
       <w:numPr>
         <w:ilvl w:val="1"/>
@@ -3037,7 +3800,7 @@
     <w:basedOn w:val="DefaultParagraphFont"/>
     <w:link w:val="Subtitle"/>
     <w:uiPriority w:val="11"/>
-    <w:rsid w:val="001F7F17"/>
+    <w:rsid w:val="00796C09"/>
     <w:rPr>
       <w:rFonts w:asciiTheme="minorHAnsi" w:eastAsiaTheme="majorEastAsia" w:hAnsiTheme="minorHAnsi" w:cstheme="majorBidi"/>
       <w:color w:val="595959" w:themeColor="text1" w:themeTint="A6"/>
@@ -3053,7 +3816,7 @@
     <w:link w:val="QuoteChar"/>
     <w:uiPriority w:val="29"/>
     <w:qFormat/>
-    <w:rsid w:val="001F7F17"/>
+    <w:rsid w:val="00796C09"/>
     <w:pPr>
       <w:spacing w:before="160"/>
       <w:jc w:val="center"/>
@@ -3069,7 +3832,7 @@
     <w:basedOn w:val="DefaultParagraphFont"/>
     <w:link w:val="Quote"/>
     <w:uiPriority w:val="29"/>
-    <w:rsid w:val="001F7F17"/>
+    <w:rsid w:val="00796C09"/>
     <w:rPr>
       <w:i/>
       <w:iCs/>
@@ -3081,7 +3844,7 @@
     <w:basedOn w:val="Normal"/>
     <w:uiPriority w:val="34"/>
     <w:qFormat/>
-    <w:rsid w:val="001F7F17"/>
+    <w:rsid w:val="00796C09"/>
     <w:pPr>
       <w:ind w:left="720"/>
       <w:contextualSpacing/>
@@ -3092,7 +3855,7 @@
     <w:basedOn w:val="DefaultParagraphFont"/>
     <w:uiPriority w:val="21"/>
     <w:qFormat/>
-    <w:rsid w:val="001F7F17"/>
+    <w:rsid w:val="00796C09"/>
     <w:rPr>
       <w:i/>
       <w:iCs/>
@@ -3106,7 +3869,7 @@
     <w:link w:val="IntenseQuoteChar"/>
     <w:uiPriority w:val="30"/>
     <w:qFormat/>
-    <w:rsid w:val="001F7F17"/>
+    <w:rsid w:val="00796C09"/>
     <w:pPr>
       <w:pBdr>
         <w:top w:val="single" w:sz="4" w:space="10" w:color="0F4761" w:themeColor="accent1" w:themeShade="BF"/>
@@ -3127,7 +3890,7 @@
     <w:basedOn w:val="DefaultParagraphFont"/>
     <w:link w:val="IntenseQuote"/>
     <w:uiPriority w:val="30"/>
-    <w:rsid w:val="001F7F17"/>
+    <w:rsid w:val="00796C09"/>
     <w:rPr>
       <w:i/>
       <w:iCs/>
@@ -3139,7 +3902,7 @@
     <w:basedOn w:val="DefaultParagraphFont"/>
     <w:uiPriority w:val="32"/>
     <w:qFormat/>
-    <w:rsid w:val="001F7F17"/>
+    <w:rsid w:val="00796C09"/>
     <w:rPr>
       <w:b/>
       <w:bCs/>
@@ -3154,7 +3917,7 @@
     <w:link w:val="HeaderChar"/>
     <w:uiPriority w:val="99"/>
     <w:unhideWhenUsed/>
-    <w:rsid w:val="001F7F17"/>
+    <w:rsid w:val="00796C09"/>
     <w:pPr>
       <w:tabs>
         <w:tab w:val="center" w:pos="4680"/>
@@ -3168,7 +3931,7 @@
     <w:basedOn w:val="DefaultParagraphFont"/>
     <w:link w:val="Header"/>
     <w:uiPriority w:val="99"/>
-    <w:rsid w:val="001F7F17"/>
+    <w:rsid w:val="00796C09"/>
   </w:style>
   <w:style w:type="paragraph" w:styleId="Footer">
     <w:name w:val="footer"/>
@@ -3176,7 +3939,7 @@
     <w:link w:val="FooterChar"/>
     <w:uiPriority w:val="99"/>
     <w:unhideWhenUsed/>
-    <w:rsid w:val="001F7F17"/>
+    <w:rsid w:val="00796C09"/>
     <w:pPr>
       <w:tabs>
         <w:tab w:val="center" w:pos="4680"/>
@@ -3190,7 +3953,7 @@
     <w:basedOn w:val="DefaultParagraphFont"/>
     <w:link w:val="Footer"/>
     <w:uiPriority w:val="99"/>
-    <w:rsid w:val="001F7F17"/>
+    <w:rsid w:val="00796C09"/>
   </w:style>
 </w:styles>
 </file>

</xml_diff>

<commit_message>
feat: keep Word hidden during rendering for 0 window freeze, mandate <blank> tag for flush-right margins, and set QUOTE left/right indents to 0
</commit_message>
<xml_diff>
--- a/output/uln_document.docx
+++ b/output/uln_document.docx
@@ -32,16 +32,11 @@
           <w:b/>
           <w:sz w:val="24"/>
         </w:rPr>
-        <w:t>I. Choose the word whose underlined part is pronounced differently from the others.</w:t>
-      </w:r>
-    </w:p>
-    <w:p>
-      <w:pPr>
-        <w:tabs>
-          <w:tab w:val="left" w:pos="2551"/>
-          <w:tab w:val="left" w:pos="4819"/>
-          <w:tab w:val="left" w:pos="7087"/>
-        </w:tabs>
+        <w:t>I.  Choose the word whose underlined part is pronounced differently from the others.</w:t>
+      </w:r>
+    </w:p>
+    <w:p>
+      <w:pPr>
         <w:spacing w:before="80" w:after="60"/>
         <w:ind w:left="283"/>
         <w:rPr>
@@ -78,13 +73,7 @@
         <w:rPr>
           <w:sz w:val="24"/>
         </w:rPr>
-        <w:t>xciting</w:t>
-      </w:r>
-      <w:r>
-        <w:rPr>
-          <w:sz w:val="24"/>
-        </w:rPr>
-        <w:tab/>
+        <w:t xml:space="preserve">xciting </w:t>
       </w:r>
       <w:r>
         <w:rPr>
@@ -110,13 +99,7 @@
         <w:rPr>
           <w:sz w:val="24"/>
         </w:rPr>
-        <w:t>xcellent</w:t>
-      </w:r>
-      <w:r>
-        <w:rPr>
-          <w:sz w:val="24"/>
-        </w:rPr>
-        <w:tab/>
+        <w:t xml:space="preserve">xcellent </w:t>
       </w:r>
       <w:r>
         <w:rPr>
@@ -142,13 +125,7 @@
         <w:rPr>
           <w:sz w:val="24"/>
         </w:rPr>
-        <w:t>xperience</w:t>
-      </w:r>
-      <w:r>
-        <w:rPr>
-          <w:sz w:val="24"/>
-        </w:rPr>
-        <w:tab/>
+        <w:t xml:space="preserve">xperience </w:t>
       </w:r>
       <w:r>
         <w:rPr>
@@ -179,11 +156,6 @@
     </w:p>
     <w:p>
       <w:pPr>
-        <w:tabs>
-          <w:tab w:val="left" w:pos="2551"/>
-          <w:tab w:val="left" w:pos="4819"/>
-          <w:tab w:val="left" w:pos="7087"/>
-        </w:tabs>
         <w:spacing w:before="80" w:after="60"/>
         <w:ind w:left="283"/>
         <w:rPr>
@@ -220,7 +192,7 @@
         <w:rPr>
           <w:sz w:val="24"/>
         </w:rPr>
-        <w:tab/>
+        <w:t xml:space="preserve"> </w:t>
       </w:r>
       <w:r>
         <w:rPr>
@@ -246,13 +218,7 @@
         <w:rPr>
           <w:sz w:val="24"/>
         </w:rPr>
-        <w:t>cle</w:t>
-      </w:r>
-      <w:r>
-        <w:rPr>
-          <w:sz w:val="24"/>
-        </w:rPr>
-        <w:tab/>
+        <w:t xml:space="preserve">cle </w:t>
       </w:r>
       <w:r>
         <w:rPr>
@@ -278,13 +244,7 @@
         <w:rPr>
           <w:sz w:val="24"/>
         </w:rPr>
-        <w:t>e</w:t>
-      </w:r>
-      <w:r>
-        <w:rPr>
-          <w:sz w:val="24"/>
-        </w:rPr>
-        <w:tab/>
+        <w:t xml:space="preserve">e </w:t>
       </w:r>
       <w:r>
         <w:rPr>
@@ -309,11 +269,6 @@
     </w:p>
     <w:p>
       <w:pPr>
-        <w:tabs>
-          <w:tab w:val="left" w:pos="2551"/>
-          <w:tab w:val="left" w:pos="4819"/>
-          <w:tab w:val="left" w:pos="7087"/>
-        </w:tabs>
         <w:spacing w:before="80" w:after="60"/>
         <w:ind w:left="283"/>
         <w:rPr>
@@ -350,13 +305,7 @@
         <w:rPr>
           <w:sz w:val="24"/>
         </w:rPr>
-        <w:t>ttery</w:t>
-      </w:r>
-      <w:r>
-        <w:rPr>
-          <w:sz w:val="24"/>
-        </w:rPr>
-        <w:tab/>
+        <w:t xml:space="preserve">ttery </w:t>
       </w:r>
       <w:r>
         <w:rPr>
@@ -382,13 +331,7 @@
         <w:rPr>
           <w:sz w:val="24"/>
         </w:rPr>
-        <w:t>llect</w:t>
-      </w:r>
-      <w:r>
-        <w:rPr>
-          <w:sz w:val="24"/>
-        </w:rPr>
-        <w:tab/>
+        <w:t xml:space="preserve">llect </w:t>
       </w:r>
       <w:r>
         <w:rPr>
@@ -414,13 +357,7 @@
         <w:rPr>
           <w:sz w:val="24"/>
         </w:rPr>
-        <w:t>dy</w:t>
-      </w:r>
-      <w:r>
-        <w:rPr>
-          <w:sz w:val="24"/>
-        </w:rPr>
-        <w:tab/>
+        <w:t xml:space="preserve">dy </w:t>
       </w:r>
       <w:r>
         <w:rPr>
@@ -451,11 +388,6 @@
     </w:p>
     <w:p>
       <w:pPr>
-        <w:tabs>
-          <w:tab w:val="left" w:pos="2551"/>
-          <w:tab w:val="left" w:pos="4819"/>
-          <w:tab w:val="left" w:pos="7087"/>
-        </w:tabs>
         <w:spacing w:before="80" w:after="60"/>
         <w:ind w:left="283"/>
         <w:rPr>
@@ -492,13 +424,7 @@
         <w:rPr>
           <w:sz w:val="24"/>
         </w:rPr>
-        <w:t>rd</w:t>
-      </w:r>
-      <w:r>
-        <w:rPr>
-          <w:sz w:val="24"/>
-        </w:rPr>
-        <w:tab/>
+        <w:t xml:space="preserve">rd </w:t>
       </w:r>
       <w:r>
         <w:rPr>
@@ -524,13 +450,7 @@
         <w:rPr>
           <w:sz w:val="24"/>
         </w:rPr>
-        <w:t>rd</w:t>
-      </w:r>
-      <w:r>
-        <w:rPr>
-          <w:sz w:val="24"/>
-        </w:rPr>
-        <w:tab/>
+        <w:t xml:space="preserve">rd </w:t>
       </w:r>
       <w:r>
         <w:rPr>
@@ -556,13 +476,7 @@
         <w:rPr>
           <w:sz w:val="24"/>
         </w:rPr>
-        <w:t>rld</w:t>
-      </w:r>
-      <w:r>
-        <w:rPr>
-          <w:sz w:val="24"/>
-        </w:rPr>
-        <w:tab/>
+        <w:t xml:space="preserve">rld </w:t>
       </w:r>
       <w:r>
         <w:rPr>
@@ -593,11 +507,6 @@
     </w:p>
     <w:p>
       <w:pPr>
-        <w:tabs>
-          <w:tab w:val="left" w:pos="2551"/>
-          <w:tab w:val="left" w:pos="4819"/>
-          <w:tab w:val="left" w:pos="7087"/>
-        </w:tabs>
         <w:spacing w:before="80" w:after="60"/>
         <w:ind w:left="283"/>
         <w:rPr>
@@ -634,13 +543,7 @@
         <w:rPr>
           <w:sz w:val="24"/>
         </w:rPr>
-        <w:t>ing</w:t>
-      </w:r>
-      <w:r>
-        <w:rPr>
-          <w:sz w:val="24"/>
-        </w:rPr>
-        <w:tab/>
+        <w:t xml:space="preserve">ing </w:t>
       </w:r>
       <w:r>
         <w:rPr>
@@ -666,13 +569,7 @@
         <w:rPr>
           <w:sz w:val="24"/>
         </w:rPr>
-        <w:t>ildren</w:t>
-      </w:r>
-      <w:r>
-        <w:rPr>
-          <w:sz w:val="24"/>
-        </w:rPr>
-        <w:tab/>
+        <w:t xml:space="preserve">ildren </w:t>
       </w:r>
       <w:r>
         <w:rPr>
@@ -698,13 +595,7 @@
         <w:rPr>
           <w:sz w:val="24"/>
         </w:rPr>
-        <w:t>ool</w:t>
-      </w:r>
-      <w:r>
-        <w:rPr>
-          <w:sz w:val="24"/>
-        </w:rPr>
-        <w:tab/>
+        <w:t xml:space="preserve">ool </w:t>
       </w:r>
       <w:r>
         <w:rPr>
@@ -765,11 +656,6 @@
     </w:p>
     <w:p>
       <w:pPr>
-        <w:tabs>
-          <w:tab w:val="left" w:pos="2551"/>
-          <w:tab w:val="left" w:pos="4819"/>
-          <w:tab w:val="left" w:pos="7087"/>
-        </w:tabs>
         <w:spacing w:before="80" w:after="60"/>
         <w:ind w:left="283"/>
         <w:rPr>
@@ -787,13 +673,7 @@
         <w:rPr>
           <w:sz w:val="24"/>
         </w:rPr>
-        <w:t xml:space="preserve"> of</w:t>
-      </w:r>
-      <w:r>
-        <w:rPr>
-          <w:sz w:val="24"/>
-        </w:rPr>
-        <w:tab/>
+        <w:t xml:space="preserve"> of </w:t>
       </w:r>
       <w:r>
         <w:rPr>
@@ -806,13 +686,7 @@
         <w:rPr>
           <w:sz w:val="24"/>
         </w:rPr>
-        <w:t xml:space="preserve"> from</w:t>
-      </w:r>
-      <w:r>
-        <w:rPr>
-          <w:sz w:val="24"/>
-        </w:rPr>
-        <w:tab/>
+        <w:t xml:space="preserve"> from </w:t>
       </w:r>
       <w:r>
         <w:rPr>
@@ -825,13 +699,7 @@
         <w:rPr>
           <w:sz w:val="24"/>
         </w:rPr>
-        <w:t xml:space="preserve"> in</w:t>
-      </w:r>
-      <w:r>
-        <w:rPr>
-          <w:sz w:val="24"/>
-        </w:rPr>
-        <w:tab/>
+        <w:t xml:space="preserve"> in </w:t>
       </w:r>
       <w:r>
         <w:rPr>
@@ -863,11 +731,6 @@
     </w:p>
     <w:p>
       <w:pPr>
-        <w:tabs>
-          <w:tab w:val="left" w:pos="2551"/>
-          <w:tab w:val="left" w:pos="4819"/>
-          <w:tab w:val="left" w:pos="7087"/>
-        </w:tabs>
         <w:spacing w:before="80" w:after="60"/>
         <w:ind w:left="283"/>
         <w:rPr>
@@ -885,13 +748,7 @@
         <w:rPr>
           <w:sz w:val="24"/>
         </w:rPr>
-        <w:t xml:space="preserve"> up</w:t>
-      </w:r>
-      <w:r>
-        <w:rPr>
-          <w:sz w:val="24"/>
-        </w:rPr>
-        <w:tab/>
+        <w:t xml:space="preserve"> up </w:t>
       </w:r>
       <w:r>
         <w:rPr>
@@ -904,13 +761,7 @@
         <w:rPr>
           <w:sz w:val="24"/>
         </w:rPr>
-        <w:t xml:space="preserve"> in</w:t>
-      </w:r>
-      <w:r>
-        <w:rPr>
-          <w:sz w:val="24"/>
-        </w:rPr>
-        <w:tab/>
+        <w:t xml:space="preserve"> in </w:t>
       </w:r>
       <w:r>
         <w:rPr>
@@ -923,13 +774,7 @@
         <w:rPr>
           <w:sz w:val="24"/>
         </w:rPr>
-        <w:t xml:space="preserve"> over</w:t>
-      </w:r>
-      <w:r>
-        <w:rPr>
-          <w:sz w:val="24"/>
-        </w:rPr>
-        <w:tab/>
+        <w:t xml:space="preserve"> over </w:t>
       </w:r>
       <w:r>
         <w:rPr>
@@ -961,11 +806,6 @@
     </w:p>
     <w:p>
       <w:pPr>
-        <w:tabs>
-          <w:tab w:val="left" w:pos="2551"/>
-          <w:tab w:val="left" w:pos="4819"/>
-          <w:tab w:val="left" w:pos="7087"/>
-        </w:tabs>
         <w:spacing w:before="80" w:after="60"/>
         <w:ind w:left="283"/>
         <w:rPr>
@@ -983,13 +823,7 @@
         <w:rPr>
           <w:sz w:val="24"/>
         </w:rPr>
-        <w:t xml:space="preserve"> interesting</w:t>
-      </w:r>
-      <w:r>
-        <w:rPr>
-          <w:sz w:val="24"/>
-        </w:rPr>
-        <w:tab/>
+        <w:t xml:space="preserve"> interesting </w:t>
       </w:r>
       <w:r>
         <w:rPr>
@@ -1002,13 +836,7 @@
         <w:rPr>
           <w:sz w:val="24"/>
         </w:rPr>
-        <w:t xml:space="preserve"> cheap</w:t>
-      </w:r>
-      <w:r>
-        <w:rPr>
-          <w:sz w:val="24"/>
-        </w:rPr>
-        <w:tab/>
+        <w:t xml:space="preserve"> cheap </w:t>
       </w:r>
       <w:r>
         <w:rPr>
@@ -1021,13 +849,7 @@
         <w:rPr>
           <w:sz w:val="24"/>
         </w:rPr>
-        <w:t xml:space="preserve"> expensive</w:t>
-      </w:r>
-      <w:r>
-        <w:rPr>
-          <w:sz w:val="24"/>
-        </w:rPr>
-        <w:tab/>
+        <w:t xml:space="preserve"> expensive </w:t>
       </w:r>
       <w:r>
         <w:rPr>
@@ -1059,11 +881,6 @@
     </w:p>
     <w:p>
       <w:pPr>
-        <w:tabs>
-          <w:tab w:val="left" w:pos="2551"/>
-          <w:tab w:val="left" w:pos="4819"/>
-          <w:tab w:val="left" w:pos="7087"/>
-        </w:tabs>
         <w:spacing w:before="80" w:after="60"/>
         <w:ind w:left="283"/>
         <w:rPr>
@@ -1081,13 +898,7 @@
         <w:rPr>
           <w:sz w:val="24"/>
         </w:rPr>
-        <w:t xml:space="preserve"> seeing</w:t>
-      </w:r>
-      <w:r>
-        <w:rPr>
-          <w:sz w:val="24"/>
-        </w:rPr>
-        <w:tab/>
+        <w:t xml:space="preserve"> seeing </w:t>
       </w:r>
       <w:r>
         <w:rPr>
@@ -1100,13 +911,7 @@
         <w:rPr>
           <w:sz w:val="24"/>
         </w:rPr>
-        <w:t xml:space="preserve"> looking</w:t>
-      </w:r>
-      <w:r>
-        <w:rPr>
-          <w:sz w:val="24"/>
-        </w:rPr>
-        <w:tab/>
+        <w:t xml:space="preserve"> looking </w:t>
       </w:r>
       <w:r>
         <w:rPr>
@@ -1119,13 +924,7 @@
         <w:rPr>
           <w:sz w:val="24"/>
         </w:rPr>
-        <w:t xml:space="preserve"> hearing</w:t>
-      </w:r>
-      <w:r>
-        <w:rPr>
-          <w:sz w:val="24"/>
-        </w:rPr>
-        <w:tab/>
+        <w:t xml:space="preserve"> hearing </w:t>
       </w:r>
       <w:r>
         <w:rPr>
@@ -1145,79 +944,76 @@
       <w:pPr>
         <w:spacing w:before="120" w:after="80"/>
         <w:rPr>
-          <w:sz w:val="24"/>
-        </w:rPr>
-      </w:pPr>
-      <w:r>
-        <w:rPr>
-          <w:sz w:val="24"/>
-        </w:rPr>
-        <w:t>*</w:t>
-      </w:r>
-      <w:r>
-        <w:rPr>
+          <w:b/>
+          <w:sz w:val="24"/>
+        </w:rPr>
+      </w:pPr>
+      <w:r>
+        <w:rPr>
+          <w:b/>
+          <w:sz w:val="24"/>
+        </w:rPr>
+        <w:t xml:space="preserve">IV. Complete the sentences with the correct form or tense of the verb </w:t>
+      </w:r>
+      <w:r>
+        <w:rPr>
+          <w:b/>
           <w:i/>
           <w:sz w:val="24"/>
         </w:rPr>
-        <w:t xml:space="preserve">IV. Complete the sentences with the correct form or tense of the verb </w:t>
-      </w:r>
-      <w:r>
-        <w:rPr>
-          <w:sz w:val="24"/>
-        </w:rPr>
         <w:t>play</w:t>
       </w:r>
       <w:r>
         <w:rPr>
+          <w:b/>
+          <w:sz w:val="24"/>
+        </w:rPr>
+        <w:t xml:space="preserve">, </w:t>
+      </w:r>
+      <w:r>
+        <w:rPr>
+          <w:b/>
           <w:i/>
           <w:sz w:val="24"/>
         </w:rPr>
+        <w:t>go</w:t>
+      </w:r>
+      <w:r>
+        <w:rPr>
+          <w:b/>
+          <w:sz w:val="24"/>
+        </w:rPr>
         <w:t xml:space="preserve">, </w:t>
       </w:r>
       <w:r>
         <w:rPr>
-          <w:sz w:val="24"/>
-        </w:rPr>
-        <w:t>go</w:t>
-      </w:r>
-      <w:r>
-        <w:rPr>
+          <w:b/>
           <w:i/>
           <w:sz w:val="24"/>
         </w:rPr>
-        <w:t xml:space="preserve">, </w:t>
-      </w:r>
-      <w:r>
-        <w:rPr>
-          <w:sz w:val="24"/>
-        </w:rPr>
         <w:t>do</w:t>
       </w:r>
       <w:r>
         <w:rPr>
+          <w:b/>
+          <w:sz w:val="24"/>
+        </w:rPr>
+        <w:t xml:space="preserve"> or </w:t>
+      </w:r>
+      <w:r>
+        <w:rPr>
+          <w:b/>
           <w:i/>
           <w:sz w:val="24"/>
         </w:rPr>
-        <w:t xml:space="preserve"> or </w:t>
-      </w:r>
-      <w:r>
-        <w:rPr>
-          <w:sz w:val="24"/>
-        </w:rPr>
         <w:t>collect</w:t>
       </w:r>
       <w:r>
         <w:rPr>
-          <w:i/>
+          <w:b/>
           <w:sz w:val="24"/>
         </w:rPr>
         <w:t>.</w:t>
-      </w:r>
-      <w:r>
-        <w:rPr>
-          <w:sz w:val="24"/>
-        </w:rPr>
-        <w:t>*</w:t>
       </w:r>
     </w:p>
     <w:p>
@@ -1410,8 +1206,9 @@
     </w:p>
     <w:p>
       <w:pPr>
-        <w:spacing w:before="120" w:after="120"/>
-        <w:ind w:left="283" w:right="283"/>
+        <w:spacing w:after="80"/>
+        <w:ind w:left="283" w:right="283" w:firstLine="425"/>
+        <w:jc w:val="both"/>
         <w:rPr>
           <w:sz w:val="24"/>
         </w:rPr>
@@ -1425,26 +1222,29 @@
     </w:p>
     <w:p>
       <w:pPr>
-        <w:spacing w:before="120" w:after="120"/>
-        <w:ind w:left="283" w:right="283"/>
-        <w:rPr>
-          <w:sz w:val="24"/>
-        </w:rPr>
-      </w:pPr>
-      <w:r>
-        <w:rPr>
-          <w:sz w:val="24"/>
-        </w:rPr>
-        <w:t>There are many different paper craft techniques. Origami is one of ancient techniques developed in Japan where squares of paper are (3)______ and formed into various objects such as flowers, animals, and boxes. Card (4)______ is also a favourite paper craft technique. Birthday cards are the most popular greeting cards, followed by Christmas cards. Receiving a (5)______ card is a special gift, because of the time and effort someone spent making it. It lets the recipient know just how much you care (6)______ them.</w:t>
-      </w:r>
-    </w:p>
-    <w:p>
-      <w:pPr>
-        <w:tabs>
-          <w:tab w:val="left" w:pos="2551"/>
-          <w:tab w:val="left" w:pos="4819"/>
-          <w:tab w:val="left" w:pos="7087"/>
-        </w:tabs>
+        <w:spacing w:after="80"/>
+        <w:ind w:left="283" w:right="283" w:firstLine="425"/>
+        <w:jc w:val="both"/>
+        <w:rPr>
+          <w:sz w:val="24"/>
+        </w:rPr>
+      </w:pPr>
+      <w:r>
+        <w:rPr>
+          <w:sz w:val="24"/>
+        </w:rPr>
+        <w:t xml:space="preserve">There are many different paper craft techniques. Origami is one of ancient techniques developed in Japan where squares of paper are (3)______ and formed into various objects such as flowers, animals, and boxes. Card (4)______ is also a favourite paper craft technique. Birthday cards are the most popular greeting cards, followed by Christmas cards. Receiving </w:t>
+      </w:r>
+      <w:r>
+        <w:rPr>
+          <w:sz w:val="24"/>
+        </w:rPr>
+        <w:lastRenderedPageBreak/>
+        <w:t>a (5)______ card is a special gift, because of the time and effort someone spent making it. It lets the recipient know just how much you care (6)______ them.</w:t>
+      </w:r>
+    </w:p>
+    <w:p>
+      <w:pPr>
         <w:spacing w:before="80" w:after="60"/>
         <w:ind w:left="283"/>
         <w:rPr>
@@ -1455,7 +1255,6 @@
         <w:rPr>
           <w:sz w:val="24"/>
         </w:rPr>
-        <w:lastRenderedPageBreak/>
         <w:t xml:space="preserve">1. </w:t>
       </w:r>
       <w:r>
@@ -1469,13 +1268,7 @@
         <w:rPr>
           <w:sz w:val="24"/>
         </w:rPr>
-        <w:t xml:space="preserve"> enjoy</w:t>
-      </w:r>
-      <w:r>
-        <w:rPr>
-          <w:sz w:val="24"/>
-        </w:rPr>
-        <w:tab/>
+        <w:t xml:space="preserve"> enjoy </w:t>
       </w:r>
       <w:r>
         <w:rPr>
@@ -1488,13 +1281,7 @@
         <w:rPr>
           <w:sz w:val="24"/>
         </w:rPr>
-        <w:t xml:space="preserve"> decide</w:t>
-      </w:r>
-      <w:r>
-        <w:rPr>
-          <w:sz w:val="24"/>
-        </w:rPr>
-        <w:tab/>
+        <w:t xml:space="preserve"> decide </w:t>
       </w:r>
       <w:r>
         <w:rPr>
@@ -1507,13 +1294,7 @@
         <w:rPr>
           <w:sz w:val="24"/>
         </w:rPr>
-        <w:t xml:space="preserve"> want</w:t>
-      </w:r>
-      <w:r>
-        <w:rPr>
-          <w:sz w:val="24"/>
-        </w:rPr>
-        <w:tab/>
+        <w:t xml:space="preserve"> want </w:t>
       </w:r>
       <w:r>
         <w:rPr>
@@ -1531,11 +1312,6 @@
     </w:p>
     <w:p>
       <w:pPr>
-        <w:tabs>
-          <w:tab w:val="left" w:pos="2551"/>
-          <w:tab w:val="left" w:pos="4819"/>
-          <w:tab w:val="left" w:pos="7087"/>
-        </w:tabs>
         <w:spacing w:before="80" w:after="60"/>
         <w:ind w:left="283"/>
         <w:rPr>
@@ -1559,13 +1335,7 @@
         <w:rPr>
           <w:sz w:val="24"/>
         </w:rPr>
-        <w:t xml:space="preserve"> must</w:t>
-      </w:r>
-      <w:r>
-        <w:rPr>
-          <w:sz w:val="24"/>
-        </w:rPr>
-        <w:tab/>
+        <w:t xml:space="preserve"> must </w:t>
       </w:r>
       <w:r>
         <w:rPr>
@@ -1578,13 +1348,7 @@
         <w:rPr>
           <w:sz w:val="24"/>
         </w:rPr>
-        <w:t xml:space="preserve"> should</w:t>
-      </w:r>
-      <w:r>
-        <w:rPr>
-          <w:sz w:val="24"/>
-        </w:rPr>
-        <w:tab/>
+        <w:t xml:space="preserve"> should </w:t>
       </w:r>
       <w:r>
         <w:rPr>
@@ -1597,13 +1361,7 @@
         <w:rPr>
           <w:sz w:val="24"/>
         </w:rPr>
-        <w:t xml:space="preserve"> can</w:t>
-      </w:r>
-      <w:r>
-        <w:rPr>
-          <w:sz w:val="24"/>
-        </w:rPr>
-        <w:tab/>
+        <w:t xml:space="preserve"> can </w:t>
       </w:r>
       <w:r>
         <w:rPr>
@@ -1621,11 +1379,6 @@
     </w:p>
     <w:p>
       <w:pPr>
-        <w:tabs>
-          <w:tab w:val="left" w:pos="2551"/>
-          <w:tab w:val="left" w:pos="4819"/>
-          <w:tab w:val="left" w:pos="7087"/>
-        </w:tabs>
         <w:spacing w:before="80" w:after="60"/>
         <w:ind w:left="283"/>
         <w:rPr>
@@ -1649,13 +1402,7 @@
         <w:rPr>
           <w:sz w:val="24"/>
         </w:rPr>
-        <w:t xml:space="preserve"> wrapped</w:t>
-      </w:r>
-      <w:r>
-        <w:rPr>
-          <w:sz w:val="24"/>
-        </w:rPr>
-        <w:tab/>
+        <w:t xml:space="preserve"> wrapped </w:t>
       </w:r>
       <w:r>
         <w:rPr>
@@ -1668,13 +1415,7 @@
         <w:rPr>
           <w:sz w:val="24"/>
         </w:rPr>
-        <w:t xml:space="preserve"> folded</w:t>
-      </w:r>
-      <w:r>
-        <w:rPr>
-          <w:sz w:val="24"/>
-        </w:rPr>
-        <w:tab/>
+        <w:t xml:space="preserve"> folded </w:t>
       </w:r>
       <w:r>
         <w:rPr>
@@ -1687,13 +1428,7 @@
         <w:rPr>
           <w:sz w:val="24"/>
         </w:rPr>
-        <w:t xml:space="preserve"> torn</w:t>
-      </w:r>
-      <w:r>
-        <w:rPr>
-          <w:sz w:val="24"/>
-        </w:rPr>
-        <w:tab/>
+        <w:t xml:space="preserve"> torn </w:t>
       </w:r>
       <w:r>
         <w:rPr>
@@ -1722,7 +1457,7 @@
           <w:b/>
           <w:sz w:val="24"/>
         </w:rPr>
-        <w:t>X. Write sentences, using the cues given.</w:t>
+        <w:t>X.  Write sentences, using the cues given.</w:t>
       </w:r>
     </w:p>
     <w:p>
@@ -1737,439 +1472,6 @@
           <w:sz w:val="24"/>
         </w:rPr>
         <w:t>1. I/ enjoy/ play/ sports/ because/ it/ good/ health</w:t>
-      </w:r>
-    </w:p>
-    <w:p>
-      <w:pPr>
-        <w:spacing w:before="120" w:after="80"/>
-        <w:rPr>
-          <w:sz w:val="24"/>
-        </w:rPr>
-      </w:pPr>
-      <w:r>
-        <w:rPr>
-          <w:sz w:val="24"/>
-        </w:rPr>
-        <w:t>______</w:t>
-      </w:r>
-    </w:p>
-    <w:p>
-      <w:pPr>
-        <w:spacing w:before="120" w:after="80"/>
-        <w:rPr>
-          <w:sz w:val="24"/>
-        </w:rPr>
-      </w:pPr>
-      <w:r>
-        <w:rPr>
-          <w:sz w:val="24"/>
-        </w:rPr>
-        <w:t>2. your children/ go/ camp/ every summer holiday?</w:t>
-      </w:r>
-    </w:p>
-    <w:p>
-      <w:pPr>
-        <w:spacing w:before="120" w:after="80"/>
-        <w:rPr>
-          <w:sz w:val="24"/>
-        </w:rPr>
-      </w:pPr>
-      <w:r>
-        <w:rPr>
-          <w:sz w:val="24"/>
-        </w:rPr>
-        <w:t>______</w:t>
-      </w:r>
-    </w:p>
-    <w:p>
-      <w:pPr>
-        <w:spacing w:before="120" w:after="80"/>
-        <w:rPr>
-          <w:sz w:val="24"/>
-        </w:rPr>
-      </w:pPr>
-      <w:r>
-        <w:rPr>
-          <w:sz w:val="24"/>
-        </w:rPr>
-        <w:t>3. I/ think/ photography/ can/ expensive hobby</w:t>
-      </w:r>
-    </w:p>
-    <w:p>
-      <w:pPr>
-        <w:spacing w:before="120" w:after="80"/>
-        <w:rPr>
-          <w:sz w:val="24"/>
-        </w:rPr>
-      </w:pPr>
-      <w:r>
-        <w:rPr>
-          <w:sz w:val="24"/>
-        </w:rPr>
-        <w:t>______</w:t>
-      </w:r>
-    </w:p>
-    <w:p>
-      <w:pPr>
-        <w:keepNext/>
-        <w:spacing w:before="360" w:after="240"/>
-        <w:rPr>
-          <w:b/>
-          <w:sz w:val="24"/>
-        </w:rPr>
-      </w:pPr>
-      <w:r>
-        <w:rPr>
-          <w:b/>
-          <w:sz w:val="24"/>
-        </w:rPr>
-        <w:t>A.  PHONETICS</w:t>
-      </w:r>
-    </w:p>
-    <w:p>
-      <w:pPr>
-        <w:spacing w:before="120" w:after="80"/>
-        <w:rPr>
-          <w:b/>
-          <w:sz w:val="24"/>
-        </w:rPr>
-      </w:pPr>
-      <w:r>
-        <w:rPr>
-          <w:b/>
-          <w:sz w:val="24"/>
-        </w:rPr>
-        <w:t>I. Underline the sound /f/ and circle the sound /v/.</w:t>
-      </w:r>
-    </w:p>
-    <w:p>
-      <w:pPr>
-        <w:tabs>
-          <w:tab w:val="left" w:pos="1871"/>
-          <w:tab w:val="left" w:pos="3742"/>
-          <w:tab w:val="left" w:pos="5613"/>
-          <w:tab w:val="left" w:pos="7483"/>
-        </w:tabs>
-        <w:spacing w:before="120" w:after="80"/>
-        <w:rPr>
-          <w:sz w:val="24"/>
-        </w:rPr>
-      </w:pPr>
-      <w:r>
-        <w:rPr>
-          <w:sz w:val="24"/>
-        </w:rPr>
-        <w:t>fun</w:t>
-      </w:r>
-      <w:r>
-        <w:rPr>
-          <w:sz w:val="24"/>
-        </w:rPr>
-        <w:tab/>
-        <w:t>fine</w:t>
-      </w:r>
-      <w:r>
-        <w:rPr>
-          <w:sz w:val="24"/>
-        </w:rPr>
-        <w:tab/>
-        <w:t>coffee</w:t>
-      </w:r>
-      <w:r>
-        <w:rPr>
-          <w:sz w:val="24"/>
-        </w:rPr>
-        <w:tab/>
-        <w:t>over</w:t>
-      </w:r>
-      <w:r>
-        <w:rPr>
-          <w:sz w:val="24"/>
-        </w:rPr>
-        <w:tab/>
-        <w:t>graph</w:t>
-      </w:r>
-    </w:p>
-    <w:p>
-      <w:pPr>
-        <w:tabs>
-          <w:tab w:val="left" w:pos="1871"/>
-          <w:tab w:val="left" w:pos="3742"/>
-          <w:tab w:val="left" w:pos="5613"/>
-          <w:tab w:val="left" w:pos="7483"/>
-        </w:tabs>
-        <w:spacing w:before="120" w:after="80"/>
-        <w:rPr>
-          <w:sz w:val="24"/>
-        </w:rPr>
-      </w:pPr>
-      <w:r>
-        <w:rPr>
-          <w:sz w:val="24"/>
-        </w:rPr>
-        <w:t>phone</w:t>
-      </w:r>
-      <w:r>
-        <w:rPr>
-          <w:sz w:val="24"/>
-        </w:rPr>
-        <w:tab/>
-        <w:t>brave</w:t>
-      </w:r>
-      <w:r>
-        <w:rPr>
-          <w:sz w:val="24"/>
-        </w:rPr>
-        <w:tab/>
-        <w:t>verb</w:t>
-      </w:r>
-      <w:r>
-        <w:rPr>
-          <w:sz w:val="24"/>
-        </w:rPr>
-        <w:tab/>
-        <w:t>stuff</w:t>
-      </w:r>
-      <w:r>
-        <w:rPr>
-          <w:sz w:val="24"/>
-        </w:rPr>
-        <w:tab/>
-        <w:t>clever</w:t>
-      </w:r>
-    </w:p>
-    <w:p>
-      <w:pPr>
-        <w:tabs>
-          <w:tab w:val="left" w:pos="1871"/>
-          <w:tab w:val="left" w:pos="3742"/>
-          <w:tab w:val="left" w:pos="5613"/>
-          <w:tab w:val="left" w:pos="7483"/>
-        </w:tabs>
-        <w:spacing w:before="120" w:after="80"/>
-        <w:rPr>
-          <w:sz w:val="24"/>
-        </w:rPr>
-      </w:pPr>
-      <w:r>
-        <w:rPr>
-          <w:sz w:val="24"/>
-        </w:rPr>
-        <w:t>enough</w:t>
-      </w:r>
-      <w:r>
-        <w:rPr>
-          <w:sz w:val="24"/>
-        </w:rPr>
-        <w:tab/>
-        <w:t>laughing</w:t>
-      </w:r>
-      <w:r>
-        <w:rPr>
-          <w:sz w:val="24"/>
-        </w:rPr>
-        <w:tab/>
-        <w:t>leaf</w:t>
-      </w:r>
-      <w:r>
-        <w:rPr>
-          <w:sz w:val="24"/>
-        </w:rPr>
-        <w:tab/>
-        <w:t>leave</w:t>
-      </w:r>
-      <w:r>
-        <w:rPr>
-          <w:sz w:val="24"/>
-        </w:rPr>
-        <w:tab/>
-        <w:t>vitamin</w:t>
-      </w:r>
-    </w:p>
-    <w:p>
-      <w:pPr>
-        <w:tabs>
-          <w:tab w:val="left" w:pos="1871"/>
-          <w:tab w:val="left" w:pos="3742"/>
-          <w:tab w:val="left" w:pos="5613"/>
-          <w:tab w:val="left" w:pos="7483"/>
-        </w:tabs>
-        <w:spacing w:before="120" w:after="80"/>
-        <w:rPr>
-          <w:sz w:val="24"/>
-        </w:rPr>
-      </w:pPr>
-      <w:r>
-        <w:rPr>
-          <w:sz w:val="24"/>
-        </w:rPr>
-        <w:t>view</w:t>
-      </w:r>
-      <w:r>
-        <w:rPr>
-          <w:sz w:val="24"/>
-        </w:rPr>
-        <w:tab/>
-        <w:t>few</w:t>
-      </w:r>
-      <w:r>
-        <w:rPr>
-          <w:sz w:val="24"/>
-        </w:rPr>
-        <w:tab/>
-        <w:t>valley</w:t>
-      </w:r>
-      <w:r>
-        <w:rPr>
-          <w:sz w:val="24"/>
-        </w:rPr>
-        <w:tab/>
-        <w:t>save</w:t>
-      </w:r>
-      <w:r>
-        <w:rPr>
-          <w:sz w:val="24"/>
-        </w:rPr>
-        <w:tab/>
-        <w:t>valve</w:t>
-      </w:r>
-    </w:p>
-    <w:p>
-      <w:pPr>
-        <w:spacing w:before="120" w:after="80"/>
-        <w:rPr>
-          <w:b/>
-          <w:sz w:val="24"/>
-        </w:rPr>
-      </w:pPr>
-      <w:r>
-        <w:rPr>
-          <w:b/>
-          <w:sz w:val="24"/>
-        </w:rPr>
-        <w:t>II. Say the sentences out loud. Then write the words with the sound /f/ and /v/ in the table.</w:t>
-      </w:r>
-    </w:p>
-    <w:p>
-      <w:pPr>
-        <w:spacing w:before="120" w:after="80"/>
-        <w:rPr>
-          <w:sz w:val="24"/>
-        </w:rPr>
-      </w:pPr>
-      <w:r>
-        <w:rPr>
-          <w:sz w:val="24"/>
-        </w:rPr>
-        <w:t>1. I feel so bad. Maybe I should take a rest for some minutes.</w:t>
-      </w:r>
-    </w:p>
-    <w:p>
-      <w:pPr>
-        <w:spacing w:before="120" w:after="80"/>
-        <w:rPr>
-          <w:sz w:val="24"/>
-        </w:rPr>
-      </w:pPr>
-      <w:r>
-        <w:rPr>
-          <w:sz w:val="24"/>
-        </w:rPr>
-        <w:t>2. His wife is laughing at the picture of the knight on the floor.</w:t>
-      </w:r>
-    </w:p>
-    <w:p>
-      <w:pPr>
-        <w:spacing w:before="120" w:after="80"/>
-        <w:rPr>
-          <w:sz w:val="24"/>
-        </w:rPr>
-      </w:pPr>
-      <w:r>
-        <w:rPr>
-          <w:sz w:val="24"/>
-        </w:rPr>
-        <w:t>3. Live our life and hold our fate.</w:t>
-      </w:r>
-    </w:p>
-    <w:p>
-      <w:pPr>
-        <w:spacing w:before="120" w:after="80"/>
-        <w:rPr>
-          <w:sz w:val="24"/>
-        </w:rPr>
-      </w:pPr>
-      <w:r>
-        <w:rPr>
-          <w:sz w:val="24"/>
-        </w:rPr>
-        <w:t xml:space="preserve">4. Which is the best movie in </w:t>
-      </w:r>
-      <w:r>
-        <w:rPr>
-          <w:i/>
-          <w:sz w:val="24"/>
-        </w:rPr>
-        <w:t>Fast and Furious</w:t>
-      </w:r>
-      <w:r>
-        <w:rPr>
-          <w:sz w:val="24"/>
-        </w:rPr>
-        <w:t xml:space="preserve"> series?</w:t>
-      </w:r>
-    </w:p>
-    <w:p>
-      <w:pPr>
-        <w:spacing w:before="120" w:after="80"/>
-        <w:rPr>
-          <w:sz w:val="24"/>
-        </w:rPr>
-      </w:pPr>
-      <w:r>
-        <w:rPr>
-          <w:sz w:val="24"/>
-        </w:rPr>
-        <w:t>5. The invitation cards are beautiful and creative.</w:t>
-      </w:r>
-    </w:p>
-    <w:p>
-      <w:pPr>
-        <w:spacing w:before="120" w:after="80"/>
-        <w:rPr>
-          <w:sz w:val="24"/>
-        </w:rPr>
-      </w:pPr>
-      <w:r>
-        <w:rPr>
-          <w:sz w:val="24"/>
-        </w:rPr>
-        <w:t>6. What animals have the rough skin? - Elephants, frogs, etc.</w:t>
-      </w:r>
-    </w:p>
-    <w:p>
-      <w:pPr>
-        <w:tabs>
-          <w:tab w:val="left" w:pos="1984"/>
-        </w:tabs>
-        <w:spacing w:before="60" w:after="60"/>
-        <w:ind w:left="1984" w:hanging="1984"/>
-        <w:rPr>
-          <w:sz w:val="24"/>
-        </w:rPr>
-      </w:pPr>
-      <w:r>
-        <w:rPr>
-          <w:sz w:val="24"/>
-        </w:rPr>
-        <w:t>/f/</w:t>
-      </w:r>
-      <w:r>
-        <w:rPr>
-          <w:sz w:val="24"/>
-        </w:rPr>
-        <w:tab/>
-        <w:t>/v/</w:t>
       </w:r>
     </w:p>
     <w:p>
@@ -2177,24 +1479,30 @@
         <w:tabs>
           <w:tab w:val="right" w:pos="9354"/>
         </w:tabs>
-        <w:spacing w:before="60" w:after="60"/>
-        <w:ind w:left="1984" w:hanging="1984"/>
-        <w:rPr>
-          <w:sz w:val="24"/>
-        </w:rPr>
-      </w:pPr>
-      <w:r>
-        <w:rPr>
-          <w:sz w:val="24"/>
-        </w:rPr>
-        <w:t>______</w:t>
-      </w:r>
-      <w:r>
-        <w:rPr>
-          <w:sz w:val="24"/>
-        </w:rPr>
-        <w:tab/>
-        <w:t>___________</w:t>
+        <w:spacing w:before="120" w:after="80"/>
+        <w:rPr>
+          <w:sz w:val="24"/>
+        </w:rPr>
+      </w:pPr>
+      <w:r>
+        <w:rPr>
+          <w:sz w:val="24"/>
+        </w:rPr>
+        <w:t>_____________________________________________</w:t>
+      </w:r>
+    </w:p>
+    <w:p>
+      <w:pPr>
+        <w:spacing w:before="120" w:after="80"/>
+        <w:rPr>
+          <w:sz w:val="24"/>
+        </w:rPr>
+      </w:pPr>
+      <w:r>
+        <w:rPr>
+          <w:sz w:val="24"/>
+        </w:rPr>
+        <w:t>2. your children/ go/ camp/ every summer holiday?</w:t>
       </w:r>
     </w:p>
     <w:p>
@@ -2202,24 +1510,30 @@
         <w:tabs>
           <w:tab w:val="right" w:pos="9354"/>
         </w:tabs>
-        <w:spacing w:before="60" w:after="60"/>
-        <w:ind w:left="1984" w:hanging="1984"/>
-        <w:rPr>
-          <w:sz w:val="24"/>
-        </w:rPr>
-      </w:pPr>
-      <w:r>
-        <w:rPr>
-          <w:sz w:val="24"/>
-        </w:rPr>
-        <w:t>______</w:t>
-      </w:r>
-      <w:r>
-        <w:rPr>
-          <w:sz w:val="24"/>
-        </w:rPr>
-        <w:tab/>
-        <w:t>___________</w:t>
+        <w:spacing w:before="120" w:after="80"/>
+        <w:rPr>
+          <w:sz w:val="24"/>
+        </w:rPr>
+      </w:pPr>
+      <w:r>
+        <w:rPr>
+          <w:sz w:val="24"/>
+        </w:rPr>
+        <w:t>_____________________________________________</w:t>
+      </w:r>
+    </w:p>
+    <w:p>
+      <w:pPr>
+        <w:spacing w:before="120" w:after="80"/>
+        <w:rPr>
+          <w:sz w:val="24"/>
+        </w:rPr>
+      </w:pPr>
+      <w:r>
+        <w:rPr>
+          <w:sz w:val="24"/>
+        </w:rPr>
+        <w:t>3. I/ think/ photography/ can/ expensive hobby</w:t>
       </w:r>
     </w:p>
     <w:p>
@@ -2227,24 +1541,245 @@
         <w:tabs>
           <w:tab w:val="right" w:pos="9354"/>
         </w:tabs>
+        <w:spacing w:before="120" w:after="80"/>
+        <w:rPr>
+          <w:sz w:val="24"/>
+        </w:rPr>
+      </w:pPr>
+      <w:r>
+        <w:rPr>
+          <w:sz w:val="24"/>
+        </w:rPr>
+        <w:t>_____________________________________________</w:t>
+      </w:r>
+    </w:p>
+    <w:p>
+      <w:pPr>
+        <w:keepNext/>
+        <w:spacing w:before="360" w:after="240"/>
+        <w:rPr>
+          <w:b/>
+          <w:sz w:val="24"/>
+        </w:rPr>
+      </w:pPr>
+      <w:r>
+        <w:rPr>
+          <w:b/>
+          <w:sz w:val="24"/>
+        </w:rPr>
+        <w:t>A.  PHONETICS</w:t>
+      </w:r>
+    </w:p>
+    <w:p>
+      <w:pPr>
+        <w:spacing w:before="120" w:after="80"/>
+        <w:rPr>
+          <w:b/>
+          <w:sz w:val="24"/>
+        </w:rPr>
+      </w:pPr>
+      <w:r>
+        <w:rPr>
+          <w:b/>
+          <w:sz w:val="24"/>
+        </w:rPr>
+        <w:t>I.  Underline the sound /f/ and circle the sound /v/.</w:t>
+      </w:r>
+    </w:p>
+    <w:p>
+      <w:pPr>
+        <w:tabs>
+          <w:tab w:val="left" w:pos="2098"/>
+          <w:tab w:val="left" w:pos="3912"/>
+          <w:tab w:val="left" w:pos="5726"/>
+          <w:tab w:val="left" w:pos="7540"/>
+        </w:tabs>
         <w:spacing w:before="60" w:after="60"/>
-        <w:ind w:left="1984" w:hanging="1984"/>
-        <w:rPr>
-          <w:sz w:val="24"/>
-        </w:rPr>
-      </w:pPr>
-      <w:r>
-        <w:rPr>
-          <w:sz w:val="24"/>
-        </w:rPr>
-        <w:t>______</w:t>
+        <w:ind w:left="283"/>
+        <w:rPr>
+          <w:sz w:val="24"/>
+        </w:rPr>
+      </w:pPr>
+      <w:r>
+        <w:rPr>
+          <w:sz w:val="24"/>
+        </w:rPr>
+        <w:t>fun</w:t>
       </w:r>
       <w:r>
         <w:rPr>
           <w:sz w:val="24"/>
         </w:rPr>
         <w:tab/>
-        <w:t>___________</w:t>
+        <w:t>fine</w:t>
+      </w:r>
+      <w:r>
+        <w:rPr>
+          <w:sz w:val="24"/>
+        </w:rPr>
+        <w:tab/>
+        <w:t>coffee</w:t>
+      </w:r>
+      <w:r>
+        <w:rPr>
+          <w:sz w:val="24"/>
+        </w:rPr>
+        <w:tab/>
+        <w:t>over</w:t>
+      </w:r>
+      <w:r>
+        <w:rPr>
+          <w:sz w:val="24"/>
+        </w:rPr>
+        <w:tab/>
+        <w:t>graph</w:t>
+      </w:r>
+    </w:p>
+    <w:p>
+      <w:pPr>
+        <w:tabs>
+          <w:tab w:val="left" w:pos="2098"/>
+          <w:tab w:val="left" w:pos="3912"/>
+          <w:tab w:val="left" w:pos="5726"/>
+          <w:tab w:val="left" w:pos="7540"/>
+        </w:tabs>
+        <w:spacing w:before="60" w:after="60"/>
+        <w:ind w:left="283"/>
+        <w:rPr>
+          <w:sz w:val="24"/>
+        </w:rPr>
+      </w:pPr>
+      <w:r>
+        <w:rPr>
+          <w:sz w:val="24"/>
+        </w:rPr>
+        <w:t>phone</w:t>
+      </w:r>
+      <w:r>
+        <w:rPr>
+          <w:sz w:val="24"/>
+        </w:rPr>
+        <w:tab/>
+        <w:t>brave</w:t>
+      </w:r>
+      <w:r>
+        <w:rPr>
+          <w:sz w:val="24"/>
+        </w:rPr>
+        <w:tab/>
+        <w:t>verb</w:t>
+      </w:r>
+      <w:r>
+        <w:rPr>
+          <w:sz w:val="24"/>
+        </w:rPr>
+        <w:tab/>
+        <w:t>stuff</w:t>
+      </w:r>
+      <w:r>
+        <w:rPr>
+          <w:sz w:val="24"/>
+        </w:rPr>
+        <w:tab/>
+        <w:t>clever</w:t>
+      </w:r>
+    </w:p>
+    <w:p>
+      <w:pPr>
+        <w:tabs>
+          <w:tab w:val="left" w:pos="2098"/>
+          <w:tab w:val="left" w:pos="3912"/>
+          <w:tab w:val="left" w:pos="5726"/>
+          <w:tab w:val="left" w:pos="7540"/>
+        </w:tabs>
+        <w:spacing w:before="60" w:after="60"/>
+        <w:ind w:left="283"/>
+        <w:rPr>
+          <w:sz w:val="24"/>
+        </w:rPr>
+      </w:pPr>
+      <w:r>
+        <w:rPr>
+          <w:sz w:val="24"/>
+        </w:rPr>
+        <w:t>enough</w:t>
+      </w:r>
+      <w:r>
+        <w:rPr>
+          <w:sz w:val="24"/>
+        </w:rPr>
+        <w:tab/>
+        <w:t>laughing</w:t>
+      </w:r>
+      <w:r>
+        <w:rPr>
+          <w:sz w:val="24"/>
+        </w:rPr>
+        <w:tab/>
+        <w:t>leaf</w:t>
+      </w:r>
+      <w:r>
+        <w:rPr>
+          <w:sz w:val="24"/>
+        </w:rPr>
+        <w:tab/>
+        <w:t>leave</w:t>
+      </w:r>
+      <w:r>
+        <w:rPr>
+          <w:sz w:val="24"/>
+        </w:rPr>
+        <w:tab/>
+        <w:t>vitamin</w:t>
+      </w:r>
+    </w:p>
+    <w:p>
+      <w:pPr>
+        <w:tabs>
+          <w:tab w:val="left" w:pos="2098"/>
+          <w:tab w:val="left" w:pos="3912"/>
+          <w:tab w:val="left" w:pos="5726"/>
+          <w:tab w:val="left" w:pos="7540"/>
+        </w:tabs>
+        <w:spacing w:before="60" w:after="60"/>
+        <w:ind w:left="283"/>
+        <w:rPr>
+          <w:sz w:val="24"/>
+        </w:rPr>
+      </w:pPr>
+      <w:r>
+        <w:rPr>
+          <w:sz w:val="24"/>
+        </w:rPr>
+        <w:t>view</w:t>
+      </w:r>
+      <w:r>
+        <w:rPr>
+          <w:sz w:val="24"/>
+        </w:rPr>
+        <w:tab/>
+        <w:t>few</w:t>
+      </w:r>
+      <w:r>
+        <w:rPr>
+          <w:sz w:val="24"/>
+        </w:rPr>
+        <w:tab/>
+        <w:t>valley</w:t>
+      </w:r>
+      <w:r>
+        <w:rPr>
+          <w:sz w:val="24"/>
+        </w:rPr>
+        <w:tab/>
+        <w:t>save</w:t>
+      </w:r>
+      <w:r>
+        <w:rPr>
+          <w:sz w:val="24"/>
+        </w:rPr>
+        <w:tab/>
+        <w:t>valve</w:t>
       </w:r>
     </w:p>
     <w:p>
@@ -2260,7 +1795,304 @@
           <w:b/>
           <w:sz w:val="24"/>
         </w:rPr>
-        <w:t>I. Look at the pictures and name the activities.</w:t>
+        <w:t>II. Say the sentences out loud. Then write the words with the sound /f/ and /v/ in the table.</w:t>
+      </w:r>
+    </w:p>
+    <w:p>
+      <w:pPr>
+        <w:spacing w:before="120" w:after="80"/>
+        <w:rPr>
+          <w:sz w:val="24"/>
+        </w:rPr>
+      </w:pPr>
+      <w:r>
+        <w:rPr>
+          <w:sz w:val="24"/>
+        </w:rPr>
+        <w:t>1. I feel so bad. Maybe I should take a rest for some minutes.</w:t>
+      </w:r>
+    </w:p>
+    <w:p>
+      <w:pPr>
+        <w:spacing w:before="120" w:after="80"/>
+        <w:rPr>
+          <w:sz w:val="24"/>
+        </w:rPr>
+      </w:pPr>
+      <w:r>
+        <w:rPr>
+          <w:sz w:val="24"/>
+        </w:rPr>
+        <w:t>2. His wife is laughing at the picture of the knight on the floor.</w:t>
+      </w:r>
+    </w:p>
+    <w:p>
+      <w:pPr>
+        <w:spacing w:before="120" w:after="80"/>
+        <w:rPr>
+          <w:sz w:val="24"/>
+        </w:rPr>
+      </w:pPr>
+      <w:r>
+        <w:rPr>
+          <w:sz w:val="24"/>
+        </w:rPr>
+        <w:t>3. Live our life and hold our fate.</w:t>
+      </w:r>
+    </w:p>
+    <w:p>
+      <w:pPr>
+        <w:spacing w:before="120" w:after="80"/>
+        <w:rPr>
+          <w:sz w:val="24"/>
+        </w:rPr>
+      </w:pPr>
+      <w:r>
+        <w:rPr>
+          <w:sz w:val="24"/>
+        </w:rPr>
+        <w:t xml:space="preserve">4. Which is the best movie in </w:t>
+      </w:r>
+      <w:r>
+        <w:rPr>
+          <w:i/>
+          <w:sz w:val="24"/>
+        </w:rPr>
+        <w:t>Fast and Furious</w:t>
+      </w:r>
+      <w:r>
+        <w:rPr>
+          <w:sz w:val="24"/>
+        </w:rPr>
+        <w:t xml:space="preserve"> series?</w:t>
+      </w:r>
+    </w:p>
+    <w:p>
+      <w:pPr>
+        <w:spacing w:before="120" w:after="80"/>
+        <w:rPr>
+          <w:sz w:val="24"/>
+        </w:rPr>
+      </w:pPr>
+      <w:r>
+        <w:rPr>
+          <w:sz w:val="24"/>
+        </w:rPr>
+        <w:t>5. The invitation cards are beautiful and creative.</w:t>
+      </w:r>
+    </w:p>
+    <w:p>
+      <w:pPr>
+        <w:spacing w:before="120" w:after="80"/>
+        <w:rPr>
+          <w:sz w:val="24"/>
+        </w:rPr>
+      </w:pPr>
+      <w:r>
+        <w:rPr>
+          <w:sz w:val="24"/>
+        </w:rPr>
+        <w:t>6. What animals have the rough skin? - Elephants, frogs, etc.</w:t>
+      </w:r>
+    </w:p>
+    <w:tbl>
+      <w:tblPr>
+        <w:tblW w:w="0" w:type="auto"/>
+        <w:jc w:val="center"/>
+        <w:tblBorders>
+          <w:top w:val="single" w:sz="8" w:space="0" w:color="000000"/>
+          <w:left w:val="single" w:sz="8" w:space="0" w:color="000000"/>
+          <w:bottom w:val="single" w:sz="8" w:space="0" w:color="000000"/>
+          <w:right w:val="single" w:sz="8" w:space="0" w:color="000000"/>
+          <w:insideH w:val="single" w:sz="8" w:space="0" w:color="000000"/>
+          <w:insideV w:val="single" w:sz="8" w:space="0" w:color="000000"/>
+        </w:tblBorders>
+        <w:tblLayout w:type="fixed"/>
+        <w:tblCellMar>
+          <w:top w:w="85" w:type="dxa"/>
+          <w:left w:w="142" w:type="dxa"/>
+          <w:bottom w:w="85" w:type="dxa"/>
+          <w:right w:w="142" w:type="dxa"/>
+        </w:tblCellMar>
+        <w:tblLook w:val="0000" w:firstRow="0" w:lastRow="0" w:firstColumn="0" w:lastColumn="0" w:noHBand="0" w:noVBand="0"/>
+      </w:tblPr>
+      <w:tblGrid>
+        <w:gridCol w:w="4678"/>
+        <w:gridCol w:w="4678"/>
+      </w:tblGrid>
+      <w:tr>
+        <w:trPr>
+          <w:jc w:val="center"/>
+        </w:trPr>
+        <w:tc>
+          <w:tcPr>
+            <w:tcW w:w="4678" w:type="dxa"/>
+            <w:vAlign w:val="center"/>
+          </w:tcPr>
+          <w:p>
+            <w:pPr>
+              <w:spacing w:before="40" w:after="40"/>
+              <w:jc w:val="center"/>
+              <w:rPr>
+                <w:b/>
+                <w:sz w:val="24"/>
+              </w:rPr>
+            </w:pPr>
+            <w:r>
+              <w:rPr>
+                <w:b/>
+                <w:sz w:val="24"/>
+              </w:rPr>
+              <w:t>/f/</w:t>
+            </w:r>
+          </w:p>
+        </w:tc>
+        <w:tc>
+          <w:tcPr>
+            <w:tcW w:w="4678" w:type="dxa"/>
+            <w:vAlign w:val="center"/>
+          </w:tcPr>
+          <w:p>
+            <w:pPr>
+              <w:spacing w:before="40" w:after="40"/>
+              <w:jc w:val="center"/>
+              <w:rPr>
+                <w:b/>
+                <w:sz w:val="24"/>
+              </w:rPr>
+            </w:pPr>
+            <w:r>
+              <w:rPr>
+                <w:b/>
+                <w:sz w:val="24"/>
+              </w:rPr>
+              <w:t>/v/</w:t>
+            </w:r>
+          </w:p>
+        </w:tc>
+      </w:tr>
+      <w:tr>
+        <w:trPr>
+          <w:jc w:val="center"/>
+        </w:trPr>
+        <w:tc>
+          <w:tcPr>
+            <w:tcW w:w="4678" w:type="dxa"/>
+            <w:vAlign w:val="center"/>
+          </w:tcPr>
+          <w:p>
+            <w:pPr>
+              <w:spacing w:before="40" w:after="40"/>
+              <w:rPr>
+                <w:sz w:val="24"/>
+              </w:rPr>
+            </w:pPr>
+          </w:p>
+        </w:tc>
+        <w:tc>
+          <w:tcPr>
+            <w:tcW w:w="4678" w:type="dxa"/>
+            <w:vAlign w:val="center"/>
+          </w:tcPr>
+          <w:p>
+            <w:pPr>
+              <w:spacing w:before="40" w:after="40"/>
+              <w:rPr>
+                <w:sz w:val="24"/>
+              </w:rPr>
+            </w:pPr>
+          </w:p>
+        </w:tc>
+      </w:tr>
+      <w:tr>
+        <w:trPr>
+          <w:jc w:val="center"/>
+        </w:trPr>
+        <w:tc>
+          <w:tcPr>
+            <w:tcW w:w="4678" w:type="dxa"/>
+            <w:vAlign w:val="center"/>
+          </w:tcPr>
+          <w:p>
+            <w:pPr>
+              <w:spacing w:before="40" w:after="40"/>
+              <w:rPr>
+                <w:sz w:val="24"/>
+              </w:rPr>
+            </w:pPr>
+          </w:p>
+        </w:tc>
+        <w:tc>
+          <w:tcPr>
+            <w:tcW w:w="4678" w:type="dxa"/>
+            <w:vAlign w:val="center"/>
+          </w:tcPr>
+          <w:p>
+            <w:pPr>
+              <w:spacing w:before="40" w:after="40"/>
+              <w:rPr>
+                <w:sz w:val="24"/>
+              </w:rPr>
+            </w:pPr>
+          </w:p>
+        </w:tc>
+      </w:tr>
+      <w:tr>
+        <w:trPr>
+          <w:jc w:val="center"/>
+        </w:trPr>
+        <w:tc>
+          <w:tcPr>
+            <w:tcW w:w="4678" w:type="dxa"/>
+            <w:vAlign w:val="center"/>
+          </w:tcPr>
+          <w:p>
+            <w:pPr>
+              <w:spacing w:before="40" w:after="40"/>
+              <w:rPr>
+                <w:sz w:val="24"/>
+              </w:rPr>
+            </w:pPr>
+          </w:p>
+        </w:tc>
+        <w:tc>
+          <w:tcPr>
+            <w:tcW w:w="4678" w:type="dxa"/>
+            <w:vAlign w:val="center"/>
+          </w:tcPr>
+          <w:p>
+            <w:pPr>
+              <w:spacing w:before="40" w:after="40"/>
+              <w:rPr>
+                <w:sz w:val="24"/>
+              </w:rPr>
+            </w:pPr>
+          </w:p>
+        </w:tc>
+      </w:tr>
+    </w:tbl>
+    <w:p>
+      <w:pPr>
+        <w:spacing w:before="120" w:after="80"/>
+        <w:rPr>
+          <w:sz w:val="24"/>
+        </w:rPr>
+      </w:pPr>
+    </w:p>
+    <w:p>
+      <w:pPr>
+        <w:spacing w:before="120" w:after="80"/>
+        <w:rPr>
+          <w:b/>
+          <w:sz w:val="24"/>
+        </w:rPr>
+      </w:pPr>
+      <w:r>
+        <w:rPr>
+          <w:b/>
+          <w:sz w:val="24"/>
+        </w:rPr>
+        <w:t>I.  Look at the pictures and name the activities.</w:t>
       </w:r>
     </w:p>
     <w:p>
@@ -2286,7 +2118,7 @@
         <mc:AlternateContent>
           <mc:Choice Requires="wps">
             <w:drawing>
-              <wp:anchor distT="0" distB="0" distL="114300" distR="114300" simplePos="0" relativeHeight="251659264" behindDoc="0" locked="0" layoutInCell="1" allowOverlap="1" wp14:anchorId="20BD9F55" wp14:editId="776DF09D">
+              <wp:anchor distT="0" distB="0" distL="114300" distR="114300" simplePos="0" relativeHeight="251659264" behindDoc="0" locked="0" layoutInCell="1" allowOverlap="1" wp14:anchorId="012AD419" wp14:editId="7841A9F2">
                 <wp:simplePos x="0" y="0"/>
                 <wp:positionH relativeFrom="margin">
                   <wp:posOffset>112395</wp:posOffset>
@@ -2297,7 +2129,7 @@
                 <wp:extent cx="5715000" cy="558800"/>
                 <wp:effectExtent l="0" t="0" r="19050" b="12700"/>
                 <wp:wrapNone/>
-                <wp:docPr id="1935565881" name="Rectangle: Rounded Corners 1"/>
+                <wp:docPr id="587855616" name="Rectangle: Rounded Corners 1"/>
                 <wp:cNvGraphicFramePr/>
                 <a:graphic xmlns:a="http://schemas.openxmlformats.org/drawingml/2006/main">
                   <a:graphicData uri="http://schemas.microsoft.com/office/word/2010/wordprocessingShape">
@@ -2360,7 +2192,7 @@
           </mc:Choice>
           <mc:Fallback>
             <w:pict>
-              <v:roundrect w14:anchorId="7D46BFD9" id="Rectangle: Rounded Corners 1" o:spid="_x0000_s1026" style="position:absolute;margin-left:8.85pt;margin-top:-6pt;width:450pt;height:44pt;z-index:251659264;visibility:visible;mso-wrap-style:square;mso-wrap-distance-left:9pt;mso-wrap-distance-top:0;mso-wrap-distance-right:9pt;mso-wrap-distance-bottom:0;mso-position-horizontal:absolute;mso-position-horizontal-relative:margin;mso-position-vertical:absolute;mso-position-vertical-relative:text;v-text-anchor:middle" arcsize="10923f" o:gfxdata="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" filled="f" fillcolor="#156082 [3204]" strokeweight="1pt">
+              <v:roundrect w14:anchorId="03CB12F4" id="Rectangle: Rounded Corners 1" o:spid="_x0000_s1026" style="position:absolute;margin-left:8.85pt;margin-top:-6pt;width:450pt;height:44pt;z-index:251659264;visibility:visible;mso-wrap-style:square;mso-wrap-distance-left:9pt;mso-wrap-distance-top:0;mso-wrap-distance-right:9pt;mso-wrap-distance-bottom:0;mso-position-horizontal:absolute;mso-position-horizontal-relative:margin;mso-position-vertical:absolute;mso-position-vertical-relative:text;v-text-anchor:middle" arcsize="10923f" o:gfxdata="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" filled="f" fillcolor="#156082 [3204]" strokeweight="1pt">
                 <v:stroke joinstyle="miter"/>
                 <w10:wrap anchorx="margin"/>
               </v:roundrect>
@@ -2434,6 +2266,7 @@
           <w:b/>
           <w:sz w:val="24"/>
         </w:rPr>
+        <w:lastRenderedPageBreak/>
         <w:t>making models</w:t>
       </w:r>
       <w:r>
@@ -2479,66 +2312,246 @@
     <w:p>
       <w:pPr>
         <w:tabs>
-          <w:tab w:val="left" w:pos="3946"/>
+          <w:tab w:val="left" w:pos="2339"/>
+          <w:tab w:val="left" w:pos="4677"/>
+          <w:tab w:val="left" w:pos="7016"/>
         </w:tabs>
-        <w:spacing w:before="60" w:after="60" w:line="240" w:lineRule="auto"/>
-        <w:ind w:left="3946" w:hanging="3946"/>
-        <w:rPr>
-          <w:b/>
-          <w:i/>
-          <w:sz w:val="20"/>
-        </w:rPr>
-      </w:pPr>
-      <w:r>
-        <w:rPr>
-          <w:sz w:val="24"/>
-        </w:rPr>
-        <w:t>1. [PIC: "A child making models"</w:t>
-      </w:r>
-      <w:r>
-        <w:rPr>
+        <w:spacing w:before="120" w:after="40" w:line="480" w:lineRule="auto"/>
+        <w:rPr>
+          <w:b/>
+          <w:sz w:val="24"/>
+        </w:rPr>
+      </w:pPr>
+      <w:r>
+        <w:rPr>
+          <w:b/>
+          <w:noProof/>
+          <w:sz w:val="24"/>
+        </w:rPr>
+        <w:drawing>
+          <wp:inline distT="0" distB="0" distL="0" distR="0" wp14:anchorId="521A1A2B" wp14:editId="74A64DAB">
+            <wp:extent cx="1260000" cy="900000"/>
+            <wp:effectExtent l="0" t="0" r="0" b="0"/>
+            <wp:docPr id="172742844" name="Picture 2"/>
+            <wp:cNvGraphicFramePr/>
+            <a:graphic xmlns:a="http://schemas.openxmlformats.org/drawingml/2006/main">
+              <a:graphicData uri="http://schemas.openxmlformats.org/drawingml/2006/picture">
+                <pic:pic xmlns:pic="http://schemas.openxmlformats.org/drawingml/2006/picture">
+                  <pic:nvPicPr>
+                    <pic:cNvPr id="172742844" name=""/>
+                    <pic:cNvPicPr/>
+                  </pic:nvPicPr>
+                  <pic:blipFill>
+                    <a:blip r:embed="rId6">
+                      <a:extLst>
+                        <a:ext uri="{28A0092B-C50C-407E-A947-70E740481C1C}">
+                          <a14:useLocalDpi xmlns:a14="http://schemas.microsoft.com/office/drawing/2010/main" val="0"/>
+                        </a:ext>
+                      </a:extLst>
+                    </a:blip>
+                    <a:stretch>
+                      <a:fillRect/>
+                    </a:stretch>
+                  </pic:blipFill>
+                  <pic:spPr>
+                    <a:xfrm>
+                      <a:off x="0" y="0"/>
+                      <a:ext cx="1260000" cy="900000"/>
+                    </a:xfrm>
+                    <a:prstGeom prst="rect">
+                      <a:avLst/>
+                    </a:prstGeom>
+                  </pic:spPr>
+                </pic:pic>
+              </a:graphicData>
+            </a:graphic>
+          </wp:inline>
+        </w:drawing>
+      </w:r>
+      <w:r>
+        <w:rPr>
+          <w:b/>
           <w:sz w:val="24"/>
         </w:rPr>
         <w:tab/>
       </w:r>
       <w:r>
         <w:rPr>
-          <w:rFonts w:ascii="Segoe UI Emoji" w:hAnsi="Segoe UI Emoji" w:cs="Segoe UI Emoji"/>
-          <w:b/>
-          <w:i/>
-          <w:color w:val="808080"/>
-          <w:sz w:val="20"/>
-        </w:rPr>
-        <w:t>🖼️</w:t>
-      </w:r>
-      <w:r>
-        <w:rPr>
-          <w:b/>
-          <w:i/>
-          <w:color w:val="808080"/>
-          <w:sz w:val="20"/>
-        </w:rPr>
-        <w:t xml:space="preserve"> [ DIAGRAM / IMAGE: A child with dollhouse ]</w:t>
+          <w:b/>
+          <w:noProof/>
+          <w:sz w:val="24"/>
+        </w:rPr>
+        <w:drawing>
+          <wp:inline distT="0" distB="0" distL="0" distR="0" wp14:anchorId="6E88AFDF" wp14:editId="577FFBF7">
+            <wp:extent cx="1260000" cy="900000"/>
+            <wp:effectExtent l="0" t="0" r="0" b="0"/>
+            <wp:docPr id="503126647" name="Picture 3"/>
+            <wp:cNvGraphicFramePr/>
+            <a:graphic xmlns:a="http://schemas.openxmlformats.org/drawingml/2006/main">
+              <a:graphicData uri="http://schemas.openxmlformats.org/drawingml/2006/picture">
+                <pic:pic xmlns:pic="http://schemas.openxmlformats.org/drawingml/2006/picture">
+                  <pic:nvPicPr>
+                    <pic:cNvPr id="503126647" name=""/>
+                    <pic:cNvPicPr/>
+                  </pic:nvPicPr>
+                  <pic:blipFill>
+                    <a:blip r:embed="rId7">
+                      <a:extLst>
+                        <a:ext uri="{28A0092B-C50C-407E-A947-70E740481C1C}">
+                          <a14:useLocalDpi xmlns:a14="http://schemas.microsoft.com/office/drawing/2010/main" val="0"/>
+                        </a:ext>
+                      </a:extLst>
+                    </a:blip>
+                    <a:stretch>
+                      <a:fillRect/>
+                    </a:stretch>
+                  </pic:blipFill>
+                  <pic:spPr>
+                    <a:xfrm>
+                      <a:off x="0" y="0"/>
+                      <a:ext cx="1260000" cy="900000"/>
+                    </a:xfrm>
+                    <a:prstGeom prst="rect">
+                      <a:avLst/>
+                    </a:prstGeom>
+                  </pic:spPr>
+                </pic:pic>
+              </a:graphicData>
+            </a:graphic>
+          </wp:inline>
+        </w:drawing>
+      </w:r>
+      <w:r>
+        <w:rPr>
+          <w:b/>
+          <w:sz w:val="24"/>
+        </w:rPr>
+        <w:tab/>
+      </w:r>
+      <w:r>
+        <w:rPr>
+          <w:b/>
+          <w:noProof/>
+          <w:sz w:val="24"/>
+        </w:rPr>
+        <w:drawing>
+          <wp:inline distT="0" distB="0" distL="0" distR="0" wp14:anchorId="78299F93" wp14:editId="2A008700">
+            <wp:extent cx="1260000" cy="900000"/>
+            <wp:effectExtent l="0" t="0" r="0" b="0"/>
+            <wp:docPr id="2140220150" name="Picture 4"/>
+            <wp:cNvGraphicFramePr/>
+            <a:graphic xmlns:a="http://schemas.openxmlformats.org/drawingml/2006/main">
+              <a:graphicData uri="http://schemas.openxmlformats.org/drawingml/2006/picture">
+                <pic:pic xmlns:pic="http://schemas.openxmlformats.org/drawingml/2006/picture">
+                  <pic:nvPicPr>
+                    <pic:cNvPr id="2140220150" name=""/>
+                    <pic:cNvPicPr/>
+                  </pic:nvPicPr>
+                  <pic:blipFill>
+                    <a:blip r:embed="rId8">
+                      <a:extLst>
+                        <a:ext uri="{28A0092B-C50C-407E-A947-70E740481C1C}">
+                          <a14:useLocalDpi xmlns:a14="http://schemas.microsoft.com/office/drawing/2010/main" val="0"/>
+                        </a:ext>
+                      </a:extLst>
+                    </a:blip>
+                    <a:stretch>
+                      <a:fillRect/>
+                    </a:stretch>
+                  </pic:blipFill>
+                  <pic:spPr>
+                    <a:xfrm>
+                      <a:off x="0" y="0"/>
+                      <a:ext cx="1260000" cy="900000"/>
+                    </a:xfrm>
+                    <a:prstGeom prst="rect">
+                      <a:avLst/>
+                    </a:prstGeom>
+                  </pic:spPr>
+                </pic:pic>
+              </a:graphicData>
+            </a:graphic>
+          </wp:inline>
+        </w:drawing>
+      </w:r>
+      <w:r>
+        <w:rPr>
+          <w:b/>
+          <w:sz w:val="24"/>
+        </w:rPr>
+        <w:tab/>
+      </w:r>
+      <w:r>
+        <w:rPr>
+          <w:b/>
+          <w:noProof/>
+          <w:sz w:val="24"/>
+        </w:rPr>
+        <w:drawing>
+          <wp:inline distT="0" distB="0" distL="0" distR="0" wp14:anchorId="7F63D660" wp14:editId="084F880C">
+            <wp:extent cx="1260000" cy="900000"/>
+            <wp:effectExtent l="0" t="0" r="0" b="0"/>
+            <wp:docPr id="1285230026" name="Picture 5"/>
+            <wp:cNvGraphicFramePr/>
+            <a:graphic xmlns:a="http://schemas.openxmlformats.org/drawingml/2006/main">
+              <a:graphicData uri="http://schemas.openxmlformats.org/drawingml/2006/picture">
+                <pic:pic xmlns:pic="http://schemas.openxmlformats.org/drawingml/2006/picture">
+                  <pic:nvPicPr>
+                    <pic:cNvPr id="1285230026" name=""/>
+                    <pic:cNvPicPr/>
+                  </pic:nvPicPr>
+                  <pic:blipFill>
+                    <a:blip r:embed="rId8">
+                      <a:extLst>
+                        <a:ext uri="{28A0092B-C50C-407E-A947-70E740481C1C}">
+                          <a14:useLocalDpi xmlns:a14="http://schemas.microsoft.com/office/drawing/2010/main" val="0"/>
+                        </a:ext>
+                      </a:extLst>
+                    </a:blip>
+                    <a:stretch>
+                      <a:fillRect/>
+                    </a:stretch>
+                  </pic:blipFill>
+                  <pic:spPr>
+                    <a:xfrm>
+                      <a:off x="0" y="0"/>
+                      <a:ext cx="1260000" cy="900000"/>
+                    </a:xfrm>
+                    <a:prstGeom prst="rect">
+                      <a:avLst/>
+                    </a:prstGeom>
+                  </pic:spPr>
+                </pic:pic>
+              </a:graphicData>
+            </a:graphic>
+          </wp:inline>
+        </w:drawing>
       </w:r>
     </w:p>
     <w:p>
       <w:pPr>
         <w:tabs>
-          <w:tab w:val="left" w:pos="2823"/>
+          <w:tab w:val="left" w:pos="2339"/>
+          <w:tab w:val="left" w:pos="4677"/>
+          <w:tab w:val="left" w:pos="7016"/>
         </w:tabs>
-        <w:spacing w:before="60" w:after="60" w:line="240" w:lineRule="auto"/>
-        <w:ind w:left="2823" w:hanging="2823"/>
-        <w:rPr>
-          <w:b/>
-          <w:i/>
-          <w:sz w:val="20"/>
-        </w:rPr>
-      </w:pPr>
-      <w:r>
-        <w:rPr>
-          <w:sz w:val="24"/>
-        </w:rPr>
-        <w:t>5. [PIC: "Doing yoga"</w:t>
+        <w:spacing w:before="40" w:line="480" w:lineRule="auto"/>
+        <w:rPr>
+          <w:sz w:val="24"/>
+        </w:rPr>
+      </w:pPr>
+      <w:r>
+        <w:rPr>
+          <w:b/>
+          <w:sz w:val="24"/>
+        </w:rPr>
+        <w:t xml:space="preserve">1. </w:t>
+      </w:r>
+      <w:r>
+        <w:rPr>
+          <w:sz w:val="24"/>
+        </w:rPr>
+        <w:t>_________</w:t>
       </w:r>
       <w:r>
         <w:rPr>
@@ -2548,27 +2561,353 @@
       </w:r>
       <w:r>
         <w:rPr>
-          <w:rFonts w:ascii="Segoe UI Emoji" w:hAnsi="Segoe UI Emoji" w:cs="Segoe UI Emoji"/>
-          <w:b/>
-          <w:i/>
-          <w:color w:val="808080"/>
-          <w:sz w:val="20"/>
-        </w:rPr>
-        <w:t>🖼️</w:t>
-      </w:r>
-      <w:r>
-        <w:rPr>
-          <w:b/>
-          <w:i/>
-          <w:color w:val="808080"/>
-          <w:sz w:val="20"/>
-        </w:rPr>
-        <w:t xml:space="preserve"> [ DIAGRAM / IMAGE: Jogging ]</w:t>
-      </w:r>
-    </w:p>
-    <w:p>
-      <w:pPr>
-        <w:spacing w:before="120" w:after="80" w:line="240" w:lineRule="auto"/>
+          <w:b/>
+          <w:sz w:val="24"/>
+        </w:rPr>
+        <w:t xml:space="preserve">2. </w:t>
+      </w:r>
+      <w:r>
+        <w:rPr>
+          <w:sz w:val="24"/>
+        </w:rPr>
+        <w:t>_________</w:t>
+      </w:r>
+      <w:r>
+        <w:rPr>
+          <w:sz w:val="24"/>
+        </w:rPr>
+        <w:tab/>
+      </w:r>
+      <w:r>
+        <w:rPr>
+          <w:b/>
+          <w:sz w:val="24"/>
+        </w:rPr>
+        <w:t xml:space="preserve">3. </w:t>
+      </w:r>
+      <w:r>
+        <w:rPr>
+          <w:sz w:val="24"/>
+        </w:rPr>
+        <w:t>_________</w:t>
+      </w:r>
+      <w:r>
+        <w:rPr>
+          <w:sz w:val="24"/>
+        </w:rPr>
+        <w:tab/>
+      </w:r>
+      <w:r>
+        <w:rPr>
+          <w:b/>
+          <w:sz w:val="24"/>
+        </w:rPr>
+        <w:t xml:space="preserve">4. </w:t>
+      </w:r>
+      <w:r>
+        <w:rPr>
+          <w:sz w:val="24"/>
+        </w:rPr>
+        <w:t>_________</w:t>
+      </w:r>
+    </w:p>
+    <w:p>
+      <w:pPr>
+        <w:tabs>
+          <w:tab w:val="left" w:pos="2339"/>
+          <w:tab w:val="left" w:pos="4677"/>
+          <w:tab w:val="left" w:pos="7016"/>
+        </w:tabs>
+        <w:spacing w:before="120" w:after="40" w:line="480" w:lineRule="auto"/>
+        <w:rPr>
+          <w:sz w:val="24"/>
+        </w:rPr>
+      </w:pPr>
+      <w:r>
+        <w:rPr>
+          <w:noProof/>
+          <w:sz w:val="24"/>
+        </w:rPr>
+        <w:drawing>
+          <wp:inline distT="0" distB="0" distL="0" distR="0" wp14:anchorId="5F51EC94" wp14:editId="0A58453E">
+            <wp:extent cx="1260000" cy="900000"/>
+            <wp:effectExtent l="0" t="0" r="0" b="0"/>
+            <wp:docPr id="645485856" name="Picture 6"/>
+            <wp:cNvGraphicFramePr/>
+            <a:graphic xmlns:a="http://schemas.openxmlformats.org/drawingml/2006/main">
+              <a:graphicData uri="http://schemas.openxmlformats.org/drawingml/2006/picture">
+                <pic:pic xmlns:pic="http://schemas.openxmlformats.org/drawingml/2006/picture">
+                  <pic:nvPicPr>
+                    <pic:cNvPr id="645485856" name=""/>
+                    <pic:cNvPicPr/>
+                  </pic:nvPicPr>
+                  <pic:blipFill>
+                    <a:blip r:embed="rId8">
+                      <a:extLst>
+                        <a:ext uri="{28A0092B-C50C-407E-A947-70E740481C1C}">
+                          <a14:useLocalDpi xmlns:a14="http://schemas.microsoft.com/office/drawing/2010/main" val="0"/>
+                        </a:ext>
+                      </a:extLst>
+                    </a:blip>
+                    <a:stretch>
+                      <a:fillRect/>
+                    </a:stretch>
+                  </pic:blipFill>
+                  <pic:spPr>
+                    <a:xfrm>
+                      <a:off x="0" y="0"/>
+                      <a:ext cx="1260000" cy="900000"/>
+                    </a:xfrm>
+                    <a:prstGeom prst="rect">
+                      <a:avLst/>
+                    </a:prstGeom>
+                  </pic:spPr>
+                </pic:pic>
+              </a:graphicData>
+            </a:graphic>
+          </wp:inline>
+        </w:drawing>
+      </w:r>
+      <w:r>
+        <w:rPr>
+          <w:sz w:val="24"/>
+        </w:rPr>
+        <w:tab/>
+      </w:r>
+      <w:r>
+        <w:rPr>
+          <w:noProof/>
+          <w:sz w:val="24"/>
+        </w:rPr>
+        <w:drawing>
+          <wp:inline distT="0" distB="0" distL="0" distR="0" wp14:anchorId="3507F125" wp14:editId="67BF62FB">
+            <wp:extent cx="1260000" cy="900000"/>
+            <wp:effectExtent l="0" t="0" r="0" b="0"/>
+            <wp:docPr id="354487270" name="Picture 7"/>
+            <wp:cNvGraphicFramePr/>
+            <a:graphic xmlns:a="http://schemas.openxmlformats.org/drawingml/2006/main">
+              <a:graphicData uri="http://schemas.openxmlformats.org/drawingml/2006/picture">
+                <pic:pic xmlns:pic="http://schemas.openxmlformats.org/drawingml/2006/picture">
+                  <pic:nvPicPr>
+                    <pic:cNvPr id="354487270" name=""/>
+                    <pic:cNvPicPr/>
+                  </pic:nvPicPr>
+                  <pic:blipFill>
+                    <a:blip r:embed="rId9" cstate="print">
+                      <a:extLst>
+                        <a:ext uri="{28A0092B-C50C-407E-A947-70E740481C1C}">
+                          <a14:useLocalDpi xmlns:a14="http://schemas.microsoft.com/office/drawing/2010/main" val="0"/>
+                        </a:ext>
+                      </a:extLst>
+                    </a:blip>
+                    <a:stretch>
+                      <a:fillRect/>
+                    </a:stretch>
+                  </pic:blipFill>
+                  <pic:spPr>
+                    <a:xfrm>
+                      <a:off x="0" y="0"/>
+                      <a:ext cx="1260000" cy="900000"/>
+                    </a:xfrm>
+                    <a:prstGeom prst="rect">
+                      <a:avLst/>
+                    </a:prstGeom>
+                  </pic:spPr>
+                </pic:pic>
+              </a:graphicData>
+            </a:graphic>
+          </wp:inline>
+        </w:drawing>
+      </w:r>
+      <w:r>
+        <w:rPr>
+          <w:sz w:val="24"/>
+        </w:rPr>
+        <w:tab/>
+      </w:r>
+      <w:r>
+        <w:rPr>
+          <w:noProof/>
+          <w:sz w:val="24"/>
+        </w:rPr>
+        <w:drawing>
+          <wp:inline distT="0" distB="0" distL="0" distR="0" wp14:anchorId="709CBD50" wp14:editId="6BD8239E">
+            <wp:extent cx="1260000" cy="900000"/>
+            <wp:effectExtent l="0" t="0" r="0" b="0"/>
+            <wp:docPr id="407022136" name="Picture 8"/>
+            <wp:cNvGraphicFramePr/>
+            <a:graphic xmlns:a="http://schemas.openxmlformats.org/drawingml/2006/main">
+              <a:graphicData uri="http://schemas.openxmlformats.org/drawingml/2006/picture">
+                <pic:pic xmlns:pic="http://schemas.openxmlformats.org/drawingml/2006/picture">
+                  <pic:nvPicPr>
+                    <pic:cNvPr id="407022136" name=""/>
+                    <pic:cNvPicPr/>
+                  </pic:nvPicPr>
+                  <pic:blipFill>
+                    <a:blip r:embed="rId10">
+                      <a:extLst>
+                        <a:ext uri="{28A0092B-C50C-407E-A947-70E740481C1C}">
+                          <a14:useLocalDpi xmlns:a14="http://schemas.microsoft.com/office/drawing/2010/main" val="0"/>
+                        </a:ext>
+                      </a:extLst>
+                    </a:blip>
+                    <a:stretch>
+                      <a:fillRect/>
+                    </a:stretch>
+                  </pic:blipFill>
+                  <pic:spPr>
+                    <a:xfrm>
+                      <a:off x="0" y="0"/>
+                      <a:ext cx="1260000" cy="900000"/>
+                    </a:xfrm>
+                    <a:prstGeom prst="rect">
+                      <a:avLst/>
+                    </a:prstGeom>
+                  </pic:spPr>
+                </pic:pic>
+              </a:graphicData>
+            </a:graphic>
+          </wp:inline>
+        </w:drawing>
+      </w:r>
+      <w:r>
+        <w:rPr>
+          <w:sz w:val="24"/>
+        </w:rPr>
+        <w:tab/>
+      </w:r>
+      <w:r>
+        <w:rPr>
+          <w:noProof/>
+          <w:sz w:val="24"/>
+        </w:rPr>
+        <w:drawing>
+          <wp:inline distT="0" distB="0" distL="0" distR="0" wp14:anchorId="2DC81504" wp14:editId="798B155C">
+            <wp:extent cx="1260000" cy="900000"/>
+            <wp:effectExtent l="0" t="0" r="0" b="0"/>
+            <wp:docPr id="1813120524" name="Picture 9"/>
+            <wp:cNvGraphicFramePr/>
+            <a:graphic xmlns:a="http://schemas.openxmlformats.org/drawingml/2006/main">
+              <a:graphicData uri="http://schemas.openxmlformats.org/drawingml/2006/picture">
+                <pic:pic xmlns:pic="http://schemas.openxmlformats.org/drawingml/2006/picture">
+                  <pic:nvPicPr>
+                    <pic:cNvPr id="1813120524" name=""/>
+                    <pic:cNvPicPr/>
+                  </pic:nvPicPr>
+                  <pic:blipFill>
+                    <a:blip r:embed="rId11" cstate="print">
+                      <a:extLst>
+                        <a:ext uri="{28A0092B-C50C-407E-A947-70E740481C1C}">
+                          <a14:useLocalDpi xmlns:a14="http://schemas.microsoft.com/office/drawing/2010/main" val="0"/>
+                        </a:ext>
+                      </a:extLst>
+                    </a:blip>
+                    <a:stretch>
+                      <a:fillRect/>
+                    </a:stretch>
+                  </pic:blipFill>
+                  <pic:spPr>
+                    <a:xfrm>
+                      <a:off x="0" y="0"/>
+                      <a:ext cx="1260000" cy="900000"/>
+                    </a:xfrm>
+                    <a:prstGeom prst="rect">
+                      <a:avLst/>
+                    </a:prstGeom>
+                  </pic:spPr>
+                </pic:pic>
+              </a:graphicData>
+            </a:graphic>
+          </wp:inline>
+        </w:drawing>
+      </w:r>
+    </w:p>
+    <w:p>
+      <w:pPr>
+        <w:tabs>
+          <w:tab w:val="left" w:pos="2339"/>
+          <w:tab w:val="left" w:pos="4677"/>
+          <w:tab w:val="left" w:pos="7016"/>
+        </w:tabs>
+        <w:spacing w:before="40" w:line="480" w:lineRule="auto"/>
+        <w:rPr>
+          <w:sz w:val="24"/>
+        </w:rPr>
+      </w:pPr>
+      <w:r>
+        <w:rPr>
+          <w:b/>
+          <w:sz w:val="24"/>
+        </w:rPr>
+        <w:t xml:space="preserve">5. </w:t>
+      </w:r>
+      <w:r>
+        <w:rPr>
+          <w:sz w:val="24"/>
+        </w:rPr>
+        <w:t>_________</w:t>
+      </w:r>
+      <w:r>
+        <w:rPr>
+          <w:sz w:val="24"/>
+        </w:rPr>
+        <w:tab/>
+      </w:r>
+      <w:r>
+        <w:rPr>
+          <w:b/>
+          <w:sz w:val="24"/>
+        </w:rPr>
+        <w:t xml:space="preserve">6. </w:t>
+      </w:r>
+      <w:r>
+        <w:rPr>
+          <w:sz w:val="24"/>
+        </w:rPr>
+        <w:t>_________</w:t>
+      </w:r>
+      <w:r>
+        <w:rPr>
+          <w:sz w:val="24"/>
+        </w:rPr>
+        <w:tab/>
+      </w:r>
+      <w:r>
+        <w:rPr>
+          <w:b/>
+          <w:sz w:val="24"/>
+        </w:rPr>
+        <w:t xml:space="preserve">7. </w:t>
+      </w:r>
+      <w:r>
+        <w:rPr>
+          <w:sz w:val="24"/>
+        </w:rPr>
+        <w:t>_________</w:t>
+      </w:r>
+      <w:r>
+        <w:rPr>
+          <w:sz w:val="24"/>
+        </w:rPr>
+        <w:tab/>
+      </w:r>
+      <w:r>
+        <w:rPr>
+          <w:b/>
+          <w:sz w:val="24"/>
+        </w:rPr>
+        <w:t xml:space="preserve">8. </w:t>
+      </w:r>
+      <w:r>
+        <w:rPr>
+          <w:sz w:val="24"/>
+        </w:rPr>
+        <w:t>_________</w:t>
+      </w:r>
+    </w:p>
+    <w:p>
+      <w:pPr>
+        <w:spacing w:before="120" w:after="80" w:line="480" w:lineRule="auto"/>
         <w:rPr>
           <w:b/>
           <w:sz w:val="24"/>
@@ -2587,7 +2926,7 @@
         <w:tabs>
           <w:tab w:val="left" w:pos="2007"/>
         </w:tabs>
-        <w:spacing w:before="60" w:after="60" w:line="240" w:lineRule="auto"/>
+        <w:spacing w:before="60" w:after="60" w:line="480" w:lineRule="auto"/>
         <w:ind w:left="2007" w:hanging="2007"/>
         <w:rPr>
           <w:sz w:val="24"/>
@@ -2624,7 +2963,7 @@
         <w:tabs>
           <w:tab w:val="left" w:pos="2007"/>
         </w:tabs>
-        <w:spacing w:before="60" w:after="60" w:line="240" w:lineRule="auto"/>
+        <w:spacing w:before="60" w:after="60" w:line="480" w:lineRule="auto"/>
         <w:ind w:left="2007" w:hanging="2007"/>
         <w:rPr>
           <w:sz w:val="24"/>
@@ -2661,7 +3000,7 @@
         <w:tabs>
           <w:tab w:val="left" w:pos="2007"/>
         </w:tabs>
-        <w:spacing w:before="60" w:after="60" w:line="240" w:lineRule="auto"/>
+        <w:spacing w:before="60" w:after="60" w:line="480" w:lineRule="auto"/>
         <w:ind w:left="2007" w:hanging="2007"/>
         <w:rPr>
           <w:sz w:val="24"/>
@@ -2698,7 +3037,7 @@
         <w:tabs>
           <w:tab w:val="left" w:pos="2007"/>
         </w:tabs>
-        <w:spacing w:before="60" w:after="60" w:line="240" w:lineRule="auto"/>
+        <w:spacing w:before="60" w:after="60" w:line="480" w:lineRule="auto"/>
         <w:ind w:left="2007" w:hanging="2007"/>
         <w:rPr>
           <w:sz w:val="24"/>
@@ -2735,7 +3074,7 @@
         <w:tabs>
           <w:tab w:val="left" w:pos="2007"/>
         </w:tabs>
-        <w:spacing w:before="60" w:after="60" w:line="240" w:lineRule="auto"/>
+        <w:spacing w:before="60" w:after="60" w:line="480" w:lineRule="auto"/>
         <w:ind w:left="2007" w:hanging="2007"/>
         <w:rPr>
           <w:sz w:val="24"/>
@@ -2772,7 +3111,7 @@
         <w:tabs>
           <w:tab w:val="left" w:pos="1984"/>
         </w:tabs>
-        <w:spacing w:before="60" w:after="60" w:line="240" w:lineRule="auto"/>
+        <w:spacing w:before="60" w:after="60" w:line="480" w:lineRule="auto"/>
         <w:ind w:left="1984" w:hanging="1984"/>
         <w:rPr>
           <w:sz w:val="24"/>
@@ -2789,24 +3128,36 @@
           <w:sz w:val="24"/>
         </w:rPr>
         <w:tab/>
-        <w:t>f. a way of resting and enjoying yourself</w:t>
-      </w:r>
-    </w:p>
-    <w:p>
-      <w:pPr>
-        <w:spacing w:before="60" w:after="60" w:line="240" w:lineRule="auto"/>
+      </w:r>
+      <w:r>
+        <w:rPr>
+          <w:b/>
+          <w:sz w:val="24"/>
+        </w:rPr>
+        <w:t xml:space="preserve">F. </w:t>
+      </w:r>
+      <w:r>
+        <w:rPr>
+          <w:sz w:val="24"/>
+        </w:rPr>
+        <w:t xml:space="preserve"> a way of resting and enjoying yourself</w:t>
+      </w:r>
+    </w:p>
+    <w:p>
+      <w:pPr>
+        <w:spacing w:before="60" w:after="60" w:line="480" w:lineRule="auto"/>
         <w:rPr>
           <w:sz w:val="24"/>
         </w:rPr>
       </w:pPr>
     </w:p>
     <w:sectPr>
-      <w:headerReference w:type="even" r:id="rId6"/>
-      <w:headerReference w:type="default" r:id="rId7"/>
-      <w:footerReference w:type="even" r:id="rId8"/>
-      <w:footerReference w:type="default" r:id="rId9"/>
-      <w:headerReference w:type="first" r:id="rId10"/>
-      <w:footerReference w:type="first" r:id="rId11"/>
+      <w:headerReference w:type="even" r:id="rId12"/>
+      <w:headerReference w:type="default" r:id="rId13"/>
+      <w:footerReference w:type="even" r:id="rId14"/>
+      <w:footerReference w:type="default" r:id="rId15"/>
+      <w:headerReference w:type="first" r:id="rId16"/>
+      <w:footerReference w:type="first" r:id="rId17"/>
       <w:pgSz w:w="11907" w:h="16840" w:code="9"/>
       <w:pgMar w:top="1134" w:right="850" w:bottom="1134" w:left="1701" w:header="720" w:footer="720" w:gutter="0"/>
       <w:cols w:space="720"/>
@@ -3402,7 +3753,7 @@
     <w:link w:val="Heading1Char"/>
     <w:uiPriority w:val="9"/>
     <w:qFormat/>
-    <w:rsid w:val="00796C09"/>
+    <w:rsid w:val="00B51F97"/>
     <w:pPr>
       <w:keepNext/>
       <w:keepLines/>
@@ -3425,7 +3776,7 @@
     <w:semiHidden/>
     <w:unhideWhenUsed/>
     <w:qFormat/>
-    <w:rsid w:val="00796C09"/>
+    <w:rsid w:val="00B51F97"/>
     <w:pPr>
       <w:keepNext/>
       <w:keepLines/>
@@ -3448,7 +3799,7 @@
     <w:semiHidden/>
     <w:unhideWhenUsed/>
     <w:qFormat/>
-    <w:rsid w:val="00796C09"/>
+    <w:rsid w:val="00B51F97"/>
     <w:pPr>
       <w:keepNext/>
       <w:keepLines/>
@@ -3471,7 +3822,7 @@
     <w:semiHidden/>
     <w:unhideWhenUsed/>
     <w:qFormat/>
-    <w:rsid w:val="00796C09"/>
+    <w:rsid w:val="00B51F97"/>
     <w:pPr>
       <w:keepNext/>
       <w:keepLines/>
@@ -3494,7 +3845,7 @@
     <w:semiHidden/>
     <w:unhideWhenUsed/>
     <w:qFormat/>
-    <w:rsid w:val="00796C09"/>
+    <w:rsid w:val="00B51F97"/>
     <w:pPr>
       <w:keepNext/>
       <w:keepLines/>
@@ -3515,7 +3866,7 @@
     <w:semiHidden/>
     <w:unhideWhenUsed/>
     <w:qFormat/>
-    <w:rsid w:val="00796C09"/>
+    <w:rsid w:val="00B51F97"/>
     <w:pPr>
       <w:keepNext/>
       <w:keepLines/>
@@ -3538,7 +3889,7 @@
     <w:semiHidden/>
     <w:unhideWhenUsed/>
     <w:qFormat/>
-    <w:rsid w:val="00796C09"/>
+    <w:rsid w:val="00B51F97"/>
     <w:pPr>
       <w:keepNext/>
       <w:keepLines/>
@@ -3559,7 +3910,7 @@
     <w:semiHidden/>
     <w:unhideWhenUsed/>
     <w:qFormat/>
-    <w:rsid w:val="00796C09"/>
+    <w:rsid w:val="00B51F97"/>
     <w:pPr>
       <w:keepNext/>
       <w:keepLines/>
@@ -3582,7 +3933,7 @@
     <w:semiHidden/>
     <w:unhideWhenUsed/>
     <w:qFormat/>
-    <w:rsid w:val="00796C09"/>
+    <w:rsid w:val="00B51F97"/>
     <w:pPr>
       <w:keepNext/>
       <w:keepLines/>
@@ -3626,7 +3977,7 @@
     <w:basedOn w:val="DefaultParagraphFont"/>
     <w:link w:val="Heading1"/>
     <w:uiPriority w:val="9"/>
-    <w:rsid w:val="00796C09"/>
+    <w:rsid w:val="00B51F97"/>
     <w:rPr>
       <w:rFonts w:asciiTheme="majorHAnsi" w:eastAsiaTheme="majorEastAsia" w:hAnsiTheme="majorHAnsi" w:cstheme="majorBidi"/>
       <w:color w:val="0F4761" w:themeColor="accent1" w:themeShade="BF"/>
@@ -3640,7 +3991,7 @@
     <w:link w:val="Heading2"/>
     <w:uiPriority w:val="9"/>
     <w:semiHidden/>
-    <w:rsid w:val="00796C09"/>
+    <w:rsid w:val="00B51F97"/>
     <w:rPr>
       <w:rFonts w:asciiTheme="majorHAnsi" w:eastAsiaTheme="majorEastAsia" w:hAnsiTheme="majorHAnsi" w:cstheme="majorBidi"/>
       <w:color w:val="0F4761" w:themeColor="accent1" w:themeShade="BF"/>
@@ -3654,7 +4005,7 @@
     <w:link w:val="Heading3"/>
     <w:uiPriority w:val="9"/>
     <w:semiHidden/>
-    <w:rsid w:val="00796C09"/>
+    <w:rsid w:val="00B51F97"/>
     <w:rPr>
       <w:rFonts w:asciiTheme="minorHAnsi" w:eastAsiaTheme="majorEastAsia" w:hAnsiTheme="minorHAnsi" w:cstheme="majorBidi"/>
       <w:color w:val="0F4761" w:themeColor="accent1" w:themeShade="BF"/>
@@ -3668,7 +4019,7 @@
     <w:link w:val="Heading4"/>
     <w:uiPriority w:val="9"/>
     <w:semiHidden/>
-    <w:rsid w:val="00796C09"/>
+    <w:rsid w:val="00B51F97"/>
     <w:rPr>
       <w:rFonts w:asciiTheme="minorHAnsi" w:eastAsiaTheme="majorEastAsia" w:hAnsiTheme="minorHAnsi" w:cstheme="majorBidi"/>
       <w:i/>
@@ -3682,7 +4033,7 @@
     <w:link w:val="Heading5"/>
     <w:uiPriority w:val="9"/>
     <w:semiHidden/>
-    <w:rsid w:val="00796C09"/>
+    <w:rsid w:val="00B51F97"/>
     <w:rPr>
       <w:rFonts w:asciiTheme="minorHAnsi" w:eastAsiaTheme="majorEastAsia" w:hAnsiTheme="minorHAnsi" w:cstheme="majorBidi"/>
       <w:color w:val="0F4761" w:themeColor="accent1" w:themeShade="BF"/>
@@ -3694,7 +4045,7 @@
     <w:link w:val="Heading6"/>
     <w:uiPriority w:val="9"/>
     <w:semiHidden/>
-    <w:rsid w:val="00796C09"/>
+    <w:rsid w:val="00B51F97"/>
     <w:rPr>
       <w:rFonts w:asciiTheme="minorHAnsi" w:eastAsiaTheme="majorEastAsia" w:hAnsiTheme="minorHAnsi" w:cstheme="majorBidi"/>
       <w:i/>
@@ -3708,7 +4059,7 @@
     <w:link w:val="Heading7"/>
     <w:uiPriority w:val="9"/>
     <w:semiHidden/>
-    <w:rsid w:val="00796C09"/>
+    <w:rsid w:val="00B51F97"/>
     <w:rPr>
       <w:rFonts w:asciiTheme="minorHAnsi" w:eastAsiaTheme="majorEastAsia" w:hAnsiTheme="minorHAnsi" w:cstheme="majorBidi"/>
       <w:color w:val="595959" w:themeColor="text1" w:themeTint="A6"/>
@@ -3720,7 +4071,7 @@
     <w:link w:val="Heading8"/>
     <w:uiPriority w:val="9"/>
     <w:semiHidden/>
-    <w:rsid w:val="00796C09"/>
+    <w:rsid w:val="00B51F97"/>
     <w:rPr>
       <w:rFonts w:asciiTheme="minorHAnsi" w:eastAsiaTheme="majorEastAsia" w:hAnsiTheme="minorHAnsi" w:cstheme="majorBidi"/>
       <w:i/>
@@ -3734,7 +4085,7 @@
     <w:link w:val="Heading9"/>
     <w:uiPriority w:val="9"/>
     <w:semiHidden/>
-    <w:rsid w:val="00796C09"/>
+    <w:rsid w:val="00B51F97"/>
     <w:rPr>
       <w:rFonts w:asciiTheme="minorHAnsi" w:eastAsiaTheme="majorEastAsia" w:hAnsiTheme="minorHAnsi" w:cstheme="majorBidi"/>
       <w:color w:val="272727" w:themeColor="text1" w:themeTint="D8"/>
@@ -3747,7 +4098,7 @@
     <w:link w:val="TitleChar"/>
     <w:uiPriority w:val="10"/>
     <w:qFormat/>
-    <w:rsid w:val="00796C09"/>
+    <w:rsid w:val="00B51F97"/>
     <w:pPr>
       <w:spacing w:after="80" w:line="240" w:lineRule="auto"/>
       <w:contextualSpacing/>
@@ -3765,7 +4116,7 @@
     <w:basedOn w:val="DefaultParagraphFont"/>
     <w:link w:val="Title"/>
     <w:uiPriority w:val="10"/>
-    <w:rsid w:val="00796C09"/>
+    <w:rsid w:val="00B51F97"/>
     <w:rPr>
       <w:rFonts w:asciiTheme="majorHAnsi" w:eastAsiaTheme="majorEastAsia" w:hAnsiTheme="majorHAnsi" w:cstheme="majorBidi"/>
       <w:spacing w:val="-10"/>
@@ -3781,7 +4132,7 @@
     <w:link w:val="SubtitleChar"/>
     <w:uiPriority w:val="11"/>
     <w:qFormat/>
-    <w:rsid w:val="00796C09"/>
+    <w:rsid w:val="00B51F97"/>
     <w:pPr>
       <w:numPr>
         <w:ilvl w:val="1"/>
@@ -3800,7 +4151,7 @@
     <w:basedOn w:val="DefaultParagraphFont"/>
     <w:link w:val="Subtitle"/>
     <w:uiPriority w:val="11"/>
-    <w:rsid w:val="00796C09"/>
+    <w:rsid w:val="00B51F97"/>
     <w:rPr>
       <w:rFonts w:asciiTheme="minorHAnsi" w:eastAsiaTheme="majorEastAsia" w:hAnsiTheme="minorHAnsi" w:cstheme="majorBidi"/>
       <w:color w:val="595959" w:themeColor="text1" w:themeTint="A6"/>
@@ -3816,7 +4167,7 @@
     <w:link w:val="QuoteChar"/>
     <w:uiPriority w:val="29"/>
     <w:qFormat/>
-    <w:rsid w:val="00796C09"/>
+    <w:rsid w:val="00B51F97"/>
     <w:pPr>
       <w:spacing w:before="160"/>
       <w:jc w:val="center"/>
@@ -3832,7 +4183,7 @@
     <w:basedOn w:val="DefaultParagraphFont"/>
     <w:link w:val="Quote"/>
     <w:uiPriority w:val="29"/>
-    <w:rsid w:val="00796C09"/>
+    <w:rsid w:val="00B51F97"/>
     <w:rPr>
       <w:i/>
       <w:iCs/>
@@ -3844,7 +4195,7 @@
     <w:basedOn w:val="Normal"/>
     <w:uiPriority w:val="34"/>
     <w:qFormat/>
-    <w:rsid w:val="00796C09"/>
+    <w:rsid w:val="00B51F97"/>
     <w:pPr>
       <w:ind w:left="720"/>
       <w:contextualSpacing/>
@@ -3855,7 +4206,7 @@
     <w:basedOn w:val="DefaultParagraphFont"/>
     <w:uiPriority w:val="21"/>
     <w:qFormat/>
-    <w:rsid w:val="00796C09"/>
+    <w:rsid w:val="00B51F97"/>
     <w:rPr>
       <w:i/>
       <w:iCs/>
@@ -3869,7 +4220,7 @@
     <w:link w:val="IntenseQuoteChar"/>
     <w:uiPriority w:val="30"/>
     <w:qFormat/>
-    <w:rsid w:val="00796C09"/>
+    <w:rsid w:val="00B51F97"/>
     <w:pPr>
       <w:pBdr>
         <w:top w:val="single" w:sz="4" w:space="10" w:color="0F4761" w:themeColor="accent1" w:themeShade="BF"/>
@@ -3890,7 +4241,7 @@
     <w:basedOn w:val="DefaultParagraphFont"/>
     <w:link w:val="IntenseQuote"/>
     <w:uiPriority w:val="30"/>
-    <w:rsid w:val="00796C09"/>
+    <w:rsid w:val="00B51F97"/>
     <w:rPr>
       <w:i/>
       <w:iCs/>
@@ -3902,7 +4253,7 @@
     <w:basedOn w:val="DefaultParagraphFont"/>
     <w:uiPriority w:val="32"/>
     <w:qFormat/>
-    <w:rsid w:val="00796C09"/>
+    <w:rsid w:val="00B51F97"/>
     <w:rPr>
       <w:b/>
       <w:bCs/>
@@ -3917,7 +4268,7 @@
     <w:link w:val="HeaderChar"/>
     <w:uiPriority w:val="99"/>
     <w:unhideWhenUsed/>
-    <w:rsid w:val="00796C09"/>
+    <w:rsid w:val="00B51F97"/>
     <w:pPr>
       <w:tabs>
         <w:tab w:val="center" w:pos="4680"/>
@@ -3931,7 +4282,7 @@
     <w:basedOn w:val="DefaultParagraphFont"/>
     <w:link w:val="Header"/>
     <w:uiPriority w:val="99"/>
-    <w:rsid w:val="00796C09"/>
+    <w:rsid w:val="00B51F97"/>
   </w:style>
   <w:style w:type="paragraph" w:styleId="Footer">
     <w:name w:val="footer"/>
@@ -3939,7 +4290,7 @@
     <w:link w:val="FooterChar"/>
     <w:uiPriority w:val="99"/>
     <w:unhideWhenUsed/>
-    <w:rsid w:val="00796C09"/>
+    <w:rsid w:val="00B51F97"/>
     <w:pPr>
       <w:tabs>
         <w:tab w:val="center" w:pos="4680"/>
@@ -3953,7 +4304,7 @@
     <w:basedOn w:val="DefaultParagraphFont"/>
     <w:link w:val="Footer"/>
     <w:uiPriority w:val="99"/>
-    <w:rsid w:val="00796C09"/>
+    <w:rsid w:val="00B51F97"/>
   </w:style>
 </w:styles>
 </file>

</xml_diff>

<commit_message>
feat: replace <blank> with actual underline characters, enable live Word window generation, set 0cm LeftIndent for numbered MCQ lines, and set KeepWithNext=True for BOX shapes
</commit_message>
<xml_diff>
--- a/output/uln_document.docx
+++ b/output/uln_document.docx
@@ -37,6 +37,11 @@
     </w:p>
     <w:p>
       <w:pPr>
+        <w:tabs>
+          <w:tab w:val="left" w:pos="2551"/>
+          <w:tab w:val="left" w:pos="4819"/>
+          <w:tab w:val="left" w:pos="7087"/>
+        </w:tabs>
         <w:spacing w:before="80" w:after="60"/>
         <w:ind w:left="283"/>
         <w:rPr>
@@ -60,20 +65,26 @@
         <w:rPr>
           <w:sz w:val="24"/>
         </w:rPr>
-        <w:t xml:space="preserve"> </w:t>
+        <w:t xml:space="preserve"> e</w:t>
       </w:r>
       <w:r>
         <w:rPr>
           <w:sz w:val="24"/>
           <w:u w:val="single"/>
         </w:rPr>
-        <w:t>e</w:t>
-      </w:r>
-      <w:r>
-        <w:rPr>
-          <w:sz w:val="24"/>
-        </w:rPr>
-        <w:t xml:space="preserve">xciting </w:t>
+        <w:t>x</w:t>
+      </w:r>
+      <w:r>
+        <w:rPr>
+          <w:sz w:val="24"/>
+        </w:rPr>
+        <w:t>citing</w:t>
+      </w:r>
+      <w:r>
+        <w:rPr>
+          <w:sz w:val="24"/>
+        </w:rPr>
+        <w:tab/>
       </w:r>
       <w:r>
         <w:rPr>
@@ -86,20 +97,26 @@
         <w:rPr>
           <w:sz w:val="24"/>
         </w:rPr>
-        <w:t xml:space="preserve"> </w:t>
+        <w:t xml:space="preserve"> e</w:t>
       </w:r>
       <w:r>
         <w:rPr>
           <w:sz w:val="24"/>
           <w:u w:val="single"/>
         </w:rPr>
-        <w:t>e</w:t>
-      </w:r>
-      <w:r>
-        <w:rPr>
-          <w:sz w:val="24"/>
-        </w:rPr>
-        <w:t xml:space="preserve">xcellent </w:t>
+        <w:t>x</w:t>
+      </w:r>
+      <w:r>
+        <w:rPr>
+          <w:sz w:val="24"/>
+        </w:rPr>
+        <w:t>cellent</w:t>
+      </w:r>
+      <w:r>
+        <w:rPr>
+          <w:sz w:val="24"/>
+        </w:rPr>
+        <w:tab/>
       </w:r>
       <w:r>
         <w:rPr>
@@ -112,20 +129,26 @@
         <w:rPr>
           <w:sz w:val="24"/>
         </w:rPr>
-        <w:t xml:space="preserve"> </w:t>
+        <w:t xml:space="preserve"> e</w:t>
       </w:r>
       <w:r>
         <w:rPr>
           <w:sz w:val="24"/>
           <w:u w:val="single"/>
         </w:rPr>
-        <w:t>e</w:t>
-      </w:r>
-      <w:r>
-        <w:rPr>
-          <w:sz w:val="24"/>
-        </w:rPr>
-        <w:t xml:space="preserve">xperience </w:t>
+        <w:t>x</w:t>
+      </w:r>
+      <w:r>
+        <w:rPr>
+          <w:sz w:val="24"/>
+        </w:rPr>
+        <w:t>perience</w:t>
+      </w:r>
+      <w:r>
+        <w:rPr>
+          <w:sz w:val="24"/>
+        </w:rPr>
+        <w:tab/>
       </w:r>
       <w:r>
         <w:rPr>
@@ -138,24 +161,29 @@
         <w:rPr>
           <w:sz w:val="24"/>
         </w:rPr>
-        <w:t xml:space="preserve"> </w:t>
+        <w:t xml:space="preserve"> e</w:t>
       </w:r>
       <w:r>
         <w:rPr>
           <w:sz w:val="24"/>
           <w:u w:val="single"/>
         </w:rPr>
-        <w:t>e</w:t>
-      </w:r>
-      <w:r>
-        <w:rPr>
-          <w:sz w:val="24"/>
-        </w:rPr>
-        <w:t>xpensive</w:t>
-      </w:r>
-    </w:p>
-    <w:p>
-      <w:pPr>
+        <w:t>x</w:t>
+      </w:r>
+      <w:r>
+        <w:rPr>
+          <w:sz w:val="24"/>
+        </w:rPr>
+        <w:t>pensive</w:t>
+      </w:r>
+    </w:p>
+    <w:p>
+      <w:pPr>
+        <w:tabs>
+          <w:tab w:val="left" w:pos="2551"/>
+          <w:tab w:val="left" w:pos="4819"/>
+          <w:tab w:val="left" w:pos="7087"/>
+        </w:tabs>
         <w:spacing w:before="80" w:after="60"/>
         <w:ind w:left="283"/>
         <w:rPr>
@@ -192,7 +220,7 @@
         <w:rPr>
           <w:sz w:val="24"/>
         </w:rPr>
-        <w:t xml:space="preserve"> </w:t>
+        <w:tab/>
       </w:r>
       <w:r>
         <w:rPr>
@@ -218,7 +246,13 @@
         <w:rPr>
           <w:sz w:val="24"/>
         </w:rPr>
-        <w:t xml:space="preserve">cle </w:t>
+        <w:t>cle</w:t>
+      </w:r>
+      <w:r>
+        <w:rPr>
+          <w:sz w:val="24"/>
+        </w:rPr>
+        <w:tab/>
       </w:r>
       <w:r>
         <w:rPr>
@@ -244,7 +278,13 @@
         <w:rPr>
           <w:sz w:val="24"/>
         </w:rPr>
-        <w:t xml:space="preserve">e </w:t>
+        <w:t>e</w:t>
+      </w:r>
+      <w:r>
+        <w:rPr>
+          <w:sz w:val="24"/>
+        </w:rPr>
+        <w:tab/>
       </w:r>
       <w:r>
         <w:rPr>
@@ -269,6 +309,11 @@
     </w:p>
     <w:p>
       <w:pPr>
+        <w:tabs>
+          <w:tab w:val="left" w:pos="2551"/>
+          <w:tab w:val="left" w:pos="4819"/>
+          <w:tab w:val="left" w:pos="7087"/>
+        </w:tabs>
         <w:spacing w:before="80" w:after="60"/>
         <w:ind w:left="283"/>
         <w:rPr>
@@ -305,7 +350,13 @@
         <w:rPr>
           <w:sz w:val="24"/>
         </w:rPr>
-        <w:t xml:space="preserve">ttery </w:t>
+        <w:t>ttery</w:t>
+      </w:r>
+      <w:r>
+        <w:rPr>
+          <w:sz w:val="24"/>
+        </w:rPr>
+        <w:tab/>
       </w:r>
       <w:r>
         <w:rPr>
@@ -331,7 +382,13 @@
         <w:rPr>
           <w:sz w:val="24"/>
         </w:rPr>
-        <w:t xml:space="preserve">llect </w:t>
+        <w:t>llect</w:t>
+      </w:r>
+      <w:r>
+        <w:rPr>
+          <w:sz w:val="24"/>
+        </w:rPr>
+        <w:tab/>
       </w:r>
       <w:r>
         <w:rPr>
@@ -357,7 +414,13 @@
         <w:rPr>
           <w:sz w:val="24"/>
         </w:rPr>
-        <w:t xml:space="preserve">dy </w:t>
+        <w:t>dy</w:t>
+      </w:r>
+      <w:r>
+        <w:rPr>
+          <w:sz w:val="24"/>
+        </w:rPr>
+        <w:tab/>
       </w:r>
       <w:r>
         <w:rPr>
@@ -388,6 +451,11 @@
     </w:p>
     <w:p>
       <w:pPr>
+        <w:tabs>
+          <w:tab w:val="left" w:pos="2551"/>
+          <w:tab w:val="left" w:pos="4819"/>
+          <w:tab w:val="left" w:pos="7087"/>
+        </w:tabs>
         <w:spacing w:before="80" w:after="60"/>
         <w:ind w:left="283"/>
         <w:rPr>
@@ -424,7 +492,13 @@
         <w:rPr>
           <w:sz w:val="24"/>
         </w:rPr>
-        <w:t xml:space="preserve">rd </w:t>
+        <w:t>rd</w:t>
+      </w:r>
+      <w:r>
+        <w:rPr>
+          <w:sz w:val="24"/>
+        </w:rPr>
+        <w:tab/>
       </w:r>
       <w:r>
         <w:rPr>
@@ -450,7 +524,13 @@
         <w:rPr>
           <w:sz w:val="24"/>
         </w:rPr>
-        <w:t xml:space="preserve">rd </w:t>
+        <w:t>rd</w:t>
+      </w:r>
+      <w:r>
+        <w:rPr>
+          <w:sz w:val="24"/>
+        </w:rPr>
+        <w:tab/>
       </w:r>
       <w:r>
         <w:rPr>
@@ -476,7 +556,13 @@
         <w:rPr>
           <w:sz w:val="24"/>
         </w:rPr>
-        <w:t xml:space="preserve">rld </w:t>
+        <w:t>rld</w:t>
+      </w:r>
+      <w:r>
+        <w:rPr>
+          <w:sz w:val="24"/>
+        </w:rPr>
+        <w:tab/>
       </w:r>
       <w:r>
         <w:rPr>
@@ -507,6 +593,11 @@
     </w:p>
     <w:p>
       <w:pPr>
+        <w:tabs>
+          <w:tab w:val="left" w:pos="2551"/>
+          <w:tab w:val="left" w:pos="4819"/>
+          <w:tab w:val="left" w:pos="7087"/>
+        </w:tabs>
         <w:spacing w:before="80" w:after="60"/>
         <w:ind w:left="283"/>
         <w:rPr>
@@ -543,7 +634,13 @@
         <w:rPr>
           <w:sz w:val="24"/>
         </w:rPr>
-        <w:t xml:space="preserve">ing </w:t>
+        <w:t>ing</w:t>
+      </w:r>
+      <w:r>
+        <w:rPr>
+          <w:sz w:val="24"/>
+        </w:rPr>
+        <w:tab/>
       </w:r>
       <w:r>
         <w:rPr>
@@ -569,7 +666,13 @@
         <w:rPr>
           <w:sz w:val="24"/>
         </w:rPr>
-        <w:t xml:space="preserve">ildren </w:t>
+        <w:t>ildren</w:t>
+      </w:r>
+      <w:r>
+        <w:rPr>
+          <w:sz w:val="24"/>
+        </w:rPr>
+        <w:tab/>
       </w:r>
       <w:r>
         <w:rPr>
@@ -595,7 +698,13 @@
         <w:rPr>
           <w:sz w:val="24"/>
         </w:rPr>
-        <w:t xml:space="preserve">ool </w:t>
+        <w:t>ool</w:t>
+      </w:r>
+      <w:r>
+        <w:rPr>
+          <w:sz w:val="24"/>
+        </w:rPr>
+        <w:tab/>
       </w:r>
       <w:r>
         <w:rPr>
@@ -651,11 +760,16 @@
         <w:rPr>
           <w:sz w:val="24"/>
         </w:rPr>
-        <w:t>1. My father can make beautiful pieces of art ______ empty eggshells.</w:t>
-      </w:r>
-    </w:p>
-    <w:p>
-      <w:pPr>
+        <w:t>1. My father can make beautiful pieces of art &lt;blank&gt; empty eggshells.</w:t>
+      </w:r>
+    </w:p>
+    <w:p>
+      <w:pPr>
+        <w:tabs>
+          <w:tab w:val="left" w:pos="2551"/>
+          <w:tab w:val="left" w:pos="4819"/>
+          <w:tab w:val="left" w:pos="7087"/>
+        </w:tabs>
         <w:spacing w:before="80" w:after="60"/>
         <w:ind w:left="283"/>
         <w:rPr>
@@ -673,7 +787,13 @@
         <w:rPr>
           <w:sz w:val="24"/>
         </w:rPr>
-        <w:t xml:space="preserve"> of </w:t>
+        <w:t xml:space="preserve"> of</w:t>
+      </w:r>
+      <w:r>
+        <w:rPr>
+          <w:sz w:val="24"/>
+        </w:rPr>
+        <w:tab/>
       </w:r>
       <w:r>
         <w:rPr>
@@ -686,7 +806,13 @@
         <w:rPr>
           <w:sz w:val="24"/>
         </w:rPr>
-        <w:t xml:space="preserve"> from </w:t>
+        <w:t xml:space="preserve"> from</w:t>
+      </w:r>
+      <w:r>
+        <w:rPr>
+          <w:sz w:val="24"/>
+        </w:rPr>
+        <w:tab/>
       </w:r>
       <w:r>
         <w:rPr>
@@ -699,7 +825,13 @@
         <w:rPr>
           <w:sz w:val="24"/>
         </w:rPr>
-        <w:t xml:space="preserve"> in </w:t>
+        <w:t xml:space="preserve"> in</w:t>
+      </w:r>
+      <w:r>
+        <w:rPr>
+          <w:sz w:val="24"/>
+        </w:rPr>
+        <w:tab/>
       </w:r>
       <w:r>
         <w:rPr>
@@ -726,11 +858,16 @@
         <w:rPr>
           <w:sz w:val="24"/>
         </w:rPr>
-        <w:t>2. Why don't you take ______ a new hobby?</w:t>
-      </w:r>
-    </w:p>
-    <w:p>
-      <w:pPr>
+        <w:t>2. Why don't you take &lt;blank&gt; a new hobby?</w:t>
+      </w:r>
+    </w:p>
+    <w:p>
+      <w:pPr>
+        <w:tabs>
+          <w:tab w:val="left" w:pos="2551"/>
+          <w:tab w:val="left" w:pos="4819"/>
+          <w:tab w:val="left" w:pos="7087"/>
+        </w:tabs>
         <w:spacing w:before="80" w:after="60"/>
         <w:ind w:left="283"/>
         <w:rPr>
@@ -748,7 +885,13 @@
         <w:rPr>
           <w:sz w:val="24"/>
         </w:rPr>
-        <w:t xml:space="preserve"> up </w:t>
+        <w:t xml:space="preserve"> up</w:t>
+      </w:r>
+      <w:r>
+        <w:rPr>
+          <w:sz w:val="24"/>
+        </w:rPr>
+        <w:tab/>
       </w:r>
       <w:r>
         <w:rPr>
@@ -761,7 +904,13 @@
         <w:rPr>
           <w:sz w:val="24"/>
         </w:rPr>
-        <w:t xml:space="preserve"> in </w:t>
+        <w:t xml:space="preserve"> in</w:t>
+      </w:r>
+      <w:r>
+        <w:rPr>
+          <w:sz w:val="24"/>
+        </w:rPr>
+        <w:tab/>
       </w:r>
       <w:r>
         <w:rPr>
@@ -774,7 +923,13 @@
         <w:rPr>
           <w:sz w:val="24"/>
         </w:rPr>
-        <w:t xml:space="preserve"> over </w:t>
+        <w:t xml:space="preserve"> over</w:t>
+      </w:r>
+      <w:r>
+        <w:rPr>
+          <w:sz w:val="24"/>
+        </w:rPr>
+        <w:tab/>
       </w:r>
       <w:r>
         <w:rPr>
@@ -801,11 +956,16 @@
         <w:rPr>
           <w:sz w:val="24"/>
         </w:rPr>
-        <w:t>3. Collecting cars is a(n) ______ hobby. It costs a lot of money.</w:t>
-      </w:r>
-    </w:p>
-    <w:p>
-      <w:pPr>
+        <w:t>3. Collecting cars is a(n) &lt;blank&gt; hobby. It costs a lot of money.</w:t>
+      </w:r>
+    </w:p>
+    <w:p>
+      <w:pPr>
+        <w:tabs>
+          <w:tab w:val="left" w:pos="2551"/>
+          <w:tab w:val="left" w:pos="4819"/>
+          <w:tab w:val="left" w:pos="7087"/>
+        </w:tabs>
         <w:spacing w:before="80" w:after="60"/>
         <w:ind w:left="283"/>
         <w:rPr>
@@ -823,7 +983,13 @@
         <w:rPr>
           <w:sz w:val="24"/>
         </w:rPr>
-        <w:t xml:space="preserve"> interesting </w:t>
+        <w:t xml:space="preserve"> interesting</w:t>
+      </w:r>
+      <w:r>
+        <w:rPr>
+          <w:sz w:val="24"/>
+        </w:rPr>
+        <w:tab/>
       </w:r>
       <w:r>
         <w:rPr>
@@ -836,7 +1002,13 @@
         <w:rPr>
           <w:sz w:val="24"/>
         </w:rPr>
-        <w:t xml:space="preserve"> cheap </w:t>
+        <w:t xml:space="preserve"> cheap</w:t>
+      </w:r>
+      <w:r>
+        <w:rPr>
+          <w:sz w:val="24"/>
+        </w:rPr>
+        <w:tab/>
       </w:r>
       <w:r>
         <w:rPr>
@@ -849,7 +1021,13 @@
         <w:rPr>
           <w:sz w:val="24"/>
         </w:rPr>
-        <w:t xml:space="preserve"> expensive </w:t>
+        <w:t xml:space="preserve"> expensive</w:t>
+      </w:r>
+      <w:r>
+        <w:rPr>
+          <w:sz w:val="24"/>
+        </w:rPr>
+        <w:tab/>
       </w:r>
       <w:r>
         <w:rPr>
@@ -876,11 +1054,16 @@
         <w:rPr>
           <w:sz w:val="24"/>
         </w:rPr>
-        <w:t>4. More people are ______ birds today than ever before.</w:t>
-      </w:r>
-    </w:p>
-    <w:p>
-      <w:pPr>
+        <w:t>4. More people are &lt;blank&gt; birds today than ever before.</w:t>
+      </w:r>
+    </w:p>
+    <w:p>
+      <w:pPr>
+        <w:tabs>
+          <w:tab w:val="left" w:pos="2551"/>
+          <w:tab w:val="left" w:pos="4819"/>
+          <w:tab w:val="left" w:pos="7087"/>
+        </w:tabs>
         <w:spacing w:before="80" w:after="60"/>
         <w:ind w:left="283"/>
         <w:rPr>
@@ -898,7 +1081,13 @@
         <w:rPr>
           <w:sz w:val="24"/>
         </w:rPr>
-        <w:t xml:space="preserve"> seeing </w:t>
+        <w:t xml:space="preserve"> seeing</w:t>
+      </w:r>
+      <w:r>
+        <w:rPr>
+          <w:sz w:val="24"/>
+        </w:rPr>
+        <w:tab/>
       </w:r>
       <w:r>
         <w:rPr>
@@ -911,7 +1100,13 @@
         <w:rPr>
           <w:sz w:val="24"/>
         </w:rPr>
-        <w:t xml:space="preserve"> looking </w:t>
+        <w:t xml:space="preserve"> looking</w:t>
+      </w:r>
+      <w:r>
+        <w:rPr>
+          <w:sz w:val="24"/>
+        </w:rPr>
+        <w:tab/>
       </w:r>
       <w:r>
         <w:rPr>
@@ -924,7 +1119,13 @@
         <w:rPr>
           <w:sz w:val="24"/>
         </w:rPr>
-        <w:t xml:space="preserve"> hearing </w:t>
+        <w:t xml:space="preserve"> hearing</w:t>
+      </w:r>
+      <w:r>
+        <w:rPr>
+          <w:sz w:val="24"/>
+        </w:rPr>
+        <w:tab/>
       </w:r>
       <w:r>
         <w:rPr>
@@ -1027,7 +1228,7 @@
         <w:rPr>
           <w:sz w:val="24"/>
         </w:rPr>
-        <w:t>1. ______ Alex ______ computer games at the weekend?</w:t>
+        <w:t>1. &lt;blank&gt; Alex &lt;blank&gt; computer games at the weekend?</w:t>
       </w:r>
     </w:p>
     <w:p>
@@ -1041,7 +1242,7 @@
         <w:rPr>
           <w:sz w:val="24"/>
         </w:rPr>
-        <w:t>2. We ______ camping in Dam Sen Park yesterday.</w:t>
+        <w:t>2. We &lt;blank&gt; camping in Dam Sen Park yesterday.</w:t>
       </w:r>
     </w:p>
     <w:p>
@@ -1055,7 +1256,7 @@
         <w:rPr>
           <w:sz w:val="24"/>
         </w:rPr>
-        <w:t>3. ______ you ______ coins some day in the future?</w:t>
+        <w:t>3. &lt;blank&gt; you &lt;blank&gt; coins some day in the future?</w:t>
       </w:r>
     </w:p>
     <w:p>
@@ -1069,7 +1270,7 @@
         <w:rPr>
           <w:sz w:val="24"/>
         </w:rPr>
-        <w:t>4. Do you want ______ mountain biking with me this weekend?</w:t>
+        <w:t>4. Do you want &lt;blank&gt; mountain biking with me this weekend?</w:t>
       </w:r>
     </w:p>
     <w:p>
@@ -1094,7 +1295,6 @@
           <w:tab w:val="right" w:pos="9354"/>
         </w:tabs>
         <w:spacing w:before="60" w:after="60"/>
-        <w:ind w:left="5669" w:hanging="5669"/>
         <w:rPr>
           <w:sz w:val="24"/>
         </w:rPr>
@@ -1119,7 +1319,6 @@
           <w:tab w:val="right" w:pos="9354"/>
         </w:tabs>
         <w:spacing w:before="60" w:after="60"/>
-        <w:ind w:left="5669" w:hanging="5669"/>
         <w:rPr>
           <w:sz w:val="24"/>
         </w:rPr>
@@ -1144,7 +1343,6 @@
           <w:tab w:val="right" w:pos="9354"/>
         </w:tabs>
         <w:spacing w:before="60" w:after="60"/>
-        <w:ind w:left="5669" w:hanging="5669"/>
         <w:rPr>
           <w:sz w:val="24"/>
         </w:rPr>
@@ -1169,7 +1367,6 @@
           <w:tab w:val="right" w:pos="9354"/>
         </w:tabs>
         <w:spacing w:before="60" w:after="60"/>
-        <w:ind w:left="4456" w:hanging="4456"/>
         <w:rPr>
           <w:sz w:val="24"/>
         </w:rPr>
@@ -1207,7 +1404,7 @@
     <w:p>
       <w:pPr>
         <w:spacing w:after="80"/>
-        <w:ind w:left="283" w:right="283" w:firstLine="425"/>
+        <w:ind w:firstLine="425"/>
         <w:jc w:val="both"/>
         <w:rPr>
           <w:sz w:val="24"/>
@@ -1217,13 +1414,13 @@
         <w:rPr>
           <w:sz w:val="24"/>
         </w:rPr>
-        <w:t>Many people (1)______ crafting with paper. The materials are readily available and don't cost much; and no super special talents are needed. Anyone (2)______ be a paper crafter.</w:t>
+        <w:t>Many people (1)&lt;blank&gt; crafting with paper. The materials are readily available and don't cost much; and no super special talents are needed. Anyone (2)&lt;blank&gt; be a paper crafter.</w:t>
       </w:r>
     </w:p>
     <w:p>
       <w:pPr>
         <w:spacing w:after="80"/>
-        <w:ind w:left="283" w:right="283" w:firstLine="425"/>
+        <w:ind w:firstLine="425"/>
         <w:jc w:val="both"/>
         <w:rPr>
           <w:sz w:val="24"/>
@@ -1233,18 +1430,16 @@
         <w:rPr>
           <w:sz w:val="24"/>
         </w:rPr>
-        <w:t xml:space="preserve">There are many different paper craft techniques. Origami is one of ancient techniques developed in Japan where squares of paper are (3)______ and formed into various objects such as flowers, animals, and boxes. Card (4)______ is also a favourite paper craft technique. Birthday cards are the most popular greeting cards, followed by Christmas cards. Receiving </w:t>
-      </w:r>
-      <w:r>
-        <w:rPr>
-          <w:sz w:val="24"/>
-        </w:rPr>
-        <w:lastRenderedPageBreak/>
-        <w:t>a (5)______ card is a special gift, because of the time and effort someone spent making it. It lets the recipient know just how much you care (6)______ them.</w:t>
-      </w:r>
-    </w:p>
-    <w:p>
-      <w:pPr>
+        <w:t>There are many different paper craft techniques. Origami is one of ancient techniques developed in Japan where squares of paper are (3)&lt;blank&gt; and formed into various objects such as flowers, animals, and boxes. Card (4)&lt;blank&gt; is also a favourite paper craft technique. Birthday cards are the most popular greeting cards, followed by Christmas cards. Receiving a (5)&lt;blank&gt; card is a special gift, because of the time and effort someone spent making it. It lets the recipient know just how much you care (6)&lt;blank&gt; them.</w:t>
+      </w:r>
+    </w:p>
+    <w:p>
+      <w:pPr>
+        <w:tabs>
+          <w:tab w:val="left" w:pos="2551"/>
+          <w:tab w:val="left" w:pos="4819"/>
+          <w:tab w:val="left" w:pos="7087"/>
+        </w:tabs>
         <w:spacing w:before="80" w:after="60"/>
         <w:ind w:left="283"/>
         <w:rPr>
@@ -1255,6 +1450,7 @@
         <w:rPr>
           <w:sz w:val="24"/>
         </w:rPr>
+        <w:lastRenderedPageBreak/>
         <w:t xml:space="preserve">1. </w:t>
       </w:r>
       <w:r>
@@ -1268,7 +1464,13 @@
         <w:rPr>
           <w:sz w:val="24"/>
         </w:rPr>
-        <w:t xml:space="preserve"> enjoy </w:t>
+        <w:t xml:space="preserve"> enjoy</w:t>
+      </w:r>
+      <w:r>
+        <w:rPr>
+          <w:sz w:val="24"/>
+        </w:rPr>
+        <w:tab/>
       </w:r>
       <w:r>
         <w:rPr>
@@ -1281,7 +1483,13 @@
         <w:rPr>
           <w:sz w:val="24"/>
         </w:rPr>
-        <w:t xml:space="preserve"> decide </w:t>
+        <w:t xml:space="preserve"> decide</w:t>
+      </w:r>
+      <w:r>
+        <w:rPr>
+          <w:sz w:val="24"/>
+        </w:rPr>
+        <w:tab/>
       </w:r>
       <w:r>
         <w:rPr>
@@ -1294,7 +1502,13 @@
         <w:rPr>
           <w:sz w:val="24"/>
         </w:rPr>
-        <w:t xml:space="preserve"> want </w:t>
+        <w:t xml:space="preserve"> want</w:t>
+      </w:r>
+      <w:r>
+        <w:rPr>
+          <w:sz w:val="24"/>
+        </w:rPr>
+        <w:tab/>
       </w:r>
       <w:r>
         <w:rPr>
@@ -1312,6 +1526,11 @@
     </w:p>
     <w:p>
       <w:pPr>
+        <w:tabs>
+          <w:tab w:val="left" w:pos="2551"/>
+          <w:tab w:val="left" w:pos="4819"/>
+          <w:tab w:val="left" w:pos="7087"/>
+        </w:tabs>
         <w:spacing w:before="80" w:after="60"/>
         <w:ind w:left="283"/>
         <w:rPr>
@@ -1335,7 +1554,13 @@
         <w:rPr>
           <w:sz w:val="24"/>
         </w:rPr>
-        <w:t xml:space="preserve"> must </w:t>
+        <w:t xml:space="preserve"> must</w:t>
+      </w:r>
+      <w:r>
+        <w:rPr>
+          <w:sz w:val="24"/>
+        </w:rPr>
+        <w:tab/>
       </w:r>
       <w:r>
         <w:rPr>
@@ -1348,7 +1573,13 @@
         <w:rPr>
           <w:sz w:val="24"/>
         </w:rPr>
-        <w:t xml:space="preserve"> should </w:t>
+        <w:t xml:space="preserve"> should</w:t>
+      </w:r>
+      <w:r>
+        <w:rPr>
+          <w:sz w:val="24"/>
+        </w:rPr>
+        <w:tab/>
       </w:r>
       <w:r>
         <w:rPr>
@@ -1361,7 +1592,13 @@
         <w:rPr>
           <w:sz w:val="24"/>
         </w:rPr>
-        <w:t xml:space="preserve"> can </w:t>
+        <w:t xml:space="preserve"> can</w:t>
+      </w:r>
+      <w:r>
+        <w:rPr>
+          <w:sz w:val="24"/>
+        </w:rPr>
+        <w:tab/>
       </w:r>
       <w:r>
         <w:rPr>
@@ -1379,6 +1616,11 @@
     </w:p>
     <w:p>
       <w:pPr>
+        <w:tabs>
+          <w:tab w:val="left" w:pos="2551"/>
+          <w:tab w:val="left" w:pos="4819"/>
+          <w:tab w:val="left" w:pos="7087"/>
+        </w:tabs>
         <w:spacing w:before="80" w:after="60"/>
         <w:ind w:left="283"/>
         <w:rPr>
@@ -1402,7 +1644,13 @@
         <w:rPr>
           <w:sz w:val="24"/>
         </w:rPr>
-        <w:t xml:space="preserve"> wrapped </w:t>
+        <w:t xml:space="preserve"> wrapped</w:t>
+      </w:r>
+      <w:r>
+        <w:rPr>
+          <w:sz w:val="24"/>
+        </w:rPr>
+        <w:tab/>
       </w:r>
       <w:r>
         <w:rPr>
@@ -1415,7 +1663,13 @@
         <w:rPr>
           <w:sz w:val="24"/>
         </w:rPr>
-        <w:t xml:space="preserve"> folded </w:t>
+        <w:t xml:space="preserve"> folded</w:t>
+      </w:r>
+      <w:r>
+        <w:rPr>
+          <w:sz w:val="24"/>
+        </w:rPr>
+        <w:tab/>
       </w:r>
       <w:r>
         <w:rPr>
@@ -1428,7 +1682,13 @@
         <w:rPr>
           <w:sz w:val="24"/>
         </w:rPr>
-        <w:t xml:space="preserve"> torn </w:t>
+        <w:t xml:space="preserve"> torn</w:t>
+      </w:r>
+      <w:r>
+        <w:rPr>
+          <w:sz w:val="24"/>
+        </w:rPr>
+        <w:tab/>
       </w:r>
       <w:r>
         <w:rPr>
@@ -1476,9 +1736,6 @@
     </w:p>
     <w:p>
       <w:pPr>
-        <w:tabs>
-          <w:tab w:val="right" w:pos="9354"/>
-        </w:tabs>
         <w:spacing w:before="120" w:after="80"/>
         <w:rPr>
           <w:sz w:val="24"/>
@@ -1488,7 +1745,7 @@
         <w:rPr>
           <w:sz w:val="24"/>
         </w:rPr>
-        <w:t>_____________________________________________</w:t>
+        <w:t>&lt;blank&gt;</w:t>
       </w:r>
     </w:p>
     <w:p>
@@ -1507,9 +1764,6 @@
     </w:p>
     <w:p>
       <w:pPr>
-        <w:tabs>
-          <w:tab w:val="right" w:pos="9354"/>
-        </w:tabs>
         <w:spacing w:before="120" w:after="80"/>
         <w:rPr>
           <w:sz w:val="24"/>
@@ -1519,7 +1773,7 @@
         <w:rPr>
           <w:sz w:val="24"/>
         </w:rPr>
-        <w:t>_____________________________________________</w:t>
+        <w:t>&lt;blank&gt;</w:t>
       </w:r>
     </w:p>
     <w:p>
@@ -1538,9 +1792,6 @@
     </w:p>
     <w:p>
       <w:pPr>
-        <w:tabs>
-          <w:tab w:val="right" w:pos="9354"/>
-        </w:tabs>
         <w:spacing w:before="120" w:after="80"/>
         <w:rPr>
           <w:sz w:val="24"/>
@@ -1550,7 +1801,7 @@
         <w:rPr>
           <w:sz w:val="24"/>
         </w:rPr>
-        <w:t>_____________________________________________</w:t>
+        <w:t>&lt;blank&gt;</w:t>
       </w:r>
     </w:p>
     <w:p>
@@ -1987,6 +2238,12 @@
                 <w:sz w:val="24"/>
               </w:rPr>
             </w:pPr>
+            <w:r>
+              <w:rPr>
+                <w:sz w:val="24"/>
+              </w:rPr>
+              <w:t>&lt;blank&gt;</w:t>
+            </w:r>
           </w:p>
         </w:tc>
         <w:tc>
@@ -2001,6 +2258,12 @@
                 <w:sz w:val="24"/>
               </w:rPr>
             </w:pPr>
+            <w:r>
+              <w:rPr>
+                <w:sz w:val="24"/>
+              </w:rPr>
+              <w:t>&lt;blank&gt;</w:t>
+            </w:r>
           </w:p>
         </w:tc>
       </w:tr>
@@ -2020,6 +2283,12 @@
                 <w:sz w:val="24"/>
               </w:rPr>
             </w:pPr>
+            <w:r>
+              <w:rPr>
+                <w:sz w:val="24"/>
+              </w:rPr>
+              <w:t>&lt;blank&gt;</w:t>
+            </w:r>
           </w:p>
         </w:tc>
         <w:tc>
@@ -2034,6 +2303,12 @@
                 <w:sz w:val="24"/>
               </w:rPr>
             </w:pPr>
+            <w:r>
+              <w:rPr>
+                <w:sz w:val="24"/>
+              </w:rPr>
+              <w:t>&lt;blank&gt;</w:t>
+            </w:r>
           </w:p>
         </w:tc>
       </w:tr>
@@ -2053,6 +2328,12 @@
                 <w:sz w:val="24"/>
               </w:rPr>
             </w:pPr>
+            <w:r>
+              <w:rPr>
+                <w:sz w:val="24"/>
+              </w:rPr>
+              <w:t>&lt;blank&gt;</w:t>
+            </w:r>
           </w:p>
         </w:tc>
         <w:tc>
@@ -2067,6 +2348,12 @@
                 <w:sz w:val="24"/>
               </w:rPr>
             </w:pPr>
+            <w:r>
+              <w:rPr>
+                <w:sz w:val="24"/>
+              </w:rPr>
+              <w:t>&lt;blank&gt;</w:t>
+            </w:r>
           </w:p>
         </w:tc>
       </w:tr>
@@ -2118,7 +2405,7 @@
         <mc:AlternateContent>
           <mc:Choice Requires="wps">
             <w:drawing>
-              <wp:anchor distT="0" distB="0" distL="114300" distR="114300" simplePos="0" relativeHeight="251659264" behindDoc="0" locked="0" layoutInCell="1" allowOverlap="1" wp14:anchorId="012AD419" wp14:editId="7841A9F2">
+              <wp:anchor distT="0" distB="0" distL="114300" distR="114300" simplePos="0" relativeHeight="251659264" behindDoc="0" locked="0" layoutInCell="1" allowOverlap="1" wp14:anchorId="0A607564" wp14:editId="77192065">
                 <wp:simplePos x="0" y="0"/>
                 <wp:positionH relativeFrom="margin">
                   <wp:posOffset>112395</wp:posOffset>
@@ -2129,7 +2416,7 @@
                 <wp:extent cx="5715000" cy="558800"/>
                 <wp:effectExtent l="0" t="0" r="19050" b="12700"/>
                 <wp:wrapNone/>
-                <wp:docPr id="587855616" name="Rectangle: Rounded Corners 1"/>
+                <wp:docPr id="1447860702" name="Rectangle: Rounded Corners 1"/>
                 <wp:cNvGraphicFramePr/>
                 <a:graphic xmlns:a="http://schemas.openxmlformats.org/drawingml/2006/main">
                   <a:graphicData uri="http://schemas.microsoft.com/office/word/2010/wordprocessingShape">
@@ -2192,7 +2479,7 @@
           </mc:Choice>
           <mc:Fallback>
             <w:pict>
-              <v:roundrect w14:anchorId="03CB12F4" id="Rectangle: Rounded Corners 1" o:spid="_x0000_s1026" style="position:absolute;margin-left:8.85pt;margin-top:-6pt;width:450pt;height:44pt;z-index:251659264;visibility:visible;mso-wrap-style:square;mso-wrap-distance-left:9pt;mso-wrap-distance-top:0;mso-wrap-distance-right:9pt;mso-wrap-distance-bottom:0;mso-position-horizontal:absolute;mso-position-horizontal-relative:margin;mso-position-vertical:absolute;mso-position-vertical-relative:text;v-text-anchor:middle" arcsize="10923f" o:gfxdata="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" filled="f" fillcolor="#156082 [3204]" strokeweight="1pt">
+              <v:roundrect w14:anchorId="4A696915" id="Rectangle: Rounded Corners 1" o:spid="_x0000_s1026" style="position:absolute;margin-left:8.85pt;margin-top:-6pt;width:450pt;height:44pt;z-index:251659264;visibility:visible;mso-wrap-style:square;mso-wrap-distance-left:9pt;mso-wrap-distance-top:0;mso-wrap-distance-right:9pt;mso-wrap-distance-bottom:0;mso-position-horizontal:absolute;mso-position-horizontal-relative:margin;mso-position-vertical:absolute;mso-position-vertical-relative:text;v-text-anchor:middle" arcsize="10923f" o:gfxdata="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" filled="f" fillcolor="#156082 [3204]" strokeweight="1pt">
                 <v:stroke joinstyle="miter"/>
                 <w10:wrap anchorx="margin"/>
               </v:roundrect>
@@ -2266,7 +2553,6 @@
           <w:b/>
           <w:sz w:val="24"/>
         </w:rPr>
-        <w:lastRenderedPageBreak/>
         <w:t>making models</w:t>
       </w:r>
       <w:r>
@@ -2328,21 +2614,22 @@
           <w:noProof/>
           <w:sz w:val="24"/>
         </w:rPr>
+        <w:lastRenderedPageBreak/>
         <w:drawing>
-          <wp:inline distT="0" distB="0" distL="0" distR="0" wp14:anchorId="521A1A2B" wp14:editId="74A64DAB">
+          <wp:inline distT="0" distB="0" distL="0" distR="0" wp14:anchorId="76494962" wp14:editId="3B8CA31A">
             <wp:extent cx="1260000" cy="900000"/>
             <wp:effectExtent l="0" t="0" r="0" b="0"/>
-            <wp:docPr id="172742844" name="Picture 2"/>
+            <wp:docPr id="2126615794" name="Picture 2"/>
             <wp:cNvGraphicFramePr/>
             <a:graphic xmlns:a="http://schemas.openxmlformats.org/drawingml/2006/main">
               <a:graphicData uri="http://schemas.openxmlformats.org/drawingml/2006/picture">
                 <pic:pic xmlns:pic="http://schemas.openxmlformats.org/drawingml/2006/picture">
                   <pic:nvPicPr>
-                    <pic:cNvPr id="172742844" name=""/>
+                    <pic:cNvPr id="2126615794" name=""/>
                     <pic:cNvPicPr/>
                   </pic:nvPicPr>
                   <pic:blipFill>
-                    <a:blip r:embed="rId6">
+                    <a:blip r:embed="rId6" cstate="print">
                       <a:extLst>
                         <a:ext uri="{28A0092B-C50C-407E-A947-70E740481C1C}">
                           <a14:useLocalDpi xmlns:a14="http://schemas.microsoft.com/office/drawing/2010/main" val="0"/>
@@ -2382,16 +2669,69 @@
           <w:sz w:val="24"/>
         </w:rPr>
         <w:drawing>
-          <wp:inline distT="0" distB="0" distL="0" distR="0" wp14:anchorId="6E88AFDF" wp14:editId="577FFBF7">
+          <wp:inline distT="0" distB="0" distL="0" distR="0" wp14:anchorId="312889C8" wp14:editId="5B17CFD2">
             <wp:extent cx="1260000" cy="900000"/>
             <wp:effectExtent l="0" t="0" r="0" b="0"/>
-            <wp:docPr id="503126647" name="Picture 3"/>
+            <wp:docPr id="1115622825" name="Picture 3"/>
             <wp:cNvGraphicFramePr/>
             <a:graphic xmlns:a="http://schemas.openxmlformats.org/drawingml/2006/main">
               <a:graphicData uri="http://schemas.openxmlformats.org/drawingml/2006/picture">
                 <pic:pic xmlns:pic="http://schemas.openxmlformats.org/drawingml/2006/picture">
                   <pic:nvPicPr>
-                    <pic:cNvPr id="503126647" name=""/>
+                    <pic:cNvPr id="1115622825" name=""/>
+                    <pic:cNvPicPr/>
+                  </pic:nvPicPr>
+                  <pic:blipFill>
+                    <a:blip r:embed="rId6" cstate="print">
+                      <a:extLst>
+                        <a:ext uri="{28A0092B-C50C-407E-A947-70E740481C1C}">
+                          <a14:useLocalDpi xmlns:a14="http://schemas.microsoft.com/office/drawing/2010/main" val="0"/>
+                        </a:ext>
+                      </a:extLst>
+                    </a:blip>
+                    <a:stretch>
+                      <a:fillRect/>
+                    </a:stretch>
+                  </pic:blipFill>
+                  <pic:spPr>
+                    <a:xfrm>
+                      <a:off x="0" y="0"/>
+                      <a:ext cx="1260000" cy="900000"/>
+                    </a:xfrm>
+                    <a:prstGeom prst="rect">
+                      <a:avLst/>
+                    </a:prstGeom>
+                  </pic:spPr>
+                </pic:pic>
+              </a:graphicData>
+            </a:graphic>
+          </wp:inline>
+        </w:drawing>
+      </w:r>
+      <w:r>
+        <w:rPr>
+          <w:b/>
+          <w:sz w:val="24"/>
+        </w:rPr>
+        <w:tab/>
+      </w:r>
+      <w:r>
+        <w:rPr>
+          <w:b/>
+          <w:noProof/>
+          <w:sz w:val="24"/>
+        </w:rPr>
+        <w:drawing>
+          <wp:inline distT="0" distB="0" distL="0" distR="0" wp14:anchorId="6A7D2E66" wp14:editId="0F59C98D">
+            <wp:extent cx="1260000" cy="900000"/>
+            <wp:effectExtent l="0" t="0" r="0" b="0"/>
+            <wp:docPr id="49995807" name="Picture 4"/>
+            <wp:cNvGraphicFramePr/>
+            <a:graphic xmlns:a="http://schemas.openxmlformats.org/drawingml/2006/main">
+              <a:graphicData uri="http://schemas.openxmlformats.org/drawingml/2006/picture">
+                <pic:pic xmlns:pic="http://schemas.openxmlformats.org/drawingml/2006/picture">
+                  <pic:nvPicPr>
+                    <pic:cNvPr id="49995807" name=""/>
                     <pic:cNvPicPr/>
                   </pic:nvPicPr>
                   <pic:blipFill>
@@ -2435,16 +2775,16 @@
           <w:sz w:val="24"/>
         </w:rPr>
         <w:drawing>
-          <wp:inline distT="0" distB="0" distL="0" distR="0" wp14:anchorId="78299F93" wp14:editId="2A008700">
+          <wp:inline distT="0" distB="0" distL="0" distR="0" wp14:anchorId="21D917BB" wp14:editId="2DCEB25B">
             <wp:extent cx="1260000" cy="900000"/>
             <wp:effectExtent l="0" t="0" r="0" b="0"/>
-            <wp:docPr id="2140220150" name="Picture 4"/>
+            <wp:docPr id="1668842246" name="Picture 5"/>
             <wp:cNvGraphicFramePr/>
             <a:graphic xmlns:a="http://schemas.openxmlformats.org/drawingml/2006/main">
               <a:graphicData uri="http://schemas.openxmlformats.org/drawingml/2006/picture">
                 <pic:pic xmlns:pic="http://schemas.openxmlformats.org/drawingml/2006/picture">
                   <pic:nvPicPr>
-                    <pic:cNvPr id="2140220150" name=""/>
+                    <pic:cNvPr id="1668842246" name=""/>
                     <pic:cNvPicPr/>
                   </pic:nvPicPr>
                   <pic:blipFill>
@@ -2474,59 +2814,6 @@
           </wp:inline>
         </w:drawing>
       </w:r>
-      <w:r>
-        <w:rPr>
-          <w:b/>
-          <w:sz w:val="24"/>
-        </w:rPr>
-        <w:tab/>
-      </w:r>
-      <w:r>
-        <w:rPr>
-          <w:b/>
-          <w:noProof/>
-          <w:sz w:val="24"/>
-        </w:rPr>
-        <w:drawing>
-          <wp:inline distT="0" distB="0" distL="0" distR="0" wp14:anchorId="7F63D660" wp14:editId="084F880C">
-            <wp:extent cx="1260000" cy="900000"/>
-            <wp:effectExtent l="0" t="0" r="0" b="0"/>
-            <wp:docPr id="1285230026" name="Picture 5"/>
-            <wp:cNvGraphicFramePr/>
-            <a:graphic xmlns:a="http://schemas.openxmlformats.org/drawingml/2006/main">
-              <a:graphicData uri="http://schemas.openxmlformats.org/drawingml/2006/picture">
-                <pic:pic xmlns:pic="http://schemas.openxmlformats.org/drawingml/2006/picture">
-                  <pic:nvPicPr>
-                    <pic:cNvPr id="1285230026" name=""/>
-                    <pic:cNvPicPr/>
-                  </pic:nvPicPr>
-                  <pic:blipFill>
-                    <a:blip r:embed="rId8">
-                      <a:extLst>
-                        <a:ext uri="{28A0092B-C50C-407E-A947-70E740481C1C}">
-                          <a14:useLocalDpi xmlns:a14="http://schemas.microsoft.com/office/drawing/2010/main" val="0"/>
-                        </a:ext>
-                      </a:extLst>
-                    </a:blip>
-                    <a:stretch>
-                      <a:fillRect/>
-                    </a:stretch>
-                  </pic:blipFill>
-                  <pic:spPr>
-                    <a:xfrm>
-                      <a:off x="0" y="0"/>
-                      <a:ext cx="1260000" cy="900000"/>
-                    </a:xfrm>
-                    <a:prstGeom prst="rect">
-                      <a:avLst/>
-                    </a:prstGeom>
-                  </pic:spPr>
-                </pic:pic>
-              </a:graphicData>
-            </a:graphic>
-          </wp:inline>
-        </w:drawing>
-      </w:r>
     </w:p>
     <w:p>
       <w:pPr>
@@ -2629,67 +2916,16 @@
           <w:sz w:val="24"/>
         </w:rPr>
         <w:drawing>
-          <wp:inline distT="0" distB="0" distL="0" distR="0" wp14:anchorId="5F51EC94" wp14:editId="0A58453E">
+          <wp:inline distT="0" distB="0" distL="0" distR="0" wp14:anchorId="08550AED" wp14:editId="77824180">
             <wp:extent cx="1260000" cy="900000"/>
             <wp:effectExtent l="0" t="0" r="0" b="0"/>
-            <wp:docPr id="645485856" name="Picture 6"/>
+            <wp:docPr id="969590336" name="Picture 6"/>
             <wp:cNvGraphicFramePr/>
             <a:graphic xmlns:a="http://schemas.openxmlformats.org/drawingml/2006/main">
               <a:graphicData uri="http://schemas.openxmlformats.org/drawingml/2006/picture">
                 <pic:pic xmlns:pic="http://schemas.openxmlformats.org/drawingml/2006/picture">
                   <pic:nvPicPr>
-                    <pic:cNvPr id="645485856" name=""/>
-                    <pic:cNvPicPr/>
-                  </pic:nvPicPr>
-                  <pic:blipFill>
-                    <a:blip r:embed="rId8">
-                      <a:extLst>
-                        <a:ext uri="{28A0092B-C50C-407E-A947-70E740481C1C}">
-                          <a14:useLocalDpi xmlns:a14="http://schemas.microsoft.com/office/drawing/2010/main" val="0"/>
-                        </a:ext>
-                      </a:extLst>
-                    </a:blip>
-                    <a:stretch>
-                      <a:fillRect/>
-                    </a:stretch>
-                  </pic:blipFill>
-                  <pic:spPr>
-                    <a:xfrm>
-                      <a:off x="0" y="0"/>
-                      <a:ext cx="1260000" cy="900000"/>
-                    </a:xfrm>
-                    <a:prstGeom prst="rect">
-                      <a:avLst/>
-                    </a:prstGeom>
-                  </pic:spPr>
-                </pic:pic>
-              </a:graphicData>
-            </a:graphic>
-          </wp:inline>
-        </w:drawing>
-      </w:r>
-      <w:r>
-        <w:rPr>
-          <w:sz w:val="24"/>
-        </w:rPr>
-        <w:tab/>
-      </w:r>
-      <w:r>
-        <w:rPr>
-          <w:noProof/>
-          <w:sz w:val="24"/>
-        </w:rPr>
-        <w:drawing>
-          <wp:inline distT="0" distB="0" distL="0" distR="0" wp14:anchorId="3507F125" wp14:editId="67BF62FB">
-            <wp:extent cx="1260000" cy="900000"/>
-            <wp:effectExtent l="0" t="0" r="0" b="0"/>
-            <wp:docPr id="354487270" name="Picture 7"/>
-            <wp:cNvGraphicFramePr/>
-            <a:graphic xmlns:a="http://schemas.openxmlformats.org/drawingml/2006/main">
-              <a:graphicData uri="http://schemas.openxmlformats.org/drawingml/2006/picture">
-                <pic:pic xmlns:pic="http://schemas.openxmlformats.org/drawingml/2006/picture">
-                  <pic:nvPicPr>
-                    <pic:cNvPr id="354487270" name=""/>
+                    <pic:cNvPr id="969590336" name=""/>
                     <pic:cNvPicPr/>
                   </pic:nvPicPr>
                   <pic:blipFill>
@@ -2731,16 +2967,16 @@
           <w:sz w:val="24"/>
         </w:rPr>
         <w:drawing>
-          <wp:inline distT="0" distB="0" distL="0" distR="0" wp14:anchorId="709CBD50" wp14:editId="6BD8239E">
+          <wp:inline distT="0" distB="0" distL="0" distR="0" wp14:anchorId="08AD1E12" wp14:editId="714B1BF8">
             <wp:extent cx="1260000" cy="900000"/>
             <wp:effectExtent l="0" t="0" r="0" b="0"/>
-            <wp:docPr id="407022136" name="Picture 8"/>
+            <wp:docPr id="1181435298" name="Picture 7"/>
             <wp:cNvGraphicFramePr/>
             <a:graphic xmlns:a="http://schemas.openxmlformats.org/drawingml/2006/main">
               <a:graphicData uri="http://schemas.openxmlformats.org/drawingml/2006/picture">
                 <pic:pic xmlns:pic="http://schemas.openxmlformats.org/drawingml/2006/picture">
                   <pic:nvPicPr>
-                    <pic:cNvPr id="407022136" name=""/>
+                    <pic:cNvPr id="1181435298" name=""/>
                     <pic:cNvPicPr/>
                   </pic:nvPicPr>
                   <pic:blipFill>
@@ -2782,20 +3018,20 @@
           <w:sz w:val="24"/>
         </w:rPr>
         <w:drawing>
-          <wp:inline distT="0" distB="0" distL="0" distR="0" wp14:anchorId="2DC81504" wp14:editId="798B155C">
+          <wp:inline distT="0" distB="0" distL="0" distR="0" wp14:anchorId="4BB21965" wp14:editId="182250CB">
             <wp:extent cx="1260000" cy="900000"/>
             <wp:effectExtent l="0" t="0" r="0" b="0"/>
-            <wp:docPr id="1813120524" name="Picture 9"/>
+            <wp:docPr id="1754358896" name="Picture 8"/>
             <wp:cNvGraphicFramePr/>
             <a:graphic xmlns:a="http://schemas.openxmlformats.org/drawingml/2006/main">
               <a:graphicData uri="http://schemas.openxmlformats.org/drawingml/2006/picture">
                 <pic:pic xmlns:pic="http://schemas.openxmlformats.org/drawingml/2006/picture">
                   <pic:nvPicPr>
-                    <pic:cNvPr id="1813120524" name=""/>
+                    <pic:cNvPr id="1754358896" name=""/>
                     <pic:cNvPicPr/>
                   </pic:nvPicPr>
                   <pic:blipFill>
-                    <a:blip r:embed="rId11" cstate="print">
+                    <a:blip r:embed="rId9" cstate="print">
                       <a:extLst>
                         <a:ext uri="{28A0092B-C50C-407E-A947-70E740481C1C}">
                           <a14:useLocalDpi xmlns:a14="http://schemas.microsoft.com/office/drawing/2010/main" val="0"/>
@@ -2821,6 +3057,57 @@
           </wp:inline>
         </w:drawing>
       </w:r>
+      <w:r>
+        <w:rPr>
+          <w:sz w:val="24"/>
+        </w:rPr>
+        <w:tab/>
+      </w:r>
+      <w:r>
+        <w:rPr>
+          <w:noProof/>
+          <w:sz w:val="24"/>
+        </w:rPr>
+        <w:drawing>
+          <wp:inline distT="0" distB="0" distL="0" distR="0" wp14:anchorId="0E23AA64" wp14:editId="43355B24">
+            <wp:extent cx="1260000" cy="900000"/>
+            <wp:effectExtent l="0" t="0" r="0" b="0"/>
+            <wp:docPr id="1206225097" name="Picture 9"/>
+            <wp:cNvGraphicFramePr/>
+            <a:graphic xmlns:a="http://schemas.openxmlformats.org/drawingml/2006/main">
+              <a:graphicData uri="http://schemas.openxmlformats.org/drawingml/2006/picture">
+                <pic:pic xmlns:pic="http://schemas.openxmlformats.org/drawingml/2006/picture">
+                  <pic:nvPicPr>
+                    <pic:cNvPr id="1206225097" name=""/>
+                    <pic:cNvPicPr/>
+                  </pic:nvPicPr>
+                  <pic:blipFill>
+                    <a:blip r:embed="rId11">
+                      <a:extLst>
+                        <a:ext uri="{28A0092B-C50C-407E-A947-70E740481C1C}">
+                          <a14:useLocalDpi xmlns:a14="http://schemas.microsoft.com/office/drawing/2010/main" val="0"/>
+                        </a:ext>
+                      </a:extLst>
+                    </a:blip>
+                    <a:stretch>
+                      <a:fillRect/>
+                    </a:stretch>
+                  </pic:blipFill>
+                  <pic:spPr>
+                    <a:xfrm>
+                      <a:off x="0" y="0"/>
+                      <a:ext cx="1260000" cy="900000"/>
+                    </a:xfrm>
+                    <a:prstGeom prst="rect">
+                      <a:avLst/>
+                    </a:prstGeom>
+                  </pic:spPr>
+                </pic:pic>
+              </a:graphicData>
+            </a:graphic>
+          </wp:inline>
+        </w:drawing>
+      </w:r>
     </w:p>
     <w:p>
       <w:pPr>
@@ -3152,12 +3439,7 @@
       </w:pPr>
     </w:p>
     <w:sectPr>
-      <w:headerReference w:type="even" r:id="rId12"/>
-      <w:headerReference w:type="default" r:id="rId13"/>
-      <w:footerReference w:type="even" r:id="rId14"/>
-      <w:footerReference w:type="default" r:id="rId15"/>
-      <w:headerReference w:type="first" r:id="rId16"/>
-      <w:footerReference w:type="first" r:id="rId17"/>
+      <w:footerReference w:type="default" r:id="rId12"/>
       <w:pgSz w:w="11907" w:h="16840" w:code="9"/>
       <w:pgMar w:top="1134" w:right="850" w:bottom="1134" w:left="1701" w:header="720" w:footer="720" w:gutter="0"/>
       <w:cols w:space="720"/>
@@ -3193,16 +3475,6 @@
 </file>
 
 <file path=word/footer1.xml><?xml version="1.0" encoding="utf-8"?>
-<w:ftr xmlns:wpc="http://schemas.microsoft.com/office/word/2010/wordprocessingCanvas" xmlns:cx="http://schemas.microsoft.com/office/drawing/2014/chartex" xmlns:cx1="http://schemas.microsoft.com/office/drawing/2015/9/8/chartex" xmlns:cx2="http://schemas.microsoft.com/office/drawing/2015/10/21/chartex" xmlns:cx3="http://schemas.microsoft.com/office/drawing/2016/5/9/chartex" xmlns:cx4="http://schemas.microsoft.com/office/drawing/2016/5/10/chartex" xmlns:cx5="http://schemas.microsoft.com/office/drawing/2016/5/11/chartex" xmlns:cx6="http://schemas.microsoft.com/office/drawing/2016/5/12/chartex" xmlns:cx7="http://schemas.microsoft.com/office/drawing/2016/5/13/chartex" xmlns:cx8="http://schemas.microsoft.com/office/drawing/2016/5/14/chartex" xmlns:mc="http://schemas.openxmlformats.org/markup-compatibility/2006" xmlns:aink="http://schemas.microsoft.com/office/drawing/2016/ink" xmlns:am3d="http://schemas.microsoft.com/office/drawing/2017/model3d" xmlns:o="urn:schemas-microsoft-com:office:office" xmlns:oel="http://schemas.microsoft.com/office/2019/extlst" xmlns:r="http://schemas.openxmlformats.org/officeDocument/2006/relationships" xmlns:m="http://schemas.openxmlformats.org/officeDocument/2006/math" xmlns:v="urn:schemas-microsoft-com:vml" xmlns:wp14="http://schemas.microsoft.com/office/word/2010/wordprocessingDrawing" xmlns:wp="http://schemas.openxmlformats.org/drawingml/2006/wordprocessingDrawing" xmlns:w10="urn:schemas-microsoft-com:office:word" xmlns:w="http://schemas.openxmlformats.org/wordprocessingml/2006/main" xmlns:w14="http://schemas.microsoft.com/office/word/2010/wordml" xmlns:w15="http://schemas.microsoft.com/office/word/2012/wordml" xmlns:w16cex="http://schemas.microsoft.com/office/word/2018/wordml/cex" xmlns:w16cid="http://schemas.microsoft.com/office/word/2016/wordml/cid" xmlns:w16="http://schemas.microsoft.com/office/word/2018/wordml" xmlns:w16du="http://schemas.microsoft.com/office/word/2023/wordml/word16du" xmlns:w16sdtdh="http://schemas.microsoft.com/office/word/2020/wordml/sdtdatahash" xmlns:w16sdtfl="http://schemas.microsoft.com/office/word/2024/wordml/sdtformatlock" xmlns:w16se="http://schemas.microsoft.com/office/word/2015/wordml/symex" xmlns:wpg="http://schemas.microsoft.com/office/word/2010/wordprocessingGroup" xmlns:wpi="http://schemas.microsoft.com/office/word/2010/wordprocessingInk" xmlns:wne="http://schemas.microsoft.com/office/word/2006/wordml" xmlns:wps="http://schemas.microsoft.com/office/word/2010/wordprocessingShape" mc:Ignorable="w14 w15 w16se w16cid w16 w16cex w16sdtdh w16sdtfl w16du wp14">
-  <w:p>
-    <w:pPr>
-      <w:pStyle w:val="Footer"/>
-    </w:pPr>
-  </w:p>
-</w:ftr>
-</file>
-
-<file path=word/footer2.xml><?xml version="1.0" encoding="utf-8"?>
 <w:ftr xmlns:wpc="http://schemas.microsoft.com/office/word/2010/wordprocessingCanvas" xmlns:cx="http://schemas.microsoft.com/office/drawing/2014/chartex" xmlns:cx1="http://schemas.microsoft.com/office/drawing/2015/9/8/chartex" xmlns:cx2="http://schemas.microsoft.com/office/drawing/2015/10/21/chartex" xmlns:cx3="http://schemas.microsoft.com/office/drawing/2016/5/9/chartex" xmlns:cx4="http://schemas.microsoft.com/office/drawing/2016/5/10/chartex" xmlns:cx5="http://schemas.microsoft.com/office/drawing/2016/5/11/chartex" xmlns:cx6="http://schemas.microsoft.com/office/drawing/2016/5/12/chartex" xmlns:cx7="http://schemas.microsoft.com/office/drawing/2016/5/13/chartex" xmlns:cx8="http://schemas.microsoft.com/office/drawing/2016/5/14/chartex" xmlns:mc="http://schemas.openxmlformats.org/markup-compatibility/2006" xmlns:aink="http://schemas.microsoft.com/office/drawing/2016/ink" xmlns:am3d="http://schemas.microsoft.com/office/drawing/2017/model3d" xmlns:o="urn:schemas-microsoft-com:office:office" xmlns:oel="http://schemas.microsoft.com/office/2019/extlst" xmlns:r="http://schemas.openxmlformats.org/officeDocument/2006/relationships" xmlns:m="http://schemas.openxmlformats.org/officeDocument/2006/math" xmlns:v="urn:schemas-microsoft-com:vml" xmlns:wp14="http://schemas.microsoft.com/office/word/2010/wordprocessingDrawing" xmlns:wp="http://schemas.openxmlformats.org/drawingml/2006/wordprocessingDrawing" xmlns:w10="urn:schemas-microsoft-com:office:word" xmlns:w="http://schemas.openxmlformats.org/wordprocessingml/2006/main" xmlns:w14="http://schemas.microsoft.com/office/word/2010/wordml" xmlns:w15="http://schemas.microsoft.com/office/word/2012/wordml" xmlns:w16cex="http://schemas.microsoft.com/office/word/2018/wordml/cex" xmlns:w16cid="http://schemas.microsoft.com/office/word/2016/wordml/cid" xmlns:w16="http://schemas.microsoft.com/office/word/2018/wordml" xmlns:w16du="http://schemas.microsoft.com/office/word/2023/wordml/word16du" xmlns:w16sdtdh="http://schemas.microsoft.com/office/word/2020/wordml/sdtdatahash" xmlns:w16sdtfl="http://schemas.microsoft.com/office/word/2024/wordml/sdtformatlock" xmlns:w16se="http://schemas.microsoft.com/office/word/2015/wordml/symex" xmlns:wpg="http://schemas.microsoft.com/office/word/2010/wordprocessingGroup" xmlns:wpi="http://schemas.microsoft.com/office/word/2010/wordprocessingInk" xmlns:wne="http://schemas.microsoft.com/office/word/2006/wordml" xmlns:wps="http://schemas.microsoft.com/office/word/2010/wordprocessingShape" mc:Ignorable="w14 w15 w16se w16cid w16 w16cex w16sdtdh w16sdtfl w16du wp14">
   <w:p>
     <w:pPr>
@@ -3280,16 +3552,6 @@
 </w:ftr>
 </file>
 
-<file path=word/footer3.xml><?xml version="1.0" encoding="utf-8"?>
-<w:ftr xmlns:wpc="http://schemas.microsoft.com/office/word/2010/wordprocessingCanvas" xmlns:cx="http://schemas.microsoft.com/office/drawing/2014/chartex" xmlns:cx1="http://schemas.microsoft.com/office/drawing/2015/9/8/chartex" xmlns:cx2="http://schemas.microsoft.com/office/drawing/2015/10/21/chartex" xmlns:cx3="http://schemas.microsoft.com/office/drawing/2016/5/9/chartex" xmlns:cx4="http://schemas.microsoft.com/office/drawing/2016/5/10/chartex" xmlns:cx5="http://schemas.microsoft.com/office/drawing/2016/5/11/chartex" xmlns:cx6="http://schemas.microsoft.com/office/drawing/2016/5/12/chartex" xmlns:cx7="http://schemas.microsoft.com/office/drawing/2016/5/13/chartex" xmlns:cx8="http://schemas.microsoft.com/office/drawing/2016/5/14/chartex" xmlns:mc="http://schemas.openxmlformats.org/markup-compatibility/2006" xmlns:aink="http://schemas.microsoft.com/office/drawing/2016/ink" xmlns:am3d="http://schemas.microsoft.com/office/drawing/2017/model3d" xmlns:o="urn:schemas-microsoft-com:office:office" xmlns:oel="http://schemas.microsoft.com/office/2019/extlst" xmlns:r="http://schemas.openxmlformats.org/officeDocument/2006/relationships" xmlns:m="http://schemas.openxmlformats.org/officeDocument/2006/math" xmlns:v="urn:schemas-microsoft-com:vml" xmlns:wp14="http://schemas.microsoft.com/office/word/2010/wordprocessingDrawing" xmlns:wp="http://schemas.openxmlformats.org/drawingml/2006/wordprocessingDrawing" xmlns:w10="urn:schemas-microsoft-com:office:word" xmlns:w="http://schemas.openxmlformats.org/wordprocessingml/2006/main" xmlns:w14="http://schemas.microsoft.com/office/word/2010/wordml" xmlns:w15="http://schemas.microsoft.com/office/word/2012/wordml" xmlns:w16cex="http://schemas.microsoft.com/office/word/2018/wordml/cex" xmlns:w16cid="http://schemas.microsoft.com/office/word/2016/wordml/cid" xmlns:w16="http://schemas.microsoft.com/office/word/2018/wordml" xmlns:w16du="http://schemas.microsoft.com/office/word/2023/wordml/word16du" xmlns:w16sdtdh="http://schemas.microsoft.com/office/word/2020/wordml/sdtdatahash" xmlns:w16sdtfl="http://schemas.microsoft.com/office/word/2024/wordml/sdtformatlock" xmlns:w16se="http://schemas.microsoft.com/office/word/2015/wordml/symex" xmlns:wpg="http://schemas.microsoft.com/office/word/2010/wordprocessingGroup" xmlns:wpi="http://schemas.microsoft.com/office/word/2010/wordprocessingInk" xmlns:wne="http://schemas.microsoft.com/office/word/2006/wordml" xmlns:wps="http://schemas.microsoft.com/office/word/2010/wordprocessingShape" mc:Ignorable="w14 w15 w16se w16cid w16 w16cex w16sdtdh w16sdtfl w16du wp14">
-  <w:p>
-    <w:pPr>
-      <w:pStyle w:val="Footer"/>
-    </w:pPr>
-  </w:p>
-</w:ftr>
-</file>
-
 <file path=word/footnotes.xml><?xml version="1.0" encoding="utf-8"?>
 <w:footnotes xmlns:wpc="http://schemas.microsoft.com/office/word/2010/wordprocessingCanvas" xmlns:cx="http://schemas.microsoft.com/office/drawing/2014/chartex" xmlns:cx1="http://schemas.microsoft.com/office/drawing/2015/9/8/chartex" xmlns:cx2="http://schemas.microsoft.com/office/drawing/2015/10/21/chartex" xmlns:cx3="http://schemas.microsoft.com/office/drawing/2016/5/9/chartex" xmlns:cx4="http://schemas.microsoft.com/office/drawing/2016/5/10/chartex" xmlns:cx5="http://schemas.microsoft.com/office/drawing/2016/5/11/chartex" xmlns:cx6="http://schemas.microsoft.com/office/drawing/2016/5/12/chartex" xmlns:cx7="http://schemas.microsoft.com/office/drawing/2016/5/13/chartex" xmlns:cx8="http://schemas.microsoft.com/office/drawing/2016/5/14/chartex" xmlns:mc="http://schemas.openxmlformats.org/markup-compatibility/2006" xmlns:aink="http://schemas.microsoft.com/office/drawing/2016/ink" xmlns:am3d="http://schemas.microsoft.com/office/drawing/2017/model3d" xmlns:o="urn:schemas-microsoft-com:office:office" xmlns:oel="http://schemas.microsoft.com/office/2019/extlst" xmlns:r="http://schemas.openxmlformats.org/officeDocument/2006/relationships" xmlns:m="http://schemas.openxmlformats.org/officeDocument/2006/math" xmlns:v="urn:schemas-microsoft-com:vml" xmlns:wp14="http://schemas.microsoft.com/office/word/2010/wordprocessingDrawing" xmlns:wp="http://schemas.openxmlformats.org/drawingml/2006/wordprocessingDrawing" xmlns:w10="urn:schemas-microsoft-com:office:word" xmlns:w="http://schemas.openxmlformats.org/wordprocessingml/2006/main" xmlns:w14="http://schemas.microsoft.com/office/word/2010/wordml" xmlns:w15="http://schemas.microsoft.com/office/word/2012/wordml" xmlns:w16cex="http://schemas.microsoft.com/office/word/2018/wordml/cex" xmlns:w16cid="http://schemas.microsoft.com/office/word/2016/wordml/cid" xmlns:w16="http://schemas.microsoft.com/office/word/2018/wordml" xmlns:w16du="http://schemas.microsoft.com/office/word/2023/wordml/word16du" xmlns:w16sdtdh="http://schemas.microsoft.com/office/word/2020/wordml/sdtdatahash" xmlns:w16sdtfl="http://schemas.microsoft.com/office/word/2024/wordml/sdtformatlock" xmlns:w16se="http://schemas.microsoft.com/office/word/2015/wordml/symex" xmlns:wpg="http://schemas.microsoft.com/office/word/2010/wordprocessingGroup" xmlns:wpi="http://schemas.microsoft.com/office/word/2010/wordprocessingInk" xmlns:wne="http://schemas.microsoft.com/office/word/2006/wordml" xmlns:wps="http://schemas.microsoft.com/office/word/2010/wordprocessingShape" mc:Ignorable="w14 w15 w16se w16cid w16 w16cex w16sdtdh w16sdtfl w16du wp14">
   <w:footnote w:type="separator" w:id="-1">
@@ -3313,36 +3575,6 @@
     </w:p>
   </w:footnote>
 </w:footnotes>
-</file>
-
-<file path=word/header1.xml><?xml version="1.0" encoding="utf-8"?>
-<w:hdr xmlns:wpc="http://schemas.microsoft.com/office/word/2010/wordprocessingCanvas" xmlns:cx="http://schemas.microsoft.com/office/drawing/2014/chartex" xmlns:cx1="http://schemas.microsoft.com/office/drawing/2015/9/8/chartex" xmlns:cx2="http://schemas.microsoft.com/office/drawing/2015/10/21/chartex" xmlns:cx3="http://schemas.microsoft.com/office/drawing/2016/5/9/chartex" xmlns:cx4="http://schemas.microsoft.com/office/drawing/2016/5/10/chartex" xmlns:cx5="http://schemas.microsoft.com/office/drawing/2016/5/11/chartex" xmlns:cx6="http://schemas.microsoft.com/office/drawing/2016/5/12/chartex" xmlns:cx7="http://schemas.microsoft.com/office/drawing/2016/5/13/chartex" xmlns:cx8="http://schemas.microsoft.com/office/drawing/2016/5/14/chartex" xmlns:mc="http://schemas.openxmlformats.org/markup-compatibility/2006" xmlns:aink="http://schemas.microsoft.com/office/drawing/2016/ink" xmlns:am3d="http://schemas.microsoft.com/office/drawing/2017/model3d" xmlns:o="urn:schemas-microsoft-com:office:office" xmlns:oel="http://schemas.microsoft.com/office/2019/extlst" xmlns:r="http://schemas.openxmlformats.org/officeDocument/2006/relationships" xmlns:m="http://schemas.openxmlformats.org/officeDocument/2006/math" xmlns:v="urn:schemas-microsoft-com:vml" xmlns:wp14="http://schemas.microsoft.com/office/word/2010/wordprocessingDrawing" xmlns:wp="http://schemas.openxmlformats.org/drawingml/2006/wordprocessingDrawing" xmlns:w10="urn:schemas-microsoft-com:office:word" xmlns:w="http://schemas.openxmlformats.org/wordprocessingml/2006/main" xmlns:w14="http://schemas.microsoft.com/office/word/2010/wordml" xmlns:w15="http://schemas.microsoft.com/office/word/2012/wordml" xmlns:w16cex="http://schemas.microsoft.com/office/word/2018/wordml/cex" xmlns:w16cid="http://schemas.microsoft.com/office/word/2016/wordml/cid" xmlns:w16="http://schemas.microsoft.com/office/word/2018/wordml" xmlns:w16du="http://schemas.microsoft.com/office/word/2023/wordml/word16du" xmlns:w16sdtdh="http://schemas.microsoft.com/office/word/2020/wordml/sdtdatahash" xmlns:w16sdtfl="http://schemas.microsoft.com/office/word/2024/wordml/sdtformatlock" xmlns:w16se="http://schemas.microsoft.com/office/word/2015/wordml/symex" xmlns:wpg="http://schemas.microsoft.com/office/word/2010/wordprocessingGroup" xmlns:wpi="http://schemas.microsoft.com/office/word/2010/wordprocessingInk" xmlns:wne="http://schemas.microsoft.com/office/word/2006/wordml" xmlns:wps="http://schemas.microsoft.com/office/word/2010/wordprocessingShape" mc:Ignorable="w14 w15 w16se w16cid w16 w16cex w16sdtdh w16sdtfl w16du wp14">
-  <w:p>
-    <w:pPr>
-      <w:pStyle w:val="Header"/>
-    </w:pPr>
-  </w:p>
-</w:hdr>
-</file>
-
-<file path=word/header2.xml><?xml version="1.0" encoding="utf-8"?>
-<w:hdr xmlns:wpc="http://schemas.microsoft.com/office/word/2010/wordprocessingCanvas" xmlns:cx="http://schemas.microsoft.com/office/drawing/2014/chartex" xmlns:cx1="http://schemas.microsoft.com/office/drawing/2015/9/8/chartex" xmlns:cx2="http://schemas.microsoft.com/office/drawing/2015/10/21/chartex" xmlns:cx3="http://schemas.microsoft.com/office/drawing/2016/5/9/chartex" xmlns:cx4="http://schemas.microsoft.com/office/drawing/2016/5/10/chartex" xmlns:cx5="http://schemas.microsoft.com/office/drawing/2016/5/11/chartex" xmlns:cx6="http://schemas.microsoft.com/office/drawing/2016/5/12/chartex" xmlns:cx7="http://schemas.microsoft.com/office/drawing/2016/5/13/chartex" xmlns:cx8="http://schemas.microsoft.com/office/drawing/2016/5/14/chartex" xmlns:mc="http://schemas.openxmlformats.org/markup-compatibility/2006" xmlns:aink="http://schemas.microsoft.com/office/drawing/2016/ink" xmlns:am3d="http://schemas.microsoft.com/office/drawing/2017/model3d" xmlns:o="urn:schemas-microsoft-com:office:office" xmlns:oel="http://schemas.microsoft.com/office/2019/extlst" xmlns:r="http://schemas.openxmlformats.org/officeDocument/2006/relationships" xmlns:m="http://schemas.openxmlformats.org/officeDocument/2006/math" xmlns:v="urn:schemas-microsoft-com:vml" xmlns:wp14="http://schemas.microsoft.com/office/word/2010/wordprocessingDrawing" xmlns:wp="http://schemas.openxmlformats.org/drawingml/2006/wordprocessingDrawing" xmlns:w10="urn:schemas-microsoft-com:office:word" xmlns:w="http://schemas.openxmlformats.org/wordprocessingml/2006/main" xmlns:w14="http://schemas.microsoft.com/office/word/2010/wordml" xmlns:w15="http://schemas.microsoft.com/office/word/2012/wordml" xmlns:w16cex="http://schemas.microsoft.com/office/word/2018/wordml/cex" xmlns:w16cid="http://schemas.microsoft.com/office/word/2016/wordml/cid" xmlns:w16="http://schemas.microsoft.com/office/word/2018/wordml" xmlns:w16du="http://schemas.microsoft.com/office/word/2023/wordml/word16du" xmlns:w16sdtdh="http://schemas.microsoft.com/office/word/2020/wordml/sdtdatahash" xmlns:w16sdtfl="http://schemas.microsoft.com/office/word/2024/wordml/sdtformatlock" xmlns:w16se="http://schemas.microsoft.com/office/word/2015/wordml/symex" xmlns:wpg="http://schemas.microsoft.com/office/word/2010/wordprocessingGroup" xmlns:wpi="http://schemas.microsoft.com/office/word/2010/wordprocessingInk" xmlns:wne="http://schemas.microsoft.com/office/word/2006/wordml" xmlns:wps="http://schemas.microsoft.com/office/word/2010/wordprocessingShape" mc:Ignorable="w14 w15 w16se w16cid w16 w16cex w16sdtdh w16sdtfl w16du wp14">
-  <w:p>
-    <w:pPr>
-      <w:pStyle w:val="Header"/>
-    </w:pPr>
-  </w:p>
-</w:hdr>
-</file>
-
-<file path=word/header3.xml><?xml version="1.0" encoding="utf-8"?>
-<w:hdr xmlns:wpc="http://schemas.microsoft.com/office/word/2010/wordprocessingCanvas" xmlns:cx="http://schemas.microsoft.com/office/drawing/2014/chartex" xmlns:cx1="http://schemas.microsoft.com/office/drawing/2015/9/8/chartex" xmlns:cx2="http://schemas.microsoft.com/office/drawing/2015/10/21/chartex" xmlns:cx3="http://schemas.microsoft.com/office/drawing/2016/5/9/chartex" xmlns:cx4="http://schemas.microsoft.com/office/drawing/2016/5/10/chartex" xmlns:cx5="http://schemas.microsoft.com/office/drawing/2016/5/11/chartex" xmlns:cx6="http://schemas.microsoft.com/office/drawing/2016/5/12/chartex" xmlns:cx7="http://schemas.microsoft.com/office/drawing/2016/5/13/chartex" xmlns:cx8="http://schemas.microsoft.com/office/drawing/2016/5/14/chartex" xmlns:mc="http://schemas.openxmlformats.org/markup-compatibility/2006" xmlns:aink="http://schemas.microsoft.com/office/drawing/2016/ink" xmlns:am3d="http://schemas.microsoft.com/office/drawing/2017/model3d" xmlns:o="urn:schemas-microsoft-com:office:office" xmlns:oel="http://schemas.microsoft.com/office/2019/extlst" xmlns:r="http://schemas.openxmlformats.org/officeDocument/2006/relationships" xmlns:m="http://schemas.openxmlformats.org/officeDocument/2006/math" xmlns:v="urn:schemas-microsoft-com:vml" xmlns:wp14="http://schemas.microsoft.com/office/word/2010/wordprocessingDrawing" xmlns:wp="http://schemas.openxmlformats.org/drawingml/2006/wordprocessingDrawing" xmlns:w10="urn:schemas-microsoft-com:office:word" xmlns:w="http://schemas.openxmlformats.org/wordprocessingml/2006/main" xmlns:w14="http://schemas.microsoft.com/office/word/2010/wordml" xmlns:w15="http://schemas.microsoft.com/office/word/2012/wordml" xmlns:w16cex="http://schemas.microsoft.com/office/word/2018/wordml/cex" xmlns:w16cid="http://schemas.microsoft.com/office/word/2016/wordml/cid" xmlns:w16="http://schemas.microsoft.com/office/word/2018/wordml" xmlns:w16du="http://schemas.microsoft.com/office/word/2023/wordml/word16du" xmlns:w16sdtdh="http://schemas.microsoft.com/office/word/2020/wordml/sdtdatahash" xmlns:w16sdtfl="http://schemas.microsoft.com/office/word/2024/wordml/sdtformatlock" xmlns:w16se="http://schemas.microsoft.com/office/word/2015/wordml/symex" xmlns:wpg="http://schemas.microsoft.com/office/word/2010/wordprocessingGroup" xmlns:wpi="http://schemas.microsoft.com/office/word/2010/wordprocessingInk" xmlns:wne="http://schemas.microsoft.com/office/word/2006/wordml" xmlns:wps="http://schemas.microsoft.com/office/word/2010/wordprocessingShape" mc:Ignorable="w14 w15 w16se w16cid w16 w16cex w16sdtdh w16sdtfl w16du wp14">
-  <w:p>
-    <w:pPr>
-      <w:pStyle w:val="Header"/>
-    </w:pPr>
-  </w:p>
-</w:hdr>
 </file>
 
 <file path=word/styles.xml><?xml version="1.0" encoding="utf-8"?>
@@ -3753,7 +3985,7 @@
     <w:link w:val="Heading1Char"/>
     <w:uiPriority w:val="9"/>
     <w:qFormat/>
-    <w:rsid w:val="00B51F97"/>
+    <w:rsid w:val="00FE06B5"/>
     <w:pPr>
       <w:keepNext/>
       <w:keepLines/>
@@ -3776,7 +4008,7 @@
     <w:semiHidden/>
     <w:unhideWhenUsed/>
     <w:qFormat/>
-    <w:rsid w:val="00B51F97"/>
+    <w:rsid w:val="00FE06B5"/>
     <w:pPr>
       <w:keepNext/>
       <w:keepLines/>
@@ -3799,7 +4031,7 @@
     <w:semiHidden/>
     <w:unhideWhenUsed/>
     <w:qFormat/>
-    <w:rsid w:val="00B51F97"/>
+    <w:rsid w:val="00FE06B5"/>
     <w:pPr>
       <w:keepNext/>
       <w:keepLines/>
@@ -3822,7 +4054,7 @@
     <w:semiHidden/>
     <w:unhideWhenUsed/>
     <w:qFormat/>
-    <w:rsid w:val="00B51F97"/>
+    <w:rsid w:val="00FE06B5"/>
     <w:pPr>
       <w:keepNext/>
       <w:keepLines/>
@@ -3845,7 +4077,7 @@
     <w:semiHidden/>
     <w:unhideWhenUsed/>
     <w:qFormat/>
-    <w:rsid w:val="00B51F97"/>
+    <w:rsid w:val="00FE06B5"/>
     <w:pPr>
       <w:keepNext/>
       <w:keepLines/>
@@ -3866,7 +4098,7 @@
     <w:semiHidden/>
     <w:unhideWhenUsed/>
     <w:qFormat/>
-    <w:rsid w:val="00B51F97"/>
+    <w:rsid w:val="00FE06B5"/>
     <w:pPr>
       <w:keepNext/>
       <w:keepLines/>
@@ -3889,7 +4121,7 @@
     <w:semiHidden/>
     <w:unhideWhenUsed/>
     <w:qFormat/>
-    <w:rsid w:val="00B51F97"/>
+    <w:rsid w:val="00FE06B5"/>
     <w:pPr>
       <w:keepNext/>
       <w:keepLines/>
@@ -3910,7 +4142,7 @@
     <w:semiHidden/>
     <w:unhideWhenUsed/>
     <w:qFormat/>
-    <w:rsid w:val="00B51F97"/>
+    <w:rsid w:val="00FE06B5"/>
     <w:pPr>
       <w:keepNext/>
       <w:keepLines/>
@@ -3933,7 +4165,7 @@
     <w:semiHidden/>
     <w:unhideWhenUsed/>
     <w:qFormat/>
-    <w:rsid w:val="00B51F97"/>
+    <w:rsid w:val="00FE06B5"/>
     <w:pPr>
       <w:keepNext/>
       <w:keepLines/>
@@ -3977,7 +4209,7 @@
     <w:basedOn w:val="DefaultParagraphFont"/>
     <w:link w:val="Heading1"/>
     <w:uiPriority w:val="9"/>
-    <w:rsid w:val="00B51F97"/>
+    <w:rsid w:val="00FE06B5"/>
     <w:rPr>
       <w:rFonts w:asciiTheme="majorHAnsi" w:eastAsiaTheme="majorEastAsia" w:hAnsiTheme="majorHAnsi" w:cstheme="majorBidi"/>
       <w:color w:val="0F4761" w:themeColor="accent1" w:themeShade="BF"/>
@@ -3991,7 +4223,7 @@
     <w:link w:val="Heading2"/>
     <w:uiPriority w:val="9"/>
     <w:semiHidden/>
-    <w:rsid w:val="00B51F97"/>
+    <w:rsid w:val="00FE06B5"/>
     <w:rPr>
       <w:rFonts w:asciiTheme="majorHAnsi" w:eastAsiaTheme="majorEastAsia" w:hAnsiTheme="majorHAnsi" w:cstheme="majorBidi"/>
       <w:color w:val="0F4761" w:themeColor="accent1" w:themeShade="BF"/>
@@ -4005,7 +4237,7 @@
     <w:link w:val="Heading3"/>
     <w:uiPriority w:val="9"/>
     <w:semiHidden/>
-    <w:rsid w:val="00B51F97"/>
+    <w:rsid w:val="00FE06B5"/>
     <w:rPr>
       <w:rFonts w:asciiTheme="minorHAnsi" w:eastAsiaTheme="majorEastAsia" w:hAnsiTheme="minorHAnsi" w:cstheme="majorBidi"/>
       <w:color w:val="0F4761" w:themeColor="accent1" w:themeShade="BF"/>
@@ -4019,7 +4251,7 @@
     <w:link w:val="Heading4"/>
     <w:uiPriority w:val="9"/>
     <w:semiHidden/>
-    <w:rsid w:val="00B51F97"/>
+    <w:rsid w:val="00FE06B5"/>
     <w:rPr>
       <w:rFonts w:asciiTheme="minorHAnsi" w:eastAsiaTheme="majorEastAsia" w:hAnsiTheme="minorHAnsi" w:cstheme="majorBidi"/>
       <w:i/>
@@ -4033,7 +4265,7 @@
     <w:link w:val="Heading5"/>
     <w:uiPriority w:val="9"/>
     <w:semiHidden/>
-    <w:rsid w:val="00B51F97"/>
+    <w:rsid w:val="00FE06B5"/>
     <w:rPr>
       <w:rFonts w:asciiTheme="minorHAnsi" w:eastAsiaTheme="majorEastAsia" w:hAnsiTheme="minorHAnsi" w:cstheme="majorBidi"/>
       <w:color w:val="0F4761" w:themeColor="accent1" w:themeShade="BF"/>
@@ -4045,7 +4277,7 @@
     <w:link w:val="Heading6"/>
     <w:uiPriority w:val="9"/>
     <w:semiHidden/>
-    <w:rsid w:val="00B51F97"/>
+    <w:rsid w:val="00FE06B5"/>
     <w:rPr>
       <w:rFonts w:asciiTheme="minorHAnsi" w:eastAsiaTheme="majorEastAsia" w:hAnsiTheme="minorHAnsi" w:cstheme="majorBidi"/>
       <w:i/>
@@ -4059,7 +4291,7 @@
     <w:link w:val="Heading7"/>
     <w:uiPriority w:val="9"/>
     <w:semiHidden/>
-    <w:rsid w:val="00B51F97"/>
+    <w:rsid w:val="00FE06B5"/>
     <w:rPr>
       <w:rFonts w:asciiTheme="minorHAnsi" w:eastAsiaTheme="majorEastAsia" w:hAnsiTheme="minorHAnsi" w:cstheme="majorBidi"/>
       <w:color w:val="595959" w:themeColor="text1" w:themeTint="A6"/>
@@ -4071,7 +4303,7 @@
     <w:link w:val="Heading8"/>
     <w:uiPriority w:val="9"/>
     <w:semiHidden/>
-    <w:rsid w:val="00B51F97"/>
+    <w:rsid w:val="00FE06B5"/>
     <w:rPr>
       <w:rFonts w:asciiTheme="minorHAnsi" w:eastAsiaTheme="majorEastAsia" w:hAnsiTheme="minorHAnsi" w:cstheme="majorBidi"/>
       <w:i/>
@@ -4085,7 +4317,7 @@
     <w:link w:val="Heading9"/>
     <w:uiPriority w:val="9"/>
     <w:semiHidden/>
-    <w:rsid w:val="00B51F97"/>
+    <w:rsid w:val="00FE06B5"/>
     <w:rPr>
       <w:rFonts w:asciiTheme="minorHAnsi" w:eastAsiaTheme="majorEastAsia" w:hAnsiTheme="minorHAnsi" w:cstheme="majorBidi"/>
       <w:color w:val="272727" w:themeColor="text1" w:themeTint="D8"/>
@@ -4098,7 +4330,7 @@
     <w:link w:val="TitleChar"/>
     <w:uiPriority w:val="10"/>
     <w:qFormat/>
-    <w:rsid w:val="00B51F97"/>
+    <w:rsid w:val="00FE06B5"/>
     <w:pPr>
       <w:spacing w:after="80" w:line="240" w:lineRule="auto"/>
       <w:contextualSpacing/>
@@ -4116,7 +4348,7 @@
     <w:basedOn w:val="DefaultParagraphFont"/>
     <w:link w:val="Title"/>
     <w:uiPriority w:val="10"/>
-    <w:rsid w:val="00B51F97"/>
+    <w:rsid w:val="00FE06B5"/>
     <w:rPr>
       <w:rFonts w:asciiTheme="majorHAnsi" w:eastAsiaTheme="majorEastAsia" w:hAnsiTheme="majorHAnsi" w:cstheme="majorBidi"/>
       <w:spacing w:val="-10"/>
@@ -4132,7 +4364,7 @@
     <w:link w:val="SubtitleChar"/>
     <w:uiPriority w:val="11"/>
     <w:qFormat/>
-    <w:rsid w:val="00B51F97"/>
+    <w:rsid w:val="00FE06B5"/>
     <w:pPr>
       <w:numPr>
         <w:ilvl w:val="1"/>
@@ -4151,7 +4383,7 @@
     <w:basedOn w:val="DefaultParagraphFont"/>
     <w:link w:val="Subtitle"/>
     <w:uiPriority w:val="11"/>
-    <w:rsid w:val="00B51F97"/>
+    <w:rsid w:val="00FE06B5"/>
     <w:rPr>
       <w:rFonts w:asciiTheme="minorHAnsi" w:eastAsiaTheme="majorEastAsia" w:hAnsiTheme="minorHAnsi" w:cstheme="majorBidi"/>
       <w:color w:val="595959" w:themeColor="text1" w:themeTint="A6"/>
@@ -4167,7 +4399,7 @@
     <w:link w:val="QuoteChar"/>
     <w:uiPriority w:val="29"/>
     <w:qFormat/>
-    <w:rsid w:val="00B51F97"/>
+    <w:rsid w:val="00FE06B5"/>
     <w:pPr>
       <w:spacing w:before="160"/>
       <w:jc w:val="center"/>
@@ -4183,7 +4415,7 @@
     <w:basedOn w:val="DefaultParagraphFont"/>
     <w:link w:val="Quote"/>
     <w:uiPriority w:val="29"/>
-    <w:rsid w:val="00B51F97"/>
+    <w:rsid w:val="00FE06B5"/>
     <w:rPr>
       <w:i/>
       <w:iCs/>
@@ -4195,7 +4427,7 @@
     <w:basedOn w:val="Normal"/>
     <w:uiPriority w:val="34"/>
     <w:qFormat/>
-    <w:rsid w:val="00B51F97"/>
+    <w:rsid w:val="00FE06B5"/>
     <w:pPr>
       <w:ind w:left="720"/>
       <w:contextualSpacing/>
@@ -4206,7 +4438,7 @@
     <w:basedOn w:val="DefaultParagraphFont"/>
     <w:uiPriority w:val="21"/>
     <w:qFormat/>
-    <w:rsid w:val="00B51F97"/>
+    <w:rsid w:val="00FE06B5"/>
     <w:rPr>
       <w:i/>
       <w:iCs/>
@@ -4220,7 +4452,7 @@
     <w:link w:val="IntenseQuoteChar"/>
     <w:uiPriority w:val="30"/>
     <w:qFormat/>
-    <w:rsid w:val="00B51F97"/>
+    <w:rsid w:val="00FE06B5"/>
     <w:pPr>
       <w:pBdr>
         <w:top w:val="single" w:sz="4" w:space="10" w:color="0F4761" w:themeColor="accent1" w:themeShade="BF"/>
@@ -4241,7 +4473,7 @@
     <w:basedOn w:val="DefaultParagraphFont"/>
     <w:link w:val="IntenseQuote"/>
     <w:uiPriority w:val="30"/>
-    <w:rsid w:val="00B51F97"/>
+    <w:rsid w:val="00FE06B5"/>
     <w:rPr>
       <w:i/>
       <w:iCs/>
@@ -4253,7 +4485,7 @@
     <w:basedOn w:val="DefaultParagraphFont"/>
     <w:uiPriority w:val="32"/>
     <w:qFormat/>
-    <w:rsid w:val="00B51F97"/>
+    <w:rsid w:val="00FE06B5"/>
     <w:rPr>
       <w:b/>
       <w:bCs/>
@@ -4268,7 +4500,7 @@
     <w:link w:val="HeaderChar"/>
     <w:uiPriority w:val="99"/>
     <w:unhideWhenUsed/>
-    <w:rsid w:val="00B51F97"/>
+    <w:rsid w:val="00FE06B5"/>
     <w:pPr>
       <w:tabs>
         <w:tab w:val="center" w:pos="4680"/>
@@ -4282,7 +4514,7 @@
     <w:basedOn w:val="DefaultParagraphFont"/>
     <w:link w:val="Header"/>
     <w:uiPriority w:val="99"/>
-    <w:rsid w:val="00B51F97"/>
+    <w:rsid w:val="00FE06B5"/>
   </w:style>
   <w:style w:type="paragraph" w:styleId="Footer">
     <w:name w:val="footer"/>
@@ -4290,7 +4522,7 @@
     <w:link w:val="FooterChar"/>
     <w:uiPriority w:val="99"/>
     <w:unhideWhenUsed/>
-    <w:rsid w:val="00B51F97"/>
+    <w:rsid w:val="00FE06B5"/>
     <w:pPr>
       <w:tabs>
         <w:tab w:val="center" w:pos="4680"/>
@@ -4304,7 +4536,7 @@
     <w:basedOn w:val="DefaultParagraphFont"/>
     <w:link w:val="Footer"/>
     <w:uiPriority w:val="99"/>
-    <w:rsid w:val="00B51F97"/>
+    <w:rsid w:val="00FE06B5"/>
   </w:style>
 </w:styles>
 </file>

</xml_diff>

<commit_message>
feat: enable native Word Heading styles for Navigation Pane outline, live ScrollIntoView auto-scrolling, and eliminate extra empty lines after tables
</commit_message>
<xml_diff>
--- a/output/uln_document.docx
+++ b/output/uln_document.docx
@@ -33,6 +33,729 @@
           <w:sz w:val="24"/>
         </w:rPr>
         <w:t>I.  Choose the word whose underlined part is pronounced differently from the others.</w:t>
+      </w:r>
+    </w:p>
+    <w:p>
+      <w:pPr>
+        <w:tabs>
+          <w:tab w:val="left" w:pos="2339"/>
+          <w:tab w:val="left" w:pos="4677"/>
+          <w:tab w:val="left" w:pos="7016"/>
+        </w:tabs>
+        <w:spacing w:before="80" w:after="60"/>
+        <w:rPr>
+          <w:sz w:val="24"/>
+        </w:rPr>
+      </w:pPr>
+      <w:r>
+        <w:rPr>
+          <w:sz w:val="24"/>
+        </w:rPr>
+        <w:t xml:space="preserve">1. </w:t>
+      </w:r>
+      <w:r>
+        <w:rPr>
+          <w:b/>
+          <w:sz w:val="24"/>
+        </w:rPr>
+        <w:t xml:space="preserve">A. </w:t>
+      </w:r>
+      <w:r>
+        <w:rPr>
+          <w:sz w:val="24"/>
+        </w:rPr>
+        <w:t xml:space="preserve"> e</w:t>
+      </w:r>
+      <w:r>
+        <w:rPr>
+          <w:sz w:val="24"/>
+          <w:u w:val="single"/>
+        </w:rPr>
+        <w:t>x</w:t>
+      </w:r>
+      <w:r>
+        <w:rPr>
+          <w:sz w:val="24"/>
+        </w:rPr>
+        <w:t>citing</w:t>
+      </w:r>
+      <w:r>
+        <w:rPr>
+          <w:sz w:val="24"/>
+        </w:rPr>
+        <w:tab/>
+      </w:r>
+      <w:r>
+        <w:rPr>
+          <w:b/>
+          <w:sz w:val="24"/>
+        </w:rPr>
+        <w:t xml:space="preserve">B. </w:t>
+      </w:r>
+      <w:r>
+        <w:rPr>
+          <w:sz w:val="24"/>
+        </w:rPr>
+        <w:t xml:space="preserve"> e</w:t>
+      </w:r>
+      <w:r>
+        <w:rPr>
+          <w:sz w:val="24"/>
+          <w:u w:val="single"/>
+        </w:rPr>
+        <w:t>x</w:t>
+      </w:r>
+      <w:r>
+        <w:rPr>
+          <w:sz w:val="24"/>
+        </w:rPr>
+        <w:t>cellent</w:t>
+      </w:r>
+      <w:r>
+        <w:rPr>
+          <w:sz w:val="24"/>
+        </w:rPr>
+        <w:tab/>
+      </w:r>
+      <w:r>
+        <w:rPr>
+          <w:b/>
+          <w:sz w:val="24"/>
+        </w:rPr>
+        <w:t xml:space="preserve">C. </w:t>
+      </w:r>
+      <w:r>
+        <w:rPr>
+          <w:sz w:val="24"/>
+        </w:rPr>
+        <w:t xml:space="preserve"> e</w:t>
+      </w:r>
+      <w:r>
+        <w:rPr>
+          <w:sz w:val="24"/>
+          <w:u w:val="single"/>
+        </w:rPr>
+        <w:t>x</w:t>
+      </w:r>
+      <w:r>
+        <w:rPr>
+          <w:sz w:val="24"/>
+        </w:rPr>
+        <w:t>perience</w:t>
+      </w:r>
+      <w:r>
+        <w:rPr>
+          <w:sz w:val="24"/>
+        </w:rPr>
+        <w:tab/>
+      </w:r>
+      <w:r>
+        <w:rPr>
+          <w:b/>
+          <w:sz w:val="24"/>
+        </w:rPr>
+        <w:t xml:space="preserve">D. </w:t>
+      </w:r>
+      <w:r>
+        <w:rPr>
+          <w:sz w:val="24"/>
+        </w:rPr>
+        <w:t xml:space="preserve"> e</w:t>
+      </w:r>
+      <w:r>
+        <w:rPr>
+          <w:sz w:val="24"/>
+          <w:u w:val="single"/>
+        </w:rPr>
+        <w:t>x</w:t>
+      </w:r>
+      <w:r>
+        <w:rPr>
+          <w:sz w:val="24"/>
+        </w:rPr>
+        <w:t>pensive</w:t>
+      </w:r>
+    </w:p>
+    <w:p>
+      <w:pPr>
+        <w:tabs>
+          <w:tab w:val="left" w:pos="2339"/>
+          <w:tab w:val="left" w:pos="4677"/>
+          <w:tab w:val="left" w:pos="7016"/>
+        </w:tabs>
+        <w:spacing w:before="80" w:after="60"/>
+        <w:rPr>
+          <w:sz w:val="24"/>
+        </w:rPr>
+      </w:pPr>
+      <w:r>
+        <w:rPr>
+          <w:sz w:val="24"/>
+        </w:rPr>
+        <w:t xml:space="preserve">2. </w:t>
+      </w:r>
+      <w:r>
+        <w:rPr>
+          <w:b/>
+          <w:sz w:val="24"/>
+        </w:rPr>
+        <w:t xml:space="preserve">A. </w:t>
+      </w:r>
+      <w:r>
+        <w:rPr>
+          <w:sz w:val="24"/>
+        </w:rPr>
+        <w:t xml:space="preserve"> hobb</w:t>
+      </w:r>
+      <w:r>
+        <w:rPr>
+          <w:sz w:val="24"/>
+          <w:u w:val="single"/>
+        </w:rPr>
+        <w:t>y</w:t>
+      </w:r>
+      <w:r>
+        <w:rPr>
+          <w:sz w:val="24"/>
+        </w:rPr>
+        <w:tab/>
+      </w:r>
+      <w:r>
+        <w:rPr>
+          <w:b/>
+          <w:sz w:val="24"/>
+        </w:rPr>
+        <w:t xml:space="preserve">B. </w:t>
+      </w:r>
+      <w:r>
+        <w:rPr>
+          <w:sz w:val="24"/>
+        </w:rPr>
+        <w:t xml:space="preserve"> c</w:t>
+      </w:r>
+      <w:r>
+        <w:rPr>
+          <w:sz w:val="24"/>
+          <w:u w:val="single"/>
+        </w:rPr>
+        <w:t>y</w:t>
+      </w:r>
+      <w:r>
+        <w:rPr>
+          <w:sz w:val="24"/>
+        </w:rPr>
+        <w:t>cle</w:t>
+      </w:r>
+      <w:r>
+        <w:rPr>
+          <w:sz w:val="24"/>
+        </w:rPr>
+        <w:tab/>
+      </w:r>
+      <w:r>
+        <w:rPr>
+          <w:b/>
+          <w:sz w:val="24"/>
+        </w:rPr>
+        <w:t xml:space="preserve">C. </w:t>
+      </w:r>
+      <w:r>
+        <w:rPr>
+          <w:sz w:val="24"/>
+        </w:rPr>
+        <w:t xml:space="preserve"> b</w:t>
+      </w:r>
+      <w:r>
+        <w:rPr>
+          <w:sz w:val="24"/>
+          <w:u w:val="single"/>
+        </w:rPr>
+        <w:t>y</w:t>
+      </w:r>
+      <w:r>
+        <w:rPr>
+          <w:sz w:val="24"/>
+        </w:rPr>
+        <w:t>e</w:t>
+      </w:r>
+      <w:r>
+        <w:rPr>
+          <w:sz w:val="24"/>
+        </w:rPr>
+        <w:tab/>
+      </w:r>
+      <w:r>
+        <w:rPr>
+          <w:b/>
+          <w:sz w:val="24"/>
+        </w:rPr>
+        <w:t xml:space="preserve">D. </w:t>
+      </w:r>
+      <w:r>
+        <w:rPr>
+          <w:sz w:val="24"/>
+        </w:rPr>
+        <w:t xml:space="preserve"> wh</w:t>
+      </w:r>
+      <w:r>
+        <w:rPr>
+          <w:sz w:val="24"/>
+          <w:u w:val="single"/>
+        </w:rPr>
+        <w:t>y</w:t>
+      </w:r>
+    </w:p>
+    <w:p>
+      <w:pPr>
+        <w:tabs>
+          <w:tab w:val="left" w:pos="2339"/>
+          <w:tab w:val="left" w:pos="4677"/>
+          <w:tab w:val="left" w:pos="7016"/>
+        </w:tabs>
+        <w:spacing w:before="80" w:after="60"/>
+        <w:rPr>
+          <w:sz w:val="24"/>
+        </w:rPr>
+      </w:pPr>
+      <w:r>
+        <w:rPr>
+          <w:sz w:val="24"/>
+        </w:rPr>
+        <w:t xml:space="preserve">3. </w:t>
+      </w:r>
+      <w:r>
+        <w:rPr>
+          <w:b/>
+          <w:sz w:val="24"/>
+        </w:rPr>
+        <w:t xml:space="preserve">A. </w:t>
+      </w:r>
+      <w:r>
+        <w:rPr>
+          <w:sz w:val="24"/>
+        </w:rPr>
+        <w:t xml:space="preserve"> p</w:t>
+      </w:r>
+      <w:r>
+        <w:rPr>
+          <w:sz w:val="24"/>
+          <w:u w:val="single"/>
+        </w:rPr>
+        <w:t>o</w:t>
+      </w:r>
+      <w:r>
+        <w:rPr>
+          <w:sz w:val="24"/>
+        </w:rPr>
+        <w:t>ttery</w:t>
+      </w:r>
+      <w:r>
+        <w:rPr>
+          <w:sz w:val="24"/>
+        </w:rPr>
+        <w:tab/>
+      </w:r>
+      <w:r>
+        <w:rPr>
+          <w:b/>
+          <w:sz w:val="24"/>
+        </w:rPr>
+        <w:t xml:space="preserve">B. </w:t>
+      </w:r>
+      <w:r>
+        <w:rPr>
+          <w:sz w:val="24"/>
+        </w:rPr>
+        <w:t xml:space="preserve"> c</w:t>
+      </w:r>
+      <w:r>
+        <w:rPr>
+          <w:sz w:val="24"/>
+          <w:u w:val="single"/>
+        </w:rPr>
+        <w:t>o</w:t>
+      </w:r>
+      <w:r>
+        <w:rPr>
+          <w:sz w:val="24"/>
+        </w:rPr>
+        <w:t>llect</w:t>
+      </w:r>
+      <w:r>
+        <w:rPr>
+          <w:sz w:val="24"/>
+        </w:rPr>
+        <w:tab/>
+      </w:r>
+      <w:r>
+        <w:rPr>
+          <w:b/>
+          <w:sz w:val="24"/>
+        </w:rPr>
+        <w:t xml:space="preserve">C. </w:t>
+      </w:r>
+      <w:r>
+        <w:rPr>
+          <w:sz w:val="24"/>
+        </w:rPr>
+        <w:t xml:space="preserve"> mel</w:t>
+      </w:r>
+      <w:r>
+        <w:rPr>
+          <w:sz w:val="24"/>
+          <w:u w:val="single"/>
+        </w:rPr>
+        <w:t>o</w:t>
+      </w:r>
+      <w:r>
+        <w:rPr>
+          <w:sz w:val="24"/>
+        </w:rPr>
+        <w:t>dy</w:t>
+      </w:r>
+      <w:r>
+        <w:rPr>
+          <w:sz w:val="24"/>
+        </w:rPr>
+        <w:tab/>
+      </w:r>
+      <w:r>
+        <w:rPr>
+          <w:b/>
+          <w:sz w:val="24"/>
+        </w:rPr>
+        <w:t xml:space="preserve">D. </w:t>
+      </w:r>
+      <w:r>
+        <w:rPr>
+          <w:sz w:val="24"/>
+        </w:rPr>
+        <w:t xml:space="preserve"> m</w:t>
+      </w:r>
+      <w:r>
+        <w:rPr>
+          <w:sz w:val="24"/>
+          <w:u w:val="single"/>
+        </w:rPr>
+        <w:t>o</w:t>
+      </w:r>
+      <w:r>
+        <w:rPr>
+          <w:sz w:val="24"/>
+        </w:rPr>
+        <w:t>nopoly</w:t>
+      </w:r>
+    </w:p>
+    <w:p>
+      <w:pPr>
+        <w:tabs>
+          <w:tab w:val="left" w:pos="2339"/>
+          <w:tab w:val="left" w:pos="4677"/>
+          <w:tab w:val="left" w:pos="7016"/>
+        </w:tabs>
+        <w:spacing w:before="80" w:after="60"/>
+        <w:rPr>
+          <w:sz w:val="24"/>
+        </w:rPr>
+      </w:pPr>
+      <w:r>
+        <w:rPr>
+          <w:sz w:val="24"/>
+        </w:rPr>
+        <w:t xml:space="preserve">4. </w:t>
+      </w:r>
+      <w:r>
+        <w:rPr>
+          <w:b/>
+          <w:sz w:val="24"/>
+        </w:rPr>
+        <w:t xml:space="preserve">A. </w:t>
+      </w:r>
+      <w:r>
+        <w:rPr>
+          <w:sz w:val="24"/>
+        </w:rPr>
+        <w:t xml:space="preserve"> h</w:t>
+      </w:r>
+      <w:r>
+        <w:rPr>
+          <w:sz w:val="24"/>
+          <w:u w:val="single"/>
+        </w:rPr>
+        <w:t>ea</w:t>
+      </w:r>
+      <w:r>
+        <w:rPr>
+          <w:sz w:val="24"/>
+        </w:rPr>
+        <w:t>rd</w:t>
+      </w:r>
+      <w:r>
+        <w:rPr>
+          <w:sz w:val="24"/>
+        </w:rPr>
+        <w:tab/>
+      </w:r>
+      <w:r>
+        <w:rPr>
+          <w:b/>
+          <w:sz w:val="24"/>
+        </w:rPr>
+        <w:t xml:space="preserve">B. </w:t>
+      </w:r>
+      <w:r>
+        <w:rPr>
+          <w:sz w:val="24"/>
+        </w:rPr>
+        <w:t xml:space="preserve"> b</w:t>
+      </w:r>
+      <w:r>
+        <w:rPr>
+          <w:sz w:val="24"/>
+          <w:u w:val="single"/>
+        </w:rPr>
+        <w:t>i</w:t>
+      </w:r>
+      <w:r>
+        <w:rPr>
+          <w:sz w:val="24"/>
+        </w:rPr>
+        <w:t>rd</w:t>
+      </w:r>
+      <w:r>
+        <w:rPr>
+          <w:sz w:val="24"/>
+        </w:rPr>
+        <w:tab/>
+      </w:r>
+      <w:r>
+        <w:rPr>
+          <w:b/>
+          <w:sz w:val="24"/>
+        </w:rPr>
+        <w:t xml:space="preserve">C. </w:t>
+      </w:r>
+      <w:r>
+        <w:rPr>
+          <w:sz w:val="24"/>
+        </w:rPr>
+        <w:t xml:space="preserve"> w</w:t>
+      </w:r>
+      <w:r>
+        <w:rPr>
+          <w:sz w:val="24"/>
+          <w:u w:val="single"/>
+        </w:rPr>
+        <w:t>o</w:t>
+      </w:r>
+      <w:r>
+        <w:rPr>
+          <w:sz w:val="24"/>
+        </w:rPr>
+        <w:t>rld</w:t>
+      </w:r>
+      <w:r>
+        <w:rPr>
+          <w:sz w:val="24"/>
+        </w:rPr>
+        <w:tab/>
+      </w:r>
+      <w:r>
+        <w:rPr>
+          <w:b/>
+          <w:sz w:val="24"/>
+        </w:rPr>
+        <w:t xml:space="preserve">D. </w:t>
+      </w:r>
+      <w:r>
+        <w:rPr>
+          <w:sz w:val="24"/>
+        </w:rPr>
+        <w:t xml:space="preserve"> pict</w:t>
+      </w:r>
+      <w:r>
+        <w:rPr>
+          <w:sz w:val="24"/>
+          <w:u w:val="single"/>
+        </w:rPr>
+        <w:t>u</w:t>
+      </w:r>
+      <w:r>
+        <w:rPr>
+          <w:sz w:val="24"/>
+        </w:rPr>
+        <w:t>re</w:t>
+      </w:r>
+    </w:p>
+    <w:p>
+      <w:pPr>
+        <w:tabs>
+          <w:tab w:val="left" w:pos="2339"/>
+          <w:tab w:val="left" w:pos="4677"/>
+          <w:tab w:val="left" w:pos="7016"/>
+        </w:tabs>
+        <w:spacing w:before="80" w:after="60"/>
+        <w:rPr>
+          <w:sz w:val="24"/>
+        </w:rPr>
+      </w:pPr>
+      <w:r>
+        <w:rPr>
+          <w:sz w:val="24"/>
+        </w:rPr>
+        <w:t xml:space="preserve">5. </w:t>
+      </w:r>
+      <w:r>
+        <w:rPr>
+          <w:b/>
+          <w:sz w:val="24"/>
+        </w:rPr>
+        <w:t xml:space="preserve">A. </w:t>
+      </w:r>
+      <w:r>
+        <w:rPr>
+          <w:sz w:val="24"/>
+        </w:rPr>
+        <w:t xml:space="preserve"> bird-wat</w:t>
+      </w:r>
+      <w:r>
+        <w:rPr>
+          <w:sz w:val="24"/>
+          <w:u w:val="single"/>
+        </w:rPr>
+        <w:t>ch</w:t>
+      </w:r>
+      <w:r>
+        <w:rPr>
+          <w:sz w:val="24"/>
+        </w:rPr>
+        <w:t>ing</w:t>
+      </w:r>
+      <w:r>
+        <w:rPr>
+          <w:sz w:val="24"/>
+        </w:rPr>
+        <w:tab/>
+      </w:r>
+      <w:r>
+        <w:rPr>
+          <w:b/>
+          <w:sz w:val="24"/>
+        </w:rPr>
+        <w:t xml:space="preserve">B. </w:t>
+      </w:r>
+      <w:r>
+        <w:rPr>
+          <w:sz w:val="24"/>
+        </w:rPr>
+        <w:t xml:space="preserve"> </w:t>
+      </w:r>
+      <w:r>
+        <w:rPr>
+          <w:sz w:val="24"/>
+          <w:u w:val="single"/>
+        </w:rPr>
+        <w:t>ch</w:t>
+      </w:r>
+      <w:r>
+        <w:rPr>
+          <w:sz w:val="24"/>
+        </w:rPr>
+        <w:t>ildren</w:t>
+      </w:r>
+      <w:r>
+        <w:rPr>
+          <w:sz w:val="24"/>
+        </w:rPr>
+        <w:tab/>
+      </w:r>
+      <w:r>
+        <w:rPr>
+          <w:b/>
+          <w:sz w:val="24"/>
+        </w:rPr>
+        <w:t xml:space="preserve">C. </w:t>
+      </w:r>
+      <w:r>
+        <w:rPr>
+          <w:sz w:val="24"/>
+        </w:rPr>
+        <w:t xml:space="preserve"> s</w:t>
+      </w:r>
+      <w:r>
+        <w:rPr>
+          <w:sz w:val="24"/>
+          <w:u w:val="single"/>
+        </w:rPr>
+        <w:t>ch</w:t>
+      </w:r>
+      <w:r>
+        <w:rPr>
+          <w:sz w:val="24"/>
+        </w:rPr>
+        <w:t>ool</w:t>
+      </w:r>
+      <w:r>
+        <w:rPr>
+          <w:sz w:val="24"/>
+        </w:rPr>
+        <w:tab/>
+      </w:r>
+      <w:r>
+        <w:rPr>
+          <w:b/>
+          <w:sz w:val="24"/>
+        </w:rPr>
+        <w:t xml:space="preserve">D. </w:t>
+      </w:r>
+      <w:r>
+        <w:rPr>
+          <w:sz w:val="24"/>
+        </w:rPr>
+        <w:t xml:space="preserve"> </w:t>
+      </w:r>
+      <w:r>
+        <w:rPr>
+          <w:sz w:val="24"/>
+          <w:u w:val="single"/>
+        </w:rPr>
+        <w:t>ch</w:t>
+      </w:r>
+      <w:r>
+        <w:rPr>
+          <w:sz w:val="24"/>
+        </w:rPr>
+        <w:t>allenge</w:t>
+      </w:r>
+    </w:p>
+    <w:p>
+      <w:pPr>
+        <w:spacing w:before="120" w:after="80"/>
+        <w:rPr>
+          <w:b/>
+          <w:sz w:val="24"/>
+        </w:rPr>
+      </w:pPr>
+      <w:r>
+        <w:rPr>
+          <w:b/>
+          <w:sz w:val="24"/>
+        </w:rPr>
+        <w:t>III. Choose the best answer a, b, c, or d to complete the sentence.</w:t>
+      </w:r>
+    </w:p>
+    <w:p>
+      <w:pPr>
+        <w:spacing w:before="120" w:after="80"/>
+        <w:rPr>
+          <w:sz w:val="24"/>
+        </w:rPr>
+      </w:pPr>
+      <w:r>
+        <w:rPr>
+          <w:sz w:val="24"/>
+        </w:rPr>
+        <w:t>1. My father can make beautiful pieces of art ___________ empty eggshells.</w:t>
       </w:r>
     </w:p>
     <w:p>
@@ -50,12 +773,6 @@
       </w:pPr>
       <w:r>
         <w:rPr>
-          <w:sz w:val="24"/>
-        </w:rPr>
-        <w:t xml:space="preserve">1. </w:t>
-      </w:r>
-      <w:r>
-        <w:rPr>
           <w:b/>
           <w:sz w:val="24"/>
         </w:rPr>
@@ -65,20 +782,7 @@
         <w:rPr>
           <w:sz w:val="24"/>
         </w:rPr>
-        <w:t xml:space="preserve"> e</w:t>
-      </w:r>
-      <w:r>
-        <w:rPr>
-          <w:sz w:val="24"/>
-          <w:u w:val="single"/>
-        </w:rPr>
-        <w:t>x</w:t>
-      </w:r>
-      <w:r>
-        <w:rPr>
-          <w:sz w:val="24"/>
-        </w:rPr>
-        <w:t>citing</w:t>
+        <w:t xml:space="preserve"> of</w:t>
       </w:r>
       <w:r>
         <w:rPr>
@@ -97,20 +801,7 @@
         <w:rPr>
           <w:sz w:val="24"/>
         </w:rPr>
-        <w:t xml:space="preserve"> e</w:t>
-      </w:r>
-      <w:r>
-        <w:rPr>
-          <w:sz w:val="24"/>
-          <w:u w:val="single"/>
-        </w:rPr>
-        <w:t>x</w:t>
-      </w:r>
-      <w:r>
-        <w:rPr>
-          <w:sz w:val="24"/>
-        </w:rPr>
-        <w:t>cellent</w:t>
+        <w:t xml:space="preserve"> from</w:t>
       </w:r>
       <w:r>
         <w:rPr>
@@ -129,20 +820,7 @@
         <w:rPr>
           <w:sz w:val="24"/>
         </w:rPr>
-        <w:t xml:space="preserve"> e</w:t>
-      </w:r>
-      <w:r>
-        <w:rPr>
-          <w:sz w:val="24"/>
-          <w:u w:val="single"/>
-        </w:rPr>
-        <w:t>x</w:t>
-      </w:r>
-      <w:r>
-        <w:rPr>
-          <w:sz w:val="24"/>
-        </w:rPr>
-        <w:t>perience</w:t>
+        <w:t xml:space="preserve"> in</w:t>
       </w:r>
       <w:r>
         <w:rPr>
@@ -161,20 +839,21 @@
         <w:rPr>
           <w:sz w:val="24"/>
         </w:rPr>
-        <w:t xml:space="preserve"> e</w:t>
-      </w:r>
-      <w:r>
-        <w:rPr>
-          <w:sz w:val="24"/>
-          <w:u w:val="single"/>
-        </w:rPr>
-        <w:t>x</w:t>
-      </w:r>
-      <w:r>
-        <w:rPr>
-          <w:sz w:val="24"/>
-        </w:rPr>
-        <w:t>pensive</w:t>
+        <w:t xml:space="preserve"> into</w:t>
+      </w:r>
+    </w:p>
+    <w:p>
+      <w:pPr>
+        <w:spacing w:before="120" w:after="80"/>
+        <w:rPr>
+          <w:sz w:val="24"/>
+        </w:rPr>
+      </w:pPr>
+      <w:r>
+        <w:rPr>
+          <w:sz w:val="24"/>
+        </w:rPr>
+        <w:t>2. Why don't you take ___________ a new hobby?</w:t>
       </w:r>
     </w:p>
     <w:p>
@@ -192,12 +871,6 @@
       </w:pPr>
       <w:r>
         <w:rPr>
-          <w:sz w:val="24"/>
-        </w:rPr>
-        <w:t xml:space="preserve">2. </w:t>
-      </w:r>
-      <w:r>
-        <w:rPr>
           <w:b/>
           <w:sz w:val="24"/>
         </w:rPr>
@@ -207,14 +880,7 @@
         <w:rPr>
           <w:sz w:val="24"/>
         </w:rPr>
-        <w:t xml:space="preserve"> hobb</w:t>
-      </w:r>
-      <w:r>
-        <w:rPr>
-          <w:sz w:val="24"/>
-          <w:u w:val="single"/>
-        </w:rPr>
-        <w:t>y</w:t>
+        <w:t xml:space="preserve"> up</w:t>
       </w:r>
       <w:r>
         <w:rPr>
@@ -233,20 +899,7 @@
         <w:rPr>
           <w:sz w:val="24"/>
         </w:rPr>
-        <w:t xml:space="preserve"> c</w:t>
-      </w:r>
-      <w:r>
-        <w:rPr>
-          <w:sz w:val="24"/>
-          <w:u w:val="single"/>
-        </w:rPr>
-        <w:t>y</w:t>
-      </w:r>
-      <w:r>
-        <w:rPr>
-          <w:sz w:val="24"/>
-        </w:rPr>
-        <w:t>cle</w:t>
+        <w:t xml:space="preserve"> in</w:t>
       </w:r>
       <w:r>
         <w:rPr>
@@ -265,20 +918,7 @@
         <w:rPr>
           <w:sz w:val="24"/>
         </w:rPr>
-        <w:t xml:space="preserve"> b</w:t>
-      </w:r>
-      <w:r>
-        <w:rPr>
-          <w:sz w:val="24"/>
-          <w:u w:val="single"/>
-        </w:rPr>
-        <w:t>y</w:t>
-      </w:r>
-      <w:r>
-        <w:rPr>
-          <w:sz w:val="24"/>
-        </w:rPr>
-        <w:t>e</w:t>
+        <w:t xml:space="preserve"> over</w:t>
       </w:r>
       <w:r>
         <w:rPr>
@@ -297,14 +937,21 @@
         <w:rPr>
           <w:sz w:val="24"/>
         </w:rPr>
-        <w:t xml:space="preserve"> wh</w:t>
-      </w:r>
-      <w:r>
-        <w:rPr>
-          <w:sz w:val="24"/>
-          <w:u w:val="single"/>
-        </w:rPr>
-        <w:t>y</w:t>
+        <w:t xml:space="preserve"> after</w:t>
+      </w:r>
+    </w:p>
+    <w:p>
+      <w:pPr>
+        <w:spacing w:before="120" w:after="80"/>
+        <w:rPr>
+          <w:sz w:val="24"/>
+        </w:rPr>
+      </w:pPr>
+      <w:r>
+        <w:rPr>
+          <w:sz w:val="24"/>
+        </w:rPr>
+        <w:t>3. Collecting cars is a(n) ___________ hobby. It costs a lot of money.</w:t>
       </w:r>
     </w:p>
     <w:p>
@@ -322,12 +969,6 @@
       </w:pPr>
       <w:r>
         <w:rPr>
-          <w:sz w:val="24"/>
-        </w:rPr>
-        <w:t xml:space="preserve">3. </w:t>
-      </w:r>
-      <w:r>
-        <w:rPr>
           <w:b/>
           <w:sz w:val="24"/>
         </w:rPr>
@@ -337,20 +978,7 @@
         <w:rPr>
           <w:sz w:val="24"/>
         </w:rPr>
-        <w:t xml:space="preserve"> p</w:t>
-      </w:r>
-      <w:r>
-        <w:rPr>
-          <w:sz w:val="24"/>
-          <w:u w:val="single"/>
-        </w:rPr>
-        <w:t>o</w:t>
-      </w:r>
-      <w:r>
-        <w:rPr>
-          <w:sz w:val="24"/>
-        </w:rPr>
-        <w:t>ttery</w:t>
+        <w:t xml:space="preserve"> interesting</w:t>
       </w:r>
       <w:r>
         <w:rPr>
@@ -369,20 +997,7 @@
         <w:rPr>
           <w:sz w:val="24"/>
         </w:rPr>
-        <w:t xml:space="preserve"> c</w:t>
-      </w:r>
-      <w:r>
-        <w:rPr>
-          <w:sz w:val="24"/>
-          <w:u w:val="single"/>
-        </w:rPr>
-        <w:t>o</w:t>
-      </w:r>
-      <w:r>
-        <w:rPr>
-          <w:sz w:val="24"/>
-        </w:rPr>
-        <w:t>llect</w:t>
+        <w:t xml:space="preserve"> cheap</w:t>
       </w:r>
       <w:r>
         <w:rPr>
@@ -401,20 +1016,7 @@
         <w:rPr>
           <w:sz w:val="24"/>
         </w:rPr>
-        <w:t xml:space="preserve"> mel</w:t>
-      </w:r>
-      <w:r>
-        <w:rPr>
-          <w:sz w:val="24"/>
-          <w:u w:val="single"/>
-        </w:rPr>
-        <w:t>o</w:t>
-      </w:r>
-      <w:r>
-        <w:rPr>
-          <w:sz w:val="24"/>
-        </w:rPr>
-        <w:t>dy</w:t>
+        <w:t xml:space="preserve"> expensive</w:t>
       </w:r>
       <w:r>
         <w:rPr>
@@ -433,20 +1035,21 @@
         <w:rPr>
           <w:sz w:val="24"/>
         </w:rPr>
-        <w:t xml:space="preserve"> m</w:t>
-      </w:r>
-      <w:r>
-        <w:rPr>
-          <w:sz w:val="24"/>
-          <w:u w:val="single"/>
-        </w:rPr>
-        <w:t>o</w:t>
-      </w:r>
-      <w:r>
-        <w:rPr>
-          <w:sz w:val="24"/>
-        </w:rPr>
-        <w:t>nopoly</w:t>
+        <w:t xml:space="preserve"> unusual</w:t>
+      </w:r>
+    </w:p>
+    <w:p>
+      <w:pPr>
+        <w:spacing w:before="120" w:after="80"/>
+        <w:rPr>
+          <w:sz w:val="24"/>
+        </w:rPr>
+      </w:pPr>
+      <w:r>
+        <w:rPr>
+          <w:sz w:val="24"/>
+        </w:rPr>
+        <w:t>4. More people are ___________ birds today than ever before.</w:t>
       </w:r>
     </w:p>
     <w:p>
@@ -464,12 +1067,6 @@
       </w:pPr>
       <w:r>
         <w:rPr>
-          <w:sz w:val="24"/>
-        </w:rPr>
-        <w:t xml:space="preserve">4. </w:t>
-      </w:r>
-      <w:r>
-        <w:rPr>
           <w:b/>
           <w:sz w:val="24"/>
         </w:rPr>
@@ -479,20 +1076,7 @@
         <w:rPr>
           <w:sz w:val="24"/>
         </w:rPr>
-        <w:t xml:space="preserve"> h</w:t>
-      </w:r>
-      <w:r>
-        <w:rPr>
-          <w:sz w:val="24"/>
-          <w:u w:val="single"/>
-        </w:rPr>
-        <w:t>ea</w:t>
-      </w:r>
-      <w:r>
-        <w:rPr>
-          <w:sz w:val="24"/>
-        </w:rPr>
-        <w:t>rd</w:t>
+        <w:t xml:space="preserve"> seeing</w:t>
       </w:r>
       <w:r>
         <w:rPr>
@@ -511,20 +1095,7 @@
         <w:rPr>
           <w:sz w:val="24"/>
         </w:rPr>
-        <w:t xml:space="preserve"> b</w:t>
-      </w:r>
-      <w:r>
-        <w:rPr>
-          <w:sz w:val="24"/>
-          <w:u w:val="single"/>
-        </w:rPr>
-        <w:t>i</w:t>
-      </w:r>
-      <w:r>
-        <w:rPr>
-          <w:sz w:val="24"/>
-        </w:rPr>
-        <w:t>rd</w:t>
+        <w:t xml:space="preserve"> looking</w:t>
       </w:r>
       <w:r>
         <w:rPr>
@@ -543,20 +1114,7 @@
         <w:rPr>
           <w:sz w:val="24"/>
         </w:rPr>
-        <w:t xml:space="preserve"> w</w:t>
-      </w:r>
-      <w:r>
-        <w:rPr>
-          <w:sz w:val="24"/>
-          <w:u w:val="single"/>
-        </w:rPr>
-        <w:t>o</w:t>
-      </w:r>
-      <w:r>
-        <w:rPr>
-          <w:sz w:val="24"/>
-        </w:rPr>
-        <w:t>rld</w:t>
+        <w:t xml:space="preserve"> hearing</w:t>
       </w:r>
       <w:r>
         <w:rPr>
@@ -575,162 +1133,7 @@
         <w:rPr>
           <w:sz w:val="24"/>
         </w:rPr>
-        <w:t xml:space="preserve"> pict</w:t>
-      </w:r>
-      <w:r>
-        <w:rPr>
-          <w:sz w:val="24"/>
-          <w:u w:val="single"/>
-        </w:rPr>
-        <w:t>u</w:t>
-      </w:r>
-      <w:r>
-        <w:rPr>
-          <w:sz w:val="24"/>
-        </w:rPr>
-        <w:t>re</w:t>
-      </w:r>
-    </w:p>
-    <w:p>
-      <w:pPr>
-        <w:tabs>
-          <w:tab w:val="left" w:pos="2551"/>
-          <w:tab w:val="left" w:pos="4819"/>
-          <w:tab w:val="left" w:pos="7087"/>
-        </w:tabs>
-        <w:spacing w:before="80" w:after="60"/>
-        <w:ind w:left="283"/>
-        <w:rPr>
-          <w:sz w:val="24"/>
-        </w:rPr>
-      </w:pPr>
-      <w:r>
-        <w:rPr>
-          <w:sz w:val="24"/>
-        </w:rPr>
-        <w:t xml:space="preserve">5. </w:t>
-      </w:r>
-      <w:r>
-        <w:rPr>
-          <w:b/>
-          <w:sz w:val="24"/>
-        </w:rPr>
-        <w:t xml:space="preserve">A. </w:t>
-      </w:r>
-      <w:r>
-        <w:rPr>
-          <w:sz w:val="24"/>
-        </w:rPr>
-        <w:t xml:space="preserve"> bird-wat</w:t>
-      </w:r>
-      <w:r>
-        <w:rPr>
-          <w:sz w:val="24"/>
-          <w:u w:val="single"/>
-        </w:rPr>
-        <w:t>ch</w:t>
-      </w:r>
-      <w:r>
-        <w:rPr>
-          <w:sz w:val="24"/>
-        </w:rPr>
-        <w:t>ing</w:t>
-      </w:r>
-      <w:r>
-        <w:rPr>
-          <w:sz w:val="24"/>
-        </w:rPr>
-        <w:tab/>
-      </w:r>
-      <w:r>
-        <w:rPr>
-          <w:b/>
-          <w:sz w:val="24"/>
-        </w:rPr>
-        <w:t xml:space="preserve">B. </w:t>
-      </w:r>
-      <w:r>
-        <w:rPr>
-          <w:sz w:val="24"/>
-        </w:rPr>
-        <w:t xml:space="preserve"> </w:t>
-      </w:r>
-      <w:r>
-        <w:rPr>
-          <w:sz w:val="24"/>
-          <w:u w:val="single"/>
-        </w:rPr>
-        <w:t>ch</w:t>
-      </w:r>
-      <w:r>
-        <w:rPr>
-          <w:sz w:val="24"/>
-        </w:rPr>
-        <w:t>ildren</w:t>
-      </w:r>
-      <w:r>
-        <w:rPr>
-          <w:sz w:val="24"/>
-        </w:rPr>
-        <w:tab/>
-      </w:r>
-      <w:r>
-        <w:rPr>
-          <w:b/>
-          <w:sz w:val="24"/>
-        </w:rPr>
-        <w:t xml:space="preserve">C. </w:t>
-      </w:r>
-      <w:r>
-        <w:rPr>
-          <w:sz w:val="24"/>
-        </w:rPr>
-        <w:t xml:space="preserve"> s</w:t>
-      </w:r>
-      <w:r>
-        <w:rPr>
-          <w:sz w:val="24"/>
-          <w:u w:val="single"/>
-        </w:rPr>
-        <w:t>ch</w:t>
-      </w:r>
-      <w:r>
-        <w:rPr>
-          <w:sz w:val="24"/>
-        </w:rPr>
-        <w:t>ool</w:t>
-      </w:r>
-      <w:r>
-        <w:rPr>
-          <w:sz w:val="24"/>
-        </w:rPr>
-        <w:tab/>
-      </w:r>
-      <w:r>
-        <w:rPr>
-          <w:b/>
-          <w:sz w:val="24"/>
-        </w:rPr>
-        <w:t xml:space="preserve">D. </w:t>
-      </w:r>
-      <w:r>
-        <w:rPr>
-          <w:sz w:val="24"/>
-        </w:rPr>
-        <w:t xml:space="preserve"> </w:t>
-      </w:r>
-      <w:r>
-        <w:rPr>
-          <w:sz w:val="24"/>
-          <w:u w:val="single"/>
-        </w:rPr>
-        <w:t>ch</w:t>
-      </w:r>
-      <w:r>
-        <w:rPr>
-          <w:sz w:val="24"/>
-        </w:rPr>
-        <w:t>allenge</w:t>
+        <w:t xml:space="preserve"> watching</w:t>
       </w:r>
     </w:p>
     <w:p>
@@ -746,7 +1149,67 @@
           <w:b/>
           <w:sz w:val="24"/>
         </w:rPr>
-        <w:t>III. Choose the best answer a, b, c, or d to complete the sentence.</w:t>
+        <w:t xml:space="preserve">IV. Complete the sentences with the correct form or tense of the verb </w:t>
+      </w:r>
+      <w:r>
+        <w:rPr>
+          <w:b/>
+          <w:i/>
+          <w:sz w:val="24"/>
+        </w:rPr>
+        <w:t>play</w:t>
+      </w:r>
+      <w:r>
+        <w:rPr>
+          <w:b/>
+          <w:sz w:val="24"/>
+        </w:rPr>
+        <w:t xml:space="preserve">, </w:t>
+      </w:r>
+      <w:r>
+        <w:rPr>
+          <w:b/>
+          <w:i/>
+          <w:sz w:val="24"/>
+        </w:rPr>
+        <w:t>go</w:t>
+      </w:r>
+      <w:r>
+        <w:rPr>
+          <w:b/>
+          <w:sz w:val="24"/>
+        </w:rPr>
+        <w:t xml:space="preserve">, </w:t>
+      </w:r>
+      <w:r>
+        <w:rPr>
+          <w:b/>
+          <w:i/>
+          <w:sz w:val="24"/>
+        </w:rPr>
+        <w:t>do</w:t>
+      </w:r>
+      <w:r>
+        <w:rPr>
+          <w:b/>
+          <w:sz w:val="24"/>
+        </w:rPr>
+        <w:t xml:space="preserve"> or </w:t>
+      </w:r>
+      <w:r>
+        <w:rPr>
+          <w:b/>
+          <w:i/>
+          <w:sz w:val="24"/>
+        </w:rPr>
+        <w:t>collect</w:t>
+      </w:r>
+      <w:r>
+        <w:rPr>
+          <w:b/>
+          <w:sz w:val="24"/>
+        </w:rPr>
+        <w:t>.</w:t>
       </w:r>
     </w:p>
     <w:p>
@@ -760,91 +1223,7 @@
         <w:rPr>
           <w:sz w:val="24"/>
         </w:rPr>
-        <w:t>1. My father can make beautiful pieces of art &lt;blank&gt; empty eggshells.</w:t>
-      </w:r>
-    </w:p>
-    <w:p>
-      <w:pPr>
-        <w:tabs>
-          <w:tab w:val="left" w:pos="2551"/>
-          <w:tab w:val="left" w:pos="4819"/>
-          <w:tab w:val="left" w:pos="7087"/>
-        </w:tabs>
-        <w:spacing w:before="80" w:after="60"/>
-        <w:ind w:left="283"/>
-        <w:rPr>
-          <w:sz w:val="24"/>
-        </w:rPr>
-      </w:pPr>
-      <w:r>
-        <w:rPr>
-          <w:b/>
-          <w:sz w:val="24"/>
-        </w:rPr>
-        <w:t xml:space="preserve">A. </w:t>
-      </w:r>
-      <w:r>
-        <w:rPr>
-          <w:sz w:val="24"/>
-        </w:rPr>
-        <w:t xml:space="preserve"> of</w:t>
-      </w:r>
-      <w:r>
-        <w:rPr>
-          <w:sz w:val="24"/>
-        </w:rPr>
-        <w:tab/>
-      </w:r>
-      <w:r>
-        <w:rPr>
-          <w:b/>
-          <w:sz w:val="24"/>
-        </w:rPr>
-        <w:t xml:space="preserve">B. </w:t>
-      </w:r>
-      <w:r>
-        <w:rPr>
-          <w:sz w:val="24"/>
-        </w:rPr>
-        <w:t xml:space="preserve"> from</w:t>
-      </w:r>
-      <w:r>
-        <w:rPr>
-          <w:sz w:val="24"/>
-        </w:rPr>
-        <w:tab/>
-      </w:r>
-      <w:r>
-        <w:rPr>
-          <w:b/>
-          <w:sz w:val="24"/>
-        </w:rPr>
-        <w:t xml:space="preserve">C. </w:t>
-      </w:r>
-      <w:r>
-        <w:rPr>
-          <w:sz w:val="24"/>
-        </w:rPr>
-        <w:t xml:space="preserve"> in</w:t>
-      </w:r>
-      <w:r>
-        <w:rPr>
-          <w:sz w:val="24"/>
-        </w:rPr>
-        <w:tab/>
-      </w:r>
-      <w:r>
-        <w:rPr>
-          <w:b/>
-          <w:sz w:val="24"/>
-        </w:rPr>
-        <w:t xml:space="preserve">D. </w:t>
-      </w:r>
-      <w:r>
-        <w:rPr>
-          <w:sz w:val="24"/>
-        </w:rPr>
-        <w:t xml:space="preserve"> into</w:t>
+        <w:t>1. ___________ Alex ___________ computer games at the weekend?</w:t>
       </w:r>
     </w:p>
     <w:p>
@@ -858,91 +1237,7 @@
         <w:rPr>
           <w:sz w:val="24"/>
         </w:rPr>
-        <w:t>2. Why don't you take &lt;blank&gt; a new hobby?</w:t>
-      </w:r>
-    </w:p>
-    <w:p>
-      <w:pPr>
-        <w:tabs>
-          <w:tab w:val="left" w:pos="2551"/>
-          <w:tab w:val="left" w:pos="4819"/>
-          <w:tab w:val="left" w:pos="7087"/>
-        </w:tabs>
-        <w:spacing w:before="80" w:after="60"/>
-        <w:ind w:left="283"/>
-        <w:rPr>
-          <w:sz w:val="24"/>
-        </w:rPr>
-      </w:pPr>
-      <w:r>
-        <w:rPr>
-          <w:b/>
-          <w:sz w:val="24"/>
-        </w:rPr>
-        <w:t xml:space="preserve">A. </w:t>
-      </w:r>
-      <w:r>
-        <w:rPr>
-          <w:sz w:val="24"/>
-        </w:rPr>
-        <w:t xml:space="preserve"> up</w:t>
-      </w:r>
-      <w:r>
-        <w:rPr>
-          <w:sz w:val="24"/>
-        </w:rPr>
-        <w:tab/>
-      </w:r>
-      <w:r>
-        <w:rPr>
-          <w:b/>
-          <w:sz w:val="24"/>
-        </w:rPr>
-        <w:t xml:space="preserve">B. </w:t>
-      </w:r>
-      <w:r>
-        <w:rPr>
-          <w:sz w:val="24"/>
-        </w:rPr>
-        <w:t xml:space="preserve"> in</w:t>
-      </w:r>
-      <w:r>
-        <w:rPr>
-          <w:sz w:val="24"/>
-        </w:rPr>
-        <w:tab/>
-      </w:r>
-      <w:r>
-        <w:rPr>
-          <w:b/>
-          <w:sz w:val="24"/>
-        </w:rPr>
-        <w:t xml:space="preserve">C. </w:t>
-      </w:r>
-      <w:r>
-        <w:rPr>
-          <w:sz w:val="24"/>
-        </w:rPr>
-        <w:t xml:space="preserve"> over</w:t>
-      </w:r>
-      <w:r>
-        <w:rPr>
-          <w:sz w:val="24"/>
-        </w:rPr>
-        <w:tab/>
-      </w:r>
-      <w:r>
-        <w:rPr>
-          <w:b/>
-          <w:sz w:val="24"/>
-        </w:rPr>
-        <w:t xml:space="preserve">D. </w:t>
-      </w:r>
-      <w:r>
-        <w:rPr>
-          <w:sz w:val="24"/>
-        </w:rPr>
-        <w:t xml:space="preserve"> after</w:t>
+        <w:t>2. We ___________ camping in Dam Sen Park yesterday.</w:t>
       </w:r>
     </w:p>
     <w:p>
@@ -956,91 +1251,7 @@
         <w:rPr>
           <w:sz w:val="24"/>
         </w:rPr>
-        <w:t>3. Collecting cars is a(n) &lt;blank&gt; hobby. It costs a lot of money.</w:t>
-      </w:r>
-    </w:p>
-    <w:p>
-      <w:pPr>
-        <w:tabs>
-          <w:tab w:val="left" w:pos="2551"/>
-          <w:tab w:val="left" w:pos="4819"/>
-          <w:tab w:val="left" w:pos="7087"/>
-        </w:tabs>
-        <w:spacing w:before="80" w:after="60"/>
-        <w:ind w:left="283"/>
-        <w:rPr>
-          <w:sz w:val="24"/>
-        </w:rPr>
-      </w:pPr>
-      <w:r>
-        <w:rPr>
-          <w:b/>
-          <w:sz w:val="24"/>
-        </w:rPr>
-        <w:t xml:space="preserve">A. </w:t>
-      </w:r>
-      <w:r>
-        <w:rPr>
-          <w:sz w:val="24"/>
-        </w:rPr>
-        <w:t xml:space="preserve"> interesting</w:t>
-      </w:r>
-      <w:r>
-        <w:rPr>
-          <w:sz w:val="24"/>
-        </w:rPr>
-        <w:tab/>
-      </w:r>
-      <w:r>
-        <w:rPr>
-          <w:b/>
-          <w:sz w:val="24"/>
-        </w:rPr>
-        <w:t xml:space="preserve">B. </w:t>
-      </w:r>
-      <w:r>
-        <w:rPr>
-          <w:sz w:val="24"/>
-        </w:rPr>
-        <w:t xml:space="preserve"> cheap</w:t>
-      </w:r>
-      <w:r>
-        <w:rPr>
-          <w:sz w:val="24"/>
-        </w:rPr>
-        <w:tab/>
-      </w:r>
-      <w:r>
-        <w:rPr>
-          <w:b/>
-          <w:sz w:val="24"/>
-        </w:rPr>
-        <w:t xml:space="preserve">C. </w:t>
-      </w:r>
-      <w:r>
-        <w:rPr>
-          <w:sz w:val="24"/>
-        </w:rPr>
-        <w:t xml:space="preserve"> expensive</w:t>
-      </w:r>
-      <w:r>
-        <w:rPr>
-          <w:sz w:val="24"/>
-        </w:rPr>
-        <w:tab/>
-      </w:r>
-      <w:r>
-        <w:rPr>
-          <w:b/>
-          <w:sz w:val="24"/>
-        </w:rPr>
-        <w:t xml:space="preserve">D. </w:t>
-      </w:r>
-      <w:r>
-        <w:rPr>
-          <w:sz w:val="24"/>
-        </w:rPr>
-        <w:t xml:space="preserve"> unusual</w:t>
+        <w:t>3. ___________ you ___________ coins some day in the future?</w:t>
       </w:r>
     </w:p>
     <w:p>
@@ -1054,223 +1265,7 @@
         <w:rPr>
           <w:sz w:val="24"/>
         </w:rPr>
-        <w:t>4. More people are &lt;blank&gt; birds today than ever before.</w:t>
-      </w:r>
-    </w:p>
-    <w:p>
-      <w:pPr>
-        <w:tabs>
-          <w:tab w:val="left" w:pos="2551"/>
-          <w:tab w:val="left" w:pos="4819"/>
-          <w:tab w:val="left" w:pos="7087"/>
-        </w:tabs>
-        <w:spacing w:before="80" w:after="60"/>
-        <w:ind w:left="283"/>
-        <w:rPr>
-          <w:sz w:val="24"/>
-        </w:rPr>
-      </w:pPr>
-      <w:r>
-        <w:rPr>
-          <w:b/>
-          <w:sz w:val="24"/>
-        </w:rPr>
-        <w:t xml:space="preserve">A. </w:t>
-      </w:r>
-      <w:r>
-        <w:rPr>
-          <w:sz w:val="24"/>
-        </w:rPr>
-        <w:t xml:space="preserve"> seeing</w:t>
-      </w:r>
-      <w:r>
-        <w:rPr>
-          <w:sz w:val="24"/>
-        </w:rPr>
-        <w:tab/>
-      </w:r>
-      <w:r>
-        <w:rPr>
-          <w:b/>
-          <w:sz w:val="24"/>
-        </w:rPr>
-        <w:t xml:space="preserve">B. </w:t>
-      </w:r>
-      <w:r>
-        <w:rPr>
-          <w:sz w:val="24"/>
-        </w:rPr>
-        <w:t xml:space="preserve"> looking</w:t>
-      </w:r>
-      <w:r>
-        <w:rPr>
-          <w:sz w:val="24"/>
-        </w:rPr>
-        <w:tab/>
-      </w:r>
-      <w:r>
-        <w:rPr>
-          <w:b/>
-          <w:sz w:val="24"/>
-        </w:rPr>
-        <w:t xml:space="preserve">C. </w:t>
-      </w:r>
-      <w:r>
-        <w:rPr>
-          <w:sz w:val="24"/>
-        </w:rPr>
-        <w:t xml:space="preserve"> hearing</w:t>
-      </w:r>
-      <w:r>
-        <w:rPr>
-          <w:sz w:val="24"/>
-        </w:rPr>
-        <w:tab/>
-      </w:r>
-      <w:r>
-        <w:rPr>
-          <w:b/>
-          <w:sz w:val="24"/>
-        </w:rPr>
-        <w:t xml:space="preserve">D. </w:t>
-      </w:r>
-      <w:r>
-        <w:rPr>
-          <w:sz w:val="24"/>
-        </w:rPr>
-        <w:t xml:space="preserve"> watching</w:t>
-      </w:r>
-    </w:p>
-    <w:p>
-      <w:pPr>
-        <w:spacing w:before="120" w:after="80"/>
-        <w:rPr>
-          <w:b/>
-          <w:sz w:val="24"/>
-        </w:rPr>
-      </w:pPr>
-      <w:r>
-        <w:rPr>
-          <w:b/>
-          <w:sz w:val="24"/>
-        </w:rPr>
-        <w:t xml:space="preserve">IV. Complete the sentences with the correct form or tense of the verb </w:t>
-      </w:r>
-      <w:r>
-        <w:rPr>
-          <w:b/>
-          <w:i/>
-          <w:sz w:val="24"/>
-        </w:rPr>
-        <w:t>play</w:t>
-      </w:r>
-      <w:r>
-        <w:rPr>
-          <w:b/>
-          <w:sz w:val="24"/>
-        </w:rPr>
-        <w:t xml:space="preserve">, </w:t>
-      </w:r>
-      <w:r>
-        <w:rPr>
-          <w:b/>
-          <w:i/>
-          <w:sz w:val="24"/>
-        </w:rPr>
-        <w:t>go</w:t>
-      </w:r>
-      <w:r>
-        <w:rPr>
-          <w:b/>
-          <w:sz w:val="24"/>
-        </w:rPr>
-        <w:t xml:space="preserve">, </w:t>
-      </w:r>
-      <w:r>
-        <w:rPr>
-          <w:b/>
-          <w:i/>
-          <w:sz w:val="24"/>
-        </w:rPr>
-        <w:t>do</w:t>
-      </w:r>
-      <w:r>
-        <w:rPr>
-          <w:b/>
-          <w:sz w:val="24"/>
-        </w:rPr>
-        <w:t xml:space="preserve"> or </w:t>
-      </w:r>
-      <w:r>
-        <w:rPr>
-          <w:b/>
-          <w:i/>
-          <w:sz w:val="24"/>
-        </w:rPr>
-        <w:t>collect</w:t>
-      </w:r>
-      <w:r>
-        <w:rPr>
-          <w:b/>
-          <w:sz w:val="24"/>
-        </w:rPr>
-        <w:t>.</w:t>
-      </w:r>
-    </w:p>
-    <w:p>
-      <w:pPr>
-        <w:spacing w:before="120" w:after="80"/>
-        <w:rPr>
-          <w:sz w:val="24"/>
-        </w:rPr>
-      </w:pPr>
-      <w:r>
-        <w:rPr>
-          <w:sz w:val="24"/>
-        </w:rPr>
-        <w:t>1. &lt;blank&gt; Alex &lt;blank&gt; computer games at the weekend?</w:t>
-      </w:r>
-    </w:p>
-    <w:p>
-      <w:pPr>
-        <w:spacing w:before="120" w:after="80"/>
-        <w:rPr>
-          <w:sz w:val="24"/>
-        </w:rPr>
-      </w:pPr>
-      <w:r>
-        <w:rPr>
-          <w:sz w:val="24"/>
-        </w:rPr>
-        <w:t>2. We &lt;blank&gt; camping in Dam Sen Park yesterday.</w:t>
-      </w:r>
-    </w:p>
-    <w:p>
-      <w:pPr>
-        <w:spacing w:before="120" w:after="80"/>
-        <w:rPr>
-          <w:sz w:val="24"/>
-        </w:rPr>
-      </w:pPr>
-      <w:r>
-        <w:rPr>
-          <w:sz w:val="24"/>
-        </w:rPr>
-        <w:t>3. &lt;blank&gt; you &lt;blank&gt; coins some day in the future?</w:t>
-      </w:r>
-    </w:p>
-    <w:p>
-      <w:pPr>
-        <w:spacing w:before="120" w:after="80"/>
-        <w:rPr>
-          <w:sz w:val="24"/>
-        </w:rPr>
-      </w:pPr>
-      <w:r>
-        <w:rPr>
-          <w:sz w:val="24"/>
-        </w:rPr>
-        <w:t>4. Do you want &lt;blank&gt; mountain biking with me this weekend?</w:t>
+        <w:t>4. Do you want ___________ mountain biking with me this weekend?</w:t>
       </w:r>
     </w:p>
     <w:p>
@@ -1414,7 +1409,7 @@
         <w:rPr>
           <w:sz w:val="24"/>
         </w:rPr>
-        <w:t>Many people (1)&lt;blank&gt; crafting with paper. The materials are readily available and don't cost much; and no super special talents are needed. Anyone (2)&lt;blank&gt; be a paper crafter.</w:t>
+        <w:t>Many people (1)___________ crafting with paper. The materials are readily available and don't cost much; and no super special talents are needed. Anyone (2)___________ be a paper crafter.</w:t>
       </w:r>
     </w:p>
     <w:p>
@@ -1430,27 +1425,32 @@
         <w:rPr>
           <w:sz w:val="24"/>
         </w:rPr>
-        <w:t>There are many different paper craft techniques. Origami is one of ancient techniques developed in Japan where squares of paper are (3)&lt;blank&gt; and formed into various objects such as flowers, animals, and boxes. Card (4)&lt;blank&gt; is also a favourite paper craft technique. Birthday cards are the most popular greeting cards, followed by Christmas cards. Receiving a (5)&lt;blank&gt; card is a special gift, because of the time and effort someone spent making it. It lets the recipient know just how much you care (6)&lt;blank&gt; them.</w:t>
+        <w:t xml:space="preserve">There are many different paper craft techniques. Origami is one of ancient techniques developed in Japan where squares of paper are (3)___________ and formed into various objects such as flowers, animals, and boxes. Card (4)___________ is also a favourite paper craft technique. Birthday cards are the most popular greeting cards, followed by Christmas cards. Receiving a </w:t>
+      </w:r>
+      <w:r>
+        <w:rPr>
+          <w:sz w:val="24"/>
+        </w:rPr>
+        <w:lastRenderedPageBreak/>
+        <w:t>(5)___________ card is a special gift, because of the time and effort someone spent making it. It lets the recipient know just how much you care (6)___________ them.</w:t>
       </w:r>
     </w:p>
     <w:p>
       <w:pPr>
         <w:tabs>
-          <w:tab w:val="left" w:pos="2551"/>
-          <w:tab w:val="left" w:pos="4819"/>
-          <w:tab w:val="left" w:pos="7087"/>
+          <w:tab w:val="left" w:pos="2339"/>
+          <w:tab w:val="left" w:pos="4677"/>
+          <w:tab w:val="left" w:pos="7016"/>
         </w:tabs>
         <w:spacing w:before="80" w:after="60"/>
-        <w:ind w:left="283"/>
-        <w:rPr>
-          <w:sz w:val="24"/>
-        </w:rPr>
-      </w:pPr>
-      <w:r>
-        <w:rPr>
-          <w:sz w:val="24"/>
-        </w:rPr>
-        <w:lastRenderedPageBreak/>
+        <w:rPr>
+          <w:sz w:val="24"/>
+        </w:rPr>
+      </w:pPr>
+      <w:r>
+        <w:rPr>
+          <w:sz w:val="24"/>
+        </w:rPr>
         <w:t xml:space="preserve">1. </w:t>
       </w:r>
       <w:r>
@@ -1527,12 +1527,11 @@
     <w:p>
       <w:pPr>
         <w:tabs>
-          <w:tab w:val="left" w:pos="2551"/>
-          <w:tab w:val="left" w:pos="4819"/>
-          <w:tab w:val="left" w:pos="7087"/>
+          <w:tab w:val="left" w:pos="2339"/>
+          <w:tab w:val="left" w:pos="4677"/>
+          <w:tab w:val="left" w:pos="7016"/>
         </w:tabs>
         <w:spacing w:before="80" w:after="60"/>
-        <w:ind w:left="283"/>
         <w:rPr>
           <w:sz w:val="24"/>
         </w:rPr>
@@ -1617,12 +1616,11 @@
     <w:p>
       <w:pPr>
         <w:tabs>
-          <w:tab w:val="left" w:pos="2551"/>
-          <w:tab w:val="left" w:pos="4819"/>
-          <w:tab w:val="left" w:pos="7087"/>
+          <w:tab w:val="left" w:pos="2339"/>
+          <w:tab w:val="left" w:pos="4677"/>
+          <w:tab w:val="left" w:pos="7016"/>
         </w:tabs>
         <w:spacing w:before="80" w:after="60"/>
-        <w:ind w:left="283"/>
         <w:rPr>
           <w:sz w:val="24"/>
         </w:rPr>
@@ -1736,6 +1734,9 @@
     </w:p>
     <w:p>
       <w:pPr>
+        <w:tabs>
+          <w:tab w:val="right" w:pos="9354"/>
+        </w:tabs>
         <w:spacing w:before="120" w:after="80"/>
         <w:rPr>
           <w:sz w:val="24"/>
@@ -1745,7 +1746,7 @@
         <w:rPr>
           <w:sz w:val="24"/>
         </w:rPr>
-        <w:t>&lt;blank&gt;</w:t>
+        <w:t>_____________________________________________</w:t>
       </w:r>
     </w:p>
     <w:p>
@@ -1764,6 +1765,9 @@
     </w:p>
     <w:p>
       <w:pPr>
+        <w:tabs>
+          <w:tab w:val="right" w:pos="9354"/>
+        </w:tabs>
         <w:spacing w:before="120" w:after="80"/>
         <w:rPr>
           <w:sz w:val="24"/>
@@ -1773,7 +1777,7 @@
         <w:rPr>
           <w:sz w:val="24"/>
         </w:rPr>
-        <w:t>&lt;blank&gt;</w:t>
+        <w:t>_____________________________________________</w:t>
       </w:r>
     </w:p>
     <w:p>
@@ -1792,6 +1796,9 @@
     </w:p>
     <w:p>
       <w:pPr>
+        <w:tabs>
+          <w:tab w:val="right" w:pos="9354"/>
+        </w:tabs>
         <w:spacing w:before="120" w:after="80"/>
         <w:rPr>
           <w:sz w:val="24"/>
@@ -1801,7 +1808,7 @@
         <w:rPr>
           <w:sz w:val="24"/>
         </w:rPr>
-        <w:t>&lt;blank&gt;</w:t>
+        <w:t>_____________________________________________</w:t>
       </w:r>
     </w:p>
     <w:p>
@@ -2242,7 +2249,7 @@
               <w:rPr>
                 <w:sz w:val="24"/>
               </w:rPr>
-              <w:t>&lt;blank&gt;</w:t>
+              <w:t>___________</w:t>
             </w:r>
           </w:p>
         </w:tc>
@@ -2262,7 +2269,7 @@
               <w:rPr>
                 <w:sz w:val="24"/>
               </w:rPr>
-              <w:t>&lt;blank&gt;</w:t>
+              <w:t>___________</w:t>
             </w:r>
           </w:p>
         </w:tc>
@@ -2287,7 +2294,7 @@
               <w:rPr>
                 <w:sz w:val="24"/>
               </w:rPr>
-              <w:t>&lt;blank&gt;</w:t>
+              <w:t>___________</w:t>
             </w:r>
           </w:p>
         </w:tc>
@@ -2307,7 +2314,7 @@
               <w:rPr>
                 <w:sz w:val="24"/>
               </w:rPr>
-              <w:t>&lt;blank&gt;</w:t>
+              <w:t>___________</w:t>
             </w:r>
           </w:p>
         </w:tc>
@@ -2332,7 +2339,7 @@
               <w:rPr>
                 <w:sz w:val="24"/>
               </w:rPr>
-              <w:t>&lt;blank&gt;</w:t>
+              <w:t>___________</w:t>
             </w:r>
           </w:p>
         </w:tc>
@@ -2352,7 +2359,7 @@
               <w:rPr>
                 <w:sz w:val="24"/>
               </w:rPr>
-              <w:t>&lt;blank&gt;</w:t>
+              <w:t>___________</w:t>
             </w:r>
           </w:p>
         </w:tc>
@@ -2384,6 +2391,7 @@
     </w:p>
     <w:p>
       <w:pPr>
+        <w:keepNext/>
         <w:tabs>
           <w:tab w:val="left" w:pos="2817"/>
           <w:tab w:val="left" w:pos="5337"/>
@@ -2402,10 +2410,11 @@
           <w:noProof/>
           <w:sz w:val="24"/>
         </w:rPr>
+        <w:lastRenderedPageBreak/>
         <mc:AlternateContent>
           <mc:Choice Requires="wps">
             <w:drawing>
-              <wp:anchor distT="0" distB="0" distL="114300" distR="114300" simplePos="0" relativeHeight="251659264" behindDoc="0" locked="0" layoutInCell="1" allowOverlap="1" wp14:anchorId="0A607564" wp14:editId="77192065">
+              <wp:anchor distT="0" distB="0" distL="114300" distR="114300" simplePos="0" relativeHeight="251659264" behindDoc="0" locked="0" layoutInCell="1" allowOverlap="1" wp14:anchorId="0F5C6746" wp14:editId="35422A01">
                 <wp:simplePos x="0" y="0"/>
                 <wp:positionH relativeFrom="margin">
                   <wp:posOffset>112395</wp:posOffset>
@@ -2416,7 +2425,7 @@
                 <wp:extent cx="5715000" cy="558800"/>
                 <wp:effectExtent l="0" t="0" r="19050" b="12700"/>
                 <wp:wrapNone/>
-                <wp:docPr id="1447860702" name="Rectangle: Rounded Corners 1"/>
+                <wp:docPr id="314480429" name="Rectangle: Rounded Corners 1"/>
                 <wp:cNvGraphicFramePr/>
                 <a:graphic xmlns:a="http://schemas.openxmlformats.org/drawingml/2006/main">
                   <a:graphicData uri="http://schemas.microsoft.com/office/word/2010/wordprocessingShape">
@@ -2479,7 +2488,7 @@
           </mc:Choice>
           <mc:Fallback>
             <w:pict>
-              <v:roundrect w14:anchorId="4A696915" id="Rectangle: Rounded Corners 1" o:spid="_x0000_s1026" style="position:absolute;margin-left:8.85pt;margin-top:-6pt;width:450pt;height:44pt;z-index:251659264;visibility:visible;mso-wrap-style:square;mso-wrap-distance-left:9pt;mso-wrap-distance-top:0;mso-wrap-distance-right:9pt;mso-wrap-distance-bottom:0;mso-position-horizontal:absolute;mso-position-horizontal-relative:margin;mso-position-vertical:absolute;mso-position-vertical-relative:text;v-text-anchor:middle" arcsize="10923f" o:gfxdata="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" filled="f" fillcolor="#156082 [3204]" strokeweight="1pt">
+              <v:roundrect w14:anchorId="4A79C35A" id="Rectangle: Rounded Corners 1" o:spid="_x0000_s1026" style="position:absolute;margin-left:8.85pt;margin-top:-6pt;width:450pt;height:44pt;z-index:251659264;visibility:visible;mso-wrap-style:square;mso-wrap-distance-left:9pt;mso-wrap-distance-top:0;mso-wrap-distance-right:9pt;mso-wrap-distance-bottom:0;mso-position-horizontal:absolute;mso-position-horizontal-relative:margin;mso-position-vertical:absolute;mso-position-vertical-relative:text;v-text-anchor:middle" arcsize="10923f" o:gfxdata="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" filled="f" fillcolor="#156082 [3204]" strokeweight="1pt">
                 <v:stroke joinstyle="miter"/>
                 <w10:wrap anchorx="margin"/>
               </v:roundrect>
@@ -2536,6 +2545,7 @@
     </w:p>
     <w:p>
       <w:pPr>
+        <w:keepNext/>
         <w:tabs>
           <w:tab w:val="left" w:pos="2817"/>
           <w:tab w:val="left" w:pos="5337"/>
@@ -2597,6 +2607,7 @@
     </w:p>
     <w:p>
       <w:pPr>
+        <w:keepNext/>
         <w:tabs>
           <w:tab w:val="left" w:pos="2339"/>
           <w:tab w:val="left" w:pos="4677"/>
@@ -2614,22 +2625,21 @@
           <w:noProof/>
           <w:sz w:val="24"/>
         </w:rPr>
-        <w:lastRenderedPageBreak/>
         <w:drawing>
-          <wp:inline distT="0" distB="0" distL="0" distR="0" wp14:anchorId="76494962" wp14:editId="3B8CA31A">
+          <wp:inline distT="0" distB="0" distL="0" distR="0" wp14:anchorId="10EDFC0B" wp14:editId="4F676188">
             <wp:extent cx="1260000" cy="900000"/>
             <wp:effectExtent l="0" t="0" r="0" b="0"/>
-            <wp:docPr id="2126615794" name="Picture 2"/>
+            <wp:docPr id="6024562" name="Picture 2"/>
             <wp:cNvGraphicFramePr/>
             <a:graphic xmlns:a="http://schemas.openxmlformats.org/drawingml/2006/main">
               <a:graphicData uri="http://schemas.openxmlformats.org/drawingml/2006/picture">
                 <pic:pic xmlns:pic="http://schemas.openxmlformats.org/drawingml/2006/picture">
                   <pic:nvPicPr>
-                    <pic:cNvPr id="2126615794" name=""/>
+                    <pic:cNvPr id="6024562" name=""/>
                     <pic:cNvPicPr/>
                   </pic:nvPicPr>
                   <pic:blipFill>
-                    <a:blip r:embed="rId6" cstate="print">
+                    <a:blip r:embed="rId6">
                       <a:extLst>
                         <a:ext uri="{28A0092B-C50C-407E-A947-70E740481C1C}">
                           <a14:useLocalDpi xmlns:a14="http://schemas.microsoft.com/office/drawing/2010/main" val="0"/>
@@ -2669,20 +2679,20 @@
           <w:sz w:val="24"/>
         </w:rPr>
         <w:drawing>
-          <wp:inline distT="0" distB="0" distL="0" distR="0" wp14:anchorId="312889C8" wp14:editId="5B17CFD2">
+          <wp:inline distT="0" distB="0" distL="0" distR="0" wp14:anchorId="4B7DCF65" wp14:editId="26DB68A5">
             <wp:extent cx="1260000" cy="900000"/>
             <wp:effectExtent l="0" t="0" r="0" b="0"/>
-            <wp:docPr id="1115622825" name="Picture 3"/>
+            <wp:docPr id="1743216738" name="Picture 3"/>
             <wp:cNvGraphicFramePr/>
             <a:graphic xmlns:a="http://schemas.openxmlformats.org/drawingml/2006/main">
               <a:graphicData uri="http://schemas.openxmlformats.org/drawingml/2006/picture">
                 <pic:pic xmlns:pic="http://schemas.openxmlformats.org/drawingml/2006/picture">
                   <pic:nvPicPr>
-                    <pic:cNvPr id="1115622825" name=""/>
+                    <pic:cNvPr id="1743216738" name=""/>
                     <pic:cNvPicPr/>
                   </pic:nvPicPr>
                   <pic:blipFill>
-                    <a:blip r:embed="rId6" cstate="print">
+                    <a:blip r:embed="rId7" cstate="print">
                       <a:extLst>
                         <a:ext uri="{28A0092B-C50C-407E-A947-70E740481C1C}">
                           <a14:useLocalDpi xmlns:a14="http://schemas.microsoft.com/office/drawing/2010/main" val="0"/>
@@ -2722,69 +2732,16 @@
           <w:sz w:val="24"/>
         </w:rPr>
         <w:drawing>
-          <wp:inline distT="0" distB="0" distL="0" distR="0" wp14:anchorId="6A7D2E66" wp14:editId="0F59C98D">
+          <wp:inline distT="0" distB="0" distL="0" distR="0" wp14:anchorId="01BB2FB7" wp14:editId="07EE4466">
             <wp:extent cx="1260000" cy="900000"/>
             <wp:effectExtent l="0" t="0" r="0" b="0"/>
-            <wp:docPr id="49995807" name="Picture 4"/>
+            <wp:docPr id="777227119" name="Picture 4"/>
             <wp:cNvGraphicFramePr/>
             <a:graphic xmlns:a="http://schemas.openxmlformats.org/drawingml/2006/main">
               <a:graphicData uri="http://schemas.openxmlformats.org/drawingml/2006/picture">
                 <pic:pic xmlns:pic="http://schemas.openxmlformats.org/drawingml/2006/picture">
                   <pic:nvPicPr>
-                    <pic:cNvPr id="49995807" name=""/>
-                    <pic:cNvPicPr/>
-                  </pic:nvPicPr>
-                  <pic:blipFill>
-                    <a:blip r:embed="rId7">
-                      <a:extLst>
-                        <a:ext uri="{28A0092B-C50C-407E-A947-70E740481C1C}">
-                          <a14:useLocalDpi xmlns:a14="http://schemas.microsoft.com/office/drawing/2010/main" val="0"/>
-                        </a:ext>
-                      </a:extLst>
-                    </a:blip>
-                    <a:stretch>
-                      <a:fillRect/>
-                    </a:stretch>
-                  </pic:blipFill>
-                  <pic:spPr>
-                    <a:xfrm>
-                      <a:off x="0" y="0"/>
-                      <a:ext cx="1260000" cy="900000"/>
-                    </a:xfrm>
-                    <a:prstGeom prst="rect">
-                      <a:avLst/>
-                    </a:prstGeom>
-                  </pic:spPr>
-                </pic:pic>
-              </a:graphicData>
-            </a:graphic>
-          </wp:inline>
-        </w:drawing>
-      </w:r>
-      <w:r>
-        <w:rPr>
-          <w:b/>
-          <w:sz w:val="24"/>
-        </w:rPr>
-        <w:tab/>
-      </w:r>
-      <w:r>
-        <w:rPr>
-          <w:b/>
-          <w:noProof/>
-          <w:sz w:val="24"/>
-        </w:rPr>
-        <w:drawing>
-          <wp:inline distT="0" distB="0" distL="0" distR="0" wp14:anchorId="21D917BB" wp14:editId="2DCEB25B">
-            <wp:extent cx="1260000" cy="900000"/>
-            <wp:effectExtent l="0" t="0" r="0" b="0"/>
-            <wp:docPr id="1668842246" name="Picture 5"/>
-            <wp:cNvGraphicFramePr/>
-            <a:graphic xmlns:a="http://schemas.openxmlformats.org/drawingml/2006/main">
-              <a:graphicData uri="http://schemas.openxmlformats.org/drawingml/2006/picture">
-                <pic:pic xmlns:pic="http://schemas.openxmlformats.org/drawingml/2006/picture">
-                  <pic:nvPicPr>
-                    <pic:cNvPr id="1668842246" name=""/>
+                    <pic:cNvPr id="777227119" name=""/>
                     <pic:cNvPicPr/>
                   </pic:nvPicPr>
                   <pic:blipFill>
@@ -2814,9 +2771,63 @@
           </wp:inline>
         </w:drawing>
       </w:r>
-    </w:p>
-    <w:p>
-      <w:pPr>
+      <w:r>
+        <w:rPr>
+          <w:b/>
+          <w:sz w:val="24"/>
+        </w:rPr>
+        <w:tab/>
+      </w:r>
+      <w:r>
+        <w:rPr>
+          <w:b/>
+          <w:noProof/>
+          <w:sz w:val="24"/>
+        </w:rPr>
+        <w:drawing>
+          <wp:inline distT="0" distB="0" distL="0" distR="0" wp14:anchorId="44C2286B" wp14:editId="057BCFC7">
+            <wp:extent cx="1260000" cy="900000"/>
+            <wp:effectExtent l="0" t="0" r="0" b="0"/>
+            <wp:docPr id="819424658" name="Picture 5"/>
+            <wp:cNvGraphicFramePr/>
+            <a:graphic xmlns:a="http://schemas.openxmlformats.org/drawingml/2006/main">
+              <a:graphicData uri="http://schemas.openxmlformats.org/drawingml/2006/picture">
+                <pic:pic xmlns:pic="http://schemas.openxmlformats.org/drawingml/2006/picture">
+                  <pic:nvPicPr>
+                    <pic:cNvPr id="819424658" name=""/>
+                    <pic:cNvPicPr/>
+                  </pic:nvPicPr>
+                  <pic:blipFill>
+                    <a:blip r:embed="rId8">
+                      <a:extLst>
+                        <a:ext uri="{28A0092B-C50C-407E-A947-70E740481C1C}">
+                          <a14:useLocalDpi xmlns:a14="http://schemas.microsoft.com/office/drawing/2010/main" val="0"/>
+                        </a:ext>
+                      </a:extLst>
+                    </a:blip>
+                    <a:stretch>
+                      <a:fillRect/>
+                    </a:stretch>
+                  </pic:blipFill>
+                  <pic:spPr>
+                    <a:xfrm>
+                      <a:off x="0" y="0"/>
+                      <a:ext cx="1260000" cy="900000"/>
+                    </a:xfrm>
+                    <a:prstGeom prst="rect">
+                      <a:avLst/>
+                    </a:prstGeom>
+                  </pic:spPr>
+                </pic:pic>
+              </a:graphicData>
+            </a:graphic>
+          </wp:inline>
+        </w:drawing>
+      </w:r>
+    </w:p>
+    <w:p>
+      <w:pPr>
+        <w:keepNext/>
         <w:tabs>
           <w:tab w:val="left" w:pos="2339"/>
           <w:tab w:val="left" w:pos="4677"/>
@@ -2900,6 +2911,7 @@
     </w:p>
     <w:p>
       <w:pPr>
+        <w:keepNext/>
         <w:tabs>
           <w:tab w:val="left" w:pos="2339"/>
           <w:tab w:val="left" w:pos="4677"/>
@@ -2916,16 +2928,67 @@
           <w:sz w:val="24"/>
         </w:rPr>
         <w:drawing>
-          <wp:inline distT="0" distB="0" distL="0" distR="0" wp14:anchorId="08550AED" wp14:editId="77824180">
+          <wp:inline distT="0" distB="0" distL="0" distR="0" wp14:anchorId="0C9D672E" wp14:editId="69FCD3AF">
             <wp:extent cx="1260000" cy="900000"/>
             <wp:effectExtent l="0" t="0" r="0" b="0"/>
-            <wp:docPr id="969590336" name="Picture 6"/>
+            <wp:docPr id="115536048" name="Picture 6"/>
             <wp:cNvGraphicFramePr/>
             <a:graphic xmlns:a="http://schemas.openxmlformats.org/drawingml/2006/main">
               <a:graphicData uri="http://schemas.openxmlformats.org/drawingml/2006/picture">
                 <pic:pic xmlns:pic="http://schemas.openxmlformats.org/drawingml/2006/picture">
                   <pic:nvPicPr>
-                    <pic:cNvPr id="969590336" name=""/>
+                    <pic:cNvPr id="115536048" name=""/>
+                    <pic:cNvPicPr/>
+                  </pic:nvPicPr>
+                  <pic:blipFill>
+                    <a:blip r:embed="rId8">
+                      <a:extLst>
+                        <a:ext uri="{28A0092B-C50C-407E-A947-70E740481C1C}">
+                          <a14:useLocalDpi xmlns:a14="http://schemas.microsoft.com/office/drawing/2010/main" val="0"/>
+                        </a:ext>
+                      </a:extLst>
+                    </a:blip>
+                    <a:stretch>
+                      <a:fillRect/>
+                    </a:stretch>
+                  </pic:blipFill>
+                  <pic:spPr>
+                    <a:xfrm>
+                      <a:off x="0" y="0"/>
+                      <a:ext cx="1260000" cy="900000"/>
+                    </a:xfrm>
+                    <a:prstGeom prst="rect">
+                      <a:avLst/>
+                    </a:prstGeom>
+                  </pic:spPr>
+                </pic:pic>
+              </a:graphicData>
+            </a:graphic>
+          </wp:inline>
+        </w:drawing>
+      </w:r>
+      <w:r>
+        <w:rPr>
+          <w:sz w:val="24"/>
+        </w:rPr>
+        <w:tab/>
+      </w:r>
+      <w:r>
+        <w:rPr>
+          <w:noProof/>
+          <w:sz w:val="24"/>
+        </w:rPr>
+        <w:drawing>
+          <wp:inline distT="0" distB="0" distL="0" distR="0" wp14:anchorId="08209F87" wp14:editId="16C536FE">
+            <wp:extent cx="1260000" cy="900000"/>
+            <wp:effectExtent l="0" t="0" r="0" b="0"/>
+            <wp:docPr id="749186392" name="Picture 7"/>
+            <wp:cNvGraphicFramePr/>
+            <a:graphic xmlns:a="http://schemas.openxmlformats.org/drawingml/2006/main">
+              <a:graphicData uri="http://schemas.openxmlformats.org/drawingml/2006/picture">
+                <pic:pic xmlns:pic="http://schemas.openxmlformats.org/drawingml/2006/picture">
+                  <pic:nvPicPr>
+                    <pic:cNvPr id="749186392" name=""/>
                     <pic:cNvPicPr/>
                   </pic:nvPicPr>
                   <pic:blipFill>
@@ -2967,16 +3030,16 @@
           <w:sz w:val="24"/>
         </w:rPr>
         <w:drawing>
-          <wp:inline distT="0" distB="0" distL="0" distR="0" wp14:anchorId="08AD1E12" wp14:editId="714B1BF8">
+          <wp:inline distT="0" distB="0" distL="0" distR="0" wp14:anchorId="65F37649" wp14:editId="39A0084B">
             <wp:extent cx="1260000" cy="900000"/>
             <wp:effectExtent l="0" t="0" r="0" b="0"/>
-            <wp:docPr id="1181435298" name="Picture 7"/>
+            <wp:docPr id="918973745" name="Picture 8"/>
             <wp:cNvGraphicFramePr/>
             <a:graphic xmlns:a="http://schemas.openxmlformats.org/drawingml/2006/main">
               <a:graphicData uri="http://schemas.openxmlformats.org/drawingml/2006/picture">
                 <pic:pic xmlns:pic="http://schemas.openxmlformats.org/drawingml/2006/picture">
                   <pic:nvPicPr>
-                    <pic:cNvPr id="1181435298" name=""/>
+                    <pic:cNvPr id="918973745" name=""/>
                     <pic:cNvPicPr/>
                   </pic:nvPicPr>
                   <pic:blipFill>
@@ -3018,16 +3081,16 @@
           <w:sz w:val="24"/>
         </w:rPr>
         <w:drawing>
-          <wp:inline distT="0" distB="0" distL="0" distR="0" wp14:anchorId="4BB21965" wp14:editId="182250CB">
+          <wp:inline distT="0" distB="0" distL="0" distR="0" wp14:anchorId="7C61ECA6" wp14:editId="5C2F1F00">
             <wp:extent cx="1260000" cy="900000"/>
             <wp:effectExtent l="0" t="0" r="0" b="0"/>
-            <wp:docPr id="1754358896" name="Picture 8"/>
+            <wp:docPr id="1424631975" name="Picture 9"/>
             <wp:cNvGraphicFramePr/>
             <a:graphic xmlns:a="http://schemas.openxmlformats.org/drawingml/2006/main">
               <a:graphicData uri="http://schemas.openxmlformats.org/drawingml/2006/picture">
                 <pic:pic xmlns:pic="http://schemas.openxmlformats.org/drawingml/2006/picture">
                   <pic:nvPicPr>
-                    <pic:cNvPr id="1754358896" name=""/>
+                    <pic:cNvPr id="1424631975" name=""/>
                     <pic:cNvPicPr/>
                   </pic:nvPicPr>
                   <pic:blipFill>
@@ -3057,60 +3120,10 @@
           </wp:inline>
         </w:drawing>
       </w:r>
-      <w:r>
-        <w:rPr>
-          <w:sz w:val="24"/>
-        </w:rPr>
-        <w:tab/>
-      </w:r>
-      <w:r>
-        <w:rPr>
-          <w:noProof/>
-          <w:sz w:val="24"/>
-        </w:rPr>
-        <w:drawing>
-          <wp:inline distT="0" distB="0" distL="0" distR="0" wp14:anchorId="0E23AA64" wp14:editId="43355B24">
-            <wp:extent cx="1260000" cy="900000"/>
-            <wp:effectExtent l="0" t="0" r="0" b="0"/>
-            <wp:docPr id="1206225097" name="Picture 9"/>
-            <wp:cNvGraphicFramePr/>
-            <a:graphic xmlns:a="http://schemas.openxmlformats.org/drawingml/2006/main">
-              <a:graphicData uri="http://schemas.openxmlformats.org/drawingml/2006/picture">
-                <pic:pic xmlns:pic="http://schemas.openxmlformats.org/drawingml/2006/picture">
-                  <pic:nvPicPr>
-                    <pic:cNvPr id="1206225097" name=""/>
-                    <pic:cNvPicPr/>
-                  </pic:nvPicPr>
-                  <pic:blipFill>
-                    <a:blip r:embed="rId11">
-                      <a:extLst>
-                        <a:ext uri="{28A0092B-C50C-407E-A947-70E740481C1C}">
-                          <a14:useLocalDpi xmlns:a14="http://schemas.microsoft.com/office/drawing/2010/main" val="0"/>
-                        </a:ext>
-                      </a:extLst>
-                    </a:blip>
-                    <a:stretch>
-                      <a:fillRect/>
-                    </a:stretch>
-                  </pic:blipFill>
-                  <pic:spPr>
-                    <a:xfrm>
-                      <a:off x="0" y="0"/>
-                      <a:ext cx="1260000" cy="900000"/>
-                    </a:xfrm>
-                    <a:prstGeom prst="rect">
-                      <a:avLst/>
-                    </a:prstGeom>
-                  </pic:spPr>
-                </pic:pic>
-              </a:graphicData>
-            </a:graphic>
-          </wp:inline>
-        </w:drawing>
-      </w:r>
-    </w:p>
-    <w:p>
-      <w:pPr>
+    </w:p>
+    <w:p>
+      <w:pPr>
+        <w:keepNext/>
         <w:tabs>
           <w:tab w:val="left" w:pos="2339"/>
           <w:tab w:val="left" w:pos="4677"/>
@@ -3439,7 +3452,12 @@
       </w:pPr>
     </w:p>
     <w:sectPr>
-      <w:footerReference w:type="default" r:id="rId12"/>
+      <w:headerReference w:type="even" r:id="rId11"/>
+      <w:headerReference w:type="default" r:id="rId12"/>
+      <w:footerReference w:type="even" r:id="rId13"/>
+      <w:footerReference w:type="default" r:id="rId14"/>
+      <w:headerReference w:type="first" r:id="rId15"/>
+      <w:footerReference w:type="first" r:id="rId16"/>
       <w:pgSz w:w="11907" w:h="16840" w:code="9"/>
       <w:pgMar w:top="1134" w:right="850" w:bottom="1134" w:left="1701" w:header="720" w:footer="720" w:gutter="0"/>
       <w:cols w:space="720"/>
@@ -3475,6 +3493,16 @@
 </file>
 
 <file path=word/footer1.xml><?xml version="1.0" encoding="utf-8"?>
+<w:ftr xmlns:wpc="http://schemas.microsoft.com/office/word/2010/wordprocessingCanvas" xmlns:cx="http://schemas.microsoft.com/office/drawing/2014/chartex" xmlns:cx1="http://schemas.microsoft.com/office/drawing/2015/9/8/chartex" xmlns:cx2="http://schemas.microsoft.com/office/drawing/2015/10/21/chartex" xmlns:cx3="http://schemas.microsoft.com/office/drawing/2016/5/9/chartex" xmlns:cx4="http://schemas.microsoft.com/office/drawing/2016/5/10/chartex" xmlns:cx5="http://schemas.microsoft.com/office/drawing/2016/5/11/chartex" xmlns:cx6="http://schemas.microsoft.com/office/drawing/2016/5/12/chartex" xmlns:cx7="http://schemas.microsoft.com/office/drawing/2016/5/13/chartex" xmlns:cx8="http://schemas.microsoft.com/office/drawing/2016/5/14/chartex" xmlns:mc="http://schemas.openxmlformats.org/markup-compatibility/2006" xmlns:aink="http://schemas.microsoft.com/office/drawing/2016/ink" xmlns:am3d="http://schemas.microsoft.com/office/drawing/2017/model3d" xmlns:o="urn:schemas-microsoft-com:office:office" xmlns:oel="http://schemas.microsoft.com/office/2019/extlst" xmlns:r="http://schemas.openxmlformats.org/officeDocument/2006/relationships" xmlns:m="http://schemas.openxmlformats.org/officeDocument/2006/math" xmlns:v="urn:schemas-microsoft-com:vml" xmlns:wp14="http://schemas.microsoft.com/office/word/2010/wordprocessingDrawing" xmlns:wp="http://schemas.openxmlformats.org/drawingml/2006/wordprocessingDrawing" xmlns:w10="urn:schemas-microsoft-com:office:word" xmlns:w="http://schemas.openxmlformats.org/wordprocessingml/2006/main" xmlns:w14="http://schemas.microsoft.com/office/word/2010/wordml" xmlns:w15="http://schemas.microsoft.com/office/word/2012/wordml" xmlns:w16cex="http://schemas.microsoft.com/office/word/2018/wordml/cex" xmlns:w16cid="http://schemas.microsoft.com/office/word/2016/wordml/cid" xmlns:w16="http://schemas.microsoft.com/office/word/2018/wordml" xmlns:w16du="http://schemas.microsoft.com/office/word/2023/wordml/word16du" xmlns:w16sdtdh="http://schemas.microsoft.com/office/word/2020/wordml/sdtdatahash" xmlns:w16sdtfl="http://schemas.microsoft.com/office/word/2024/wordml/sdtformatlock" xmlns:w16se="http://schemas.microsoft.com/office/word/2015/wordml/symex" xmlns:wpg="http://schemas.microsoft.com/office/word/2010/wordprocessingGroup" xmlns:wpi="http://schemas.microsoft.com/office/word/2010/wordprocessingInk" xmlns:wne="http://schemas.microsoft.com/office/word/2006/wordml" xmlns:wps="http://schemas.microsoft.com/office/word/2010/wordprocessingShape" mc:Ignorable="w14 w15 w16se w16cid w16 w16cex w16sdtdh w16sdtfl w16du wp14">
+  <w:p>
+    <w:pPr>
+      <w:pStyle w:val="Footer"/>
+    </w:pPr>
+  </w:p>
+</w:ftr>
+</file>
+
+<file path=word/footer2.xml><?xml version="1.0" encoding="utf-8"?>
 <w:ftr xmlns:wpc="http://schemas.microsoft.com/office/word/2010/wordprocessingCanvas" xmlns:cx="http://schemas.microsoft.com/office/drawing/2014/chartex" xmlns:cx1="http://schemas.microsoft.com/office/drawing/2015/9/8/chartex" xmlns:cx2="http://schemas.microsoft.com/office/drawing/2015/10/21/chartex" xmlns:cx3="http://schemas.microsoft.com/office/drawing/2016/5/9/chartex" xmlns:cx4="http://schemas.microsoft.com/office/drawing/2016/5/10/chartex" xmlns:cx5="http://schemas.microsoft.com/office/drawing/2016/5/11/chartex" xmlns:cx6="http://schemas.microsoft.com/office/drawing/2016/5/12/chartex" xmlns:cx7="http://schemas.microsoft.com/office/drawing/2016/5/13/chartex" xmlns:cx8="http://schemas.microsoft.com/office/drawing/2016/5/14/chartex" xmlns:mc="http://schemas.openxmlformats.org/markup-compatibility/2006" xmlns:aink="http://schemas.microsoft.com/office/drawing/2016/ink" xmlns:am3d="http://schemas.microsoft.com/office/drawing/2017/model3d" xmlns:o="urn:schemas-microsoft-com:office:office" xmlns:oel="http://schemas.microsoft.com/office/2019/extlst" xmlns:r="http://schemas.openxmlformats.org/officeDocument/2006/relationships" xmlns:m="http://schemas.openxmlformats.org/officeDocument/2006/math" xmlns:v="urn:schemas-microsoft-com:vml" xmlns:wp14="http://schemas.microsoft.com/office/word/2010/wordprocessingDrawing" xmlns:wp="http://schemas.openxmlformats.org/drawingml/2006/wordprocessingDrawing" xmlns:w10="urn:schemas-microsoft-com:office:word" xmlns:w="http://schemas.openxmlformats.org/wordprocessingml/2006/main" xmlns:w14="http://schemas.microsoft.com/office/word/2010/wordml" xmlns:w15="http://schemas.microsoft.com/office/word/2012/wordml" xmlns:w16cex="http://schemas.microsoft.com/office/word/2018/wordml/cex" xmlns:w16cid="http://schemas.microsoft.com/office/word/2016/wordml/cid" xmlns:w16="http://schemas.microsoft.com/office/word/2018/wordml" xmlns:w16du="http://schemas.microsoft.com/office/word/2023/wordml/word16du" xmlns:w16sdtdh="http://schemas.microsoft.com/office/word/2020/wordml/sdtdatahash" xmlns:w16sdtfl="http://schemas.microsoft.com/office/word/2024/wordml/sdtformatlock" xmlns:w16se="http://schemas.microsoft.com/office/word/2015/wordml/symex" xmlns:wpg="http://schemas.microsoft.com/office/word/2010/wordprocessingGroup" xmlns:wpi="http://schemas.microsoft.com/office/word/2010/wordprocessingInk" xmlns:wne="http://schemas.microsoft.com/office/word/2006/wordml" xmlns:wps="http://schemas.microsoft.com/office/word/2010/wordprocessingShape" mc:Ignorable="w14 w15 w16se w16cid w16 w16cex w16sdtdh w16sdtfl w16du wp14">
   <w:p>
     <w:pPr>
@@ -3552,6 +3580,16 @@
 </w:ftr>
 </file>
 
+<file path=word/footer3.xml><?xml version="1.0" encoding="utf-8"?>
+<w:ftr xmlns:wpc="http://schemas.microsoft.com/office/word/2010/wordprocessingCanvas" xmlns:cx="http://schemas.microsoft.com/office/drawing/2014/chartex" xmlns:cx1="http://schemas.microsoft.com/office/drawing/2015/9/8/chartex" xmlns:cx2="http://schemas.microsoft.com/office/drawing/2015/10/21/chartex" xmlns:cx3="http://schemas.microsoft.com/office/drawing/2016/5/9/chartex" xmlns:cx4="http://schemas.microsoft.com/office/drawing/2016/5/10/chartex" xmlns:cx5="http://schemas.microsoft.com/office/drawing/2016/5/11/chartex" xmlns:cx6="http://schemas.microsoft.com/office/drawing/2016/5/12/chartex" xmlns:cx7="http://schemas.microsoft.com/office/drawing/2016/5/13/chartex" xmlns:cx8="http://schemas.microsoft.com/office/drawing/2016/5/14/chartex" xmlns:mc="http://schemas.openxmlformats.org/markup-compatibility/2006" xmlns:aink="http://schemas.microsoft.com/office/drawing/2016/ink" xmlns:am3d="http://schemas.microsoft.com/office/drawing/2017/model3d" xmlns:o="urn:schemas-microsoft-com:office:office" xmlns:oel="http://schemas.microsoft.com/office/2019/extlst" xmlns:r="http://schemas.openxmlformats.org/officeDocument/2006/relationships" xmlns:m="http://schemas.openxmlformats.org/officeDocument/2006/math" xmlns:v="urn:schemas-microsoft-com:vml" xmlns:wp14="http://schemas.microsoft.com/office/word/2010/wordprocessingDrawing" xmlns:wp="http://schemas.openxmlformats.org/drawingml/2006/wordprocessingDrawing" xmlns:w10="urn:schemas-microsoft-com:office:word" xmlns:w="http://schemas.openxmlformats.org/wordprocessingml/2006/main" xmlns:w14="http://schemas.microsoft.com/office/word/2010/wordml" xmlns:w15="http://schemas.microsoft.com/office/word/2012/wordml" xmlns:w16cex="http://schemas.microsoft.com/office/word/2018/wordml/cex" xmlns:w16cid="http://schemas.microsoft.com/office/word/2016/wordml/cid" xmlns:w16="http://schemas.microsoft.com/office/word/2018/wordml" xmlns:w16du="http://schemas.microsoft.com/office/word/2023/wordml/word16du" xmlns:w16sdtdh="http://schemas.microsoft.com/office/word/2020/wordml/sdtdatahash" xmlns:w16sdtfl="http://schemas.microsoft.com/office/word/2024/wordml/sdtformatlock" xmlns:w16se="http://schemas.microsoft.com/office/word/2015/wordml/symex" xmlns:wpg="http://schemas.microsoft.com/office/word/2010/wordprocessingGroup" xmlns:wpi="http://schemas.microsoft.com/office/word/2010/wordprocessingInk" xmlns:wne="http://schemas.microsoft.com/office/word/2006/wordml" xmlns:wps="http://schemas.microsoft.com/office/word/2010/wordprocessingShape" mc:Ignorable="w14 w15 w16se w16cid w16 w16cex w16sdtdh w16sdtfl w16du wp14">
+  <w:p>
+    <w:pPr>
+      <w:pStyle w:val="Footer"/>
+    </w:pPr>
+  </w:p>
+</w:ftr>
+</file>
+
 <file path=word/footnotes.xml><?xml version="1.0" encoding="utf-8"?>
 <w:footnotes xmlns:wpc="http://schemas.microsoft.com/office/word/2010/wordprocessingCanvas" xmlns:cx="http://schemas.microsoft.com/office/drawing/2014/chartex" xmlns:cx1="http://schemas.microsoft.com/office/drawing/2015/9/8/chartex" xmlns:cx2="http://schemas.microsoft.com/office/drawing/2015/10/21/chartex" xmlns:cx3="http://schemas.microsoft.com/office/drawing/2016/5/9/chartex" xmlns:cx4="http://schemas.microsoft.com/office/drawing/2016/5/10/chartex" xmlns:cx5="http://schemas.microsoft.com/office/drawing/2016/5/11/chartex" xmlns:cx6="http://schemas.microsoft.com/office/drawing/2016/5/12/chartex" xmlns:cx7="http://schemas.microsoft.com/office/drawing/2016/5/13/chartex" xmlns:cx8="http://schemas.microsoft.com/office/drawing/2016/5/14/chartex" xmlns:mc="http://schemas.openxmlformats.org/markup-compatibility/2006" xmlns:aink="http://schemas.microsoft.com/office/drawing/2016/ink" xmlns:am3d="http://schemas.microsoft.com/office/drawing/2017/model3d" xmlns:o="urn:schemas-microsoft-com:office:office" xmlns:oel="http://schemas.microsoft.com/office/2019/extlst" xmlns:r="http://schemas.openxmlformats.org/officeDocument/2006/relationships" xmlns:m="http://schemas.openxmlformats.org/officeDocument/2006/math" xmlns:v="urn:schemas-microsoft-com:vml" xmlns:wp14="http://schemas.microsoft.com/office/word/2010/wordprocessingDrawing" xmlns:wp="http://schemas.openxmlformats.org/drawingml/2006/wordprocessingDrawing" xmlns:w10="urn:schemas-microsoft-com:office:word" xmlns:w="http://schemas.openxmlformats.org/wordprocessingml/2006/main" xmlns:w14="http://schemas.microsoft.com/office/word/2010/wordml" xmlns:w15="http://schemas.microsoft.com/office/word/2012/wordml" xmlns:w16cex="http://schemas.microsoft.com/office/word/2018/wordml/cex" xmlns:w16cid="http://schemas.microsoft.com/office/word/2016/wordml/cid" xmlns:w16="http://schemas.microsoft.com/office/word/2018/wordml" xmlns:w16du="http://schemas.microsoft.com/office/word/2023/wordml/word16du" xmlns:w16sdtdh="http://schemas.microsoft.com/office/word/2020/wordml/sdtdatahash" xmlns:w16sdtfl="http://schemas.microsoft.com/office/word/2024/wordml/sdtformatlock" xmlns:w16se="http://schemas.microsoft.com/office/word/2015/wordml/symex" xmlns:wpg="http://schemas.microsoft.com/office/word/2010/wordprocessingGroup" xmlns:wpi="http://schemas.microsoft.com/office/word/2010/wordprocessingInk" xmlns:wne="http://schemas.microsoft.com/office/word/2006/wordml" xmlns:wps="http://schemas.microsoft.com/office/word/2010/wordprocessingShape" mc:Ignorable="w14 w15 w16se w16cid w16 w16cex w16sdtdh w16sdtfl w16du wp14">
   <w:footnote w:type="separator" w:id="-1">
@@ -3575,6 +3613,36 @@
     </w:p>
   </w:footnote>
 </w:footnotes>
+</file>
+
+<file path=word/header1.xml><?xml version="1.0" encoding="utf-8"?>
+<w:hdr xmlns:wpc="http://schemas.microsoft.com/office/word/2010/wordprocessingCanvas" xmlns:cx="http://schemas.microsoft.com/office/drawing/2014/chartex" xmlns:cx1="http://schemas.microsoft.com/office/drawing/2015/9/8/chartex" xmlns:cx2="http://schemas.microsoft.com/office/drawing/2015/10/21/chartex" xmlns:cx3="http://schemas.microsoft.com/office/drawing/2016/5/9/chartex" xmlns:cx4="http://schemas.microsoft.com/office/drawing/2016/5/10/chartex" xmlns:cx5="http://schemas.microsoft.com/office/drawing/2016/5/11/chartex" xmlns:cx6="http://schemas.microsoft.com/office/drawing/2016/5/12/chartex" xmlns:cx7="http://schemas.microsoft.com/office/drawing/2016/5/13/chartex" xmlns:cx8="http://schemas.microsoft.com/office/drawing/2016/5/14/chartex" xmlns:mc="http://schemas.openxmlformats.org/markup-compatibility/2006" xmlns:aink="http://schemas.microsoft.com/office/drawing/2016/ink" xmlns:am3d="http://schemas.microsoft.com/office/drawing/2017/model3d" xmlns:o="urn:schemas-microsoft-com:office:office" xmlns:oel="http://schemas.microsoft.com/office/2019/extlst" xmlns:r="http://schemas.openxmlformats.org/officeDocument/2006/relationships" xmlns:m="http://schemas.openxmlformats.org/officeDocument/2006/math" xmlns:v="urn:schemas-microsoft-com:vml" xmlns:wp14="http://schemas.microsoft.com/office/word/2010/wordprocessingDrawing" xmlns:wp="http://schemas.openxmlformats.org/drawingml/2006/wordprocessingDrawing" xmlns:w10="urn:schemas-microsoft-com:office:word" xmlns:w="http://schemas.openxmlformats.org/wordprocessingml/2006/main" xmlns:w14="http://schemas.microsoft.com/office/word/2010/wordml" xmlns:w15="http://schemas.microsoft.com/office/word/2012/wordml" xmlns:w16cex="http://schemas.microsoft.com/office/word/2018/wordml/cex" xmlns:w16cid="http://schemas.microsoft.com/office/word/2016/wordml/cid" xmlns:w16="http://schemas.microsoft.com/office/word/2018/wordml" xmlns:w16du="http://schemas.microsoft.com/office/word/2023/wordml/word16du" xmlns:w16sdtdh="http://schemas.microsoft.com/office/word/2020/wordml/sdtdatahash" xmlns:w16sdtfl="http://schemas.microsoft.com/office/word/2024/wordml/sdtformatlock" xmlns:w16se="http://schemas.microsoft.com/office/word/2015/wordml/symex" xmlns:wpg="http://schemas.microsoft.com/office/word/2010/wordprocessingGroup" xmlns:wpi="http://schemas.microsoft.com/office/word/2010/wordprocessingInk" xmlns:wne="http://schemas.microsoft.com/office/word/2006/wordml" xmlns:wps="http://schemas.microsoft.com/office/word/2010/wordprocessingShape" mc:Ignorable="w14 w15 w16se w16cid w16 w16cex w16sdtdh w16sdtfl w16du wp14">
+  <w:p>
+    <w:pPr>
+      <w:pStyle w:val="Header"/>
+    </w:pPr>
+  </w:p>
+</w:hdr>
+</file>
+
+<file path=word/header2.xml><?xml version="1.0" encoding="utf-8"?>
+<w:hdr xmlns:wpc="http://schemas.microsoft.com/office/word/2010/wordprocessingCanvas" xmlns:cx="http://schemas.microsoft.com/office/drawing/2014/chartex" xmlns:cx1="http://schemas.microsoft.com/office/drawing/2015/9/8/chartex" xmlns:cx2="http://schemas.microsoft.com/office/drawing/2015/10/21/chartex" xmlns:cx3="http://schemas.microsoft.com/office/drawing/2016/5/9/chartex" xmlns:cx4="http://schemas.microsoft.com/office/drawing/2016/5/10/chartex" xmlns:cx5="http://schemas.microsoft.com/office/drawing/2016/5/11/chartex" xmlns:cx6="http://schemas.microsoft.com/office/drawing/2016/5/12/chartex" xmlns:cx7="http://schemas.microsoft.com/office/drawing/2016/5/13/chartex" xmlns:cx8="http://schemas.microsoft.com/office/drawing/2016/5/14/chartex" xmlns:mc="http://schemas.openxmlformats.org/markup-compatibility/2006" xmlns:aink="http://schemas.microsoft.com/office/drawing/2016/ink" xmlns:am3d="http://schemas.microsoft.com/office/drawing/2017/model3d" xmlns:o="urn:schemas-microsoft-com:office:office" xmlns:oel="http://schemas.microsoft.com/office/2019/extlst" xmlns:r="http://schemas.openxmlformats.org/officeDocument/2006/relationships" xmlns:m="http://schemas.openxmlformats.org/officeDocument/2006/math" xmlns:v="urn:schemas-microsoft-com:vml" xmlns:wp14="http://schemas.microsoft.com/office/word/2010/wordprocessingDrawing" xmlns:wp="http://schemas.openxmlformats.org/drawingml/2006/wordprocessingDrawing" xmlns:w10="urn:schemas-microsoft-com:office:word" xmlns:w="http://schemas.openxmlformats.org/wordprocessingml/2006/main" xmlns:w14="http://schemas.microsoft.com/office/word/2010/wordml" xmlns:w15="http://schemas.microsoft.com/office/word/2012/wordml" xmlns:w16cex="http://schemas.microsoft.com/office/word/2018/wordml/cex" xmlns:w16cid="http://schemas.microsoft.com/office/word/2016/wordml/cid" xmlns:w16="http://schemas.microsoft.com/office/word/2018/wordml" xmlns:w16du="http://schemas.microsoft.com/office/word/2023/wordml/word16du" xmlns:w16sdtdh="http://schemas.microsoft.com/office/word/2020/wordml/sdtdatahash" xmlns:w16sdtfl="http://schemas.microsoft.com/office/word/2024/wordml/sdtformatlock" xmlns:w16se="http://schemas.microsoft.com/office/word/2015/wordml/symex" xmlns:wpg="http://schemas.microsoft.com/office/word/2010/wordprocessingGroup" xmlns:wpi="http://schemas.microsoft.com/office/word/2010/wordprocessingInk" xmlns:wne="http://schemas.microsoft.com/office/word/2006/wordml" xmlns:wps="http://schemas.microsoft.com/office/word/2010/wordprocessingShape" mc:Ignorable="w14 w15 w16se w16cid w16 w16cex w16sdtdh w16sdtfl w16du wp14">
+  <w:p>
+    <w:pPr>
+      <w:pStyle w:val="Header"/>
+    </w:pPr>
+  </w:p>
+</w:hdr>
+</file>
+
+<file path=word/header3.xml><?xml version="1.0" encoding="utf-8"?>
+<w:hdr xmlns:wpc="http://schemas.microsoft.com/office/word/2010/wordprocessingCanvas" xmlns:cx="http://schemas.microsoft.com/office/drawing/2014/chartex" xmlns:cx1="http://schemas.microsoft.com/office/drawing/2015/9/8/chartex" xmlns:cx2="http://schemas.microsoft.com/office/drawing/2015/10/21/chartex" xmlns:cx3="http://schemas.microsoft.com/office/drawing/2016/5/9/chartex" xmlns:cx4="http://schemas.microsoft.com/office/drawing/2016/5/10/chartex" xmlns:cx5="http://schemas.microsoft.com/office/drawing/2016/5/11/chartex" xmlns:cx6="http://schemas.microsoft.com/office/drawing/2016/5/12/chartex" xmlns:cx7="http://schemas.microsoft.com/office/drawing/2016/5/13/chartex" xmlns:cx8="http://schemas.microsoft.com/office/drawing/2016/5/14/chartex" xmlns:mc="http://schemas.openxmlformats.org/markup-compatibility/2006" xmlns:aink="http://schemas.microsoft.com/office/drawing/2016/ink" xmlns:am3d="http://schemas.microsoft.com/office/drawing/2017/model3d" xmlns:o="urn:schemas-microsoft-com:office:office" xmlns:oel="http://schemas.microsoft.com/office/2019/extlst" xmlns:r="http://schemas.openxmlformats.org/officeDocument/2006/relationships" xmlns:m="http://schemas.openxmlformats.org/officeDocument/2006/math" xmlns:v="urn:schemas-microsoft-com:vml" xmlns:wp14="http://schemas.microsoft.com/office/word/2010/wordprocessingDrawing" xmlns:wp="http://schemas.openxmlformats.org/drawingml/2006/wordprocessingDrawing" xmlns:w10="urn:schemas-microsoft-com:office:word" xmlns:w="http://schemas.openxmlformats.org/wordprocessingml/2006/main" xmlns:w14="http://schemas.microsoft.com/office/word/2010/wordml" xmlns:w15="http://schemas.microsoft.com/office/word/2012/wordml" xmlns:w16cex="http://schemas.microsoft.com/office/word/2018/wordml/cex" xmlns:w16cid="http://schemas.microsoft.com/office/word/2016/wordml/cid" xmlns:w16="http://schemas.microsoft.com/office/word/2018/wordml" xmlns:w16du="http://schemas.microsoft.com/office/word/2023/wordml/word16du" xmlns:w16sdtdh="http://schemas.microsoft.com/office/word/2020/wordml/sdtdatahash" xmlns:w16sdtfl="http://schemas.microsoft.com/office/word/2024/wordml/sdtformatlock" xmlns:w16se="http://schemas.microsoft.com/office/word/2015/wordml/symex" xmlns:wpg="http://schemas.microsoft.com/office/word/2010/wordprocessingGroup" xmlns:wpi="http://schemas.microsoft.com/office/word/2010/wordprocessingInk" xmlns:wne="http://schemas.microsoft.com/office/word/2006/wordml" xmlns:wps="http://schemas.microsoft.com/office/word/2010/wordprocessingShape" mc:Ignorable="w14 w15 w16se w16cid w16 w16cex w16sdtdh w16sdtfl w16du wp14">
+  <w:p>
+    <w:pPr>
+      <w:pStyle w:val="Header"/>
+    </w:pPr>
+  </w:p>
+</w:hdr>
 </file>
 
 <file path=word/styles.xml><?xml version="1.0" encoding="utf-8"?>
@@ -3985,7 +4053,7 @@
     <w:link w:val="Heading1Char"/>
     <w:uiPriority w:val="9"/>
     <w:qFormat/>
-    <w:rsid w:val="00FE06B5"/>
+    <w:rsid w:val="00553192"/>
     <w:pPr>
       <w:keepNext/>
       <w:keepLines/>
@@ -4008,7 +4076,7 @@
     <w:semiHidden/>
     <w:unhideWhenUsed/>
     <w:qFormat/>
-    <w:rsid w:val="00FE06B5"/>
+    <w:rsid w:val="00553192"/>
     <w:pPr>
       <w:keepNext/>
       <w:keepLines/>
@@ -4031,7 +4099,7 @@
     <w:semiHidden/>
     <w:unhideWhenUsed/>
     <w:qFormat/>
-    <w:rsid w:val="00FE06B5"/>
+    <w:rsid w:val="00553192"/>
     <w:pPr>
       <w:keepNext/>
       <w:keepLines/>
@@ -4054,7 +4122,7 @@
     <w:semiHidden/>
     <w:unhideWhenUsed/>
     <w:qFormat/>
-    <w:rsid w:val="00FE06B5"/>
+    <w:rsid w:val="00553192"/>
     <w:pPr>
       <w:keepNext/>
       <w:keepLines/>
@@ -4077,7 +4145,7 @@
     <w:semiHidden/>
     <w:unhideWhenUsed/>
     <w:qFormat/>
-    <w:rsid w:val="00FE06B5"/>
+    <w:rsid w:val="00553192"/>
     <w:pPr>
       <w:keepNext/>
       <w:keepLines/>
@@ -4098,7 +4166,7 @@
     <w:semiHidden/>
     <w:unhideWhenUsed/>
     <w:qFormat/>
-    <w:rsid w:val="00FE06B5"/>
+    <w:rsid w:val="00553192"/>
     <w:pPr>
       <w:keepNext/>
       <w:keepLines/>
@@ -4121,7 +4189,7 @@
     <w:semiHidden/>
     <w:unhideWhenUsed/>
     <w:qFormat/>
-    <w:rsid w:val="00FE06B5"/>
+    <w:rsid w:val="00553192"/>
     <w:pPr>
       <w:keepNext/>
       <w:keepLines/>
@@ -4142,7 +4210,7 @@
     <w:semiHidden/>
     <w:unhideWhenUsed/>
     <w:qFormat/>
-    <w:rsid w:val="00FE06B5"/>
+    <w:rsid w:val="00553192"/>
     <w:pPr>
       <w:keepNext/>
       <w:keepLines/>
@@ -4165,7 +4233,7 @@
     <w:semiHidden/>
     <w:unhideWhenUsed/>
     <w:qFormat/>
-    <w:rsid w:val="00FE06B5"/>
+    <w:rsid w:val="00553192"/>
     <w:pPr>
       <w:keepNext/>
       <w:keepLines/>
@@ -4209,7 +4277,7 @@
     <w:basedOn w:val="DefaultParagraphFont"/>
     <w:link w:val="Heading1"/>
     <w:uiPriority w:val="9"/>
-    <w:rsid w:val="00FE06B5"/>
+    <w:rsid w:val="00553192"/>
     <w:rPr>
       <w:rFonts w:asciiTheme="majorHAnsi" w:eastAsiaTheme="majorEastAsia" w:hAnsiTheme="majorHAnsi" w:cstheme="majorBidi"/>
       <w:color w:val="0F4761" w:themeColor="accent1" w:themeShade="BF"/>
@@ -4223,7 +4291,7 @@
     <w:link w:val="Heading2"/>
     <w:uiPriority w:val="9"/>
     <w:semiHidden/>
-    <w:rsid w:val="00FE06B5"/>
+    <w:rsid w:val="00553192"/>
     <w:rPr>
       <w:rFonts w:asciiTheme="majorHAnsi" w:eastAsiaTheme="majorEastAsia" w:hAnsiTheme="majorHAnsi" w:cstheme="majorBidi"/>
       <w:color w:val="0F4761" w:themeColor="accent1" w:themeShade="BF"/>
@@ -4237,7 +4305,7 @@
     <w:link w:val="Heading3"/>
     <w:uiPriority w:val="9"/>
     <w:semiHidden/>
-    <w:rsid w:val="00FE06B5"/>
+    <w:rsid w:val="00553192"/>
     <w:rPr>
       <w:rFonts w:asciiTheme="minorHAnsi" w:eastAsiaTheme="majorEastAsia" w:hAnsiTheme="minorHAnsi" w:cstheme="majorBidi"/>
       <w:color w:val="0F4761" w:themeColor="accent1" w:themeShade="BF"/>
@@ -4251,7 +4319,7 @@
     <w:link w:val="Heading4"/>
     <w:uiPriority w:val="9"/>
     <w:semiHidden/>
-    <w:rsid w:val="00FE06B5"/>
+    <w:rsid w:val="00553192"/>
     <w:rPr>
       <w:rFonts w:asciiTheme="minorHAnsi" w:eastAsiaTheme="majorEastAsia" w:hAnsiTheme="minorHAnsi" w:cstheme="majorBidi"/>
       <w:i/>
@@ -4265,7 +4333,7 @@
     <w:link w:val="Heading5"/>
     <w:uiPriority w:val="9"/>
     <w:semiHidden/>
-    <w:rsid w:val="00FE06B5"/>
+    <w:rsid w:val="00553192"/>
     <w:rPr>
       <w:rFonts w:asciiTheme="minorHAnsi" w:eastAsiaTheme="majorEastAsia" w:hAnsiTheme="minorHAnsi" w:cstheme="majorBidi"/>
       <w:color w:val="0F4761" w:themeColor="accent1" w:themeShade="BF"/>
@@ -4277,7 +4345,7 @@
     <w:link w:val="Heading6"/>
     <w:uiPriority w:val="9"/>
     <w:semiHidden/>
-    <w:rsid w:val="00FE06B5"/>
+    <w:rsid w:val="00553192"/>
     <w:rPr>
       <w:rFonts w:asciiTheme="minorHAnsi" w:eastAsiaTheme="majorEastAsia" w:hAnsiTheme="minorHAnsi" w:cstheme="majorBidi"/>
       <w:i/>
@@ -4291,7 +4359,7 @@
     <w:link w:val="Heading7"/>
     <w:uiPriority w:val="9"/>
     <w:semiHidden/>
-    <w:rsid w:val="00FE06B5"/>
+    <w:rsid w:val="00553192"/>
     <w:rPr>
       <w:rFonts w:asciiTheme="minorHAnsi" w:eastAsiaTheme="majorEastAsia" w:hAnsiTheme="minorHAnsi" w:cstheme="majorBidi"/>
       <w:color w:val="595959" w:themeColor="text1" w:themeTint="A6"/>
@@ -4303,7 +4371,7 @@
     <w:link w:val="Heading8"/>
     <w:uiPriority w:val="9"/>
     <w:semiHidden/>
-    <w:rsid w:val="00FE06B5"/>
+    <w:rsid w:val="00553192"/>
     <w:rPr>
       <w:rFonts w:asciiTheme="minorHAnsi" w:eastAsiaTheme="majorEastAsia" w:hAnsiTheme="minorHAnsi" w:cstheme="majorBidi"/>
       <w:i/>
@@ -4317,7 +4385,7 @@
     <w:link w:val="Heading9"/>
     <w:uiPriority w:val="9"/>
     <w:semiHidden/>
-    <w:rsid w:val="00FE06B5"/>
+    <w:rsid w:val="00553192"/>
     <w:rPr>
       <w:rFonts w:asciiTheme="minorHAnsi" w:eastAsiaTheme="majorEastAsia" w:hAnsiTheme="minorHAnsi" w:cstheme="majorBidi"/>
       <w:color w:val="272727" w:themeColor="text1" w:themeTint="D8"/>
@@ -4330,7 +4398,7 @@
     <w:link w:val="TitleChar"/>
     <w:uiPriority w:val="10"/>
     <w:qFormat/>
-    <w:rsid w:val="00FE06B5"/>
+    <w:rsid w:val="00553192"/>
     <w:pPr>
       <w:spacing w:after="80" w:line="240" w:lineRule="auto"/>
       <w:contextualSpacing/>
@@ -4348,7 +4416,7 @@
     <w:basedOn w:val="DefaultParagraphFont"/>
     <w:link w:val="Title"/>
     <w:uiPriority w:val="10"/>
-    <w:rsid w:val="00FE06B5"/>
+    <w:rsid w:val="00553192"/>
     <w:rPr>
       <w:rFonts w:asciiTheme="majorHAnsi" w:eastAsiaTheme="majorEastAsia" w:hAnsiTheme="majorHAnsi" w:cstheme="majorBidi"/>
       <w:spacing w:val="-10"/>
@@ -4364,7 +4432,7 @@
     <w:link w:val="SubtitleChar"/>
     <w:uiPriority w:val="11"/>
     <w:qFormat/>
-    <w:rsid w:val="00FE06B5"/>
+    <w:rsid w:val="00553192"/>
     <w:pPr>
       <w:numPr>
         <w:ilvl w:val="1"/>
@@ -4383,7 +4451,7 @@
     <w:basedOn w:val="DefaultParagraphFont"/>
     <w:link w:val="Subtitle"/>
     <w:uiPriority w:val="11"/>
-    <w:rsid w:val="00FE06B5"/>
+    <w:rsid w:val="00553192"/>
     <w:rPr>
       <w:rFonts w:asciiTheme="minorHAnsi" w:eastAsiaTheme="majorEastAsia" w:hAnsiTheme="minorHAnsi" w:cstheme="majorBidi"/>
       <w:color w:val="595959" w:themeColor="text1" w:themeTint="A6"/>
@@ -4399,7 +4467,7 @@
     <w:link w:val="QuoteChar"/>
     <w:uiPriority w:val="29"/>
     <w:qFormat/>
-    <w:rsid w:val="00FE06B5"/>
+    <w:rsid w:val="00553192"/>
     <w:pPr>
       <w:spacing w:before="160"/>
       <w:jc w:val="center"/>
@@ -4415,7 +4483,7 @@
     <w:basedOn w:val="DefaultParagraphFont"/>
     <w:link w:val="Quote"/>
     <w:uiPriority w:val="29"/>
-    <w:rsid w:val="00FE06B5"/>
+    <w:rsid w:val="00553192"/>
     <w:rPr>
       <w:i/>
       <w:iCs/>
@@ -4427,7 +4495,7 @@
     <w:basedOn w:val="Normal"/>
     <w:uiPriority w:val="34"/>
     <w:qFormat/>
-    <w:rsid w:val="00FE06B5"/>
+    <w:rsid w:val="00553192"/>
     <w:pPr>
       <w:ind w:left="720"/>
       <w:contextualSpacing/>
@@ -4438,7 +4506,7 @@
     <w:basedOn w:val="DefaultParagraphFont"/>
     <w:uiPriority w:val="21"/>
     <w:qFormat/>
-    <w:rsid w:val="00FE06B5"/>
+    <w:rsid w:val="00553192"/>
     <w:rPr>
       <w:i/>
       <w:iCs/>
@@ -4452,7 +4520,7 @@
     <w:link w:val="IntenseQuoteChar"/>
     <w:uiPriority w:val="30"/>
     <w:qFormat/>
-    <w:rsid w:val="00FE06B5"/>
+    <w:rsid w:val="00553192"/>
     <w:pPr>
       <w:pBdr>
         <w:top w:val="single" w:sz="4" w:space="10" w:color="0F4761" w:themeColor="accent1" w:themeShade="BF"/>
@@ -4473,7 +4541,7 @@
     <w:basedOn w:val="DefaultParagraphFont"/>
     <w:link w:val="IntenseQuote"/>
     <w:uiPriority w:val="30"/>
-    <w:rsid w:val="00FE06B5"/>
+    <w:rsid w:val="00553192"/>
     <w:rPr>
       <w:i/>
       <w:iCs/>
@@ -4485,7 +4553,7 @@
     <w:basedOn w:val="DefaultParagraphFont"/>
     <w:uiPriority w:val="32"/>
     <w:qFormat/>
-    <w:rsid w:val="00FE06B5"/>
+    <w:rsid w:val="00553192"/>
     <w:rPr>
       <w:b/>
       <w:bCs/>
@@ -4500,7 +4568,7 @@
     <w:link w:val="HeaderChar"/>
     <w:uiPriority w:val="99"/>
     <w:unhideWhenUsed/>
-    <w:rsid w:val="00FE06B5"/>
+    <w:rsid w:val="00553192"/>
     <w:pPr>
       <w:tabs>
         <w:tab w:val="center" w:pos="4680"/>
@@ -4514,7 +4582,7 @@
     <w:basedOn w:val="DefaultParagraphFont"/>
     <w:link w:val="Header"/>
     <w:uiPriority w:val="99"/>
-    <w:rsid w:val="00FE06B5"/>
+    <w:rsid w:val="00553192"/>
   </w:style>
   <w:style w:type="paragraph" w:styleId="Footer">
     <w:name w:val="footer"/>
@@ -4522,7 +4590,7 @@
     <w:link w:val="FooterChar"/>
     <w:uiPriority w:val="99"/>
     <w:unhideWhenUsed/>
-    <w:rsid w:val="00FE06B5"/>
+    <w:rsid w:val="00553192"/>
     <w:pPr>
       <w:tabs>
         <w:tab w:val="center" w:pos="4680"/>
@@ -4536,7 +4604,7 @@
     <w:basedOn w:val="DefaultParagraphFont"/>
     <w:link w:val="Footer"/>
     <w:uiPriority w:val="99"/>
-    <w:rsid w:val="00FE06B5"/>
+    <w:rsid w:val="00553192"/>
   </w:style>
 </w:styles>
 </file>

</xml_diff>

<commit_message>
docs: simplify [PIC] tags in prompt.txt removing verbose descriptions and attributes
</commit_message>
<xml_diff>
--- a/output/uln_document.docx
+++ b/output/uln_document.docx
@@ -9,22 +9,97 @@
         </w:tabs>
         <w:spacing w:before="60" w:after="60"/>
         <w:ind w:left="5669" w:hanging="5669"/>
-        <w:rPr>
-          <w:sz w:val="24"/>
-        </w:rPr>
       </w:pPr>
       <w:r>
         <w:rPr>
-          <w:sz w:val="24"/>
+          <w:noProof/>
         </w:rPr>
-        <w:t>[PIC: "Red circular speed limit sign with number 40"</w:t>
+        <w:drawing>
+          <wp:inline distT="0" distB="0" distL="0" distR="0">
+            <wp:extent cx="2160000" cy="1440000"/>
+            <wp:effectExtent l="0" t="0" r="0" b="8255"/>
+            <wp:docPr id="1590874681" name="Picture 1"/>
+            <wp:cNvGraphicFramePr/>
+            <a:graphic xmlns:a="http://schemas.openxmlformats.org/drawingml/2006/main">
+              <a:graphicData uri="http://schemas.openxmlformats.org/drawingml/2006/picture">
+                <pic:pic xmlns:pic="http://schemas.openxmlformats.org/drawingml/2006/picture">
+                  <pic:nvPicPr>
+                    <pic:cNvPr id="1590874681" name=""/>
+                    <pic:cNvPicPr/>
+                  </pic:nvPicPr>
+                  <pic:blipFill>
+                    <a:blip r:embed="rId6">
+                      <a:extLst>
+                        <a:ext uri="{28A0092B-C50C-407E-A947-70E740481C1C}">
+                          <a14:useLocalDpi xmlns:a14="http://schemas.microsoft.com/office/drawing/2010/main" val="0"/>
+                        </a:ext>
+                      </a:extLst>
+                    </a:blip>
+                    <a:stretch>
+                      <a:fillRect/>
+                    </a:stretch>
+                  </pic:blipFill>
+                  <pic:spPr>
+                    <a:xfrm>
+                      <a:off x="0" y="0"/>
+                      <a:ext cx="2160000" cy="1440000"/>
+                    </a:xfrm>
+                    <a:prstGeom prst="rect">
+                      <a:avLst/>
+                    </a:prstGeom>
+                  </pic:spPr>
+                </pic:pic>
+              </a:graphicData>
+            </a:graphic>
+          </wp:inline>
+        </w:drawing>
+      </w:r>
+      <w:r>
+        <w:tab/>
       </w:r>
       <w:r>
         <w:rPr>
-          <w:sz w:val="24"/>
+          <w:noProof/>
         </w:rPr>
-        <w:tab/>
-        <w:t>pos:inline | size:medium]  [P0] 11. What does the sign (A) say?</w:t>
+        <w:drawing>
+          <wp:inline distT="0" distB="0" distL="0" distR="0">
+            <wp:extent cx="2160000" cy="1440000"/>
+            <wp:effectExtent l="0" t="0" r="0" b="8255"/>
+            <wp:docPr id="399795176" name="Picture 2"/>
+            <wp:cNvGraphicFramePr/>
+            <a:graphic xmlns:a="http://schemas.openxmlformats.org/drawingml/2006/main">
+              <a:graphicData uri="http://schemas.openxmlformats.org/drawingml/2006/picture">
+                <pic:pic xmlns:pic="http://schemas.openxmlformats.org/drawingml/2006/picture">
+                  <pic:nvPicPr>
+                    <pic:cNvPr id="399795176" name=""/>
+                    <pic:cNvPicPr/>
+                  </pic:nvPicPr>
+                  <pic:blipFill>
+                    <a:blip r:embed="rId6">
+                      <a:extLst>
+                        <a:ext uri="{28A0092B-C50C-407E-A947-70E740481C1C}">
+                          <a14:useLocalDpi xmlns:a14="http://schemas.microsoft.com/office/drawing/2010/main" val="0"/>
+                        </a:ext>
+                      </a:extLst>
+                    </a:blip>
+                    <a:stretch>
+                      <a:fillRect/>
+                    </a:stretch>
+                  </pic:blipFill>
+                  <pic:spPr>
+                    <a:xfrm>
+                      <a:off x="0" y="0"/>
+                      <a:ext cx="2160000" cy="1440000"/>
+                    </a:xfrm>
+                    <a:prstGeom prst="rect">
+                      <a:avLst/>
+                    </a:prstGeom>
+                  </pic:spPr>
+                </pic:pic>
+              </a:graphicData>
+            </a:graphic>
+          </wp:inline>
+        </w:drawing>
       </w:r>
     </w:p>
     <w:p>
@@ -46,24 +121,7 @@
         <w:rPr>
           <w:sz w:val="24"/>
         </w:rPr>
-        <w:t xml:space="preserve"> Maximum 40 vehicles are allowed on this road.</w:t>
-      </w:r>
-    </w:p>
-    <w:p>
-      <w:pPr>
-        <w:spacing w:before="80" w:after="60"/>
-        <w:ind w:left="283"/>
-        <w:rPr>
-          <w:color w:val="FF0000"/>
-          <w:sz w:val="24"/>
-        </w:rPr>
-      </w:pPr>
-      <w:r>
-        <w:rPr>
-          <w:color w:val="FF0000"/>
-          <w:sz w:val="24"/>
-        </w:rPr>
-        <w:t>**B.** You shouldn't exceed this maximum speed.</w:t>
+        <w:t xml:space="preserve"> Throw plastic bottles into the water.</w:t>
       </w:r>
     </w:p>
     <w:p>
@@ -77,7 +135,28 @@
       <w:r>
         <w:rPr>
           <w:b/>
-          <w:color w:val="FF0000"/>
+          <w:sz w:val="24"/>
+        </w:rPr>
+        <w:t xml:space="preserve">B. </w:t>
+      </w:r>
+      <w:r>
+        <w:rPr>
+          <w:sz w:val="24"/>
+        </w:rPr>
+        <w:t xml:space="preserve"> Throw trash and bottles into the water.</w:t>
+      </w:r>
+    </w:p>
+    <w:p>
+      <w:pPr>
+        <w:spacing w:before="80" w:after="60"/>
+        <w:ind w:left="283"/>
+        <w:rPr>
+          <w:sz w:val="24"/>
+        </w:rPr>
+      </w:pPr>
+      <w:r>
+        <w:rPr>
+          <w:b/>
           <w:sz w:val="24"/>
         </w:rPr>
         <w:t xml:space="preserve">C. </w:t>
@@ -86,7 +165,7 @@
         <w:rPr>
           <w:sz w:val="24"/>
         </w:rPr>
-        <w:t xml:space="preserve"> Minimum 40 vehicles are allowed on this road.</w:t>
+        <w:t xml:space="preserve"> Don't throw plastic bottles into the water.</w:t>
       </w:r>
     </w:p>
     <w:p>
@@ -108,7 +187,7 @@
         <w:rPr>
           <w:sz w:val="24"/>
         </w:rPr>
-        <w:t xml:space="preserve"> You shouldn't move below this speed.</w:t>
+        <w:t xml:space="preserve"> Don't pick up plastic bottles in the water.</w:t>
       </w:r>
     </w:p>
     <w:p>
@@ -121,12 +200,12 @@
       </w:pPr>
     </w:p>
     <w:sectPr>
-      <w:headerReference w:type="even" r:id="rId6"/>
-      <w:headerReference w:type="default" r:id="rId7"/>
-      <w:footerReference w:type="even" r:id="rId8"/>
-      <w:footerReference w:type="default" r:id="rId9"/>
-      <w:headerReference w:type="first" r:id="rId10"/>
-      <w:footerReference w:type="first" r:id="rId11"/>
+      <w:headerReference w:type="even" r:id="rId7"/>
+      <w:headerReference w:type="default" r:id="rId8"/>
+      <w:footerReference w:type="even" r:id="rId9"/>
+      <w:footerReference w:type="default" r:id="rId10"/>
+      <w:headerReference w:type="first" r:id="rId11"/>
+      <w:footerReference w:type="first" r:id="rId12"/>
       <w:pgSz w:w="11907" w:h="16840" w:code="9"/>
       <w:pgMar w:top="1134" w:right="850" w:bottom="1134" w:left="1701" w:header="720" w:footer="720" w:gutter="0"/>
       <w:cols w:space="720"/>
@@ -722,7 +801,7 @@
     <w:link w:val="Heading1Char"/>
     <w:uiPriority w:val="9"/>
     <w:qFormat/>
-    <w:rsid w:val="00BC242A"/>
+    <w:rsid w:val="00D55490"/>
     <w:pPr>
       <w:keepNext/>
       <w:keepLines/>
@@ -745,7 +824,7 @@
     <w:semiHidden/>
     <w:unhideWhenUsed/>
     <w:qFormat/>
-    <w:rsid w:val="00BC242A"/>
+    <w:rsid w:val="00D55490"/>
     <w:pPr>
       <w:keepNext/>
       <w:keepLines/>
@@ -768,7 +847,7 @@
     <w:semiHidden/>
     <w:unhideWhenUsed/>
     <w:qFormat/>
-    <w:rsid w:val="00BC242A"/>
+    <w:rsid w:val="00D55490"/>
     <w:pPr>
       <w:keepNext/>
       <w:keepLines/>
@@ -791,7 +870,7 @@
     <w:semiHidden/>
     <w:unhideWhenUsed/>
     <w:qFormat/>
-    <w:rsid w:val="00BC242A"/>
+    <w:rsid w:val="00D55490"/>
     <w:pPr>
       <w:keepNext/>
       <w:keepLines/>
@@ -814,7 +893,7 @@
     <w:semiHidden/>
     <w:unhideWhenUsed/>
     <w:qFormat/>
-    <w:rsid w:val="00BC242A"/>
+    <w:rsid w:val="00D55490"/>
     <w:pPr>
       <w:keepNext/>
       <w:keepLines/>
@@ -835,7 +914,7 @@
     <w:semiHidden/>
     <w:unhideWhenUsed/>
     <w:qFormat/>
-    <w:rsid w:val="00BC242A"/>
+    <w:rsid w:val="00D55490"/>
     <w:pPr>
       <w:keepNext/>
       <w:keepLines/>
@@ -858,7 +937,7 @@
     <w:semiHidden/>
     <w:unhideWhenUsed/>
     <w:qFormat/>
-    <w:rsid w:val="00BC242A"/>
+    <w:rsid w:val="00D55490"/>
     <w:pPr>
       <w:keepNext/>
       <w:keepLines/>
@@ -879,7 +958,7 @@
     <w:semiHidden/>
     <w:unhideWhenUsed/>
     <w:qFormat/>
-    <w:rsid w:val="00BC242A"/>
+    <w:rsid w:val="00D55490"/>
     <w:pPr>
       <w:keepNext/>
       <w:keepLines/>
@@ -902,7 +981,7 @@
     <w:semiHidden/>
     <w:unhideWhenUsed/>
     <w:qFormat/>
-    <w:rsid w:val="00BC242A"/>
+    <w:rsid w:val="00D55490"/>
     <w:pPr>
       <w:keepNext/>
       <w:keepLines/>
@@ -946,7 +1025,7 @@
     <w:basedOn w:val="DefaultParagraphFont"/>
     <w:link w:val="Heading1"/>
     <w:uiPriority w:val="9"/>
-    <w:rsid w:val="00BC242A"/>
+    <w:rsid w:val="00D55490"/>
     <w:rPr>
       <w:rFonts w:asciiTheme="majorHAnsi" w:eastAsiaTheme="majorEastAsia" w:hAnsiTheme="majorHAnsi" w:cstheme="majorBidi"/>
       <w:color w:val="0F4761" w:themeColor="accent1" w:themeShade="BF"/>
@@ -960,7 +1039,7 @@
     <w:link w:val="Heading2"/>
     <w:uiPriority w:val="9"/>
     <w:semiHidden/>
-    <w:rsid w:val="00BC242A"/>
+    <w:rsid w:val="00D55490"/>
     <w:rPr>
       <w:rFonts w:asciiTheme="majorHAnsi" w:eastAsiaTheme="majorEastAsia" w:hAnsiTheme="majorHAnsi" w:cstheme="majorBidi"/>
       <w:color w:val="0F4761" w:themeColor="accent1" w:themeShade="BF"/>
@@ -974,7 +1053,7 @@
     <w:link w:val="Heading3"/>
     <w:uiPriority w:val="9"/>
     <w:semiHidden/>
-    <w:rsid w:val="00BC242A"/>
+    <w:rsid w:val="00D55490"/>
     <w:rPr>
       <w:rFonts w:asciiTheme="minorHAnsi" w:eastAsiaTheme="majorEastAsia" w:hAnsiTheme="minorHAnsi" w:cstheme="majorBidi"/>
       <w:color w:val="0F4761" w:themeColor="accent1" w:themeShade="BF"/>
@@ -988,7 +1067,7 @@
     <w:link w:val="Heading4"/>
     <w:uiPriority w:val="9"/>
     <w:semiHidden/>
-    <w:rsid w:val="00BC242A"/>
+    <w:rsid w:val="00D55490"/>
     <w:rPr>
       <w:rFonts w:asciiTheme="minorHAnsi" w:eastAsiaTheme="majorEastAsia" w:hAnsiTheme="minorHAnsi" w:cstheme="majorBidi"/>
       <w:i/>
@@ -1002,7 +1081,7 @@
     <w:link w:val="Heading5"/>
     <w:uiPriority w:val="9"/>
     <w:semiHidden/>
-    <w:rsid w:val="00BC242A"/>
+    <w:rsid w:val="00D55490"/>
     <w:rPr>
       <w:rFonts w:asciiTheme="minorHAnsi" w:eastAsiaTheme="majorEastAsia" w:hAnsiTheme="minorHAnsi" w:cstheme="majorBidi"/>
       <w:color w:val="0F4761" w:themeColor="accent1" w:themeShade="BF"/>
@@ -1014,7 +1093,7 @@
     <w:link w:val="Heading6"/>
     <w:uiPriority w:val="9"/>
     <w:semiHidden/>
-    <w:rsid w:val="00BC242A"/>
+    <w:rsid w:val="00D55490"/>
     <w:rPr>
       <w:rFonts w:asciiTheme="minorHAnsi" w:eastAsiaTheme="majorEastAsia" w:hAnsiTheme="minorHAnsi" w:cstheme="majorBidi"/>
       <w:i/>
@@ -1028,7 +1107,7 @@
     <w:link w:val="Heading7"/>
     <w:uiPriority w:val="9"/>
     <w:semiHidden/>
-    <w:rsid w:val="00BC242A"/>
+    <w:rsid w:val="00D55490"/>
     <w:rPr>
       <w:rFonts w:asciiTheme="minorHAnsi" w:eastAsiaTheme="majorEastAsia" w:hAnsiTheme="minorHAnsi" w:cstheme="majorBidi"/>
       <w:color w:val="595959" w:themeColor="text1" w:themeTint="A6"/>
@@ -1040,7 +1119,7 @@
     <w:link w:val="Heading8"/>
     <w:uiPriority w:val="9"/>
     <w:semiHidden/>
-    <w:rsid w:val="00BC242A"/>
+    <w:rsid w:val="00D55490"/>
     <w:rPr>
       <w:rFonts w:asciiTheme="minorHAnsi" w:eastAsiaTheme="majorEastAsia" w:hAnsiTheme="minorHAnsi" w:cstheme="majorBidi"/>
       <w:i/>
@@ -1054,7 +1133,7 @@
     <w:link w:val="Heading9"/>
     <w:uiPriority w:val="9"/>
     <w:semiHidden/>
-    <w:rsid w:val="00BC242A"/>
+    <w:rsid w:val="00D55490"/>
     <w:rPr>
       <w:rFonts w:asciiTheme="minorHAnsi" w:eastAsiaTheme="majorEastAsia" w:hAnsiTheme="minorHAnsi" w:cstheme="majorBidi"/>
       <w:color w:val="272727" w:themeColor="text1" w:themeTint="D8"/>
@@ -1067,7 +1146,7 @@
     <w:link w:val="TitleChar"/>
     <w:uiPriority w:val="10"/>
     <w:qFormat/>
-    <w:rsid w:val="00BC242A"/>
+    <w:rsid w:val="00D55490"/>
     <w:pPr>
       <w:spacing w:after="80" w:line="240" w:lineRule="auto"/>
       <w:contextualSpacing/>
@@ -1085,7 +1164,7 @@
     <w:basedOn w:val="DefaultParagraphFont"/>
     <w:link w:val="Title"/>
     <w:uiPriority w:val="10"/>
-    <w:rsid w:val="00BC242A"/>
+    <w:rsid w:val="00D55490"/>
     <w:rPr>
       <w:rFonts w:asciiTheme="majorHAnsi" w:eastAsiaTheme="majorEastAsia" w:hAnsiTheme="majorHAnsi" w:cstheme="majorBidi"/>
       <w:spacing w:val="-10"/>
@@ -1101,7 +1180,7 @@
     <w:link w:val="SubtitleChar"/>
     <w:uiPriority w:val="11"/>
     <w:qFormat/>
-    <w:rsid w:val="00BC242A"/>
+    <w:rsid w:val="00D55490"/>
     <w:pPr>
       <w:numPr>
         <w:ilvl w:val="1"/>
@@ -1120,7 +1199,7 @@
     <w:basedOn w:val="DefaultParagraphFont"/>
     <w:link w:val="Subtitle"/>
     <w:uiPriority w:val="11"/>
-    <w:rsid w:val="00BC242A"/>
+    <w:rsid w:val="00D55490"/>
     <w:rPr>
       <w:rFonts w:asciiTheme="minorHAnsi" w:eastAsiaTheme="majorEastAsia" w:hAnsiTheme="minorHAnsi" w:cstheme="majorBidi"/>
       <w:color w:val="595959" w:themeColor="text1" w:themeTint="A6"/>
@@ -1136,7 +1215,7 @@
     <w:link w:val="QuoteChar"/>
     <w:uiPriority w:val="29"/>
     <w:qFormat/>
-    <w:rsid w:val="00BC242A"/>
+    <w:rsid w:val="00D55490"/>
     <w:pPr>
       <w:spacing w:before="160"/>
       <w:jc w:val="center"/>
@@ -1152,7 +1231,7 @@
     <w:basedOn w:val="DefaultParagraphFont"/>
     <w:link w:val="Quote"/>
     <w:uiPriority w:val="29"/>
-    <w:rsid w:val="00BC242A"/>
+    <w:rsid w:val="00D55490"/>
     <w:rPr>
       <w:i/>
       <w:iCs/>
@@ -1164,7 +1243,7 @@
     <w:basedOn w:val="Normal"/>
     <w:uiPriority w:val="34"/>
     <w:qFormat/>
-    <w:rsid w:val="00BC242A"/>
+    <w:rsid w:val="00D55490"/>
     <w:pPr>
       <w:ind w:left="720"/>
       <w:contextualSpacing/>
@@ -1175,7 +1254,7 @@
     <w:basedOn w:val="DefaultParagraphFont"/>
     <w:uiPriority w:val="21"/>
     <w:qFormat/>
-    <w:rsid w:val="00BC242A"/>
+    <w:rsid w:val="00D55490"/>
     <w:rPr>
       <w:i/>
       <w:iCs/>
@@ -1189,7 +1268,7 @@
     <w:link w:val="IntenseQuoteChar"/>
     <w:uiPriority w:val="30"/>
     <w:qFormat/>
-    <w:rsid w:val="00BC242A"/>
+    <w:rsid w:val="00D55490"/>
     <w:pPr>
       <w:pBdr>
         <w:top w:val="single" w:sz="4" w:space="10" w:color="0F4761" w:themeColor="accent1" w:themeShade="BF"/>
@@ -1210,7 +1289,7 @@
     <w:basedOn w:val="DefaultParagraphFont"/>
     <w:link w:val="IntenseQuote"/>
     <w:uiPriority w:val="30"/>
-    <w:rsid w:val="00BC242A"/>
+    <w:rsid w:val="00D55490"/>
     <w:rPr>
       <w:i/>
       <w:iCs/>
@@ -1222,7 +1301,7 @@
     <w:basedOn w:val="DefaultParagraphFont"/>
     <w:uiPriority w:val="32"/>
     <w:qFormat/>
-    <w:rsid w:val="00BC242A"/>
+    <w:rsid w:val="00D55490"/>
     <w:rPr>
       <w:b/>
       <w:bCs/>
@@ -1237,7 +1316,7 @@
     <w:link w:val="HeaderChar"/>
     <w:uiPriority w:val="99"/>
     <w:unhideWhenUsed/>
-    <w:rsid w:val="00BC242A"/>
+    <w:rsid w:val="00D55490"/>
     <w:pPr>
       <w:tabs>
         <w:tab w:val="center" w:pos="4680"/>
@@ -1251,7 +1330,7 @@
     <w:basedOn w:val="DefaultParagraphFont"/>
     <w:link w:val="Header"/>
     <w:uiPriority w:val="99"/>
-    <w:rsid w:val="00BC242A"/>
+    <w:rsid w:val="00D55490"/>
   </w:style>
   <w:style w:type="paragraph" w:styleId="Footer">
     <w:name w:val="footer"/>
@@ -1259,7 +1338,7 @@
     <w:link w:val="FooterChar"/>
     <w:uiPriority w:val="99"/>
     <w:unhideWhenUsed/>
-    <w:rsid w:val="00BC242A"/>
+    <w:rsid w:val="00D55490"/>
     <w:pPr>
       <w:tabs>
         <w:tab w:val="center" w:pos="4680"/>
@@ -1273,7 +1352,7 @@
     <w:basedOn w:val="DefaultParagraphFont"/>
     <w:link w:val="Footer"/>
     <w:uiPriority w:val="99"/>
-    <w:rsid w:val="00BC242A"/>
+    <w:rsid w:val="00D55490"/>
   </w:style>
 </w:styles>
 </file>

</xml_diff>

<commit_message>
feat: scale borderless table picture to match combined 4 options height, center vertically, and align flush full right with 5mm gap
</commit_message>
<xml_diff>
--- a/output/uln_document.docx
+++ b/output/uln_document.docx
@@ -5,26 +5,42 @@
     <w:p>
       <w:pPr>
         <w:tabs>
-          <w:tab w:val="left" w:pos="5669"/>
+          <w:tab w:val="left" w:pos="4819"/>
         </w:tabs>
         <w:spacing w:before="60" w:after="60"/>
-        <w:ind w:left="5669" w:hanging="5669"/>
+        <w:ind w:left="283"/>
+        <w:rPr>
+          <w:sz w:val="24"/>
+        </w:rPr>
       </w:pPr>
       <w:r>
         <w:rPr>
+          <w:sz w:val="24"/>
+        </w:rPr>
+        <w:t>11. What does the sign (A) say?</w:t>
+      </w:r>
+      <w:r>
+        <w:rPr>
+          <w:sz w:val="24"/>
+        </w:rPr>
+        <w:tab/>
+      </w:r>
+      <w:r>
+        <w:rPr>
           <w:noProof/>
+          <w:sz w:val="24"/>
         </w:rPr>
         <w:drawing>
           <wp:inline distT="0" distB="0" distL="0" distR="0">
             <wp:extent cx="2160000" cy="1440000"/>
             <wp:effectExtent l="0" t="0" r="0" b="8255"/>
-            <wp:docPr id="1590874681" name="Picture 1"/>
+            <wp:docPr id="1604948048" name="Picture 1"/>
             <wp:cNvGraphicFramePr/>
             <a:graphic xmlns:a="http://schemas.openxmlformats.org/drawingml/2006/main">
               <a:graphicData uri="http://schemas.openxmlformats.org/drawingml/2006/picture">
                 <pic:pic xmlns:pic="http://schemas.openxmlformats.org/drawingml/2006/picture">
                   <pic:nvPicPr>
-                    <pic:cNvPr id="1590874681" name=""/>
+                    <pic:cNvPr id="1604948048" name=""/>
                     <pic:cNvPicPr/>
                   </pic:nvPicPr>
                   <pic:blipFill>
@@ -54,57 +70,13 @@
           </wp:inline>
         </w:drawing>
       </w:r>
-      <w:r>
-        <w:tab/>
-      </w:r>
-      <w:r>
-        <w:rPr>
-          <w:noProof/>
-        </w:rPr>
-        <w:drawing>
-          <wp:inline distT="0" distB="0" distL="0" distR="0">
-            <wp:extent cx="2160000" cy="1440000"/>
-            <wp:effectExtent l="0" t="0" r="0" b="8255"/>
-            <wp:docPr id="399795176" name="Picture 2"/>
-            <wp:cNvGraphicFramePr/>
-            <a:graphic xmlns:a="http://schemas.openxmlformats.org/drawingml/2006/main">
-              <a:graphicData uri="http://schemas.openxmlformats.org/drawingml/2006/picture">
-                <pic:pic xmlns:pic="http://schemas.openxmlformats.org/drawingml/2006/picture">
-                  <pic:nvPicPr>
-                    <pic:cNvPr id="399795176" name=""/>
-                    <pic:cNvPicPr/>
-                  </pic:nvPicPr>
-                  <pic:blipFill>
-                    <a:blip r:embed="rId6">
-                      <a:extLst>
-                        <a:ext uri="{28A0092B-C50C-407E-A947-70E740481C1C}">
-                          <a14:useLocalDpi xmlns:a14="http://schemas.microsoft.com/office/drawing/2010/main" val="0"/>
-                        </a:ext>
-                      </a:extLst>
-                    </a:blip>
-                    <a:stretch>
-                      <a:fillRect/>
-                    </a:stretch>
-                  </pic:blipFill>
-                  <pic:spPr>
-                    <a:xfrm>
-                      <a:off x="0" y="0"/>
-                      <a:ext cx="2160000" cy="1440000"/>
-                    </a:xfrm>
-                    <a:prstGeom prst="rect">
-                      <a:avLst/>
-                    </a:prstGeom>
-                  </pic:spPr>
-                </pic:pic>
-              </a:graphicData>
-            </a:graphic>
-          </wp:inline>
-        </w:drawing>
-      </w:r>
     </w:p>
     <w:p>
       <w:pPr>
-        <w:spacing w:before="80" w:after="60"/>
+        <w:tabs>
+          <w:tab w:val="left" w:pos="4819"/>
+        </w:tabs>
+        <w:spacing w:before="60" w:after="60"/>
         <w:ind w:left="283"/>
         <w:rPr>
           <w:sz w:val="24"/>
@@ -121,12 +93,21 @@
         <w:rPr>
           <w:sz w:val="24"/>
         </w:rPr>
-        <w:t xml:space="preserve"> Throw plastic bottles into the water.</w:t>
+        <w:t xml:space="preserve"> Maximum 40 vehicles are allowed on this road.</w:t>
+      </w:r>
+      <w:r>
+        <w:rPr>
+          <w:sz w:val="24"/>
+        </w:rPr>
+        <w:tab/>
       </w:r>
     </w:p>
     <w:p>
       <w:pPr>
-        <w:spacing w:before="80" w:after="60"/>
+        <w:tabs>
+          <w:tab w:val="left" w:pos="4819"/>
+        </w:tabs>
+        <w:spacing w:before="60" w:after="60"/>
         <w:ind w:left="283"/>
         <w:rPr>
           <w:sz w:val="24"/>
@@ -143,12 +124,21 @@
         <w:rPr>
           <w:sz w:val="24"/>
         </w:rPr>
-        <w:t xml:space="preserve"> Throw trash and bottles into the water.</w:t>
+        <w:t xml:space="preserve"> You shouldn't exceed this maximum speed.</w:t>
+      </w:r>
+      <w:r>
+        <w:rPr>
+          <w:sz w:val="24"/>
+        </w:rPr>
+        <w:tab/>
       </w:r>
     </w:p>
     <w:p>
       <w:pPr>
-        <w:spacing w:before="80" w:after="60"/>
+        <w:tabs>
+          <w:tab w:val="left" w:pos="4819"/>
+        </w:tabs>
+        <w:spacing w:before="60" w:after="60"/>
         <w:ind w:left="283"/>
         <w:rPr>
           <w:sz w:val="24"/>
@@ -165,12 +155,21 @@
         <w:rPr>
           <w:sz w:val="24"/>
         </w:rPr>
-        <w:t xml:space="preserve"> Don't throw plastic bottles into the water.</w:t>
+        <w:t xml:space="preserve"> Minimum 40 vehicles are allowed on this road.</w:t>
+      </w:r>
+      <w:r>
+        <w:rPr>
+          <w:sz w:val="24"/>
+        </w:rPr>
+        <w:tab/>
       </w:r>
     </w:p>
     <w:p>
       <w:pPr>
-        <w:spacing w:before="80" w:after="60"/>
+        <w:tabs>
+          <w:tab w:val="left" w:pos="4819"/>
+        </w:tabs>
+        <w:spacing w:before="60" w:after="60"/>
         <w:ind w:left="283"/>
         <w:rPr>
           <w:sz w:val="24"/>
@@ -187,13 +186,18 @@
         <w:rPr>
           <w:sz w:val="24"/>
         </w:rPr>
-        <w:t xml:space="preserve"> Don't pick up plastic bottles in the water.</w:t>
+        <w:t xml:space="preserve"> You shouldn't move below this speed.</w:t>
+      </w:r>
+      <w:r>
+        <w:rPr>
+          <w:sz w:val="24"/>
+        </w:rPr>
+        <w:tab/>
       </w:r>
     </w:p>
     <w:p>
       <w:pPr>
-        <w:spacing w:before="80" w:after="60"/>
-        <w:ind w:left="283"/>
+        <w:spacing w:before="60" w:after="60"/>
         <w:rPr>
           <w:sz w:val="24"/>
         </w:rPr>
@@ -801,7 +805,7 @@
     <w:link w:val="Heading1Char"/>
     <w:uiPriority w:val="9"/>
     <w:qFormat/>
-    <w:rsid w:val="00D55490"/>
+    <w:rsid w:val="004E39CD"/>
     <w:pPr>
       <w:keepNext/>
       <w:keepLines/>
@@ -824,7 +828,7 @@
     <w:semiHidden/>
     <w:unhideWhenUsed/>
     <w:qFormat/>
-    <w:rsid w:val="00D55490"/>
+    <w:rsid w:val="004E39CD"/>
     <w:pPr>
       <w:keepNext/>
       <w:keepLines/>
@@ -847,7 +851,7 @@
     <w:semiHidden/>
     <w:unhideWhenUsed/>
     <w:qFormat/>
-    <w:rsid w:val="00D55490"/>
+    <w:rsid w:val="004E39CD"/>
     <w:pPr>
       <w:keepNext/>
       <w:keepLines/>
@@ -870,7 +874,7 @@
     <w:semiHidden/>
     <w:unhideWhenUsed/>
     <w:qFormat/>
-    <w:rsid w:val="00D55490"/>
+    <w:rsid w:val="004E39CD"/>
     <w:pPr>
       <w:keepNext/>
       <w:keepLines/>
@@ -893,7 +897,7 @@
     <w:semiHidden/>
     <w:unhideWhenUsed/>
     <w:qFormat/>
-    <w:rsid w:val="00D55490"/>
+    <w:rsid w:val="004E39CD"/>
     <w:pPr>
       <w:keepNext/>
       <w:keepLines/>
@@ -914,7 +918,7 @@
     <w:semiHidden/>
     <w:unhideWhenUsed/>
     <w:qFormat/>
-    <w:rsid w:val="00D55490"/>
+    <w:rsid w:val="004E39CD"/>
     <w:pPr>
       <w:keepNext/>
       <w:keepLines/>
@@ -937,7 +941,7 @@
     <w:semiHidden/>
     <w:unhideWhenUsed/>
     <w:qFormat/>
-    <w:rsid w:val="00D55490"/>
+    <w:rsid w:val="004E39CD"/>
     <w:pPr>
       <w:keepNext/>
       <w:keepLines/>
@@ -958,7 +962,7 @@
     <w:semiHidden/>
     <w:unhideWhenUsed/>
     <w:qFormat/>
-    <w:rsid w:val="00D55490"/>
+    <w:rsid w:val="004E39CD"/>
     <w:pPr>
       <w:keepNext/>
       <w:keepLines/>
@@ -981,7 +985,7 @@
     <w:semiHidden/>
     <w:unhideWhenUsed/>
     <w:qFormat/>
-    <w:rsid w:val="00D55490"/>
+    <w:rsid w:val="004E39CD"/>
     <w:pPr>
       <w:keepNext/>
       <w:keepLines/>
@@ -1025,7 +1029,7 @@
     <w:basedOn w:val="DefaultParagraphFont"/>
     <w:link w:val="Heading1"/>
     <w:uiPriority w:val="9"/>
-    <w:rsid w:val="00D55490"/>
+    <w:rsid w:val="004E39CD"/>
     <w:rPr>
       <w:rFonts w:asciiTheme="majorHAnsi" w:eastAsiaTheme="majorEastAsia" w:hAnsiTheme="majorHAnsi" w:cstheme="majorBidi"/>
       <w:color w:val="0F4761" w:themeColor="accent1" w:themeShade="BF"/>
@@ -1039,7 +1043,7 @@
     <w:link w:val="Heading2"/>
     <w:uiPriority w:val="9"/>
     <w:semiHidden/>
-    <w:rsid w:val="00D55490"/>
+    <w:rsid w:val="004E39CD"/>
     <w:rPr>
       <w:rFonts w:asciiTheme="majorHAnsi" w:eastAsiaTheme="majorEastAsia" w:hAnsiTheme="majorHAnsi" w:cstheme="majorBidi"/>
       <w:color w:val="0F4761" w:themeColor="accent1" w:themeShade="BF"/>
@@ -1053,7 +1057,7 @@
     <w:link w:val="Heading3"/>
     <w:uiPriority w:val="9"/>
     <w:semiHidden/>
-    <w:rsid w:val="00D55490"/>
+    <w:rsid w:val="004E39CD"/>
     <w:rPr>
       <w:rFonts w:asciiTheme="minorHAnsi" w:eastAsiaTheme="majorEastAsia" w:hAnsiTheme="minorHAnsi" w:cstheme="majorBidi"/>
       <w:color w:val="0F4761" w:themeColor="accent1" w:themeShade="BF"/>
@@ -1067,7 +1071,7 @@
     <w:link w:val="Heading4"/>
     <w:uiPriority w:val="9"/>
     <w:semiHidden/>
-    <w:rsid w:val="00D55490"/>
+    <w:rsid w:val="004E39CD"/>
     <w:rPr>
       <w:rFonts w:asciiTheme="minorHAnsi" w:eastAsiaTheme="majorEastAsia" w:hAnsiTheme="minorHAnsi" w:cstheme="majorBidi"/>
       <w:i/>
@@ -1081,7 +1085,7 @@
     <w:link w:val="Heading5"/>
     <w:uiPriority w:val="9"/>
     <w:semiHidden/>
-    <w:rsid w:val="00D55490"/>
+    <w:rsid w:val="004E39CD"/>
     <w:rPr>
       <w:rFonts w:asciiTheme="minorHAnsi" w:eastAsiaTheme="majorEastAsia" w:hAnsiTheme="minorHAnsi" w:cstheme="majorBidi"/>
       <w:color w:val="0F4761" w:themeColor="accent1" w:themeShade="BF"/>
@@ -1093,7 +1097,7 @@
     <w:link w:val="Heading6"/>
     <w:uiPriority w:val="9"/>
     <w:semiHidden/>
-    <w:rsid w:val="00D55490"/>
+    <w:rsid w:val="004E39CD"/>
     <w:rPr>
       <w:rFonts w:asciiTheme="minorHAnsi" w:eastAsiaTheme="majorEastAsia" w:hAnsiTheme="minorHAnsi" w:cstheme="majorBidi"/>
       <w:i/>
@@ -1107,7 +1111,7 @@
     <w:link w:val="Heading7"/>
     <w:uiPriority w:val="9"/>
     <w:semiHidden/>
-    <w:rsid w:val="00D55490"/>
+    <w:rsid w:val="004E39CD"/>
     <w:rPr>
       <w:rFonts w:asciiTheme="minorHAnsi" w:eastAsiaTheme="majorEastAsia" w:hAnsiTheme="minorHAnsi" w:cstheme="majorBidi"/>
       <w:color w:val="595959" w:themeColor="text1" w:themeTint="A6"/>
@@ -1119,7 +1123,7 @@
     <w:link w:val="Heading8"/>
     <w:uiPriority w:val="9"/>
     <w:semiHidden/>
-    <w:rsid w:val="00D55490"/>
+    <w:rsid w:val="004E39CD"/>
     <w:rPr>
       <w:rFonts w:asciiTheme="minorHAnsi" w:eastAsiaTheme="majorEastAsia" w:hAnsiTheme="minorHAnsi" w:cstheme="majorBidi"/>
       <w:i/>
@@ -1133,7 +1137,7 @@
     <w:link w:val="Heading9"/>
     <w:uiPriority w:val="9"/>
     <w:semiHidden/>
-    <w:rsid w:val="00D55490"/>
+    <w:rsid w:val="004E39CD"/>
     <w:rPr>
       <w:rFonts w:asciiTheme="minorHAnsi" w:eastAsiaTheme="majorEastAsia" w:hAnsiTheme="minorHAnsi" w:cstheme="majorBidi"/>
       <w:color w:val="272727" w:themeColor="text1" w:themeTint="D8"/>
@@ -1146,7 +1150,7 @@
     <w:link w:val="TitleChar"/>
     <w:uiPriority w:val="10"/>
     <w:qFormat/>
-    <w:rsid w:val="00D55490"/>
+    <w:rsid w:val="004E39CD"/>
     <w:pPr>
       <w:spacing w:after="80" w:line="240" w:lineRule="auto"/>
       <w:contextualSpacing/>
@@ -1164,7 +1168,7 @@
     <w:basedOn w:val="DefaultParagraphFont"/>
     <w:link w:val="Title"/>
     <w:uiPriority w:val="10"/>
-    <w:rsid w:val="00D55490"/>
+    <w:rsid w:val="004E39CD"/>
     <w:rPr>
       <w:rFonts w:asciiTheme="majorHAnsi" w:eastAsiaTheme="majorEastAsia" w:hAnsiTheme="majorHAnsi" w:cstheme="majorBidi"/>
       <w:spacing w:val="-10"/>
@@ -1180,7 +1184,7 @@
     <w:link w:val="SubtitleChar"/>
     <w:uiPriority w:val="11"/>
     <w:qFormat/>
-    <w:rsid w:val="00D55490"/>
+    <w:rsid w:val="004E39CD"/>
     <w:pPr>
       <w:numPr>
         <w:ilvl w:val="1"/>
@@ -1199,7 +1203,7 @@
     <w:basedOn w:val="DefaultParagraphFont"/>
     <w:link w:val="Subtitle"/>
     <w:uiPriority w:val="11"/>
-    <w:rsid w:val="00D55490"/>
+    <w:rsid w:val="004E39CD"/>
     <w:rPr>
       <w:rFonts w:asciiTheme="minorHAnsi" w:eastAsiaTheme="majorEastAsia" w:hAnsiTheme="minorHAnsi" w:cstheme="majorBidi"/>
       <w:color w:val="595959" w:themeColor="text1" w:themeTint="A6"/>
@@ -1215,7 +1219,7 @@
     <w:link w:val="QuoteChar"/>
     <w:uiPriority w:val="29"/>
     <w:qFormat/>
-    <w:rsid w:val="00D55490"/>
+    <w:rsid w:val="004E39CD"/>
     <w:pPr>
       <w:spacing w:before="160"/>
       <w:jc w:val="center"/>
@@ -1231,7 +1235,7 @@
     <w:basedOn w:val="DefaultParagraphFont"/>
     <w:link w:val="Quote"/>
     <w:uiPriority w:val="29"/>
-    <w:rsid w:val="00D55490"/>
+    <w:rsid w:val="004E39CD"/>
     <w:rPr>
       <w:i/>
       <w:iCs/>
@@ -1243,7 +1247,7 @@
     <w:basedOn w:val="Normal"/>
     <w:uiPriority w:val="34"/>
     <w:qFormat/>
-    <w:rsid w:val="00D55490"/>
+    <w:rsid w:val="004E39CD"/>
     <w:pPr>
       <w:ind w:left="720"/>
       <w:contextualSpacing/>
@@ -1254,7 +1258,7 @@
     <w:basedOn w:val="DefaultParagraphFont"/>
     <w:uiPriority w:val="21"/>
     <w:qFormat/>
-    <w:rsid w:val="00D55490"/>
+    <w:rsid w:val="004E39CD"/>
     <w:rPr>
       <w:i/>
       <w:iCs/>
@@ -1268,7 +1272,7 @@
     <w:link w:val="IntenseQuoteChar"/>
     <w:uiPriority w:val="30"/>
     <w:qFormat/>
-    <w:rsid w:val="00D55490"/>
+    <w:rsid w:val="004E39CD"/>
     <w:pPr>
       <w:pBdr>
         <w:top w:val="single" w:sz="4" w:space="10" w:color="0F4761" w:themeColor="accent1" w:themeShade="BF"/>
@@ -1289,7 +1293,7 @@
     <w:basedOn w:val="DefaultParagraphFont"/>
     <w:link w:val="IntenseQuote"/>
     <w:uiPriority w:val="30"/>
-    <w:rsid w:val="00D55490"/>
+    <w:rsid w:val="004E39CD"/>
     <w:rPr>
       <w:i/>
       <w:iCs/>
@@ -1301,7 +1305,7 @@
     <w:basedOn w:val="DefaultParagraphFont"/>
     <w:uiPriority w:val="32"/>
     <w:qFormat/>
-    <w:rsid w:val="00D55490"/>
+    <w:rsid w:val="004E39CD"/>
     <w:rPr>
       <w:b/>
       <w:bCs/>
@@ -1316,7 +1320,7 @@
     <w:link w:val="HeaderChar"/>
     <w:uiPriority w:val="99"/>
     <w:unhideWhenUsed/>
-    <w:rsid w:val="00D55490"/>
+    <w:rsid w:val="004E39CD"/>
     <w:pPr>
       <w:tabs>
         <w:tab w:val="center" w:pos="4680"/>
@@ -1330,7 +1334,7 @@
     <w:basedOn w:val="DefaultParagraphFont"/>
     <w:link w:val="Header"/>
     <w:uiPriority w:val="99"/>
-    <w:rsid w:val="00D55490"/>
+    <w:rsid w:val="004E39CD"/>
   </w:style>
   <w:style w:type="paragraph" w:styleId="Footer">
     <w:name w:val="footer"/>
@@ -1338,7 +1342,7 @@
     <w:link w:val="FooterChar"/>
     <w:uiPriority w:val="99"/>
     <w:unhideWhenUsed/>
-    <w:rsid w:val="00D55490"/>
+    <w:rsid w:val="004E39CD"/>
     <w:pPr>
       <w:tabs>
         <w:tab w:val="center" w:pos="4680"/>
@@ -1352,7 +1356,7 @@
     <w:basedOn w:val="DefaultParagraphFont"/>
     <w:link w:val="Footer"/>
     <w:uiPriority w:val="99"/>
-    <w:rsid w:val="00D55490"/>
+    <w:rsid w:val="004E39CD"/>
   </w:style>
 </w:styles>
 </file>

</xml_diff>

<commit_message>
feat: dynamically calculate picture height to align top with Option A and bottom with Option D, flushed right to margin
</commit_message>
<xml_diff>
--- a/output/uln_document.docx
+++ b/output/uln_document.docx
@@ -17,7 +17,21 @@
         <w:rPr>
           <w:sz w:val="24"/>
         </w:rPr>
-        <w:t>11. What does the sign (A) say?</w:t>
+        <w:t xml:space="preserve">11. What does </w:t>
+      </w:r>
+      <w:proofErr w:type="gramStart"/>
+      <w:r>
+        <w:rPr>
+          <w:sz w:val="24"/>
+        </w:rPr>
+        <w:t>the sign</w:t>
+      </w:r>
+      <w:proofErr w:type="gramEnd"/>
+      <w:r>
+        <w:rPr>
+          <w:sz w:val="24"/>
+        </w:rPr>
+        <w:t xml:space="preserve"> (A) say?</w:t>
       </w:r>
       <w:r>
         <w:rPr>
@@ -25,15 +39,35 @@
         </w:rPr>
         <w:tab/>
       </w:r>
+    </w:p>
+    <w:p>
+      <w:pPr>
+        <w:tabs>
+          <w:tab w:val="left" w:pos="4819"/>
+        </w:tabs>
+        <w:spacing w:before="60" w:after="60"/>
+        <w:ind w:left="283"/>
+        <w:rPr>
+          <w:sz w:val="24"/>
+        </w:rPr>
+      </w:pPr>
       <w:r>
         <w:rPr>
           <w:noProof/>
           <w:sz w:val="24"/>
         </w:rPr>
         <w:drawing>
-          <wp:inline distT="0" distB="0" distL="0" distR="0">
-            <wp:extent cx="2160000" cy="1440000"/>
-            <wp:effectExtent l="0" t="0" r="0" b="8255"/>
+          <wp:anchor distT="0" distB="0" distL="114300" distR="114300" simplePos="0" relativeHeight="251658240" behindDoc="0" locked="0" layoutInCell="1" allowOverlap="1" wp14:anchorId="3EF3197F" wp14:editId="101045E2">
+            <wp:simplePos x="0" y="0"/>
+            <wp:positionH relativeFrom="column">
+              <wp:posOffset>3972850</wp:posOffset>
+            </wp:positionH>
+            <wp:positionV relativeFrom="paragraph">
+              <wp:posOffset>25907</wp:posOffset>
+            </wp:positionV>
+            <wp:extent cx="1783223" cy="940212"/>
+            <wp:effectExtent l="0" t="0" r="7620" b="0"/>
+            <wp:wrapNone/>
             <wp:docPr id="1604948048" name="Picture 1"/>
             <wp:cNvGraphicFramePr/>
             <a:graphic xmlns:a="http://schemas.openxmlformats.org/drawingml/2006/main">
@@ -44,7 +78,7 @@
                     <pic:cNvPicPr/>
                   </pic:nvPicPr>
                   <pic:blipFill>
-                    <a:blip r:embed="rId6">
+                    <a:blip r:embed="rId6" cstate="print">
                       <a:extLst>
                         <a:ext uri="{28A0092B-C50C-407E-A947-70E740481C1C}">
                           <a14:useLocalDpi xmlns:a14="http://schemas.microsoft.com/office/drawing/2010/main" val="0"/>
@@ -58,7 +92,7 @@
                   <pic:spPr>
                     <a:xfrm>
                       <a:off x="0" y="0"/>
-                      <a:ext cx="2160000" cy="1440000"/>
+                      <a:ext cx="1800928" cy="949547"/>
                     </a:xfrm>
                     <a:prstGeom prst="rect">
                       <a:avLst/>
@@ -67,21 +101,15 @@
                 </pic:pic>
               </a:graphicData>
             </a:graphic>
-          </wp:inline>
+            <wp14:sizeRelH relativeFrom="margin">
+              <wp14:pctWidth>0</wp14:pctWidth>
+            </wp14:sizeRelH>
+            <wp14:sizeRelV relativeFrom="margin">
+              <wp14:pctHeight>0</wp14:pctHeight>
+            </wp14:sizeRelV>
+          </wp:anchor>
         </w:drawing>
       </w:r>
-    </w:p>
-    <w:p>
-      <w:pPr>
-        <w:tabs>
-          <w:tab w:val="left" w:pos="4819"/>
-        </w:tabs>
-        <w:spacing w:before="60" w:after="60"/>
-        <w:ind w:left="283"/>
-        <w:rPr>
-          <w:sz w:val="24"/>
-        </w:rPr>
-      </w:pPr>
       <w:r>
         <w:rPr>
           <w:b/>

</xml_diff>

<commit_message>
feat: add Background Mode toggle for 0 mouse freeze and live screen viewport auto-scrolling
</commit_message>
<xml_diff>
--- a/output/uln_document.docx
+++ b/output/uln_document.docx
@@ -4,77 +4,49 @@
   <w:body>
     <w:p>
       <w:pPr>
-        <w:tabs>
-          <w:tab w:val="left" w:pos="4819"/>
-        </w:tabs>
-        <w:spacing w:before="60" w:after="60"/>
-        <w:ind w:left="283"/>
-        <w:rPr>
-          <w:sz w:val="24"/>
-        </w:rPr>
-      </w:pPr>
-      <w:r>
-        <w:rPr>
-          <w:sz w:val="24"/>
-        </w:rPr>
-        <w:t xml:space="preserve">11. What does </w:t>
-      </w:r>
-      <w:proofErr w:type="gramStart"/>
-      <w:r>
-        <w:rPr>
-          <w:sz w:val="24"/>
-        </w:rPr>
-        <w:t>the sign</w:t>
-      </w:r>
-      <w:proofErr w:type="gramEnd"/>
-      <w:r>
-        <w:rPr>
-          <w:sz w:val="24"/>
-        </w:rPr>
-        <w:t xml:space="preserve"> (A) say?</w:t>
-      </w:r>
-      <w:r>
-        <w:rPr>
-          <w:sz w:val="24"/>
-        </w:rPr>
-        <w:tab/>
-      </w:r>
-    </w:p>
-    <w:p>
-      <w:pPr>
-        <w:tabs>
-          <w:tab w:val="left" w:pos="4819"/>
-        </w:tabs>
-        <w:spacing w:before="60" w:after="60"/>
-        <w:ind w:left="283"/>
-        <w:rPr>
-          <w:sz w:val="24"/>
-        </w:rPr>
-      </w:pPr>
+        <w:spacing w:before="120" w:after="80"/>
+        <w:rPr>
+          <w:b/>
+          <w:sz w:val="24"/>
+        </w:rPr>
+      </w:pPr>
+      <w:r>
+        <w:rPr>
+          <w:b/>
+          <w:sz w:val="24"/>
+        </w:rPr>
+        <w:t>II. What does the sign say? Choose the correct answer.</w:t>
+      </w:r>
+    </w:p>
+    <w:p>
+      <w:pPr>
+        <w:spacing w:before="120" w:after="80"/>
+        <w:rPr>
+          <w:sz w:val="24"/>
+        </w:rPr>
+      </w:pPr>
+      <w:r>
+        <w:rPr>
+          <w:sz w:val="24"/>
+        </w:rPr>
+        <w:t xml:space="preserve">[TAB2: borderless] </w:t>
+      </w:r>
       <w:r>
         <w:rPr>
           <w:noProof/>
           <w:sz w:val="24"/>
         </w:rPr>
         <w:drawing>
-          <wp:anchor distT="0" distB="0" distL="114300" distR="114300" simplePos="0" relativeHeight="251658240" behindDoc="0" locked="0" layoutInCell="1" allowOverlap="1" wp14:anchorId="3EF3197F" wp14:editId="101045E2">
-            <wp:simplePos x="0" y="0"/>
-            <wp:positionH relativeFrom="column">
-              <wp:posOffset>3972850</wp:posOffset>
-            </wp:positionH>
-            <wp:positionV relativeFrom="paragraph">
-              <wp:posOffset>25907</wp:posOffset>
-            </wp:positionV>
-            <wp:extent cx="1783223" cy="940212"/>
-            <wp:effectExtent l="0" t="0" r="7620" b="0"/>
-            <wp:wrapNone/>
-            <wp:docPr id="1604948048" name="Picture 1"/>
+          <wp:inline distT="0" distB="0" distL="0" distR="0">
+            <wp:extent cx="2160000" cy="1440000"/>
+            <wp:effectExtent l="0" t="0" r="0" b="8255"/>
+            <wp:docPr id="2018372788" name="Picture 1"/>
             <wp:cNvGraphicFramePr/>
             <a:graphic xmlns:a="http://schemas.openxmlformats.org/drawingml/2006/main">
               <a:graphicData uri="http://schemas.openxmlformats.org/drawingml/2006/picture">
                 <pic:pic xmlns:pic="http://schemas.openxmlformats.org/drawingml/2006/picture">
                   <pic:nvPicPr>
-                    <pic:cNvPr id="1604948048" name=""/>
+                    <pic:cNvPr id="2018372788" name=""/>
                     <pic:cNvPicPr/>
                   </pic:nvPicPr>
                   <pic:blipFill>
@@ -92,7 +64,7 @@
                   <pic:spPr>
                     <a:xfrm>
                       <a:off x="0" y="0"/>
-                      <a:ext cx="1800928" cy="949547"/>
+                      <a:ext cx="2160000" cy="1440000"/>
                     </a:xfrm>
                     <a:prstGeom prst="rect">
                       <a:avLst/>
@@ -101,17 +73,26 @@
                 </pic:pic>
               </a:graphicData>
             </a:graphic>
-            <wp14:sizeRelH relativeFrom="margin">
-              <wp14:pctWidth>0</wp14:pctWidth>
-            </wp14:sizeRelH>
-            <wp14:sizeRelV relativeFrom="margin">
-              <wp14:pctHeight>0</wp14:pctHeight>
-            </wp14:sizeRelV>
-          </wp:anchor>
+          </wp:inline>
         </w:drawing>
       </w:r>
       <w:r>
         <w:rPr>
+          <w:sz w:val="24"/>
+        </w:rPr>
+        <w:t xml:space="preserve"> | [P0] 1. What does this sign mean?</w:t>
+      </w:r>
+    </w:p>
+    <w:p>
+      <w:pPr>
+        <w:spacing w:before="80" w:after="60"/>
+        <w:ind w:left="283"/>
+        <w:rPr>
+          <w:sz w:val="24"/>
+        </w:rPr>
+      </w:pPr>
+      <w:r>
+        <w:rPr>
           <w:b/>
           <w:sz w:val="24"/>
         </w:rPr>
@@ -121,21 +102,12 @@
         <w:rPr>
           <w:sz w:val="24"/>
         </w:rPr>
-        <w:t xml:space="preserve"> Maximum 40 vehicles are allowed on this road.</w:t>
-      </w:r>
-      <w:r>
-        <w:rPr>
-          <w:sz w:val="24"/>
-        </w:rPr>
-        <w:tab/>
-      </w:r>
-    </w:p>
-    <w:p>
-      <w:pPr>
-        <w:tabs>
-          <w:tab w:val="left" w:pos="4819"/>
-        </w:tabs>
-        <w:spacing w:before="60" w:after="60"/>
+        <w:t xml:space="preserve"> You must turn left here.</w:t>
+      </w:r>
+    </w:p>
+    <w:p>
+      <w:pPr>
+        <w:spacing w:before="80" w:after="60"/>
         <w:ind w:left="283"/>
         <w:rPr>
           <w:sz w:val="24"/>
@@ -152,21 +124,12 @@
         <w:rPr>
           <w:sz w:val="24"/>
         </w:rPr>
-        <w:t xml:space="preserve"> You shouldn't exceed this maximum speed.</w:t>
-      </w:r>
-      <w:r>
-        <w:rPr>
-          <w:sz w:val="24"/>
-        </w:rPr>
-        <w:tab/>
-      </w:r>
-    </w:p>
-    <w:p>
-      <w:pPr>
-        <w:tabs>
-          <w:tab w:val="left" w:pos="4819"/>
-        </w:tabs>
-        <w:spacing w:before="60" w:after="60"/>
+        <w:t xml:space="preserve"> You cannot turn left.</w:t>
+      </w:r>
+    </w:p>
+    <w:p>
+      <w:pPr>
+        <w:spacing w:before="80" w:after="60"/>
         <w:ind w:left="283"/>
         <w:rPr>
           <w:sz w:val="24"/>
@@ -183,21 +146,12 @@
         <w:rPr>
           <w:sz w:val="24"/>
         </w:rPr>
-        <w:t xml:space="preserve"> Minimum 40 vehicles are allowed on this road.</w:t>
-      </w:r>
-      <w:r>
-        <w:rPr>
-          <w:sz w:val="24"/>
-        </w:rPr>
-        <w:tab/>
-      </w:r>
-    </w:p>
-    <w:p>
-      <w:pPr>
-        <w:tabs>
-          <w:tab w:val="left" w:pos="4819"/>
-        </w:tabs>
-        <w:spacing w:before="60" w:after="60"/>
+        <w:t xml:space="preserve"> Left turn is allowed for buses only.</w:t>
+      </w:r>
+    </w:p>
+    <w:p>
+      <w:pPr>
+        <w:spacing w:before="80" w:after="60"/>
         <w:ind w:left="283"/>
         <w:rPr>
           <w:sz w:val="24"/>
@@ -214,30 +168,2734 @@
         <w:rPr>
           <w:sz w:val="24"/>
         </w:rPr>
-        <w:t xml:space="preserve"> You shouldn't move below this speed.</w:t>
-      </w:r>
-      <w:r>
-        <w:rPr>
-          <w:sz w:val="24"/>
-        </w:rPr>
-        <w:tab/>
-      </w:r>
-    </w:p>
-    <w:p>
-      <w:pPr>
-        <w:spacing w:before="60" w:after="60"/>
+        <w:t xml:space="preserve"> Parking on the left is forbidden.</w:t>
+      </w:r>
+    </w:p>
+    <w:p>
+      <w:pPr>
+        <w:spacing w:before="120" w:after="80"/>
+        <w:rPr>
+          <w:b/>
+          <w:sz w:val="24"/>
+        </w:rPr>
+      </w:pPr>
+      <w:r>
+        <w:rPr>
+          <w:b/>
+          <w:sz w:val="24"/>
+        </w:rPr>
+        <w:t>II. What does the sign say? Choose the correct answer.</w:t>
+      </w:r>
+    </w:p>
+    <w:p>
+      <w:pPr>
+        <w:spacing w:before="120" w:after="80"/>
+        <w:rPr>
+          <w:sz w:val="24"/>
+        </w:rPr>
+      </w:pPr>
+      <w:r>
+        <w:rPr>
+          <w:sz w:val="24"/>
+        </w:rPr>
+        <w:t xml:space="preserve">[TAB2: borderless] </w:t>
+      </w:r>
+      <w:r>
+        <w:rPr>
+          <w:noProof/>
+          <w:sz w:val="24"/>
+        </w:rPr>
+        <w:drawing>
+          <wp:inline distT="0" distB="0" distL="0" distR="0">
+            <wp:extent cx="2160000" cy="1440000"/>
+            <wp:effectExtent l="0" t="0" r="0" b="8255"/>
+            <wp:docPr id="974214335" name="Picture 2"/>
+            <wp:cNvGraphicFramePr/>
+            <a:graphic xmlns:a="http://schemas.openxmlformats.org/drawingml/2006/main">
+              <a:graphicData uri="http://schemas.openxmlformats.org/drawingml/2006/picture">
+                <pic:pic xmlns:pic="http://schemas.openxmlformats.org/drawingml/2006/picture">
+                  <pic:nvPicPr>
+                    <pic:cNvPr id="974214335" name=""/>
+                    <pic:cNvPicPr/>
+                  </pic:nvPicPr>
+                  <pic:blipFill>
+                    <a:blip r:embed="rId7">
+                      <a:extLst>
+                        <a:ext uri="{28A0092B-C50C-407E-A947-70E740481C1C}">
+                          <a14:useLocalDpi xmlns:a14="http://schemas.microsoft.com/office/drawing/2010/main" val="0"/>
+                        </a:ext>
+                      </a:extLst>
+                    </a:blip>
+                    <a:stretch>
+                      <a:fillRect/>
+                    </a:stretch>
+                  </pic:blipFill>
+                  <pic:spPr>
+                    <a:xfrm>
+                      <a:off x="0" y="0"/>
+                      <a:ext cx="2160000" cy="1440000"/>
+                    </a:xfrm>
+                    <a:prstGeom prst="rect">
+                      <a:avLst/>
+                    </a:prstGeom>
+                  </pic:spPr>
+                </pic:pic>
+              </a:graphicData>
+            </a:graphic>
+          </wp:inline>
+        </w:drawing>
+      </w:r>
+      <w:r>
+        <w:rPr>
+          <w:sz w:val="24"/>
+        </w:rPr>
+        <w:t xml:space="preserve"> | [P0] 1. What does this sign mean?</w:t>
+      </w:r>
+    </w:p>
+    <w:p>
+      <w:pPr>
+        <w:spacing w:before="80" w:after="60"/>
+        <w:ind w:left="283"/>
+        <w:rPr>
+          <w:sz w:val="24"/>
+        </w:rPr>
+      </w:pPr>
+      <w:r>
+        <w:rPr>
+          <w:b/>
+          <w:sz w:val="24"/>
+        </w:rPr>
+        <w:t xml:space="preserve">A. </w:t>
+      </w:r>
+      <w:r>
+        <w:rPr>
+          <w:sz w:val="24"/>
+        </w:rPr>
+        <w:t xml:space="preserve"> You must turn left here.</w:t>
+      </w:r>
+    </w:p>
+    <w:p>
+      <w:pPr>
+        <w:spacing w:before="80" w:after="60"/>
+        <w:ind w:left="283"/>
+        <w:rPr>
+          <w:sz w:val="24"/>
+        </w:rPr>
+      </w:pPr>
+      <w:r>
+        <w:rPr>
+          <w:b/>
+          <w:sz w:val="24"/>
+        </w:rPr>
+        <w:t xml:space="preserve">B. </w:t>
+      </w:r>
+      <w:r>
+        <w:rPr>
+          <w:sz w:val="24"/>
+        </w:rPr>
+        <w:t xml:space="preserve"> You cannot turn left.</w:t>
+      </w:r>
+    </w:p>
+    <w:p>
+      <w:pPr>
+        <w:spacing w:before="80" w:after="60"/>
+        <w:ind w:left="283"/>
+        <w:rPr>
+          <w:sz w:val="24"/>
+        </w:rPr>
+      </w:pPr>
+      <w:r>
+        <w:rPr>
+          <w:b/>
+          <w:sz w:val="24"/>
+        </w:rPr>
+        <w:t xml:space="preserve">C. </w:t>
+      </w:r>
+      <w:r>
+        <w:rPr>
+          <w:sz w:val="24"/>
+        </w:rPr>
+        <w:t xml:space="preserve"> Left turn is allowed for buses only.</w:t>
+      </w:r>
+    </w:p>
+    <w:p>
+      <w:pPr>
+        <w:spacing w:before="80" w:after="60"/>
+        <w:ind w:left="283"/>
+        <w:rPr>
+          <w:sz w:val="24"/>
+        </w:rPr>
+      </w:pPr>
+      <w:r>
+        <w:rPr>
+          <w:b/>
+          <w:sz w:val="24"/>
+        </w:rPr>
+        <w:t xml:space="preserve">D. </w:t>
+      </w:r>
+      <w:r>
+        <w:rPr>
+          <w:sz w:val="24"/>
+        </w:rPr>
+        <w:t xml:space="preserve"> Parking on the left is forbidden.</w:t>
+      </w:r>
+    </w:p>
+    <w:p>
+      <w:pPr>
+        <w:spacing w:before="120" w:after="80"/>
+        <w:rPr>
+          <w:b/>
+          <w:sz w:val="24"/>
+        </w:rPr>
+      </w:pPr>
+      <w:r>
+        <w:rPr>
+          <w:b/>
+          <w:sz w:val="24"/>
+        </w:rPr>
+        <w:t>II. What does the sign say? Choose the correct answer.</w:t>
+      </w:r>
+    </w:p>
+    <w:p>
+      <w:pPr>
+        <w:spacing w:before="120" w:after="80"/>
+        <w:rPr>
+          <w:sz w:val="24"/>
+        </w:rPr>
+      </w:pPr>
+      <w:r>
+        <w:rPr>
+          <w:sz w:val="24"/>
+        </w:rPr>
+        <w:t xml:space="preserve">[TAB2: borderless] </w:t>
+      </w:r>
+      <w:r>
+        <w:rPr>
+          <w:noProof/>
+          <w:sz w:val="24"/>
+        </w:rPr>
+        <w:drawing>
+          <wp:inline distT="0" distB="0" distL="0" distR="0">
+            <wp:extent cx="2160000" cy="1440000"/>
+            <wp:effectExtent l="0" t="0" r="0" b="8255"/>
+            <wp:docPr id="892310409" name="Picture 3"/>
+            <wp:cNvGraphicFramePr/>
+            <a:graphic xmlns:a="http://schemas.openxmlformats.org/drawingml/2006/main">
+              <a:graphicData uri="http://schemas.openxmlformats.org/drawingml/2006/picture">
+                <pic:pic xmlns:pic="http://schemas.openxmlformats.org/drawingml/2006/picture">
+                  <pic:nvPicPr>
+                    <pic:cNvPr id="892310409" name=""/>
+                    <pic:cNvPicPr/>
+                  </pic:nvPicPr>
+                  <pic:blipFill>
+                    <a:blip r:embed="rId8">
+                      <a:extLst>
+                        <a:ext uri="{28A0092B-C50C-407E-A947-70E740481C1C}">
+                          <a14:useLocalDpi xmlns:a14="http://schemas.microsoft.com/office/drawing/2010/main" val="0"/>
+                        </a:ext>
+                      </a:extLst>
+                    </a:blip>
+                    <a:stretch>
+                      <a:fillRect/>
+                    </a:stretch>
+                  </pic:blipFill>
+                  <pic:spPr>
+                    <a:xfrm>
+                      <a:off x="0" y="0"/>
+                      <a:ext cx="2160000" cy="1440000"/>
+                    </a:xfrm>
+                    <a:prstGeom prst="rect">
+                      <a:avLst/>
+                    </a:prstGeom>
+                  </pic:spPr>
+                </pic:pic>
+              </a:graphicData>
+            </a:graphic>
+          </wp:inline>
+        </w:drawing>
+      </w:r>
+      <w:r>
+        <w:rPr>
+          <w:sz w:val="24"/>
+        </w:rPr>
+        <w:t xml:space="preserve"> | [P0] 1. What does this sign mean?</w:t>
+      </w:r>
+    </w:p>
+    <w:p>
+      <w:pPr>
+        <w:spacing w:before="80" w:after="60"/>
+        <w:ind w:left="283"/>
+        <w:rPr>
+          <w:sz w:val="24"/>
+        </w:rPr>
+      </w:pPr>
+      <w:r>
+        <w:rPr>
+          <w:b/>
+          <w:sz w:val="24"/>
+        </w:rPr>
+        <w:t xml:space="preserve">A. </w:t>
+      </w:r>
+      <w:r>
+        <w:rPr>
+          <w:sz w:val="24"/>
+        </w:rPr>
+        <w:t xml:space="preserve"> You must turn left here.</w:t>
+      </w:r>
+    </w:p>
+    <w:p>
+      <w:pPr>
+        <w:spacing w:before="80" w:after="60"/>
+        <w:ind w:left="283"/>
+        <w:rPr>
+          <w:sz w:val="24"/>
+        </w:rPr>
+      </w:pPr>
+      <w:r>
+        <w:rPr>
+          <w:b/>
+          <w:sz w:val="24"/>
+        </w:rPr>
+        <w:t xml:space="preserve">B. </w:t>
+      </w:r>
+      <w:r>
+        <w:rPr>
+          <w:sz w:val="24"/>
+        </w:rPr>
+        <w:t xml:space="preserve"> You cannot turn left.</w:t>
+      </w:r>
+    </w:p>
+    <w:p>
+      <w:pPr>
+        <w:spacing w:before="80" w:after="60"/>
+        <w:ind w:left="283"/>
+        <w:rPr>
+          <w:sz w:val="24"/>
+        </w:rPr>
+      </w:pPr>
+      <w:r>
+        <w:rPr>
+          <w:b/>
+          <w:sz w:val="24"/>
+        </w:rPr>
+        <w:t xml:space="preserve">C. </w:t>
+      </w:r>
+      <w:r>
+        <w:rPr>
+          <w:sz w:val="24"/>
+        </w:rPr>
+        <w:t xml:space="preserve"> Left turn is allowed for buses only.</w:t>
+      </w:r>
+    </w:p>
+    <w:p>
+      <w:pPr>
+        <w:spacing w:before="80" w:after="60"/>
+        <w:ind w:left="283"/>
+        <w:rPr>
+          <w:sz w:val="24"/>
+        </w:rPr>
+      </w:pPr>
+      <w:r>
+        <w:rPr>
+          <w:b/>
+          <w:sz w:val="24"/>
+        </w:rPr>
+        <w:t xml:space="preserve">D. </w:t>
+      </w:r>
+      <w:r>
+        <w:rPr>
+          <w:sz w:val="24"/>
+        </w:rPr>
+        <w:t xml:space="preserve"> Parking on the left is forbidden.</w:t>
+      </w:r>
+    </w:p>
+    <w:p>
+      <w:pPr>
+        <w:spacing w:before="120" w:after="80"/>
+        <w:rPr>
+          <w:b/>
+          <w:sz w:val="24"/>
+        </w:rPr>
+      </w:pPr>
+      <w:r>
+        <w:rPr>
+          <w:b/>
+          <w:sz w:val="24"/>
+        </w:rPr>
+        <w:t>II. What does the sign say? Choose the correct answer.</w:t>
+      </w:r>
+    </w:p>
+    <w:p>
+      <w:pPr>
+        <w:spacing w:before="120" w:after="80"/>
+        <w:rPr>
+          <w:sz w:val="24"/>
+        </w:rPr>
+      </w:pPr>
+      <w:r>
+        <w:rPr>
+          <w:sz w:val="24"/>
+        </w:rPr>
+        <w:lastRenderedPageBreak/>
+        <w:t xml:space="preserve">[TAB2: borderless] </w:t>
+      </w:r>
+      <w:r>
+        <w:rPr>
+          <w:noProof/>
+          <w:sz w:val="24"/>
+        </w:rPr>
+        <w:drawing>
+          <wp:inline distT="0" distB="0" distL="0" distR="0">
+            <wp:extent cx="2160000" cy="1440000"/>
+            <wp:effectExtent l="0" t="0" r="0" b="8255"/>
+            <wp:docPr id="1974192293" name="Picture 4"/>
+            <wp:cNvGraphicFramePr/>
+            <a:graphic xmlns:a="http://schemas.openxmlformats.org/drawingml/2006/main">
+              <a:graphicData uri="http://schemas.openxmlformats.org/drawingml/2006/picture">
+                <pic:pic xmlns:pic="http://schemas.openxmlformats.org/drawingml/2006/picture">
+                  <pic:nvPicPr>
+                    <pic:cNvPr id="1974192293" name=""/>
+                    <pic:cNvPicPr/>
+                  </pic:nvPicPr>
+                  <pic:blipFill>
+                    <a:blip r:embed="rId8">
+                      <a:extLst>
+                        <a:ext uri="{28A0092B-C50C-407E-A947-70E740481C1C}">
+                          <a14:useLocalDpi xmlns:a14="http://schemas.microsoft.com/office/drawing/2010/main" val="0"/>
+                        </a:ext>
+                      </a:extLst>
+                    </a:blip>
+                    <a:stretch>
+                      <a:fillRect/>
+                    </a:stretch>
+                  </pic:blipFill>
+                  <pic:spPr>
+                    <a:xfrm>
+                      <a:off x="0" y="0"/>
+                      <a:ext cx="2160000" cy="1440000"/>
+                    </a:xfrm>
+                    <a:prstGeom prst="rect">
+                      <a:avLst/>
+                    </a:prstGeom>
+                  </pic:spPr>
+                </pic:pic>
+              </a:graphicData>
+            </a:graphic>
+          </wp:inline>
+        </w:drawing>
+      </w:r>
+      <w:r>
+        <w:rPr>
+          <w:sz w:val="24"/>
+        </w:rPr>
+        <w:t xml:space="preserve"> | [P0] 1. What does this sign mean?</w:t>
+      </w:r>
+    </w:p>
+    <w:p>
+      <w:pPr>
+        <w:spacing w:before="80" w:after="60"/>
+        <w:ind w:left="283"/>
+        <w:rPr>
+          <w:sz w:val="24"/>
+        </w:rPr>
+      </w:pPr>
+      <w:r>
+        <w:rPr>
+          <w:b/>
+          <w:sz w:val="24"/>
+        </w:rPr>
+        <w:t xml:space="preserve">A. </w:t>
+      </w:r>
+      <w:r>
+        <w:rPr>
+          <w:sz w:val="24"/>
+        </w:rPr>
+        <w:t xml:space="preserve"> You must turn left here.</w:t>
+      </w:r>
+    </w:p>
+    <w:p>
+      <w:pPr>
+        <w:spacing w:before="80" w:after="60"/>
+        <w:ind w:left="283"/>
+        <w:rPr>
+          <w:sz w:val="24"/>
+        </w:rPr>
+      </w:pPr>
+      <w:r>
+        <w:rPr>
+          <w:b/>
+          <w:sz w:val="24"/>
+        </w:rPr>
+        <w:t xml:space="preserve">B. </w:t>
+      </w:r>
+      <w:r>
+        <w:rPr>
+          <w:sz w:val="24"/>
+        </w:rPr>
+        <w:t xml:space="preserve"> You cannot turn left.</w:t>
+      </w:r>
+    </w:p>
+    <w:p>
+      <w:pPr>
+        <w:spacing w:before="80" w:after="60"/>
+        <w:ind w:left="283"/>
+        <w:rPr>
+          <w:sz w:val="24"/>
+        </w:rPr>
+      </w:pPr>
+      <w:r>
+        <w:rPr>
+          <w:b/>
+          <w:sz w:val="24"/>
+        </w:rPr>
+        <w:t xml:space="preserve">C. </w:t>
+      </w:r>
+      <w:r>
+        <w:rPr>
+          <w:sz w:val="24"/>
+        </w:rPr>
+        <w:t xml:space="preserve"> Left turn is allowed for buses only.</w:t>
+      </w:r>
+    </w:p>
+    <w:p>
+      <w:pPr>
+        <w:spacing w:before="80" w:after="60"/>
+        <w:ind w:left="283"/>
+        <w:rPr>
+          <w:sz w:val="24"/>
+        </w:rPr>
+      </w:pPr>
+      <w:r>
+        <w:rPr>
+          <w:b/>
+          <w:sz w:val="24"/>
+        </w:rPr>
+        <w:t xml:space="preserve">D. </w:t>
+      </w:r>
+      <w:r>
+        <w:rPr>
+          <w:sz w:val="24"/>
+        </w:rPr>
+        <w:t xml:space="preserve"> Parking on the left is forbidden.</w:t>
+      </w:r>
+    </w:p>
+    <w:p>
+      <w:pPr>
+        <w:spacing w:before="120" w:after="80"/>
+        <w:rPr>
+          <w:b/>
+          <w:sz w:val="24"/>
+        </w:rPr>
+      </w:pPr>
+      <w:r>
+        <w:rPr>
+          <w:b/>
+          <w:sz w:val="24"/>
+        </w:rPr>
+        <w:t>II. What does the sign say? Choose the correct answer.</w:t>
+      </w:r>
+    </w:p>
+    <w:p>
+      <w:pPr>
+        <w:spacing w:before="120" w:after="80"/>
+        <w:rPr>
+          <w:sz w:val="24"/>
+        </w:rPr>
+      </w:pPr>
+      <w:r>
+        <w:rPr>
+          <w:sz w:val="24"/>
+        </w:rPr>
+        <w:t xml:space="preserve">[TAB2: borderless] </w:t>
+      </w:r>
+      <w:r>
+        <w:rPr>
+          <w:noProof/>
+          <w:sz w:val="24"/>
+        </w:rPr>
+        <w:drawing>
+          <wp:inline distT="0" distB="0" distL="0" distR="0">
+            <wp:extent cx="2160000" cy="1440000"/>
+            <wp:effectExtent l="0" t="0" r="0" b="8255"/>
+            <wp:docPr id="1846862289" name="Picture 5"/>
+            <wp:cNvGraphicFramePr/>
+            <a:graphic xmlns:a="http://schemas.openxmlformats.org/drawingml/2006/main">
+              <a:graphicData uri="http://schemas.openxmlformats.org/drawingml/2006/picture">
+                <pic:pic xmlns:pic="http://schemas.openxmlformats.org/drawingml/2006/picture">
+                  <pic:nvPicPr>
+                    <pic:cNvPr id="1846862289" name=""/>
+                    <pic:cNvPicPr/>
+                  </pic:nvPicPr>
+                  <pic:blipFill>
+                    <a:blip r:embed="rId8">
+                      <a:extLst>
+                        <a:ext uri="{28A0092B-C50C-407E-A947-70E740481C1C}">
+                          <a14:useLocalDpi xmlns:a14="http://schemas.microsoft.com/office/drawing/2010/main" val="0"/>
+                        </a:ext>
+                      </a:extLst>
+                    </a:blip>
+                    <a:stretch>
+                      <a:fillRect/>
+                    </a:stretch>
+                  </pic:blipFill>
+                  <pic:spPr>
+                    <a:xfrm>
+                      <a:off x="0" y="0"/>
+                      <a:ext cx="2160000" cy="1440000"/>
+                    </a:xfrm>
+                    <a:prstGeom prst="rect">
+                      <a:avLst/>
+                    </a:prstGeom>
+                  </pic:spPr>
+                </pic:pic>
+              </a:graphicData>
+            </a:graphic>
+          </wp:inline>
+        </w:drawing>
+      </w:r>
+      <w:r>
+        <w:rPr>
+          <w:sz w:val="24"/>
+        </w:rPr>
+        <w:t xml:space="preserve"> | [P0] 1. What does this sign mean?</w:t>
+      </w:r>
+    </w:p>
+    <w:p>
+      <w:pPr>
+        <w:spacing w:before="80" w:after="60"/>
+        <w:ind w:left="283"/>
+        <w:rPr>
+          <w:sz w:val="24"/>
+        </w:rPr>
+      </w:pPr>
+      <w:r>
+        <w:rPr>
+          <w:b/>
+          <w:sz w:val="24"/>
+        </w:rPr>
+        <w:t xml:space="preserve">A. </w:t>
+      </w:r>
+      <w:r>
+        <w:rPr>
+          <w:sz w:val="24"/>
+        </w:rPr>
+        <w:t xml:space="preserve"> You must turn left here.</w:t>
+      </w:r>
+    </w:p>
+    <w:p>
+      <w:pPr>
+        <w:spacing w:before="80" w:after="60"/>
+        <w:ind w:left="283"/>
+        <w:rPr>
+          <w:sz w:val="24"/>
+        </w:rPr>
+      </w:pPr>
+      <w:r>
+        <w:rPr>
+          <w:b/>
+          <w:sz w:val="24"/>
+        </w:rPr>
+        <w:t xml:space="preserve">B. </w:t>
+      </w:r>
+      <w:r>
+        <w:rPr>
+          <w:sz w:val="24"/>
+        </w:rPr>
+        <w:t xml:space="preserve"> You cannot turn left.</w:t>
+      </w:r>
+    </w:p>
+    <w:p>
+      <w:pPr>
+        <w:spacing w:before="80" w:after="60"/>
+        <w:ind w:left="283"/>
+        <w:rPr>
+          <w:sz w:val="24"/>
+        </w:rPr>
+      </w:pPr>
+      <w:r>
+        <w:rPr>
+          <w:b/>
+          <w:sz w:val="24"/>
+        </w:rPr>
+        <w:t xml:space="preserve">C. </w:t>
+      </w:r>
+      <w:r>
+        <w:rPr>
+          <w:sz w:val="24"/>
+        </w:rPr>
+        <w:t xml:space="preserve"> Left turn is allowed for buses only.</w:t>
+      </w:r>
+    </w:p>
+    <w:p>
+      <w:pPr>
+        <w:spacing w:before="80" w:after="60"/>
+        <w:ind w:left="283"/>
+        <w:rPr>
+          <w:sz w:val="24"/>
+        </w:rPr>
+      </w:pPr>
+      <w:r>
+        <w:rPr>
+          <w:b/>
+          <w:sz w:val="24"/>
+        </w:rPr>
+        <w:t xml:space="preserve">D. </w:t>
+      </w:r>
+      <w:r>
+        <w:rPr>
+          <w:sz w:val="24"/>
+        </w:rPr>
+        <w:t xml:space="preserve"> Parking on the left is forbidden.</w:t>
+      </w:r>
+    </w:p>
+    <w:p>
+      <w:pPr>
+        <w:spacing w:before="120" w:after="80"/>
+        <w:rPr>
+          <w:b/>
+          <w:sz w:val="24"/>
+        </w:rPr>
+      </w:pPr>
+      <w:r>
+        <w:rPr>
+          <w:b/>
+          <w:sz w:val="24"/>
+        </w:rPr>
+        <w:t>II. What does the sign say? Choose the correct answer.</w:t>
+      </w:r>
+    </w:p>
+    <w:p>
+      <w:pPr>
+        <w:spacing w:before="120" w:after="80"/>
+        <w:rPr>
+          <w:sz w:val="24"/>
+        </w:rPr>
+      </w:pPr>
+      <w:r>
+        <w:rPr>
+          <w:sz w:val="24"/>
+        </w:rPr>
+        <w:t xml:space="preserve">[TAB2: borderless] </w:t>
+      </w:r>
+      <w:r>
+        <w:rPr>
+          <w:noProof/>
+          <w:sz w:val="24"/>
+        </w:rPr>
+        <w:drawing>
+          <wp:inline distT="0" distB="0" distL="0" distR="0">
+            <wp:extent cx="2160000" cy="1440000"/>
+            <wp:effectExtent l="0" t="0" r="0" b="8255"/>
+            <wp:docPr id="776522307" name="Picture 6"/>
+            <wp:cNvGraphicFramePr/>
+            <a:graphic xmlns:a="http://schemas.openxmlformats.org/drawingml/2006/main">
+              <a:graphicData uri="http://schemas.openxmlformats.org/drawingml/2006/picture">
+                <pic:pic xmlns:pic="http://schemas.openxmlformats.org/drawingml/2006/picture">
+                  <pic:nvPicPr>
+                    <pic:cNvPr id="776522307" name=""/>
+                    <pic:cNvPicPr/>
+                  </pic:nvPicPr>
+                  <pic:blipFill>
+                    <a:blip r:embed="rId8">
+                      <a:extLst>
+                        <a:ext uri="{28A0092B-C50C-407E-A947-70E740481C1C}">
+                          <a14:useLocalDpi xmlns:a14="http://schemas.microsoft.com/office/drawing/2010/main" val="0"/>
+                        </a:ext>
+                      </a:extLst>
+                    </a:blip>
+                    <a:stretch>
+                      <a:fillRect/>
+                    </a:stretch>
+                  </pic:blipFill>
+                  <pic:spPr>
+                    <a:xfrm>
+                      <a:off x="0" y="0"/>
+                      <a:ext cx="2160000" cy="1440000"/>
+                    </a:xfrm>
+                    <a:prstGeom prst="rect">
+                      <a:avLst/>
+                    </a:prstGeom>
+                  </pic:spPr>
+                </pic:pic>
+              </a:graphicData>
+            </a:graphic>
+          </wp:inline>
+        </w:drawing>
+      </w:r>
+      <w:r>
+        <w:rPr>
+          <w:sz w:val="24"/>
+        </w:rPr>
+        <w:t xml:space="preserve"> | [P0] 1. What does this sign mean?</w:t>
+      </w:r>
+    </w:p>
+    <w:p>
+      <w:pPr>
+        <w:spacing w:before="80" w:after="60"/>
+        <w:ind w:left="283"/>
+        <w:rPr>
+          <w:sz w:val="24"/>
+        </w:rPr>
+      </w:pPr>
+      <w:r>
+        <w:rPr>
+          <w:b/>
+          <w:sz w:val="24"/>
+        </w:rPr>
+        <w:t xml:space="preserve">A. </w:t>
+      </w:r>
+      <w:r>
+        <w:rPr>
+          <w:sz w:val="24"/>
+        </w:rPr>
+        <w:t xml:space="preserve"> You must turn left here.</w:t>
+      </w:r>
+    </w:p>
+    <w:p>
+      <w:pPr>
+        <w:spacing w:before="80" w:after="60"/>
+        <w:ind w:left="283"/>
+        <w:rPr>
+          <w:sz w:val="24"/>
+        </w:rPr>
+      </w:pPr>
+      <w:r>
+        <w:rPr>
+          <w:b/>
+          <w:sz w:val="24"/>
+        </w:rPr>
+        <w:t xml:space="preserve">B. </w:t>
+      </w:r>
+      <w:r>
+        <w:rPr>
+          <w:sz w:val="24"/>
+        </w:rPr>
+        <w:t xml:space="preserve"> You cannot turn left.</w:t>
+      </w:r>
+    </w:p>
+    <w:p>
+      <w:pPr>
+        <w:spacing w:before="80" w:after="60"/>
+        <w:ind w:left="283"/>
+        <w:rPr>
+          <w:sz w:val="24"/>
+        </w:rPr>
+      </w:pPr>
+      <w:r>
+        <w:rPr>
+          <w:b/>
+          <w:sz w:val="24"/>
+        </w:rPr>
+        <w:t xml:space="preserve">C. </w:t>
+      </w:r>
+      <w:r>
+        <w:rPr>
+          <w:sz w:val="24"/>
+        </w:rPr>
+        <w:t xml:space="preserve"> Left turn is allowed for buses only.</w:t>
+      </w:r>
+    </w:p>
+    <w:p>
+      <w:pPr>
+        <w:spacing w:before="80" w:after="60"/>
+        <w:ind w:left="283"/>
+        <w:rPr>
+          <w:sz w:val="24"/>
+        </w:rPr>
+      </w:pPr>
+      <w:r>
+        <w:rPr>
+          <w:b/>
+          <w:sz w:val="24"/>
+        </w:rPr>
+        <w:t xml:space="preserve">D. </w:t>
+      </w:r>
+      <w:r>
+        <w:rPr>
+          <w:sz w:val="24"/>
+        </w:rPr>
+        <w:t xml:space="preserve"> Parking on the left is forbidden.</w:t>
+      </w:r>
+    </w:p>
+    <w:p>
+      <w:pPr>
+        <w:spacing w:before="120" w:after="80"/>
+        <w:rPr>
+          <w:b/>
+          <w:sz w:val="24"/>
+        </w:rPr>
+      </w:pPr>
+      <w:r>
+        <w:rPr>
+          <w:b/>
+          <w:sz w:val="24"/>
+        </w:rPr>
+        <w:t>II. What does the sign say? Choose the correct answer.</w:t>
+      </w:r>
+    </w:p>
+    <w:p>
+      <w:pPr>
+        <w:spacing w:before="120" w:after="80"/>
+        <w:rPr>
+          <w:sz w:val="24"/>
+        </w:rPr>
+      </w:pPr>
+      <w:r>
+        <w:rPr>
+          <w:sz w:val="24"/>
+        </w:rPr>
+        <w:lastRenderedPageBreak/>
+        <w:t xml:space="preserve">[TAB2: borderless] </w:t>
+      </w:r>
+      <w:r>
+        <w:rPr>
+          <w:noProof/>
+          <w:sz w:val="24"/>
+        </w:rPr>
+        <w:drawing>
+          <wp:inline distT="0" distB="0" distL="0" distR="0">
+            <wp:extent cx="2160000" cy="1440000"/>
+            <wp:effectExtent l="0" t="0" r="0" b="8255"/>
+            <wp:docPr id="496803042" name="Picture 7"/>
+            <wp:cNvGraphicFramePr/>
+            <a:graphic xmlns:a="http://schemas.openxmlformats.org/drawingml/2006/main">
+              <a:graphicData uri="http://schemas.openxmlformats.org/drawingml/2006/picture">
+                <pic:pic xmlns:pic="http://schemas.openxmlformats.org/drawingml/2006/picture">
+                  <pic:nvPicPr>
+                    <pic:cNvPr id="496803042" name=""/>
+                    <pic:cNvPicPr/>
+                  </pic:nvPicPr>
+                  <pic:blipFill>
+                    <a:blip r:embed="rId8">
+                      <a:extLst>
+                        <a:ext uri="{28A0092B-C50C-407E-A947-70E740481C1C}">
+                          <a14:useLocalDpi xmlns:a14="http://schemas.microsoft.com/office/drawing/2010/main" val="0"/>
+                        </a:ext>
+                      </a:extLst>
+                    </a:blip>
+                    <a:stretch>
+                      <a:fillRect/>
+                    </a:stretch>
+                  </pic:blipFill>
+                  <pic:spPr>
+                    <a:xfrm>
+                      <a:off x="0" y="0"/>
+                      <a:ext cx="2160000" cy="1440000"/>
+                    </a:xfrm>
+                    <a:prstGeom prst="rect">
+                      <a:avLst/>
+                    </a:prstGeom>
+                  </pic:spPr>
+                </pic:pic>
+              </a:graphicData>
+            </a:graphic>
+          </wp:inline>
+        </w:drawing>
+      </w:r>
+      <w:r>
+        <w:rPr>
+          <w:sz w:val="24"/>
+        </w:rPr>
+        <w:t xml:space="preserve"> | [P0] 1. What does this sign mean?</w:t>
+      </w:r>
+    </w:p>
+    <w:p>
+      <w:pPr>
+        <w:spacing w:before="80" w:after="60"/>
+        <w:ind w:left="283"/>
+        <w:rPr>
+          <w:sz w:val="24"/>
+        </w:rPr>
+      </w:pPr>
+      <w:r>
+        <w:rPr>
+          <w:b/>
+          <w:sz w:val="24"/>
+        </w:rPr>
+        <w:t xml:space="preserve">A. </w:t>
+      </w:r>
+      <w:r>
+        <w:rPr>
+          <w:sz w:val="24"/>
+        </w:rPr>
+        <w:t xml:space="preserve"> You must turn left here.</w:t>
+      </w:r>
+    </w:p>
+    <w:p>
+      <w:pPr>
+        <w:spacing w:before="80" w:after="60"/>
+        <w:ind w:left="283"/>
+        <w:rPr>
+          <w:sz w:val="24"/>
+        </w:rPr>
+      </w:pPr>
+      <w:r>
+        <w:rPr>
+          <w:b/>
+          <w:sz w:val="24"/>
+        </w:rPr>
+        <w:t xml:space="preserve">B. </w:t>
+      </w:r>
+      <w:r>
+        <w:rPr>
+          <w:sz w:val="24"/>
+        </w:rPr>
+        <w:t xml:space="preserve"> You cannot turn left.</w:t>
+      </w:r>
+    </w:p>
+    <w:p>
+      <w:pPr>
+        <w:spacing w:before="80" w:after="60"/>
+        <w:ind w:left="283"/>
+        <w:rPr>
+          <w:sz w:val="24"/>
+        </w:rPr>
+      </w:pPr>
+      <w:r>
+        <w:rPr>
+          <w:b/>
+          <w:sz w:val="24"/>
+        </w:rPr>
+        <w:t xml:space="preserve">C. </w:t>
+      </w:r>
+      <w:r>
+        <w:rPr>
+          <w:sz w:val="24"/>
+        </w:rPr>
+        <w:t xml:space="preserve"> Left turn is allowed for buses only.</w:t>
+      </w:r>
+    </w:p>
+    <w:p>
+      <w:pPr>
+        <w:spacing w:before="80" w:after="60"/>
+        <w:ind w:left="283"/>
+        <w:rPr>
+          <w:sz w:val="24"/>
+        </w:rPr>
+      </w:pPr>
+      <w:r>
+        <w:rPr>
+          <w:b/>
+          <w:sz w:val="24"/>
+        </w:rPr>
+        <w:t xml:space="preserve">D. </w:t>
+      </w:r>
+      <w:r>
+        <w:rPr>
+          <w:sz w:val="24"/>
+        </w:rPr>
+        <w:t xml:space="preserve"> Parking on the left is forbidden.</w:t>
+      </w:r>
+    </w:p>
+    <w:p>
+      <w:pPr>
+        <w:spacing w:before="120" w:after="80"/>
+        <w:rPr>
+          <w:b/>
+          <w:sz w:val="24"/>
+        </w:rPr>
+      </w:pPr>
+      <w:r>
+        <w:rPr>
+          <w:b/>
+          <w:sz w:val="24"/>
+        </w:rPr>
+        <w:t>II. What does the sign say? Choose the correct answer.</w:t>
+      </w:r>
+    </w:p>
+    <w:p>
+      <w:pPr>
+        <w:spacing w:before="120" w:after="80"/>
+        <w:rPr>
+          <w:sz w:val="24"/>
+        </w:rPr>
+      </w:pPr>
+      <w:r>
+        <w:rPr>
+          <w:sz w:val="24"/>
+        </w:rPr>
+        <w:t xml:space="preserve">[TAB2: borderless] </w:t>
+      </w:r>
+      <w:r>
+        <w:rPr>
+          <w:noProof/>
+          <w:sz w:val="24"/>
+        </w:rPr>
+        <w:drawing>
+          <wp:inline distT="0" distB="0" distL="0" distR="0">
+            <wp:extent cx="2160000" cy="1440000"/>
+            <wp:effectExtent l="0" t="0" r="0" b="8255"/>
+            <wp:docPr id="867493899" name="Picture 8"/>
+            <wp:cNvGraphicFramePr/>
+            <a:graphic xmlns:a="http://schemas.openxmlformats.org/drawingml/2006/main">
+              <a:graphicData uri="http://schemas.openxmlformats.org/drawingml/2006/picture">
+                <pic:pic xmlns:pic="http://schemas.openxmlformats.org/drawingml/2006/picture">
+                  <pic:nvPicPr>
+                    <pic:cNvPr id="867493899" name=""/>
+                    <pic:cNvPicPr/>
+                  </pic:nvPicPr>
+                  <pic:blipFill>
+                    <a:blip r:embed="rId8">
+                      <a:extLst>
+                        <a:ext uri="{28A0092B-C50C-407E-A947-70E740481C1C}">
+                          <a14:useLocalDpi xmlns:a14="http://schemas.microsoft.com/office/drawing/2010/main" val="0"/>
+                        </a:ext>
+                      </a:extLst>
+                    </a:blip>
+                    <a:stretch>
+                      <a:fillRect/>
+                    </a:stretch>
+                  </pic:blipFill>
+                  <pic:spPr>
+                    <a:xfrm>
+                      <a:off x="0" y="0"/>
+                      <a:ext cx="2160000" cy="1440000"/>
+                    </a:xfrm>
+                    <a:prstGeom prst="rect">
+                      <a:avLst/>
+                    </a:prstGeom>
+                  </pic:spPr>
+                </pic:pic>
+              </a:graphicData>
+            </a:graphic>
+          </wp:inline>
+        </w:drawing>
+      </w:r>
+      <w:r>
+        <w:rPr>
+          <w:sz w:val="24"/>
+        </w:rPr>
+        <w:t xml:space="preserve"> | [P0] 1. What does this sign mean?</w:t>
+      </w:r>
+    </w:p>
+    <w:p>
+      <w:pPr>
+        <w:spacing w:before="80" w:after="60"/>
+        <w:ind w:left="283"/>
+        <w:rPr>
+          <w:sz w:val="24"/>
+        </w:rPr>
+      </w:pPr>
+      <w:r>
+        <w:rPr>
+          <w:b/>
+          <w:sz w:val="24"/>
+        </w:rPr>
+        <w:t xml:space="preserve">A. </w:t>
+      </w:r>
+      <w:r>
+        <w:rPr>
+          <w:sz w:val="24"/>
+        </w:rPr>
+        <w:t xml:space="preserve"> You must turn left here.</w:t>
+      </w:r>
+    </w:p>
+    <w:p>
+      <w:pPr>
+        <w:spacing w:before="80" w:after="60"/>
+        <w:ind w:left="283"/>
+        <w:rPr>
+          <w:sz w:val="24"/>
+        </w:rPr>
+      </w:pPr>
+      <w:r>
+        <w:rPr>
+          <w:b/>
+          <w:sz w:val="24"/>
+        </w:rPr>
+        <w:t xml:space="preserve">B. </w:t>
+      </w:r>
+      <w:r>
+        <w:rPr>
+          <w:sz w:val="24"/>
+        </w:rPr>
+        <w:t xml:space="preserve"> You cannot turn left.</w:t>
+      </w:r>
+    </w:p>
+    <w:p>
+      <w:pPr>
+        <w:spacing w:before="80" w:after="60"/>
+        <w:ind w:left="283"/>
+        <w:rPr>
+          <w:sz w:val="24"/>
+        </w:rPr>
+      </w:pPr>
+      <w:r>
+        <w:rPr>
+          <w:b/>
+          <w:sz w:val="24"/>
+        </w:rPr>
+        <w:t xml:space="preserve">C. </w:t>
+      </w:r>
+      <w:r>
+        <w:rPr>
+          <w:sz w:val="24"/>
+        </w:rPr>
+        <w:t xml:space="preserve"> Left turn is allowed for buses only.</w:t>
+      </w:r>
+    </w:p>
+    <w:p>
+      <w:pPr>
+        <w:spacing w:before="80" w:after="60"/>
+        <w:ind w:left="283"/>
+        <w:rPr>
+          <w:sz w:val="24"/>
+        </w:rPr>
+      </w:pPr>
+      <w:r>
+        <w:rPr>
+          <w:b/>
+          <w:sz w:val="24"/>
+        </w:rPr>
+        <w:t xml:space="preserve">D. </w:t>
+      </w:r>
+      <w:r>
+        <w:rPr>
+          <w:sz w:val="24"/>
+        </w:rPr>
+        <w:t xml:space="preserve"> Parking on the left is forbidden.</w:t>
+      </w:r>
+    </w:p>
+    <w:p>
+      <w:pPr>
+        <w:spacing w:before="120" w:after="80"/>
+        <w:rPr>
+          <w:b/>
+          <w:sz w:val="24"/>
+        </w:rPr>
+      </w:pPr>
+      <w:r>
+        <w:rPr>
+          <w:b/>
+          <w:sz w:val="24"/>
+        </w:rPr>
+        <w:t>II. What does the sign say? Choose the correct answer.</w:t>
+      </w:r>
+    </w:p>
+    <w:p>
+      <w:pPr>
+        <w:spacing w:before="120" w:after="80"/>
+        <w:rPr>
+          <w:sz w:val="24"/>
+        </w:rPr>
+      </w:pPr>
+      <w:r>
+        <w:rPr>
+          <w:sz w:val="24"/>
+        </w:rPr>
+        <w:t xml:space="preserve">[TAB2: borderless] </w:t>
+      </w:r>
+      <w:r>
+        <w:rPr>
+          <w:noProof/>
+          <w:sz w:val="24"/>
+        </w:rPr>
+        <w:drawing>
+          <wp:inline distT="0" distB="0" distL="0" distR="0">
+            <wp:extent cx="2160000" cy="1440000"/>
+            <wp:effectExtent l="0" t="0" r="0" b="8255"/>
+            <wp:docPr id="1109392754" name="Picture 9"/>
+            <wp:cNvGraphicFramePr/>
+            <a:graphic xmlns:a="http://schemas.openxmlformats.org/drawingml/2006/main">
+              <a:graphicData uri="http://schemas.openxmlformats.org/drawingml/2006/picture">
+                <pic:pic xmlns:pic="http://schemas.openxmlformats.org/drawingml/2006/picture">
+                  <pic:nvPicPr>
+                    <pic:cNvPr id="1109392754" name=""/>
+                    <pic:cNvPicPr/>
+                  </pic:nvPicPr>
+                  <pic:blipFill>
+                    <a:blip r:embed="rId8">
+                      <a:extLst>
+                        <a:ext uri="{28A0092B-C50C-407E-A947-70E740481C1C}">
+                          <a14:useLocalDpi xmlns:a14="http://schemas.microsoft.com/office/drawing/2010/main" val="0"/>
+                        </a:ext>
+                      </a:extLst>
+                    </a:blip>
+                    <a:stretch>
+                      <a:fillRect/>
+                    </a:stretch>
+                  </pic:blipFill>
+                  <pic:spPr>
+                    <a:xfrm>
+                      <a:off x="0" y="0"/>
+                      <a:ext cx="2160000" cy="1440000"/>
+                    </a:xfrm>
+                    <a:prstGeom prst="rect">
+                      <a:avLst/>
+                    </a:prstGeom>
+                  </pic:spPr>
+                </pic:pic>
+              </a:graphicData>
+            </a:graphic>
+          </wp:inline>
+        </w:drawing>
+      </w:r>
+      <w:r>
+        <w:rPr>
+          <w:sz w:val="24"/>
+        </w:rPr>
+        <w:t xml:space="preserve"> | [P0] 1. What does this sign mean?</w:t>
+      </w:r>
+    </w:p>
+    <w:p>
+      <w:pPr>
+        <w:spacing w:before="80" w:after="60"/>
+        <w:ind w:left="283"/>
+        <w:rPr>
+          <w:sz w:val="24"/>
+        </w:rPr>
+      </w:pPr>
+      <w:r>
+        <w:rPr>
+          <w:b/>
+          <w:sz w:val="24"/>
+        </w:rPr>
+        <w:t xml:space="preserve">A. </w:t>
+      </w:r>
+      <w:r>
+        <w:rPr>
+          <w:sz w:val="24"/>
+        </w:rPr>
+        <w:t xml:space="preserve"> You must turn left here.</w:t>
+      </w:r>
+    </w:p>
+    <w:p>
+      <w:pPr>
+        <w:spacing w:before="80" w:after="60"/>
+        <w:ind w:left="283"/>
+        <w:rPr>
+          <w:sz w:val="24"/>
+        </w:rPr>
+      </w:pPr>
+      <w:r>
+        <w:rPr>
+          <w:b/>
+          <w:sz w:val="24"/>
+        </w:rPr>
+        <w:t xml:space="preserve">B. </w:t>
+      </w:r>
+      <w:r>
+        <w:rPr>
+          <w:sz w:val="24"/>
+        </w:rPr>
+        <w:t xml:space="preserve"> You cannot turn left.</w:t>
+      </w:r>
+    </w:p>
+    <w:p>
+      <w:pPr>
+        <w:spacing w:before="80" w:after="60"/>
+        <w:ind w:left="283"/>
+        <w:rPr>
+          <w:sz w:val="24"/>
+        </w:rPr>
+      </w:pPr>
+      <w:r>
+        <w:rPr>
+          <w:b/>
+          <w:sz w:val="24"/>
+        </w:rPr>
+        <w:t xml:space="preserve">C. </w:t>
+      </w:r>
+      <w:r>
+        <w:rPr>
+          <w:sz w:val="24"/>
+        </w:rPr>
+        <w:t xml:space="preserve"> Left turn is allowed for buses only.</w:t>
+      </w:r>
+    </w:p>
+    <w:p>
+      <w:pPr>
+        <w:spacing w:before="80" w:after="60"/>
+        <w:ind w:left="283"/>
+        <w:rPr>
+          <w:sz w:val="24"/>
+        </w:rPr>
+      </w:pPr>
+      <w:r>
+        <w:rPr>
+          <w:b/>
+          <w:sz w:val="24"/>
+        </w:rPr>
+        <w:t xml:space="preserve">D. </w:t>
+      </w:r>
+      <w:r>
+        <w:rPr>
+          <w:sz w:val="24"/>
+        </w:rPr>
+        <w:t xml:space="preserve"> Parking on the left is forbidden.</w:t>
+      </w:r>
+    </w:p>
+    <w:p>
+      <w:pPr>
+        <w:spacing w:before="120" w:after="80"/>
+        <w:rPr>
+          <w:b/>
+          <w:sz w:val="24"/>
+        </w:rPr>
+      </w:pPr>
+      <w:r>
+        <w:rPr>
+          <w:b/>
+          <w:sz w:val="24"/>
+        </w:rPr>
+        <w:t>II. What does the sign say? Choose the correct answer.</w:t>
+      </w:r>
+    </w:p>
+    <w:p>
+      <w:pPr>
+        <w:spacing w:before="120" w:after="80"/>
+        <w:rPr>
+          <w:sz w:val="24"/>
+        </w:rPr>
+      </w:pPr>
+      <w:r>
+        <w:rPr>
+          <w:sz w:val="24"/>
+        </w:rPr>
+        <w:lastRenderedPageBreak/>
+        <w:t xml:space="preserve">[TAB2: borderless] </w:t>
+      </w:r>
+      <w:r>
+        <w:rPr>
+          <w:noProof/>
+          <w:sz w:val="24"/>
+        </w:rPr>
+        <w:drawing>
+          <wp:inline distT="0" distB="0" distL="0" distR="0">
+            <wp:extent cx="2160000" cy="1440000"/>
+            <wp:effectExtent l="0" t="0" r="0" b="8255"/>
+            <wp:docPr id="1678317791" name="Picture 10"/>
+            <wp:cNvGraphicFramePr/>
+            <a:graphic xmlns:a="http://schemas.openxmlformats.org/drawingml/2006/main">
+              <a:graphicData uri="http://schemas.openxmlformats.org/drawingml/2006/picture">
+                <pic:pic xmlns:pic="http://schemas.openxmlformats.org/drawingml/2006/picture">
+                  <pic:nvPicPr>
+                    <pic:cNvPr id="1678317791" name=""/>
+                    <pic:cNvPicPr/>
+                  </pic:nvPicPr>
+                  <pic:blipFill>
+                    <a:blip r:embed="rId8">
+                      <a:extLst>
+                        <a:ext uri="{28A0092B-C50C-407E-A947-70E740481C1C}">
+                          <a14:useLocalDpi xmlns:a14="http://schemas.microsoft.com/office/drawing/2010/main" val="0"/>
+                        </a:ext>
+                      </a:extLst>
+                    </a:blip>
+                    <a:stretch>
+                      <a:fillRect/>
+                    </a:stretch>
+                  </pic:blipFill>
+                  <pic:spPr>
+                    <a:xfrm>
+                      <a:off x="0" y="0"/>
+                      <a:ext cx="2160000" cy="1440000"/>
+                    </a:xfrm>
+                    <a:prstGeom prst="rect">
+                      <a:avLst/>
+                    </a:prstGeom>
+                  </pic:spPr>
+                </pic:pic>
+              </a:graphicData>
+            </a:graphic>
+          </wp:inline>
+        </w:drawing>
+      </w:r>
+      <w:r>
+        <w:rPr>
+          <w:sz w:val="24"/>
+        </w:rPr>
+        <w:t xml:space="preserve"> | [P0] 1. What does this sign mean?</w:t>
+      </w:r>
+    </w:p>
+    <w:p>
+      <w:pPr>
+        <w:spacing w:before="80" w:after="60"/>
+        <w:ind w:left="283"/>
+        <w:rPr>
+          <w:sz w:val="24"/>
+        </w:rPr>
+      </w:pPr>
+      <w:r>
+        <w:rPr>
+          <w:b/>
+          <w:sz w:val="24"/>
+        </w:rPr>
+        <w:t xml:space="preserve">A. </w:t>
+      </w:r>
+      <w:r>
+        <w:rPr>
+          <w:sz w:val="24"/>
+        </w:rPr>
+        <w:t xml:space="preserve"> You must turn left here.</w:t>
+      </w:r>
+    </w:p>
+    <w:p>
+      <w:pPr>
+        <w:spacing w:before="80" w:after="60"/>
+        <w:ind w:left="283"/>
+        <w:rPr>
+          <w:sz w:val="24"/>
+        </w:rPr>
+      </w:pPr>
+      <w:r>
+        <w:rPr>
+          <w:b/>
+          <w:sz w:val="24"/>
+        </w:rPr>
+        <w:t xml:space="preserve">B. </w:t>
+      </w:r>
+      <w:r>
+        <w:rPr>
+          <w:sz w:val="24"/>
+        </w:rPr>
+        <w:t xml:space="preserve"> You cannot turn left.</w:t>
+      </w:r>
+    </w:p>
+    <w:p>
+      <w:pPr>
+        <w:spacing w:before="80" w:after="60"/>
+        <w:ind w:left="283"/>
+        <w:rPr>
+          <w:sz w:val="24"/>
+        </w:rPr>
+      </w:pPr>
+      <w:r>
+        <w:rPr>
+          <w:b/>
+          <w:sz w:val="24"/>
+        </w:rPr>
+        <w:t xml:space="preserve">C. </w:t>
+      </w:r>
+      <w:r>
+        <w:rPr>
+          <w:sz w:val="24"/>
+        </w:rPr>
+        <w:t xml:space="preserve"> Left turn is allowed for buses only.</w:t>
+      </w:r>
+    </w:p>
+    <w:p>
+      <w:pPr>
+        <w:spacing w:before="80" w:after="60"/>
+        <w:ind w:left="283"/>
+        <w:rPr>
+          <w:sz w:val="24"/>
+        </w:rPr>
+      </w:pPr>
+      <w:r>
+        <w:rPr>
+          <w:b/>
+          <w:sz w:val="24"/>
+        </w:rPr>
+        <w:t xml:space="preserve">D. </w:t>
+      </w:r>
+      <w:r>
+        <w:rPr>
+          <w:sz w:val="24"/>
+        </w:rPr>
+        <w:t xml:space="preserve"> Parking on the left is forbidden.</w:t>
+      </w:r>
+    </w:p>
+    <w:p>
+      <w:pPr>
+        <w:spacing w:before="120" w:after="80"/>
+        <w:rPr>
+          <w:b/>
+          <w:sz w:val="24"/>
+        </w:rPr>
+      </w:pPr>
+      <w:r>
+        <w:rPr>
+          <w:b/>
+          <w:sz w:val="24"/>
+        </w:rPr>
+        <w:t>II. What does the sign say? Choose the correct answer.</w:t>
+      </w:r>
+    </w:p>
+    <w:p>
+      <w:pPr>
+        <w:spacing w:before="120" w:after="80"/>
+        <w:rPr>
+          <w:sz w:val="24"/>
+        </w:rPr>
+      </w:pPr>
+      <w:r>
+        <w:rPr>
+          <w:sz w:val="24"/>
+        </w:rPr>
+        <w:t xml:space="preserve">[TAB2: borderless] </w:t>
+      </w:r>
+      <w:r>
+        <w:rPr>
+          <w:noProof/>
+          <w:sz w:val="24"/>
+        </w:rPr>
+        <w:drawing>
+          <wp:inline distT="0" distB="0" distL="0" distR="0">
+            <wp:extent cx="2160000" cy="1440000"/>
+            <wp:effectExtent l="0" t="0" r="0" b="8255"/>
+            <wp:docPr id="1868892135" name="Picture 11"/>
+            <wp:cNvGraphicFramePr/>
+            <a:graphic xmlns:a="http://schemas.openxmlformats.org/drawingml/2006/main">
+              <a:graphicData uri="http://schemas.openxmlformats.org/drawingml/2006/picture">
+                <pic:pic xmlns:pic="http://schemas.openxmlformats.org/drawingml/2006/picture">
+                  <pic:nvPicPr>
+                    <pic:cNvPr id="1868892135" name=""/>
+                    <pic:cNvPicPr/>
+                  </pic:nvPicPr>
+                  <pic:blipFill>
+                    <a:blip r:embed="rId8">
+                      <a:extLst>
+                        <a:ext uri="{28A0092B-C50C-407E-A947-70E740481C1C}">
+                          <a14:useLocalDpi xmlns:a14="http://schemas.microsoft.com/office/drawing/2010/main" val="0"/>
+                        </a:ext>
+                      </a:extLst>
+                    </a:blip>
+                    <a:stretch>
+                      <a:fillRect/>
+                    </a:stretch>
+                  </pic:blipFill>
+                  <pic:spPr>
+                    <a:xfrm>
+                      <a:off x="0" y="0"/>
+                      <a:ext cx="2160000" cy="1440000"/>
+                    </a:xfrm>
+                    <a:prstGeom prst="rect">
+                      <a:avLst/>
+                    </a:prstGeom>
+                  </pic:spPr>
+                </pic:pic>
+              </a:graphicData>
+            </a:graphic>
+          </wp:inline>
+        </w:drawing>
+      </w:r>
+      <w:r>
+        <w:rPr>
+          <w:sz w:val="24"/>
+        </w:rPr>
+        <w:t xml:space="preserve"> | [P0] 1. What does this sign mean?</w:t>
+      </w:r>
+    </w:p>
+    <w:p>
+      <w:pPr>
+        <w:spacing w:before="80" w:after="60"/>
+        <w:ind w:left="283"/>
+        <w:rPr>
+          <w:sz w:val="24"/>
+        </w:rPr>
+      </w:pPr>
+      <w:r>
+        <w:rPr>
+          <w:b/>
+          <w:sz w:val="24"/>
+        </w:rPr>
+        <w:t xml:space="preserve">A. </w:t>
+      </w:r>
+      <w:r>
+        <w:rPr>
+          <w:sz w:val="24"/>
+        </w:rPr>
+        <w:t xml:space="preserve"> You must turn left here.</w:t>
+      </w:r>
+    </w:p>
+    <w:p>
+      <w:pPr>
+        <w:spacing w:before="80" w:after="60"/>
+        <w:ind w:left="283"/>
+        <w:rPr>
+          <w:sz w:val="24"/>
+        </w:rPr>
+      </w:pPr>
+      <w:r>
+        <w:rPr>
+          <w:b/>
+          <w:sz w:val="24"/>
+        </w:rPr>
+        <w:t xml:space="preserve">B. </w:t>
+      </w:r>
+      <w:r>
+        <w:rPr>
+          <w:sz w:val="24"/>
+        </w:rPr>
+        <w:t xml:space="preserve"> You cannot turn left.</w:t>
+      </w:r>
+    </w:p>
+    <w:p>
+      <w:pPr>
+        <w:spacing w:before="80" w:after="60"/>
+        <w:ind w:left="283"/>
+        <w:rPr>
+          <w:sz w:val="24"/>
+        </w:rPr>
+      </w:pPr>
+      <w:r>
+        <w:rPr>
+          <w:b/>
+          <w:sz w:val="24"/>
+        </w:rPr>
+        <w:t xml:space="preserve">C. </w:t>
+      </w:r>
+      <w:r>
+        <w:rPr>
+          <w:sz w:val="24"/>
+        </w:rPr>
+        <w:t xml:space="preserve"> Left turn is allowed for buses only.</w:t>
+      </w:r>
+    </w:p>
+    <w:p>
+      <w:pPr>
+        <w:spacing w:before="80" w:after="60"/>
+        <w:ind w:left="283"/>
+        <w:rPr>
+          <w:sz w:val="24"/>
+        </w:rPr>
+      </w:pPr>
+      <w:r>
+        <w:rPr>
+          <w:b/>
+          <w:sz w:val="24"/>
+        </w:rPr>
+        <w:t xml:space="preserve">D. </w:t>
+      </w:r>
+      <w:r>
+        <w:rPr>
+          <w:sz w:val="24"/>
+        </w:rPr>
+        <w:t xml:space="preserve"> Parking on the left is forbidden.</w:t>
+      </w:r>
+    </w:p>
+    <w:p>
+      <w:pPr>
+        <w:spacing w:before="120" w:after="80"/>
+        <w:rPr>
+          <w:b/>
+          <w:sz w:val="24"/>
+        </w:rPr>
+      </w:pPr>
+      <w:r>
+        <w:rPr>
+          <w:b/>
+          <w:sz w:val="24"/>
+        </w:rPr>
+        <w:t>II. What does the sign say? Choose the correct answer.</w:t>
+      </w:r>
+    </w:p>
+    <w:p>
+      <w:pPr>
+        <w:spacing w:before="120" w:after="80"/>
+        <w:rPr>
+          <w:sz w:val="24"/>
+        </w:rPr>
+      </w:pPr>
+      <w:r>
+        <w:rPr>
+          <w:sz w:val="24"/>
+        </w:rPr>
+        <w:t xml:space="preserve">[TAB2: borderless] </w:t>
+      </w:r>
+      <w:r>
+        <w:rPr>
+          <w:noProof/>
+          <w:sz w:val="24"/>
+        </w:rPr>
+        <w:drawing>
+          <wp:inline distT="0" distB="0" distL="0" distR="0">
+            <wp:extent cx="2160000" cy="1440000"/>
+            <wp:effectExtent l="0" t="0" r="0" b="8255"/>
+            <wp:docPr id="1100064189" name="Picture 12"/>
+            <wp:cNvGraphicFramePr/>
+            <a:graphic xmlns:a="http://schemas.openxmlformats.org/drawingml/2006/main">
+              <a:graphicData uri="http://schemas.openxmlformats.org/drawingml/2006/picture">
+                <pic:pic xmlns:pic="http://schemas.openxmlformats.org/drawingml/2006/picture">
+                  <pic:nvPicPr>
+                    <pic:cNvPr id="1100064189" name=""/>
+                    <pic:cNvPicPr/>
+                  </pic:nvPicPr>
+                  <pic:blipFill>
+                    <a:blip r:embed="rId8">
+                      <a:extLst>
+                        <a:ext uri="{28A0092B-C50C-407E-A947-70E740481C1C}">
+                          <a14:useLocalDpi xmlns:a14="http://schemas.microsoft.com/office/drawing/2010/main" val="0"/>
+                        </a:ext>
+                      </a:extLst>
+                    </a:blip>
+                    <a:stretch>
+                      <a:fillRect/>
+                    </a:stretch>
+                  </pic:blipFill>
+                  <pic:spPr>
+                    <a:xfrm>
+                      <a:off x="0" y="0"/>
+                      <a:ext cx="2160000" cy="1440000"/>
+                    </a:xfrm>
+                    <a:prstGeom prst="rect">
+                      <a:avLst/>
+                    </a:prstGeom>
+                  </pic:spPr>
+                </pic:pic>
+              </a:graphicData>
+            </a:graphic>
+          </wp:inline>
+        </w:drawing>
+      </w:r>
+      <w:r>
+        <w:rPr>
+          <w:sz w:val="24"/>
+        </w:rPr>
+        <w:t xml:space="preserve"> | [P0] 1. What does this sign mean?</w:t>
+      </w:r>
+    </w:p>
+    <w:p>
+      <w:pPr>
+        <w:spacing w:before="80" w:after="60"/>
+        <w:ind w:left="283"/>
+        <w:rPr>
+          <w:sz w:val="24"/>
+        </w:rPr>
+      </w:pPr>
+      <w:r>
+        <w:rPr>
+          <w:b/>
+          <w:sz w:val="24"/>
+        </w:rPr>
+        <w:t xml:space="preserve">A. </w:t>
+      </w:r>
+      <w:r>
+        <w:rPr>
+          <w:sz w:val="24"/>
+        </w:rPr>
+        <w:t xml:space="preserve"> You must turn left here.</w:t>
+      </w:r>
+    </w:p>
+    <w:p>
+      <w:pPr>
+        <w:spacing w:before="80" w:after="60"/>
+        <w:ind w:left="283"/>
+        <w:rPr>
+          <w:sz w:val="24"/>
+        </w:rPr>
+      </w:pPr>
+      <w:r>
+        <w:rPr>
+          <w:b/>
+          <w:sz w:val="24"/>
+        </w:rPr>
+        <w:t xml:space="preserve">B. </w:t>
+      </w:r>
+      <w:r>
+        <w:rPr>
+          <w:sz w:val="24"/>
+        </w:rPr>
+        <w:t xml:space="preserve"> You cannot turn left.</w:t>
+      </w:r>
+    </w:p>
+    <w:p>
+      <w:pPr>
+        <w:spacing w:before="80" w:after="60"/>
+        <w:ind w:left="283"/>
+        <w:rPr>
+          <w:sz w:val="24"/>
+        </w:rPr>
+      </w:pPr>
+      <w:r>
+        <w:rPr>
+          <w:b/>
+          <w:sz w:val="24"/>
+        </w:rPr>
+        <w:t xml:space="preserve">C. </w:t>
+      </w:r>
+      <w:r>
+        <w:rPr>
+          <w:sz w:val="24"/>
+        </w:rPr>
+        <w:t xml:space="preserve"> Left turn is allowed for buses only.</w:t>
+      </w:r>
+    </w:p>
+    <w:p>
+      <w:pPr>
+        <w:spacing w:before="80" w:after="60"/>
+        <w:ind w:left="283"/>
+        <w:rPr>
+          <w:sz w:val="24"/>
+        </w:rPr>
+      </w:pPr>
+      <w:r>
+        <w:rPr>
+          <w:b/>
+          <w:sz w:val="24"/>
+        </w:rPr>
+        <w:t xml:space="preserve">D. </w:t>
+      </w:r>
+      <w:r>
+        <w:rPr>
+          <w:sz w:val="24"/>
+        </w:rPr>
+        <w:t xml:space="preserve"> Parking on the left is forbidden.</w:t>
+      </w:r>
+    </w:p>
+    <w:p>
+      <w:pPr>
+        <w:spacing w:before="120" w:after="80"/>
+        <w:rPr>
+          <w:b/>
+          <w:sz w:val="24"/>
+        </w:rPr>
+      </w:pPr>
+      <w:r>
+        <w:rPr>
+          <w:b/>
+          <w:sz w:val="24"/>
+        </w:rPr>
+        <w:t>II. What does the sign say? Choose the correct answer.</w:t>
+      </w:r>
+    </w:p>
+    <w:p>
+      <w:pPr>
+        <w:spacing w:before="120" w:after="80"/>
+        <w:rPr>
+          <w:sz w:val="24"/>
+        </w:rPr>
+      </w:pPr>
+      <w:r>
+        <w:rPr>
+          <w:sz w:val="24"/>
+        </w:rPr>
+        <w:lastRenderedPageBreak/>
+        <w:t xml:space="preserve">[TAB2: borderless] </w:t>
+      </w:r>
+      <w:r>
+        <w:rPr>
+          <w:noProof/>
+          <w:sz w:val="24"/>
+        </w:rPr>
+        <w:drawing>
+          <wp:inline distT="0" distB="0" distL="0" distR="0">
+            <wp:extent cx="2160000" cy="1440000"/>
+            <wp:effectExtent l="0" t="0" r="0" b="8255"/>
+            <wp:docPr id="271626012" name="Picture 13"/>
+            <wp:cNvGraphicFramePr/>
+            <a:graphic xmlns:a="http://schemas.openxmlformats.org/drawingml/2006/main">
+              <a:graphicData uri="http://schemas.openxmlformats.org/drawingml/2006/picture">
+                <pic:pic xmlns:pic="http://schemas.openxmlformats.org/drawingml/2006/picture">
+                  <pic:nvPicPr>
+                    <pic:cNvPr id="271626012" name=""/>
+                    <pic:cNvPicPr/>
+                  </pic:nvPicPr>
+                  <pic:blipFill>
+                    <a:blip r:embed="rId8">
+                      <a:extLst>
+                        <a:ext uri="{28A0092B-C50C-407E-A947-70E740481C1C}">
+                          <a14:useLocalDpi xmlns:a14="http://schemas.microsoft.com/office/drawing/2010/main" val="0"/>
+                        </a:ext>
+                      </a:extLst>
+                    </a:blip>
+                    <a:stretch>
+                      <a:fillRect/>
+                    </a:stretch>
+                  </pic:blipFill>
+                  <pic:spPr>
+                    <a:xfrm>
+                      <a:off x="0" y="0"/>
+                      <a:ext cx="2160000" cy="1440000"/>
+                    </a:xfrm>
+                    <a:prstGeom prst="rect">
+                      <a:avLst/>
+                    </a:prstGeom>
+                  </pic:spPr>
+                </pic:pic>
+              </a:graphicData>
+            </a:graphic>
+          </wp:inline>
+        </w:drawing>
+      </w:r>
+      <w:r>
+        <w:rPr>
+          <w:sz w:val="24"/>
+        </w:rPr>
+        <w:t xml:space="preserve"> | [P0] 1. What does this sign mean?</w:t>
+      </w:r>
+    </w:p>
+    <w:p>
+      <w:pPr>
+        <w:spacing w:before="80" w:after="60"/>
+        <w:ind w:left="283"/>
+        <w:rPr>
+          <w:sz w:val="24"/>
+        </w:rPr>
+      </w:pPr>
+      <w:r>
+        <w:rPr>
+          <w:b/>
+          <w:sz w:val="24"/>
+        </w:rPr>
+        <w:t xml:space="preserve">A. </w:t>
+      </w:r>
+      <w:r>
+        <w:rPr>
+          <w:sz w:val="24"/>
+        </w:rPr>
+        <w:t xml:space="preserve"> You must turn left here.</w:t>
+      </w:r>
+    </w:p>
+    <w:p>
+      <w:pPr>
+        <w:spacing w:before="80" w:after="60"/>
+        <w:ind w:left="283"/>
+        <w:rPr>
+          <w:sz w:val="24"/>
+        </w:rPr>
+      </w:pPr>
+      <w:r>
+        <w:rPr>
+          <w:b/>
+          <w:sz w:val="24"/>
+        </w:rPr>
+        <w:t xml:space="preserve">B. </w:t>
+      </w:r>
+      <w:r>
+        <w:rPr>
+          <w:sz w:val="24"/>
+        </w:rPr>
+        <w:t xml:space="preserve"> You cannot turn left.</w:t>
+      </w:r>
+    </w:p>
+    <w:p>
+      <w:pPr>
+        <w:spacing w:before="80" w:after="60"/>
+        <w:ind w:left="283"/>
+        <w:rPr>
+          <w:sz w:val="24"/>
+        </w:rPr>
+      </w:pPr>
+      <w:r>
+        <w:rPr>
+          <w:b/>
+          <w:sz w:val="24"/>
+        </w:rPr>
+        <w:t xml:space="preserve">C. </w:t>
+      </w:r>
+      <w:r>
+        <w:rPr>
+          <w:sz w:val="24"/>
+        </w:rPr>
+        <w:t xml:space="preserve"> Left turn is allowed for buses only.</w:t>
+      </w:r>
+    </w:p>
+    <w:p>
+      <w:pPr>
+        <w:spacing w:before="80" w:after="60"/>
+        <w:ind w:left="283"/>
+        <w:rPr>
+          <w:sz w:val="24"/>
+        </w:rPr>
+      </w:pPr>
+      <w:r>
+        <w:rPr>
+          <w:b/>
+          <w:sz w:val="24"/>
+        </w:rPr>
+        <w:t xml:space="preserve">D. </w:t>
+      </w:r>
+      <w:r>
+        <w:rPr>
+          <w:sz w:val="24"/>
+        </w:rPr>
+        <w:t xml:space="preserve"> Parking on the left is forbidden.</w:t>
+      </w:r>
+    </w:p>
+    <w:p>
+      <w:pPr>
+        <w:spacing w:before="120" w:after="80"/>
+        <w:rPr>
+          <w:b/>
+          <w:sz w:val="24"/>
+        </w:rPr>
+      </w:pPr>
+      <w:r>
+        <w:rPr>
+          <w:b/>
+          <w:sz w:val="24"/>
+        </w:rPr>
+        <w:t>II. What does the sign say? Choose the correct answer.</w:t>
+      </w:r>
+    </w:p>
+    <w:p>
+      <w:pPr>
+        <w:spacing w:before="120" w:after="80"/>
+        <w:rPr>
+          <w:sz w:val="24"/>
+        </w:rPr>
+      </w:pPr>
+      <w:r>
+        <w:rPr>
+          <w:sz w:val="24"/>
+        </w:rPr>
+        <w:t xml:space="preserve">[TAB2: borderless] </w:t>
+      </w:r>
+      <w:r>
+        <w:rPr>
+          <w:noProof/>
+          <w:sz w:val="24"/>
+        </w:rPr>
+        <w:drawing>
+          <wp:inline distT="0" distB="0" distL="0" distR="0">
+            <wp:extent cx="2160000" cy="1440000"/>
+            <wp:effectExtent l="0" t="0" r="0" b="8255"/>
+            <wp:docPr id="1023308072" name="Picture 14"/>
+            <wp:cNvGraphicFramePr/>
+            <a:graphic xmlns:a="http://schemas.openxmlformats.org/drawingml/2006/main">
+              <a:graphicData uri="http://schemas.openxmlformats.org/drawingml/2006/picture">
+                <pic:pic xmlns:pic="http://schemas.openxmlformats.org/drawingml/2006/picture">
+                  <pic:nvPicPr>
+                    <pic:cNvPr id="1023308072" name=""/>
+                    <pic:cNvPicPr/>
+                  </pic:nvPicPr>
+                  <pic:blipFill>
+                    <a:blip r:embed="rId8">
+                      <a:extLst>
+                        <a:ext uri="{28A0092B-C50C-407E-A947-70E740481C1C}">
+                          <a14:useLocalDpi xmlns:a14="http://schemas.microsoft.com/office/drawing/2010/main" val="0"/>
+                        </a:ext>
+                      </a:extLst>
+                    </a:blip>
+                    <a:stretch>
+                      <a:fillRect/>
+                    </a:stretch>
+                  </pic:blipFill>
+                  <pic:spPr>
+                    <a:xfrm>
+                      <a:off x="0" y="0"/>
+                      <a:ext cx="2160000" cy="1440000"/>
+                    </a:xfrm>
+                    <a:prstGeom prst="rect">
+                      <a:avLst/>
+                    </a:prstGeom>
+                  </pic:spPr>
+                </pic:pic>
+              </a:graphicData>
+            </a:graphic>
+          </wp:inline>
+        </w:drawing>
+      </w:r>
+      <w:r>
+        <w:rPr>
+          <w:sz w:val="24"/>
+        </w:rPr>
+        <w:t xml:space="preserve"> | [P0] 1. What does this sign mean?</w:t>
+      </w:r>
+    </w:p>
+    <w:p>
+      <w:pPr>
+        <w:spacing w:before="80" w:after="60"/>
+        <w:ind w:left="283"/>
+        <w:rPr>
+          <w:sz w:val="24"/>
+        </w:rPr>
+      </w:pPr>
+      <w:r>
+        <w:rPr>
+          <w:b/>
+          <w:sz w:val="24"/>
+        </w:rPr>
+        <w:t xml:space="preserve">A. </w:t>
+      </w:r>
+      <w:r>
+        <w:rPr>
+          <w:sz w:val="24"/>
+        </w:rPr>
+        <w:t xml:space="preserve"> You must turn left here.</w:t>
+      </w:r>
+    </w:p>
+    <w:p>
+      <w:pPr>
+        <w:spacing w:before="80" w:after="60"/>
+        <w:ind w:left="283"/>
+        <w:rPr>
+          <w:sz w:val="24"/>
+        </w:rPr>
+      </w:pPr>
+      <w:r>
+        <w:rPr>
+          <w:b/>
+          <w:sz w:val="24"/>
+        </w:rPr>
+        <w:t xml:space="preserve">B. </w:t>
+      </w:r>
+      <w:r>
+        <w:rPr>
+          <w:sz w:val="24"/>
+        </w:rPr>
+        <w:t xml:space="preserve"> You cannot turn left.</w:t>
+      </w:r>
+    </w:p>
+    <w:p>
+      <w:pPr>
+        <w:spacing w:before="80" w:after="60"/>
+        <w:ind w:left="283"/>
+        <w:rPr>
+          <w:sz w:val="24"/>
+        </w:rPr>
+      </w:pPr>
+      <w:r>
+        <w:rPr>
+          <w:b/>
+          <w:sz w:val="24"/>
+        </w:rPr>
+        <w:t xml:space="preserve">C. </w:t>
+      </w:r>
+      <w:r>
+        <w:rPr>
+          <w:sz w:val="24"/>
+        </w:rPr>
+        <w:t xml:space="preserve"> Left turn is allowed for buses only.</w:t>
+      </w:r>
+    </w:p>
+    <w:p>
+      <w:pPr>
+        <w:spacing w:before="80" w:after="60"/>
+        <w:ind w:left="283"/>
+        <w:rPr>
+          <w:sz w:val="24"/>
+        </w:rPr>
+      </w:pPr>
+      <w:r>
+        <w:rPr>
+          <w:b/>
+          <w:sz w:val="24"/>
+        </w:rPr>
+        <w:t xml:space="preserve">D. </w:t>
+      </w:r>
+      <w:r>
+        <w:rPr>
+          <w:sz w:val="24"/>
+        </w:rPr>
+        <w:t xml:space="preserve"> Parking on the left is forbidden.</w:t>
+      </w:r>
+    </w:p>
+    <w:p>
+      <w:pPr>
+        <w:spacing w:before="120" w:after="80"/>
+        <w:rPr>
+          <w:b/>
+          <w:sz w:val="24"/>
+        </w:rPr>
+      </w:pPr>
+      <w:r>
+        <w:rPr>
+          <w:b/>
+          <w:sz w:val="24"/>
+        </w:rPr>
+        <w:t>II. What does the sign say? Choose the correct answer.</w:t>
+      </w:r>
+    </w:p>
+    <w:p>
+      <w:pPr>
+        <w:spacing w:before="120" w:after="80"/>
+        <w:rPr>
+          <w:sz w:val="24"/>
+        </w:rPr>
+      </w:pPr>
+      <w:r>
+        <w:rPr>
+          <w:sz w:val="24"/>
+        </w:rPr>
+        <w:t xml:space="preserve">[TAB2: borderless] </w:t>
+      </w:r>
+      <w:r>
+        <w:rPr>
+          <w:noProof/>
+          <w:sz w:val="24"/>
+        </w:rPr>
+        <w:drawing>
+          <wp:inline distT="0" distB="0" distL="0" distR="0">
+            <wp:extent cx="2160000" cy="1440000"/>
+            <wp:effectExtent l="0" t="0" r="0" b="8255"/>
+            <wp:docPr id="121910101" name="Picture 15"/>
+            <wp:cNvGraphicFramePr/>
+            <a:graphic xmlns:a="http://schemas.openxmlformats.org/drawingml/2006/main">
+              <a:graphicData uri="http://schemas.openxmlformats.org/drawingml/2006/picture">
+                <pic:pic xmlns:pic="http://schemas.openxmlformats.org/drawingml/2006/picture">
+                  <pic:nvPicPr>
+                    <pic:cNvPr id="121910101" name=""/>
+                    <pic:cNvPicPr/>
+                  </pic:nvPicPr>
+                  <pic:blipFill>
+                    <a:blip r:embed="rId8">
+                      <a:extLst>
+                        <a:ext uri="{28A0092B-C50C-407E-A947-70E740481C1C}">
+                          <a14:useLocalDpi xmlns:a14="http://schemas.microsoft.com/office/drawing/2010/main" val="0"/>
+                        </a:ext>
+                      </a:extLst>
+                    </a:blip>
+                    <a:stretch>
+                      <a:fillRect/>
+                    </a:stretch>
+                  </pic:blipFill>
+                  <pic:spPr>
+                    <a:xfrm>
+                      <a:off x="0" y="0"/>
+                      <a:ext cx="2160000" cy="1440000"/>
+                    </a:xfrm>
+                    <a:prstGeom prst="rect">
+                      <a:avLst/>
+                    </a:prstGeom>
+                  </pic:spPr>
+                </pic:pic>
+              </a:graphicData>
+            </a:graphic>
+          </wp:inline>
+        </w:drawing>
+      </w:r>
+      <w:r>
+        <w:rPr>
+          <w:sz w:val="24"/>
+        </w:rPr>
+        <w:t xml:space="preserve"> | [P0] 1. What does this sign mean?</w:t>
+      </w:r>
+    </w:p>
+    <w:p>
+      <w:pPr>
+        <w:spacing w:before="80" w:after="60"/>
+        <w:ind w:left="283"/>
+        <w:rPr>
+          <w:sz w:val="24"/>
+        </w:rPr>
+      </w:pPr>
+      <w:r>
+        <w:rPr>
+          <w:b/>
+          <w:sz w:val="24"/>
+        </w:rPr>
+        <w:t xml:space="preserve">A. </w:t>
+      </w:r>
+      <w:r>
+        <w:rPr>
+          <w:sz w:val="24"/>
+        </w:rPr>
+        <w:t xml:space="preserve"> You must turn left here.</w:t>
+      </w:r>
+    </w:p>
+    <w:p>
+      <w:pPr>
+        <w:spacing w:before="80" w:after="60"/>
+        <w:ind w:left="283"/>
+        <w:rPr>
+          <w:sz w:val="24"/>
+        </w:rPr>
+      </w:pPr>
+      <w:r>
+        <w:rPr>
+          <w:b/>
+          <w:sz w:val="24"/>
+        </w:rPr>
+        <w:t xml:space="preserve">B. </w:t>
+      </w:r>
+      <w:r>
+        <w:rPr>
+          <w:sz w:val="24"/>
+        </w:rPr>
+        <w:t xml:space="preserve"> You cannot turn left.</w:t>
+      </w:r>
+    </w:p>
+    <w:p>
+      <w:pPr>
+        <w:spacing w:before="80" w:after="60"/>
+        <w:ind w:left="283"/>
+        <w:rPr>
+          <w:sz w:val="24"/>
+        </w:rPr>
+      </w:pPr>
+      <w:r>
+        <w:rPr>
+          <w:b/>
+          <w:sz w:val="24"/>
+        </w:rPr>
+        <w:t xml:space="preserve">C. </w:t>
+      </w:r>
+      <w:r>
+        <w:rPr>
+          <w:sz w:val="24"/>
+        </w:rPr>
+        <w:t xml:space="preserve"> Left turn is allowed for buses only.</w:t>
+      </w:r>
+    </w:p>
+    <w:p>
+      <w:pPr>
+        <w:spacing w:before="80" w:after="60"/>
+        <w:ind w:left="283"/>
+        <w:rPr>
+          <w:sz w:val="24"/>
+        </w:rPr>
+      </w:pPr>
+      <w:r>
+        <w:rPr>
+          <w:b/>
+          <w:sz w:val="24"/>
+        </w:rPr>
+        <w:t xml:space="preserve">D. </w:t>
+      </w:r>
+      <w:r>
+        <w:rPr>
+          <w:sz w:val="24"/>
+        </w:rPr>
+        <w:t xml:space="preserve"> Parking on the left is forbidden.</w:t>
+      </w:r>
+    </w:p>
+    <w:p>
+      <w:pPr>
+        <w:spacing w:before="120" w:after="80"/>
+        <w:rPr>
+          <w:b/>
+          <w:sz w:val="24"/>
+        </w:rPr>
+      </w:pPr>
+      <w:r>
+        <w:rPr>
+          <w:b/>
+          <w:sz w:val="24"/>
+        </w:rPr>
+        <w:t>II. What does the sign say? Choose the correct answer.</w:t>
+      </w:r>
+    </w:p>
+    <w:p>
+      <w:pPr>
+        <w:spacing w:before="120" w:after="80"/>
+        <w:rPr>
+          <w:sz w:val="24"/>
+        </w:rPr>
+      </w:pPr>
+      <w:r>
+        <w:rPr>
+          <w:sz w:val="24"/>
+        </w:rPr>
+        <w:lastRenderedPageBreak/>
+        <w:t xml:space="preserve">[TAB2: borderless] </w:t>
+      </w:r>
+      <w:r>
+        <w:rPr>
+          <w:noProof/>
+          <w:sz w:val="24"/>
+        </w:rPr>
+        <w:drawing>
+          <wp:inline distT="0" distB="0" distL="0" distR="0">
+            <wp:extent cx="2160000" cy="1440000"/>
+            <wp:effectExtent l="0" t="0" r="0" b="8255"/>
+            <wp:docPr id="1772893097" name="Picture 16"/>
+            <wp:cNvGraphicFramePr/>
+            <a:graphic xmlns:a="http://schemas.openxmlformats.org/drawingml/2006/main">
+              <a:graphicData uri="http://schemas.openxmlformats.org/drawingml/2006/picture">
+                <pic:pic xmlns:pic="http://schemas.openxmlformats.org/drawingml/2006/picture">
+                  <pic:nvPicPr>
+                    <pic:cNvPr id="1772893097" name=""/>
+                    <pic:cNvPicPr/>
+                  </pic:nvPicPr>
+                  <pic:blipFill>
+                    <a:blip r:embed="rId8">
+                      <a:extLst>
+                        <a:ext uri="{28A0092B-C50C-407E-A947-70E740481C1C}">
+                          <a14:useLocalDpi xmlns:a14="http://schemas.microsoft.com/office/drawing/2010/main" val="0"/>
+                        </a:ext>
+                      </a:extLst>
+                    </a:blip>
+                    <a:stretch>
+                      <a:fillRect/>
+                    </a:stretch>
+                  </pic:blipFill>
+                  <pic:spPr>
+                    <a:xfrm>
+                      <a:off x="0" y="0"/>
+                      <a:ext cx="2160000" cy="1440000"/>
+                    </a:xfrm>
+                    <a:prstGeom prst="rect">
+                      <a:avLst/>
+                    </a:prstGeom>
+                  </pic:spPr>
+                </pic:pic>
+              </a:graphicData>
+            </a:graphic>
+          </wp:inline>
+        </w:drawing>
+      </w:r>
+      <w:r>
+        <w:rPr>
+          <w:sz w:val="24"/>
+        </w:rPr>
+        <w:t xml:space="preserve"> | [P0] 1. What does this sign mean?</w:t>
+      </w:r>
+    </w:p>
+    <w:p>
+      <w:pPr>
+        <w:spacing w:before="80" w:after="60"/>
+        <w:ind w:left="283"/>
+        <w:rPr>
+          <w:sz w:val="24"/>
+        </w:rPr>
+      </w:pPr>
+      <w:r>
+        <w:rPr>
+          <w:b/>
+          <w:sz w:val="24"/>
+        </w:rPr>
+        <w:t xml:space="preserve">A. </w:t>
+      </w:r>
+      <w:r>
+        <w:rPr>
+          <w:sz w:val="24"/>
+        </w:rPr>
+        <w:t xml:space="preserve"> You must turn left here.</w:t>
+      </w:r>
+    </w:p>
+    <w:p>
+      <w:pPr>
+        <w:spacing w:before="80" w:after="60"/>
+        <w:ind w:left="283"/>
+        <w:rPr>
+          <w:sz w:val="24"/>
+        </w:rPr>
+      </w:pPr>
+      <w:r>
+        <w:rPr>
+          <w:b/>
+          <w:sz w:val="24"/>
+        </w:rPr>
+        <w:t xml:space="preserve">B. </w:t>
+      </w:r>
+      <w:r>
+        <w:rPr>
+          <w:sz w:val="24"/>
+        </w:rPr>
+        <w:t xml:space="preserve"> You cannot turn left.</w:t>
+      </w:r>
+    </w:p>
+    <w:p>
+      <w:pPr>
+        <w:spacing w:before="80" w:after="60"/>
+        <w:ind w:left="283"/>
+        <w:rPr>
+          <w:sz w:val="24"/>
+        </w:rPr>
+      </w:pPr>
+      <w:r>
+        <w:rPr>
+          <w:b/>
+          <w:sz w:val="24"/>
+        </w:rPr>
+        <w:t xml:space="preserve">C. </w:t>
+      </w:r>
+      <w:r>
+        <w:rPr>
+          <w:sz w:val="24"/>
+        </w:rPr>
+        <w:t xml:space="preserve"> Left turn is allowed for buses only.</w:t>
+      </w:r>
+    </w:p>
+    <w:p>
+      <w:pPr>
+        <w:spacing w:before="80" w:after="60"/>
+        <w:ind w:left="283"/>
+        <w:rPr>
+          <w:sz w:val="24"/>
+        </w:rPr>
+      </w:pPr>
+      <w:r>
+        <w:rPr>
+          <w:b/>
+          <w:sz w:val="24"/>
+        </w:rPr>
+        <w:t xml:space="preserve">D. </w:t>
+      </w:r>
+      <w:r>
+        <w:rPr>
+          <w:sz w:val="24"/>
+        </w:rPr>
+        <w:t xml:space="preserve"> Parking on the left is forbidden.</w:t>
+      </w:r>
+    </w:p>
+    <w:p>
+      <w:pPr>
+        <w:spacing w:before="120" w:after="80"/>
+        <w:rPr>
+          <w:b/>
+          <w:sz w:val="24"/>
+        </w:rPr>
+      </w:pPr>
+      <w:r>
+        <w:rPr>
+          <w:b/>
+          <w:sz w:val="24"/>
+        </w:rPr>
+        <w:t>II. What does the sign say? Choose the correct answer.</w:t>
+      </w:r>
+    </w:p>
+    <w:p>
+      <w:pPr>
+        <w:spacing w:before="120" w:after="80"/>
+        <w:rPr>
+          <w:sz w:val="24"/>
+        </w:rPr>
+      </w:pPr>
+      <w:r>
+        <w:rPr>
+          <w:sz w:val="24"/>
+        </w:rPr>
+        <w:t xml:space="preserve">[TAB2: borderless] </w:t>
+      </w:r>
+      <w:r>
+        <w:rPr>
+          <w:noProof/>
+          <w:sz w:val="24"/>
+        </w:rPr>
+        <w:drawing>
+          <wp:inline distT="0" distB="0" distL="0" distR="0">
+            <wp:extent cx="2160000" cy="1440000"/>
+            <wp:effectExtent l="0" t="0" r="0" b="8255"/>
+            <wp:docPr id="959945702" name="Picture 17"/>
+            <wp:cNvGraphicFramePr/>
+            <a:graphic xmlns:a="http://schemas.openxmlformats.org/drawingml/2006/main">
+              <a:graphicData uri="http://schemas.openxmlformats.org/drawingml/2006/picture">
+                <pic:pic xmlns:pic="http://schemas.openxmlformats.org/drawingml/2006/picture">
+                  <pic:nvPicPr>
+                    <pic:cNvPr id="959945702" name=""/>
+                    <pic:cNvPicPr/>
+                  </pic:nvPicPr>
+                  <pic:blipFill>
+                    <a:blip r:embed="rId8">
+                      <a:extLst>
+                        <a:ext uri="{28A0092B-C50C-407E-A947-70E740481C1C}">
+                          <a14:useLocalDpi xmlns:a14="http://schemas.microsoft.com/office/drawing/2010/main" val="0"/>
+                        </a:ext>
+                      </a:extLst>
+                    </a:blip>
+                    <a:stretch>
+                      <a:fillRect/>
+                    </a:stretch>
+                  </pic:blipFill>
+                  <pic:spPr>
+                    <a:xfrm>
+                      <a:off x="0" y="0"/>
+                      <a:ext cx="2160000" cy="1440000"/>
+                    </a:xfrm>
+                    <a:prstGeom prst="rect">
+                      <a:avLst/>
+                    </a:prstGeom>
+                  </pic:spPr>
+                </pic:pic>
+              </a:graphicData>
+            </a:graphic>
+          </wp:inline>
+        </w:drawing>
+      </w:r>
+      <w:r>
+        <w:rPr>
+          <w:sz w:val="24"/>
+        </w:rPr>
+        <w:t xml:space="preserve"> | [P0] 1. What does this sign mean?</w:t>
+      </w:r>
+    </w:p>
+    <w:p>
+      <w:pPr>
+        <w:spacing w:before="80" w:after="60"/>
+        <w:ind w:left="283"/>
+        <w:rPr>
+          <w:sz w:val="24"/>
+        </w:rPr>
+      </w:pPr>
+      <w:r>
+        <w:rPr>
+          <w:b/>
+          <w:sz w:val="24"/>
+        </w:rPr>
+        <w:t xml:space="preserve">A. </w:t>
+      </w:r>
+      <w:r>
+        <w:rPr>
+          <w:sz w:val="24"/>
+        </w:rPr>
+        <w:t xml:space="preserve"> You must turn left here.</w:t>
+      </w:r>
+    </w:p>
+    <w:p>
+      <w:pPr>
+        <w:spacing w:before="80" w:after="60"/>
+        <w:ind w:left="283"/>
+        <w:rPr>
+          <w:sz w:val="24"/>
+        </w:rPr>
+      </w:pPr>
+      <w:r>
+        <w:rPr>
+          <w:b/>
+          <w:sz w:val="24"/>
+        </w:rPr>
+        <w:t xml:space="preserve">B. </w:t>
+      </w:r>
+      <w:r>
+        <w:rPr>
+          <w:sz w:val="24"/>
+        </w:rPr>
+        <w:t xml:space="preserve"> You cannot turn left.</w:t>
+      </w:r>
+    </w:p>
+    <w:p>
+      <w:pPr>
+        <w:spacing w:before="80" w:after="60"/>
+        <w:ind w:left="283"/>
+        <w:rPr>
+          <w:sz w:val="24"/>
+        </w:rPr>
+      </w:pPr>
+      <w:r>
+        <w:rPr>
+          <w:b/>
+          <w:sz w:val="24"/>
+        </w:rPr>
+        <w:t xml:space="preserve">C. </w:t>
+      </w:r>
+      <w:r>
+        <w:rPr>
+          <w:sz w:val="24"/>
+        </w:rPr>
+        <w:t xml:space="preserve"> Left turn is allowed for buses only.</w:t>
+      </w:r>
+    </w:p>
+    <w:p>
+      <w:pPr>
+        <w:spacing w:before="80" w:after="60"/>
+        <w:ind w:left="283"/>
+        <w:rPr>
+          <w:sz w:val="24"/>
+        </w:rPr>
+      </w:pPr>
+      <w:r>
+        <w:rPr>
+          <w:b/>
+          <w:sz w:val="24"/>
+        </w:rPr>
+        <w:t xml:space="preserve">D. </w:t>
+      </w:r>
+      <w:r>
+        <w:rPr>
+          <w:sz w:val="24"/>
+        </w:rPr>
+        <w:t xml:space="preserve"> Parking on the left is forbidden.</w:t>
+      </w:r>
+    </w:p>
+    <w:p>
+      <w:pPr>
+        <w:spacing w:before="80" w:after="60"/>
+        <w:ind w:left="283"/>
         <w:rPr>
           <w:sz w:val="24"/>
         </w:rPr>
       </w:pPr>
     </w:p>
     <w:sectPr>
-      <w:headerReference w:type="even" r:id="rId7"/>
-      <w:headerReference w:type="default" r:id="rId8"/>
-      <w:footerReference w:type="even" r:id="rId9"/>
-      <w:footerReference w:type="default" r:id="rId10"/>
-      <w:headerReference w:type="first" r:id="rId11"/>
-      <w:footerReference w:type="first" r:id="rId12"/>
+      <w:headerReference w:type="even" r:id="rId9"/>
+      <w:headerReference w:type="default" r:id="rId10"/>
+      <w:footerReference w:type="even" r:id="rId11"/>
+      <w:footerReference w:type="default" r:id="rId12"/>
+      <w:headerReference w:type="first" r:id="rId13"/>
+      <w:footerReference w:type="first" r:id="rId14"/>
       <w:pgSz w:w="11907" w:h="16840" w:code="9"/>
       <w:pgMar w:top="1134" w:right="850" w:bottom="1134" w:left="1701" w:header="720" w:footer="720" w:gutter="0"/>
       <w:cols w:space="720"/>
@@ -833,7 +3491,7 @@
     <w:link w:val="Heading1Char"/>
     <w:uiPriority w:val="9"/>
     <w:qFormat/>
-    <w:rsid w:val="004E39CD"/>
+    <w:rsid w:val="000A49FF"/>
     <w:pPr>
       <w:keepNext/>
       <w:keepLines/>
@@ -856,7 +3514,7 @@
     <w:semiHidden/>
     <w:unhideWhenUsed/>
     <w:qFormat/>
-    <w:rsid w:val="004E39CD"/>
+    <w:rsid w:val="000A49FF"/>
     <w:pPr>
       <w:keepNext/>
       <w:keepLines/>
@@ -879,7 +3537,7 @@
     <w:semiHidden/>
     <w:unhideWhenUsed/>
     <w:qFormat/>
-    <w:rsid w:val="004E39CD"/>
+    <w:rsid w:val="000A49FF"/>
     <w:pPr>
       <w:keepNext/>
       <w:keepLines/>
@@ -902,7 +3560,7 @@
     <w:semiHidden/>
     <w:unhideWhenUsed/>
     <w:qFormat/>
-    <w:rsid w:val="004E39CD"/>
+    <w:rsid w:val="000A49FF"/>
     <w:pPr>
       <w:keepNext/>
       <w:keepLines/>
@@ -925,7 +3583,7 @@
     <w:semiHidden/>
     <w:unhideWhenUsed/>
     <w:qFormat/>
-    <w:rsid w:val="004E39CD"/>
+    <w:rsid w:val="000A49FF"/>
     <w:pPr>
       <w:keepNext/>
       <w:keepLines/>
@@ -946,7 +3604,7 @@
     <w:semiHidden/>
     <w:unhideWhenUsed/>
     <w:qFormat/>
-    <w:rsid w:val="004E39CD"/>
+    <w:rsid w:val="000A49FF"/>
     <w:pPr>
       <w:keepNext/>
       <w:keepLines/>
@@ -969,7 +3627,7 @@
     <w:semiHidden/>
     <w:unhideWhenUsed/>
     <w:qFormat/>
-    <w:rsid w:val="004E39CD"/>
+    <w:rsid w:val="000A49FF"/>
     <w:pPr>
       <w:keepNext/>
       <w:keepLines/>
@@ -990,7 +3648,7 @@
     <w:semiHidden/>
     <w:unhideWhenUsed/>
     <w:qFormat/>
-    <w:rsid w:val="004E39CD"/>
+    <w:rsid w:val="000A49FF"/>
     <w:pPr>
       <w:keepNext/>
       <w:keepLines/>
@@ -1013,7 +3671,7 @@
     <w:semiHidden/>
     <w:unhideWhenUsed/>
     <w:qFormat/>
-    <w:rsid w:val="004E39CD"/>
+    <w:rsid w:val="000A49FF"/>
     <w:pPr>
       <w:keepNext/>
       <w:keepLines/>
@@ -1057,7 +3715,7 @@
     <w:basedOn w:val="DefaultParagraphFont"/>
     <w:link w:val="Heading1"/>
     <w:uiPriority w:val="9"/>
-    <w:rsid w:val="004E39CD"/>
+    <w:rsid w:val="000A49FF"/>
     <w:rPr>
       <w:rFonts w:asciiTheme="majorHAnsi" w:eastAsiaTheme="majorEastAsia" w:hAnsiTheme="majorHAnsi" w:cstheme="majorBidi"/>
       <w:color w:val="0F4761" w:themeColor="accent1" w:themeShade="BF"/>
@@ -1071,7 +3729,7 @@
     <w:link w:val="Heading2"/>
     <w:uiPriority w:val="9"/>
     <w:semiHidden/>
-    <w:rsid w:val="004E39CD"/>
+    <w:rsid w:val="000A49FF"/>
     <w:rPr>
       <w:rFonts w:asciiTheme="majorHAnsi" w:eastAsiaTheme="majorEastAsia" w:hAnsiTheme="majorHAnsi" w:cstheme="majorBidi"/>
       <w:color w:val="0F4761" w:themeColor="accent1" w:themeShade="BF"/>
@@ -1085,7 +3743,7 @@
     <w:link w:val="Heading3"/>
     <w:uiPriority w:val="9"/>
     <w:semiHidden/>
-    <w:rsid w:val="004E39CD"/>
+    <w:rsid w:val="000A49FF"/>
     <w:rPr>
       <w:rFonts w:asciiTheme="minorHAnsi" w:eastAsiaTheme="majorEastAsia" w:hAnsiTheme="minorHAnsi" w:cstheme="majorBidi"/>
       <w:color w:val="0F4761" w:themeColor="accent1" w:themeShade="BF"/>
@@ -1099,7 +3757,7 @@
     <w:link w:val="Heading4"/>
     <w:uiPriority w:val="9"/>
     <w:semiHidden/>
-    <w:rsid w:val="004E39CD"/>
+    <w:rsid w:val="000A49FF"/>
     <w:rPr>
       <w:rFonts w:asciiTheme="minorHAnsi" w:eastAsiaTheme="majorEastAsia" w:hAnsiTheme="minorHAnsi" w:cstheme="majorBidi"/>
       <w:i/>
@@ -1113,7 +3771,7 @@
     <w:link w:val="Heading5"/>
     <w:uiPriority w:val="9"/>
     <w:semiHidden/>
-    <w:rsid w:val="004E39CD"/>
+    <w:rsid w:val="000A49FF"/>
     <w:rPr>
       <w:rFonts w:asciiTheme="minorHAnsi" w:eastAsiaTheme="majorEastAsia" w:hAnsiTheme="minorHAnsi" w:cstheme="majorBidi"/>
       <w:color w:val="0F4761" w:themeColor="accent1" w:themeShade="BF"/>
@@ -1125,7 +3783,7 @@
     <w:link w:val="Heading6"/>
     <w:uiPriority w:val="9"/>
     <w:semiHidden/>
-    <w:rsid w:val="004E39CD"/>
+    <w:rsid w:val="000A49FF"/>
     <w:rPr>
       <w:rFonts w:asciiTheme="minorHAnsi" w:eastAsiaTheme="majorEastAsia" w:hAnsiTheme="minorHAnsi" w:cstheme="majorBidi"/>
       <w:i/>
@@ -1139,7 +3797,7 @@
     <w:link w:val="Heading7"/>
     <w:uiPriority w:val="9"/>
     <w:semiHidden/>
-    <w:rsid w:val="004E39CD"/>
+    <w:rsid w:val="000A49FF"/>
     <w:rPr>
       <w:rFonts w:asciiTheme="minorHAnsi" w:eastAsiaTheme="majorEastAsia" w:hAnsiTheme="minorHAnsi" w:cstheme="majorBidi"/>
       <w:color w:val="595959" w:themeColor="text1" w:themeTint="A6"/>
@@ -1151,7 +3809,7 @@
     <w:link w:val="Heading8"/>
     <w:uiPriority w:val="9"/>
     <w:semiHidden/>
-    <w:rsid w:val="004E39CD"/>
+    <w:rsid w:val="000A49FF"/>
     <w:rPr>
       <w:rFonts w:asciiTheme="minorHAnsi" w:eastAsiaTheme="majorEastAsia" w:hAnsiTheme="minorHAnsi" w:cstheme="majorBidi"/>
       <w:i/>
@@ -1165,7 +3823,7 @@
     <w:link w:val="Heading9"/>
     <w:uiPriority w:val="9"/>
     <w:semiHidden/>
-    <w:rsid w:val="004E39CD"/>
+    <w:rsid w:val="000A49FF"/>
     <w:rPr>
       <w:rFonts w:asciiTheme="minorHAnsi" w:eastAsiaTheme="majorEastAsia" w:hAnsiTheme="minorHAnsi" w:cstheme="majorBidi"/>
       <w:color w:val="272727" w:themeColor="text1" w:themeTint="D8"/>
@@ -1178,7 +3836,7 @@
     <w:link w:val="TitleChar"/>
     <w:uiPriority w:val="10"/>
     <w:qFormat/>
-    <w:rsid w:val="004E39CD"/>
+    <w:rsid w:val="000A49FF"/>
     <w:pPr>
       <w:spacing w:after="80" w:line="240" w:lineRule="auto"/>
       <w:contextualSpacing/>
@@ -1196,7 +3854,7 @@
     <w:basedOn w:val="DefaultParagraphFont"/>
     <w:link w:val="Title"/>
     <w:uiPriority w:val="10"/>
-    <w:rsid w:val="004E39CD"/>
+    <w:rsid w:val="000A49FF"/>
     <w:rPr>
       <w:rFonts w:asciiTheme="majorHAnsi" w:eastAsiaTheme="majorEastAsia" w:hAnsiTheme="majorHAnsi" w:cstheme="majorBidi"/>
       <w:spacing w:val="-10"/>
@@ -1212,7 +3870,7 @@
     <w:link w:val="SubtitleChar"/>
     <w:uiPriority w:val="11"/>
     <w:qFormat/>
-    <w:rsid w:val="004E39CD"/>
+    <w:rsid w:val="000A49FF"/>
     <w:pPr>
       <w:numPr>
         <w:ilvl w:val="1"/>
@@ -1231,7 +3889,7 @@
     <w:basedOn w:val="DefaultParagraphFont"/>
     <w:link w:val="Subtitle"/>
     <w:uiPriority w:val="11"/>
-    <w:rsid w:val="004E39CD"/>
+    <w:rsid w:val="000A49FF"/>
     <w:rPr>
       <w:rFonts w:asciiTheme="minorHAnsi" w:eastAsiaTheme="majorEastAsia" w:hAnsiTheme="minorHAnsi" w:cstheme="majorBidi"/>
       <w:color w:val="595959" w:themeColor="text1" w:themeTint="A6"/>
@@ -1247,7 +3905,7 @@
     <w:link w:val="QuoteChar"/>
     <w:uiPriority w:val="29"/>
     <w:qFormat/>
-    <w:rsid w:val="004E39CD"/>
+    <w:rsid w:val="000A49FF"/>
     <w:pPr>
       <w:spacing w:before="160"/>
       <w:jc w:val="center"/>
@@ -1263,7 +3921,7 @@
     <w:basedOn w:val="DefaultParagraphFont"/>
     <w:link w:val="Quote"/>
     <w:uiPriority w:val="29"/>
-    <w:rsid w:val="004E39CD"/>
+    <w:rsid w:val="000A49FF"/>
     <w:rPr>
       <w:i/>
       <w:iCs/>
@@ -1275,7 +3933,7 @@
     <w:basedOn w:val="Normal"/>
     <w:uiPriority w:val="34"/>
     <w:qFormat/>
-    <w:rsid w:val="004E39CD"/>
+    <w:rsid w:val="000A49FF"/>
     <w:pPr>
       <w:ind w:left="720"/>
       <w:contextualSpacing/>
@@ -1286,7 +3944,7 @@
     <w:basedOn w:val="DefaultParagraphFont"/>
     <w:uiPriority w:val="21"/>
     <w:qFormat/>
-    <w:rsid w:val="004E39CD"/>
+    <w:rsid w:val="000A49FF"/>
     <w:rPr>
       <w:i/>
       <w:iCs/>
@@ -1300,7 +3958,7 @@
     <w:link w:val="IntenseQuoteChar"/>
     <w:uiPriority w:val="30"/>
     <w:qFormat/>
-    <w:rsid w:val="004E39CD"/>
+    <w:rsid w:val="000A49FF"/>
     <w:pPr>
       <w:pBdr>
         <w:top w:val="single" w:sz="4" w:space="10" w:color="0F4761" w:themeColor="accent1" w:themeShade="BF"/>
@@ -1321,7 +3979,7 @@
     <w:basedOn w:val="DefaultParagraphFont"/>
     <w:link w:val="IntenseQuote"/>
     <w:uiPriority w:val="30"/>
-    <w:rsid w:val="004E39CD"/>
+    <w:rsid w:val="000A49FF"/>
     <w:rPr>
       <w:i/>
       <w:iCs/>
@@ -1333,7 +3991,7 @@
     <w:basedOn w:val="DefaultParagraphFont"/>
     <w:uiPriority w:val="32"/>
     <w:qFormat/>
-    <w:rsid w:val="004E39CD"/>
+    <w:rsid w:val="000A49FF"/>
     <w:rPr>
       <w:b/>
       <w:bCs/>
@@ -1348,7 +4006,7 @@
     <w:link w:val="HeaderChar"/>
     <w:uiPriority w:val="99"/>
     <w:unhideWhenUsed/>
-    <w:rsid w:val="004E39CD"/>
+    <w:rsid w:val="000A49FF"/>
     <w:pPr>
       <w:tabs>
         <w:tab w:val="center" w:pos="4680"/>
@@ -1362,7 +4020,7 @@
     <w:basedOn w:val="DefaultParagraphFont"/>
     <w:link w:val="Header"/>
     <w:uiPriority w:val="99"/>
-    <w:rsid w:val="004E39CD"/>
+    <w:rsid w:val="000A49FF"/>
   </w:style>
   <w:style w:type="paragraph" w:styleId="Footer">
     <w:name w:val="footer"/>
@@ -1370,7 +4028,7 @@
     <w:link w:val="FooterChar"/>
     <w:uiPriority w:val="99"/>
     <w:unhideWhenUsed/>
-    <w:rsid w:val="004E39CD"/>
+    <w:rsid w:val="000A49FF"/>
     <w:pPr>
       <w:tabs>
         <w:tab w:val="center" w:pos="4680"/>
@@ -1384,7 +4042,7 @@
     <w:basedOn w:val="DefaultParagraphFont"/>
     <w:link w:val="Footer"/>
     <w:uiPriority w:val="99"/>
-    <w:rsid w:val="004E39CD"/>
+    <w:rsid w:val="000A49FF"/>
   </w:style>
 </w:styles>
 </file>

</xml_diff>

<commit_message>
fix: set Live Screen View as default so Word opens immediately on generation
</commit_message>
<xml_diff>
--- a/output/uln_document.docx
+++ b/output/uln_document.docx
@@ -37,20 +37,20 @@
           <w:sz w:val="24"/>
         </w:rPr>
         <w:drawing>
-          <wp:inline distT="0" distB="0" distL="0" distR="0">
+          <wp:inline distT="0" distB="0" distL="0" distR="0" wp14:anchorId="5779F885" wp14:editId="3852A734">
             <wp:extent cx="2160000" cy="1440000"/>
             <wp:effectExtent l="0" t="0" r="0" b="8255"/>
-            <wp:docPr id="2018372788" name="Picture 1"/>
+            <wp:docPr id="543089923" name="Picture 1"/>
             <wp:cNvGraphicFramePr/>
             <a:graphic xmlns:a="http://schemas.openxmlformats.org/drawingml/2006/main">
               <a:graphicData uri="http://schemas.openxmlformats.org/drawingml/2006/picture">
                 <pic:pic xmlns:pic="http://schemas.openxmlformats.org/drawingml/2006/picture">
                   <pic:nvPicPr>
-                    <pic:cNvPr id="2018372788" name=""/>
+                    <pic:cNvPr id="543089923" name=""/>
                     <pic:cNvPicPr/>
                   </pic:nvPicPr>
                   <pic:blipFill>
-                    <a:blip r:embed="rId6" cstate="print">
+                    <a:blip r:embed="rId6">
                       <a:extLst>
                         <a:ext uri="{28A0092B-C50C-407E-A947-70E740481C1C}">
                           <a14:useLocalDpi xmlns:a14="http://schemas.microsoft.com/office/drawing/2010/main" val="0"/>
@@ -206,20 +206,20 @@
           <w:sz w:val="24"/>
         </w:rPr>
         <w:drawing>
-          <wp:inline distT="0" distB="0" distL="0" distR="0">
+          <wp:inline distT="0" distB="0" distL="0" distR="0" wp14:anchorId="3999FFB7" wp14:editId="7FAD7666">
             <wp:extent cx="2160000" cy="1440000"/>
             <wp:effectExtent l="0" t="0" r="0" b="8255"/>
-            <wp:docPr id="974214335" name="Picture 2"/>
+            <wp:docPr id="1925342895" name="Picture 2"/>
             <wp:cNvGraphicFramePr/>
             <a:graphic xmlns:a="http://schemas.openxmlformats.org/drawingml/2006/main">
               <a:graphicData uri="http://schemas.openxmlformats.org/drawingml/2006/picture">
                 <pic:pic xmlns:pic="http://schemas.openxmlformats.org/drawingml/2006/picture">
                   <pic:nvPicPr>
-                    <pic:cNvPr id="974214335" name=""/>
+                    <pic:cNvPr id="1925342895" name=""/>
                     <pic:cNvPicPr/>
                   </pic:nvPicPr>
                   <pic:blipFill>
-                    <a:blip r:embed="rId7">
+                    <a:blip r:embed="rId6">
                       <a:extLst>
                         <a:ext uri="{28A0092B-C50C-407E-A947-70E740481C1C}">
                           <a14:useLocalDpi xmlns:a14="http://schemas.microsoft.com/office/drawing/2010/main" val="0"/>
@@ -375,20 +375,20 @@
           <w:sz w:val="24"/>
         </w:rPr>
         <w:drawing>
-          <wp:inline distT="0" distB="0" distL="0" distR="0">
+          <wp:inline distT="0" distB="0" distL="0" distR="0" wp14:anchorId="5806072D" wp14:editId="6E990793">
             <wp:extent cx="2160000" cy="1440000"/>
             <wp:effectExtent l="0" t="0" r="0" b="8255"/>
-            <wp:docPr id="892310409" name="Picture 3"/>
+            <wp:docPr id="1324627772" name="Picture 3"/>
             <wp:cNvGraphicFramePr/>
             <a:graphic xmlns:a="http://schemas.openxmlformats.org/drawingml/2006/main">
               <a:graphicData uri="http://schemas.openxmlformats.org/drawingml/2006/picture">
                 <pic:pic xmlns:pic="http://schemas.openxmlformats.org/drawingml/2006/picture">
                   <pic:nvPicPr>
-                    <pic:cNvPr id="892310409" name=""/>
+                    <pic:cNvPr id="1324627772" name=""/>
                     <pic:cNvPicPr/>
                   </pic:nvPicPr>
                   <pic:blipFill>
-                    <a:blip r:embed="rId8">
+                    <a:blip r:embed="rId6">
                       <a:extLst>
                         <a:ext uri="{28A0092B-C50C-407E-A947-70E740481C1C}">
                           <a14:useLocalDpi xmlns:a14="http://schemas.microsoft.com/office/drawing/2010/main" val="0"/>
@@ -545,20 +545,20 @@
           <w:sz w:val="24"/>
         </w:rPr>
         <w:drawing>
-          <wp:inline distT="0" distB="0" distL="0" distR="0">
+          <wp:inline distT="0" distB="0" distL="0" distR="0" wp14:anchorId="2A182EA7" wp14:editId="66541CE4">
             <wp:extent cx="2160000" cy="1440000"/>
             <wp:effectExtent l="0" t="0" r="0" b="8255"/>
-            <wp:docPr id="1974192293" name="Picture 4"/>
+            <wp:docPr id="1218551113" name="Picture 4"/>
             <wp:cNvGraphicFramePr/>
             <a:graphic xmlns:a="http://schemas.openxmlformats.org/drawingml/2006/main">
               <a:graphicData uri="http://schemas.openxmlformats.org/drawingml/2006/picture">
                 <pic:pic xmlns:pic="http://schemas.openxmlformats.org/drawingml/2006/picture">
                   <pic:nvPicPr>
-                    <pic:cNvPr id="1974192293" name=""/>
+                    <pic:cNvPr id="1218551113" name=""/>
                     <pic:cNvPicPr/>
                   </pic:nvPicPr>
                   <pic:blipFill>
-                    <a:blip r:embed="rId8">
+                    <a:blip r:embed="rId6">
                       <a:extLst>
                         <a:ext uri="{28A0092B-C50C-407E-A947-70E740481C1C}">
                           <a14:useLocalDpi xmlns:a14="http://schemas.microsoft.com/office/drawing/2010/main" val="0"/>
@@ -714,20 +714,20 @@
           <w:sz w:val="24"/>
         </w:rPr>
         <w:drawing>
-          <wp:inline distT="0" distB="0" distL="0" distR="0">
+          <wp:inline distT="0" distB="0" distL="0" distR="0" wp14:anchorId="4D77B96E" wp14:editId="2938382F">
             <wp:extent cx="2160000" cy="1440000"/>
             <wp:effectExtent l="0" t="0" r="0" b="8255"/>
-            <wp:docPr id="1846862289" name="Picture 5"/>
+            <wp:docPr id="725127105" name="Picture 5"/>
             <wp:cNvGraphicFramePr/>
             <a:graphic xmlns:a="http://schemas.openxmlformats.org/drawingml/2006/main">
               <a:graphicData uri="http://schemas.openxmlformats.org/drawingml/2006/picture">
                 <pic:pic xmlns:pic="http://schemas.openxmlformats.org/drawingml/2006/picture">
                   <pic:nvPicPr>
-                    <pic:cNvPr id="1846862289" name=""/>
+                    <pic:cNvPr id="725127105" name=""/>
                     <pic:cNvPicPr/>
                   </pic:nvPicPr>
                   <pic:blipFill>
-                    <a:blip r:embed="rId8">
+                    <a:blip r:embed="rId6">
                       <a:extLst>
                         <a:ext uri="{28A0092B-C50C-407E-A947-70E740481C1C}">
                           <a14:useLocalDpi xmlns:a14="http://schemas.microsoft.com/office/drawing/2010/main" val="0"/>
@@ -883,20 +883,20 @@
           <w:sz w:val="24"/>
         </w:rPr>
         <w:drawing>
-          <wp:inline distT="0" distB="0" distL="0" distR="0">
+          <wp:inline distT="0" distB="0" distL="0" distR="0" wp14:anchorId="23D4C617" wp14:editId="3214A603">
             <wp:extent cx="2160000" cy="1440000"/>
             <wp:effectExtent l="0" t="0" r="0" b="8255"/>
-            <wp:docPr id="776522307" name="Picture 6"/>
+            <wp:docPr id="1252713534" name="Picture 6"/>
             <wp:cNvGraphicFramePr/>
             <a:graphic xmlns:a="http://schemas.openxmlformats.org/drawingml/2006/main">
               <a:graphicData uri="http://schemas.openxmlformats.org/drawingml/2006/picture">
                 <pic:pic xmlns:pic="http://schemas.openxmlformats.org/drawingml/2006/picture">
                   <pic:nvPicPr>
-                    <pic:cNvPr id="776522307" name=""/>
+                    <pic:cNvPr id="1252713534" name=""/>
                     <pic:cNvPicPr/>
                   </pic:nvPicPr>
                   <pic:blipFill>
-                    <a:blip r:embed="rId8">
+                    <a:blip r:embed="rId6">
                       <a:extLst>
                         <a:ext uri="{28A0092B-C50C-407E-A947-70E740481C1C}">
                           <a14:useLocalDpi xmlns:a14="http://schemas.microsoft.com/office/drawing/2010/main" val="0"/>
@@ -1053,20 +1053,20 @@
           <w:sz w:val="24"/>
         </w:rPr>
         <w:drawing>
-          <wp:inline distT="0" distB="0" distL="0" distR="0">
+          <wp:inline distT="0" distB="0" distL="0" distR="0" wp14:anchorId="3600A831" wp14:editId="6DEEAC94">
             <wp:extent cx="2160000" cy="1440000"/>
             <wp:effectExtent l="0" t="0" r="0" b="8255"/>
-            <wp:docPr id="496803042" name="Picture 7"/>
+            <wp:docPr id="2058438607" name="Picture 7"/>
             <wp:cNvGraphicFramePr/>
             <a:graphic xmlns:a="http://schemas.openxmlformats.org/drawingml/2006/main">
               <a:graphicData uri="http://schemas.openxmlformats.org/drawingml/2006/picture">
                 <pic:pic xmlns:pic="http://schemas.openxmlformats.org/drawingml/2006/picture">
                   <pic:nvPicPr>
-                    <pic:cNvPr id="496803042" name=""/>
+                    <pic:cNvPr id="2058438607" name=""/>
                     <pic:cNvPicPr/>
                   </pic:nvPicPr>
                   <pic:blipFill>
-                    <a:blip r:embed="rId8">
+                    <a:blip r:embed="rId6">
                       <a:extLst>
                         <a:ext uri="{28A0092B-C50C-407E-A947-70E740481C1C}">
                           <a14:useLocalDpi xmlns:a14="http://schemas.microsoft.com/office/drawing/2010/main" val="0"/>
@@ -1222,20 +1222,20 @@
           <w:sz w:val="24"/>
         </w:rPr>
         <w:drawing>
-          <wp:inline distT="0" distB="0" distL="0" distR="0">
+          <wp:inline distT="0" distB="0" distL="0" distR="0" wp14:anchorId="20A5E6BB" wp14:editId="2ED7C401">
             <wp:extent cx="2160000" cy="1440000"/>
             <wp:effectExtent l="0" t="0" r="0" b="8255"/>
-            <wp:docPr id="867493899" name="Picture 8"/>
+            <wp:docPr id="2126129283" name="Picture 8"/>
             <wp:cNvGraphicFramePr/>
             <a:graphic xmlns:a="http://schemas.openxmlformats.org/drawingml/2006/main">
               <a:graphicData uri="http://schemas.openxmlformats.org/drawingml/2006/picture">
                 <pic:pic xmlns:pic="http://schemas.openxmlformats.org/drawingml/2006/picture">
                   <pic:nvPicPr>
-                    <pic:cNvPr id="867493899" name=""/>
+                    <pic:cNvPr id="2126129283" name=""/>
                     <pic:cNvPicPr/>
                   </pic:nvPicPr>
                   <pic:blipFill>
-                    <a:blip r:embed="rId8">
+                    <a:blip r:embed="rId6">
                       <a:extLst>
                         <a:ext uri="{28A0092B-C50C-407E-A947-70E740481C1C}">
                           <a14:useLocalDpi xmlns:a14="http://schemas.microsoft.com/office/drawing/2010/main" val="0"/>
@@ -1391,20 +1391,20 @@
           <w:sz w:val="24"/>
         </w:rPr>
         <w:drawing>
-          <wp:inline distT="0" distB="0" distL="0" distR="0">
+          <wp:inline distT="0" distB="0" distL="0" distR="0" wp14:anchorId="0A07355D" wp14:editId="043601D8">
             <wp:extent cx="2160000" cy="1440000"/>
             <wp:effectExtent l="0" t="0" r="0" b="8255"/>
-            <wp:docPr id="1109392754" name="Picture 9"/>
+            <wp:docPr id="1769987345" name="Picture 9"/>
             <wp:cNvGraphicFramePr/>
             <a:graphic xmlns:a="http://schemas.openxmlformats.org/drawingml/2006/main">
               <a:graphicData uri="http://schemas.openxmlformats.org/drawingml/2006/picture">
                 <pic:pic xmlns:pic="http://schemas.openxmlformats.org/drawingml/2006/picture">
                   <pic:nvPicPr>
-                    <pic:cNvPr id="1109392754" name=""/>
+                    <pic:cNvPr id="1769987345" name=""/>
                     <pic:cNvPicPr/>
                   </pic:nvPicPr>
                   <pic:blipFill>
-                    <a:blip r:embed="rId8">
+                    <a:blip r:embed="rId6">
                       <a:extLst>
                         <a:ext uri="{28A0092B-C50C-407E-A947-70E740481C1C}">
                           <a14:useLocalDpi xmlns:a14="http://schemas.microsoft.com/office/drawing/2010/main" val="0"/>
@@ -1561,20 +1561,20 @@
           <w:sz w:val="24"/>
         </w:rPr>
         <w:drawing>
-          <wp:inline distT="0" distB="0" distL="0" distR="0">
+          <wp:inline distT="0" distB="0" distL="0" distR="0" wp14:anchorId="7F56B98F" wp14:editId="6E996863">
             <wp:extent cx="2160000" cy="1440000"/>
             <wp:effectExtent l="0" t="0" r="0" b="8255"/>
-            <wp:docPr id="1678317791" name="Picture 10"/>
+            <wp:docPr id="261241243" name="Picture 10"/>
             <wp:cNvGraphicFramePr/>
             <a:graphic xmlns:a="http://schemas.openxmlformats.org/drawingml/2006/main">
               <a:graphicData uri="http://schemas.openxmlformats.org/drawingml/2006/picture">
                 <pic:pic xmlns:pic="http://schemas.openxmlformats.org/drawingml/2006/picture">
                   <pic:nvPicPr>
-                    <pic:cNvPr id="1678317791" name=""/>
+                    <pic:cNvPr id="261241243" name=""/>
                     <pic:cNvPicPr/>
                   </pic:nvPicPr>
                   <pic:blipFill>
-                    <a:blip r:embed="rId8">
+                    <a:blip r:embed="rId6">
                       <a:extLst>
                         <a:ext uri="{28A0092B-C50C-407E-A947-70E740481C1C}">
                           <a14:useLocalDpi xmlns:a14="http://schemas.microsoft.com/office/drawing/2010/main" val="0"/>
@@ -1730,20 +1730,20 @@
           <w:sz w:val="24"/>
         </w:rPr>
         <w:drawing>
-          <wp:inline distT="0" distB="0" distL="0" distR="0">
+          <wp:inline distT="0" distB="0" distL="0" distR="0" wp14:anchorId="588DF459" wp14:editId="60E617B1">
             <wp:extent cx="2160000" cy="1440000"/>
             <wp:effectExtent l="0" t="0" r="0" b="8255"/>
-            <wp:docPr id="1868892135" name="Picture 11"/>
+            <wp:docPr id="284735513" name="Picture 11"/>
             <wp:cNvGraphicFramePr/>
             <a:graphic xmlns:a="http://schemas.openxmlformats.org/drawingml/2006/main">
               <a:graphicData uri="http://schemas.openxmlformats.org/drawingml/2006/picture">
                 <pic:pic xmlns:pic="http://schemas.openxmlformats.org/drawingml/2006/picture">
                   <pic:nvPicPr>
-                    <pic:cNvPr id="1868892135" name=""/>
+                    <pic:cNvPr id="284735513" name=""/>
                     <pic:cNvPicPr/>
                   </pic:nvPicPr>
                   <pic:blipFill>
-                    <a:blip r:embed="rId8">
+                    <a:blip r:embed="rId6">
                       <a:extLst>
                         <a:ext uri="{28A0092B-C50C-407E-A947-70E740481C1C}">
                           <a14:useLocalDpi xmlns:a14="http://schemas.microsoft.com/office/drawing/2010/main" val="0"/>
@@ -1899,20 +1899,20 @@
           <w:sz w:val="24"/>
         </w:rPr>
         <w:drawing>
-          <wp:inline distT="0" distB="0" distL="0" distR="0">
+          <wp:inline distT="0" distB="0" distL="0" distR="0" wp14:anchorId="1ECE40E0" wp14:editId="55B1F39B">
             <wp:extent cx="2160000" cy="1440000"/>
             <wp:effectExtent l="0" t="0" r="0" b="8255"/>
-            <wp:docPr id="1100064189" name="Picture 12"/>
+            <wp:docPr id="2099219557" name="Picture 12"/>
             <wp:cNvGraphicFramePr/>
             <a:graphic xmlns:a="http://schemas.openxmlformats.org/drawingml/2006/main">
               <a:graphicData uri="http://schemas.openxmlformats.org/drawingml/2006/picture">
                 <pic:pic xmlns:pic="http://schemas.openxmlformats.org/drawingml/2006/picture">
                   <pic:nvPicPr>
-                    <pic:cNvPr id="1100064189" name=""/>
+                    <pic:cNvPr id="2099219557" name=""/>
                     <pic:cNvPicPr/>
                   </pic:nvPicPr>
                   <pic:blipFill>
-                    <a:blip r:embed="rId8">
+                    <a:blip r:embed="rId6">
                       <a:extLst>
                         <a:ext uri="{28A0092B-C50C-407E-A947-70E740481C1C}">
                           <a14:useLocalDpi xmlns:a14="http://schemas.microsoft.com/office/drawing/2010/main" val="0"/>
@@ -2069,20 +2069,20 @@
           <w:sz w:val="24"/>
         </w:rPr>
         <w:drawing>
-          <wp:inline distT="0" distB="0" distL="0" distR="0">
+          <wp:inline distT="0" distB="0" distL="0" distR="0" wp14:anchorId="7DADE682" wp14:editId="4ED26FE8">
             <wp:extent cx="2160000" cy="1440000"/>
             <wp:effectExtent l="0" t="0" r="0" b="8255"/>
-            <wp:docPr id="271626012" name="Picture 13"/>
+            <wp:docPr id="195141814" name="Picture 13"/>
             <wp:cNvGraphicFramePr/>
             <a:graphic xmlns:a="http://schemas.openxmlformats.org/drawingml/2006/main">
               <a:graphicData uri="http://schemas.openxmlformats.org/drawingml/2006/picture">
                 <pic:pic xmlns:pic="http://schemas.openxmlformats.org/drawingml/2006/picture">
                   <pic:nvPicPr>
-                    <pic:cNvPr id="271626012" name=""/>
+                    <pic:cNvPr id="195141814" name=""/>
                     <pic:cNvPicPr/>
                   </pic:nvPicPr>
                   <pic:blipFill>
-                    <a:blip r:embed="rId8">
+                    <a:blip r:embed="rId6">
                       <a:extLst>
                         <a:ext uri="{28A0092B-C50C-407E-A947-70E740481C1C}">
                           <a14:useLocalDpi xmlns:a14="http://schemas.microsoft.com/office/drawing/2010/main" val="0"/>
@@ -2238,20 +2238,20 @@
           <w:sz w:val="24"/>
         </w:rPr>
         <w:drawing>
-          <wp:inline distT="0" distB="0" distL="0" distR="0">
+          <wp:inline distT="0" distB="0" distL="0" distR="0" wp14:anchorId="6D94490F" wp14:editId="47C948B6">
             <wp:extent cx="2160000" cy="1440000"/>
             <wp:effectExtent l="0" t="0" r="0" b="8255"/>
-            <wp:docPr id="1023308072" name="Picture 14"/>
+            <wp:docPr id="1577957878" name="Picture 14"/>
             <wp:cNvGraphicFramePr/>
             <a:graphic xmlns:a="http://schemas.openxmlformats.org/drawingml/2006/main">
               <a:graphicData uri="http://schemas.openxmlformats.org/drawingml/2006/picture">
                 <pic:pic xmlns:pic="http://schemas.openxmlformats.org/drawingml/2006/picture">
                   <pic:nvPicPr>
-                    <pic:cNvPr id="1023308072" name=""/>
+                    <pic:cNvPr id="1577957878" name=""/>
                     <pic:cNvPicPr/>
                   </pic:nvPicPr>
                   <pic:blipFill>
-                    <a:blip r:embed="rId8">
+                    <a:blip r:embed="rId6">
                       <a:extLst>
                         <a:ext uri="{28A0092B-C50C-407E-A947-70E740481C1C}">
                           <a14:useLocalDpi xmlns:a14="http://schemas.microsoft.com/office/drawing/2010/main" val="0"/>
@@ -2407,20 +2407,20 @@
           <w:sz w:val="24"/>
         </w:rPr>
         <w:drawing>
-          <wp:inline distT="0" distB="0" distL="0" distR="0">
+          <wp:inline distT="0" distB="0" distL="0" distR="0" wp14:anchorId="40346614" wp14:editId="2E015C53">
             <wp:extent cx="2160000" cy="1440000"/>
             <wp:effectExtent l="0" t="0" r="0" b="8255"/>
-            <wp:docPr id="121910101" name="Picture 15"/>
+            <wp:docPr id="2142285790" name="Picture 15"/>
             <wp:cNvGraphicFramePr/>
             <a:graphic xmlns:a="http://schemas.openxmlformats.org/drawingml/2006/main">
               <a:graphicData uri="http://schemas.openxmlformats.org/drawingml/2006/picture">
                 <pic:pic xmlns:pic="http://schemas.openxmlformats.org/drawingml/2006/picture">
                   <pic:nvPicPr>
-                    <pic:cNvPr id="121910101" name=""/>
+                    <pic:cNvPr id="2142285790" name=""/>
                     <pic:cNvPicPr/>
                   </pic:nvPicPr>
                   <pic:blipFill>
-                    <a:blip r:embed="rId8">
+                    <a:blip r:embed="rId6">
                       <a:extLst>
                         <a:ext uri="{28A0092B-C50C-407E-A947-70E740481C1C}">
                           <a14:useLocalDpi xmlns:a14="http://schemas.microsoft.com/office/drawing/2010/main" val="0"/>
@@ -2577,20 +2577,20 @@
           <w:sz w:val="24"/>
         </w:rPr>
         <w:drawing>
-          <wp:inline distT="0" distB="0" distL="0" distR="0">
+          <wp:inline distT="0" distB="0" distL="0" distR="0" wp14:anchorId="482BA6E1" wp14:editId="6DD71331">
             <wp:extent cx="2160000" cy="1440000"/>
             <wp:effectExtent l="0" t="0" r="0" b="8255"/>
-            <wp:docPr id="1772893097" name="Picture 16"/>
+            <wp:docPr id="387251143" name="Picture 16"/>
             <wp:cNvGraphicFramePr/>
             <a:graphic xmlns:a="http://schemas.openxmlformats.org/drawingml/2006/main">
               <a:graphicData uri="http://schemas.openxmlformats.org/drawingml/2006/picture">
                 <pic:pic xmlns:pic="http://schemas.openxmlformats.org/drawingml/2006/picture">
                   <pic:nvPicPr>
-                    <pic:cNvPr id="1772893097" name=""/>
+                    <pic:cNvPr id="387251143" name=""/>
                     <pic:cNvPicPr/>
                   </pic:nvPicPr>
                   <pic:blipFill>
-                    <a:blip r:embed="rId8">
+                    <a:blip r:embed="rId6">
                       <a:extLst>
                         <a:ext uri="{28A0092B-C50C-407E-A947-70E740481C1C}">
                           <a14:useLocalDpi xmlns:a14="http://schemas.microsoft.com/office/drawing/2010/main" val="0"/>
@@ -2746,20 +2746,20 @@
           <w:sz w:val="24"/>
         </w:rPr>
         <w:drawing>
-          <wp:inline distT="0" distB="0" distL="0" distR="0">
+          <wp:inline distT="0" distB="0" distL="0" distR="0" wp14:anchorId="07983143" wp14:editId="00FCAEBF">
             <wp:extent cx="2160000" cy="1440000"/>
             <wp:effectExtent l="0" t="0" r="0" b="8255"/>
-            <wp:docPr id="959945702" name="Picture 17"/>
+            <wp:docPr id="668789964" name="Picture 17"/>
             <wp:cNvGraphicFramePr/>
             <a:graphic xmlns:a="http://schemas.openxmlformats.org/drawingml/2006/main">
               <a:graphicData uri="http://schemas.openxmlformats.org/drawingml/2006/picture">
                 <pic:pic xmlns:pic="http://schemas.openxmlformats.org/drawingml/2006/picture">
                   <pic:nvPicPr>
-                    <pic:cNvPr id="959945702" name=""/>
+                    <pic:cNvPr id="668789964" name=""/>
                     <pic:cNvPicPr/>
                   </pic:nvPicPr>
                   <pic:blipFill>
-                    <a:blip r:embed="rId8">
+                    <a:blip r:embed="rId6">
                       <a:extLst>
                         <a:ext uri="{28A0092B-C50C-407E-A947-70E740481C1C}">
                           <a14:useLocalDpi xmlns:a14="http://schemas.microsoft.com/office/drawing/2010/main" val="0"/>
@@ -2890,12 +2890,12 @@
       </w:pPr>
     </w:p>
     <w:sectPr>
-      <w:headerReference w:type="even" r:id="rId9"/>
-      <w:headerReference w:type="default" r:id="rId10"/>
-      <w:footerReference w:type="even" r:id="rId11"/>
-      <w:footerReference w:type="default" r:id="rId12"/>
-      <w:headerReference w:type="first" r:id="rId13"/>
-      <w:footerReference w:type="first" r:id="rId14"/>
+      <w:headerReference w:type="even" r:id="rId7"/>
+      <w:headerReference w:type="default" r:id="rId8"/>
+      <w:footerReference w:type="even" r:id="rId9"/>
+      <w:footerReference w:type="default" r:id="rId10"/>
+      <w:headerReference w:type="first" r:id="rId11"/>
+      <w:footerReference w:type="first" r:id="rId12"/>
       <w:pgSz w:w="11907" w:h="16840" w:code="9"/>
       <w:pgMar w:top="1134" w:right="850" w:bottom="1134" w:left="1701" w:header="720" w:footer="720" w:gutter="0"/>
       <w:cols w:space="720"/>
@@ -3491,7 +3491,7 @@
     <w:link w:val="Heading1Char"/>
     <w:uiPriority w:val="9"/>
     <w:qFormat/>
-    <w:rsid w:val="000A49FF"/>
+    <w:rsid w:val="00A0066C"/>
     <w:pPr>
       <w:keepNext/>
       <w:keepLines/>
@@ -3514,7 +3514,7 @@
     <w:semiHidden/>
     <w:unhideWhenUsed/>
     <w:qFormat/>
-    <w:rsid w:val="000A49FF"/>
+    <w:rsid w:val="00A0066C"/>
     <w:pPr>
       <w:keepNext/>
       <w:keepLines/>
@@ -3537,7 +3537,7 @@
     <w:semiHidden/>
     <w:unhideWhenUsed/>
     <w:qFormat/>
-    <w:rsid w:val="000A49FF"/>
+    <w:rsid w:val="00A0066C"/>
     <w:pPr>
       <w:keepNext/>
       <w:keepLines/>
@@ -3560,7 +3560,7 @@
     <w:semiHidden/>
     <w:unhideWhenUsed/>
     <w:qFormat/>
-    <w:rsid w:val="000A49FF"/>
+    <w:rsid w:val="00A0066C"/>
     <w:pPr>
       <w:keepNext/>
       <w:keepLines/>
@@ -3583,7 +3583,7 @@
     <w:semiHidden/>
     <w:unhideWhenUsed/>
     <w:qFormat/>
-    <w:rsid w:val="000A49FF"/>
+    <w:rsid w:val="00A0066C"/>
     <w:pPr>
       <w:keepNext/>
       <w:keepLines/>
@@ -3604,7 +3604,7 @@
     <w:semiHidden/>
     <w:unhideWhenUsed/>
     <w:qFormat/>
-    <w:rsid w:val="000A49FF"/>
+    <w:rsid w:val="00A0066C"/>
     <w:pPr>
       <w:keepNext/>
       <w:keepLines/>
@@ -3627,7 +3627,7 @@
     <w:semiHidden/>
     <w:unhideWhenUsed/>
     <w:qFormat/>
-    <w:rsid w:val="000A49FF"/>
+    <w:rsid w:val="00A0066C"/>
     <w:pPr>
       <w:keepNext/>
       <w:keepLines/>
@@ -3648,7 +3648,7 @@
     <w:semiHidden/>
     <w:unhideWhenUsed/>
     <w:qFormat/>
-    <w:rsid w:val="000A49FF"/>
+    <w:rsid w:val="00A0066C"/>
     <w:pPr>
       <w:keepNext/>
       <w:keepLines/>
@@ -3671,7 +3671,7 @@
     <w:semiHidden/>
     <w:unhideWhenUsed/>
     <w:qFormat/>
-    <w:rsid w:val="000A49FF"/>
+    <w:rsid w:val="00A0066C"/>
     <w:pPr>
       <w:keepNext/>
       <w:keepLines/>
@@ -3715,7 +3715,7 @@
     <w:basedOn w:val="DefaultParagraphFont"/>
     <w:link w:val="Heading1"/>
     <w:uiPriority w:val="9"/>
-    <w:rsid w:val="000A49FF"/>
+    <w:rsid w:val="00A0066C"/>
     <w:rPr>
       <w:rFonts w:asciiTheme="majorHAnsi" w:eastAsiaTheme="majorEastAsia" w:hAnsiTheme="majorHAnsi" w:cstheme="majorBidi"/>
       <w:color w:val="0F4761" w:themeColor="accent1" w:themeShade="BF"/>
@@ -3729,7 +3729,7 @@
     <w:link w:val="Heading2"/>
     <w:uiPriority w:val="9"/>
     <w:semiHidden/>
-    <w:rsid w:val="000A49FF"/>
+    <w:rsid w:val="00A0066C"/>
     <w:rPr>
       <w:rFonts w:asciiTheme="majorHAnsi" w:eastAsiaTheme="majorEastAsia" w:hAnsiTheme="majorHAnsi" w:cstheme="majorBidi"/>
       <w:color w:val="0F4761" w:themeColor="accent1" w:themeShade="BF"/>
@@ -3743,7 +3743,7 @@
     <w:link w:val="Heading3"/>
     <w:uiPriority w:val="9"/>
     <w:semiHidden/>
-    <w:rsid w:val="000A49FF"/>
+    <w:rsid w:val="00A0066C"/>
     <w:rPr>
       <w:rFonts w:asciiTheme="minorHAnsi" w:eastAsiaTheme="majorEastAsia" w:hAnsiTheme="minorHAnsi" w:cstheme="majorBidi"/>
       <w:color w:val="0F4761" w:themeColor="accent1" w:themeShade="BF"/>
@@ -3757,7 +3757,7 @@
     <w:link w:val="Heading4"/>
     <w:uiPriority w:val="9"/>
     <w:semiHidden/>
-    <w:rsid w:val="000A49FF"/>
+    <w:rsid w:val="00A0066C"/>
     <w:rPr>
       <w:rFonts w:asciiTheme="minorHAnsi" w:eastAsiaTheme="majorEastAsia" w:hAnsiTheme="minorHAnsi" w:cstheme="majorBidi"/>
       <w:i/>
@@ -3771,7 +3771,7 @@
     <w:link w:val="Heading5"/>
     <w:uiPriority w:val="9"/>
     <w:semiHidden/>
-    <w:rsid w:val="000A49FF"/>
+    <w:rsid w:val="00A0066C"/>
     <w:rPr>
       <w:rFonts w:asciiTheme="minorHAnsi" w:eastAsiaTheme="majorEastAsia" w:hAnsiTheme="minorHAnsi" w:cstheme="majorBidi"/>
       <w:color w:val="0F4761" w:themeColor="accent1" w:themeShade="BF"/>
@@ -3783,7 +3783,7 @@
     <w:link w:val="Heading6"/>
     <w:uiPriority w:val="9"/>
     <w:semiHidden/>
-    <w:rsid w:val="000A49FF"/>
+    <w:rsid w:val="00A0066C"/>
     <w:rPr>
       <w:rFonts w:asciiTheme="minorHAnsi" w:eastAsiaTheme="majorEastAsia" w:hAnsiTheme="minorHAnsi" w:cstheme="majorBidi"/>
       <w:i/>
@@ -3797,7 +3797,7 @@
     <w:link w:val="Heading7"/>
     <w:uiPriority w:val="9"/>
     <w:semiHidden/>
-    <w:rsid w:val="000A49FF"/>
+    <w:rsid w:val="00A0066C"/>
     <w:rPr>
       <w:rFonts w:asciiTheme="minorHAnsi" w:eastAsiaTheme="majorEastAsia" w:hAnsiTheme="minorHAnsi" w:cstheme="majorBidi"/>
       <w:color w:val="595959" w:themeColor="text1" w:themeTint="A6"/>
@@ -3809,7 +3809,7 @@
     <w:link w:val="Heading8"/>
     <w:uiPriority w:val="9"/>
     <w:semiHidden/>
-    <w:rsid w:val="000A49FF"/>
+    <w:rsid w:val="00A0066C"/>
     <w:rPr>
       <w:rFonts w:asciiTheme="minorHAnsi" w:eastAsiaTheme="majorEastAsia" w:hAnsiTheme="minorHAnsi" w:cstheme="majorBidi"/>
       <w:i/>
@@ -3823,7 +3823,7 @@
     <w:link w:val="Heading9"/>
     <w:uiPriority w:val="9"/>
     <w:semiHidden/>
-    <w:rsid w:val="000A49FF"/>
+    <w:rsid w:val="00A0066C"/>
     <w:rPr>
       <w:rFonts w:asciiTheme="minorHAnsi" w:eastAsiaTheme="majorEastAsia" w:hAnsiTheme="minorHAnsi" w:cstheme="majorBidi"/>
       <w:color w:val="272727" w:themeColor="text1" w:themeTint="D8"/>
@@ -3836,7 +3836,7 @@
     <w:link w:val="TitleChar"/>
     <w:uiPriority w:val="10"/>
     <w:qFormat/>
-    <w:rsid w:val="000A49FF"/>
+    <w:rsid w:val="00A0066C"/>
     <w:pPr>
       <w:spacing w:after="80" w:line="240" w:lineRule="auto"/>
       <w:contextualSpacing/>
@@ -3854,7 +3854,7 @@
     <w:basedOn w:val="DefaultParagraphFont"/>
     <w:link w:val="Title"/>
     <w:uiPriority w:val="10"/>
-    <w:rsid w:val="000A49FF"/>
+    <w:rsid w:val="00A0066C"/>
     <w:rPr>
       <w:rFonts w:asciiTheme="majorHAnsi" w:eastAsiaTheme="majorEastAsia" w:hAnsiTheme="majorHAnsi" w:cstheme="majorBidi"/>
       <w:spacing w:val="-10"/>
@@ -3870,7 +3870,7 @@
     <w:link w:val="SubtitleChar"/>
     <w:uiPriority w:val="11"/>
     <w:qFormat/>
-    <w:rsid w:val="000A49FF"/>
+    <w:rsid w:val="00A0066C"/>
     <w:pPr>
       <w:numPr>
         <w:ilvl w:val="1"/>
@@ -3889,7 +3889,7 @@
     <w:basedOn w:val="DefaultParagraphFont"/>
     <w:link w:val="Subtitle"/>
     <w:uiPriority w:val="11"/>
-    <w:rsid w:val="000A49FF"/>
+    <w:rsid w:val="00A0066C"/>
     <w:rPr>
       <w:rFonts w:asciiTheme="minorHAnsi" w:eastAsiaTheme="majorEastAsia" w:hAnsiTheme="minorHAnsi" w:cstheme="majorBidi"/>
       <w:color w:val="595959" w:themeColor="text1" w:themeTint="A6"/>
@@ -3905,7 +3905,7 @@
     <w:link w:val="QuoteChar"/>
     <w:uiPriority w:val="29"/>
     <w:qFormat/>
-    <w:rsid w:val="000A49FF"/>
+    <w:rsid w:val="00A0066C"/>
     <w:pPr>
       <w:spacing w:before="160"/>
       <w:jc w:val="center"/>
@@ -3921,7 +3921,7 @@
     <w:basedOn w:val="DefaultParagraphFont"/>
     <w:link w:val="Quote"/>
     <w:uiPriority w:val="29"/>
-    <w:rsid w:val="000A49FF"/>
+    <w:rsid w:val="00A0066C"/>
     <w:rPr>
       <w:i/>
       <w:iCs/>
@@ -3933,7 +3933,7 @@
     <w:basedOn w:val="Normal"/>
     <w:uiPriority w:val="34"/>
     <w:qFormat/>
-    <w:rsid w:val="000A49FF"/>
+    <w:rsid w:val="00A0066C"/>
     <w:pPr>
       <w:ind w:left="720"/>
       <w:contextualSpacing/>
@@ -3944,7 +3944,7 @@
     <w:basedOn w:val="DefaultParagraphFont"/>
     <w:uiPriority w:val="21"/>
     <w:qFormat/>
-    <w:rsid w:val="000A49FF"/>
+    <w:rsid w:val="00A0066C"/>
     <w:rPr>
       <w:i/>
       <w:iCs/>
@@ -3958,7 +3958,7 @@
     <w:link w:val="IntenseQuoteChar"/>
     <w:uiPriority w:val="30"/>
     <w:qFormat/>
-    <w:rsid w:val="000A49FF"/>
+    <w:rsid w:val="00A0066C"/>
     <w:pPr>
       <w:pBdr>
         <w:top w:val="single" w:sz="4" w:space="10" w:color="0F4761" w:themeColor="accent1" w:themeShade="BF"/>
@@ -3979,7 +3979,7 @@
     <w:basedOn w:val="DefaultParagraphFont"/>
     <w:link w:val="IntenseQuote"/>
     <w:uiPriority w:val="30"/>
-    <w:rsid w:val="000A49FF"/>
+    <w:rsid w:val="00A0066C"/>
     <w:rPr>
       <w:i/>
       <w:iCs/>
@@ -3991,7 +3991,7 @@
     <w:basedOn w:val="DefaultParagraphFont"/>
     <w:uiPriority w:val="32"/>
     <w:qFormat/>
-    <w:rsid w:val="000A49FF"/>
+    <w:rsid w:val="00A0066C"/>
     <w:rPr>
       <w:b/>
       <w:bCs/>
@@ -4006,7 +4006,7 @@
     <w:link w:val="HeaderChar"/>
     <w:uiPriority w:val="99"/>
     <w:unhideWhenUsed/>
-    <w:rsid w:val="000A49FF"/>
+    <w:rsid w:val="00A0066C"/>
     <w:pPr>
       <w:tabs>
         <w:tab w:val="center" w:pos="4680"/>
@@ -4020,7 +4020,7 @@
     <w:basedOn w:val="DefaultParagraphFont"/>
     <w:link w:val="Header"/>
     <w:uiPriority w:val="99"/>
-    <w:rsid w:val="000A49FF"/>
+    <w:rsid w:val="00A0066C"/>
   </w:style>
   <w:style w:type="paragraph" w:styleId="Footer">
     <w:name w:val="footer"/>
@@ -4028,7 +4028,7 @@
     <w:link w:val="FooterChar"/>
     <w:uiPriority w:val="99"/>
     <w:unhideWhenUsed/>
-    <w:rsid w:val="000A49FF"/>
+    <w:rsid w:val="00A0066C"/>
     <w:pPr>
       <w:tabs>
         <w:tab w:val="center" w:pos="4680"/>
@@ -4042,7 +4042,7 @@
     <w:basedOn w:val="DefaultParagraphFont"/>
     <w:link w:val="Footer"/>
     <w:uiPriority w:val="99"/>
-    <w:rsid w:val="000A49FF"/>
+    <w:rsid w:val="00A0066C"/>
   </w:style>
 </w:styles>
 </file>

</xml_diff>

<commit_message>
feat: auto-minimize GUI window during compilation so MS Word is unblocked
</commit_message>
<xml_diff>
--- a/output/uln_document.docx
+++ b/output/uln_document.docx
@@ -37,16 +37,16 @@
           <w:sz w:val="24"/>
         </w:rPr>
         <w:drawing>
-          <wp:inline distT="0" distB="0" distL="0" distR="0" wp14:anchorId="5779F885" wp14:editId="3852A734">
+          <wp:inline distT="0" distB="0" distL="0" distR="0">
             <wp:extent cx="2160000" cy="1440000"/>
             <wp:effectExtent l="0" t="0" r="0" b="8255"/>
-            <wp:docPr id="543089923" name="Picture 1"/>
+            <wp:docPr id="180975263" name="Picture 1"/>
             <wp:cNvGraphicFramePr/>
             <a:graphic xmlns:a="http://schemas.openxmlformats.org/drawingml/2006/main">
               <a:graphicData uri="http://schemas.openxmlformats.org/drawingml/2006/picture">
                 <pic:pic xmlns:pic="http://schemas.openxmlformats.org/drawingml/2006/picture">
                   <pic:nvPicPr>
-                    <pic:cNvPr id="543089923" name=""/>
+                    <pic:cNvPr id="180975263" name=""/>
                     <pic:cNvPicPr/>
                   </pic:nvPicPr>
                   <pic:blipFill>
@@ -206,16 +206,16 @@
           <w:sz w:val="24"/>
         </w:rPr>
         <w:drawing>
-          <wp:inline distT="0" distB="0" distL="0" distR="0" wp14:anchorId="3999FFB7" wp14:editId="7FAD7666">
+          <wp:inline distT="0" distB="0" distL="0" distR="0">
             <wp:extent cx="2160000" cy="1440000"/>
             <wp:effectExtent l="0" t="0" r="0" b="8255"/>
-            <wp:docPr id="1925342895" name="Picture 2"/>
+            <wp:docPr id="966731096" name="Picture 2"/>
             <wp:cNvGraphicFramePr/>
             <a:graphic xmlns:a="http://schemas.openxmlformats.org/drawingml/2006/main">
               <a:graphicData uri="http://schemas.openxmlformats.org/drawingml/2006/picture">
                 <pic:pic xmlns:pic="http://schemas.openxmlformats.org/drawingml/2006/picture">
                   <pic:nvPicPr>
-                    <pic:cNvPr id="1925342895" name=""/>
+                    <pic:cNvPr id="966731096" name=""/>
                     <pic:cNvPicPr/>
                   </pic:nvPicPr>
                   <pic:blipFill>
@@ -375,16 +375,16 @@
           <w:sz w:val="24"/>
         </w:rPr>
         <w:drawing>
-          <wp:inline distT="0" distB="0" distL="0" distR="0" wp14:anchorId="5806072D" wp14:editId="6E990793">
+          <wp:inline distT="0" distB="0" distL="0" distR="0">
             <wp:extent cx="2160000" cy="1440000"/>
             <wp:effectExtent l="0" t="0" r="0" b="8255"/>
-            <wp:docPr id="1324627772" name="Picture 3"/>
+            <wp:docPr id="1781980810" name="Picture 3"/>
             <wp:cNvGraphicFramePr/>
             <a:graphic xmlns:a="http://schemas.openxmlformats.org/drawingml/2006/main">
               <a:graphicData uri="http://schemas.openxmlformats.org/drawingml/2006/picture">
                 <pic:pic xmlns:pic="http://schemas.openxmlformats.org/drawingml/2006/picture">
                   <pic:nvPicPr>
-                    <pic:cNvPr id="1324627772" name=""/>
+                    <pic:cNvPr id="1781980810" name=""/>
                     <pic:cNvPicPr/>
                   </pic:nvPicPr>
                   <pic:blipFill>
@@ -545,16 +545,16 @@
           <w:sz w:val="24"/>
         </w:rPr>
         <w:drawing>
-          <wp:inline distT="0" distB="0" distL="0" distR="0" wp14:anchorId="2A182EA7" wp14:editId="66541CE4">
+          <wp:inline distT="0" distB="0" distL="0" distR="0">
             <wp:extent cx="2160000" cy="1440000"/>
             <wp:effectExtent l="0" t="0" r="0" b="8255"/>
-            <wp:docPr id="1218551113" name="Picture 4"/>
+            <wp:docPr id="1630835673" name="Picture 4"/>
             <wp:cNvGraphicFramePr/>
             <a:graphic xmlns:a="http://schemas.openxmlformats.org/drawingml/2006/main">
               <a:graphicData uri="http://schemas.openxmlformats.org/drawingml/2006/picture">
                 <pic:pic xmlns:pic="http://schemas.openxmlformats.org/drawingml/2006/picture">
                   <pic:nvPicPr>
-                    <pic:cNvPr id="1218551113" name=""/>
+                    <pic:cNvPr id="1630835673" name=""/>
                     <pic:cNvPicPr/>
                   </pic:nvPicPr>
                   <pic:blipFill>
@@ -714,16 +714,16 @@
           <w:sz w:val="24"/>
         </w:rPr>
         <w:drawing>
-          <wp:inline distT="0" distB="0" distL="0" distR="0" wp14:anchorId="4D77B96E" wp14:editId="2938382F">
+          <wp:inline distT="0" distB="0" distL="0" distR="0">
             <wp:extent cx="2160000" cy="1440000"/>
             <wp:effectExtent l="0" t="0" r="0" b="8255"/>
-            <wp:docPr id="725127105" name="Picture 5"/>
+            <wp:docPr id="1694622807" name="Picture 5"/>
             <wp:cNvGraphicFramePr/>
             <a:graphic xmlns:a="http://schemas.openxmlformats.org/drawingml/2006/main">
               <a:graphicData uri="http://schemas.openxmlformats.org/drawingml/2006/picture">
                 <pic:pic xmlns:pic="http://schemas.openxmlformats.org/drawingml/2006/picture">
                   <pic:nvPicPr>
-                    <pic:cNvPr id="725127105" name=""/>
+                    <pic:cNvPr id="1694622807" name=""/>
                     <pic:cNvPicPr/>
                   </pic:nvPicPr>
                   <pic:blipFill>
@@ -883,16 +883,16 @@
           <w:sz w:val="24"/>
         </w:rPr>
         <w:drawing>
-          <wp:inline distT="0" distB="0" distL="0" distR="0" wp14:anchorId="23D4C617" wp14:editId="3214A603">
+          <wp:inline distT="0" distB="0" distL="0" distR="0">
             <wp:extent cx="2160000" cy="1440000"/>
             <wp:effectExtent l="0" t="0" r="0" b="8255"/>
-            <wp:docPr id="1252713534" name="Picture 6"/>
+            <wp:docPr id="697198702" name="Picture 6"/>
             <wp:cNvGraphicFramePr/>
             <a:graphic xmlns:a="http://schemas.openxmlformats.org/drawingml/2006/main">
               <a:graphicData uri="http://schemas.openxmlformats.org/drawingml/2006/picture">
                 <pic:pic xmlns:pic="http://schemas.openxmlformats.org/drawingml/2006/picture">
                   <pic:nvPicPr>
-                    <pic:cNvPr id="1252713534" name=""/>
+                    <pic:cNvPr id="697198702" name=""/>
                     <pic:cNvPicPr/>
                   </pic:nvPicPr>
                   <pic:blipFill>
@@ -1053,16 +1053,16 @@
           <w:sz w:val="24"/>
         </w:rPr>
         <w:drawing>
-          <wp:inline distT="0" distB="0" distL="0" distR="0" wp14:anchorId="3600A831" wp14:editId="6DEEAC94">
+          <wp:inline distT="0" distB="0" distL="0" distR="0">
             <wp:extent cx="2160000" cy="1440000"/>
             <wp:effectExtent l="0" t="0" r="0" b="8255"/>
-            <wp:docPr id="2058438607" name="Picture 7"/>
+            <wp:docPr id="1519075983" name="Picture 7"/>
             <wp:cNvGraphicFramePr/>
             <a:graphic xmlns:a="http://schemas.openxmlformats.org/drawingml/2006/main">
               <a:graphicData uri="http://schemas.openxmlformats.org/drawingml/2006/picture">
                 <pic:pic xmlns:pic="http://schemas.openxmlformats.org/drawingml/2006/picture">
                   <pic:nvPicPr>
-                    <pic:cNvPr id="2058438607" name=""/>
+                    <pic:cNvPr id="1519075983" name=""/>
                     <pic:cNvPicPr/>
                   </pic:nvPicPr>
                   <pic:blipFill>
@@ -1222,16 +1222,16 @@
           <w:sz w:val="24"/>
         </w:rPr>
         <w:drawing>
-          <wp:inline distT="0" distB="0" distL="0" distR="0" wp14:anchorId="20A5E6BB" wp14:editId="2ED7C401">
+          <wp:inline distT="0" distB="0" distL="0" distR="0">
             <wp:extent cx="2160000" cy="1440000"/>
             <wp:effectExtent l="0" t="0" r="0" b="8255"/>
-            <wp:docPr id="2126129283" name="Picture 8"/>
+            <wp:docPr id="575713178" name="Picture 8"/>
             <wp:cNvGraphicFramePr/>
             <a:graphic xmlns:a="http://schemas.openxmlformats.org/drawingml/2006/main">
               <a:graphicData uri="http://schemas.openxmlformats.org/drawingml/2006/picture">
                 <pic:pic xmlns:pic="http://schemas.openxmlformats.org/drawingml/2006/picture">
                   <pic:nvPicPr>
-                    <pic:cNvPr id="2126129283" name=""/>
+                    <pic:cNvPr id="575713178" name=""/>
                     <pic:cNvPicPr/>
                   </pic:nvPicPr>
                   <pic:blipFill>
@@ -1391,16 +1391,16 @@
           <w:sz w:val="24"/>
         </w:rPr>
         <w:drawing>
-          <wp:inline distT="0" distB="0" distL="0" distR="0" wp14:anchorId="0A07355D" wp14:editId="043601D8">
+          <wp:inline distT="0" distB="0" distL="0" distR="0">
             <wp:extent cx="2160000" cy="1440000"/>
             <wp:effectExtent l="0" t="0" r="0" b="8255"/>
-            <wp:docPr id="1769987345" name="Picture 9"/>
+            <wp:docPr id="1250127538" name="Picture 9"/>
             <wp:cNvGraphicFramePr/>
             <a:graphic xmlns:a="http://schemas.openxmlformats.org/drawingml/2006/main">
               <a:graphicData uri="http://schemas.openxmlformats.org/drawingml/2006/picture">
                 <pic:pic xmlns:pic="http://schemas.openxmlformats.org/drawingml/2006/picture">
                   <pic:nvPicPr>
-                    <pic:cNvPr id="1769987345" name=""/>
+                    <pic:cNvPr id="1250127538" name=""/>
                     <pic:cNvPicPr/>
                   </pic:nvPicPr>
                   <pic:blipFill>
@@ -1561,16 +1561,16 @@
           <w:sz w:val="24"/>
         </w:rPr>
         <w:drawing>
-          <wp:inline distT="0" distB="0" distL="0" distR="0" wp14:anchorId="7F56B98F" wp14:editId="6E996863">
+          <wp:inline distT="0" distB="0" distL="0" distR="0">
             <wp:extent cx="2160000" cy="1440000"/>
             <wp:effectExtent l="0" t="0" r="0" b="8255"/>
-            <wp:docPr id="261241243" name="Picture 10"/>
+            <wp:docPr id="1473580118" name="Picture 10"/>
             <wp:cNvGraphicFramePr/>
             <a:graphic xmlns:a="http://schemas.openxmlformats.org/drawingml/2006/main">
               <a:graphicData uri="http://schemas.openxmlformats.org/drawingml/2006/picture">
                 <pic:pic xmlns:pic="http://schemas.openxmlformats.org/drawingml/2006/picture">
                   <pic:nvPicPr>
-                    <pic:cNvPr id="261241243" name=""/>
+                    <pic:cNvPr id="1473580118" name=""/>
                     <pic:cNvPicPr/>
                   </pic:nvPicPr>
                   <pic:blipFill>
@@ -1730,16 +1730,16 @@
           <w:sz w:val="24"/>
         </w:rPr>
         <w:drawing>
-          <wp:inline distT="0" distB="0" distL="0" distR="0" wp14:anchorId="588DF459" wp14:editId="60E617B1">
+          <wp:inline distT="0" distB="0" distL="0" distR="0">
             <wp:extent cx="2160000" cy="1440000"/>
             <wp:effectExtent l="0" t="0" r="0" b="8255"/>
-            <wp:docPr id="284735513" name="Picture 11"/>
+            <wp:docPr id="276661342" name="Picture 11"/>
             <wp:cNvGraphicFramePr/>
             <a:graphic xmlns:a="http://schemas.openxmlformats.org/drawingml/2006/main">
               <a:graphicData uri="http://schemas.openxmlformats.org/drawingml/2006/picture">
                 <pic:pic xmlns:pic="http://schemas.openxmlformats.org/drawingml/2006/picture">
                   <pic:nvPicPr>
-                    <pic:cNvPr id="284735513" name=""/>
+                    <pic:cNvPr id="276661342" name=""/>
                     <pic:cNvPicPr/>
                   </pic:nvPicPr>
                   <pic:blipFill>
@@ -1899,16 +1899,16 @@
           <w:sz w:val="24"/>
         </w:rPr>
         <w:drawing>
-          <wp:inline distT="0" distB="0" distL="0" distR="0" wp14:anchorId="1ECE40E0" wp14:editId="55B1F39B">
+          <wp:inline distT="0" distB="0" distL="0" distR="0">
             <wp:extent cx="2160000" cy="1440000"/>
             <wp:effectExtent l="0" t="0" r="0" b="8255"/>
-            <wp:docPr id="2099219557" name="Picture 12"/>
+            <wp:docPr id="910066386" name="Picture 12"/>
             <wp:cNvGraphicFramePr/>
             <a:graphic xmlns:a="http://schemas.openxmlformats.org/drawingml/2006/main">
               <a:graphicData uri="http://schemas.openxmlformats.org/drawingml/2006/picture">
                 <pic:pic xmlns:pic="http://schemas.openxmlformats.org/drawingml/2006/picture">
                   <pic:nvPicPr>
-                    <pic:cNvPr id="2099219557" name=""/>
+                    <pic:cNvPr id="910066386" name=""/>
                     <pic:cNvPicPr/>
                   </pic:nvPicPr>
                   <pic:blipFill>
@@ -2069,16 +2069,16 @@
           <w:sz w:val="24"/>
         </w:rPr>
         <w:drawing>
-          <wp:inline distT="0" distB="0" distL="0" distR="0" wp14:anchorId="7DADE682" wp14:editId="4ED26FE8">
+          <wp:inline distT="0" distB="0" distL="0" distR="0">
             <wp:extent cx="2160000" cy="1440000"/>
             <wp:effectExtent l="0" t="0" r="0" b="8255"/>
-            <wp:docPr id="195141814" name="Picture 13"/>
+            <wp:docPr id="1303038601" name="Picture 13"/>
             <wp:cNvGraphicFramePr/>
             <a:graphic xmlns:a="http://schemas.openxmlformats.org/drawingml/2006/main">
               <a:graphicData uri="http://schemas.openxmlformats.org/drawingml/2006/picture">
                 <pic:pic xmlns:pic="http://schemas.openxmlformats.org/drawingml/2006/picture">
                   <pic:nvPicPr>
-                    <pic:cNvPr id="195141814" name=""/>
+                    <pic:cNvPr id="1303038601" name=""/>
                     <pic:cNvPicPr/>
                   </pic:nvPicPr>
                   <pic:blipFill>
@@ -2238,16 +2238,16 @@
           <w:sz w:val="24"/>
         </w:rPr>
         <w:drawing>
-          <wp:inline distT="0" distB="0" distL="0" distR="0" wp14:anchorId="6D94490F" wp14:editId="47C948B6">
+          <wp:inline distT="0" distB="0" distL="0" distR="0">
             <wp:extent cx="2160000" cy="1440000"/>
             <wp:effectExtent l="0" t="0" r="0" b="8255"/>
-            <wp:docPr id="1577957878" name="Picture 14"/>
+            <wp:docPr id="1009503421" name="Picture 14"/>
             <wp:cNvGraphicFramePr/>
             <a:graphic xmlns:a="http://schemas.openxmlformats.org/drawingml/2006/main">
               <a:graphicData uri="http://schemas.openxmlformats.org/drawingml/2006/picture">
                 <pic:pic xmlns:pic="http://schemas.openxmlformats.org/drawingml/2006/picture">
                   <pic:nvPicPr>
-                    <pic:cNvPr id="1577957878" name=""/>
+                    <pic:cNvPr id="1009503421" name=""/>
                     <pic:cNvPicPr/>
                   </pic:nvPicPr>
                   <pic:blipFill>
@@ -2407,16 +2407,16 @@
           <w:sz w:val="24"/>
         </w:rPr>
         <w:drawing>
-          <wp:inline distT="0" distB="0" distL="0" distR="0" wp14:anchorId="40346614" wp14:editId="2E015C53">
+          <wp:inline distT="0" distB="0" distL="0" distR="0">
             <wp:extent cx="2160000" cy="1440000"/>
             <wp:effectExtent l="0" t="0" r="0" b="8255"/>
-            <wp:docPr id="2142285790" name="Picture 15"/>
+            <wp:docPr id="1660815039" name="Picture 15"/>
             <wp:cNvGraphicFramePr/>
             <a:graphic xmlns:a="http://schemas.openxmlformats.org/drawingml/2006/main">
               <a:graphicData uri="http://schemas.openxmlformats.org/drawingml/2006/picture">
                 <pic:pic xmlns:pic="http://schemas.openxmlformats.org/drawingml/2006/picture">
                   <pic:nvPicPr>
-                    <pic:cNvPr id="2142285790" name=""/>
+                    <pic:cNvPr id="1660815039" name=""/>
                     <pic:cNvPicPr/>
                   </pic:nvPicPr>
                   <pic:blipFill>
@@ -2577,16 +2577,16 @@
           <w:sz w:val="24"/>
         </w:rPr>
         <w:drawing>
-          <wp:inline distT="0" distB="0" distL="0" distR="0" wp14:anchorId="482BA6E1" wp14:editId="6DD71331">
+          <wp:inline distT="0" distB="0" distL="0" distR="0">
             <wp:extent cx="2160000" cy="1440000"/>
             <wp:effectExtent l="0" t="0" r="0" b="8255"/>
-            <wp:docPr id="387251143" name="Picture 16"/>
+            <wp:docPr id="379499875" name="Picture 16"/>
             <wp:cNvGraphicFramePr/>
             <a:graphic xmlns:a="http://schemas.openxmlformats.org/drawingml/2006/main">
               <a:graphicData uri="http://schemas.openxmlformats.org/drawingml/2006/picture">
                 <pic:pic xmlns:pic="http://schemas.openxmlformats.org/drawingml/2006/picture">
                   <pic:nvPicPr>
-                    <pic:cNvPr id="387251143" name=""/>
+                    <pic:cNvPr id="379499875" name=""/>
                     <pic:cNvPicPr/>
                   </pic:nvPicPr>
                   <pic:blipFill>
@@ -2746,16 +2746,16 @@
           <w:sz w:val="24"/>
         </w:rPr>
         <w:drawing>
-          <wp:inline distT="0" distB="0" distL="0" distR="0" wp14:anchorId="07983143" wp14:editId="00FCAEBF">
+          <wp:inline distT="0" distB="0" distL="0" distR="0">
             <wp:extent cx="2160000" cy="1440000"/>
             <wp:effectExtent l="0" t="0" r="0" b="8255"/>
-            <wp:docPr id="668789964" name="Picture 17"/>
+            <wp:docPr id="2034695431" name="Picture 17"/>
             <wp:cNvGraphicFramePr/>
             <a:graphic xmlns:a="http://schemas.openxmlformats.org/drawingml/2006/main">
               <a:graphicData uri="http://schemas.openxmlformats.org/drawingml/2006/picture">
                 <pic:pic xmlns:pic="http://schemas.openxmlformats.org/drawingml/2006/picture">
                   <pic:nvPicPr>
-                    <pic:cNvPr id="668789964" name=""/>
+                    <pic:cNvPr id="2034695431" name=""/>
                     <pic:cNvPicPr/>
                   </pic:nvPicPr>
                   <pic:blipFill>
@@ -3491,7 +3491,7 @@
     <w:link w:val="Heading1Char"/>
     <w:uiPriority w:val="9"/>
     <w:qFormat/>
-    <w:rsid w:val="00A0066C"/>
+    <w:rsid w:val="00BC418E"/>
     <w:pPr>
       <w:keepNext/>
       <w:keepLines/>
@@ -3514,7 +3514,7 @@
     <w:semiHidden/>
     <w:unhideWhenUsed/>
     <w:qFormat/>
-    <w:rsid w:val="00A0066C"/>
+    <w:rsid w:val="00BC418E"/>
     <w:pPr>
       <w:keepNext/>
       <w:keepLines/>
@@ -3537,7 +3537,7 @@
     <w:semiHidden/>
     <w:unhideWhenUsed/>
     <w:qFormat/>
-    <w:rsid w:val="00A0066C"/>
+    <w:rsid w:val="00BC418E"/>
     <w:pPr>
       <w:keepNext/>
       <w:keepLines/>
@@ -3560,7 +3560,7 @@
     <w:semiHidden/>
     <w:unhideWhenUsed/>
     <w:qFormat/>
-    <w:rsid w:val="00A0066C"/>
+    <w:rsid w:val="00BC418E"/>
     <w:pPr>
       <w:keepNext/>
       <w:keepLines/>
@@ -3583,7 +3583,7 @@
     <w:semiHidden/>
     <w:unhideWhenUsed/>
     <w:qFormat/>
-    <w:rsid w:val="00A0066C"/>
+    <w:rsid w:val="00BC418E"/>
     <w:pPr>
       <w:keepNext/>
       <w:keepLines/>
@@ -3604,7 +3604,7 @@
     <w:semiHidden/>
     <w:unhideWhenUsed/>
     <w:qFormat/>
-    <w:rsid w:val="00A0066C"/>
+    <w:rsid w:val="00BC418E"/>
     <w:pPr>
       <w:keepNext/>
       <w:keepLines/>
@@ -3627,7 +3627,7 @@
     <w:semiHidden/>
     <w:unhideWhenUsed/>
     <w:qFormat/>
-    <w:rsid w:val="00A0066C"/>
+    <w:rsid w:val="00BC418E"/>
     <w:pPr>
       <w:keepNext/>
       <w:keepLines/>
@@ -3648,7 +3648,7 @@
     <w:semiHidden/>
     <w:unhideWhenUsed/>
     <w:qFormat/>
-    <w:rsid w:val="00A0066C"/>
+    <w:rsid w:val="00BC418E"/>
     <w:pPr>
       <w:keepNext/>
       <w:keepLines/>
@@ -3671,7 +3671,7 @@
     <w:semiHidden/>
     <w:unhideWhenUsed/>
     <w:qFormat/>
-    <w:rsid w:val="00A0066C"/>
+    <w:rsid w:val="00BC418E"/>
     <w:pPr>
       <w:keepNext/>
       <w:keepLines/>
@@ -3715,7 +3715,7 @@
     <w:basedOn w:val="DefaultParagraphFont"/>
     <w:link w:val="Heading1"/>
     <w:uiPriority w:val="9"/>
-    <w:rsid w:val="00A0066C"/>
+    <w:rsid w:val="00BC418E"/>
     <w:rPr>
       <w:rFonts w:asciiTheme="majorHAnsi" w:eastAsiaTheme="majorEastAsia" w:hAnsiTheme="majorHAnsi" w:cstheme="majorBidi"/>
       <w:color w:val="0F4761" w:themeColor="accent1" w:themeShade="BF"/>
@@ -3729,7 +3729,7 @@
     <w:link w:val="Heading2"/>
     <w:uiPriority w:val="9"/>
     <w:semiHidden/>
-    <w:rsid w:val="00A0066C"/>
+    <w:rsid w:val="00BC418E"/>
     <w:rPr>
       <w:rFonts w:asciiTheme="majorHAnsi" w:eastAsiaTheme="majorEastAsia" w:hAnsiTheme="majorHAnsi" w:cstheme="majorBidi"/>
       <w:color w:val="0F4761" w:themeColor="accent1" w:themeShade="BF"/>
@@ -3743,7 +3743,7 @@
     <w:link w:val="Heading3"/>
     <w:uiPriority w:val="9"/>
     <w:semiHidden/>
-    <w:rsid w:val="00A0066C"/>
+    <w:rsid w:val="00BC418E"/>
     <w:rPr>
       <w:rFonts w:asciiTheme="minorHAnsi" w:eastAsiaTheme="majorEastAsia" w:hAnsiTheme="minorHAnsi" w:cstheme="majorBidi"/>
       <w:color w:val="0F4761" w:themeColor="accent1" w:themeShade="BF"/>
@@ -3757,7 +3757,7 @@
     <w:link w:val="Heading4"/>
     <w:uiPriority w:val="9"/>
     <w:semiHidden/>
-    <w:rsid w:val="00A0066C"/>
+    <w:rsid w:val="00BC418E"/>
     <w:rPr>
       <w:rFonts w:asciiTheme="minorHAnsi" w:eastAsiaTheme="majorEastAsia" w:hAnsiTheme="minorHAnsi" w:cstheme="majorBidi"/>
       <w:i/>
@@ -3771,7 +3771,7 @@
     <w:link w:val="Heading5"/>
     <w:uiPriority w:val="9"/>
     <w:semiHidden/>
-    <w:rsid w:val="00A0066C"/>
+    <w:rsid w:val="00BC418E"/>
     <w:rPr>
       <w:rFonts w:asciiTheme="minorHAnsi" w:eastAsiaTheme="majorEastAsia" w:hAnsiTheme="minorHAnsi" w:cstheme="majorBidi"/>
       <w:color w:val="0F4761" w:themeColor="accent1" w:themeShade="BF"/>
@@ -3783,7 +3783,7 @@
     <w:link w:val="Heading6"/>
     <w:uiPriority w:val="9"/>
     <w:semiHidden/>
-    <w:rsid w:val="00A0066C"/>
+    <w:rsid w:val="00BC418E"/>
     <w:rPr>
       <w:rFonts w:asciiTheme="minorHAnsi" w:eastAsiaTheme="majorEastAsia" w:hAnsiTheme="minorHAnsi" w:cstheme="majorBidi"/>
       <w:i/>
@@ -3797,7 +3797,7 @@
     <w:link w:val="Heading7"/>
     <w:uiPriority w:val="9"/>
     <w:semiHidden/>
-    <w:rsid w:val="00A0066C"/>
+    <w:rsid w:val="00BC418E"/>
     <w:rPr>
       <w:rFonts w:asciiTheme="minorHAnsi" w:eastAsiaTheme="majorEastAsia" w:hAnsiTheme="minorHAnsi" w:cstheme="majorBidi"/>
       <w:color w:val="595959" w:themeColor="text1" w:themeTint="A6"/>
@@ -3809,7 +3809,7 @@
     <w:link w:val="Heading8"/>
     <w:uiPriority w:val="9"/>
     <w:semiHidden/>
-    <w:rsid w:val="00A0066C"/>
+    <w:rsid w:val="00BC418E"/>
     <w:rPr>
       <w:rFonts w:asciiTheme="minorHAnsi" w:eastAsiaTheme="majorEastAsia" w:hAnsiTheme="minorHAnsi" w:cstheme="majorBidi"/>
       <w:i/>
@@ -3823,7 +3823,7 @@
     <w:link w:val="Heading9"/>
     <w:uiPriority w:val="9"/>
     <w:semiHidden/>
-    <w:rsid w:val="00A0066C"/>
+    <w:rsid w:val="00BC418E"/>
     <w:rPr>
       <w:rFonts w:asciiTheme="minorHAnsi" w:eastAsiaTheme="majorEastAsia" w:hAnsiTheme="minorHAnsi" w:cstheme="majorBidi"/>
       <w:color w:val="272727" w:themeColor="text1" w:themeTint="D8"/>
@@ -3836,7 +3836,7 @@
     <w:link w:val="TitleChar"/>
     <w:uiPriority w:val="10"/>
     <w:qFormat/>
-    <w:rsid w:val="00A0066C"/>
+    <w:rsid w:val="00BC418E"/>
     <w:pPr>
       <w:spacing w:after="80" w:line="240" w:lineRule="auto"/>
       <w:contextualSpacing/>
@@ -3854,7 +3854,7 @@
     <w:basedOn w:val="DefaultParagraphFont"/>
     <w:link w:val="Title"/>
     <w:uiPriority w:val="10"/>
-    <w:rsid w:val="00A0066C"/>
+    <w:rsid w:val="00BC418E"/>
     <w:rPr>
       <w:rFonts w:asciiTheme="majorHAnsi" w:eastAsiaTheme="majorEastAsia" w:hAnsiTheme="majorHAnsi" w:cstheme="majorBidi"/>
       <w:spacing w:val="-10"/>
@@ -3870,7 +3870,7 @@
     <w:link w:val="SubtitleChar"/>
     <w:uiPriority w:val="11"/>
     <w:qFormat/>
-    <w:rsid w:val="00A0066C"/>
+    <w:rsid w:val="00BC418E"/>
     <w:pPr>
       <w:numPr>
         <w:ilvl w:val="1"/>
@@ -3889,7 +3889,7 @@
     <w:basedOn w:val="DefaultParagraphFont"/>
     <w:link w:val="Subtitle"/>
     <w:uiPriority w:val="11"/>
-    <w:rsid w:val="00A0066C"/>
+    <w:rsid w:val="00BC418E"/>
     <w:rPr>
       <w:rFonts w:asciiTheme="minorHAnsi" w:eastAsiaTheme="majorEastAsia" w:hAnsiTheme="minorHAnsi" w:cstheme="majorBidi"/>
       <w:color w:val="595959" w:themeColor="text1" w:themeTint="A6"/>
@@ -3905,7 +3905,7 @@
     <w:link w:val="QuoteChar"/>
     <w:uiPriority w:val="29"/>
     <w:qFormat/>
-    <w:rsid w:val="00A0066C"/>
+    <w:rsid w:val="00BC418E"/>
     <w:pPr>
       <w:spacing w:before="160"/>
       <w:jc w:val="center"/>
@@ -3921,7 +3921,7 @@
     <w:basedOn w:val="DefaultParagraphFont"/>
     <w:link w:val="Quote"/>
     <w:uiPriority w:val="29"/>
-    <w:rsid w:val="00A0066C"/>
+    <w:rsid w:val="00BC418E"/>
     <w:rPr>
       <w:i/>
       <w:iCs/>
@@ -3933,7 +3933,7 @@
     <w:basedOn w:val="Normal"/>
     <w:uiPriority w:val="34"/>
     <w:qFormat/>
-    <w:rsid w:val="00A0066C"/>
+    <w:rsid w:val="00BC418E"/>
     <w:pPr>
       <w:ind w:left="720"/>
       <w:contextualSpacing/>
@@ -3944,7 +3944,7 @@
     <w:basedOn w:val="DefaultParagraphFont"/>
     <w:uiPriority w:val="21"/>
     <w:qFormat/>
-    <w:rsid w:val="00A0066C"/>
+    <w:rsid w:val="00BC418E"/>
     <w:rPr>
       <w:i/>
       <w:iCs/>
@@ -3958,7 +3958,7 @@
     <w:link w:val="IntenseQuoteChar"/>
     <w:uiPriority w:val="30"/>
     <w:qFormat/>
-    <w:rsid w:val="00A0066C"/>
+    <w:rsid w:val="00BC418E"/>
     <w:pPr>
       <w:pBdr>
         <w:top w:val="single" w:sz="4" w:space="10" w:color="0F4761" w:themeColor="accent1" w:themeShade="BF"/>
@@ -3979,7 +3979,7 @@
     <w:basedOn w:val="DefaultParagraphFont"/>
     <w:link w:val="IntenseQuote"/>
     <w:uiPriority w:val="30"/>
-    <w:rsid w:val="00A0066C"/>
+    <w:rsid w:val="00BC418E"/>
     <w:rPr>
       <w:i/>
       <w:iCs/>
@@ -3991,7 +3991,7 @@
     <w:basedOn w:val="DefaultParagraphFont"/>
     <w:uiPriority w:val="32"/>
     <w:qFormat/>
-    <w:rsid w:val="00A0066C"/>
+    <w:rsid w:val="00BC418E"/>
     <w:rPr>
       <w:b/>
       <w:bCs/>
@@ -4006,7 +4006,7 @@
     <w:link w:val="HeaderChar"/>
     <w:uiPriority w:val="99"/>
     <w:unhideWhenUsed/>
-    <w:rsid w:val="00A0066C"/>
+    <w:rsid w:val="00BC418E"/>
     <w:pPr>
       <w:tabs>
         <w:tab w:val="center" w:pos="4680"/>
@@ -4020,7 +4020,7 @@
     <w:basedOn w:val="DefaultParagraphFont"/>
     <w:link w:val="Header"/>
     <w:uiPriority w:val="99"/>
-    <w:rsid w:val="00A0066C"/>
+    <w:rsid w:val="00BC418E"/>
   </w:style>
   <w:style w:type="paragraph" w:styleId="Footer">
     <w:name w:val="footer"/>
@@ -4028,7 +4028,7 @@
     <w:link w:val="FooterChar"/>
     <w:uiPriority w:val="99"/>
     <w:unhideWhenUsed/>
-    <w:rsid w:val="00A0066C"/>
+    <w:rsid w:val="00BC418E"/>
     <w:pPr>
       <w:tabs>
         <w:tab w:val="center" w:pos="4680"/>
@@ -4042,7 +4042,7 @@
     <w:basedOn w:val="DefaultParagraphFont"/>
     <w:link w:val="Footer"/>
     <w:uiPriority w:val="99"/>
-    <w:rsid w:val="00A0066C"/>
+    <w:rsid w:val="00BC418E"/>
   </w:style>
 </w:styles>
 </file>

</xml_diff>

<commit_message>
fix: resolve options clumping with bold tags (a,b,A,B) and align TAB2 blank line length with P1 blanks
</commit_message>
<xml_diff>
--- a/output/uln_document.docx
+++ b/output/uln_document.docx
@@ -2,534 +2,6 @@
 <file path=word/document.xml><?xml version="1.0" encoding="utf-8"?>
 <w:document xmlns:wpc="http://schemas.microsoft.com/office/word/2010/wordprocessingCanvas" xmlns:cx="http://schemas.microsoft.com/office/drawing/2014/chartex" xmlns:cx1="http://schemas.microsoft.com/office/drawing/2015/9/8/chartex" xmlns:cx2="http://schemas.microsoft.com/office/drawing/2015/10/21/chartex" xmlns:cx3="http://schemas.microsoft.com/office/drawing/2016/5/9/chartex" xmlns:cx4="http://schemas.microsoft.com/office/drawing/2016/5/10/chartex" xmlns:cx5="http://schemas.microsoft.com/office/drawing/2016/5/11/chartex" xmlns:cx6="http://schemas.microsoft.com/office/drawing/2016/5/12/chartex" xmlns:cx7="http://schemas.microsoft.com/office/drawing/2016/5/13/chartex" xmlns:cx8="http://schemas.microsoft.com/office/drawing/2016/5/14/chartex" xmlns:mc="http://schemas.openxmlformats.org/markup-compatibility/2006" xmlns:aink="http://schemas.microsoft.com/office/drawing/2016/ink" xmlns:am3d="http://schemas.microsoft.com/office/drawing/2017/model3d" xmlns:o="urn:schemas-microsoft-com:office:office" xmlns:oel="http://schemas.microsoft.com/office/2019/extlst" xmlns:r="http://schemas.openxmlformats.org/officeDocument/2006/relationships" xmlns:m="http://schemas.openxmlformats.org/officeDocument/2006/math" xmlns:v="urn:schemas-microsoft-com:vml" xmlns:wp14="http://schemas.microsoft.com/office/word/2010/wordprocessingDrawing" xmlns:wp="http://schemas.openxmlformats.org/drawingml/2006/wordprocessingDrawing" xmlns:w10="urn:schemas-microsoft-com:office:word" xmlns:w="http://schemas.openxmlformats.org/wordprocessingml/2006/main" xmlns:w14="http://schemas.microsoft.com/office/word/2010/wordml" xmlns:w15="http://schemas.microsoft.com/office/word/2012/wordml" xmlns:w16cei="http://schemas.microsoft.com/office/word/2026/wordml/cei" xmlns:w16cex="http://schemas.microsoft.com/office/word/2018/wordml/cex" xmlns:w16cid="http://schemas.microsoft.com/office/word/2016/wordml/cid" xmlns:w16="http://schemas.microsoft.com/office/word/2018/wordml" xmlns:w16du="http://schemas.microsoft.com/office/word/2023/wordml/word16du" xmlns:w16sdtdh="http://schemas.microsoft.com/office/word/2020/wordml/sdtdatahash" xmlns:w16sdtfl="http://schemas.microsoft.com/office/word/2024/wordml/sdtformatlock" xmlns:w16se="http://schemas.microsoft.com/office/word/2015/wordml/symex" xmlns:wpg="http://schemas.microsoft.com/office/word/2010/wordprocessingGroup" xmlns:wpi="http://schemas.microsoft.com/office/word/2010/wordprocessingInk" xmlns:wne="http://schemas.microsoft.com/office/word/2006/wordml" xmlns:wps="http://schemas.microsoft.com/office/word/2010/wordprocessingShape" mc:Ignorable="w14 w15 w16se w16cid w16 w16cex w16sdtdh w16sdtfl w16du wp14">
   <w:body>
-    <w:p>
-      <w:pPr>
-        <w:spacing w:before="120" w:after="80"/>
-        <w:rPr>
-          <w:b/>
-          <w:sz w:val="24"/>
-        </w:rPr>
-      </w:pPr>
-      <w:r>
-        <w:rPr>
-          <w:b/>
-          <w:sz w:val="24"/>
-        </w:rPr>
-        <w:t>I.  Arrange the words to make sentences.</w:t>
-      </w:r>
-    </w:p>
-    <w:p>
-      <w:pPr>
-        <w:spacing w:before="120" w:after="80"/>
-        <w:rPr>
-          <w:sz w:val="24"/>
-        </w:rPr>
-      </w:pPr>
-      <w:r>
-        <w:rPr>
-          <w:sz w:val="24"/>
-        </w:rPr>
-        <w:t>1. hobby/ you/ have/ any/ do/?</w:t>
-      </w:r>
-    </w:p>
-    <w:p>
-      <w:pPr>
-        <w:tabs>
-          <w:tab w:val="right" w:pos="9354"/>
-        </w:tabs>
-        <w:spacing w:before="80" w:after="60"/>
-        <w:ind w:left="283"/>
-        <w:rPr>
-          <w:sz w:val="24"/>
-        </w:rPr>
-      </w:pPr>
-      <w:r>
-        <w:rPr>
-          <w:sz w:val="24"/>
-        </w:rPr>
-        <w:t>_____________________________________________</w:t>
-      </w:r>
-    </w:p>
-    <w:p>
-      <w:pPr>
-        <w:spacing w:before="120" w:after="80"/>
-        <w:rPr>
-          <w:sz w:val="24"/>
-        </w:rPr>
-      </w:pPr>
-      <w:r>
-        <w:rPr>
-          <w:sz w:val="24"/>
-        </w:rPr>
-        <w:t>2. his/ do/ what/ your/ brother/ does/ in/ free time/?</w:t>
-      </w:r>
-    </w:p>
-    <w:p>
-      <w:pPr>
-        <w:tabs>
-          <w:tab w:val="right" w:pos="9354"/>
-        </w:tabs>
-        <w:spacing w:before="80" w:after="60"/>
-        <w:ind w:left="283"/>
-        <w:rPr>
-          <w:sz w:val="24"/>
-        </w:rPr>
-      </w:pPr>
-      <w:r>
-        <w:rPr>
-          <w:sz w:val="24"/>
-        </w:rPr>
-        <w:t>_____________________________________________</w:t>
-      </w:r>
-    </w:p>
-    <w:p>
-      <w:pPr>
-        <w:spacing w:before="120" w:after="80"/>
-        <w:rPr>
-          <w:sz w:val="24"/>
-        </w:rPr>
-      </w:pPr>
-      <w:r>
-        <w:rPr>
-          <w:sz w:val="24"/>
-        </w:rPr>
-        <w:t>3. he/ the summer/ in/ climbing/ goes/ mountain/ usually/.</w:t>
-      </w:r>
-    </w:p>
-    <w:p>
-      <w:pPr>
-        <w:tabs>
-          <w:tab w:val="right" w:pos="9354"/>
-        </w:tabs>
-        <w:spacing w:before="80" w:after="60"/>
-        <w:ind w:left="283"/>
-        <w:rPr>
-          <w:sz w:val="24"/>
-        </w:rPr>
-      </w:pPr>
-      <w:r>
-        <w:rPr>
-          <w:sz w:val="24"/>
-        </w:rPr>
-        <w:t>_____________________________________________</w:t>
-      </w:r>
-    </w:p>
-    <w:p>
-      <w:pPr>
-        <w:spacing w:before="120" w:after="80"/>
-        <w:rPr>
-          <w:sz w:val="24"/>
-        </w:rPr>
-      </w:pPr>
-      <w:r>
-        <w:rPr>
-          <w:sz w:val="24"/>
-        </w:rPr>
-        <w:t>4. friends/ monopoly/ enjoy/ I/ with/ playing/ my/.</w:t>
-      </w:r>
-    </w:p>
-    <w:p>
-      <w:pPr>
-        <w:tabs>
-          <w:tab w:val="right" w:pos="9354"/>
-        </w:tabs>
-        <w:spacing w:before="80" w:after="60"/>
-        <w:ind w:left="283"/>
-        <w:rPr>
-          <w:sz w:val="24"/>
-        </w:rPr>
-      </w:pPr>
-      <w:r>
-        <w:rPr>
-          <w:sz w:val="24"/>
-        </w:rPr>
-        <w:t>_____________________________________________</w:t>
-      </w:r>
-    </w:p>
-    <w:p>
-      <w:pPr>
-        <w:spacing w:before="120" w:after="80"/>
-        <w:rPr>
-          <w:sz w:val="24"/>
-        </w:rPr>
-      </w:pPr>
-      <w:r>
-        <w:rPr>
-          <w:sz w:val="24"/>
-        </w:rPr>
-        <w:t>5. it/ boring/ because/ finds/ time/ models/ Jim/ takes/ lots of/ making/.</w:t>
-      </w:r>
-    </w:p>
-    <w:p>
-      <w:pPr>
-        <w:tabs>
-          <w:tab w:val="right" w:pos="9354"/>
-        </w:tabs>
-        <w:spacing w:before="80" w:after="60"/>
-        <w:ind w:left="283"/>
-        <w:rPr>
-          <w:sz w:val="24"/>
-        </w:rPr>
-      </w:pPr>
-      <w:r>
-        <w:rPr>
-          <w:sz w:val="24"/>
-        </w:rPr>
-        <w:t>_____________________________________________</w:t>
-      </w:r>
-    </w:p>
-    <w:p>
-      <w:pPr>
-        <w:spacing w:before="120" w:after="80"/>
-        <w:rPr>
-          <w:sz w:val="24"/>
-        </w:rPr>
-      </w:pPr>
-      <w:r>
-        <w:rPr>
-          <w:sz w:val="24"/>
-        </w:rPr>
-        <w:t>6. people/ do/ many/ gardening/ as/ a/ take up/ hobby/?</w:t>
-      </w:r>
-    </w:p>
-    <w:p>
-      <w:pPr>
-        <w:tabs>
-          <w:tab w:val="right" w:pos="9354"/>
-        </w:tabs>
-        <w:spacing w:before="80" w:after="60"/>
-        <w:ind w:left="283"/>
-        <w:rPr>
-          <w:sz w:val="24"/>
-        </w:rPr>
-      </w:pPr>
-      <w:r>
-        <w:rPr>
-          <w:sz w:val="24"/>
-        </w:rPr>
-        <w:t>_____________________________________________</w:t>
-      </w:r>
-    </w:p>
-    <w:p>
-      <w:pPr>
-        <w:spacing w:before="120" w:after="80"/>
-        <w:rPr>
-          <w:b/>
-          <w:sz w:val="24"/>
-        </w:rPr>
-      </w:pPr>
-      <w:r>
-        <w:rPr>
-          <w:b/>
-          <w:sz w:val="24"/>
-        </w:rPr>
-        <w:t>II. Complete the second sentence so that it has the same meaning as the first one.</w:t>
-      </w:r>
-    </w:p>
-    <w:p>
-      <w:pPr>
-        <w:spacing w:before="120" w:after="80"/>
-        <w:rPr>
-          <w:sz w:val="24"/>
-        </w:rPr>
-      </w:pPr>
-      <w:r>
-        <w:rPr>
-          <w:sz w:val="24"/>
-        </w:rPr>
-        <w:t>1. What is your hobby?</w:t>
-      </w:r>
-    </w:p>
-    <w:p>
-      <w:pPr>
-        <w:spacing w:before="80" w:after="60"/>
-        <w:ind w:left="283"/>
-        <w:rPr>
-          <w:rFonts w:hint="eastAsia"/>
-          <w:sz w:val="24"/>
-        </w:rPr>
-      </w:pPr>
-      <w:r>
-        <w:rPr>
-          <w:rFonts w:hint="eastAsia"/>
-          <w:sz w:val="24"/>
-        </w:rPr>
-        <w:t>→</w:t>
-      </w:r>
-      <w:r>
-        <w:rPr>
-          <w:rFonts w:hint="eastAsia"/>
-          <w:sz w:val="24"/>
-        </w:rPr>
-        <w:t xml:space="preserve"> What hobby ___________</w:t>
-      </w:r>
-    </w:p>
-    <w:p>
-      <w:pPr>
-        <w:spacing w:before="120" w:after="80"/>
-        <w:rPr>
-          <w:sz w:val="24"/>
-        </w:rPr>
-      </w:pPr>
-      <w:r>
-        <w:rPr>
-          <w:sz w:val="24"/>
-        </w:rPr>
-        <w:t>2. We all find painting interesting because it's a creative activity.</w:t>
-      </w:r>
-    </w:p>
-    <w:p>
-      <w:pPr>
-        <w:spacing w:before="80" w:after="60"/>
-        <w:ind w:left="283"/>
-        <w:rPr>
-          <w:rFonts w:hint="eastAsia"/>
-          <w:sz w:val="24"/>
-        </w:rPr>
-      </w:pPr>
-      <w:r>
-        <w:rPr>
-          <w:rFonts w:hint="eastAsia"/>
-          <w:sz w:val="24"/>
-        </w:rPr>
-        <w:t>→</w:t>
-      </w:r>
-      <w:r>
-        <w:rPr>
-          <w:rFonts w:hint="eastAsia"/>
-          <w:sz w:val="24"/>
-        </w:rPr>
-        <w:t xml:space="preserve"> We all think ___________</w:t>
-      </w:r>
-    </w:p>
-    <w:p>
-      <w:pPr>
-        <w:spacing w:before="120" w:after="80"/>
-        <w:rPr>
-          <w:sz w:val="24"/>
-        </w:rPr>
-      </w:pPr>
-      <w:r>
-        <w:rPr>
-          <w:sz w:val="24"/>
-        </w:rPr>
-        <w:t>3. His hobby is collecting toy cars.</w:t>
-      </w:r>
-    </w:p>
-    <w:p>
-      <w:pPr>
-        <w:spacing w:before="80" w:after="60"/>
-        <w:ind w:left="283"/>
-        <w:rPr>
-          <w:rFonts w:hint="eastAsia"/>
-          <w:sz w:val="24"/>
-        </w:rPr>
-      </w:pPr>
-      <w:r>
-        <w:rPr>
-          <w:rFonts w:hint="eastAsia"/>
-          <w:sz w:val="24"/>
-        </w:rPr>
-        <w:t>→</w:t>
-      </w:r>
-      <w:r>
-        <w:rPr>
-          <w:rFonts w:hint="eastAsia"/>
-          <w:sz w:val="24"/>
-        </w:rPr>
-        <w:t xml:space="preserve"> He collects ___________</w:t>
-      </w:r>
-    </w:p>
-    <w:p>
-      <w:pPr>
-        <w:spacing w:before="120" w:after="80"/>
-        <w:rPr>
-          <w:sz w:val="24"/>
-        </w:rPr>
-      </w:pPr>
-      <w:r>
-        <w:rPr>
-          <w:sz w:val="24"/>
-        </w:rPr>
-        <w:t>4. It isn't necessary to finish the work today.</w:t>
-      </w:r>
-    </w:p>
-    <w:p>
-      <w:pPr>
-        <w:spacing w:before="80" w:after="60"/>
-        <w:ind w:left="283"/>
-        <w:rPr>
-          <w:rFonts w:hint="eastAsia"/>
-          <w:sz w:val="24"/>
-        </w:rPr>
-      </w:pPr>
-      <w:r>
-        <w:rPr>
-          <w:rFonts w:hint="eastAsia"/>
-          <w:sz w:val="24"/>
-        </w:rPr>
-        <w:t>→</w:t>
-      </w:r>
-      <w:r>
-        <w:rPr>
-          <w:rFonts w:hint="eastAsia"/>
-          <w:sz w:val="24"/>
-        </w:rPr>
-        <w:t xml:space="preserve"> You don't ___________</w:t>
-      </w:r>
-    </w:p>
-    <w:p>
-      <w:pPr>
-        <w:spacing w:before="120" w:after="80"/>
-        <w:rPr>
-          <w:sz w:val="24"/>
-        </w:rPr>
-      </w:pPr>
-      <w:r>
-        <w:rPr>
-          <w:sz w:val="24"/>
-        </w:rPr>
-        <w:t>5. When did you start your hobby?</w:t>
-      </w:r>
-    </w:p>
-    <w:p>
-      <w:pPr>
-        <w:spacing w:before="80" w:after="60"/>
-        <w:ind w:left="283"/>
-        <w:rPr>
-          <w:rFonts w:hint="eastAsia"/>
-          <w:sz w:val="24"/>
-        </w:rPr>
-      </w:pPr>
-      <w:r>
-        <w:rPr>
-          <w:rFonts w:hint="eastAsia"/>
-          <w:sz w:val="24"/>
-        </w:rPr>
-        <w:t>→</w:t>
-      </w:r>
-      <w:r>
-        <w:rPr>
-          <w:rFonts w:hint="eastAsia"/>
-          <w:sz w:val="24"/>
-        </w:rPr>
-        <w:t xml:space="preserve"> How long ___________</w:t>
-      </w:r>
-    </w:p>
-    <w:p>
-      <w:pPr>
-        <w:spacing w:before="120" w:after="80"/>
-        <w:rPr>
-          <w:sz w:val="24"/>
-        </w:rPr>
-      </w:pPr>
-      <w:r>
-        <w:rPr>
-          <w:sz w:val="24"/>
-        </w:rPr>
-        <w:t>6. It took me three hours to make this pottery jug.</w:t>
-      </w:r>
-    </w:p>
-    <w:p>
-      <w:pPr>
-        <w:spacing w:before="80" w:after="60"/>
-        <w:ind w:left="283"/>
-        <w:rPr>
-          <w:rFonts w:hint="eastAsia"/>
-          <w:sz w:val="24"/>
-        </w:rPr>
-      </w:pPr>
-      <w:r>
-        <w:rPr>
-          <w:rFonts w:hint="eastAsia"/>
-          <w:sz w:val="24"/>
-        </w:rPr>
-        <w:t>→</w:t>
-      </w:r>
-      <w:r>
-        <w:rPr>
-          <w:rFonts w:hint="eastAsia"/>
-          <w:sz w:val="24"/>
-        </w:rPr>
-        <w:t xml:space="preserve"> I spent ___________</w:t>
-      </w:r>
-    </w:p>
-    <w:p>
-      <w:pPr>
-        <w:spacing w:before="120" w:after="80"/>
-        <w:rPr>
-          <w:sz w:val="24"/>
-        </w:rPr>
-      </w:pPr>
-      <w:r>
-        <w:rPr>
-          <w:sz w:val="24"/>
-        </w:rPr>
-        <w:t>7. My father likes to do gardening at the weekend.</w:t>
-      </w:r>
-    </w:p>
-    <w:p>
-      <w:pPr>
-        <w:spacing w:before="80" w:after="60"/>
-        <w:ind w:left="283"/>
-        <w:rPr>
-          <w:rFonts w:hint="eastAsia"/>
-          <w:sz w:val="24"/>
-        </w:rPr>
-      </w:pPr>
-      <w:r>
-        <w:rPr>
-          <w:rFonts w:hint="eastAsia"/>
-          <w:sz w:val="24"/>
-        </w:rPr>
-        <w:t>→</w:t>
-      </w:r>
-      <w:r>
-        <w:rPr>
-          <w:rFonts w:hint="eastAsia"/>
-          <w:sz w:val="24"/>
-        </w:rPr>
-        <w:t xml:space="preserve"> My father enjoys ___________</w:t>
-      </w:r>
-    </w:p>
-    <w:p>
-      <w:pPr>
-        <w:spacing w:before="120" w:after="80"/>
-        <w:rPr>
-          <w:sz w:val="24"/>
-        </w:rPr>
-      </w:pPr>
-      <w:r>
-        <w:rPr>
-          <w:sz w:val="24"/>
-        </w:rPr>
-        <w:t>8. Why don't we go swimming this afternoon?</w:t>
-      </w:r>
-    </w:p>
-    <w:p>
-      <w:pPr>
-        <w:spacing w:before="80" w:after="60"/>
-        <w:ind w:left="283"/>
-        <w:rPr>
-          <w:rFonts w:hint="eastAsia"/>
-          <w:sz w:val="24"/>
-        </w:rPr>
-      </w:pPr>
-      <w:r>
-        <w:rPr>
-          <w:rFonts w:hint="eastAsia"/>
-          <w:sz w:val="24"/>
-        </w:rPr>
-        <w:t>→</w:t>
-      </w:r>
-      <w:r>
-        <w:rPr>
-          <w:rFonts w:hint="eastAsia"/>
-          <w:sz w:val="24"/>
-        </w:rPr>
-        <w:t xml:space="preserve"> What about ___________</w:t>
-      </w:r>
-    </w:p>
     <w:p>
       <w:pPr>
         <w:spacing w:before="120" w:after="80"/>
@@ -558,7 +30,6 @@
           <w:insideH w:val="single" w:sz="8" w:space="0" w:color="000000"/>
           <w:insideV w:val="single" w:sz="8" w:space="0" w:color="000000"/>
         </w:tblBorders>
-        <w:tblLayout w:type="fixed"/>
         <w:tblCellMar>
           <w:top w:w="85" w:type="dxa"/>
           <w:left w:w="142" w:type="dxa"/>
@@ -568,8 +39,8 @@
         <w:tblLook w:val="0000" w:firstRow="0" w:lastRow="0" w:firstColumn="0" w:lastColumn="0" w:noHBand="0" w:noVBand="0"/>
       </w:tblPr>
       <w:tblGrid>
-        <w:gridCol w:w="4678"/>
-        <w:gridCol w:w="4678"/>
+        <w:gridCol w:w="1998"/>
+        <w:gridCol w:w="7189"/>
       </w:tblGrid>
       <w:tr>
         <w:trPr>
@@ -577,7 +48,7 @@
         </w:trPr>
         <w:tc>
           <w:tcPr>
-            <w:tcW w:w="4678" w:type="dxa"/>
+            <w:tcW w:w="0" w:type="auto"/>
             <w:vAlign w:val="center"/>
           </w:tcPr>
           <w:p>
@@ -594,14 +65,13 @@
                 <w:b/>
                 <w:sz w:val="24"/>
               </w:rPr>
-              <w:lastRenderedPageBreak/>
               <w:t>A</w:t>
             </w:r>
           </w:p>
         </w:tc>
         <w:tc>
           <w:tcPr>
-            <w:tcW w:w="4678" w:type="dxa"/>
+            <w:tcW w:w="0" w:type="auto"/>
             <w:vAlign w:val="center"/>
           </w:tcPr>
           <w:p>
@@ -629,7 +99,7 @@
         </w:trPr>
         <w:tc>
           <w:tcPr>
-            <w:tcW w:w="4678" w:type="dxa"/>
+            <w:tcW w:w="0" w:type="auto"/>
             <w:vAlign w:val="center"/>
           </w:tcPr>
           <w:p>
@@ -649,7 +119,7 @@
         </w:tc>
         <w:tc>
           <w:tcPr>
-            <w:tcW w:w="4678" w:type="dxa"/>
+            <w:tcW w:w="0" w:type="auto"/>
             <w:vAlign w:val="center"/>
           </w:tcPr>
           <w:p>
@@ -681,7 +151,7 @@
         </w:trPr>
         <w:tc>
           <w:tcPr>
-            <w:tcW w:w="4678" w:type="dxa"/>
+            <w:tcW w:w="0" w:type="auto"/>
             <w:vAlign w:val="center"/>
           </w:tcPr>
           <w:p>
@@ -701,7 +171,7 @@
         </w:tc>
         <w:tc>
           <w:tcPr>
-            <w:tcW w:w="4678" w:type="dxa"/>
+            <w:tcW w:w="0" w:type="auto"/>
             <w:vAlign w:val="center"/>
           </w:tcPr>
           <w:p>
@@ -733,7 +203,7 @@
         </w:trPr>
         <w:tc>
           <w:tcPr>
-            <w:tcW w:w="4678" w:type="dxa"/>
+            <w:tcW w:w="0" w:type="auto"/>
             <w:vAlign w:val="center"/>
           </w:tcPr>
           <w:p>
@@ -753,7 +223,7 @@
         </w:tc>
         <w:tc>
           <w:tcPr>
-            <w:tcW w:w="4678" w:type="dxa"/>
+            <w:tcW w:w="0" w:type="auto"/>
             <w:vAlign w:val="center"/>
           </w:tcPr>
           <w:p>
@@ -785,7 +255,7 @@
         </w:trPr>
         <w:tc>
           <w:tcPr>
-            <w:tcW w:w="4678" w:type="dxa"/>
+            <w:tcW w:w="0" w:type="auto"/>
             <w:vAlign w:val="center"/>
           </w:tcPr>
           <w:p>
@@ -805,7 +275,7 @@
         </w:tc>
         <w:tc>
           <w:tcPr>
-            <w:tcW w:w="4678" w:type="dxa"/>
+            <w:tcW w:w="0" w:type="auto"/>
             <w:vAlign w:val="center"/>
           </w:tcPr>
           <w:p>
@@ -837,7 +307,7 @@
         </w:trPr>
         <w:tc>
           <w:tcPr>
-            <w:tcW w:w="4678" w:type="dxa"/>
+            <w:tcW w:w="0" w:type="auto"/>
             <w:vAlign w:val="center"/>
           </w:tcPr>
           <w:p>
@@ -857,7 +327,7 @@
         </w:tc>
         <w:tc>
           <w:tcPr>
-            <w:tcW w:w="4678" w:type="dxa"/>
+            <w:tcW w:w="0" w:type="auto"/>
             <w:vAlign w:val="center"/>
           </w:tcPr>
           <w:p>
@@ -889,7 +359,7 @@
         </w:trPr>
         <w:tc>
           <w:tcPr>
-            <w:tcW w:w="4678" w:type="dxa"/>
+            <w:tcW w:w="0" w:type="auto"/>
             <w:vAlign w:val="center"/>
           </w:tcPr>
           <w:p>
@@ -909,7 +379,7 @@
         </w:tc>
         <w:tc>
           <w:tcPr>
-            <w:tcW w:w="4678" w:type="dxa"/>
+            <w:tcW w:w="0" w:type="auto"/>
             <w:vAlign w:val="center"/>
           </w:tcPr>
           <w:p>
@@ -968,11 +438,6 @@
     </w:p>
     <w:p>
       <w:pPr>
-        <w:tabs>
-          <w:tab w:val="left" w:pos="2551"/>
-          <w:tab w:val="left" w:pos="4819"/>
-          <w:tab w:val="left" w:pos="7087"/>
-        </w:tabs>
         <w:spacing w:before="80" w:after="60"/>
         <w:ind w:left="283"/>
         <w:rPr>
@@ -990,13 +455,7 @@
         <w:rPr>
           <w:sz w:val="24"/>
         </w:rPr>
-        <w:t xml:space="preserve"> of</w:t>
-      </w:r>
-      <w:r>
-        <w:rPr>
-          <w:sz w:val="24"/>
-        </w:rPr>
-        <w:tab/>
+        <w:t xml:space="preserve"> of </w:t>
       </w:r>
       <w:r>
         <w:rPr>
@@ -1009,13 +468,7 @@
         <w:rPr>
           <w:sz w:val="24"/>
         </w:rPr>
-        <w:t xml:space="preserve"> from</w:t>
-      </w:r>
-      <w:r>
-        <w:rPr>
-          <w:sz w:val="24"/>
-        </w:rPr>
-        <w:tab/>
+        <w:t xml:space="preserve"> from </w:t>
       </w:r>
       <w:r>
         <w:rPr>
@@ -1028,13 +481,7 @@
         <w:rPr>
           <w:sz w:val="24"/>
         </w:rPr>
-        <w:t xml:space="preserve"> in</w:t>
-      </w:r>
-      <w:r>
-        <w:rPr>
-          <w:sz w:val="24"/>
-        </w:rPr>
-        <w:tab/>
+        <w:t xml:space="preserve"> in </w:t>
       </w:r>
       <w:r>
         <w:rPr>
@@ -1066,11 +513,6 @@
     </w:p>
     <w:p>
       <w:pPr>
-        <w:tabs>
-          <w:tab w:val="left" w:pos="2551"/>
-          <w:tab w:val="left" w:pos="4819"/>
-          <w:tab w:val="left" w:pos="7087"/>
-        </w:tabs>
         <w:spacing w:before="80" w:after="60"/>
         <w:ind w:left="283"/>
         <w:rPr>
@@ -1088,13 +530,7 @@
         <w:rPr>
           <w:sz w:val="24"/>
         </w:rPr>
-        <w:t xml:space="preserve"> up</w:t>
-      </w:r>
-      <w:r>
-        <w:rPr>
-          <w:sz w:val="24"/>
-        </w:rPr>
-        <w:tab/>
+        <w:t xml:space="preserve"> up </w:t>
       </w:r>
       <w:r>
         <w:rPr>
@@ -1107,13 +543,7 @@
         <w:rPr>
           <w:sz w:val="24"/>
         </w:rPr>
-        <w:t xml:space="preserve"> in</w:t>
-      </w:r>
-      <w:r>
-        <w:rPr>
-          <w:sz w:val="24"/>
-        </w:rPr>
-        <w:tab/>
+        <w:t xml:space="preserve"> in </w:t>
       </w:r>
       <w:r>
         <w:rPr>
@@ -1126,13 +556,7 @@
         <w:rPr>
           <w:sz w:val="24"/>
         </w:rPr>
-        <w:t xml:space="preserve"> over</w:t>
-      </w:r>
-      <w:r>
-        <w:rPr>
-          <w:sz w:val="24"/>
-        </w:rPr>
-        <w:tab/>
+        <w:t xml:space="preserve"> over </w:t>
       </w:r>
       <w:r>
         <w:rPr>
@@ -1164,11 +588,6 @@
     </w:p>
     <w:p>
       <w:pPr>
-        <w:tabs>
-          <w:tab w:val="left" w:pos="2551"/>
-          <w:tab w:val="left" w:pos="4819"/>
-          <w:tab w:val="left" w:pos="7087"/>
-        </w:tabs>
         <w:spacing w:before="80" w:after="60"/>
         <w:ind w:left="283"/>
         <w:rPr>
@@ -1186,13 +605,7 @@
         <w:rPr>
           <w:sz w:val="24"/>
         </w:rPr>
-        <w:t xml:space="preserve"> interesting</w:t>
-      </w:r>
-      <w:r>
-        <w:rPr>
-          <w:sz w:val="24"/>
-        </w:rPr>
-        <w:tab/>
+        <w:t xml:space="preserve"> interesting </w:t>
       </w:r>
       <w:r>
         <w:rPr>
@@ -1205,13 +618,7 @@
         <w:rPr>
           <w:sz w:val="24"/>
         </w:rPr>
-        <w:t xml:space="preserve"> cheap</w:t>
-      </w:r>
-      <w:r>
-        <w:rPr>
-          <w:sz w:val="24"/>
-        </w:rPr>
-        <w:tab/>
+        <w:t xml:space="preserve"> cheap </w:t>
       </w:r>
       <w:r>
         <w:rPr>
@@ -1224,13 +631,7 @@
         <w:rPr>
           <w:sz w:val="24"/>
         </w:rPr>
-        <w:t xml:space="preserve"> expensive</w:t>
-      </w:r>
-      <w:r>
-        <w:rPr>
-          <w:sz w:val="24"/>
-        </w:rPr>
-        <w:tab/>
+        <w:t xml:space="preserve"> expensive </w:t>
       </w:r>
       <w:r>
         <w:rPr>
@@ -1262,11 +663,6 @@
     </w:p>
     <w:p>
       <w:pPr>
-        <w:tabs>
-          <w:tab w:val="left" w:pos="2551"/>
-          <w:tab w:val="left" w:pos="4819"/>
-          <w:tab w:val="left" w:pos="7087"/>
-        </w:tabs>
         <w:spacing w:before="80" w:after="60"/>
         <w:ind w:left="283"/>
         <w:rPr>
@@ -1284,13 +680,7 @@
         <w:rPr>
           <w:sz w:val="24"/>
         </w:rPr>
-        <w:t xml:space="preserve"> seeing</w:t>
-      </w:r>
-      <w:r>
-        <w:rPr>
-          <w:sz w:val="24"/>
-        </w:rPr>
-        <w:tab/>
+        <w:t xml:space="preserve"> seeing </w:t>
       </w:r>
       <w:r>
         <w:rPr>
@@ -1303,13 +693,7 @@
         <w:rPr>
           <w:sz w:val="24"/>
         </w:rPr>
-        <w:t xml:space="preserve"> looking</w:t>
-      </w:r>
-      <w:r>
-        <w:rPr>
-          <w:sz w:val="24"/>
-        </w:rPr>
-        <w:tab/>
+        <w:t xml:space="preserve"> looking </w:t>
       </w:r>
       <w:r>
         <w:rPr>
@@ -1322,13 +706,7 @@
         <w:rPr>
           <w:sz w:val="24"/>
         </w:rPr>
-        <w:t xml:space="preserve"> hearing</w:t>
-      </w:r>
-      <w:r>
-        <w:rPr>
-          <w:sz w:val="24"/>
-        </w:rPr>
-        <w:tab/>
+        <w:t xml:space="preserve"> hearing </w:t>
       </w:r>
       <w:r>
         <w:rPr>
@@ -1360,11 +738,6 @@
     </w:p>
     <w:p>
       <w:pPr>
-        <w:tabs>
-          <w:tab w:val="left" w:pos="2551"/>
-          <w:tab w:val="left" w:pos="4819"/>
-          <w:tab w:val="left" w:pos="7087"/>
-        </w:tabs>
         <w:spacing w:before="80" w:after="60"/>
         <w:ind w:left="283"/>
         <w:rPr>
@@ -1382,13 +755,7 @@
         <w:rPr>
           <w:sz w:val="24"/>
         </w:rPr>
-        <w:t xml:space="preserve"> play</w:t>
-      </w:r>
-      <w:r>
-        <w:rPr>
-          <w:sz w:val="24"/>
-        </w:rPr>
-        <w:tab/>
+        <w:t xml:space="preserve"> play </w:t>
       </w:r>
       <w:r>
         <w:rPr>
@@ -1401,13 +768,7 @@
         <w:rPr>
           <w:sz w:val="24"/>
         </w:rPr>
-        <w:t xml:space="preserve"> to play</w:t>
-      </w:r>
-      <w:r>
-        <w:rPr>
-          <w:sz w:val="24"/>
-        </w:rPr>
-        <w:tab/>
+        <w:t xml:space="preserve"> to play </w:t>
       </w:r>
       <w:r>
         <w:rPr>
@@ -1420,13 +781,7 @@
         <w:rPr>
           <w:sz w:val="24"/>
         </w:rPr>
-        <w:t xml:space="preserve"> playing</w:t>
-      </w:r>
-      <w:r>
-        <w:rPr>
-          <w:sz w:val="24"/>
-        </w:rPr>
-        <w:tab/>
+        <w:t xml:space="preserve"> playing </w:t>
       </w:r>
       <w:r>
         <w:rPr>
@@ -1458,11 +813,6 @@
     </w:p>
     <w:p>
       <w:pPr>
-        <w:tabs>
-          <w:tab w:val="left" w:pos="2551"/>
-          <w:tab w:val="left" w:pos="4819"/>
-          <w:tab w:val="left" w:pos="7087"/>
-        </w:tabs>
         <w:spacing w:before="80" w:after="60"/>
         <w:ind w:left="283"/>
         <w:rPr>
@@ -1480,13 +830,7 @@
         <w:rPr>
           <w:sz w:val="24"/>
         </w:rPr>
-        <w:t xml:space="preserve"> unique</w:t>
-      </w:r>
-      <w:r>
-        <w:rPr>
-          <w:sz w:val="24"/>
-        </w:rPr>
-        <w:tab/>
+        <w:t xml:space="preserve"> unique </w:t>
       </w:r>
       <w:r>
         <w:rPr>
@@ -1499,13 +843,7 @@
         <w:rPr>
           <w:sz w:val="24"/>
         </w:rPr>
-        <w:t xml:space="preserve"> fragile</w:t>
-      </w:r>
-      <w:r>
-        <w:rPr>
-          <w:sz w:val="24"/>
-        </w:rPr>
-        <w:tab/>
+        <w:t xml:space="preserve"> fragile </w:t>
       </w:r>
       <w:r>
         <w:rPr>
@@ -1518,13 +856,7 @@
         <w:rPr>
           <w:sz w:val="24"/>
         </w:rPr>
-        <w:t xml:space="preserve"> difficult</w:t>
-      </w:r>
-      <w:r>
-        <w:rPr>
-          <w:sz w:val="24"/>
-        </w:rPr>
-        <w:tab/>
+        <w:t xml:space="preserve"> difficult </w:t>
       </w:r>
       <w:r>
         <w:rPr>
@@ -1556,11 +888,6 @@
     </w:p>
     <w:p>
       <w:pPr>
-        <w:tabs>
-          <w:tab w:val="left" w:pos="2551"/>
-          <w:tab w:val="left" w:pos="4819"/>
-          <w:tab w:val="left" w:pos="7087"/>
-        </w:tabs>
         <w:spacing w:before="80" w:after="60"/>
         <w:ind w:left="283"/>
         <w:rPr>
@@ -1578,13 +905,7 @@
         <w:rPr>
           <w:sz w:val="24"/>
         </w:rPr>
-        <w:t xml:space="preserve"> share</w:t>
-      </w:r>
-      <w:r>
-        <w:rPr>
-          <w:sz w:val="24"/>
-        </w:rPr>
-        <w:tab/>
+        <w:t xml:space="preserve"> share </w:t>
       </w:r>
       <w:r>
         <w:rPr>
@@ -1597,13 +918,7 @@
         <w:rPr>
           <w:sz w:val="24"/>
         </w:rPr>
-        <w:t xml:space="preserve"> play</w:t>
-      </w:r>
-      <w:r>
-        <w:rPr>
-          <w:sz w:val="24"/>
-        </w:rPr>
-        <w:tab/>
+        <w:t xml:space="preserve"> play </w:t>
       </w:r>
       <w:r>
         <w:rPr>
@@ -1616,13 +931,7 @@
         <w:rPr>
           <w:sz w:val="24"/>
         </w:rPr>
-        <w:t xml:space="preserve"> do</w:t>
-      </w:r>
-      <w:r>
-        <w:rPr>
-          <w:sz w:val="24"/>
-        </w:rPr>
-        <w:tab/>
+        <w:t xml:space="preserve"> do </w:t>
       </w:r>
       <w:r>
         <w:rPr>
@@ -1654,11 +963,6 @@
     </w:p>
     <w:p>
       <w:pPr>
-        <w:tabs>
-          <w:tab w:val="left" w:pos="2551"/>
-          <w:tab w:val="left" w:pos="4819"/>
-          <w:tab w:val="left" w:pos="7087"/>
-        </w:tabs>
         <w:spacing w:before="80" w:after="60"/>
         <w:ind w:left="283"/>
         <w:rPr>
@@ -1676,13 +980,7 @@
         <w:rPr>
           <w:sz w:val="24"/>
         </w:rPr>
-        <w:t xml:space="preserve"> what</w:t>
-      </w:r>
-      <w:r>
-        <w:rPr>
-          <w:sz w:val="24"/>
-        </w:rPr>
-        <w:tab/>
+        <w:t xml:space="preserve"> what </w:t>
       </w:r>
       <w:r>
         <w:rPr>
@@ -1695,13 +993,7 @@
         <w:rPr>
           <w:sz w:val="24"/>
         </w:rPr>
-        <w:t xml:space="preserve"> where</w:t>
-      </w:r>
-      <w:r>
-        <w:rPr>
-          <w:sz w:val="24"/>
-        </w:rPr>
-        <w:tab/>
+        <w:t xml:space="preserve"> where </w:t>
       </w:r>
       <w:r>
         <w:rPr>
@@ -1714,13 +1006,7 @@
         <w:rPr>
           <w:sz w:val="24"/>
         </w:rPr>
-        <w:t xml:space="preserve"> how</w:t>
-      </w:r>
-      <w:r>
-        <w:rPr>
-          <w:sz w:val="24"/>
-        </w:rPr>
-        <w:tab/>
+        <w:t xml:space="preserve"> how </w:t>
       </w:r>
       <w:r>
         <w:rPr>
@@ -1752,11 +1038,6 @@
     </w:p>
     <w:p>
       <w:pPr>
-        <w:tabs>
-          <w:tab w:val="left" w:pos="2551"/>
-          <w:tab w:val="left" w:pos="4819"/>
-          <w:tab w:val="left" w:pos="7087"/>
-        </w:tabs>
         <w:spacing w:before="80" w:after="60"/>
         <w:ind w:left="283"/>
         <w:rPr>
@@ -1774,13 +1055,7 @@
         <w:rPr>
           <w:sz w:val="24"/>
         </w:rPr>
-        <w:t xml:space="preserve"> How much</w:t>
-      </w:r>
-      <w:r>
-        <w:rPr>
-          <w:sz w:val="24"/>
-        </w:rPr>
-        <w:tab/>
+        <w:t xml:space="preserve"> How much </w:t>
       </w:r>
       <w:r>
         <w:rPr>
@@ -1793,13 +1068,7 @@
         <w:rPr>
           <w:sz w:val="24"/>
         </w:rPr>
-        <w:t xml:space="preserve"> How long</w:t>
-      </w:r>
-      <w:r>
-        <w:rPr>
-          <w:sz w:val="24"/>
-        </w:rPr>
-        <w:tab/>
+        <w:t xml:space="preserve"> How long </w:t>
       </w:r>
       <w:r>
         <w:rPr>
@@ -1812,13 +1081,7 @@
         <w:rPr>
           <w:sz w:val="24"/>
         </w:rPr>
-        <w:t xml:space="preserve"> How often</w:t>
-      </w:r>
-      <w:r>
-        <w:rPr>
-          <w:sz w:val="24"/>
-        </w:rPr>
-        <w:tab/>
+        <w:t xml:space="preserve"> How often </w:t>
       </w:r>
       <w:r>
         <w:rPr>
@@ -1847,40 +1110,7 @@
           <w:b/>
           <w:sz w:val="24"/>
         </w:rPr>
-        <w:t>IX. Read the text carefully, then answer the questions.</w:t>
-      </w:r>
-    </w:p>
-    <w:p>
-      <w:pPr>
-        <w:spacing w:after="80"/>
-        <w:ind w:firstLine="425"/>
-        <w:jc w:val="both"/>
-        <w:rPr>
-          <w:sz w:val="24"/>
-        </w:rPr>
-      </w:pPr>
-      <w:r>
-        <w:rPr>
-          <w:sz w:val="24"/>
-        </w:rPr>
-        <w:lastRenderedPageBreak/>
-        <w:t>My name's Susan. I have two favourite hobbies. My first hobby is reading. I started to do it when I was four years old. The first time I did it, I felt interested. So I kept reading. I enjoy reading because it can make me relaxed and calm. Moreover, it can give me an imagination, so I can write books in the future. I can learn the different cultures and customs of other countries in the world, too.</w:t>
-      </w:r>
-    </w:p>
-    <w:p>
-      <w:pPr>
-        <w:spacing w:after="80"/>
-        <w:ind w:firstLine="425"/>
-        <w:jc w:val="both"/>
-        <w:rPr>
-          <w:sz w:val="24"/>
-        </w:rPr>
-      </w:pPr>
-      <w:r>
-        <w:rPr>
-          <w:sz w:val="24"/>
-        </w:rPr>
-        <w:t>My second hobby is gardening. I have made a small garden and planted many beds of flowers. In the spring season, my garden is full of beautiful flowers. I have a separate plot for vegetables – carrots, potatoes, etc. In the evening, I water the plants and remove the weeds. I love sitting in my garden and reading my books. It is very pleasant to be there!</w:t>
+        <w:t>I.  Arrange the words to make sentences.</w:t>
       </w:r>
     </w:p>
     <w:p>
@@ -1894,7 +1124,7 @@
         <w:rPr>
           <w:sz w:val="24"/>
         </w:rPr>
-        <w:t>1. What are Susan's hobbies?</w:t>
+        <w:t>1. hobby/ you/ have/ any/ do/?</w:t>
       </w:r>
     </w:p>
     <w:p>
@@ -1926,7 +1156,7 @@
         <w:rPr>
           <w:sz w:val="24"/>
         </w:rPr>
-        <w:t>2. When did she start reading?</w:t>
+        <w:t>2. his/ do/ what/ your/ brother/ does/ in/ free time/?</w:t>
       </w:r>
     </w:p>
     <w:p>
@@ -1944,6 +1174,7 @@
         <w:rPr>
           <w:sz w:val="24"/>
         </w:rPr>
+        <w:lastRenderedPageBreak/>
         <w:t>_____________________________________________</w:t>
       </w:r>
     </w:p>
@@ -1958,7 +1189,7 @@
         <w:rPr>
           <w:sz w:val="24"/>
         </w:rPr>
-        <w:t>3. How did she feel when she first read a book?</w:t>
+        <w:t>3. he/ the summer/ in/ climbing/ goes/ mountain/ usually/.</w:t>
       </w:r>
     </w:p>
     <w:p>
@@ -1990,7 +1221,7 @@
         <w:rPr>
           <w:sz w:val="24"/>
         </w:rPr>
-        <w:t>4. Why does she enjoy reading?</w:t>
+        <w:t>4. friends/ monopoly/ enjoy/ I/ with/ playing/ my/.</w:t>
       </w:r>
     </w:p>
     <w:p>
@@ -2022,7 +1253,7 @@
         <w:rPr>
           <w:sz w:val="24"/>
         </w:rPr>
-        <w:t>5. What has she planted in her garden?</w:t>
+        <w:t>5. it/ boring/ because/ finds/ time/ models/ Jim/ takes/ lots of/ making/.</w:t>
       </w:r>
     </w:p>
     <w:p>
@@ -2054,7 +1285,7 @@
         <w:rPr>
           <w:sz w:val="24"/>
         </w:rPr>
-        <w:t>6. When does she water the plants?</w:t>
+        <w:t>6. people/ do/ many/ gardening/ as/ a/ take up/ hobby/?</w:t>
       </w:r>
     </w:p>
     <w:p>
@@ -2073,6 +1304,390 @@
           <w:sz w:val="24"/>
         </w:rPr>
         <w:t>_____________________________________________</w:t>
+      </w:r>
+    </w:p>
+    <w:p>
+      <w:pPr>
+        <w:spacing w:before="120" w:after="80"/>
+        <w:rPr>
+          <w:b/>
+          <w:sz w:val="24"/>
+        </w:rPr>
+      </w:pPr>
+      <w:r>
+        <w:rPr>
+          <w:b/>
+          <w:sz w:val="24"/>
+        </w:rPr>
+        <w:t>II. Complete the second sentence so that it has the same meaning as the first one.</w:t>
+      </w:r>
+    </w:p>
+    <w:p>
+      <w:pPr>
+        <w:spacing w:before="120" w:after="80"/>
+        <w:rPr>
+          <w:sz w:val="24"/>
+        </w:rPr>
+      </w:pPr>
+      <w:r>
+        <w:rPr>
+          <w:sz w:val="24"/>
+        </w:rPr>
+        <w:t>1. What is your hobby?</w:t>
+      </w:r>
+    </w:p>
+    <w:p>
+      <w:pPr>
+        <w:tabs>
+          <w:tab w:val="right" w:pos="9354"/>
+        </w:tabs>
+        <w:spacing w:before="60" w:after="60"/>
+        <w:rPr>
+          <w:sz w:val="24"/>
+        </w:rPr>
+      </w:pPr>
+      <w:r>
+        <w:rPr>
+          <w:rFonts w:hint="eastAsia"/>
+          <w:sz w:val="24"/>
+        </w:rPr>
+        <w:t>→</w:t>
+      </w:r>
+      <w:r>
+        <w:rPr>
+          <w:rFonts w:hint="eastAsia"/>
+          <w:sz w:val="24"/>
+        </w:rPr>
+        <w:t xml:space="preserve"> What hobby</w:t>
+      </w:r>
+      <w:r>
+        <w:rPr>
+          <w:sz w:val="24"/>
+        </w:rPr>
+        <w:tab/>
+        <w:t>___________</w:t>
+      </w:r>
+    </w:p>
+    <w:p>
+      <w:pPr>
+        <w:spacing w:before="120" w:after="80"/>
+        <w:rPr>
+          <w:sz w:val="24"/>
+        </w:rPr>
+      </w:pPr>
+      <w:r>
+        <w:rPr>
+          <w:sz w:val="24"/>
+        </w:rPr>
+        <w:t>2. We all find painting interesting because it's a creative activity.</w:t>
+      </w:r>
+    </w:p>
+    <w:p>
+      <w:pPr>
+        <w:tabs>
+          <w:tab w:val="right" w:pos="9354"/>
+        </w:tabs>
+        <w:spacing w:before="60" w:after="60"/>
+        <w:rPr>
+          <w:sz w:val="24"/>
+        </w:rPr>
+      </w:pPr>
+      <w:r>
+        <w:rPr>
+          <w:rFonts w:hint="eastAsia"/>
+          <w:sz w:val="24"/>
+        </w:rPr>
+        <w:t>→</w:t>
+      </w:r>
+      <w:r>
+        <w:rPr>
+          <w:rFonts w:hint="eastAsia"/>
+          <w:sz w:val="24"/>
+        </w:rPr>
+        <w:t xml:space="preserve"> We all think</w:t>
+      </w:r>
+      <w:r>
+        <w:rPr>
+          <w:sz w:val="24"/>
+        </w:rPr>
+        <w:tab/>
+        <w:t>___________</w:t>
+      </w:r>
+    </w:p>
+    <w:p>
+      <w:pPr>
+        <w:spacing w:before="120" w:after="80"/>
+        <w:rPr>
+          <w:sz w:val="24"/>
+        </w:rPr>
+      </w:pPr>
+      <w:r>
+        <w:rPr>
+          <w:sz w:val="24"/>
+        </w:rPr>
+        <w:t>3. His hobby is collecting toy cars.</w:t>
+      </w:r>
+    </w:p>
+    <w:p>
+      <w:pPr>
+        <w:tabs>
+          <w:tab w:val="right" w:pos="9354"/>
+        </w:tabs>
+        <w:spacing w:before="60" w:after="60"/>
+        <w:rPr>
+          <w:sz w:val="24"/>
+        </w:rPr>
+      </w:pPr>
+      <w:r>
+        <w:rPr>
+          <w:rFonts w:hint="eastAsia"/>
+          <w:sz w:val="24"/>
+        </w:rPr>
+        <w:t>→</w:t>
+      </w:r>
+      <w:r>
+        <w:rPr>
+          <w:rFonts w:hint="eastAsia"/>
+          <w:sz w:val="24"/>
+        </w:rPr>
+        <w:t xml:space="preserve"> He collects</w:t>
+      </w:r>
+      <w:r>
+        <w:rPr>
+          <w:sz w:val="24"/>
+        </w:rPr>
+        <w:tab/>
+        <w:t>___________</w:t>
+      </w:r>
+    </w:p>
+    <w:p>
+      <w:pPr>
+        <w:spacing w:before="120" w:after="80"/>
+        <w:rPr>
+          <w:sz w:val="24"/>
+        </w:rPr>
+      </w:pPr>
+      <w:r>
+        <w:rPr>
+          <w:sz w:val="24"/>
+        </w:rPr>
+        <w:t>4. It isn't necessary to finish the work today.</w:t>
+      </w:r>
+    </w:p>
+    <w:p>
+      <w:pPr>
+        <w:tabs>
+          <w:tab w:val="right" w:pos="9354"/>
+        </w:tabs>
+        <w:spacing w:before="60" w:after="60"/>
+        <w:rPr>
+          <w:sz w:val="24"/>
+        </w:rPr>
+      </w:pPr>
+      <w:r>
+        <w:rPr>
+          <w:rFonts w:hint="eastAsia"/>
+          <w:sz w:val="24"/>
+        </w:rPr>
+        <w:t>→</w:t>
+      </w:r>
+      <w:r>
+        <w:rPr>
+          <w:rFonts w:hint="eastAsia"/>
+          <w:sz w:val="24"/>
+        </w:rPr>
+        <w:t xml:space="preserve"> You don't</w:t>
+      </w:r>
+      <w:r>
+        <w:rPr>
+          <w:sz w:val="24"/>
+        </w:rPr>
+        <w:tab/>
+        <w:t>___________</w:t>
+      </w:r>
+    </w:p>
+    <w:p>
+      <w:pPr>
+        <w:spacing w:before="120" w:after="80"/>
+        <w:rPr>
+          <w:sz w:val="24"/>
+        </w:rPr>
+      </w:pPr>
+      <w:r>
+        <w:rPr>
+          <w:sz w:val="24"/>
+        </w:rPr>
+        <w:t>5. When did you start your hobby?</w:t>
+      </w:r>
+    </w:p>
+    <w:p>
+      <w:pPr>
+        <w:tabs>
+          <w:tab w:val="right" w:pos="9354"/>
+        </w:tabs>
+        <w:spacing w:before="60" w:after="60"/>
+        <w:rPr>
+          <w:sz w:val="24"/>
+        </w:rPr>
+      </w:pPr>
+      <w:r>
+        <w:rPr>
+          <w:rFonts w:hint="eastAsia"/>
+          <w:sz w:val="24"/>
+        </w:rPr>
+        <w:t>→</w:t>
+      </w:r>
+      <w:r>
+        <w:rPr>
+          <w:rFonts w:hint="eastAsia"/>
+          <w:sz w:val="24"/>
+        </w:rPr>
+        <w:t xml:space="preserve"> How long</w:t>
+      </w:r>
+      <w:r>
+        <w:rPr>
+          <w:sz w:val="24"/>
+        </w:rPr>
+        <w:tab/>
+        <w:t>___________</w:t>
+      </w:r>
+    </w:p>
+    <w:p>
+      <w:pPr>
+        <w:spacing w:before="120" w:after="80"/>
+        <w:rPr>
+          <w:sz w:val="24"/>
+        </w:rPr>
+      </w:pPr>
+      <w:r>
+        <w:rPr>
+          <w:sz w:val="24"/>
+        </w:rPr>
+        <w:t>6. It took me three hours to make this pottery jug.</w:t>
+      </w:r>
+    </w:p>
+    <w:p>
+      <w:pPr>
+        <w:tabs>
+          <w:tab w:val="right" w:pos="9354"/>
+        </w:tabs>
+        <w:spacing w:before="60" w:after="60"/>
+        <w:rPr>
+          <w:sz w:val="24"/>
+        </w:rPr>
+      </w:pPr>
+      <w:r>
+        <w:rPr>
+          <w:rFonts w:hint="eastAsia"/>
+          <w:sz w:val="24"/>
+        </w:rPr>
+        <w:t>→</w:t>
+      </w:r>
+      <w:r>
+        <w:rPr>
+          <w:rFonts w:hint="eastAsia"/>
+          <w:sz w:val="24"/>
+        </w:rPr>
+        <w:t xml:space="preserve"> I spent</w:t>
+      </w:r>
+      <w:r>
+        <w:rPr>
+          <w:sz w:val="24"/>
+        </w:rPr>
+        <w:tab/>
+        <w:t>___________</w:t>
+      </w:r>
+    </w:p>
+    <w:p>
+      <w:pPr>
+        <w:spacing w:before="120" w:after="80"/>
+        <w:rPr>
+          <w:sz w:val="24"/>
+        </w:rPr>
+      </w:pPr>
+      <w:r>
+        <w:rPr>
+          <w:sz w:val="24"/>
+        </w:rPr>
+        <w:t>7. My father likes to do gardening at the weekend.</w:t>
+      </w:r>
+    </w:p>
+    <w:p>
+      <w:pPr>
+        <w:tabs>
+          <w:tab w:val="right" w:pos="9354"/>
+        </w:tabs>
+        <w:spacing w:before="60" w:after="60"/>
+        <w:rPr>
+          <w:sz w:val="24"/>
+        </w:rPr>
+      </w:pPr>
+      <w:r>
+        <w:rPr>
+          <w:rFonts w:hint="eastAsia"/>
+          <w:sz w:val="24"/>
+        </w:rPr>
+        <w:t>→</w:t>
+      </w:r>
+      <w:r>
+        <w:rPr>
+          <w:rFonts w:hint="eastAsia"/>
+          <w:sz w:val="24"/>
+        </w:rPr>
+        <w:t xml:space="preserve"> My father enjoys</w:t>
+      </w:r>
+      <w:r>
+        <w:rPr>
+          <w:sz w:val="24"/>
+        </w:rPr>
+        <w:tab/>
+        <w:t>___________</w:t>
+      </w:r>
+    </w:p>
+    <w:p>
+      <w:pPr>
+        <w:spacing w:before="120" w:after="80"/>
+        <w:rPr>
+          <w:sz w:val="24"/>
+        </w:rPr>
+      </w:pPr>
+      <w:r>
+        <w:rPr>
+          <w:sz w:val="24"/>
+        </w:rPr>
+        <w:t>8. Why don't we go swimming this afternoon?</w:t>
+      </w:r>
+    </w:p>
+    <w:p>
+      <w:pPr>
+        <w:tabs>
+          <w:tab w:val="right" w:pos="9354"/>
+        </w:tabs>
+        <w:spacing w:before="60" w:after="60"/>
+        <w:rPr>
+          <w:sz w:val="24"/>
+        </w:rPr>
+      </w:pPr>
+      <w:r>
+        <w:rPr>
+          <w:rFonts w:hint="eastAsia"/>
+          <w:sz w:val="24"/>
+        </w:rPr>
+        <w:t>→</w:t>
+      </w:r>
+      <w:r>
+        <w:rPr>
+          <w:rFonts w:hint="eastAsia"/>
+          <w:sz w:val="24"/>
+        </w:rPr>
+        <w:t xml:space="preserve"> What about</w:t>
+      </w:r>
+      <w:r>
+        <w:rPr>
+          <w:sz w:val="24"/>
+        </w:rPr>
+        <w:tab/>
+        <w:t>___________</w:t>
       </w:r>
     </w:p>
     <w:p>
@@ -2112,10 +1727,11 @@
           <w:noProof/>
           <w:sz w:val="24"/>
         </w:rPr>
+        <w:lastRenderedPageBreak/>
         <mc:AlternateContent>
           <mc:Choice Requires="wps">
             <w:drawing>
-              <wp:anchor distT="0" distB="0" distL="114300" distR="114300" simplePos="0" relativeHeight="251659264" behindDoc="0" locked="0" layoutInCell="1" allowOverlap="1" wp14:anchorId="3C5D3134" wp14:editId="4C7B1EF1">
+              <wp:anchor distT="0" distB="0" distL="114300" distR="114300" simplePos="0" relativeHeight="251659264" behindDoc="0" locked="0" layoutInCell="1" allowOverlap="1" wp14:anchorId="6C17BF52" wp14:editId="305CF000">
                 <wp:simplePos x="0" y="0"/>
                 <wp:positionH relativeFrom="margin">
                   <wp:posOffset>1674495</wp:posOffset>
@@ -2126,7 +1742,7 @@
                 <wp:extent cx="2590800" cy="558800"/>
                 <wp:effectExtent l="0" t="0" r="19050" b="12700"/>
                 <wp:wrapNone/>
-                <wp:docPr id="1764318927" name="Rectangle: Rounded Corners 1"/>
+                <wp:docPr id="2074646678" name="Rectangle: Rounded Corners 1"/>
                 <wp:cNvGraphicFramePr/>
                 <a:graphic xmlns:a="http://schemas.openxmlformats.org/drawingml/2006/main">
                   <a:graphicData uri="http://schemas.microsoft.com/office/word/2010/wordprocessingShape">
@@ -2189,7 +1805,7 @@
           </mc:Choice>
           <mc:Fallback>
             <w:pict>
-              <v:roundrect w14:anchorId="4A236385" id="Rectangle: Rounded Corners 1" o:spid="_x0000_s1026" style="position:absolute;margin-left:131.85pt;margin-top:-6pt;width:204pt;height:44pt;z-index:251659264;visibility:visible;mso-wrap-style:square;mso-wrap-distance-left:9pt;mso-wrap-distance-top:0;mso-wrap-distance-right:9pt;mso-wrap-distance-bottom:0;mso-position-horizontal:absolute;mso-position-horizontal-relative:margin;mso-position-vertical:absolute;mso-position-vertical-relative:text;v-text-anchor:middle" arcsize="10923f" o:gfxdata="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" filled="f" fillcolor="#156082 [3204]" strokeweight="1pt">
+              <v:roundrect w14:anchorId="615F5C05" id="Rectangle: Rounded Corners 1" o:spid="_x0000_s1026" style="position:absolute;margin-left:131.85pt;margin-top:-6pt;width:204pt;height:44pt;z-index:251659264;visibility:visible;mso-wrap-style:square;mso-wrap-distance-left:9pt;mso-wrap-distance-top:0;mso-wrap-distance-right:9pt;mso-wrap-distance-bottom:0;mso-position-horizontal:absolute;mso-position-horizontal-relative:margin;mso-position-vertical:absolute;mso-position-vertical-relative:text;v-text-anchor:middle" arcsize="10923f" o:gfxdata="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" filled="f" fillcolor="#156082 [3204]" strokeweight="1pt">
                 <v:stroke joinstyle="miter"/>
                 <w10:wrap anchorx="margin"/>
               </v:roundrect>
@@ -2308,30 +1924,296 @@
     </w:p>
     <w:p>
       <w:pPr>
+        <w:keepNext/>
         <w:tabs>
-          <w:tab w:val="left" w:pos="3837"/>
-          <w:tab w:val="left" w:pos="4917"/>
-          <w:tab w:val="left" w:pos="5997"/>
+          <w:tab w:val="right" w:pos="9354"/>
         </w:tabs>
+        <w:spacing w:before="60" w:after="60" w:line="480" w:lineRule="auto"/>
+        <w:rPr>
+          <w:sz w:val="24"/>
+        </w:rPr>
+      </w:pPr>
+      <w:r>
+        <w:rPr>
+          <w:sz w:val="24"/>
+        </w:rPr>
+        <w:t>1. not bright or not having much light</w:t>
+      </w:r>
+      <w:r>
+        <w:rPr>
+          <w:sz w:val="24"/>
+        </w:rPr>
+        <w:tab/>
+        <w:t>___________</w:t>
+      </w:r>
+    </w:p>
+    <w:p>
+      <w:pPr>
+        <w:keepNext/>
+        <w:tabs>
+          <w:tab w:val="right" w:pos="9354"/>
+        </w:tabs>
+        <w:spacing w:before="60" w:after="60" w:line="480" w:lineRule="auto"/>
+        <w:rPr>
+          <w:sz w:val="24"/>
+        </w:rPr>
+      </w:pPr>
+      <w:r>
+        <w:rPr>
+          <w:sz w:val="24"/>
+        </w:rPr>
+        <w:t>2. needing to rest or sleep</w:t>
+      </w:r>
+      <w:r>
+        <w:rPr>
+          <w:sz w:val="24"/>
+        </w:rPr>
+        <w:tab/>
+        <w:t>___________</w:t>
+      </w:r>
+    </w:p>
+    <w:p>
+      <w:pPr>
+        <w:keepNext/>
+        <w:tabs>
+          <w:tab w:val="right" w:pos="9354"/>
+        </w:tabs>
+        <w:spacing w:before="60" w:after="60" w:line="480" w:lineRule="auto"/>
+        <w:rPr>
+          <w:sz w:val="24"/>
+        </w:rPr>
+      </w:pPr>
+      <w:r>
+        <w:rPr>
+          <w:sz w:val="24"/>
+        </w:rPr>
+        <w:t>3. marked with dirt, mud, etc.</w:t>
+      </w:r>
+      <w:r>
+        <w:rPr>
+          <w:sz w:val="24"/>
+        </w:rPr>
+        <w:tab/>
+        <w:t>___________</w:t>
+      </w:r>
+    </w:p>
+    <w:p>
+      <w:pPr>
+        <w:keepNext/>
+        <w:tabs>
+          <w:tab w:val="right" w:pos="9354"/>
+        </w:tabs>
+        <w:spacing w:before="60" w:after="60" w:line="480" w:lineRule="auto"/>
+        <w:rPr>
+          <w:sz w:val="24"/>
+        </w:rPr>
+      </w:pPr>
+      <w:r>
+        <w:rPr>
+          <w:sz w:val="24"/>
+        </w:rPr>
+        <w:t>4. having good health and not likely to become ill</w:t>
+      </w:r>
+      <w:r>
+        <w:rPr>
+          <w:sz w:val="24"/>
+        </w:rPr>
+        <w:tab/>
+        <w:t>___________</w:t>
+      </w:r>
+    </w:p>
+    <w:p>
+      <w:pPr>
+        <w:keepNext/>
+        <w:tabs>
+          <w:tab w:val="right" w:pos="9354"/>
+        </w:tabs>
+        <w:spacing w:before="60" w:after="60" w:line="480" w:lineRule="auto"/>
+        <w:rPr>
+          <w:sz w:val="24"/>
+        </w:rPr>
+      </w:pPr>
+      <w:r>
+        <w:rPr>
+          <w:sz w:val="24"/>
+        </w:rPr>
+        <w:t>5. rough, dry and painful, especially because of wind or cold weather</w:t>
+      </w:r>
+      <w:r>
+        <w:rPr>
+          <w:sz w:val="24"/>
+        </w:rPr>
+        <w:tab/>
+        <w:t>___________</w:t>
+      </w:r>
+    </w:p>
+    <w:p>
+      <w:pPr>
+        <w:keepNext/>
+        <w:tabs>
+          <w:tab w:val="right" w:pos="9354"/>
+        </w:tabs>
+        <w:spacing w:before="60" w:after="60" w:line="480" w:lineRule="auto"/>
+        <w:rPr>
+          <w:sz w:val="24"/>
+        </w:rPr>
+      </w:pPr>
+      <w:r>
+        <w:rPr>
+          <w:sz w:val="24"/>
+        </w:rPr>
+        <w:t>6. healthy and strong, especially because you do regular exercise</w:t>
+      </w:r>
+      <w:r>
+        <w:rPr>
+          <w:sz w:val="24"/>
+        </w:rPr>
+        <w:tab/>
+        <w:t>___________</w:t>
+      </w:r>
+    </w:p>
+    <w:p>
+      <w:pPr>
+        <w:keepNext/>
+        <w:tabs>
+          <w:tab w:val="right" w:pos="9354"/>
+        </w:tabs>
+        <w:spacing w:before="60" w:after="60" w:line="480" w:lineRule="auto"/>
+        <w:rPr>
+          <w:sz w:val="24"/>
+        </w:rPr>
+      </w:pPr>
+      <w:r>
+        <w:rPr>
+          <w:sz w:val="24"/>
+        </w:rPr>
+        <w:t>7. always busy doing things, especially physical activities</w:t>
+      </w:r>
+      <w:r>
+        <w:rPr>
+          <w:sz w:val="24"/>
+        </w:rPr>
+        <w:tab/>
+        <w:t>___________</w:t>
+      </w:r>
+    </w:p>
+    <w:p>
+      <w:pPr>
+        <w:keepNext/>
+        <w:tabs>
+          <w:tab w:val="right" w:pos="9354"/>
+        </w:tabs>
+        <w:spacing w:before="60" w:after="60" w:line="480" w:lineRule="auto"/>
+        <w:rPr>
+          <w:sz w:val="24"/>
+        </w:rPr>
+      </w:pPr>
+      <w:r>
+        <w:rPr>
+          <w:sz w:val="24"/>
+        </w:rPr>
+        <w:t>8. arranged neatly and with everything in order</w:t>
+      </w:r>
+      <w:r>
+        <w:rPr>
+          <w:sz w:val="24"/>
+        </w:rPr>
+        <w:tab/>
+        <w:t>___________</w:t>
+      </w:r>
+    </w:p>
+    <w:p>
+      <w:pPr>
         <w:spacing w:before="120" w:after="80" w:line="480" w:lineRule="auto"/>
         <w:rPr>
-          <w:sz w:val="24"/>
-        </w:rPr>
-      </w:pPr>
-      <w:r>
-        <w:rPr>
-          <w:sz w:val="24"/>
-        </w:rPr>
-        <w:t>1. not bright or not having much light ___________</w:t>
+          <w:b/>
+          <w:sz w:val="24"/>
+        </w:rPr>
+      </w:pPr>
+      <w:r>
+        <w:rPr>
+          <w:b/>
+          <w:sz w:val="24"/>
+        </w:rPr>
+        <w:t>IX. Read the text carefully, then answer the questions.</w:t>
+      </w:r>
+    </w:p>
+    <w:p>
+      <w:pPr>
+        <w:spacing w:after="80" w:line="480" w:lineRule="auto"/>
+        <w:ind w:firstLine="425"/>
+        <w:jc w:val="both"/>
+        <w:rPr>
+          <w:sz w:val="24"/>
+        </w:rPr>
+      </w:pPr>
+      <w:r>
+        <w:rPr>
+          <w:sz w:val="24"/>
+        </w:rPr>
+        <w:t>My name's Susan. I have two favourite hobbies. My first hobby is reading. I started to do it when I was four years old. The first time I did it, I felt interested. So I kept reading. I enjoy reading because it can make me relaxed and calm. Moreover, it can give me an imagination, so I can write books in the future. I can learn the different cultures and customs of other countries in the world, too.</w:t>
+      </w:r>
+    </w:p>
+    <w:p>
+      <w:pPr>
+        <w:spacing w:after="80" w:line="480" w:lineRule="auto"/>
+        <w:ind w:firstLine="425"/>
+        <w:jc w:val="both"/>
+        <w:rPr>
+          <w:sz w:val="24"/>
+        </w:rPr>
+      </w:pPr>
+    </w:p>
+    <w:p>
+      <w:pPr>
+        <w:spacing w:after="80" w:line="480" w:lineRule="auto"/>
+        <w:ind w:firstLine="425"/>
+        <w:jc w:val="both"/>
+        <w:rPr>
+          <w:sz w:val="24"/>
+        </w:rPr>
+      </w:pPr>
+      <w:r>
+        <w:rPr>
+          <w:sz w:val="24"/>
+        </w:rPr>
+        <w:t>My second hobby is gardening. I have made a small garden and planted many beds of flowers. In the spring season, my garden is full of beautiful flowers. I have a separate plot for vegetables – carrots, potatoes, etc. In the evening, I water the plants and remove the weeds. I love sitting in my garden and reading my books. It is very pleasant to be there!</w:t>
+      </w:r>
+    </w:p>
+    <w:p>
+      <w:pPr>
+        <w:spacing w:before="120" w:after="80" w:line="480" w:lineRule="auto"/>
+        <w:rPr>
+          <w:sz w:val="24"/>
+        </w:rPr>
+      </w:pPr>
+      <w:r>
+        <w:rPr>
+          <w:sz w:val="24"/>
+        </w:rPr>
+        <w:t>1. What are Susan's hobbies?</w:t>
       </w:r>
     </w:p>
     <w:p>
       <w:pPr>
         <w:tabs>
-          <w:tab w:val="left" w:pos="3837"/>
-          <w:tab w:val="left" w:pos="4917"/>
-          <w:tab w:val="left" w:pos="5997"/>
+          <w:tab w:val="right" w:pos="9354"/>
         </w:tabs>
+        <w:spacing w:before="80" w:after="60" w:line="480" w:lineRule="auto"/>
+        <w:ind w:left="283"/>
+        <w:rPr>
+          <w:sz w:val="24"/>
+        </w:rPr>
+      </w:pPr>
+      <w:r>
+        <w:rPr>
+          <w:sz w:val="24"/>
+        </w:rPr>
+        <w:t>_____________________________________________</w:t>
+      </w:r>
+    </w:p>
+    <w:p>
+      <w:pPr>
         <w:spacing w:before="120" w:after="80" w:line="480" w:lineRule="auto"/>
         <w:rPr>
           <w:sz w:val="24"/>
@@ -2341,16 +2223,29 @@
         <w:rPr>
           <w:sz w:val="24"/>
         </w:rPr>
-        <w:t>2. needing to rest or sleep ___________</w:t>
+        <w:t>2. When did she start reading?</w:t>
       </w:r>
     </w:p>
     <w:p>
       <w:pPr>
         <w:tabs>
-          <w:tab w:val="left" w:pos="3837"/>
-          <w:tab w:val="left" w:pos="4917"/>
-          <w:tab w:val="left" w:pos="5997"/>
+          <w:tab w:val="right" w:pos="9354"/>
         </w:tabs>
+        <w:spacing w:before="80" w:after="60" w:line="480" w:lineRule="auto"/>
+        <w:ind w:left="283"/>
+        <w:rPr>
+          <w:sz w:val="24"/>
+        </w:rPr>
+      </w:pPr>
+      <w:r>
+        <w:rPr>
+          <w:sz w:val="24"/>
+        </w:rPr>
+        <w:t>_____________________________________________</w:t>
+      </w:r>
+    </w:p>
+    <w:p>
+      <w:pPr>
         <w:spacing w:before="120" w:after="80" w:line="480" w:lineRule="auto"/>
         <w:rPr>
           <w:sz w:val="24"/>
@@ -2360,16 +2255,30 @@
         <w:rPr>
           <w:sz w:val="24"/>
         </w:rPr>
-        <w:t>3. marked with dirt, mud, etc. ___________</w:t>
+        <w:lastRenderedPageBreak/>
+        <w:t>3. How did she feel when she first read a book?</w:t>
       </w:r>
     </w:p>
     <w:p>
       <w:pPr>
         <w:tabs>
-          <w:tab w:val="left" w:pos="3837"/>
-          <w:tab w:val="left" w:pos="4917"/>
-          <w:tab w:val="left" w:pos="5997"/>
+          <w:tab w:val="right" w:pos="9354"/>
         </w:tabs>
+        <w:spacing w:before="80" w:after="60" w:line="480" w:lineRule="auto"/>
+        <w:ind w:left="283"/>
+        <w:rPr>
+          <w:sz w:val="24"/>
+        </w:rPr>
+      </w:pPr>
+      <w:r>
+        <w:rPr>
+          <w:sz w:val="24"/>
+        </w:rPr>
+        <w:t>_____________________________________________</w:t>
+      </w:r>
+    </w:p>
+    <w:p>
+      <w:pPr>
         <w:spacing w:before="120" w:after="80" w:line="480" w:lineRule="auto"/>
         <w:rPr>
           <w:sz w:val="24"/>
@@ -2379,16 +2288,29 @@
         <w:rPr>
           <w:sz w:val="24"/>
         </w:rPr>
-        <w:t>4. having good health and not likely to become ill ___________</w:t>
+        <w:t>4. Why does she enjoy reading?</w:t>
       </w:r>
     </w:p>
     <w:p>
       <w:pPr>
         <w:tabs>
-          <w:tab w:val="left" w:pos="3837"/>
-          <w:tab w:val="left" w:pos="4917"/>
-          <w:tab w:val="left" w:pos="5997"/>
+          <w:tab w:val="right" w:pos="9354"/>
         </w:tabs>
+        <w:spacing w:before="80" w:after="60" w:line="480" w:lineRule="auto"/>
+        <w:ind w:left="283"/>
+        <w:rPr>
+          <w:sz w:val="24"/>
+        </w:rPr>
+      </w:pPr>
+      <w:r>
+        <w:rPr>
+          <w:sz w:val="24"/>
+        </w:rPr>
+        <w:t>_____________________________________________</w:t>
+      </w:r>
+    </w:p>
+    <w:p>
+      <w:pPr>
         <w:spacing w:before="120" w:after="80" w:line="480" w:lineRule="auto"/>
         <w:rPr>
           <w:sz w:val="24"/>
@@ -2398,16 +2320,29 @@
         <w:rPr>
           <w:sz w:val="24"/>
         </w:rPr>
-        <w:t>5. rough, dry and painful, especially because of wind or cold weather ___________</w:t>
+        <w:t>5. What has she planted in her garden?</w:t>
       </w:r>
     </w:p>
     <w:p>
       <w:pPr>
         <w:tabs>
-          <w:tab w:val="left" w:pos="3837"/>
-          <w:tab w:val="left" w:pos="4917"/>
-          <w:tab w:val="left" w:pos="5997"/>
+          <w:tab w:val="right" w:pos="9354"/>
         </w:tabs>
+        <w:spacing w:before="80" w:after="60" w:line="480" w:lineRule="auto"/>
+        <w:ind w:left="283"/>
+        <w:rPr>
+          <w:sz w:val="24"/>
+        </w:rPr>
+      </w:pPr>
+      <w:r>
+        <w:rPr>
+          <w:sz w:val="24"/>
+        </w:rPr>
+        <w:t>_____________________________________________</w:t>
+      </w:r>
+    </w:p>
+    <w:p>
+      <w:pPr>
         <w:spacing w:before="120" w:after="80" w:line="480" w:lineRule="auto"/>
         <w:rPr>
           <w:sz w:val="24"/>
@@ -2417,62 +2352,43 @@
         <w:rPr>
           <w:sz w:val="24"/>
         </w:rPr>
-        <w:t>6. healthy and strong, especially because you do regular exercise ___________</w:t>
+        <w:t>6. When does she water the plants?</w:t>
       </w:r>
     </w:p>
     <w:p>
       <w:pPr>
         <w:tabs>
-          <w:tab w:val="left" w:pos="3837"/>
-          <w:tab w:val="left" w:pos="4917"/>
-          <w:tab w:val="left" w:pos="5997"/>
+          <w:tab w:val="right" w:pos="9354"/>
         </w:tabs>
-        <w:spacing w:before="120" w:after="80" w:line="480" w:lineRule="auto"/>
-        <w:rPr>
-          <w:sz w:val="24"/>
-        </w:rPr>
-      </w:pPr>
-      <w:r>
-        <w:rPr>
-          <w:sz w:val="24"/>
-        </w:rPr>
-        <w:t>7. always busy doing things, especially physical activities ___________</w:t>
-      </w:r>
-    </w:p>
-    <w:p>
-      <w:pPr>
-        <w:tabs>
-          <w:tab w:val="left" w:pos="3837"/>
-          <w:tab w:val="left" w:pos="4917"/>
-          <w:tab w:val="left" w:pos="5997"/>
-        </w:tabs>
-        <w:spacing w:before="120" w:after="80" w:line="480" w:lineRule="auto"/>
-        <w:rPr>
-          <w:sz w:val="24"/>
-        </w:rPr>
-      </w:pPr>
-      <w:r>
-        <w:rPr>
-          <w:sz w:val="24"/>
-        </w:rPr>
-        <w:t>8. arranged neatly and with everything in order ___________</w:t>
-      </w:r>
-    </w:p>
-    <w:p>
-      <w:pPr>
-        <w:tabs>
-          <w:tab w:val="left" w:pos="3837"/>
-          <w:tab w:val="left" w:pos="4917"/>
-          <w:tab w:val="left" w:pos="5997"/>
-        </w:tabs>
-        <w:spacing w:before="120" w:after="80" w:line="480" w:lineRule="auto"/>
+        <w:spacing w:before="80" w:after="60" w:line="480" w:lineRule="auto"/>
+        <w:ind w:left="283"/>
+        <w:rPr>
+          <w:sz w:val="24"/>
+        </w:rPr>
+      </w:pPr>
+      <w:r>
+        <w:rPr>
+          <w:sz w:val="24"/>
+        </w:rPr>
+        <w:t>_____________________________________________</w:t>
+      </w:r>
+    </w:p>
+    <w:p>
+      <w:pPr>
+        <w:spacing w:before="80" w:after="60" w:line="480" w:lineRule="auto"/>
+        <w:ind w:left="283"/>
         <w:rPr>
           <w:sz w:val="24"/>
         </w:rPr>
       </w:pPr>
     </w:p>
     <w:sectPr>
-      <w:footerReference w:type="default" r:id="rId6"/>
+      <w:headerReference w:type="even" r:id="rId6"/>
+      <w:headerReference w:type="default" r:id="rId7"/>
+      <w:footerReference w:type="even" r:id="rId8"/>
+      <w:footerReference w:type="default" r:id="rId9"/>
+      <w:headerReference w:type="first" r:id="rId10"/>
+      <w:footerReference w:type="first" r:id="rId11"/>
       <w:pgSz w:w="11907" w:h="16840" w:code="9"/>
       <w:pgMar w:top="1134" w:right="850" w:bottom="1134" w:left="1701" w:header="720" w:footer="720" w:gutter="0"/>
       <w:cols w:space="720"/>
@@ -2508,6 +2424,16 @@
 </file>
 
 <file path=word/footer1.xml><?xml version="1.0" encoding="utf-8"?>
+<w:ftr xmlns:wpc="http://schemas.microsoft.com/office/word/2010/wordprocessingCanvas" xmlns:cx="http://schemas.microsoft.com/office/drawing/2014/chartex" xmlns:cx1="http://schemas.microsoft.com/office/drawing/2015/9/8/chartex" xmlns:cx2="http://schemas.microsoft.com/office/drawing/2015/10/21/chartex" xmlns:cx3="http://schemas.microsoft.com/office/drawing/2016/5/9/chartex" xmlns:cx4="http://schemas.microsoft.com/office/drawing/2016/5/10/chartex" xmlns:cx5="http://schemas.microsoft.com/office/drawing/2016/5/11/chartex" xmlns:cx6="http://schemas.microsoft.com/office/drawing/2016/5/12/chartex" xmlns:cx7="http://schemas.microsoft.com/office/drawing/2016/5/13/chartex" xmlns:cx8="http://schemas.microsoft.com/office/drawing/2016/5/14/chartex" xmlns:mc="http://schemas.openxmlformats.org/markup-compatibility/2006" xmlns:aink="http://schemas.microsoft.com/office/drawing/2016/ink" xmlns:am3d="http://schemas.microsoft.com/office/drawing/2017/model3d" xmlns:o="urn:schemas-microsoft-com:office:office" xmlns:oel="http://schemas.microsoft.com/office/2019/extlst" xmlns:r="http://schemas.openxmlformats.org/officeDocument/2006/relationships" xmlns:m="http://schemas.openxmlformats.org/officeDocument/2006/math" xmlns:v="urn:schemas-microsoft-com:vml" xmlns:wp14="http://schemas.microsoft.com/office/word/2010/wordprocessingDrawing" xmlns:wp="http://schemas.openxmlformats.org/drawingml/2006/wordprocessingDrawing" xmlns:w10="urn:schemas-microsoft-com:office:word" xmlns:w="http://schemas.openxmlformats.org/wordprocessingml/2006/main" xmlns:w14="http://schemas.microsoft.com/office/word/2010/wordml" xmlns:w15="http://schemas.microsoft.com/office/word/2012/wordml" xmlns:w16cei="http://schemas.microsoft.com/office/word/2026/wordml/cei" xmlns:w16cex="http://schemas.microsoft.com/office/word/2018/wordml/cex" xmlns:w16cid="http://schemas.microsoft.com/office/word/2016/wordml/cid" xmlns:w16="http://schemas.microsoft.com/office/word/2018/wordml" xmlns:w16du="http://schemas.microsoft.com/office/word/2023/wordml/word16du" xmlns:w16sdtdh="http://schemas.microsoft.com/office/word/2020/wordml/sdtdatahash" xmlns:w16sdtfl="http://schemas.microsoft.com/office/word/2024/wordml/sdtformatlock" xmlns:w16se="http://schemas.microsoft.com/office/word/2015/wordml/symex" xmlns:wpg="http://schemas.microsoft.com/office/word/2010/wordprocessingGroup" xmlns:wpi="http://schemas.microsoft.com/office/word/2010/wordprocessingInk" xmlns:wne="http://schemas.microsoft.com/office/word/2006/wordml" xmlns:wps="http://schemas.microsoft.com/office/word/2010/wordprocessingShape" mc:Ignorable="w14 w15 w16se w16cid w16 w16cex w16sdtdh w16sdtfl w16du wp14">
+  <w:p>
+    <w:pPr>
+      <w:pStyle w:val="Footer"/>
+    </w:pPr>
+  </w:p>
+</w:ftr>
+</file>
+
+<file path=word/footer2.xml><?xml version="1.0" encoding="utf-8"?>
 <w:ftr xmlns:wpc="http://schemas.microsoft.com/office/word/2010/wordprocessingCanvas" xmlns:cx="http://schemas.microsoft.com/office/drawing/2014/chartex" xmlns:cx1="http://schemas.microsoft.com/office/drawing/2015/9/8/chartex" xmlns:cx2="http://schemas.microsoft.com/office/drawing/2015/10/21/chartex" xmlns:cx3="http://schemas.microsoft.com/office/drawing/2016/5/9/chartex" xmlns:cx4="http://schemas.microsoft.com/office/drawing/2016/5/10/chartex" xmlns:cx5="http://schemas.microsoft.com/office/drawing/2016/5/11/chartex" xmlns:cx6="http://schemas.microsoft.com/office/drawing/2016/5/12/chartex" xmlns:cx7="http://schemas.microsoft.com/office/drawing/2016/5/13/chartex" xmlns:cx8="http://schemas.microsoft.com/office/drawing/2016/5/14/chartex" xmlns:mc="http://schemas.openxmlformats.org/markup-compatibility/2006" xmlns:aink="http://schemas.microsoft.com/office/drawing/2016/ink" xmlns:am3d="http://schemas.microsoft.com/office/drawing/2017/model3d" xmlns:o="urn:schemas-microsoft-com:office:office" xmlns:oel="http://schemas.microsoft.com/office/2019/extlst" xmlns:r="http://schemas.openxmlformats.org/officeDocument/2006/relationships" xmlns:m="http://schemas.openxmlformats.org/officeDocument/2006/math" xmlns:v="urn:schemas-microsoft-com:vml" xmlns:wp14="http://schemas.microsoft.com/office/word/2010/wordprocessingDrawing" xmlns:wp="http://schemas.openxmlformats.org/drawingml/2006/wordprocessingDrawing" xmlns:w10="urn:schemas-microsoft-com:office:word" xmlns:w="http://schemas.openxmlformats.org/wordprocessingml/2006/main" xmlns:w14="http://schemas.microsoft.com/office/word/2010/wordml" xmlns:w15="http://schemas.microsoft.com/office/word/2012/wordml" xmlns:w16cei="http://schemas.microsoft.com/office/word/2026/wordml/cei" xmlns:w16cex="http://schemas.microsoft.com/office/word/2018/wordml/cex" xmlns:w16cid="http://schemas.microsoft.com/office/word/2016/wordml/cid" xmlns:w16="http://schemas.microsoft.com/office/word/2018/wordml" xmlns:w16du="http://schemas.microsoft.com/office/word/2023/wordml/word16du" xmlns:w16sdtdh="http://schemas.microsoft.com/office/word/2020/wordml/sdtdatahash" xmlns:w16sdtfl="http://schemas.microsoft.com/office/word/2024/wordml/sdtformatlock" xmlns:w16se="http://schemas.microsoft.com/office/word/2015/wordml/symex" xmlns:wpg="http://schemas.microsoft.com/office/word/2010/wordprocessingGroup" xmlns:wpi="http://schemas.microsoft.com/office/word/2010/wordprocessingInk" xmlns:wne="http://schemas.microsoft.com/office/word/2006/wordml" xmlns:wps="http://schemas.microsoft.com/office/word/2010/wordprocessingShape" mc:Ignorable="w14 w15 w16se w16cid w16 w16cex w16sdtdh w16sdtfl w16du wp14">
   <w:p>
     <w:pPr>
@@ -2585,6 +2511,16 @@
 </w:ftr>
 </file>
 
+<file path=word/footer3.xml><?xml version="1.0" encoding="utf-8"?>
+<w:ftr xmlns:wpc="http://schemas.microsoft.com/office/word/2010/wordprocessingCanvas" xmlns:cx="http://schemas.microsoft.com/office/drawing/2014/chartex" xmlns:cx1="http://schemas.microsoft.com/office/drawing/2015/9/8/chartex" xmlns:cx2="http://schemas.microsoft.com/office/drawing/2015/10/21/chartex" xmlns:cx3="http://schemas.microsoft.com/office/drawing/2016/5/9/chartex" xmlns:cx4="http://schemas.microsoft.com/office/drawing/2016/5/10/chartex" xmlns:cx5="http://schemas.microsoft.com/office/drawing/2016/5/11/chartex" xmlns:cx6="http://schemas.microsoft.com/office/drawing/2016/5/12/chartex" xmlns:cx7="http://schemas.microsoft.com/office/drawing/2016/5/13/chartex" xmlns:cx8="http://schemas.microsoft.com/office/drawing/2016/5/14/chartex" xmlns:mc="http://schemas.openxmlformats.org/markup-compatibility/2006" xmlns:aink="http://schemas.microsoft.com/office/drawing/2016/ink" xmlns:am3d="http://schemas.microsoft.com/office/drawing/2017/model3d" xmlns:o="urn:schemas-microsoft-com:office:office" xmlns:oel="http://schemas.microsoft.com/office/2019/extlst" xmlns:r="http://schemas.openxmlformats.org/officeDocument/2006/relationships" xmlns:m="http://schemas.openxmlformats.org/officeDocument/2006/math" xmlns:v="urn:schemas-microsoft-com:vml" xmlns:wp14="http://schemas.microsoft.com/office/word/2010/wordprocessingDrawing" xmlns:wp="http://schemas.openxmlformats.org/drawingml/2006/wordprocessingDrawing" xmlns:w10="urn:schemas-microsoft-com:office:word" xmlns:w="http://schemas.openxmlformats.org/wordprocessingml/2006/main" xmlns:w14="http://schemas.microsoft.com/office/word/2010/wordml" xmlns:w15="http://schemas.microsoft.com/office/word/2012/wordml" xmlns:w16cei="http://schemas.microsoft.com/office/word/2026/wordml/cei" xmlns:w16cex="http://schemas.microsoft.com/office/word/2018/wordml/cex" xmlns:w16cid="http://schemas.microsoft.com/office/word/2016/wordml/cid" xmlns:w16="http://schemas.microsoft.com/office/word/2018/wordml" xmlns:w16du="http://schemas.microsoft.com/office/word/2023/wordml/word16du" xmlns:w16sdtdh="http://schemas.microsoft.com/office/word/2020/wordml/sdtdatahash" xmlns:w16sdtfl="http://schemas.microsoft.com/office/word/2024/wordml/sdtformatlock" xmlns:w16se="http://schemas.microsoft.com/office/word/2015/wordml/symex" xmlns:wpg="http://schemas.microsoft.com/office/word/2010/wordprocessingGroup" xmlns:wpi="http://schemas.microsoft.com/office/word/2010/wordprocessingInk" xmlns:wne="http://schemas.microsoft.com/office/word/2006/wordml" xmlns:wps="http://schemas.microsoft.com/office/word/2010/wordprocessingShape" mc:Ignorable="w14 w15 w16se w16cid w16 w16cex w16sdtdh w16sdtfl w16du wp14">
+  <w:p>
+    <w:pPr>
+      <w:pStyle w:val="Footer"/>
+    </w:pPr>
+  </w:p>
+</w:ftr>
+</file>
+
 <file path=word/footnotes.xml><?xml version="1.0" encoding="utf-8"?>
 <w:footnotes xmlns:wpc="http://schemas.microsoft.com/office/word/2010/wordprocessingCanvas" xmlns:cx="http://schemas.microsoft.com/office/drawing/2014/chartex" xmlns:cx1="http://schemas.microsoft.com/office/drawing/2015/9/8/chartex" xmlns:cx2="http://schemas.microsoft.com/office/drawing/2015/10/21/chartex" xmlns:cx3="http://schemas.microsoft.com/office/drawing/2016/5/9/chartex" xmlns:cx4="http://schemas.microsoft.com/office/drawing/2016/5/10/chartex" xmlns:cx5="http://schemas.microsoft.com/office/drawing/2016/5/11/chartex" xmlns:cx6="http://schemas.microsoft.com/office/drawing/2016/5/12/chartex" xmlns:cx7="http://schemas.microsoft.com/office/drawing/2016/5/13/chartex" xmlns:cx8="http://schemas.microsoft.com/office/drawing/2016/5/14/chartex" xmlns:mc="http://schemas.openxmlformats.org/markup-compatibility/2006" xmlns:aink="http://schemas.microsoft.com/office/drawing/2016/ink" xmlns:am3d="http://schemas.microsoft.com/office/drawing/2017/model3d" xmlns:o="urn:schemas-microsoft-com:office:office" xmlns:oel="http://schemas.microsoft.com/office/2019/extlst" xmlns:r="http://schemas.openxmlformats.org/officeDocument/2006/relationships" xmlns:m="http://schemas.openxmlformats.org/officeDocument/2006/math" xmlns:v="urn:schemas-microsoft-com:vml" xmlns:wp14="http://schemas.microsoft.com/office/word/2010/wordprocessingDrawing" xmlns:wp="http://schemas.openxmlformats.org/drawingml/2006/wordprocessingDrawing" xmlns:w10="urn:schemas-microsoft-com:office:word" xmlns:w="http://schemas.openxmlformats.org/wordprocessingml/2006/main" xmlns:w14="http://schemas.microsoft.com/office/word/2010/wordml" xmlns:w15="http://schemas.microsoft.com/office/word/2012/wordml" xmlns:w16cei="http://schemas.microsoft.com/office/word/2026/wordml/cei" xmlns:w16cex="http://schemas.microsoft.com/office/word/2018/wordml/cex" xmlns:w16cid="http://schemas.microsoft.com/office/word/2016/wordml/cid" xmlns:w16="http://schemas.microsoft.com/office/word/2018/wordml" xmlns:w16du="http://schemas.microsoft.com/office/word/2023/wordml/word16du" xmlns:w16sdtdh="http://schemas.microsoft.com/office/word/2020/wordml/sdtdatahash" xmlns:w16sdtfl="http://schemas.microsoft.com/office/word/2024/wordml/sdtformatlock" xmlns:w16se="http://schemas.microsoft.com/office/word/2015/wordml/symex" xmlns:wpg="http://schemas.microsoft.com/office/word/2010/wordprocessingGroup" xmlns:wpi="http://schemas.microsoft.com/office/word/2010/wordprocessingInk" xmlns:wne="http://schemas.microsoft.com/office/word/2006/wordml" xmlns:wps="http://schemas.microsoft.com/office/word/2010/wordprocessingShape" mc:Ignorable="w14 w15 w16se w16cid w16 w16cex w16sdtdh w16sdtfl w16du wp14">
   <w:footnote w:type="separator" w:id="-1">
@@ -2608,6 +2544,36 @@
     </w:p>
   </w:footnote>
 </w:footnotes>
+</file>
+
+<file path=word/header1.xml><?xml version="1.0" encoding="utf-8"?>
+<w:hdr xmlns:wpc="http://schemas.microsoft.com/office/word/2010/wordprocessingCanvas" xmlns:cx="http://schemas.microsoft.com/office/drawing/2014/chartex" xmlns:cx1="http://schemas.microsoft.com/office/drawing/2015/9/8/chartex" xmlns:cx2="http://schemas.microsoft.com/office/drawing/2015/10/21/chartex" xmlns:cx3="http://schemas.microsoft.com/office/drawing/2016/5/9/chartex" xmlns:cx4="http://schemas.microsoft.com/office/drawing/2016/5/10/chartex" xmlns:cx5="http://schemas.microsoft.com/office/drawing/2016/5/11/chartex" xmlns:cx6="http://schemas.microsoft.com/office/drawing/2016/5/12/chartex" xmlns:cx7="http://schemas.microsoft.com/office/drawing/2016/5/13/chartex" xmlns:cx8="http://schemas.microsoft.com/office/drawing/2016/5/14/chartex" xmlns:mc="http://schemas.openxmlformats.org/markup-compatibility/2006" xmlns:aink="http://schemas.microsoft.com/office/drawing/2016/ink" xmlns:am3d="http://schemas.microsoft.com/office/drawing/2017/model3d" xmlns:o="urn:schemas-microsoft-com:office:office" xmlns:oel="http://schemas.microsoft.com/office/2019/extlst" xmlns:r="http://schemas.openxmlformats.org/officeDocument/2006/relationships" xmlns:m="http://schemas.openxmlformats.org/officeDocument/2006/math" xmlns:v="urn:schemas-microsoft-com:vml" xmlns:wp14="http://schemas.microsoft.com/office/word/2010/wordprocessingDrawing" xmlns:wp="http://schemas.openxmlformats.org/drawingml/2006/wordprocessingDrawing" xmlns:w10="urn:schemas-microsoft-com:office:word" xmlns:w="http://schemas.openxmlformats.org/wordprocessingml/2006/main" xmlns:w14="http://schemas.microsoft.com/office/word/2010/wordml" xmlns:w15="http://schemas.microsoft.com/office/word/2012/wordml" xmlns:w16cei="http://schemas.microsoft.com/office/word/2026/wordml/cei" xmlns:w16cex="http://schemas.microsoft.com/office/word/2018/wordml/cex" xmlns:w16cid="http://schemas.microsoft.com/office/word/2016/wordml/cid" xmlns:w16="http://schemas.microsoft.com/office/word/2018/wordml" xmlns:w16du="http://schemas.microsoft.com/office/word/2023/wordml/word16du" xmlns:w16sdtdh="http://schemas.microsoft.com/office/word/2020/wordml/sdtdatahash" xmlns:w16sdtfl="http://schemas.microsoft.com/office/word/2024/wordml/sdtformatlock" xmlns:w16se="http://schemas.microsoft.com/office/word/2015/wordml/symex" xmlns:wpg="http://schemas.microsoft.com/office/word/2010/wordprocessingGroup" xmlns:wpi="http://schemas.microsoft.com/office/word/2010/wordprocessingInk" xmlns:wne="http://schemas.microsoft.com/office/word/2006/wordml" xmlns:wps="http://schemas.microsoft.com/office/word/2010/wordprocessingShape" mc:Ignorable="w14 w15 w16se w16cid w16 w16cex w16sdtdh w16sdtfl w16du wp14">
+  <w:p>
+    <w:pPr>
+      <w:pStyle w:val="Header"/>
+    </w:pPr>
+  </w:p>
+</w:hdr>
+</file>
+
+<file path=word/header2.xml><?xml version="1.0" encoding="utf-8"?>
+<w:hdr xmlns:wpc="http://schemas.microsoft.com/office/word/2010/wordprocessingCanvas" xmlns:cx="http://schemas.microsoft.com/office/drawing/2014/chartex" xmlns:cx1="http://schemas.microsoft.com/office/drawing/2015/9/8/chartex" xmlns:cx2="http://schemas.microsoft.com/office/drawing/2015/10/21/chartex" xmlns:cx3="http://schemas.microsoft.com/office/drawing/2016/5/9/chartex" xmlns:cx4="http://schemas.microsoft.com/office/drawing/2016/5/10/chartex" xmlns:cx5="http://schemas.microsoft.com/office/drawing/2016/5/11/chartex" xmlns:cx6="http://schemas.microsoft.com/office/drawing/2016/5/12/chartex" xmlns:cx7="http://schemas.microsoft.com/office/drawing/2016/5/13/chartex" xmlns:cx8="http://schemas.microsoft.com/office/drawing/2016/5/14/chartex" xmlns:mc="http://schemas.openxmlformats.org/markup-compatibility/2006" xmlns:aink="http://schemas.microsoft.com/office/drawing/2016/ink" xmlns:am3d="http://schemas.microsoft.com/office/drawing/2017/model3d" xmlns:o="urn:schemas-microsoft-com:office:office" xmlns:oel="http://schemas.microsoft.com/office/2019/extlst" xmlns:r="http://schemas.openxmlformats.org/officeDocument/2006/relationships" xmlns:m="http://schemas.openxmlformats.org/officeDocument/2006/math" xmlns:v="urn:schemas-microsoft-com:vml" xmlns:wp14="http://schemas.microsoft.com/office/word/2010/wordprocessingDrawing" xmlns:wp="http://schemas.openxmlformats.org/drawingml/2006/wordprocessingDrawing" xmlns:w10="urn:schemas-microsoft-com:office:word" xmlns:w="http://schemas.openxmlformats.org/wordprocessingml/2006/main" xmlns:w14="http://schemas.microsoft.com/office/word/2010/wordml" xmlns:w15="http://schemas.microsoft.com/office/word/2012/wordml" xmlns:w16cei="http://schemas.microsoft.com/office/word/2026/wordml/cei" xmlns:w16cex="http://schemas.microsoft.com/office/word/2018/wordml/cex" xmlns:w16cid="http://schemas.microsoft.com/office/word/2016/wordml/cid" xmlns:w16="http://schemas.microsoft.com/office/word/2018/wordml" xmlns:w16du="http://schemas.microsoft.com/office/word/2023/wordml/word16du" xmlns:w16sdtdh="http://schemas.microsoft.com/office/word/2020/wordml/sdtdatahash" xmlns:w16sdtfl="http://schemas.microsoft.com/office/word/2024/wordml/sdtformatlock" xmlns:w16se="http://schemas.microsoft.com/office/word/2015/wordml/symex" xmlns:wpg="http://schemas.microsoft.com/office/word/2010/wordprocessingGroup" xmlns:wpi="http://schemas.microsoft.com/office/word/2010/wordprocessingInk" xmlns:wne="http://schemas.microsoft.com/office/word/2006/wordml" xmlns:wps="http://schemas.microsoft.com/office/word/2010/wordprocessingShape" mc:Ignorable="w14 w15 w16se w16cid w16 w16cex w16sdtdh w16sdtfl w16du wp14">
+  <w:p>
+    <w:pPr>
+      <w:pStyle w:val="Header"/>
+    </w:pPr>
+  </w:p>
+</w:hdr>
+</file>
+
+<file path=word/header3.xml><?xml version="1.0" encoding="utf-8"?>
+<w:hdr xmlns:wpc="http://schemas.microsoft.com/office/word/2010/wordprocessingCanvas" xmlns:cx="http://schemas.microsoft.com/office/drawing/2014/chartex" xmlns:cx1="http://schemas.microsoft.com/office/drawing/2015/9/8/chartex" xmlns:cx2="http://schemas.microsoft.com/office/drawing/2015/10/21/chartex" xmlns:cx3="http://schemas.microsoft.com/office/drawing/2016/5/9/chartex" xmlns:cx4="http://schemas.microsoft.com/office/drawing/2016/5/10/chartex" xmlns:cx5="http://schemas.microsoft.com/office/drawing/2016/5/11/chartex" xmlns:cx6="http://schemas.microsoft.com/office/drawing/2016/5/12/chartex" xmlns:cx7="http://schemas.microsoft.com/office/drawing/2016/5/13/chartex" xmlns:cx8="http://schemas.microsoft.com/office/drawing/2016/5/14/chartex" xmlns:mc="http://schemas.openxmlformats.org/markup-compatibility/2006" xmlns:aink="http://schemas.microsoft.com/office/drawing/2016/ink" xmlns:am3d="http://schemas.microsoft.com/office/drawing/2017/model3d" xmlns:o="urn:schemas-microsoft-com:office:office" xmlns:oel="http://schemas.microsoft.com/office/2019/extlst" xmlns:r="http://schemas.openxmlformats.org/officeDocument/2006/relationships" xmlns:m="http://schemas.openxmlformats.org/officeDocument/2006/math" xmlns:v="urn:schemas-microsoft-com:vml" xmlns:wp14="http://schemas.microsoft.com/office/word/2010/wordprocessingDrawing" xmlns:wp="http://schemas.openxmlformats.org/drawingml/2006/wordprocessingDrawing" xmlns:w10="urn:schemas-microsoft-com:office:word" xmlns:w="http://schemas.openxmlformats.org/wordprocessingml/2006/main" xmlns:w14="http://schemas.microsoft.com/office/word/2010/wordml" xmlns:w15="http://schemas.microsoft.com/office/word/2012/wordml" xmlns:w16cei="http://schemas.microsoft.com/office/word/2026/wordml/cei" xmlns:w16cex="http://schemas.microsoft.com/office/word/2018/wordml/cex" xmlns:w16cid="http://schemas.microsoft.com/office/word/2016/wordml/cid" xmlns:w16="http://schemas.microsoft.com/office/word/2018/wordml" xmlns:w16du="http://schemas.microsoft.com/office/word/2023/wordml/word16du" xmlns:w16sdtdh="http://schemas.microsoft.com/office/word/2020/wordml/sdtdatahash" xmlns:w16sdtfl="http://schemas.microsoft.com/office/word/2024/wordml/sdtformatlock" xmlns:w16se="http://schemas.microsoft.com/office/word/2015/wordml/symex" xmlns:wpg="http://schemas.microsoft.com/office/word/2010/wordprocessingGroup" xmlns:wpi="http://schemas.microsoft.com/office/word/2010/wordprocessingInk" xmlns:wne="http://schemas.microsoft.com/office/word/2006/wordml" xmlns:wps="http://schemas.microsoft.com/office/word/2010/wordprocessingShape" mc:Ignorable="w14 w15 w16se w16cid w16 w16cex w16sdtdh w16sdtfl w16du wp14">
+  <w:p>
+    <w:pPr>
+      <w:pStyle w:val="Header"/>
+    </w:pPr>
+  </w:p>
+</w:hdr>
 </file>
 
 <file path=word/styles.xml><?xml version="1.0" encoding="utf-8"?>
@@ -3018,7 +2984,7 @@
     <w:link w:val="Heading1Char"/>
     <w:uiPriority w:val="9"/>
     <w:qFormat/>
-    <w:rsid w:val="00F90560"/>
+    <w:rsid w:val="00E4632B"/>
     <w:pPr>
       <w:keepNext/>
       <w:keepLines/>
@@ -3041,7 +3007,7 @@
     <w:semiHidden/>
     <w:unhideWhenUsed/>
     <w:qFormat/>
-    <w:rsid w:val="00F90560"/>
+    <w:rsid w:val="00E4632B"/>
     <w:pPr>
       <w:keepNext/>
       <w:keepLines/>
@@ -3064,7 +3030,7 @@
     <w:semiHidden/>
     <w:unhideWhenUsed/>
     <w:qFormat/>
-    <w:rsid w:val="00F90560"/>
+    <w:rsid w:val="00E4632B"/>
     <w:pPr>
       <w:keepNext/>
       <w:keepLines/>
@@ -3087,7 +3053,7 @@
     <w:semiHidden/>
     <w:unhideWhenUsed/>
     <w:qFormat/>
-    <w:rsid w:val="00F90560"/>
+    <w:rsid w:val="00E4632B"/>
     <w:pPr>
       <w:keepNext/>
       <w:keepLines/>
@@ -3110,7 +3076,7 @@
     <w:semiHidden/>
     <w:unhideWhenUsed/>
     <w:qFormat/>
-    <w:rsid w:val="00F90560"/>
+    <w:rsid w:val="00E4632B"/>
     <w:pPr>
       <w:keepNext/>
       <w:keepLines/>
@@ -3131,7 +3097,7 @@
     <w:semiHidden/>
     <w:unhideWhenUsed/>
     <w:qFormat/>
-    <w:rsid w:val="00F90560"/>
+    <w:rsid w:val="00E4632B"/>
     <w:pPr>
       <w:keepNext/>
       <w:keepLines/>
@@ -3154,7 +3120,7 @@
     <w:semiHidden/>
     <w:unhideWhenUsed/>
     <w:qFormat/>
-    <w:rsid w:val="00F90560"/>
+    <w:rsid w:val="00E4632B"/>
     <w:pPr>
       <w:keepNext/>
       <w:keepLines/>
@@ -3175,7 +3141,7 @@
     <w:semiHidden/>
     <w:unhideWhenUsed/>
     <w:qFormat/>
-    <w:rsid w:val="00F90560"/>
+    <w:rsid w:val="00E4632B"/>
     <w:pPr>
       <w:keepNext/>
       <w:keepLines/>
@@ -3198,7 +3164,7 @@
     <w:semiHidden/>
     <w:unhideWhenUsed/>
     <w:qFormat/>
-    <w:rsid w:val="00F90560"/>
+    <w:rsid w:val="00E4632B"/>
     <w:pPr>
       <w:keepNext/>
       <w:keepLines/>
@@ -3242,7 +3208,7 @@
     <w:basedOn w:val="DefaultParagraphFont"/>
     <w:link w:val="Heading1"/>
     <w:uiPriority w:val="9"/>
-    <w:rsid w:val="00F90560"/>
+    <w:rsid w:val="00E4632B"/>
     <w:rPr>
       <w:rFonts w:asciiTheme="majorHAnsi" w:eastAsiaTheme="majorEastAsia" w:hAnsiTheme="majorHAnsi" w:cstheme="majorBidi"/>
       <w:color w:val="0F4761" w:themeColor="accent1" w:themeShade="BF"/>
@@ -3256,7 +3222,7 @@
     <w:link w:val="Heading2"/>
     <w:uiPriority w:val="9"/>
     <w:semiHidden/>
-    <w:rsid w:val="00F90560"/>
+    <w:rsid w:val="00E4632B"/>
     <w:rPr>
       <w:rFonts w:asciiTheme="majorHAnsi" w:eastAsiaTheme="majorEastAsia" w:hAnsiTheme="majorHAnsi" w:cstheme="majorBidi"/>
       <w:color w:val="0F4761" w:themeColor="accent1" w:themeShade="BF"/>
@@ -3270,7 +3236,7 @@
     <w:link w:val="Heading3"/>
     <w:uiPriority w:val="9"/>
     <w:semiHidden/>
-    <w:rsid w:val="00F90560"/>
+    <w:rsid w:val="00E4632B"/>
     <w:rPr>
       <w:rFonts w:asciiTheme="minorHAnsi" w:eastAsiaTheme="majorEastAsia" w:hAnsiTheme="minorHAnsi" w:cstheme="majorBidi"/>
       <w:color w:val="0F4761" w:themeColor="accent1" w:themeShade="BF"/>
@@ -3284,7 +3250,7 @@
     <w:link w:val="Heading4"/>
     <w:uiPriority w:val="9"/>
     <w:semiHidden/>
-    <w:rsid w:val="00F90560"/>
+    <w:rsid w:val="00E4632B"/>
     <w:rPr>
       <w:rFonts w:asciiTheme="minorHAnsi" w:eastAsiaTheme="majorEastAsia" w:hAnsiTheme="minorHAnsi" w:cstheme="majorBidi"/>
       <w:i/>
@@ -3298,7 +3264,7 @@
     <w:link w:val="Heading5"/>
     <w:uiPriority w:val="9"/>
     <w:semiHidden/>
-    <w:rsid w:val="00F90560"/>
+    <w:rsid w:val="00E4632B"/>
     <w:rPr>
       <w:rFonts w:asciiTheme="minorHAnsi" w:eastAsiaTheme="majorEastAsia" w:hAnsiTheme="minorHAnsi" w:cstheme="majorBidi"/>
       <w:color w:val="0F4761" w:themeColor="accent1" w:themeShade="BF"/>
@@ -3310,7 +3276,7 @@
     <w:link w:val="Heading6"/>
     <w:uiPriority w:val="9"/>
     <w:semiHidden/>
-    <w:rsid w:val="00F90560"/>
+    <w:rsid w:val="00E4632B"/>
     <w:rPr>
       <w:rFonts w:asciiTheme="minorHAnsi" w:eastAsiaTheme="majorEastAsia" w:hAnsiTheme="minorHAnsi" w:cstheme="majorBidi"/>
       <w:i/>
@@ -3324,7 +3290,7 @@
     <w:link w:val="Heading7"/>
     <w:uiPriority w:val="9"/>
     <w:semiHidden/>
-    <w:rsid w:val="00F90560"/>
+    <w:rsid w:val="00E4632B"/>
     <w:rPr>
       <w:rFonts w:asciiTheme="minorHAnsi" w:eastAsiaTheme="majorEastAsia" w:hAnsiTheme="minorHAnsi" w:cstheme="majorBidi"/>
       <w:color w:val="595959" w:themeColor="text1" w:themeTint="A6"/>
@@ -3336,7 +3302,7 @@
     <w:link w:val="Heading8"/>
     <w:uiPriority w:val="9"/>
     <w:semiHidden/>
-    <w:rsid w:val="00F90560"/>
+    <w:rsid w:val="00E4632B"/>
     <w:rPr>
       <w:rFonts w:asciiTheme="minorHAnsi" w:eastAsiaTheme="majorEastAsia" w:hAnsiTheme="minorHAnsi" w:cstheme="majorBidi"/>
       <w:i/>
@@ -3350,7 +3316,7 @@
     <w:link w:val="Heading9"/>
     <w:uiPriority w:val="9"/>
     <w:semiHidden/>
-    <w:rsid w:val="00F90560"/>
+    <w:rsid w:val="00E4632B"/>
     <w:rPr>
       <w:rFonts w:asciiTheme="minorHAnsi" w:eastAsiaTheme="majorEastAsia" w:hAnsiTheme="minorHAnsi" w:cstheme="majorBidi"/>
       <w:color w:val="272727" w:themeColor="text1" w:themeTint="D8"/>
@@ -3363,7 +3329,7 @@
     <w:link w:val="TitleChar"/>
     <w:uiPriority w:val="10"/>
     <w:qFormat/>
-    <w:rsid w:val="00F90560"/>
+    <w:rsid w:val="00E4632B"/>
     <w:pPr>
       <w:spacing w:after="80" w:line="240" w:lineRule="auto"/>
       <w:contextualSpacing/>
@@ -3381,7 +3347,7 @@
     <w:basedOn w:val="DefaultParagraphFont"/>
     <w:link w:val="Title"/>
     <w:uiPriority w:val="10"/>
-    <w:rsid w:val="00F90560"/>
+    <w:rsid w:val="00E4632B"/>
     <w:rPr>
       <w:rFonts w:asciiTheme="majorHAnsi" w:eastAsiaTheme="majorEastAsia" w:hAnsiTheme="majorHAnsi" w:cstheme="majorBidi"/>
       <w:spacing w:val="-10"/>
@@ -3397,7 +3363,7 @@
     <w:link w:val="SubtitleChar"/>
     <w:uiPriority w:val="11"/>
     <w:qFormat/>
-    <w:rsid w:val="00F90560"/>
+    <w:rsid w:val="00E4632B"/>
     <w:pPr>
       <w:numPr>
         <w:ilvl w:val="1"/>
@@ -3416,7 +3382,7 @@
     <w:basedOn w:val="DefaultParagraphFont"/>
     <w:link w:val="Subtitle"/>
     <w:uiPriority w:val="11"/>
-    <w:rsid w:val="00F90560"/>
+    <w:rsid w:val="00E4632B"/>
     <w:rPr>
       <w:rFonts w:asciiTheme="minorHAnsi" w:eastAsiaTheme="majorEastAsia" w:hAnsiTheme="minorHAnsi" w:cstheme="majorBidi"/>
       <w:color w:val="595959" w:themeColor="text1" w:themeTint="A6"/>
@@ -3432,7 +3398,7 @@
     <w:link w:val="QuoteChar"/>
     <w:uiPriority w:val="29"/>
     <w:qFormat/>
-    <w:rsid w:val="00F90560"/>
+    <w:rsid w:val="00E4632B"/>
     <w:pPr>
       <w:spacing w:before="160"/>
       <w:jc w:val="center"/>
@@ -3448,7 +3414,7 @@
     <w:basedOn w:val="DefaultParagraphFont"/>
     <w:link w:val="Quote"/>
     <w:uiPriority w:val="29"/>
-    <w:rsid w:val="00F90560"/>
+    <w:rsid w:val="00E4632B"/>
     <w:rPr>
       <w:i/>
       <w:iCs/>
@@ -3460,7 +3426,7 @@
     <w:basedOn w:val="Normal"/>
     <w:uiPriority w:val="34"/>
     <w:qFormat/>
-    <w:rsid w:val="00F90560"/>
+    <w:rsid w:val="00E4632B"/>
     <w:pPr>
       <w:ind w:left="720"/>
       <w:contextualSpacing/>
@@ -3471,7 +3437,7 @@
     <w:basedOn w:val="DefaultParagraphFont"/>
     <w:uiPriority w:val="21"/>
     <w:qFormat/>
-    <w:rsid w:val="00F90560"/>
+    <w:rsid w:val="00E4632B"/>
     <w:rPr>
       <w:i/>
       <w:iCs/>
@@ -3485,7 +3451,7 @@
     <w:link w:val="IntenseQuoteChar"/>
     <w:uiPriority w:val="30"/>
     <w:qFormat/>
-    <w:rsid w:val="00F90560"/>
+    <w:rsid w:val="00E4632B"/>
     <w:pPr>
       <w:pBdr>
         <w:top w:val="single" w:sz="4" w:space="10" w:color="0F4761" w:themeColor="accent1" w:themeShade="BF"/>
@@ -3506,7 +3472,7 @@
     <w:basedOn w:val="DefaultParagraphFont"/>
     <w:link w:val="IntenseQuote"/>
     <w:uiPriority w:val="30"/>
-    <w:rsid w:val="00F90560"/>
+    <w:rsid w:val="00E4632B"/>
     <w:rPr>
       <w:i/>
       <w:iCs/>
@@ -3518,7 +3484,7 @@
     <w:basedOn w:val="DefaultParagraphFont"/>
     <w:uiPriority w:val="32"/>
     <w:qFormat/>
-    <w:rsid w:val="00F90560"/>
+    <w:rsid w:val="00E4632B"/>
     <w:rPr>
       <w:b/>
       <w:bCs/>
@@ -3533,7 +3499,7 @@
     <w:link w:val="HeaderChar"/>
     <w:uiPriority w:val="99"/>
     <w:unhideWhenUsed/>
-    <w:rsid w:val="00F90560"/>
+    <w:rsid w:val="00E4632B"/>
     <w:pPr>
       <w:tabs>
         <w:tab w:val="center" w:pos="4680"/>
@@ -3547,7 +3513,7 @@
     <w:basedOn w:val="DefaultParagraphFont"/>
     <w:link w:val="Header"/>
     <w:uiPriority w:val="99"/>
-    <w:rsid w:val="00F90560"/>
+    <w:rsid w:val="00E4632B"/>
   </w:style>
   <w:style w:type="paragraph" w:styleId="Footer">
     <w:name w:val="footer"/>
@@ -3555,7 +3521,7 @@
     <w:link w:val="FooterChar"/>
     <w:uiPriority w:val="99"/>
     <w:unhideWhenUsed/>
-    <w:rsid w:val="00F90560"/>
+    <w:rsid w:val="00E4632B"/>
     <w:pPr>
       <w:tabs>
         <w:tab w:val="center" w:pos="4680"/>
@@ -3569,7 +3535,7 @@
     <w:basedOn w:val="DefaultParagraphFont"/>
     <w:link w:val="Footer"/>
     <w:uiPriority w:val="99"/>
-    <w:rsid w:val="00F90560"/>
+    <w:rsid w:val="00E4632B"/>
   </w:style>
 </w:styles>
 </file>

</xml_diff>

<commit_message>
fix: center TAB2 column headers relative to respective columns and remove double spaces after option letters
</commit_message>
<xml_diff>
--- a/output/uln_document.docx
+++ b/output/uln_document.docx
@@ -926,7 +926,7 @@
     <w:link w:val="Heading1Char"/>
     <w:uiPriority w:val="9"/>
     <w:qFormat/>
-    <w:rsid w:val="00BA427F"/>
+    <w:rsid w:val="005B3C51"/>
     <w:pPr>
       <w:keepNext/>
       <w:keepLines/>
@@ -949,7 +949,7 @@
     <w:semiHidden/>
     <w:unhideWhenUsed/>
     <w:qFormat/>
-    <w:rsid w:val="00BA427F"/>
+    <w:rsid w:val="005B3C51"/>
     <w:pPr>
       <w:keepNext/>
       <w:keepLines/>
@@ -972,7 +972,7 @@
     <w:semiHidden/>
     <w:unhideWhenUsed/>
     <w:qFormat/>
-    <w:rsid w:val="00BA427F"/>
+    <w:rsid w:val="005B3C51"/>
     <w:pPr>
       <w:keepNext/>
       <w:keepLines/>
@@ -995,7 +995,7 @@
     <w:semiHidden/>
     <w:unhideWhenUsed/>
     <w:qFormat/>
-    <w:rsid w:val="00BA427F"/>
+    <w:rsid w:val="005B3C51"/>
     <w:pPr>
       <w:keepNext/>
       <w:keepLines/>
@@ -1018,7 +1018,7 @@
     <w:semiHidden/>
     <w:unhideWhenUsed/>
     <w:qFormat/>
-    <w:rsid w:val="00BA427F"/>
+    <w:rsid w:val="005B3C51"/>
     <w:pPr>
       <w:keepNext/>
       <w:keepLines/>
@@ -1039,7 +1039,7 @@
     <w:semiHidden/>
     <w:unhideWhenUsed/>
     <w:qFormat/>
-    <w:rsid w:val="00BA427F"/>
+    <w:rsid w:val="005B3C51"/>
     <w:pPr>
       <w:keepNext/>
       <w:keepLines/>
@@ -1062,7 +1062,7 @@
     <w:semiHidden/>
     <w:unhideWhenUsed/>
     <w:qFormat/>
-    <w:rsid w:val="00BA427F"/>
+    <w:rsid w:val="005B3C51"/>
     <w:pPr>
       <w:keepNext/>
       <w:keepLines/>
@@ -1083,7 +1083,7 @@
     <w:semiHidden/>
     <w:unhideWhenUsed/>
     <w:qFormat/>
-    <w:rsid w:val="00BA427F"/>
+    <w:rsid w:val="005B3C51"/>
     <w:pPr>
       <w:keepNext/>
       <w:keepLines/>
@@ -1106,7 +1106,7 @@
     <w:semiHidden/>
     <w:unhideWhenUsed/>
     <w:qFormat/>
-    <w:rsid w:val="00BA427F"/>
+    <w:rsid w:val="005B3C51"/>
     <w:pPr>
       <w:keepNext/>
       <w:keepLines/>
@@ -1150,7 +1150,7 @@
     <w:basedOn w:val="DefaultParagraphFont"/>
     <w:link w:val="Heading1"/>
     <w:uiPriority w:val="9"/>
-    <w:rsid w:val="00BA427F"/>
+    <w:rsid w:val="005B3C51"/>
     <w:rPr>
       <w:rFonts w:asciiTheme="majorHAnsi" w:eastAsiaTheme="majorEastAsia" w:hAnsiTheme="majorHAnsi" w:cstheme="majorBidi"/>
       <w:color w:val="0F4761" w:themeColor="accent1" w:themeShade="BF"/>
@@ -1164,7 +1164,7 @@
     <w:link w:val="Heading2"/>
     <w:uiPriority w:val="9"/>
     <w:semiHidden/>
-    <w:rsid w:val="00BA427F"/>
+    <w:rsid w:val="005B3C51"/>
     <w:rPr>
       <w:rFonts w:asciiTheme="majorHAnsi" w:eastAsiaTheme="majorEastAsia" w:hAnsiTheme="majorHAnsi" w:cstheme="majorBidi"/>
       <w:color w:val="0F4761" w:themeColor="accent1" w:themeShade="BF"/>
@@ -1178,7 +1178,7 @@
     <w:link w:val="Heading3"/>
     <w:uiPriority w:val="9"/>
     <w:semiHidden/>
-    <w:rsid w:val="00BA427F"/>
+    <w:rsid w:val="005B3C51"/>
     <w:rPr>
       <w:rFonts w:asciiTheme="minorHAnsi" w:eastAsiaTheme="majorEastAsia" w:hAnsiTheme="minorHAnsi" w:cstheme="majorBidi"/>
       <w:color w:val="0F4761" w:themeColor="accent1" w:themeShade="BF"/>
@@ -1192,7 +1192,7 @@
     <w:link w:val="Heading4"/>
     <w:uiPriority w:val="9"/>
     <w:semiHidden/>
-    <w:rsid w:val="00BA427F"/>
+    <w:rsid w:val="005B3C51"/>
     <w:rPr>
       <w:rFonts w:asciiTheme="minorHAnsi" w:eastAsiaTheme="majorEastAsia" w:hAnsiTheme="minorHAnsi" w:cstheme="majorBidi"/>
       <w:i/>
@@ -1206,7 +1206,7 @@
     <w:link w:val="Heading5"/>
     <w:uiPriority w:val="9"/>
     <w:semiHidden/>
-    <w:rsid w:val="00BA427F"/>
+    <w:rsid w:val="005B3C51"/>
     <w:rPr>
       <w:rFonts w:asciiTheme="minorHAnsi" w:eastAsiaTheme="majorEastAsia" w:hAnsiTheme="minorHAnsi" w:cstheme="majorBidi"/>
       <w:color w:val="0F4761" w:themeColor="accent1" w:themeShade="BF"/>
@@ -1218,7 +1218,7 @@
     <w:link w:val="Heading6"/>
     <w:uiPriority w:val="9"/>
     <w:semiHidden/>
-    <w:rsid w:val="00BA427F"/>
+    <w:rsid w:val="005B3C51"/>
     <w:rPr>
       <w:rFonts w:asciiTheme="minorHAnsi" w:eastAsiaTheme="majorEastAsia" w:hAnsiTheme="minorHAnsi" w:cstheme="majorBidi"/>
       <w:i/>
@@ -1232,7 +1232,7 @@
     <w:link w:val="Heading7"/>
     <w:uiPriority w:val="9"/>
     <w:semiHidden/>
-    <w:rsid w:val="00BA427F"/>
+    <w:rsid w:val="005B3C51"/>
     <w:rPr>
       <w:rFonts w:asciiTheme="minorHAnsi" w:eastAsiaTheme="majorEastAsia" w:hAnsiTheme="minorHAnsi" w:cstheme="majorBidi"/>
       <w:color w:val="595959" w:themeColor="text1" w:themeTint="A6"/>
@@ -1244,7 +1244,7 @@
     <w:link w:val="Heading8"/>
     <w:uiPriority w:val="9"/>
     <w:semiHidden/>
-    <w:rsid w:val="00BA427F"/>
+    <w:rsid w:val="005B3C51"/>
     <w:rPr>
       <w:rFonts w:asciiTheme="minorHAnsi" w:eastAsiaTheme="majorEastAsia" w:hAnsiTheme="minorHAnsi" w:cstheme="majorBidi"/>
       <w:i/>
@@ -1258,7 +1258,7 @@
     <w:link w:val="Heading9"/>
     <w:uiPriority w:val="9"/>
     <w:semiHidden/>
-    <w:rsid w:val="00BA427F"/>
+    <w:rsid w:val="005B3C51"/>
     <w:rPr>
       <w:rFonts w:asciiTheme="minorHAnsi" w:eastAsiaTheme="majorEastAsia" w:hAnsiTheme="minorHAnsi" w:cstheme="majorBidi"/>
       <w:color w:val="272727" w:themeColor="text1" w:themeTint="D8"/>
@@ -1271,7 +1271,7 @@
     <w:link w:val="TitleChar"/>
     <w:uiPriority w:val="10"/>
     <w:qFormat/>
-    <w:rsid w:val="00BA427F"/>
+    <w:rsid w:val="005B3C51"/>
     <w:pPr>
       <w:spacing w:after="80" w:line="240" w:lineRule="auto"/>
       <w:contextualSpacing/>
@@ -1289,7 +1289,7 @@
     <w:basedOn w:val="DefaultParagraphFont"/>
     <w:link w:val="Title"/>
     <w:uiPriority w:val="10"/>
-    <w:rsid w:val="00BA427F"/>
+    <w:rsid w:val="005B3C51"/>
     <w:rPr>
       <w:rFonts w:asciiTheme="majorHAnsi" w:eastAsiaTheme="majorEastAsia" w:hAnsiTheme="majorHAnsi" w:cstheme="majorBidi"/>
       <w:spacing w:val="-10"/>
@@ -1305,7 +1305,7 @@
     <w:link w:val="SubtitleChar"/>
     <w:uiPriority w:val="11"/>
     <w:qFormat/>
-    <w:rsid w:val="00BA427F"/>
+    <w:rsid w:val="005B3C51"/>
     <w:pPr>
       <w:numPr>
         <w:ilvl w:val="1"/>
@@ -1324,7 +1324,7 @@
     <w:basedOn w:val="DefaultParagraphFont"/>
     <w:link w:val="Subtitle"/>
     <w:uiPriority w:val="11"/>
-    <w:rsid w:val="00BA427F"/>
+    <w:rsid w:val="005B3C51"/>
     <w:rPr>
       <w:rFonts w:asciiTheme="minorHAnsi" w:eastAsiaTheme="majorEastAsia" w:hAnsiTheme="minorHAnsi" w:cstheme="majorBidi"/>
       <w:color w:val="595959" w:themeColor="text1" w:themeTint="A6"/>
@@ -1340,7 +1340,7 @@
     <w:link w:val="QuoteChar"/>
     <w:uiPriority w:val="29"/>
     <w:qFormat/>
-    <w:rsid w:val="00BA427F"/>
+    <w:rsid w:val="005B3C51"/>
     <w:pPr>
       <w:spacing w:before="160"/>
       <w:jc w:val="center"/>
@@ -1356,7 +1356,7 @@
     <w:basedOn w:val="DefaultParagraphFont"/>
     <w:link w:val="Quote"/>
     <w:uiPriority w:val="29"/>
-    <w:rsid w:val="00BA427F"/>
+    <w:rsid w:val="005B3C51"/>
     <w:rPr>
       <w:i/>
       <w:iCs/>
@@ -1368,7 +1368,7 @@
     <w:basedOn w:val="Normal"/>
     <w:uiPriority w:val="34"/>
     <w:qFormat/>
-    <w:rsid w:val="00BA427F"/>
+    <w:rsid w:val="005B3C51"/>
     <w:pPr>
       <w:ind w:left="720"/>
       <w:contextualSpacing/>
@@ -1379,7 +1379,7 @@
     <w:basedOn w:val="DefaultParagraphFont"/>
     <w:uiPriority w:val="21"/>
     <w:qFormat/>
-    <w:rsid w:val="00BA427F"/>
+    <w:rsid w:val="005B3C51"/>
     <w:rPr>
       <w:i/>
       <w:iCs/>
@@ -1393,7 +1393,7 @@
     <w:link w:val="IntenseQuoteChar"/>
     <w:uiPriority w:val="30"/>
     <w:qFormat/>
-    <w:rsid w:val="00BA427F"/>
+    <w:rsid w:val="005B3C51"/>
     <w:pPr>
       <w:pBdr>
         <w:top w:val="single" w:sz="4" w:space="10" w:color="0F4761" w:themeColor="accent1" w:themeShade="BF"/>
@@ -1414,7 +1414,7 @@
     <w:basedOn w:val="DefaultParagraphFont"/>
     <w:link w:val="IntenseQuote"/>
     <w:uiPriority w:val="30"/>
-    <w:rsid w:val="00BA427F"/>
+    <w:rsid w:val="005B3C51"/>
     <w:rPr>
       <w:i/>
       <w:iCs/>
@@ -1426,7 +1426,7 @@
     <w:basedOn w:val="DefaultParagraphFont"/>
     <w:uiPriority w:val="32"/>
     <w:qFormat/>
-    <w:rsid w:val="00BA427F"/>
+    <w:rsid w:val="005B3C51"/>
     <w:rPr>
       <w:b/>
       <w:bCs/>
@@ -1441,7 +1441,7 @@
     <w:link w:val="HeaderChar"/>
     <w:uiPriority w:val="99"/>
     <w:unhideWhenUsed/>
-    <w:rsid w:val="00BA427F"/>
+    <w:rsid w:val="005B3C51"/>
     <w:pPr>
       <w:tabs>
         <w:tab w:val="center" w:pos="4680"/>
@@ -1455,7 +1455,7 @@
     <w:basedOn w:val="DefaultParagraphFont"/>
     <w:link w:val="Header"/>
     <w:uiPriority w:val="99"/>
-    <w:rsid w:val="00BA427F"/>
+    <w:rsid w:val="005B3C51"/>
   </w:style>
   <w:style w:type="paragraph" w:styleId="Footer">
     <w:name w:val="footer"/>
@@ -1463,7 +1463,7 @@
     <w:link w:val="FooterChar"/>
     <w:uiPriority w:val="99"/>
     <w:unhideWhenUsed/>
-    <w:rsid w:val="00BA427F"/>
+    <w:rsid w:val="005B3C51"/>
     <w:pPr>
       <w:tabs>
         <w:tab w:val="center" w:pos="4680"/>
@@ -1477,7 +1477,7 @@
     <w:basedOn w:val="DefaultParagraphFont"/>
     <w:link w:val="Footer"/>
     <w:uiPriority w:val="99"/>
-    <w:rsid w:val="00BA427F"/>
+    <w:rsid w:val="005B3C51"/>
   </w:style>
 </w:styles>
 </file>

</xml_diff>

<commit_message>
fix: remove Word Bank label from BOX definition and example — BOX content must be items-only separated by pipes
</commit_message>
<xml_diff>
--- a/output/uln_document.docx
+++ b/output/uln_document.docx
@@ -20,7 +20,7 @@
           <w:color w:val="auto"/>
           <w:sz w:val="24"/>
         </w:rPr>
-        <w:t>SECTION A: MULTIPLE CHOICE QUESTIONS</w:t>
+        <w:t>SECTION A: GRAMMAR &amp; VOCABULARY</w:t>
       </w:r>
     </w:p>
     <w:p>
@@ -36,7 +36,7 @@
           <w:b/>
           <w:sz w:val="24"/>
         </w:rPr>
-        <w:t>I.  Choose the best answer A, B, C, or D to complete each sentence.</w:t>
+        <w:t>I.  Choose the best option A, B, C, or D to complete each sentence.</w:t>
       </w:r>
     </w:p>
     <w:p>
@@ -50,7 +50,7 @@
         <w:rPr>
           <w:sz w:val="24"/>
         </w:rPr>
-        <w:t>1. She is looking forward to ___________ her old friends at the party.</w:t>
+        <w:t>1. She is looking forward to ___________ her old friends at the annual reunion.</w:t>
       </w:r>
     </w:p>
     <w:p>
@@ -77,7 +77,7 @@
         <w:rPr>
           <w:sz w:val="24"/>
         </w:rPr>
-        <w:t xml:space="preserve"> see</w:t>
+        <w:t>see</w:t>
       </w:r>
       <w:r>
         <w:rPr>
@@ -96,7 +96,7 @@
         <w:rPr>
           <w:sz w:val="24"/>
         </w:rPr>
-        <w:t xml:space="preserve"> seeing</w:t>
+        <w:t>seeing</w:t>
       </w:r>
       <w:r>
         <w:rPr>
@@ -115,7 +115,7 @@
         <w:rPr>
           <w:sz w:val="24"/>
         </w:rPr>
-        <w:t xml:space="preserve"> saw</w:t>
+        <w:t>saw</w:t>
       </w:r>
       <w:r>
         <w:rPr>
@@ -134,7 +134,7 @@
         <w:rPr>
           <w:sz w:val="24"/>
         </w:rPr>
-        <w:t xml:space="preserve"> seen</w:t>
+        <w:t>seen</w:t>
       </w:r>
     </w:p>
     <w:p>
@@ -148,7 +148,7 @@
         <w:rPr>
           <w:sz w:val="24"/>
         </w:rPr>
-        <w:t>2. Nam is the ___________ student in our class.</w:t>
+        <w:t>2. If it ___________ heavily tomorrow, the outdoor festival will be postponed.</w:t>
       </w:r>
     </w:p>
     <w:p>
@@ -175,7 +175,7 @@
         <w:rPr>
           <w:sz w:val="24"/>
         </w:rPr>
-        <w:t xml:space="preserve"> tall</w:t>
+        <w:t>rain</w:t>
       </w:r>
       <w:r>
         <w:rPr>
@@ -194,7 +194,7 @@
         <w:rPr>
           <w:sz w:val="24"/>
         </w:rPr>
-        <w:t xml:space="preserve"> taller</w:t>
+        <w:t>rains</w:t>
       </w:r>
       <w:r>
         <w:rPr>
@@ -213,7 +213,7 @@
         <w:rPr>
           <w:sz w:val="24"/>
         </w:rPr>
-        <w:t xml:space="preserve"> tallest</w:t>
+        <w:t>rained</w:t>
       </w:r>
       <w:r>
         <w:rPr>
@@ -232,7 +232,7 @@
         <w:rPr>
           <w:sz w:val="24"/>
         </w:rPr>
-        <w:t xml:space="preserve"> most tall</w:t>
+        <w:t>raining</w:t>
       </w:r>
     </w:p>
     <w:p>
@@ -272,12 +272,6 @@
       <w:r>
         <w:rPr>
           <w:sz w:val="24"/>
-        </w:rPr>
-        <w:t xml:space="preserve"> </w:t>
-      </w:r>
-      <w:r>
-        <w:rPr>
-          <w:sz w:val="24"/>
           <w:u w:val="single"/>
         </w:rPr>
         <w:t>c</w:t>
@@ -304,12 +298,6 @@
       <w:r>
         <w:rPr>
           <w:sz w:val="24"/>
-        </w:rPr>
-        <w:t xml:space="preserve"> </w:t>
-      </w:r>
-      <w:r>
-        <w:rPr>
-          <w:sz w:val="24"/>
           <w:u w:val="single"/>
         </w:rPr>
         <w:t>c</w:t>
@@ -336,12 +324,6 @@
       <w:r>
         <w:rPr>
           <w:sz w:val="24"/>
-        </w:rPr>
-        <w:t xml:space="preserve"> </w:t>
-      </w:r>
-      <w:r>
-        <w:rPr>
-          <w:sz w:val="24"/>
           <w:u w:val="single"/>
         </w:rPr>
         <w:t>c</w:t>
@@ -368,12 +350,6 @@
       <w:r>
         <w:rPr>
           <w:sz w:val="24"/>
-        </w:rPr>
-        <w:t xml:space="preserve"> </w:t>
-      </w:r>
-      <w:r>
-        <w:rPr>
-          <w:sz w:val="24"/>
           <w:u w:val="single"/>
         </w:rPr>
         <w:t>c</w:t>
@@ -396,7 +372,7 @@
         <w:rPr>
           <w:sz w:val="24"/>
         </w:rPr>
-        <w:t>4. If it ___________ tomorrow, we will cancel the outdoor picnic.</w:t>
+        <w:t>4. My elder brother has been working as a software developer ___________ 2018.</w:t>
       </w:r>
     </w:p>
     <w:p>
@@ -423,7 +399,7 @@
         <w:rPr>
           <w:sz w:val="24"/>
         </w:rPr>
-        <w:t xml:space="preserve"> rain</w:t>
+        <w:t>for</w:t>
       </w:r>
       <w:r>
         <w:rPr>
@@ -442,7 +418,7 @@
         <w:rPr>
           <w:sz w:val="24"/>
         </w:rPr>
-        <w:t xml:space="preserve"> rains</w:t>
+        <w:t>since</w:t>
       </w:r>
       <w:r>
         <w:rPr>
@@ -461,7 +437,7 @@
         <w:rPr>
           <w:sz w:val="24"/>
         </w:rPr>
-        <w:t xml:space="preserve"> rained</w:t>
+        <w:t>in</w:t>
       </w:r>
       <w:r>
         <w:rPr>
@@ -480,7 +456,7 @@
         <w:rPr>
           <w:sz w:val="24"/>
         </w:rPr>
-        <w:t xml:space="preserve"> raining</w:t>
+        <w:t>at</w:t>
       </w:r>
     </w:p>
     <w:p>
@@ -494,7 +470,7 @@
         <w:rPr>
           <w:sz w:val="24"/>
         </w:rPr>
-        <w:t>5. My father has worked in this factory ___________ 2010.</w:t>
+        <w:t>5. Choose the word that has a different primary stress pattern:</w:t>
       </w:r>
     </w:p>
     <w:p>
@@ -521,7 +497,7 @@
         <w:rPr>
           <w:sz w:val="24"/>
         </w:rPr>
-        <w:t xml:space="preserve"> for</w:t>
+        <w:t>teacher</w:t>
       </w:r>
       <w:r>
         <w:rPr>
@@ -540,7 +516,7 @@
         <w:rPr>
           <w:sz w:val="24"/>
         </w:rPr>
-        <w:t xml:space="preserve"> since</w:t>
+        <w:t>doctor</w:t>
       </w:r>
       <w:r>
         <w:rPr>
@@ -559,7 +535,7 @@
         <w:rPr>
           <w:sz w:val="24"/>
         </w:rPr>
-        <w:t xml:space="preserve"> in</w:t>
+        <w:t>student</w:t>
       </w:r>
       <w:r>
         <w:rPr>
@@ -578,31 +554,172 @@
         <w:rPr>
           <w:sz w:val="24"/>
         </w:rPr>
-        <w:t xml:space="preserve"> at</w:t>
-      </w:r>
-    </w:p>
-    <w:p>
-      <w:pPr>
-        <w:spacing w:before="120" w:after="80"/>
-        <w:rPr>
-          <w:sz w:val="24"/>
-        </w:rPr>
-      </w:pPr>
-      <w:r>
-        <w:rPr>
-          <w:sz w:val="24"/>
-        </w:rPr>
-        <w:t>6. The heavy rain prevented us ___________ going out for dinner.</w:t>
-      </w:r>
-    </w:p>
-    <w:p>
-      <w:pPr>
+        <w:t>agree</w:t>
+      </w:r>
+    </w:p>
+    <w:p>
+      <w:pPr>
+        <w:keepNext/>
         <w:tabs>
-          <w:tab w:val="left" w:pos="2551"/>
+          <w:tab w:val="left" w:pos="4137"/>
+          <w:tab w:val="left" w:pos="6057"/>
+        </w:tabs>
+        <w:spacing w:before="80" w:after="0" w:line="480" w:lineRule="auto"/>
+        <w:ind w:left="2217"/>
+        <w:rPr>
+          <w:b/>
+          <w:sz w:val="24"/>
+        </w:rPr>
+      </w:pPr>
+      <w:r>
+        <w:rPr>
+          <w:b/>
+          <w:noProof/>
+          <w:sz w:val="24"/>
+        </w:rPr>
+        <mc:AlternateContent>
+          <mc:Choice Requires="wps">
+            <w:drawing>
+              <wp:anchor distT="0" distB="0" distL="114300" distR="114300" simplePos="0" relativeHeight="251659264" behindDoc="0" locked="0" layoutInCell="1" allowOverlap="1">
+                <wp:simplePos x="0" y="0"/>
+                <wp:positionH relativeFrom="margin">
+                  <wp:posOffset>1331595</wp:posOffset>
+                </wp:positionH>
+                <wp:positionV relativeFrom="paragraph">
+                  <wp:posOffset>-76200</wp:posOffset>
+                </wp:positionV>
+                <wp:extent cx="3276600" cy="355600"/>
+                <wp:effectExtent l="0" t="0" r="19050" b="25400"/>
+                <wp:wrapNone/>
+                <wp:docPr id="743480541" name="Rectangle: Rounded Corners 1"/>
+                <wp:cNvGraphicFramePr/>
+                <a:graphic xmlns:a="http://schemas.openxmlformats.org/drawingml/2006/main">
+                  <a:graphicData uri="http://schemas.microsoft.com/office/word/2010/wordprocessingShape">
+                    <wps:wsp>
+                      <wps:cNvSpPr/>
+                      <wps:spPr>
+                        <a:xfrm>
+                          <a:off x="0" y="0"/>
+                          <a:ext cx="3276600" cy="355600"/>
+                        </a:xfrm>
+                        <a:prstGeom prst="roundRect">
+                          <a:avLst/>
+                        </a:prstGeom>
+                        <a:noFill/>
+                        <a:ln w="12700" cap="flat" cmpd="sng" algn="ctr">
+                          <a:solidFill>
+                            <a:srgbClr val="000000"/>
+                          </a:solidFill>
+                          <a:prstDash val="solid"/>
+                          <a:miter lim="800000"/>
+                        </a:ln>
+                        <a:effectLst/>
+                        <a:extLst>
+                          <a:ext uri="{909E8E84-426E-40DD-AFC4-6F175D3DCCD1}">
+                            <a14:hiddenFill xmlns:a14="http://schemas.microsoft.com/office/drawing/2010/main">
+                              <a:solidFill>
+                                <a:schemeClr val="accent1"/>
+                              </a:solidFill>
+                            </a14:hiddenFill>
+                          </a:ext>
+                        </a:extLst>
+                      </wps:spPr>
+                      <wps:style>
+                        <a:lnRef idx="2">
+                          <a:schemeClr val="accent1">
+                            <a:shade val="15000"/>
+                          </a:schemeClr>
+                        </a:lnRef>
+                        <a:fillRef idx="1">
+                          <a:schemeClr val="accent1"/>
+                        </a:fillRef>
+                        <a:effectRef idx="0">
+                          <a:schemeClr val="accent1"/>
+                        </a:effectRef>
+                        <a:fontRef idx="minor">
+                          <a:schemeClr val="lt1"/>
+                        </a:fontRef>
+                      </wps:style>
+                      <wps:bodyPr rot="0" spcFirstLastPara="0" vertOverflow="overflow" horzOverflow="overflow" vert="horz" wrap="square" lIns="91440" tIns="45720" rIns="91440" bIns="45720" numCol="1" spcCol="0" rtlCol="0" fromWordArt="0" anchor="ctr" anchorCtr="0" forceAA="0" compatLnSpc="1">
+                        <a:prstTxWarp prst="textNoShape">
+                          <a:avLst/>
+                        </a:prstTxWarp>
+                        <a:noAutofit/>
+                      </wps:bodyPr>
+                    </wps:wsp>
+                  </a:graphicData>
+                </a:graphic>
+              </wp:anchor>
+            </w:drawing>
+          </mc:Choice>
+          <mc:Fallback>
+            <w:pict>
+              <v:roundrect w14:anchorId="6238458C" id="Rectangle: Rounded Corners 1" o:spid="_x0000_s1026" style="position:absolute;margin-left:104.85pt;margin-top:-6pt;width:258pt;height:28pt;z-index:251659264;visibility:visible;mso-wrap-style:square;mso-wrap-distance-left:9pt;mso-wrap-distance-top:0;mso-wrap-distance-right:9pt;mso-wrap-distance-bottom:0;mso-position-horizontal:absolute;mso-position-horizontal-relative:margin;mso-position-vertical:absolute;mso-position-vertical-relative:text;v-text-anchor:middle" arcsize="10923f" o:gfxdata="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" filled="f" fillcolor="#156082 [3204]" strokeweight="1pt">
+                <v:stroke joinstyle="miter"/>
+                <w10:wrap anchorx="margin"/>
+              </v:roundrect>
+            </w:pict>
+          </mc:Fallback>
+        </mc:AlternateContent>
+      </w:r>
+      <w:r>
+        <w:rPr>
+          <w:b/>
+          <w:sz w:val="24"/>
+        </w:rPr>
+        <w:t>photosynthesis</w:t>
+      </w:r>
+      <w:r>
+        <w:rPr>
+          <w:sz w:val="24"/>
+        </w:rPr>
+        <w:tab/>
+      </w:r>
+      <w:r>
+        <w:rPr>
+          <w:b/>
+          <w:sz w:val="24"/>
+        </w:rPr>
+        <w:t>chlorophyll</w:t>
+      </w:r>
+      <w:r>
+        <w:rPr>
+          <w:sz w:val="24"/>
+        </w:rPr>
+        <w:tab/>
+      </w:r>
+      <w:r>
+        <w:rPr>
+          <w:b/>
+          <w:sz w:val="24"/>
+        </w:rPr>
+        <w:t>ecosystem</w:t>
+      </w:r>
+    </w:p>
+    <w:p>
+      <w:pPr>
+        <w:tabs>
+          <w:tab w:val="left" w:pos="4137"/>
+          <w:tab w:val="left" w:pos="6057"/>
+        </w:tabs>
+        <w:spacing w:before="120" w:after="80" w:line="480" w:lineRule="auto"/>
+        <w:rPr>
+          <w:sz w:val="24"/>
+        </w:rPr>
+      </w:pPr>
+      <w:r>
+        <w:rPr>
+          <w:sz w:val="24"/>
+        </w:rPr>
+        <w:t>6. Green plants produce oxygen and glucose during the process of ___________.</w:t>
+      </w:r>
+    </w:p>
+    <w:p>
+      <w:pPr>
+        <w:tabs>
           <w:tab w:val="left" w:pos="4819"/>
-          <w:tab w:val="left" w:pos="7087"/>
         </w:tabs>
-        <w:spacing w:before="80" w:after="60"/>
+        <w:spacing w:before="80" w:after="60" w:line="480" w:lineRule="auto"/>
         <w:ind w:left="283"/>
         <w:rPr>
           <w:sz w:val="24"/>
@@ -619,7 +736,7 @@
         <w:rPr>
           <w:sz w:val="24"/>
         </w:rPr>
-        <w:t>from</w:t>
+        <w:t>photosynthesis</w:t>
       </w:r>
       <w:r>
         <w:rPr>
@@ -638,7 +755,32 @@
         <w:rPr>
           <w:sz w:val="24"/>
         </w:rPr>
-        <w:t>of</w:t>
+        <w:t>chlorophyll</w:t>
+      </w:r>
+    </w:p>
+    <w:p>
+      <w:pPr>
+        <w:tabs>
+          <w:tab w:val="left" w:pos="4819"/>
+        </w:tabs>
+        <w:spacing w:before="80" w:after="60" w:line="480" w:lineRule="auto"/>
+        <w:ind w:left="283"/>
+        <w:rPr>
+          <w:sz w:val="24"/>
+        </w:rPr>
+      </w:pPr>
+      <w:r>
+        <w:rPr>
+          <w:b/>
+          <w:sz w:val="24"/>
+        </w:rPr>
+        <w:t xml:space="preserve">C. </w:t>
+      </w:r>
+      <w:r>
+        <w:rPr>
+          <w:sz w:val="24"/>
+        </w:rPr>
+        <w:t>ecosystem</w:t>
       </w:r>
       <w:r>
         <w:rPr>
@@ -651,20 +793,119 @@
           <w:b/>
           <w:sz w:val="24"/>
         </w:rPr>
+        <w:t xml:space="preserve">D. </w:t>
+      </w:r>
+      <w:r>
+        <w:rPr>
+          <w:sz w:val="24"/>
+        </w:rPr>
+        <w:t>respiration</w:t>
+      </w:r>
+    </w:p>
+    <w:p>
+      <w:pPr>
+        <w:spacing w:after="80" w:line="480" w:lineRule="auto"/>
+        <w:ind w:firstLine="425"/>
+        <w:jc w:val="both"/>
+        <w:rPr>
+          <w:sz w:val="24"/>
+        </w:rPr>
+      </w:pPr>
+      <w:r>
+        <w:rPr>
+          <w:sz w:val="24"/>
+        </w:rPr>
+        <w:t>Last summer, Minh visited his grandparents in the countryside. The peaceful atmosphere and fresh air helped him relax after a stressful school year. Every morning, he woke up early to ride his bicycle around the village lake.</w:t>
+      </w:r>
+    </w:p>
+    <w:p>
+      <w:pPr>
+        <w:spacing w:before="120" w:after="80" w:line="480" w:lineRule="auto"/>
+        <w:rPr>
+          <w:sz w:val="24"/>
+        </w:rPr>
+      </w:pPr>
+      <w:r>
+        <w:rPr>
+          <w:sz w:val="24"/>
+        </w:rPr>
+        <w:t>7. Why did Minh enjoy his summer stay in the countryside?</w:t>
+      </w:r>
+    </w:p>
+    <w:p>
+      <w:pPr>
+        <w:spacing w:before="80" w:after="60" w:line="480" w:lineRule="auto"/>
+        <w:ind w:left="283"/>
+        <w:rPr>
+          <w:sz w:val="24"/>
+        </w:rPr>
+      </w:pPr>
+      <w:r>
+        <w:rPr>
+          <w:b/>
+          <w:sz w:val="24"/>
+        </w:rPr>
+        <w:t xml:space="preserve">A. </w:t>
+      </w:r>
+      <w:r>
+        <w:rPr>
+          <w:sz w:val="24"/>
+        </w:rPr>
+        <w:t>Because he liked riding cars</w:t>
+      </w:r>
+    </w:p>
+    <w:p>
+      <w:pPr>
+        <w:spacing w:before="80" w:after="60" w:line="480" w:lineRule="auto"/>
+        <w:ind w:left="283"/>
+        <w:rPr>
+          <w:sz w:val="24"/>
+        </w:rPr>
+      </w:pPr>
+      <w:r>
+        <w:rPr>
+          <w:b/>
+          <w:sz w:val="24"/>
+        </w:rPr>
+        <w:t xml:space="preserve">B. </w:t>
+      </w:r>
+      <w:r>
+        <w:rPr>
+          <w:sz w:val="24"/>
+        </w:rPr>
+        <w:t>Because of the peaceful environment and fresh air</w:t>
+      </w:r>
+    </w:p>
+    <w:p>
+      <w:pPr>
+        <w:spacing w:before="80" w:after="60" w:line="480" w:lineRule="auto"/>
+        <w:ind w:left="283"/>
+        <w:rPr>
+          <w:sz w:val="24"/>
+        </w:rPr>
+      </w:pPr>
+      <w:r>
+        <w:rPr>
+          <w:b/>
+          <w:sz w:val="24"/>
+        </w:rPr>
         <w:t xml:space="preserve">C. </w:t>
       </w:r>
       <w:r>
         <w:rPr>
           <w:sz w:val="24"/>
         </w:rPr>
-        <w:t>in</w:t>
-      </w:r>
-      <w:r>
-        <w:rPr>
-          <w:sz w:val="24"/>
-        </w:rPr>
-        <w:tab/>
-      </w:r>
+        <w:t>Because he wanted to work on a farm</w:t>
+      </w:r>
+    </w:p>
+    <w:p>
+      <w:pPr>
+        <w:spacing w:before="80" w:after="60" w:line="480" w:lineRule="auto"/>
+        <w:ind w:left="283"/>
+        <w:rPr>
+          <w:sz w:val="24"/>
+        </w:rPr>
+      </w:pPr>
       <w:r>
         <w:rPr>
           <w:b/>
@@ -676,203 +917,7 @@
         <w:rPr>
           <w:sz w:val="24"/>
         </w:rPr>
-        <w:t>with</w:t>
-      </w:r>
-    </w:p>
-    <w:p>
-      <w:pPr>
-        <w:spacing w:before="120" w:after="80"/>
-        <w:rPr>
-          <w:sz w:val="24"/>
-        </w:rPr>
-      </w:pPr>
-      <w:r>
-        <w:rPr>
-          <w:sz w:val="24"/>
-        </w:rPr>
-        <w:t>7. You should turn ___________ the lights before leaving the classroom.</w:t>
-      </w:r>
-    </w:p>
-    <w:p>
-      <w:pPr>
-        <w:tabs>
-          <w:tab w:val="left" w:pos="2551"/>
-          <w:tab w:val="left" w:pos="4819"/>
-          <w:tab w:val="left" w:pos="7087"/>
-        </w:tabs>
-        <w:spacing w:before="80" w:after="60"/>
-        <w:ind w:left="283"/>
-        <w:rPr>
-          <w:sz w:val="24"/>
-        </w:rPr>
-      </w:pPr>
-      <w:r>
-        <w:rPr>
-          <w:b/>
-          <w:sz w:val="24"/>
-        </w:rPr>
-        <w:t xml:space="preserve">A. </w:t>
-      </w:r>
-      <w:r>
-        <w:rPr>
-          <w:sz w:val="24"/>
-        </w:rPr>
-        <w:t>on</w:t>
-      </w:r>
-      <w:r>
-        <w:rPr>
-          <w:sz w:val="24"/>
-        </w:rPr>
-        <w:tab/>
-      </w:r>
-      <w:r>
-        <w:rPr>
-          <w:b/>
-          <w:sz w:val="24"/>
-        </w:rPr>
-        <w:t xml:space="preserve">B. </w:t>
-      </w:r>
-      <w:r>
-        <w:rPr>
-          <w:sz w:val="24"/>
-        </w:rPr>
-        <w:t>off</w:t>
-      </w:r>
-      <w:r>
-        <w:rPr>
-          <w:sz w:val="24"/>
-        </w:rPr>
-        <w:tab/>
-      </w:r>
-      <w:r>
-        <w:rPr>
-          <w:b/>
-          <w:sz w:val="24"/>
-        </w:rPr>
-        <w:t xml:space="preserve">C. </w:t>
-      </w:r>
-      <w:r>
-        <w:rPr>
-          <w:sz w:val="24"/>
-        </w:rPr>
-        <w:t>up</w:t>
-      </w:r>
-      <w:r>
-        <w:rPr>
-          <w:sz w:val="24"/>
-        </w:rPr>
-        <w:tab/>
-      </w:r>
-      <w:r>
-        <w:rPr>
-          <w:b/>
-          <w:sz w:val="24"/>
-        </w:rPr>
-        <w:t xml:space="preserve">D. </w:t>
-      </w:r>
-      <w:r>
-        <w:rPr>
-          <w:sz w:val="24"/>
-        </w:rPr>
-        <w:t>down</w:t>
-      </w:r>
-    </w:p>
-    <w:p>
-      <w:pPr>
-        <w:spacing w:before="120" w:after="80"/>
-        <w:rPr>
-          <w:sz w:val="24"/>
-        </w:rPr>
-      </w:pPr>
-      <w:r>
-        <w:rPr>
-          <w:sz w:val="24"/>
-        </w:rPr>
-        <w:t>8. Although he was very tired, ___________ he finished all his homework.</w:t>
-      </w:r>
-    </w:p>
-    <w:p>
-      <w:pPr>
-        <w:tabs>
-          <w:tab w:val="left" w:pos="2551"/>
-          <w:tab w:val="left" w:pos="4819"/>
-          <w:tab w:val="left" w:pos="7087"/>
-        </w:tabs>
-        <w:spacing w:before="80" w:after="60"/>
-        <w:ind w:left="283"/>
-        <w:rPr>
-          <w:sz w:val="24"/>
-        </w:rPr>
-      </w:pPr>
-      <w:r>
-        <w:rPr>
-          <w:b/>
-          <w:sz w:val="24"/>
-        </w:rPr>
-        <w:t xml:space="preserve">A. </w:t>
-      </w:r>
-      <w:r>
-        <w:rPr>
-          <w:sz w:val="24"/>
-        </w:rPr>
-        <w:t xml:space="preserve"> but</w:t>
-      </w:r>
-      <w:r>
-        <w:rPr>
-          <w:sz w:val="24"/>
-        </w:rPr>
-        <w:tab/>
-      </w:r>
-      <w:r>
-        <w:rPr>
-          <w:b/>
-          <w:sz w:val="24"/>
-        </w:rPr>
-        <w:t xml:space="preserve">B. </w:t>
-      </w:r>
-      <w:r>
-        <w:rPr>
-          <w:sz w:val="24"/>
-        </w:rPr>
-        <w:t xml:space="preserve"> however</w:t>
-      </w:r>
-      <w:r>
-        <w:rPr>
-          <w:sz w:val="24"/>
-        </w:rPr>
-        <w:tab/>
-      </w:r>
-      <w:r>
-        <w:rPr>
-          <w:b/>
-          <w:sz w:val="24"/>
-        </w:rPr>
-        <w:t xml:space="preserve">C. </w:t>
-      </w:r>
-      <w:r>
-        <w:rPr>
-          <w:sz w:val="24"/>
-        </w:rPr>
-        <w:t xml:space="preserve"> he</w:t>
-      </w:r>
-      <w:r>
-        <w:rPr>
-          <w:sz w:val="24"/>
-        </w:rPr>
-        <w:tab/>
-      </w:r>
-      <w:r>
-        <w:rPr>
-          <w:b/>
-          <w:sz w:val="24"/>
-        </w:rPr>
-        <w:t xml:space="preserve">D. </w:t>
-      </w:r>
-      <w:r>
-        <w:rPr>
-          <w:sz w:val="24"/>
-        </w:rPr>
-        <w:t xml:space="preserve"> so</w:t>
+        <w:t>Because his school was located there</w:t>
       </w:r>
     </w:p>
     <w:p>
@@ -886,36 +931,34 @@
         <w:rPr>
           <w:sz w:val="24"/>
         </w:rPr>
-        <w:t>9. What does the road sign say?</w:t>
+        <w:t>8. What does this traffic sign indicate?</w:t>
       </w:r>
     </w:p>
     <w:p>
       <w:pPr>
         <w:spacing w:before="60" w:after="60" w:line="240" w:lineRule="auto"/>
-        <w:ind w:left="283"/>
-        <w:rPr>
-          <w:sz w:val="24"/>
-        </w:rPr>
-      </w:pPr>
-      <w:r>
-        <w:rPr>
-          <w:b/>
+        <w:rPr>
+          <w:sz w:val="24"/>
+        </w:rPr>
+      </w:pPr>
+      <w:r>
+        <w:rPr>
           <w:noProof/>
           <w:sz w:val="24"/>
         </w:rPr>
         <w:drawing>
-          <wp:anchor distT="0" distB="0" distL="114300" distR="114300" simplePos="0" relativeHeight="251658240" behindDoc="0" locked="0" layoutInCell="1" allowOverlap="1">
+          <wp:anchor distT="0" distB="0" distL="114300" distR="114300" simplePos="0" relativeHeight="251660288" behindDoc="0" locked="0" layoutInCell="1" allowOverlap="1">
             <wp:simplePos x="0" y="0"/>
             <wp:positionH relativeFrom="margin">
-              <wp:posOffset>4815205</wp:posOffset>
+              <wp:posOffset>4679950</wp:posOffset>
             </wp:positionH>
             <wp:positionV relativeFrom="paragraph">
               <wp:posOffset>0</wp:posOffset>
             </wp:positionV>
-            <wp:extent cx="1125000" cy="900000"/>
-            <wp:effectExtent l="0" t="0" r="0" b="0"/>
+            <wp:extent cx="1260000" cy="1008000"/>
+            <wp:effectExtent l="0" t="0" r="0" b="1905"/>
             <wp:wrapNone/>
-            <wp:docPr id="726451525" name="Picture 1"/>
+            <wp:docPr id="2135633920" name="Picture 2"/>
             <wp:cNvGraphicFramePr>
               <a:graphicFrameLocks xmlns:a="http://schemas.openxmlformats.org/drawingml/2006/main"/>
             </wp:cNvGraphicFramePr>
@@ -923,7 +966,7 @@
               <a:graphicData uri="http://schemas.openxmlformats.org/drawingml/2006/picture">
                 <pic:pic xmlns:pic="http://schemas.openxmlformats.org/drawingml/2006/picture">
                   <pic:nvPicPr>
-                    <pic:cNvPr id="726451525" name=""/>
+                    <pic:cNvPr id="2135633920" name=""/>
                     <pic:cNvPicPr/>
                   </pic:nvPicPr>
                   <pic:blipFill>
@@ -941,7 +984,7 @@
                   <pic:spPr>
                     <a:xfrm>
                       <a:off x="0" y="0"/>
-                      <a:ext cx="1125000" cy="900000"/>
+                      <a:ext cx="1260000" cy="1008000"/>
                     </a:xfrm>
                     <a:prstGeom prst="rect">
                       <a:avLst/>
@@ -961,104 +1004,172 @@
       </w:r>
       <w:r>
         <w:rPr>
-          <w:b/>
-          <w:sz w:val="24"/>
-        </w:rPr>
-        <w:t xml:space="preserve">A. </w:t>
-      </w:r>
-      <w:r>
-        <w:rPr>
-          <w:sz w:val="24"/>
-        </w:rPr>
-        <w:t xml:space="preserve"> Maximum 40 vehicles are allowed on this road.</w:t>
+          <w:sz w:val="24"/>
+        </w:rPr>
+        <w:t>Maximum speed allowed is 40 km/h.</w:t>
       </w:r>
     </w:p>
     <w:p>
       <w:pPr>
         <w:spacing w:before="60" w:after="60" w:line="240" w:lineRule="auto"/>
-        <w:ind w:left="283"/>
-        <w:rPr>
-          <w:sz w:val="24"/>
-        </w:rPr>
-      </w:pPr>
-      <w:r>
-        <w:rPr>
-          <w:b/>
-          <w:sz w:val="24"/>
-        </w:rPr>
-        <w:t xml:space="preserve">B. </w:t>
-      </w:r>
-      <w:r>
-        <w:rPr>
-          <w:sz w:val="24"/>
-        </w:rPr>
-        <w:t xml:space="preserve"> You shouldn't exceed this maximum speed.</w:t>
+        <w:rPr>
+          <w:sz w:val="24"/>
+        </w:rPr>
+      </w:pPr>
+      <w:r>
+        <w:rPr>
+          <w:sz w:val="24"/>
+        </w:rPr>
+        <w:t>You must drive faster than 40 km/h.</w:t>
       </w:r>
     </w:p>
     <w:p>
       <w:pPr>
         <w:spacing w:before="60" w:after="60" w:line="240" w:lineRule="auto"/>
-        <w:ind w:left="283"/>
-        <w:rPr>
-          <w:sz w:val="24"/>
-        </w:rPr>
-      </w:pPr>
-      <w:r>
-        <w:rPr>
-          <w:b/>
-          <w:sz w:val="24"/>
-        </w:rPr>
-        <w:t xml:space="preserve">C. </w:t>
-      </w:r>
-      <w:r>
-        <w:rPr>
-          <w:sz w:val="24"/>
-        </w:rPr>
-        <w:t xml:space="preserve"> Minimum 40 vehicles are allowed on this road.</w:t>
+        <w:rPr>
+          <w:sz w:val="24"/>
+        </w:rPr>
+      </w:pPr>
+      <w:r>
+        <w:rPr>
+          <w:sz w:val="24"/>
+        </w:rPr>
+        <w:t>Vehicles over 40 tons are forbidden.</w:t>
       </w:r>
     </w:p>
     <w:p>
       <w:pPr>
         <w:spacing w:before="60" w:after="60" w:line="240" w:lineRule="auto"/>
-        <w:ind w:left="283"/>
-        <w:rPr>
-          <w:sz w:val="24"/>
-        </w:rPr>
-      </w:pPr>
-      <w:r>
-        <w:rPr>
-          <w:b/>
-          <w:sz w:val="24"/>
-        </w:rPr>
-        <w:t xml:space="preserve">D. </w:t>
-      </w:r>
-      <w:r>
-        <w:rPr>
-          <w:sz w:val="24"/>
-        </w:rPr>
-        <w:t xml:space="preserve"> You shouldn't move below this speed.</w:t>
+        <w:rPr>
+          <w:sz w:val="24"/>
+        </w:rPr>
+      </w:pPr>
+      <w:r>
+        <w:rPr>
+          <w:sz w:val="24"/>
+        </w:rPr>
+        <w:t>Parking is allowed for 40 minutes only.</w:t>
       </w:r>
     </w:p>
     <w:p>
       <w:pPr>
         <w:spacing w:before="120" w:after="80" w:line="240" w:lineRule="auto"/>
         <w:rPr>
-          <w:sz w:val="24"/>
-        </w:rPr>
-      </w:pPr>
-      <w:r>
-        <w:rPr>
-          <w:sz w:val="24"/>
-        </w:rPr>
-        <w:t>10. Choose the word that has a different primary stress pattern:</w:t>
+          <w:b/>
+          <w:sz w:val="24"/>
+        </w:rPr>
+      </w:pPr>
+      <w:r>
+        <w:rPr>
+          <w:b/>
+          <w:sz w:val="24"/>
+        </w:rPr>
+        <w:lastRenderedPageBreak/>
+        <w:t>II. ERROR CORRECTION</w:t>
+      </w:r>
+    </w:p>
+    <w:p>
+      <w:pPr>
+        <w:spacing w:before="120" w:after="80" w:line="240" w:lineRule="auto"/>
+        <w:rPr>
+          <w:b/>
+          <w:sz w:val="24"/>
+        </w:rPr>
+      </w:pPr>
+      <w:r>
+        <w:rPr>
+          <w:b/>
+          <w:sz w:val="24"/>
+        </w:rPr>
+        <w:t>Identify the error in the sentence and write the correct word in the answer column.</w:t>
       </w:r>
     </w:p>
     <w:p>
       <w:pPr>
         <w:tabs>
-          <w:tab w:val="left" w:pos="2551"/>
-          <w:tab w:val="left" w:pos="4819"/>
-          <w:tab w:val="left" w:pos="7087"/>
+          <w:tab w:val="right" w:leader="heavy" w:pos="9354"/>
+        </w:tabs>
+        <w:spacing w:before="60" w:after="60" w:line="240" w:lineRule="auto"/>
+        <w:rPr>
+          <w:sz w:val="24"/>
+        </w:rPr>
+      </w:pPr>
+      <w:r>
+        <w:rPr>
+          <w:sz w:val="24"/>
+        </w:rPr>
+        <w:t xml:space="preserve">9. Nam is my </w:t>
+      </w:r>
+      <w:r>
+        <w:rPr>
+          <w:sz w:val="24"/>
+          <w:u w:val="single"/>
+        </w:rPr>
+        <w:t>classmates</w:t>
+      </w:r>
+      <w:r>
+        <w:rPr>
+          <w:sz w:val="24"/>
+        </w:rPr>
+        <w:t>. He watches TV every night.</w:t>
+      </w:r>
+      <w:r>
+        <w:rPr>
+          <w:sz w:val="24"/>
+        </w:rPr>
+        <w:tab/>
+      </w:r>
+    </w:p>
+    <w:p>
+      <w:pPr>
+        <w:spacing w:before="120" w:after="80" w:line="240" w:lineRule="auto"/>
+        <w:rPr>
+          <w:b/>
+          <w:sz w:val="24"/>
+        </w:rPr>
+      </w:pPr>
+      <w:r>
+        <w:rPr>
+          <w:b/>
+          <w:sz w:val="24"/>
+        </w:rPr>
+        <w:t>III. SENTENCE TRANSFORMATION</w:t>
+      </w:r>
+    </w:p>
+    <w:p>
+      <w:pPr>
+        <w:spacing w:before="120" w:after="80" w:line="240" w:lineRule="auto"/>
+        <w:rPr>
+          <w:b/>
+          <w:sz w:val="24"/>
+        </w:rPr>
+      </w:pPr>
+      <w:r>
+        <w:rPr>
+          <w:b/>
+          <w:sz w:val="24"/>
+        </w:rPr>
+        <w:t>Complete the second sentence so that it has the same meaning as the first.</w:t>
+      </w:r>
+    </w:p>
+    <w:p>
+      <w:pPr>
+        <w:spacing w:before="120" w:after="80" w:line="240" w:lineRule="auto"/>
+        <w:rPr>
+          <w:sz w:val="24"/>
+        </w:rPr>
+      </w:pPr>
+      <w:r>
+        <w:rPr>
+          <w:sz w:val="24"/>
+        </w:rPr>
+        <w:t>10. What is your favourite hobby?</w:t>
+      </w:r>
+    </w:p>
+    <w:p>
+      <w:pPr>
+        <w:tabs>
+          <w:tab w:val="right" w:leader="heavy" w:pos="9354"/>
         </w:tabs>
         <w:spacing w:before="80" w:after="60" w:line="240" w:lineRule="auto"/>
         <w:ind w:left="283"/>
@@ -1068,73 +1179,23 @@
       </w:pPr>
       <w:r>
         <w:rPr>
-          <w:b/>
-          <w:sz w:val="24"/>
-        </w:rPr>
-        <w:t xml:space="preserve">A. </w:t>
-      </w:r>
-      <w:r>
-        <w:rPr>
-          <w:sz w:val="24"/>
-        </w:rPr>
-        <w:t xml:space="preserve"> teacher</w:t>
+          <w:rFonts w:hint="eastAsia"/>
+          <w:sz w:val="24"/>
+        </w:rPr>
+        <w:t>→</w:t>
+      </w:r>
+      <w:r>
+        <w:rPr>
+          <w:rFonts w:hint="eastAsia"/>
+          <w:sz w:val="24"/>
+        </w:rPr>
+        <w:t xml:space="preserve"> What hobby</w:t>
       </w:r>
       <w:r>
         <w:rPr>
           <w:sz w:val="24"/>
         </w:rPr>
         <w:tab/>
-      </w:r>
-      <w:r>
-        <w:rPr>
-          <w:b/>
-          <w:sz w:val="24"/>
-        </w:rPr>
-        <w:t xml:space="preserve">B. </w:t>
-      </w:r>
-      <w:r>
-        <w:rPr>
-          <w:sz w:val="24"/>
-        </w:rPr>
-        <w:t xml:space="preserve"> doctor</w:t>
-      </w:r>
-      <w:r>
-        <w:rPr>
-          <w:sz w:val="24"/>
-        </w:rPr>
-        <w:tab/>
-      </w:r>
-      <w:r>
-        <w:rPr>
-          <w:b/>
-          <w:sz w:val="24"/>
-        </w:rPr>
-        <w:t xml:space="preserve">C. </w:t>
-      </w:r>
-      <w:r>
-        <w:rPr>
-          <w:sz w:val="24"/>
-        </w:rPr>
-        <w:t xml:space="preserve"> student</w:t>
-      </w:r>
-      <w:r>
-        <w:rPr>
-          <w:sz w:val="24"/>
-        </w:rPr>
-        <w:tab/>
-      </w:r>
-      <w:r>
-        <w:rPr>
-          <w:b/>
-          <w:sz w:val="24"/>
-        </w:rPr>
-        <w:t xml:space="preserve">D. </w:t>
-      </w:r>
-      <w:r>
-        <w:rPr>
-          <w:sz w:val="24"/>
-        </w:rPr>
-        <w:t xml:space="preserve"> agree</w:t>
       </w:r>
     </w:p>
     <w:p>
@@ -1147,7 +1208,12 @@
       </w:pPr>
     </w:p>
     <w:sectPr>
-      <w:footerReference w:type="default" r:id="rId7"/>
+      <w:headerReference w:type="even" r:id="rId7"/>
+      <w:headerReference w:type="default" r:id="rId8"/>
+      <w:footerReference w:type="even" r:id="rId9"/>
+      <w:footerReference w:type="default" r:id="rId10"/>
+      <w:headerReference w:type="first" r:id="rId11"/>
+      <w:footerReference w:type="first" r:id="rId12"/>
       <w:pgSz w:w="11907" w:h="16840" w:code="9"/>
       <w:pgMar w:top="1134" w:right="850" w:bottom="1134" w:left="1701" w:header="720" w:footer="720" w:gutter="0"/>
       <w:cols w:space="720"/>
@@ -1183,6 +1249,16 @@
 </file>
 
 <file path=word/footer1.xml><?xml version="1.0" encoding="utf-8"?>
+<w:ftr xmlns:wpc="http://schemas.microsoft.com/office/word/2010/wordprocessingCanvas" xmlns:cx="http://schemas.microsoft.com/office/drawing/2014/chartex" xmlns:cx1="http://schemas.microsoft.com/office/drawing/2015/9/8/chartex" xmlns:cx2="http://schemas.microsoft.com/office/drawing/2015/10/21/chartex" xmlns:cx3="http://schemas.microsoft.com/office/drawing/2016/5/9/chartex" xmlns:cx4="http://schemas.microsoft.com/office/drawing/2016/5/10/chartex" xmlns:cx5="http://schemas.microsoft.com/office/drawing/2016/5/11/chartex" xmlns:cx6="http://schemas.microsoft.com/office/drawing/2016/5/12/chartex" xmlns:cx7="http://schemas.microsoft.com/office/drawing/2016/5/13/chartex" xmlns:cx8="http://schemas.microsoft.com/office/drawing/2016/5/14/chartex" xmlns:mc="http://schemas.openxmlformats.org/markup-compatibility/2006" xmlns:aink="http://schemas.microsoft.com/office/drawing/2016/ink" xmlns:am3d="http://schemas.microsoft.com/office/drawing/2017/model3d" xmlns:o="urn:schemas-microsoft-com:office:office" xmlns:oel="http://schemas.microsoft.com/office/2019/extlst" xmlns:r="http://schemas.openxmlformats.org/officeDocument/2006/relationships" xmlns:m="http://schemas.openxmlformats.org/officeDocument/2006/math" xmlns:v="urn:schemas-microsoft-com:vml" xmlns:wp14="http://schemas.microsoft.com/office/word/2010/wordprocessingDrawing" xmlns:wp="http://schemas.openxmlformats.org/drawingml/2006/wordprocessingDrawing" xmlns:w10="urn:schemas-microsoft-com:office:word" xmlns:w="http://schemas.openxmlformats.org/wordprocessingml/2006/main" xmlns:w14="http://schemas.microsoft.com/office/word/2010/wordml" xmlns:w15="http://schemas.microsoft.com/office/word/2012/wordml" xmlns:w16cei="http://schemas.microsoft.com/office/word/2026/wordml/cei" xmlns:w16cex="http://schemas.microsoft.com/office/word/2018/wordml/cex" xmlns:w16cid="http://schemas.microsoft.com/office/word/2016/wordml/cid" xmlns:w16="http://schemas.microsoft.com/office/word/2018/wordml" xmlns:w16du="http://schemas.microsoft.com/office/word/2023/wordml/word16du" xmlns:w16sdtdh="http://schemas.microsoft.com/office/word/2020/wordml/sdtdatahash" xmlns:w16sdtfl="http://schemas.microsoft.com/office/word/2024/wordml/sdtformatlock" xmlns:w16se="http://schemas.microsoft.com/office/word/2015/wordml/symex" xmlns:wpg="http://schemas.microsoft.com/office/word/2010/wordprocessingGroup" xmlns:wpi="http://schemas.microsoft.com/office/word/2010/wordprocessingInk" xmlns:wne="http://schemas.microsoft.com/office/word/2006/wordml" xmlns:wps="http://schemas.microsoft.com/office/word/2010/wordprocessingShape" mc:Ignorable="w14 w15 w16se w16cid w16 w16cex w16sdtdh w16sdtfl w16du wp14">
+  <w:p>
+    <w:pPr>
+      <w:pStyle w:val="Footer"/>
+    </w:pPr>
+  </w:p>
+</w:ftr>
+</file>
+
+<file path=word/footer2.xml><?xml version="1.0" encoding="utf-8"?>
 <w:ftr xmlns:wpc="http://schemas.microsoft.com/office/word/2010/wordprocessingCanvas" xmlns:cx="http://schemas.microsoft.com/office/drawing/2014/chartex" xmlns:cx1="http://schemas.microsoft.com/office/drawing/2015/9/8/chartex" xmlns:cx2="http://schemas.microsoft.com/office/drawing/2015/10/21/chartex" xmlns:cx3="http://schemas.microsoft.com/office/drawing/2016/5/9/chartex" xmlns:cx4="http://schemas.microsoft.com/office/drawing/2016/5/10/chartex" xmlns:cx5="http://schemas.microsoft.com/office/drawing/2016/5/11/chartex" xmlns:cx6="http://schemas.microsoft.com/office/drawing/2016/5/12/chartex" xmlns:cx7="http://schemas.microsoft.com/office/drawing/2016/5/13/chartex" xmlns:cx8="http://schemas.microsoft.com/office/drawing/2016/5/14/chartex" xmlns:mc="http://schemas.openxmlformats.org/markup-compatibility/2006" xmlns:aink="http://schemas.microsoft.com/office/drawing/2016/ink" xmlns:am3d="http://schemas.microsoft.com/office/drawing/2017/model3d" xmlns:o="urn:schemas-microsoft-com:office:office" xmlns:oel="http://schemas.microsoft.com/office/2019/extlst" xmlns:r="http://schemas.openxmlformats.org/officeDocument/2006/relationships" xmlns:m="http://schemas.openxmlformats.org/officeDocument/2006/math" xmlns:v="urn:schemas-microsoft-com:vml" xmlns:wp14="http://schemas.microsoft.com/office/word/2010/wordprocessingDrawing" xmlns:wp="http://schemas.openxmlformats.org/drawingml/2006/wordprocessingDrawing" xmlns:w10="urn:schemas-microsoft-com:office:word" xmlns:w="http://schemas.openxmlformats.org/wordprocessingml/2006/main" xmlns:w14="http://schemas.microsoft.com/office/word/2010/wordml" xmlns:w15="http://schemas.microsoft.com/office/word/2012/wordml" xmlns:w16cei="http://schemas.microsoft.com/office/word/2026/wordml/cei" xmlns:w16cex="http://schemas.microsoft.com/office/word/2018/wordml/cex" xmlns:w16cid="http://schemas.microsoft.com/office/word/2016/wordml/cid" xmlns:w16="http://schemas.microsoft.com/office/word/2018/wordml" xmlns:w16du="http://schemas.microsoft.com/office/word/2023/wordml/word16du" xmlns:w16sdtdh="http://schemas.microsoft.com/office/word/2020/wordml/sdtdatahash" xmlns:w16sdtfl="http://schemas.microsoft.com/office/word/2024/wordml/sdtformatlock" xmlns:w16se="http://schemas.microsoft.com/office/word/2015/wordml/symex" xmlns:wpg="http://schemas.microsoft.com/office/word/2010/wordprocessingGroup" xmlns:wpi="http://schemas.microsoft.com/office/word/2010/wordprocessingInk" xmlns:wne="http://schemas.microsoft.com/office/word/2006/wordml" xmlns:wps="http://schemas.microsoft.com/office/word/2010/wordprocessingShape" mc:Ignorable="w14 w15 w16se w16cid w16 w16cex w16sdtdh w16sdtfl w16du wp14">
   <w:p>
     <w:pPr>
@@ -1260,6 +1336,16 @@
 </w:ftr>
 </file>
 
+<file path=word/footer3.xml><?xml version="1.0" encoding="utf-8"?>
+<w:ftr xmlns:wpc="http://schemas.microsoft.com/office/word/2010/wordprocessingCanvas" xmlns:cx="http://schemas.microsoft.com/office/drawing/2014/chartex" xmlns:cx1="http://schemas.microsoft.com/office/drawing/2015/9/8/chartex" xmlns:cx2="http://schemas.microsoft.com/office/drawing/2015/10/21/chartex" xmlns:cx3="http://schemas.microsoft.com/office/drawing/2016/5/9/chartex" xmlns:cx4="http://schemas.microsoft.com/office/drawing/2016/5/10/chartex" xmlns:cx5="http://schemas.microsoft.com/office/drawing/2016/5/11/chartex" xmlns:cx6="http://schemas.microsoft.com/office/drawing/2016/5/12/chartex" xmlns:cx7="http://schemas.microsoft.com/office/drawing/2016/5/13/chartex" xmlns:cx8="http://schemas.microsoft.com/office/drawing/2016/5/14/chartex" xmlns:mc="http://schemas.openxmlformats.org/markup-compatibility/2006" xmlns:aink="http://schemas.microsoft.com/office/drawing/2016/ink" xmlns:am3d="http://schemas.microsoft.com/office/drawing/2017/model3d" xmlns:o="urn:schemas-microsoft-com:office:office" xmlns:oel="http://schemas.microsoft.com/office/2019/extlst" xmlns:r="http://schemas.openxmlformats.org/officeDocument/2006/relationships" xmlns:m="http://schemas.openxmlformats.org/officeDocument/2006/math" xmlns:v="urn:schemas-microsoft-com:vml" xmlns:wp14="http://schemas.microsoft.com/office/word/2010/wordprocessingDrawing" xmlns:wp="http://schemas.openxmlformats.org/drawingml/2006/wordprocessingDrawing" xmlns:w10="urn:schemas-microsoft-com:office:word" xmlns:w="http://schemas.openxmlformats.org/wordprocessingml/2006/main" xmlns:w14="http://schemas.microsoft.com/office/word/2010/wordml" xmlns:w15="http://schemas.microsoft.com/office/word/2012/wordml" xmlns:w16cei="http://schemas.microsoft.com/office/word/2026/wordml/cei" xmlns:w16cex="http://schemas.microsoft.com/office/word/2018/wordml/cex" xmlns:w16cid="http://schemas.microsoft.com/office/word/2016/wordml/cid" xmlns:w16="http://schemas.microsoft.com/office/word/2018/wordml" xmlns:w16du="http://schemas.microsoft.com/office/word/2023/wordml/word16du" xmlns:w16sdtdh="http://schemas.microsoft.com/office/word/2020/wordml/sdtdatahash" xmlns:w16sdtfl="http://schemas.microsoft.com/office/word/2024/wordml/sdtformatlock" xmlns:w16se="http://schemas.microsoft.com/office/word/2015/wordml/symex" xmlns:wpg="http://schemas.microsoft.com/office/word/2010/wordprocessingGroup" xmlns:wpi="http://schemas.microsoft.com/office/word/2010/wordprocessingInk" xmlns:wne="http://schemas.microsoft.com/office/word/2006/wordml" xmlns:wps="http://schemas.microsoft.com/office/word/2010/wordprocessingShape" mc:Ignorable="w14 w15 w16se w16cid w16 w16cex w16sdtdh w16sdtfl w16du wp14">
+  <w:p>
+    <w:pPr>
+      <w:pStyle w:val="Footer"/>
+    </w:pPr>
+  </w:p>
+</w:ftr>
+</file>
+
 <file path=word/footnotes.xml><?xml version="1.0" encoding="utf-8"?>
 <w:footnotes xmlns:wpc="http://schemas.microsoft.com/office/word/2010/wordprocessingCanvas" xmlns:cx="http://schemas.microsoft.com/office/drawing/2014/chartex" xmlns:cx1="http://schemas.microsoft.com/office/drawing/2015/9/8/chartex" xmlns:cx2="http://schemas.microsoft.com/office/drawing/2015/10/21/chartex" xmlns:cx3="http://schemas.microsoft.com/office/drawing/2016/5/9/chartex" xmlns:cx4="http://schemas.microsoft.com/office/drawing/2016/5/10/chartex" xmlns:cx5="http://schemas.microsoft.com/office/drawing/2016/5/11/chartex" xmlns:cx6="http://schemas.microsoft.com/office/drawing/2016/5/12/chartex" xmlns:cx7="http://schemas.microsoft.com/office/drawing/2016/5/13/chartex" xmlns:cx8="http://schemas.microsoft.com/office/drawing/2016/5/14/chartex" xmlns:mc="http://schemas.openxmlformats.org/markup-compatibility/2006" xmlns:aink="http://schemas.microsoft.com/office/drawing/2016/ink" xmlns:am3d="http://schemas.microsoft.com/office/drawing/2017/model3d" xmlns:o="urn:schemas-microsoft-com:office:office" xmlns:oel="http://schemas.microsoft.com/office/2019/extlst" xmlns:r="http://schemas.openxmlformats.org/officeDocument/2006/relationships" xmlns:m="http://schemas.openxmlformats.org/officeDocument/2006/math" xmlns:v="urn:schemas-microsoft-com:vml" xmlns:wp14="http://schemas.microsoft.com/office/word/2010/wordprocessingDrawing" xmlns:wp="http://schemas.openxmlformats.org/drawingml/2006/wordprocessingDrawing" xmlns:w10="urn:schemas-microsoft-com:office:word" xmlns:w="http://schemas.openxmlformats.org/wordprocessingml/2006/main" xmlns:w14="http://schemas.microsoft.com/office/word/2010/wordml" xmlns:w15="http://schemas.microsoft.com/office/word/2012/wordml" xmlns:w16cei="http://schemas.microsoft.com/office/word/2026/wordml/cei" xmlns:w16cex="http://schemas.microsoft.com/office/word/2018/wordml/cex" xmlns:w16cid="http://schemas.microsoft.com/office/word/2016/wordml/cid" xmlns:w16="http://schemas.microsoft.com/office/word/2018/wordml" xmlns:w16du="http://schemas.microsoft.com/office/word/2023/wordml/word16du" xmlns:w16sdtdh="http://schemas.microsoft.com/office/word/2020/wordml/sdtdatahash" xmlns:w16sdtfl="http://schemas.microsoft.com/office/word/2024/wordml/sdtformatlock" xmlns:w16se="http://schemas.microsoft.com/office/word/2015/wordml/symex" xmlns:wpg="http://schemas.microsoft.com/office/word/2010/wordprocessingGroup" xmlns:wpi="http://schemas.microsoft.com/office/word/2010/wordprocessingInk" xmlns:wne="http://schemas.microsoft.com/office/word/2006/wordml" xmlns:wps="http://schemas.microsoft.com/office/word/2010/wordprocessingShape" mc:Ignorable="w14 w15 w16se w16cid w16 w16cex w16sdtdh w16sdtfl w16du wp14">
   <w:footnote w:type="separator" w:id="-1">
@@ -1283,6 +1369,36 @@
     </w:p>
   </w:footnote>
 </w:footnotes>
+</file>
+
+<file path=word/header1.xml><?xml version="1.0" encoding="utf-8"?>
+<w:hdr xmlns:wpc="http://schemas.microsoft.com/office/word/2010/wordprocessingCanvas" xmlns:cx="http://schemas.microsoft.com/office/drawing/2014/chartex" xmlns:cx1="http://schemas.microsoft.com/office/drawing/2015/9/8/chartex" xmlns:cx2="http://schemas.microsoft.com/office/drawing/2015/10/21/chartex" xmlns:cx3="http://schemas.microsoft.com/office/drawing/2016/5/9/chartex" xmlns:cx4="http://schemas.microsoft.com/office/drawing/2016/5/10/chartex" xmlns:cx5="http://schemas.microsoft.com/office/drawing/2016/5/11/chartex" xmlns:cx6="http://schemas.microsoft.com/office/drawing/2016/5/12/chartex" xmlns:cx7="http://schemas.microsoft.com/office/drawing/2016/5/13/chartex" xmlns:cx8="http://schemas.microsoft.com/office/drawing/2016/5/14/chartex" xmlns:mc="http://schemas.openxmlformats.org/markup-compatibility/2006" xmlns:aink="http://schemas.microsoft.com/office/drawing/2016/ink" xmlns:am3d="http://schemas.microsoft.com/office/drawing/2017/model3d" xmlns:o="urn:schemas-microsoft-com:office:office" xmlns:oel="http://schemas.microsoft.com/office/2019/extlst" xmlns:r="http://schemas.openxmlformats.org/officeDocument/2006/relationships" xmlns:m="http://schemas.openxmlformats.org/officeDocument/2006/math" xmlns:v="urn:schemas-microsoft-com:vml" xmlns:wp14="http://schemas.microsoft.com/office/word/2010/wordprocessingDrawing" xmlns:wp="http://schemas.openxmlformats.org/drawingml/2006/wordprocessingDrawing" xmlns:w10="urn:schemas-microsoft-com:office:word" xmlns:w="http://schemas.openxmlformats.org/wordprocessingml/2006/main" xmlns:w14="http://schemas.microsoft.com/office/word/2010/wordml" xmlns:w15="http://schemas.microsoft.com/office/word/2012/wordml" xmlns:w16cei="http://schemas.microsoft.com/office/word/2026/wordml/cei" xmlns:w16cex="http://schemas.microsoft.com/office/word/2018/wordml/cex" xmlns:w16cid="http://schemas.microsoft.com/office/word/2016/wordml/cid" xmlns:w16="http://schemas.microsoft.com/office/word/2018/wordml" xmlns:w16du="http://schemas.microsoft.com/office/word/2023/wordml/word16du" xmlns:w16sdtdh="http://schemas.microsoft.com/office/word/2020/wordml/sdtdatahash" xmlns:w16sdtfl="http://schemas.microsoft.com/office/word/2024/wordml/sdtformatlock" xmlns:w16se="http://schemas.microsoft.com/office/word/2015/wordml/symex" xmlns:wpg="http://schemas.microsoft.com/office/word/2010/wordprocessingGroup" xmlns:wpi="http://schemas.microsoft.com/office/word/2010/wordprocessingInk" xmlns:wne="http://schemas.microsoft.com/office/word/2006/wordml" xmlns:wps="http://schemas.microsoft.com/office/word/2010/wordprocessingShape" mc:Ignorable="w14 w15 w16se w16cid w16 w16cex w16sdtdh w16sdtfl w16du wp14">
+  <w:p>
+    <w:pPr>
+      <w:pStyle w:val="Header"/>
+    </w:pPr>
+  </w:p>
+</w:hdr>
+</file>
+
+<file path=word/header2.xml><?xml version="1.0" encoding="utf-8"?>
+<w:hdr xmlns:wpc="http://schemas.microsoft.com/office/word/2010/wordprocessingCanvas" xmlns:cx="http://schemas.microsoft.com/office/drawing/2014/chartex" xmlns:cx1="http://schemas.microsoft.com/office/drawing/2015/9/8/chartex" xmlns:cx2="http://schemas.microsoft.com/office/drawing/2015/10/21/chartex" xmlns:cx3="http://schemas.microsoft.com/office/drawing/2016/5/9/chartex" xmlns:cx4="http://schemas.microsoft.com/office/drawing/2016/5/10/chartex" xmlns:cx5="http://schemas.microsoft.com/office/drawing/2016/5/11/chartex" xmlns:cx6="http://schemas.microsoft.com/office/drawing/2016/5/12/chartex" xmlns:cx7="http://schemas.microsoft.com/office/drawing/2016/5/13/chartex" xmlns:cx8="http://schemas.microsoft.com/office/drawing/2016/5/14/chartex" xmlns:mc="http://schemas.openxmlformats.org/markup-compatibility/2006" xmlns:aink="http://schemas.microsoft.com/office/drawing/2016/ink" xmlns:am3d="http://schemas.microsoft.com/office/drawing/2017/model3d" xmlns:o="urn:schemas-microsoft-com:office:office" xmlns:oel="http://schemas.microsoft.com/office/2019/extlst" xmlns:r="http://schemas.openxmlformats.org/officeDocument/2006/relationships" xmlns:m="http://schemas.openxmlformats.org/officeDocument/2006/math" xmlns:v="urn:schemas-microsoft-com:vml" xmlns:wp14="http://schemas.microsoft.com/office/word/2010/wordprocessingDrawing" xmlns:wp="http://schemas.openxmlformats.org/drawingml/2006/wordprocessingDrawing" xmlns:w10="urn:schemas-microsoft-com:office:word" xmlns:w="http://schemas.openxmlformats.org/wordprocessingml/2006/main" xmlns:w14="http://schemas.microsoft.com/office/word/2010/wordml" xmlns:w15="http://schemas.microsoft.com/office/word/2012/wordml" xmlns:w16cei="http://schemas.microsoft.com/office/word/2026/wordml/cei" xmlns:w16cex="http://schemas.microsoft.com/office/word/2018/wordml/cex" xmlns:w16cid="http://schemas.microsoft.com/office/word/2016/wordml/cid" xmlns:w16="http://schemas.microsoft.com/office/word/2018/wordml" xmlns:w16du="http://schemas.microsoft.com/office/word/2023/wordml/word16du" xmlns:w16sdtdh="http://schemas.microsoft.com/office/word/2020/wordml/sdtdatahash" xmlns:w16sdtfl="http://schemas.microsoft.com/office/word/2024/wordml/sdtformatlock" xmlns:w16se="http://schemas.microsoft.com/office/word/2015/wordml/symex" xmlns:wpg="http://schemas.microsoft.com/office/word/2010/wordprocessingGroup" xmlns:wpi="http://schemas.microsoft.com/office/word/2010/wordprocessingInk" xmlns:wne="http://schemas.microsoft.com/office/word/2006/wordml" xmlns:wps="http://schemas.microsoft.com/office/word/2010/wordprocessingShape" mc:Ignorable="w14 w15 w16se w16cid w16 w16cex w16sdtdh w16sdtfl w16du wp14">
+  <w:p>
+    <w:pPr>
+      <w:pStyle w:val="Header"/>
+    </w:pPr>
+  </w:p>
+</w:hdr>
+</file>
+
+<file path=word/header3.xml><?xml version="1.0" encoding="utf-8"?>
+<w:hdr xmlns:wpc="http://schemas.microsoft.com/office/word/2010/wordprocessingCanvas" xmlns:cx="http://schemas.microsoft.com/office/drawing/2014/chartex" xmlns:cx1="http://schemas.microsoft.com/office/drawing/2015/9/8/chartex" xmlns:cx2="http://schemas.microsoft.com/office/drawing/2015/10/21/chartex" xmlns:cx3="http://schemas.microsoft.com/office/drawing/2016/5/9/chartex" xmlns:cx4="http://schemas.microsoft.com/office/drawing/2016/5/10/chartex" xmlns:cx5="http://schemas.microsoft.com/office/drawing/2016/5/11/chartex" xmlns:cx6="http://schemas.microsoft.com/office/drawing/2016/5/12/chartex" xmlns:cx7="http://schemas.microsoft.com/office/drawing/2016/5/13/chartex" xmlns:cx8="http://schemas.microsoft.com/office/drawing/2016/5/14/chartex" xmlns:mc="http://schemas.openxmlformats.org/markup-compatibility/2006" xmlns:aink="http://schemas.microsoft.com/office/drawing/2016/ink" xmlns:am3d="http://schemas.microsoft.com/office/drawing/2017/model3d" xmlns:o="urn:schemas-microsoft-com:office:office" xmlns:oel="http://schemas.microsoft.com/office/2019/extlst" xmlns:r="http://schemas.openxmlformats.org/officeDocument/2006/relationships" xmlns:m="http://schemas.openxmlformats.org/officeDocument/2006/math" xmlns:v="urn:schemas-microsoft-com:vml" xmlns:wp14="http://schemas.microsoft.com/office/word/2010/wordprocessingDrawing" xmlns:wp="http://schemas.openxmlformats.org/drawingml/2006/wordprocessingDrawing" xmlns:w10="urn:schemas-microsoft-com:office:word" xmlns:w="http://schemas.openxmlformats.org/wordprocessingml/2006/main" xmlns:w14="http://schemas.microsoft.com/office/word/2010/wordml" xmlns:w15="http://schemas.microsoft.com/office/word/2012/wordml" xmlns:w16cei="http://schemas.microsoft.com/office/word/2026/wordml/cei" xmlns:w16cex="http://schemas.microsoft.com/office/word/2018/wordml/cex" xmlns:w16cid="http://schemas.microsoft.com/office/word/2016/wordml/cid" xmlns:w16="http://schemas.microsoft.com/office/word/2018/wordml" xmlns:w16du="http://schemas.microsoft.com/office/word/2023/wordml/word16du" xmlns:w16sdtdh="http://schemas.microsoft.com/office/word/2020/wordml/sdtdatahash" xmlns:w16sdtfl="http://schemas.microsoft.com/office/word/2024/wordml/sdtformatlock" xmlns:w16se="http://schemas.microsoft.com/office/word/2015/wordml/symex" xmlns:wpg="http://schemas.microsoft.com/office/word/2010/wordprocessingGroup" xmlns:wpi="http://schemas.microsoft.com/office/word/2010/wordprocessingInk" xmlns:wne="http://schemas.microsoft.com/office/word/2006/wordml" xmlns:wps="http://schemas.microsoft.com/office/word/2010/wordprocessingShape" mc:Ignorable="w14 w15 w16se w16cid w16 w16cex w16sdtdh w16sdtfl w16du wp14">
+  <w:p>
+    <w:pPr>
+      <w:pStyle w:val="Header"/>
+    </w:pPr>
+  </w:p>
+</w:hdr>
 </file>
 
 <file path=word/styles.xml><?xml version="1.0" encoding="utf-8"?>
@@ -1693,7 +1809,7 @@
     <w:link w:val="Heading1Char"/>
     <w:uiPriority w:val="9"/>
     <w:qFormat/>
-    <w:rsid w:val="00791D3E"/>
+    <w:rsid w:val="00C665D2"/>
     <w:pPr>
       <w:keepNext/>
       <w:keepLines/>
@@ -1716,7 +1832,7 @@
     <w:semiHidden/>
     <w:unhideWhenUsed/>
     <w:qFormat/>
-    <w:rsid w:val="00791D3E"/>
+    <w:rsid w:val="00C665D2"/>
     <w:pPr>
       <w:keepNext/>
       <w:keepLines/>
@@ -1739,7 +1855,7 @@
     <w:semiHidden/>
     <w:unhideWhenUsed/>
     <w:qFormat/>
-    <w:rsid w:val="00791D3E"/>
+    <w:rsid w:val="00C665D2"/>
     <w:pPr>
       <w:keepNext/>
       <w:keepLines/>
@@ -1762,7 +1878,7 @@
     <w:semiHidden/>
     <w:unhideWhenUsed/>
     <w:qFormat/>
-    <w:rsid w:val="00791D3E"/>
+    <w:rsid w:val="00C665D2"/>
     <w:pPr>
       <w:keepNext/>
       <w:keepLines/>
@@ -1785,7 +1901,7 @@
     <w:semiHidden/>
     <w:unhideWhenUsed/>
     <w:qFormat/>
-    <w:rsid w:val="00791D3E"/>
+    <w:rsid w:val="00C665D2"/>
     <w:pPr>
       <w:keepNext/>
       <w:keepLines/>
@@ -1806,7 +1922,7 @@
     <w:semiHidden/>
     <w:unhideWhenUsed/>
     <w:qFormat/>
-    <w:rsid w:val="00791D3E"/>
+    <w:rsid w:val="00C665D2"/>
     <w:pPr>
       <w:keepNext/>
       <w:keepLines/>
@@ -1829,7 +1945,7 @@
     <w:semiHidden/>
     <w:unhideWhenUsed/>
     <w:qFormat/>
-    <w:rsid w:val="00791D3E"/>
+    <w:rsid w:val="00C665D2"/>
     <w:pPr>
       <w:keepNext/>
       <w:keepLines/>
@@ -1850,7 +1966,7 @@
     <w:semiHidden/>
     <w:unhideWhenUsed/>
     <w:qFormat/>
-    <w:rsid w:val="00791D3E"/>
+    <w:rsid w:val="00C665D2"/>
     <w:pPr>
       <w:keepNext/>
       <w:keepLines/>
@@ -1873,7 +1989,7 @@
     <w:semiHidden/>
     <w:unhideWhenUsed/>
     <w:qFormat/>
-    <w:rsid w:val="00791D3E"/>
+    <w:rsid w:val="00C665D2"/>
     <w:pPr>
       <w:keepNext/>
       <w:keepLines/>
@@ -1917,7 +2033,7 @@
     <w:basedOn w:val="DefaultParagraphFont"/>
     <w:link w:val="Heading1"/>
     <w:uiPriority w:val="9"/>
-    <w:rsid w:val="00791D3E"/>
+    <w:rsid w:val="00C665D2"/>
     <w:rPr>
       <w:rFonts w:asciiTheme="majorHAnsi" w:eastAsiaTheme="majorEastAsia" w:hAnsiTheme="majorHAnsi" w:cstheme="majorBidi"/>
       <w:color w:val="0F4761" w:themeColor="accent1" w:themeShade="BF"/>
@@ -1931,7 +2047,7 @@
     <w:link w:val="Heading2"/>
     <w:uiPriority w:val="9"/>
     <w:semiHidden/>
-    <w:rsid w:val="00791D3E"/>
+    <w:rsid w:val="00C665D2"/>
     <w:rPr>
       <w:rFonts w:asciiTheme="majorHAnsi" w:eastAsiaTheme="majorEastAsia" w:hAnsiTheme="majorHAnsi" w:cstheme="majorBidi"/>
       <w:color w:val="0F4761" w:themeColor="accent1" w:themeShade="BF"/>
@@ -1945,7 +2061,7 @@
     <w:link w:val="Heading3"/>
     <w:uiPriority w:val="9"/>
     <w:semiHidden/>
-    <w:rsid w:val="00791D3E"/>
+    <w:rsid w:val="00C665D2"/>
     <w:rPr>
       <w:rFonts w:asciiTheme="minorHAnsi" w:eastAsiaTheme="majorEastAsia" w:hAnsiTheme="minorHAnsi" w:cstheme="majorBidi"/>
       <w:color w:val="0F4761" w:themeColor="accent1" w:themeShade="BF"/>
@@ -1959,7 +2075,7 @@
     <w:link w:val="Heading4"/>
     <w:uiPriority w:val="9"/>
     <w:semiHidden/>
-    <w:rsid w:val="00791D3E"/>
+    <w:rsid w:val="00C665D2"/>
     <w:rPr>
       <w:rFonts w:asciiTheme="minorHAnsi" w:eastAsiaTheme="majorEastAsia" w:hAnsiTheme="minorHAnsi" w:cstheme="majorBidi"/>
       <w:i/>
@@ -1973,7 +2089,7 @@
     <w:link w:val="Heading5"/>
     <w:uiPriority w:val="9"/>
     <w:semiHidden/>
-    <w:rsid w:val="00791D3E"/>
+    <w:rsid w:val="00C665D2"/>
     <w:rPr>
       <w:rFonts w:asciiTheme="minorHAnsi" w:eastAsiaTheme="majorEastAsia" w:hAnsiTheme="minorHAnsi" w:cstheme="majorBidi"/>
       <w:color w:val="0F4761" w:themeColor="accent1" w:themeShade="BF"/>
@@ -1985,7 +2101,7 @@
     <w:link w:val="Heading6"/>
     <w:uiPriority w:val="9"/>
     <w:semiHidden/>
-    <w:rsid w:val="00791D3E"/>
+    <w:rsid w:val="00C665D2"/>
     <w:rPr>
       <w:rFonts w:asciiTheme="minorHAnsi" w:eastAsiaTheme="majorEastAsia" w:hAnsiTheme="minorHAnsi" w:cstheme="majorBidi"/>
       <w:i/>
@@ -1999,7 +2115,7 @@
     <w:link w:val="Heading7"/>
     <w:uiPriority w:val="9"/>
     <w:semiHidden/>
-    <w:rsid w:val="00791D3E"/>
+    <w:rsid w:val="00C665D2"/>
     <w:rPr>
       <w:rFonts w:asciiTheme="minorHAnsi" w:eastAsiaTheme="majorEastAsia" w:hAnsiTheme="minorHAnsi" w:cstheme="majorBidi"/>
       <w:color w:val="595959" w:themeColor="text1" w:themeTint="A6"/>
@@ -2011,7 +2127,7 @@
     <w:link w:val="Heading8"/>
     <w:uiPriority w:val="9"/>
     <w:semiHidden/>
-    <w:rsid w:val="00791D3E"/>
+    <w:rsid w:val="00C665D2"/>
     <w:rPr>
       <w:rFonts w:asciiTheme="minorHAnsi" w:eastAsiaTheme="majorEastAsia" w:hAnsiTheme="minorHAnsi" w:cstheme="majorBidi"/>
       <w:i/>
@@ -2025,7 +2141,7 @@
     <w:link w:val="Heading9"/>
     <w:uiPriority w:val="9"/>
     <w:semiHidden/>
-    <w:rsid w:val="00791D3E"/>
+    <w:rsid w:val="00C665D2"/>
     <w:rPr>
       <w:rFonts w:asciiTheme="minorHAnsi" w:eastAsiaTheme="majorEastAsia" w:hAnsiTheme="minorHAnsi" w:cstheme="majorBidi"/>
       <w:color w:val="272727" w:themeColor="text1" w:themeTint="D8"/>
@@ -2038,7 +2154,7 @@
     <w:link w:val="TitleChar"/>
     <w:uiPriority w:val="10"/>
     <w:qFormat/>
-    <w:rsid w:val="00791D3E"/>
+    <w:rsid w:val="00C665D2"/>
     <w:pPr>
       <w:spacing w:after="80" w:line="240" w:lineRule="auto"/>
       <w:contextualSpacing/>
@@ -2056,7 +2172,7 @@
     <w:basedOn w:val="DefaultParagraphFont"/>
     <w:link w:val="Title"/>
     <w:uiPriority w:val="10"/>
-    <w:rsid w:val="00791D3E"/>
+    <w:rsid w:val="00C665D2"/>
     <w:rPr>
       <w:rFonts w:asciiTheme="majorHAnsi" w:eastAsiaTheme="majorEastAsia" w:hAnsiTheme="majorHAnsi" w:cstheme="majorBidi"/>
       <w:spacing w:val="-10"/>
@@ -2072,7 +2188,7 @@
     <w:link w:val="SubtitleChar"/>
     <w:uiPriority w:val="11"/>
     <w:qFormat/>
-    <w:rsid w:val="00791D3E"/>
+    <w:rsid w:val="00C665D2"/>
     <w:pPr>
       <w:numPr>
         <w:ilvl w:val="1"/>
@@ -2091,7 +2207,7 @@
     <w:basedOn w:val="DefaultParagraphFont"/>
     <w:link w:val="Subtitle"/>
     <w:uiPriority w:val="11"/>
-    <w:rsid w:val="00791D3E"/>
+    <w:rsid w:val="00C665D2"/>
     <w:rPr>
       <w:rFonts w:asciiTheme="minorHAnsi" w:eastAsiaTheme="majorEastAsia" w:hAnsiTheme="minorHAnsi" w:cstheme="majorBidi"/>
       <w:color w:val="595959" w:themeColor="text1" w:themeTint="A6"/>
@@ -2107,7 +2223,7 @@
     <w:link w:val="QuoteChar"/>
     <w:uiPriority w:val="29"/>
     <w:qFormat/>
-    <w:rsid w:val="00791D3E"/>
+    <w:rsid w:val="00C665D2"/>
     <w:pPr>
       <w:spacing w:before="160"/>
       <w:jc w:val="center"/>
@@ -2123,7 +2239,7 @@
     <w:basedOn w:val="DefaultParagraphFont"/>
     <w:link w:val="Quote"/>
     <w:uiPriority w:val="29"/>
-    <w:rsid w:val="00791D3E"/>
+    <w:rsid w:val="00C665D2"/>
     <w:rPr>
       <w:i/>
       <w:iCs/>
@@ -2135,7 +2251,7 @@
     <w:basedOn w:val="Normal"/>
     <w:uiPriority w:val="34"/>
     <w:qFormat/>
-    <w:rsid w:val="00791D3E"/>
+    <w:rsid w:val="00C665D2"/>
     <w:pPr>
       <w:ind w:left="720"/>
       <w:contextualSpacing/>
@@ -2146,7 +2262,7 @@
     <w:basedOn w:val="DefaultParagraphFont"/>
     <w:uiPriority w:val="21"/>
     <w:qFormat/>
-    <w:rsid w:val="00791D3E"/>
+    <w:rsid w:val="00C665D2"/>
     <w:rPr>
       <w:i/>
       <w:iCs/>
@@ -2160,7 +2276,7 @@
     <w:link w:val="IntenseQuoteChar"/>
     <w:uiPriority w:val="30"/>
     <w:qFormat/>
-    <w:rsid w:val="00791D3E"/>
+    <w:rsid w:val="00C665D2"/>
     <w:pPr>
       <w:pBdr>
         <w:top w:val="single" w:sz="4" w:space="10" w:color="0F4761" w:themeColor="accent1" w:themeShade="BF"/>
@@ -2181,7 +2297,7 @@
     <w:basedOn w:val="DefaultParagraphFont"/>
     <w:link w:val="IntenseQuote"/>
     <w:uiPriority w:val="30"/>
-    <w:rsid w:val="00791D3E"/>
+    <w:rsid w:val="00C665D2"/>
     <w:rPr>
       <w:i/>
       <w:iCs/>
@@ -2193,7 +2309,7 @@
     <w:basedOn w:val="DefaultParagraphFont"/>
     <w:uiPriority w:val="32"/>
     <w:qFormat/>
-    <w:rsid w:val="00791D3E"/>
+    <w:rsid w:val="00C665D2"/>
     <w:rPr>
       <w:b/>
       <w:bCs/>
@@ -2208,7 +2324,7 @@
     <w:link w:val="HeaderChar"/>
     <w:uiPriority w:val="99"/>
     <w:unhideWhenUsed/>
-    <w:rsid w:val="00791D3E"/>
+    <w:rsid w:val="00C665D2"/>
     <w:pPr>
       <w:tabs>
         <w:tab w:val="center" w:pos="4680"/>
@@ -2222,7 +2338,7 @@
     <w:basedOn w:val="DefaultParagraphFont"/>
     <w:link w:val="Header"/>
     <w:uiPriority w:val="99"/>
-    <w:rsid w:val="00791D3E"/>
+    <w:rsid w:val="00C665D2"/>
   </w:style>
   <w:style w:type="paragraph" w:styleId="Footer">
     <w:name w:val="footer"/>
@@ -2230,7 +2346,7 @@
     <w:link w:val="FooterChar"/>
     <w:uiPriority w:val="99"/>
     <w:unhideWhenUsed/>
-    <w:rsid w:val="00791D3E"/>
+    <w:rsid w:val="00C665D2"/>
     <w:pPr>
       <w:tabs>
         <w:tab w:val="center" w:pos="4680"/>
@@ -2244,7 +2360,7 @@
     <w:basedOn w:val="DefaultParagraphFont"/>
     <w:link w:val="Footer"/>
     <w:uiPriority w:val="99"/>
-    <w:rsid w:val="00791D3E"/>
+    <w:rsid w:val="00C665D2"/>
   </w:style>
 </w:styles>
 </file>

</xml_diff>

<commit_message>
feat: implement auto-numbering system with [NUM] container tag and #N placeholders
</commit_message>
<xml_diff>
--- a/output/uln_document.docx
+++ b/output/uln_document.docx
@@ -56,9 +56,7 @@
     <w:p>
       <w:pPr>
         <w:tabs>
-          <w:tab w:val="left" w:pos="2551"/>
           <w:tab w:val="left" w:pos="4819"/>
-          <w:tab w:val="left" w:pos="7087"/>
         </w:tabs>
         <w:spacing w:before="80" w:after="60"/>
         <w:ind w:left="283"/>
@@ -77,7 +75,7 @@
         <w:rPr>
           <w:sz w:val="24"/>
         </w:rPr>
-        <w:t>see</w:t>
+        <w:t>seeasdfasdfsd</w:t>
       </w:r>
       <w:r>
         <w:rPr>
@@ -98,12 +96,18 @@
         </w:rPr>
         <w:t>seeing</w:t>
       </w:r>
-      <w:r>
-        <w:rPr>
-          <w:sz w:val="24"/>
-        </w:rPr>
-        <w:tab/>
-      </w:r>
+    </w:p>
+    <w:p>
+      <w:pPr>
+        <w:tabs>
+          <w:tab w:val="left" w:pos="4819"/>
+        </w:tabs>
+        <w:spacing w:before="80" w:after="60"/>
+        <w:ind w:left="283"/>
+        <w:rPr>
+          <w:sz w:val="24"/>
+        </w:rPr>
+      </w:pPr>
       <w:r>
         <w:rPr>
           <w:b/>
@@ -115,7 +119,7 @@
         <w:rPr>
           <w:sz w:val="24"/>
         </w:rPr>
-        <w:t>saw</w:t>
+        <w:t>sawasdfasdfasdfasdfasdfasdfsdf</w:t>
       </w:r>
       <w:r>
         <w:rPr>
@@ -591,7 +595,7 @@
                 <wp:extent cx="3276600" cy="355600"/>
                 <wp:effectExtent l="0" t="0" r="19050" b="25400"/>
                 <wp:wrapNone/>
-                <wp:docPr id="743480541" name="Rectangle: Rounded Corners 1"/>
+                <wp:docPr id="1207538531" name="Rectangle: Rounded Corners 1"/>
                 <wp:cNvGraphicFramePr/>
                 <a:graphic xmlns:a="http://schemas.openxmlformats.org/drawingml/2006/main">
                   <a:graphicData uri="http://schemas.microsoft.com/office/word/2010/wordprocessingShape">
@@ -654,7 +658,7 @@
           </mc:Choice>
           <mc:Fallback>
             <w:pict>
-              <v:roundrect w14:anchorId="6238458C" id="Rectangle: Rounded Corners 1" o:spid="_x0000_s1026" style="position:absolute;margin-left:104.85pt;margin-top:-6pt;width:258pt;height:28pt;z-index:251659264;visibility:visible;mso-wrap-style:square;mso-wrap-distance-left:9pt;mso-wrap-distance-top:0;mso-wrap-distance-right:9pt;mso-wrap-distance-bottom:0;mso-position-horizontal:absolute;mso-position-horizontal-relative:margin;mso-position-vertical:absolute;mso-position-vertical-relative:text;v-text-anchor:middle" arcsize="10923f" o:gfxdata="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" filled="f" fillcolor="#156082 [3204]" strokeweight="1pt">
+              <v:roundrect w14:anchorId="6DEDD072" id="Rectangle: Rounded Corners 1" o:spid="_x0000_s1026" style="position:absolute;margin-left:104.85pt;margin-top:-6pt;width:258pt;height:28pt;z-index:251659264;visibility:visible;mso-wrap-style:square;mso-wrap-distance-left:9pt;mso-wrap-distance-top:0;mso-wrap-distance-right:9pt;mso-wrap-distance-bottom:0;mso-position-horizontal:absolute;mso-position-horizontal-relative:margin;mso-position-vertical:absolute;mso-position-vertical-relative:text;v-text-anchor:middle" arcsize="10923f" o:gfxdata="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" filled="f" fillcolor="#156082 [3204]" strokeweight="1pt">
                 <v:stroke joinstyle="miter"/>
                 <w10:wrap anchorx="margin"/>
               </v:roundrect>
@@ -958,7 +962,7 @@
             <wp:extent cx="1260000" cy="1008000"/>
             <wp:effectExtent l="0" t="0" r="0" b="1905"/>
             <wp:wrapNone/>
-            <wp:docPr id="2135633920" name="Picture 2"/>
+            <wp:docPr id="1451323389" name="Picture 2"/>
             <wp:cNvGraphicFramePr>
               <a:graphicFrameLocks xmlns:a="http://schemas.openxmlformats.org/drawingml/2006/main"/>
             </wp:cNvGraphicFramePr>
@@ -966,7 +970,7 @@
               <a:graphicData uri="http://schemas.openxmlformats.org/drawingml/2006/picture">
                 <pic:pic xmlns:pic="http://schemas.openxmlformats.org/drawingml/2006/picture">
                   <pic:nvPicPr>
-                    <pic:cNvPr id="2135633920" name=""/>
+                    <pic:cNvPr id="1451323389" name=""/>
                     <pic:cNvPicPr/>
                   </pic:nvPicPr>
                   <pic:blipFill>
@@ -1048,6 +1052,7 @@
         <w:rPr>
           <w:sz w:val="24"/>
         </w:rPr>
+        <w:lastRenderedPageBreak/>
         <w:t>Parking is allowed for 40 minutes only.</w:t>
       </w:r>
     </w:p>
@@ -1064,7 +1069,6 @@
           <w:b/>
           <w:sz w:val="24"/>
         </w:rPr>
-        <w:lastRenderedPageBreak/>
         <w:t>II. ERROR CORRECTION</w:t>
       </w:r>
     </w:p>
@@ -1809,7 +1813,7 @@
     <w:link w:val="Heading1Char"/>
     <w:uiPriority w:val="9"/>
     <w:qFormat/>
-    <w:rsid w:val="00C665D2"/>
+    <w:rsid w:val="003E65F2"/>
     <w:pPr>
       <w:keepNext/>
       <w:keepLines/>
@@ -1832,7 +1836,7 @@
     <w:semiHidden/>
     <w:unhideWhenUsed/>
     <w:qFormat/>
-    <w:rsid w:val="00C665D2"/>
+    <w:rsid w:val="003E65F2"/>
     <w:pPr>
       <w:keepNext/>
       <w:keepLines/>
@@ -1855,7 +1859,7 @@
     <w:semiHidden/>
     <w:unhideWhenUsed/>
     <w:qFormat/>
-    <w:rsid w:val="00C665D2"/>
+    <w:rsid w:val="003E65F2"/>
     <w:pPr>
       <w:keepNext/>
       <w:keepLines/>
@@ -1878,7 +1882,7 @@
     <w:semiHidden/>
     <w:unhideWhenUsed/>
     <w:qFormat/>
-    <w:rsid w:val="00C665D2"/>
+    <w:rsid w:val="003E65F2"/>
     <w:pPr>
       <w:keepNext/>
       <w:keepLines/>
@@ -1901,7 +1905,7 @@
     <w:semiHidden/>
     <w:unhideWhenUsed/>
     <w:qFormat/>
-    <w:rsid w:val="00C665D2"/>
+    <w:rsid w:val="003E65F2"/>
     <w:pPr>
       <w:keepNext/>
       <w:keepLines/>
@@ -1922,7 +1926,7 @@
     <w:semiHidden/>
     <w:unhideWhenUsed/>
     <w:qFormat/>
-    <w:rsid w:val="00C665D2"/>
+    <w:rsid w:val="003E65F2"/>
     <w:pPr>
       <w:keepNext/>
       <w:keepLines/>
@@ -1945,7 +1949,7 @@
     <w:semiHidden/>
     <w:unhideWhenUsed/>
     <w:qFormat/>
-    <w:rsid w:val="00C665D2"/>
+    <w:rsid w:val="003E65F2"/>
     <w:pPr>
       <w:keepNext/>
       <w:keepLines/>
@@ -1966,7 +1970,7 @@
     <w:semiHidden/>
     <w:unhideWhenUsed/>
     <w:qFormat/>
-    <w:rsid w:val="00C665D2"/>
+    <w:rsid w:val="003E65F2"/>
     <w:pPr>
       <w:keepNext/>
       <w:keepLines/>
@@ -1989,7 +1993,7 @@
     <w:semiHidden/>
     <w:unhideWhenUsed/>
     <w:qFormat/>
-    <w:rsid w:val="00C665D2"/>
+    <w:rsid w:val="003E65F2"/>
     <w:pPr>
       <w:keepNext/>
       <w:keepLines/>
@@ -2033,7 +2037,7 @@
     <w:basedOn w:val="DefaultParagraphFont"/>
     <w:link w:val="Heading1"/>
     <w:uiPriority w:val="9"/>
-    <w:rsid w:val="00C665D2"/>
+    <w:rsid w:val="003E65F2"/>
     <w:rPr>
       <w:rFonts w:asciiTheme="majorHAnsi" w:eastAsiaTheme="majorEastAsia" w:hAnsiTheme="majorHAnsi" w:cstheme="majorBidi"/>
       <w:color w:val="0F4761" w:themeColor="accent1" w:themeShade="BF"/>
@@ -2047,7 +2051,7 @@
     <w:link w:val="Heading2"/>
     <w:uiPriority w:val="9"/>
     <w:semiHidden/>
-    <w:rsid w:val="00C665D2"/>
+    <w:rsid w:val="003E65F2"/>
     <w:rPr>
       <w:rFonts w:asciiTheme="majorHAnsi" w:eastAsiaTheme="majorEastAsia" w:hAnsiTheme="majorHAnsi" w:cstheme="majorBidi"/>
       <w:color w:val="0F4761" w:themeColor="accent1" w:themeShade="BF"/>
@@ -2061,7 +2065,7 @@
     <w:link w:val="Heading3"/>
     <w:uiPriority w:val="9"/>
     <w:semiHidden/>
-    <w:rsid w:val="00C665D2"/>
+    <w:rsid w:val="003E65F2"/>
     <w:rPr>
       <w:rFonts w:asciiTheme="minorHAnsi" w:eastAsiaTheme="majorEastAsia" w:hAnsiTheme="minorHAnsi" w:cstheme="majorBidi"/>
       <w:color w:val="0F4761" w:themeColor="accent1" w:themeShade="BF"/>
@@ -2075,7 +2079,7 @@
     <w:link w:val="Heading4"/>
     <w:uiPriority w:val="9"/>
     <w:semiHidden/>
-    <w:rsid w:val="00C665D2"/>
+    <w:rsid w:val="003E65F2"/>
     <w:rPr>
       <w:rFonts w:asciiTheme="minorHAnsi" w:eastAsiaTheme="majorEastAsia" w:hAnsiTheme="minorHAnsi" w:cstheme="majorBidi"/>
       <w:i/>
@@ -2089,7 +2093,7 @@
     <w:link w:val="Heading5"/>
     <w:uiPriority w:val="9"/>
     <w:semiHidden/>
-    <w:rsid w:val="00C665D2"/>
+    <w:rsid w:val="003E65F2"/>
     <w:rPr>
       <w:rFonts w:asciiTheme="minorHAnsi" w:eastAsiaTheme="majorEastAsia" w:hAnsiTheme="minorHAnsi" w:cstheme="majorBidi"/>
       <w:color w:val="0F4761" w:themeColor="accent1" w:themeShade="BF"/>
@@ -2101,7 +2105,7 @@
     <w:link w:val="Heading6"/>
     <w:uiPriority w:val="9"/>
     <w:semiHidden/>
-    <w:rsid w:val="00C665D2"/>
+    <w:rsid w:val="003E65F2"/>
     <w:rPr>
       <w:rFonts w:asciiTheme="minorHAnsi" w:eastAsiaTheme="majorEastAsia" w:hAnsiTheme="minorHAnsi" w:cstheme="majorBidi"/>
       <w:i/>
@@ -2115,7 +2119,7 @@
     <w:link w:val="Heading7"/>
     <w:uiPriority w:val="9"/>
     <w:semiHidden/>
-    <w:rsid w:val="00C665D2"/>
+    <w:rsid w:val="003E65F2"/>
     <w:rPr>
       <w:rFonts w:asciiTheme="minorHAnsi" w:eastAsiaTheme="majorEastAsia" w:hAnsiTheme="minorHAnsi" w:cstheme="majorBidi"/>
       <w:color w:val="595959" w:themeColor="text1" w:themeTint="A6"/>
@@ -2127,7 +2131,7 @@
     <w:link w:val="Heading8"/>
     <w:uiPriority w:val="9"/>
     <w:semiHidden/>
-    <w:rsid w:val="00C665D2"/>
+    <w:rsid w:val="003E65F2"/>
     <w:rPr>
       <w:rFonts w:asciiTheme="minorHAnsi" w:eastAsiaTheme="majorEastAsia" w:hAnsiTheme="minorHAnsi" w:cstheme="majorBidi"/>
       <w:i/>
@@ -2141,7 +2145,7 @@
     <w:link w:val="Heading9"/>
     <w:uiPriority w:val="9"/>
     <w:semiHidden/>
-    <w:rsid w:val="00C665D2"/>
+    <w:rsid w:val="003E65F2"/>
     <w:rPr>
       <w:rFonts w:asciiTheme="minorHAnsi" w:eastAsiaTheme="majorEastAsia" w:hAnsiTheme="minorHAnsi" w:cstheme="majorBidi"/>
       <w:color w:val="272727" w:themeColor="text1" w:themeTint="D8"/>
@@ -2154,7 +2158,7 @@
     <w:link w:val="TitleChar"/>
     <w:uiPriority w:val="10"/>
     <w:qFormat/>
-    <w:rsid w:val="00C665D2"/>
+    <w:rsid w:val="003E65F2"/>
     <w:pPr>
       <w:spacing w:after="80" w:line="240" w:lineRule="auto"/>
       <w:contextualSpacing/>
@@ -2172,7 +2176,7 @@
     <w:basedOn w:val="DefaultParagraphFont"/>
     <w:link w:val="Title"/>
     <w:uiPriority w:val="10"/>
-    <w:rsid w:val="00C665D2"/>
+    <w:rsid w:val="003E65F2"/>
     <w:rPr>
       <w:rFonts w:asciiTheme="majorHAnsi" w:eastAsiaTheme="majorEastAsia" w:hAnsiTheme="majorHAnsi" w:cstheme="majorBidi"/>
       <w:spacing w:val="-10"/>
@@ -2188,7 +2192,7 @@
     <w:link w:val="SubtitleChar"/>
     <w:uiPriority w:val="11"/>
     <w:qFormat/>
-    <w:rsid w:val="00C665D2"/>
+    <w:rsid w:val="003E65F2"/>
     <w:pPr>
       <w:numPr>
         <w:ilvl w:val="1"/>
@@ -2207,7 +2211,7 @@
     <w:basedOn w:val="DefaultParagraphFont"/>
     <w:link w:val="Subtitle"/>
     <w:uiPriority w:val="11"/>
-    <w:rsid w:val="00C665D2"/>
+    <w:rsid w:val="003E65F2"/>
     <w:rPr>
       <w:rFonts w:asciiTheme="minorHAnsi" w:eastAsiaTheme="majorEastAsia" w:hAnsiTheme="minorHAnsi" w:cstheme="majorBidi"/>
       <w:color w:val="595959" w:themeColor="text1" w:themeTint="A6"/>
@@ -2223,7 +2227,7 @@
     <w:link w:val="QuoteChar"/>
     <w:uiPriority w:val="29"/>
     <w:qFormat/>
-    <w:rsid w:val="00C665D2"/>
+    <w:rsid w:val="003E65F2"/>
     <w:pPr>
       <w:spacing w:before="160"/>
       <w:jc w:val="center"/>
@@ -2239,7 +2243,7 @@
     <w:basedOn w:val="DefaultParagraphFont"/>
     <w:link w:val="Quote"/>
     <w:uiPriority w:val="29"/>
-    <w:rsid w:val="00C665D2"/>
+    <w:rsid w:val="003E65F2"/>
     <w:rPr>
       <w:i/>
       <w:iCs/>
@@ -2251,7 +2255,7 @@
     <w:basedOn w:val="Normal"/>
     <w:uiPriority w:val="34"/>
     <w:qFormat/>
-    <w:rsid w:val="00C665D2"/>
+    <w:rsid w:val="003E65F2"/>
     <w:pPr>
       <w:ind w:left="720"/>
       <w:contextualSpacing/>
@@ -2262,7 +2266,7 @@
     <w:basedOn w:val="DefaultParagraphFont"/>
     <w:uiPriority w:val="21"/>
     <w:qFormat/>
-    <w:rsid w:val="00C665D2"/>
+    <w:rsid w:val="003E65F2"/>
     <w:rPr>
       <w:i/>
       <w:iCs/>
@@ -2276,7 +2280,7 @@
     <w:link w:val="IntenseQuoteChar"/>
     <w:uiPriority w:val="30"/>
     <w:qFormat/>
-    <w:rsid w:val="00C665D2"/>
+    <w:rsid w:val="003E65F2"/>
     <w:pPr>
       <w:pBdr>
         <w:top w:val="single" w:sz="4" w:space="10" w:color="0F4761" w:themeColor="accent1" w:themeShade="BF"/>
@@ -2297,7 +2301,7 @@
     <w:basedOn w:val="DefaultParagraphFont"/>
     <w:link w:val="IntenseQuote"/>
     <w:uiPriority w:val="30"/>
-    <w:rsid w:val="00C665D2"/>
+    <w:rsid w:val="003E65F2"/>
     <w:rPr>
       <w:i/>
       <w:iCs/>
@@ -2309,7 +2313,7 @@
     <w:basedOn w:val="DefaultParagraphFont"/>
     <w:uiPriority w:val="32"/>
     <w:qFormat/>
-    <w:rsid w:val="00C665D2"/>
+    <w:rsid w:val="003E65F2"/>
     <w:rPr>
       <w:b/>
       <w:bCs/>
@@ -2324,7 +2328,7 @@
     <w:link w:val="HeaderChar"/>
     <w:uiPriority w:val="99"/>
     <w:unhideWhenUsed/>
-    <w:rsid w:val="00C665D2"/>
+    <w:rsid w:val="003E65F2"/>
     <w:pPr>
       <w:tabs>
         <w:tab w:val="center" w:pos="4680"/>
@@ -2338,7 +2342,7 @@
     <w:basedOn w:val="DefaultParagraphFont"/>
     <w:link w:val="Header"/>
     <w:uiPriority w:val="99"/>
-    <w:rsid w:val="00C665D2"/>
+    <w:rsid w:val="003E65F2"/>
   </w:style>
   <w:style w:type="paragraph" w:styleId="Footer">
     <w:name w:val="footer"/>
@@ -2346,7 +2350,7 @@
     <w:link w:val="FooterChar"/>
     <w:uiPriority w:val="99"/>
     <w:unhideWhenUsed/>
-    <w:rsid w:val="00C665D2"/>
+    <w:rsid w:val="003E65F2"/>
     <w:pPr>
       <w:tabs>
         <w:tab w:val="center" w:pos="4680"/>
@@ -2360,7 +2364,7 @@
     <w:basedOn w:val="DefaultParagraphFont"/>
     <w:link w:val="Footer"/>
     <w:uiPriority w:val="99"/>
-    <w:rsid w:val="00C665D2"/>
+    <w:rsid w:val="003E65F2"/>
   </w:style>
 </w:styles>
 </file>

</xml_diff>

<commit_message>
fix: apply native MS Word Numbered List to questions and auto-prefix bold A., B., C., D. options in borderless tables
</commit_message>
<xml_diff>
--- a/output/uln_document.docx
+++ b/output/uln_document.docx
@@ -51,108 +51,6 @@
           <w:sz w:val="24"/>
         </w:rPr>
         <w:t>1. She is looking forward to ___________ her old friends at the annual reunion.</w:t>
-      </w:r>
-    </w:p>
-    <w:p>
-      <w:pPr>
-        <w:tabs>
-          <w:tab w:val="left" w:pos="4819"/>
-        </w:tabs>
-        <w:spacing w:before="80" w:after="60"/>
-        <w:ind w:left="283"/>
-        <w:rPr>
-          <w:sz w:val="24"/>
-        </w:rPr>
-      </w:pPr>
-      <w:r>
-        <w:rPr>
-          <w:b/>
-          <w:sz w:val="24"/>
-        </w:rPr>
-        <w:t xml:space="preserve">A. </w:t>
-      </w:r>
-      <w:r>
-        <w:rPr>
-          <w:sz w:val="24"/>
-        </w:rPr>
-        <w:t>seeasdfasdfsd</w:t>
-      </w:r>
-      <w:r>
-        <w:rPr>
-          <w:sz w:val="24"/>
-        </w:rPr>
-        <w:tab/>
-      </w:r>
-      <w:r>
-        <w:rPr>
-          <w:b/>
-          <w:sz w:val="24"/>
-        </w:rPr>
-        <w:t xml:space="preserve">B. </w:t>
-      </w:r>
-      <w:r>
-        <w:rPr>
-          <w:sz w:val="24"/>
-        </w:rPr>
-        <w:t>seeing</w:t>
-      </w:r>
-    </w:p>
-    <w:p>
-      <w:pPr>
-        <w:tabs>
-          <w:tab w:val="left" w:pos="4819"/>
-        </w:tabs>
-        <w:spacing w:before="80" w:after="60"/>
-        <w:ind w:left="283"/>
-        <w:rPr>
-          <w:sz w:val="24"/>
-        </w:rPr>
-      </w:pPr>
-      <w:r>
-        <w:rPr>
-          <w:b/>
-          <w:sz w:val="24"/>
-        </w:rPr>
-        <w:t xml:space="preserve">C. </w:t>
-      </w:r>
-      <w:r>
-        <w:rPr>
-          <w:sz w:val="24"/>
-        </w:rPr>
-        <w:t>sawasdfasdfasdfasdfasdfasdfsdf</w:t>
-      </w:r>
-      <w:r>
-        <w:rPr>
-          <w:sz w:val="24"/>
-        </w:rPr>
-        <w:tab/>
-      </w:r>
-      <w:r>
-        <w:rPr>
-          <w:b/>
-          <w:sz w:val="24"/>
-        </w:rPr>
-        <w:t xml:space="preserve">D. </w:t>
-      </w:r>
-      <w:r>
-        <w:rPr>
-          <w:sz w:val="24"/>
-        </w:rPr>
-        <w:t>seen</w:t>
-      </w:r>
-    </w:p>
-    <w:p>
-      <w:pPr>
-        <w:spacing w:before="120" w:after="80"/>
-        <w:rPr>
-          <w:sz w:val="24"/>
-        </w:rPr>
-      </w:pPr>
-      <w:r>
-        <w:rPr>
-          <w:sz w:val="24"/>
-        </w:rPr>
-        <w:t>2. If it ___________ heavily tomorrow, the outdoor festival will be postponed.</w:t>
       </w:r>
     </w:p>
     <w:p>
@@ -179,7 +77,7 @@
         <w:rPr>
           <w:sz w:val="24"/>
         </w:rPr>
-        <w:t>rain</w:t>
+        <w:t>see</w:t>
       </w:r>
       <w:r>
         <w:rPr>
@@ -198,7 +96,7 @@
         <w:rPr>
           <w:sz w:val="24"/>
         </w:rPr>
-        <w:t>rains</w:t>
+        <w:t>seeing</w:t>
       </w:r>
       <w:r>
         <w:rPr>
@@ -217,7 +115,7 @@
         <w:rPr>
           <w:sz w:val="24"/>
         </w:rPr>
-        <w:t>rained</w:t>
+        <w:t>saw</w:t>
       </w:r>
       <w:r>
         <w:rPr>
@@ -236,7 +134,7 @@
         <w:rPr>
           <w:sz w:val="24"/>
         </w:rPr>
-        <w:t>raining</w:t>
+        <w:t>seen</w:t>
       </w:r>
     </w:p>
     <w:p>
@@ -250,7 +148,7 @@
         <w:rPr>
           <w:sz w:val="24"/>
         </w:rPr>
-        <w:t>3. Choose the word whose underlined part is pronounced differently:</w:t>
+        <w:t>2. If it ___________ heavily tomorrow, the outdoor festival will be postponed.</w:t>
       </w:r>
     </w:p>
     <w:p>
@@ -276,15 +174,8 @@
       <w:r>
         <w:rPr>
           <w:sz w:val="24"/>
-          <w:u w:val="single"/>
-        </w:rPr>
-        <w:t>c</w:t>
-      </w:r>
-      <w:r>
-        <w:rPr>
-          <w:sz w:val="24"/>
-        </w:rPr>
-        <w:t>at</w:t>
+        </w:rPr>
+        <w:t>rain</w:t>
       </w:r>
       <w:r>
         <w:rPr>
@@ -302,15 +193,8 @@
       <w:r>
         <w:rPr>
           <w:sz w:val="24"/>
-          <w:u w:val="single"/>
-        </w:rPr>
-        <w:t>c</w:t>
-      </w:r>
-      <w:r>
-        <w:rPr>
-          <w:sz w:val="24"/>
-        </w:rPr>
-        <w:t>ity</w:t>
+        </w:rPr>
+        <w:t>rains</w:t>
       </w:r>
       <w:r>
         <w:rPr>
@@ -328,15 +212,8 @@
       <w:r>
         <w:rPr>
           <w:sz w:val="24"/>
-          <w:u w:val="single"/>
-        </w:rPr>
-        <w:t>c</w:t>
-      </w:r>
-      <w:r>
-        <w:rPr>
-          <w:sz w:val="24"/>
-        </w:rPr>
-        <w:t>ar</w:t>
+        </w:rPr>
+        <w:t>rained</w:t>
       </w:r>
       <w:r>
         <w:rPr>
@@ -354,15 +231,8 @@
       <w:r>
         <w:rPr>
           <w:sz w:val="24"/>
-          <w:u w:val="single"/>
-        </w:rPr>
-        <w:t>c</w:t>
-      </w:r>
-      <w:r>
-        <w:rPr>
-          <w:sz w:val="24"/>
-        </w:rPr>
-        <w:t>up</w:t>
+        </w:rPr>
+        <w:t>raining</w:t>
       </w:r>
     </w:p>
     <w:p>
@@ -376,7 +246,7 @@
         <w:rPr>
           <w:sz w:val="24"/>
         </w:rPr>
-        <w:t>4. My elder brother has been working as a software developer ___________ 2018.</w:t>
+        <w:t>3. Choose the word whose underlined part is pronounced differently:</w:t>
       </w:r>
     </w:p>
     <w:p>
@@ -402,8 +272,15 @@
       <w:r>
         <w:rPr>
           <w:sz w:val="24"/>
-        </w:rPr>
-        <w:t>for</w:t>
+          <w:u w:val="single"/>
+        </w:rPr>
+        <w:t>c</w:t>
+      </w:r>
+      <w:r>
+        <w:rPr>
+          <w:sz w:val="24"/>
+        </w:rPr>
+        <w:t>at</w:t>
       </w:r>
       <w:r>
         <w:rPr>
@@ -421,8 +298,15 @@
       <w:r>
         <w:rPr>
           <w:sz w:val="24"/>
-        </w:rPr>
-        <w:t>since</w:t>
+          <w:u w:val="single"/>
+        </w:rPr>
+        <w:t>c</w:t>
+      </w:r>
+      <w:r>
+        <w:rPr>
+          <w:sz w:val="24"/>
+        </w:rPr>
+        <w:t>ity</w:t>
       </w:r>
       <w:r>
         <w:rPr>
@@ -440,8 +324,15 @@
       <w:r>
         <w:rPr>
           <w:sz w:val="24"/>
-        </w:rPr>
-        <w:t>in</w:t>
+          <w:u w:val="single"/>
+        </w:rPr>
+        <w:t>c</w:t>
+      </w:r>
+      <w:r>
+        <w:rPr>
+          <w:sz w:val="24"/>
+        </w:rPr>
+        <w:t>ar</w:t>
       </w:r>
       <w:r>
         <w:rPr>
@@ -459,8 +350,15 @@
       <w:r>
         <w:rPr>
           <w:sz w:val="24"/>
-        </w:rPr>
-        <w:t>at</w:t>
+          <w:u w:val="single"/>
+        </w:rPr>
+        <w:t>c</w:t>
+      </w:r>
+      <w:r>
+        <w:rPr>
+          <w:sz w:val="24"/>
+        </w:rPr>
+        <w:t>up</w:t>
       </w:r>
     </w:p>
     <w:p>
@@ -474,7 +372,7 @@
         <w:rPr>
           <w:sz w:val="24"/>
         </w:rPr>
-        <w:t>5. Choose the word that has a different primary stress pattern:</w:t>
+        <w:t>4. My elder brother has been working as a software developer ___________ 2018.</w:t>
       </w:r>
     </w:p>
     <w:p>
@@ -501,6 +399,104 @@
         <w:rPr>
           <w:sz w:val="24"/>
         </w:rPr>
+        <w:t>for</w:t>
+      </w:r>
+      <w:r>
+        <w:rPr>
+          <w:sz w:val="24"/>
+        </w:rPr>
+        <w:tab/>
+      </w:r>
+      <w:r>
+        <w:rPr>
+          <w:b/>
+          <w:sz w:val="24"/>
+        </w:rPr>
+        <w:t xml:space="preserve">B. </w:t>
+      </w:r>
+      <w:r>
+        <w:rPr>
+          <w:sz w:val="24"/>
+        </w:rPr>
+        <w:t>since</w:t>
+      </w:r>
+      <w:r>
+        <w:rPr>
+          <w:sz w:val="24"/>
+        </w:rPr>
+        <w:tab/>
+      </w:r>
+      <w:r>
+        <w:rPr>
+          <w:b/>
+          <w:sz w:val="24"/>
+        </w:rPr>
+        <w:t xml:space="preserve">C. </w:t>
+      </w:r>
+      <w:r>
+        <w:rPr>
+          <w:sz w:val="24"/>
+        </w:rPr>
+        <w:t>in</w:t>
+      </w:r>
+      <w:r>
+        <w:rPr>
+          <w:sz w:val="24"/>
+        </w:rPr>
+        <w:tab/>
+      </w:r>
+      <w:r>
+        <w:rPr>
+          <w:b/>
+          <w:sz w:val="24"/>
+        </w:rPr>
+        <w:t xml:space="preserve">D. </w:t>
+      </w:r>
+      <w:r>
+        <w:rPr>
+          <w:sz w:val="24"/>
+        </w:rPr>
+        <w:t>at</w:t>
+      </w:r>
+    </w:p>
+    <w:p>
+      <w:pPr>
+        <w:spacing w:before="120" w:after="80"/>
+        <w:rPr>
+          <w:sz w:val="24"/>
+        </w:rPr>
+      </w:pPr>
+      <w:r>
+        <w:rPr>
+          <w:sz w:val="24"/>
+        </w:rPr>
+        <w:t>5. Choose the word that has a different primary stress pattern:</w:t>
+      </w:r>
+    </w:p>
+    <w:p>
+      <w:pPr>
+        <w:tabs>
+          <w:tab w:val="left" w:pos="2551"/>
+          <w:tab w:val="left" w:pos="4819"/>
+          <w:tab w:val="left" w:pos="7087"/>
+        </w:tabs>
+        <w:spacing w:before="80" w:after="60"/>
+        <w:ind w:left="283"/>
+        <w:rPr>
+          <w:sz w:val="24"/>
+        </w:rPr>
+      </w:pPr>
+      <w:r>
+        <w:rPr>
+          <w:b/>
+          <w:sz w:val="24"/>
+        </w:rPr>
+        <w:t xml:space="preserve">A. </w:t>
+      </w:r>
+      <w:r>
+        <w:rPr>
+          <w:sz w:val="24"/>
+        </w:rPr>
         <w:t>teacher</w:t>
       </w:r>
       <w:r>
@@ -584,7 +580,7 @@
         <mc:AlternateContent>
           <mc:Choice Requires="wps">
             <w:drawing>
-              <wp:anchor distT="0" distB="0" distL="114300" distR="114300" simplePos="0" relativeHeight="251659264" behindDoc="0" locked="0" layoutInCell="1" allowOverlap="1">
+              <wp:anchor distT="0" distB="0" distL="114300" distR="114300" simplePos="0" relativeHeight="251659264" behindDoc="0" locked="0" layoutInCell="1" allowOverlap="1" wp14:anchorId="73F752CD" wp14:editId="4E070811">
                 <wp:simplePos x="0" y="0"/>
                 <wp:positionH relativeFrom="margin">
                   <wp:posOffset>1331595</wp:posOffset>
@@ -595,7 +591,7 @@
                 <wp:extent cx="3276600" cy="355600"/>
                 <wp:effectExtent l="0" t="0" r="19050" b="25400"/>
                 <wp:wrapNone/>
-                <wp:docPr id="1207538531" name="Rectangle: Rounded Corners 1"/>
+                <wp:docPr id="845357617" name="Rectangle: Rounded Corners 1"/>
                 <wp:cNvGraphicFramePr/>
                 <a:graphic xmlns:a="http://schemas.openxmlformats.org/drawingml/2006/main">
                   <a:graphicData uri="http://schemas.microsoft.com/office/word/2010/wordprocessingShape">
@@ -658,7 +654,7 @@
           </mc:Choice>
           <mc:Fallback>
             <w:pict>
-              <v:roundrect w14:anchorId="6DEDD072" id="Rectangle: Rounded Corners 1" o:spid="_x0000_s1026" style="position:absolute;margin-left:104.85pt;margin-top:-6pt;width:258pt;height:28pt;z-index:251659264;visibility:visible;mso-wrap-style:square;mso-wrap-distance-left:9pt;mso-wrap-distance-top:0;mso-wrap-distance-right:9pt;mso-wrap-distance-bottom:0;mso-position-horizontal:absolute;mso-position-horizontal-relative:margin;mso-position-vertical:absolute;mso-position-vertical-relative:text;v-text-anchor:middle" arcsize="10923f" o:gfxdata="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" filled="f" fillcolor="#156082 [3204]" strokeweight="1pt">
+              <v:roundrect w14:anchorId="03A71BC1" id="Rectangle: Rounded Corners 1" o:spid="_x0000_s1026" style="position:absolute;margin-left:104.85pt;margin-top:-6pt;width:258pt;height:28pt;z-index:251659264;visibility:visible;mso-wrap-style:square;mso-wrap-distance-left:9pt;mso-wrap-distance-top:0;mso-wrap-distance-right:9pt;mso-wrap-distance-bottom:0;mso-position-horizontal:absolute;mso-position-horizontal-relative:margin;mso-position-vertical:absolute;mso-position-vertical-relative:text;v-text-anchor:middle" arcsize="10923f" o:gfxdata="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" filled="f" fillcolor="#156082 [3204]" strokeweight="1pt">
                 <v:stroke joinstyle="miter"/>
                 <w10:wrap anchorx="margin"/>
               </v:roundrect>
@@ -951,7 +947,7 @@
           <w:sz w:val="24"/>
         </w:rPr>
         <w:drawing>
-          <wp:anchor distT="0" distB="0" distL="114300" distR="114300" simplePos="0" relativeHeight="251660288" behindDoc="0" locked="0" layoutInCell="1" allowOverlap="1">
+          <wp:anchor distT="0" distB="0" distL="114300" distR="114300" simplePos="0" relativeHeight="251660288" behindDoc="0" locked="0" layoutInCell="1" allowOverlap="1" wp14:anchorId="1EB68506" wp14:editId="394295B4">
             <wp:simplePos x="0" y="0"/>
             <wp:positionH relativeFrom="margin">
               <wp:posOffset>4679950</wp:posOffset>
@@ -962,7 +958,7 @@
             <wp:extent cx="1260000" cy="1008000"/>
             <wp:effectExtent l="0" t="0" r="0" b="1905"/>
             <wp:wrapNone/>
-            <wp:docPr id="1451323389" name="Picture 2"/>
+            <wp:docPr id="510194739" name="Picture 2"/>
             <wp:cNvGraphicFramePr>
               <a:graphicFrameLocks xmlns:a="http://schemas.openxmlformats.org/drawingml/2006/main"/>
             </wp:cNvGraphicFramePr>
@@ -970,7 +966,7 @@
               <a:graphicData uri="http://schemas.openxmlformats.org/drawingml/2006/picture">
                 <pic:pic xmlns:pic="http://schemas.openxmlformats.org/drawingml/2006/picture">
                   <pic:nvPicPr>
-                    <pic:cNvPr id="1451323389" name=""/>
+                    <pic:cNvPr id="510194739" name=""/>
                     <pic:cNvPicPr/>
                   </pic:nvPicPr>
                   <pic:blipFill>
@@ -1052,23 +1048,23 @@
         <w:rPr>
           <w:sz w:val="24"/>
         </w:rPr>
+        <w:t>Parking is allowed for 40 minutes only.</w:t>
+      </w:r>
+    </w:p>
+    <w:p>
+      <w:pPr>
+        <w:spacing w:before="120" w:after="80" w:line="240" w:lineRule="auto"/>
+        <w:rPr>
+          <w:b/>
+          <w:sz w:val="24"/>
+        </w:rPr>
+      </w:pPr>
+      <w:r>
+        <w:rPr>
+          <w:b/>
+          <w:sz w:val="24"/>
+        </w:rPr>
         <w:lastRenderedPageBreak/>
-        <w:t>Parking is allowed for 40 minutes only.</w:t>
-      </w:r>
-    </w:p>
-    <w:p>
-      <w:pPr>
-        <w:spacing w:before="120" w:after="80" w:line="240" w:lineRule="auto"/>
-        <w:rPr>
-          <w:b/>
-          <w:sz w:val="24"/>
-        </w:rPr>
-      </w:pPr>
-      <w:r>
-        <w:rPr>
-          <w:b/>
-          <w:sz w:val="24"/>
-        </w:rPr>
         <w:t>II. ERROR CORRECTION</w:t>
       </w:r>
     </w:p>
@@ -1291,7 +1287,7 @@
         <w:noProof/>
         <w:sz w:val="20"/>
       </w:rPr>
-      <w:t>1</w:t>
+      <w:t>2</w:t>
     </w:r>
     <w:r>
       <w:rPr>
@@ -1328,7 +1324,7 @@
         <w:noProof/>
         <w:sz w:val="20"/>
       </w:rPr>
-      <w:t>1</w:t>
+      <w:t>2</w:t>
     </w:r>
     <w:r>
       <w:rPr>
@@ -1813,7 +1809,7 @@
     <w:link w:val="Heading1Char"/>
     <w:uiPriority w:val="9"/>
     <w:qFormat/>
-    <w:rsid w:val="003E65F2"/>
+    <w:rsid w:val="00362565"/>
     <w:pPr>
       <w:keepNext/>
       <w:keepLines/>
@@ -1836,7 +1832,7 @@
     <w:semiHidden/>
     <w:unhideWhenUsed/>
     <w:qFormat/>
-    <w:rsid w:val="003E65F2"/>
+    <w:rsid w:val="00362565"/>
     <w:pPr>
       <w:keepNext/>
       <w:keepLines/>
@@ -1859,7 +1855,7 @@
     <w:semiHidden/>
     <w:unhideWhenUsed/>
     <w:qFormat/>
-    <w:rsid w:val="003E65F2"/>
+    <w:rsid w:val="00362565"/>
     <w:pPr>
       <w:keepNext/>
       <w:keepLines/>
@@ -1882,7 +1878,7 @@
     <w:semiHidden/>
     <w:unhideWhenUsed/>
     <w:qFormat/>
-    <w:rsid w:val="003E65F2"/>
+    <w:rsid w:val="00362565"/>
     <w:pPr>
       <w:keepNext/>
       <w:keepLines/>
@@ -1905,7 +1901,7 @@
     <w:semiHidden/>
     <w:unhideWhenUsed/>
     <w:qFormat/>
-    <w:rsid w:val="003E65F2"/>
+    <w:rsid w:val="00362565"/>
     <w:pPr>
       <w:keepNext/>
       <w:keepLines/>
@@ -1926,7 +1922,7 @@
     <w:semiHidden/>
     <w:unhideWhenUsed/>
     <w:qFormat/>
-    <w:rsid w:val="003E65F2"/>
+    <w:rsid w:val="00362565"/>
     <w:pPr>
       <w:keepNext/>
       <w:keepLines/>
@@ -1949,7 +1945,7 @@
     <w:semiHidden/>
     <w:unhideWhenUsed/>
     <w:qFormat/>
-    <w:rsid w:val="003E65F2"/>
+    <w:rsid w:val="00362565"/>
     <w:pPr>
       <w:keepNext/>
       <w:keepLines/>
@@ -1970,7 +1966,7 @@
     <w:semiHidden/>
     <w:unhideWhenUsed/>
     <w:qFormat/>
-    <w:rsid w:val="003E65F2"/>
+    <w:rsid w:val="00362565"/>
     <w:pPr>
       <w:keepNext/>
       <w:keepLines/>
@@ -1993,7 +1989,7 @@
     <w:semiHidden/>
     <w:unhideWhenUsed/>
     <w:qFormat/>
-    <w:rsid w:val="003E65F2"/>
+    <w:rsid w:val="00362565"/>
     <w:pPr>
       <w:keepNext/>
       <w:keepLines/>
@@ -2037,7 +2033,7 @@
     <w:basedOn w:val="DefaultParagraphFont"/>
     <w:link w:val="Heading1"/>
     <w:uiPriority w:val="9"/>
-    <w:rsid w:val="003E65F2"/>
+    <w:rsid w:val="00362565"/>
     <w:rPr>
       <w:rFonts w:asciiTheme="majorHAnsi" w:eastAsiaTheme="majorEastAsia" w:hAnsiTheme="majorHAnsi" w:cstheme="majorBidi"/>
       <w:color w:val="0F4761" w:themeColor="accent1" w:themeShade="BF"/>
@@ -2051,7 +2047,7 @@
     <w:link w:val="Heading2"/>
     <w:uiPriority w:val="9"/>
     <w:semiHidden/>
-    <w:rsid w:val="003E65F2"/>
+    <w:rsid w:val="00362565"/>
     <w:rPr>
       <w:rFonts w:asciiTheme="majorHAnsi" w:eastAsiaTheme="majorEastAsia" w:hAnsiTheme="majorHAnsi" w:cstheme="majorBidi"/>
       <w:color w:val="0F4761" w:themeColor="accent1" w:themeShade="BF"/>
@@ -2065,7 +2061,7 @@
     <w:link w:val="Heading3"/>
     <w:uiPriority w:val="9"/>
     <w:semiHidden/>
-    <w:rsid w:val="003E65F2"/>
+    <w:rsid w:val="00362565"/>
     <w:rPr>
       <w:rFonts w:asciiTheme="minorHAnsi" w:eastAsiaTheme="majorEastAsia" w:hAnsiTheme="minorHAnsi" w:cstheme="majorBidi"/>
       <w:color w:val="0F4761" w:themeColor="accent1" w:themeShade="BF"/>
@@ -2079,7 +2075,7 @@
     <w:link w:val="Heading4"/>
     <w:uiPriority w:val="9"/>
     <w:semiHidden/>
-    <w:rsid w:val="003E65F2"/>
+    <w:rsid w:val="00362565"/>
     <w:rPr>
       <w:rFonts w:asciiTheme="minorHAnsi" w:eastAsiaTheme="majorEastAsia" w:hAnsiTheme="minorHAnsi" w:cstheme="majorBidi"/>
       <w:i/>
@@ -2093,7 +2089,7 @@
     <w:link w:val="Heading5"/>
     <w:uiPriority w:val="9"/>
     <w:semiHidden/>
-    <w:rsid w:val="003E65F2"/>
+    <w:rsid w:val="00362565"/>
     <w:rPr>
       <w:rFonts w:asciiTheme="minorHAnsi" w:eastAsiaTheme="majorEastAsia" w:hAnsiTheme="minorHAnsi" w:cstheme="majorBidi"/>
       <w:color w:val="0F4761" w:themeColor="accent1" w:themeShade="BF"/>
@@ -2105,7 +2101,7 @@
     <w:link w:val="Heading6"/>
     <w:uiPriority w:val="9"/>
     <w:semiHidden/>
-    <w:rsid w:val="003E65F2"/>
+    <w:rsid w:val="00362565"/>
     <w:rPr>
       <w:rFonts w:asciiTheme="minorHAnsi" w:eastAsiaTheme="majorEastAsia" w:hAnsiTheme="minorHAnsi" w:cstheme="majorBidi"/>
       <w:i/>
@@ -2119,7 +2115,7 @@
     <w:link w:val="Heading7"/>
     <w:uiPriority w:val="9"/>
     <w:semiHidden/>
-    <w:rsid w:val="003E65F2"/>
+    <w:rsid w:val="00362565"/>
     <w:rPr>
       <w:rFonts w:asciiTheme="minorHAnsi" w:eastAsiaTheme="majorEastAsia" w:hAnsiTheme="minorHAnsi" w:cstheme="majorBidi"/>
       <w:color w:val="595959" w:themeColor="text1" w:themeTint="A6"/>
@@ -2131,7 +2127,7 @@
     <w:link w:val="Heading8"/>
     <w:uiPriority w:val="9"/>
     <w:semiHidden/>
-    <w:rsid w:val="003E65F2"/>
+    <w:rsid w:val="00362565"/>
     <w:rPr>
       <w:rFonts w:asciiTheme="minorHAnsi" w:eastAsiaTheme="majorEastAsia" w:hAnsiTheme="minorHAnsi" w:cstheme="majorBidi"/>
       <w:i/>
@@ -2145,7 +2141,7 @@
     <w:link w:val="Heading9"/>
     <w:uiPriority w:val="9"/>
     <w:semiHidden/>
-    <w:rsid w:val="003E65F2"/>
+    <w:rsid w:val="00362565"/>
     <w:rPr>
       <w:rFonts w:asciiTheme="minorHAnsi" w:eastAsiaTheme="majorEastAsia" w:hAnsiTheme="minorHAnsi" w:cstheme="majorBidi"/>
       <w:color w:val="272727" w:themeColor="text1" w:themeTint="D8"/>
@@ -2158,7 +2154,7 @@
     <w:link w:val="TitleChar"/>
     <w:uiPriority w:val="10"/>
     <w:qFormat/>
-    <w:rsid w:val="003E65F2"/>
+    <w:rsid w:val="00362565"/>
     <w:pPr>
       <w:spacing w:after="80" w:line="240" w:lineRule="auto"/>
       <w:contextualSpacing/>
@@ -2176,7 +2172,7 @@
     <w:basedOn w:val="DefaultParagraphFont"/>
     <w:link w:val="Title"/>
     <w:uiPriority w:val="10"/>
-    <w:rsid w:val="003E65F2"/>
+    <w:rsid w:val="00362565"/>
     <w:rPr>
       <w:rFonts w:asciiTheme="majorHAnsi" w:eastAsiaTheme="majorEastAsia" w:hAnsiTheme="majorHAnsi" w:cstheme="majorBidi"/>
       <w:spacing w:val="-10"/>
@@ -2192,7 +2188,7 @@
     <w:link w:val="SubtitleChar"/>
     <w:uiPriority w:val="11"/>
     <w:qFormat/>
-    <w:rsid w:val="003E65F2"/>
+    <w:rsid w:val="00362565"/>
     <w:pPr>
       <w:numPr>
         <w:ilvl w:val="1"/>
@@ -2211,7 +2207,7 @@
     <w:basedOn w:val="DefaultParagraphFont"/>
     <w:link w:val="Subtitle"/>
     <w:uiPriority w:val="11"/>
-    <w:rsid w:val="003E65F2"/>
+    <w:rsid w:val="00362565"/>
     <w:rPr>
       <w:rFonts w:asciiTheme="minorHAnsi" w:eastAsiaTheme="majorEastAsia" w:hAnsiTheme="minorHAnsi" w:cstheme="majorBidi"/>
       <w:color w:val="595959" w:themeColor="text1" w:themeTint="A6"/>
@@ -2227,7 +2223,7 @@
     <w:link w:val="QuoteChar"/>
     <w:uiPriority w:val="29"/>
     <w:qFormat/>
-    <w:rsid w:val="003E65F2"/>
+    <w:rsid w:val="00362565"/>
     <w:pPr>
       <w:spacing w:before="160"/>
       <w:jc w:val="center"/>
@@ -2243,7 +2239,7 @@
     <w:basedOn w:val="DefaultParagraphFont"/>
     <w:link w:val="Quote"/>
     <w:uiPriority w:val="29"/>
-    <w:rsid w:val="003E65F2"/>
+    <w:rsid w:val="00362565"/>
     <w:rPr>
       <w:i/>
       <w:iCs/>
@@ -2255,7 +2251,7 @@
     <w:basedOn w:val="Normal"/>
     <w:uiPriority w:val="34"/>
     <w:qFormat/>
-    <w:rsid w:val="003E65F2"/>
+    <w:rsid w:val="00362565"/>
     <w:pPr>
       <w:ind w:left="720"/>
       <w:contextualSpacing/>
@@ -2266,7 +2262,7 @@
     <w:basedOn w:val="DefaultParagraphFont"/>
     <w:uiPriority w:val="21"/>
     <w:qFormat/>
-    <w:rsid w:val="003E65F2"/>
+    <w:rsid w:val="00362565"/>
     <w:rPr>
       <w:i/>
       <w:iCs/>
@@ -2280,7 +2276,7 @@
     <w:link w:val="IntenseQuoteChar"/>
     <w:uiPriority w:val="30"/>
     <w:qFormat/>
-    <w:rsid w:val="003E65F2"/>
+    <w:rsid w:val="00362565"/>
     <w:pPr>
       <w:pBdr>
         <w:top w:val="single" w:sz="4" w:space="10" w:color="0F4761" w:themeColor="accent1" w:themeShade="BF"/>
@@ -2301,7 +2297,7 @@
     <w:basedOn w:val="DefaultParagraphFont"/>
     <w:link w:val="IntenseQuote"/>
     <w:uiPriority w:val="30"/>
-    <w:rsid w:val="003E65F2"/>
+    <w:rsid w:val="00362565"/>
     <w:rPr>
       <w:i/>
       <w:iCs/>
@@ -2313,7 +2309,7 @@
     <w:basedOn w:val="DefaultParagraphFont"/>
     <w:uiPriority w:val="32"/>
     <w:qFormat/>
-    <w:rsid w:val="003E65F2"/>
+    <w:rsid w:val="00362565"/>
     <w:rPr>
       <w:b/>
       <w:bCs/>
@@ -2328,7 +2324,7 @@
     <w:link w:val="HeaderChar"/>
     <w:uiPriority w:val="99"/>
     <w:unhideWhenUsed/>
-    <w:rsid w:val="003E65F2"/>
+    <w:rsid w:val="00362565"/>
     <w:pPr>
       <w:tabs>
         <w:tab w:val="center" w:pos="4680"/>
@@ -2342,7 +2338,7 @@
     <w:basedOn w:val="DefaultParagraphFont"/>
     <w:link w:val="Header"/>
     <w:uiPriority w:val="99"/>
-    <w:rsid w:val="003E65F2"/>
+    <w:rsid w:val="00362565"/>
   </w:style>
   <w:style w:type="paragraph" w:styleId="Footer">
     <w:name w:val="footer"/>
@@ -2350,7 +2346,7 @@
     <w:link w:val="FooterChar"/>
     <w:uiPriority w:val="99"/>
     <w:unhideWhenUsed/>
-    <w:rsid w:val="003E65F2"/>
+    <w:rsid w:val="00362565"/>
     <w:pPr>
       <w:tabs>
         <w:tab w:val="center" w:pos="4680"/>
@@ -2364,7 +2360,7 @@
     <w:basedOn w:val="DefaultParagraphFont"/>
     <w:link w:val="Footer"/>
     <w:uiPriority w:val="99"/>
-    <w:rsid w:val="003E65F2"/>
+    <w:rsid w:val="00362565"/>
   </w:style>
 </w:styles>
 </file>

</xml_diff>

<commit_message>
fix: recursively clean #N placeholders in tables/TAB2, enforce left indent 0 on native lists, and create unlinked independent list templates per NUM section
</commit_message>
<xml_diff>
--- a/output/uln_document.docx
+++ b/output/uln_document.docx
@@ -41,16 +41,22 @@
     </w:p>
     <w:p>
       <w:pPr>
+        <w:pStyle w:val="ListParagraph"/>
+        <w:numPr>
+          <w:ilvl w:val="0"/>
+          <w:numId w:val="1"/>
+        </w:numPr>
         <w:spacing w:before="120" w:after="80"/>
         <w:rPr>
-          <w:sz w:val="24"/>
-        </w:rPr>
-      </w:pPr>
-      <w:r>
-        <w:rPr>
-          <w:sz w:val="24"/>
-        </w:rPr>
-        <w:t>1. She is looking forward to ___________ her old friends at the annual reunion.</w:t>
+          <w:b/>
+          <w:sz w:val="24"/>
+        </w:rPr>
+      </w:pPr>
+      <w:r>
+        <w:rPr>
+          <w:sz w:val="24"/>
+        </w:rPr>
+        <w:t>She is looking forward to ___________ her old friends at the annual reunion.</w:t>
       </w:r>
     </w:p>
     <w:p>
@@ -139,6 +145,11 @@
     </w:p>
     <w:p>
       <w:pPr>
+        <w:pStyle w:val="ListParagraph"/>
+        <w:numPr>
+          <w:ilvl w:val="0"/>
+          <w:numId w:val="1"/>
+        </w:numPr>
         <w:spacing w:before="120" w:after="80"/>
         <w:rPr>
           <w:sz w:val="24"/>
@@ -148,7 +159,7 @@
         <w:rPr>
           <w:sz w:val="24"/>
         </w:rPr>
-        <w:t>2. If it ___________ heavily tomorrow, the outdoor festival will be postponed.</w:t>
+        <w:t>If it ___________ heavily tomorrow, the outdoor festival will be postponed.</w:t>
       </w:r>
     </w:p>
     <w:p>
@@ -237,6 +248,11 @@
     </w:p>
     <w:p>
       <w:pPr>
+        <w:pStyle w:val="ListParagraph"/>
+        <w:numPr>
+          <w:ilvl w:val="0"/>
+          <w:numId w:val="1"/>
+        </w:numPr>
         <w:spacing w:before="120" w:after="80"/>
         <w:rPr>
           <w:sz w:val="24"/>
@@ -246,7 +262,7 @@
         <w:rPr>
           <w:sz w:val="24"/>
         </w:rPr>
-        <w:t>3. Choose the word whose underlined part is pronounced differently:</w:t>
+        <w:t>Choose the word whose underlined part is pronounced differently:</w:t>
       </w:r>
     </w:p>
     <w:p>
@@ -363,6 +379,11 @@
     </w:p>
     <w:p>
       <w:pPr>
+        <w:pStyle w:val="ListParagraph"/>
+        <w:numPr>
+          <w:ilvl w:val="0"/>
+          <w:numId w:val="1"/>
+        </w:numPr>
         <w:spacing w:before="120" w:after="80"/>
         <w:rPr>
           <w:sz w:val="24"/>
@@ -372,7 +393,7 @@
         <w:rPr>
           <w:sz w:val="24"/>
         </w:rPr>
-        <w:t>4. My elder brother has been working as a software developer ___________ 2018.</w:t>
+        <w:t>My elder brother has been working as a software developer ___________ 2018.</w:t>
       </w:r>
     </w:p>
     <w:p>
@@ -461,6 +482,11 @@
     </w:p>
     <w:p>
       <w:pPr>
+        <w:pStyle w:val="ListParagraph"/>
+        <w:numPr>
+          <w:ilvl w:val="0"/>
+          <w:numId w:val="1"/>
+        </w:numPr>
         <w:spacing w:before="120" w:after="80"/>
         <w:rPr>
           <w:sz w:val="24"/>
@@ -470,7 +496,7 @@
         <w:rPr>
           <w:sz w:val="24"/>
         </w:rPr>
-        <w:t>5. Choose the word that has a different primary stress pattern:</w:t>
+        <w:t>Choose the word that has a different primary stress pattern:</w:t>
       </w:r>
     </w:p>
     <w:p>
@@ -580,7 +606,7 @@
         <mc:AlternateContent>
           <mc:Choice Requires="wps">
             <w:drawing>
-              <wp:anchor distT="0" distB="0" distL="114300" distR="114300" simplePos="0" relativeHeight="251659264" behindDoc="0" locked="0" layoutInCell="1" allowOverlap="1" wp14:anchorId="73F752CD" wp14:editId="4E070811">
+              <wp:anchor distT="0" distB="0" distL="114300" distR="114300" simplePos="0" relativeHeight="251659264" behindDoc="0" locked="0" layoutInCell="1" allowOverlap="1" wp14:anchorId="2B34B278" wp14:editId="1FAF6835">
                 <wp:simplePos x="0" y="0"/>
                 <wp:positionH relativeFrom="margin">
                   <wp:posOffset>1331595</wp:posOffset>
@@ -591,7 +617,7 @@
                 <wp:extent cx="3276600" cy="355600"/>
                 <wp:effectExtent l="0" t="0" r="19050" b="25400"/>
                 <wp:wrapNone/>
-                <wp:docPr id="845357617" name="Rectangle: Rounded Corners 1"/>
+                <wp:docPr id="1211450012" name="Rectangle: Rounded Corners 1"/>
                 <wp:cNvGraphicFramePr/>
                 <a:graphic xmlns:a="http://schemas.openxmlformats.org/drawingml/2006/main">
                   <a:graphicData uri="http://schemas.microsoft.com/office/word/2010/wordprocessingShape">
@@ -654,7 +680,7 @@
           </mc:Choice>
           <mc:Fallback>
             <w:pict>
-              <v:roundrect w14:anchorId="03A71BC1" id="Rectangle: Rounded Corners 1" o:spid="_x0000_s1026" style="position:absolute;margin-left:104.85pt;margin-top:-6pt;width:258pt;height:28pt;z-index:251659264;visibility:visible;mso-wrap-style:square;mso-wrap-distance-left:9pt;mso-wrap-distance-top:0;mso-wrap-distance-right:9pt;mso-wrap-distance-bottom:0;mso-position-horizontal:absolute;mso-position-horizontal-relative:margin;mso-position-vertical:absolute;mso-position-vertical-relative:text;v-text-anchor:middle" arcsize="10923f" o:gfxdata="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" filled="f" fillcolor="#156082 [3204]" strokeweight="1pt">
+              <v:roundrect w14:anchorId="64262990" id="Rectangle: Rounded Corners 1" o:spid="_x0000_s1026" style="position:absolute;margin-left:104.85pt;margin-top:-6pt;width:258pt;height:28pt;z-index:251659264;visibility:visible;mso-wrap-style:square;mso-wrap-distance-left:9pt;mso-wrap-distance-top:0;mso-wrap-distance-right:9pt;mso-wrap-distance-bottom:0;mso-position-horizontal:absolute;mso-position-horizontal-relative:margin;mso-position-vertical:absolute;mso-position-vertical-relative:text;v-text-anchor:middle" arcsize="10923f" o:gfxdata="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" filled="f" fillcolor="#156082 [3204]" strokeweight="1pt">
                 <v:stroke joinstyle="miter"/>
                 <w10:wrap anchorx="margin"/>
               </v:roundrect>
@@ -698,20 +724,26 @@
     </w:p>
     <w:p>
       <w:pPr>
+        <w:pStyle w:val="ListParagraph"/>
+        <w:numPr>
+          <w:ilvl w:val="0"/>
+          <w:numId w:val="1"/>
+        </w:numPr>
         <w:tabs>
           <w:tab w:val="left" w:pos="4137"/>
           <w:tab w:val="left" w:pos="6057"/>
         </w:tabs>
         <w:spacing w:before="120" w:after="80" w:line="480" w:lineRule="auto"/>
         <w:rPr>
-          <w:sz w:val="24"/>
-        </w:rPr>
-      </w:pPr>
-      <w:r>
-        <w:rPr>
-          <w:sz w:val="24"/>
-        </w:rPr>
-        <w:t>6. Green plants produce oxygen and glucose during the process of ___________.</w:t>
+          <w:b/>
+          <w:sz w:val="24"/>
+        </w:rPr>
+      </w:pPr>
+      <w:r>
+        <w:rPr>
+          <w:sz w:val="24"/>
+        </w:rPr>
+        <w:t>Green plants produce oxygen and glucose during the process of ___________.</w:t>
       </w:r>
     </w:p>
     <w:p>
@@ -820,6 +852,11 @@
     </w:p>
     <w:p>
       <w:pPr>
+        <w:pStyle w:val="ListParagraph"/>
+        <w:numPr>
+          <w:ilvl w:val="0"/>
+          <w:numId w:val="1"/>
+        </w:numPr>
         <w:spacing w:before="120" w:after="80" w:line="480" w:lineRule="auto"/>
         <w:rPr>
           <w:sz w:val="24"/>
@@ -829,7 +866,7 @@
         <w:rPr>
           <w:sz w:val="24"/>
         </w:rPr>
-        <w:t>7. Why did Minh enjoy his summer stay in the countryside?</w:t>
+        <w:t>Why did Minh enjoy his summer stay in the countryside?</w:t>
       </w:r>
     </w:p>
     <w:p>
@@ -931,23 +968,25 @@
         <w:rPr>
           <w:sz w:val="24"/>
         </w:rPr>
-        <w:t>8. What does this traffic sign indicate?</w:t>
+        <w:t>#8. What does this traffic sign indicate?</w:t>
       </w:r>
     </w:p>
     <w:p>
       <w:pPr>
         <w:spacing w:before="60" w:after="60" w:line="240" w:lineRule="auto"/>
-        <w:rPr>
-          <w:sz w:val="24"/>
-        </w:rPr>
-      </w:pPr>
-      <w:r>
-        <w:rPr>
+        <w:ind w:left="283"/>
+        <w:rPr>
+          <w:sz w:val="24"/>
+        </w:rPr>
+      </w:pPr>
+      <w:r>
+        <w:rPr>
+          <w:b/>
           <w:noProof/>
           <w:sz w:val="24"/>
         </w:rPr>
         <w:drawing>
-          <wp:anchor distT="0" distB="0" distL="114300" distR="114300" simplePos="0" relativeHeight="251660288" behindDoc="0" locked="0" layoutInCell="1" allowOverlap="1" wp14:anchorId="1EB68506" wp14:editId="394295B4">
+          <wp:anchor distT="0" distB="0" distL="114300" distR="114300" simplePos="0" relativeHeight="251660288" behindDoc="0" locked="0" layoutInCell="1" allowOverlap="1" wp14:anchorId="273D7F17" wp14:editId="7D4153EB">
             <wp:simplePos x="0" y="0"/>
             <wp:positionH relativeFrom="margin">
               <wp:posOffset>4679950</wp:posOffset>
@@ -958,7 +997,7 @@
             <wp:extent cx="1260000" cy="1008000"/>
             <wp:effectExtent l="0" t="0" r="0" b="1905"/>
             <wp:wrapNone/>
-            <wp:docPr id="510194739" name="Picture 2"/>
+            <wp:docPr id="1698498844" name="Picture 2"/>
             <wp:cNvGraphicFramePr>
               <a:graphicFrameLocks xmlns:a="http://schemas.openxmlformats.org/drawingml/2006/main"/>
             </wp:cNvGraphicFramePr>
@@ -966,11 +1005,11 @@
               <a:graphicData uri="http://schemas.openxmlformats.org/drawingml/2006/picture">
                 <pic:pic xmlns:pic="http://schemas.openxmlformats.org/drawingml/2006/picture">
                   <pic:nvPicPr>
-                    <pic:cNvPr id="510194739" name=""/>
+                    <pic:cNvPr id="1698498844" name=""/>
                     <pic:cNvPicPr/>
                   </pic:nvPicPr>
                   <pic:blipFill>
-                    <a:blip r:embed="rId6">
+                    <a:blip r:embed="rId7">
                       <a:extLst>
                         <a:ext uri="{28A0092B-C50C-407E-A947-70E740481C1C}">
                           <a14:useLocalDpi xmlns:a14="http://schemas.microsoft.com/office/drawing/2010/main" val="0"/>
@@ -1004,51 +1043,82 @@
       </w:r>
       <w:r>
         <w:rPr>
-          <w:sz w:val="24"/>
-        </w:rPr>
-        <w:t>Maximum speed allowed is 40 km/h.</w:t>
+          <w:b/>
+          <w:sz w:val="24"/>
+        </w:rPr>
+        <w:t xml:space="preserve">A. </w:t>
+      </w:r>
+      <w:r>
+        <w:rPr>
+          <w:sz w:val="24"/>
+        </w:rPr>
+        <w:t xml:space="preserve"> Maximum speed allowed is 40 km/h.</w:t>
       </w:r>
     </w:p>
     <w:p>
       <w:pPr>
         <w:spacing w:before="60" w:after="60" w:line="240" w:lineRule="auto"/>
-        <w:rPr>
-          <w:sz w:val="24"/>
-        </w:rPr>
-      </w:pPr>
-      <w:r>
-        <w:rPr>
-          <w:sz w:val="24"/>
-        </w:rPr>
-        <w:t>You must drive faster than 40 km/h.</w:t>
+        <w:ind w:left="283"/>
+        <w:rPr>
+          <w:sz w:val="24"/>
+        </w:rPr>
+      </w:pPr>
+      <w:r>
+        <w:rPr>
+          <w:b/>
+          <w:sz w:val="24"/>
+        </w:rPr>
+        <w:t xml:space="preserve">B. </w:t>
+      </w:r>
+      <w:r>
+        <w:rPr>
+          <w:sz w:val="24"/>
+        </w:rPr>
+        <w:t xml:space="preserve"> You must drive faster than 40 km/h.</w:t>
       </w:r>
     </w:p>
     <w:p>
       <w:pPr>
         <w:spacing w:before="60" w:after="60" w:line="240" w:lineRule="auto"/>
-        <w:rPr>
-          <w:sz w:val="24"/>
-        </w:rPr>
-      </w:pPr>
-      <w:r>
-        <w:rPr>
-          <w:sz w:val="24"/>
-        </w:rPr>
-        <w:t>Vehicles over 40 tons are forbidden.</w:t>
+        <w:ind w:left="283"/>
+        <w:rPr>
+          <w:sz w:val="24"/>
+        </w:rPr>
+      </w:pPr>
+      <w:r>
+        <w:rPr>
+          <w:b/>
+          <w:sz w:val="24"/>
+        </w:rPr>
+        <w:t xml:space="preserve">C. </w:t>
+      </w:r>
+      <w:r>
+        <w:rPr>
+          <w:sz w:val="24"/>
+        </w:rPr>
+        <w:t xml:space="preserve"> Vehicles over 40 tons are forbidden.</w:t>
       </w:r>
     </w:p>
     <w:p>
       <w:pPr>
         <w:spacing w:before="60" w:after="60" w:line="240" w:lineRule="auto"/>
-        <w:rPr>
-          <w:sz w:val="24"/>
-        </w:rPr>
-      </w:pPr>
-      <w:r>
-        <w:rPr>
-          <w:sz w:val="24"/>
-        </w:rPr>
-        <w:t>Parking is allowed for 40 minutes only.</w:t>
+        <w:ind w:left="283"/>
+        <w:rPr>
+          <w:sz w:val="24"/>
+        </w:rPr>
+      </w:pPr>
+      <w:r>
+        <w:rPr>
+          <w:b/>
+          <w:sz w:val="24"/>
+        </w:rPr>
+        <w:t xml:space="preserve">D. </w:t>
+      </w:r>
+      <w:r>
+        <w:rPr>
+          <w:sz w:val="24"/>
+        </w:rPr>
+        <w:t xml:space="preserve"> Parking is allowed for 40 minutes only.</w:t>
       </w:r>
     </w:p>
     <w:p>
@@ -1154,26 +1224,38 @@
     </w:p>
     <w:p>
       <w:pPr>
+        <w:pStyle w:val="ListParagraph"/>
+        <w:numPr>
+          <w:ilvl w:val="0"/>
+          <w:numId w:val="1"/>
+        </w:numPr>
         <w:spacing w:before="120" w:after="80" w:line="240" w:lineRule="auto"/>
         <w:rPr>
-          <w:sz w:val="24"/>
-        </w:rPr>
-      </w:pPr>
-      <w:r>
-        <w:rPr>
-          <w:sz w:val="24"/>
-        </w:rPr>
-        <w:t>10. What is your favourite hobby?</w:t>
-      </w:r>
-    </w:p>
-    <w:p>
-      <w:pPr>
+          <w:b/>
+          <w:sz w:val="24"/>
+        </w:rPr>
+      </w:pPr>
+      <w:r>
+        <w:rPr>
+          <w:sz w:val="24"/>
+        </w:rPr>
+        <w:t>What is your favourite hobby?</w:t>
+      </w:r>
+    </w:p>
+    <w:p>
+      <w:pPr>
+        <w:pStyle w:val="ListParagraph"/>
+        <w:numPr>
+          <w:ilvl w:val="0"/>
+          <w:numId w:val="1"/>
+        </w:numPr>
         <w:tabs>
           <w:tab w:val="right" w:leader="heavy" w:pos="9354"/>
         </w:tabs>
         <w:spacing w:before="80" w:after="60" w:line="240" w:lineRule="auto"/>
-        <w:ind w:left="283"/>
-        <w:rPr>
+        <w:ind w:left="283" w:firstLine="0"/>
+        <w:rPr>
+          <w:b/>
           <w:sz w:val="24"/>
         </w:rPr>
       </w:pPr>
@@ -1200,20 +1282,26 @@
     </w:p>
     <w:p>
       <w:pPr>
+        <w:pStyle w:val="ListParagraph"/>
+        <w:numPr>
+          <w:ilvl w:val="0"/>
+          <w:numId w:val="1"/>
+        </w:numPr>
         <w:spacing w:before="80" w:after="60" w:line="240" w:lineRule="auto"/>
-        <w:ind w:left="283"/>
-        <w:rPr>
+        <w:ind w:left="283" w:firstLine="0"/>
+        <w:rPr>
+          <w:b/>
           <w:sz w:val="24"/>
         </w:rPr>
       </w:pPr>
     </w:p>
     <w:sectPr>
-      <w:headerReference w:type="even" r:id="rId7"/>
-      <w:headerReference w:type="default" r:id="rId8"/>
-      <w:footerReference w:type="even" r:id="rId9"/>
-      <w:footerReference w:type="default" r:id="rId10"/>
-      <w:headerReference w:type="first" r:id="rId11"/>
-      <w:footerReference w:type="first" r:id="rId12"/>
+      <w:headerReference w:type="even" r:id="rId8"/>
+      <w:headerReference w:type="default" r:id="rId9"/>
+      <w:footerReference w:type="even" r:id="rId10"/>
+      <w:footerReference w:type="default" r:id="rId11"/>
+      <w:headerReference w:type="first" r:id="rId12"/>
+      <w:footerReference w:type="first" r:id="rId13"/>
       <w:pgSz w:w="11907" w:h="16840" w:code="9"/>
       <w:pgMar w:top="1134" w:right="850" w:bottom="1134" w:left="1701" w:header="720" w:footer="720" w:gutter="0"/>
       <w:cols w:space="720"/>
@@ -1324,7 +1412,7 @@
         <w:noProof/>
         <w:sz w:val="20"/>
       </w:rPr>
-      <w:t>2</w:t>
+      <w:t>1</w:t>
     </w:r>
     <w:r>
       <w:rPr>
@@ -1399,6 +1487,28 @@
     </w:pPr>
   </w:p>
 </w:hdr>
+</file>
+
+<file path=word/numbering.xml><?xml version="1.0" encoding="utf-8"?>
+<w:numbering xmlns:wpc="http://schemas.microsoft.com/office/word/2010/wordprocessingCanvas" xmlns:cx="http://schemas.microsoft.com/office/drawing/2014/chartex" xmlns:cx1="http://schemas.microsoft.com/office/drawing/2015/9/8/chartex" xmlns:cx2="http://schemas.microsoft.com/office/drawing/2015/10/21/chartex" xmlns:cx3="http://schemas.microsoft.com/office/drawing/2016/5/9/chartex" xmlns:cx4="http://schemas.microsoft.com/office/drawing/2016/5/10/chartex" xmlns:cx5="http://schemas.microsoft.com/office/drawing/2016/5/11/chartex" xmlns:cx6="http://schemas.microsoft.com/office/drawing/2016/5/12/chartex" xmlns:cx7="http://schemas.microsoft.com/office/drawing/2016/5/13/chartex" xmlns:cx8="http://schemas.microsoft.com/office/drawing/2016/5/14/chartex" xmlns:mc="http://schemas.openxmlformats.org/markup-compatibility/2006" xmlns:aink="http://schemas.microsoft.com/office/drawing/2016/ink" xmlns:am3d="http://schemas.microsoft.com/office/drawing/2017/model3d" xmlns:o="urn:schemas-microsoft-com:office:office" xmlns:oel="http://schemas.microsoft.com/office/2019/extlst" xmlns:r="http://schemas.openxmlformats.org/officeDocument/2006/relationships" xmlns:m="http://schemas.openxmlformats.org/officeDocument/2006/math" xmlns:v="urn:schemas-microsoft-com:vml" xmlns:wp14="http://schemas.microsoft.com/office/word/2010/wordprocessingDrawing" xmlns:wp="http://schemas.openxmlformats.org/drawingml/2006/wordprocessingDrawing" xmlns:w10="urn:schemas-microsoft-com:office:word" xmlns:w="http://schemas.openxmlformats.org/wordprocessingml/2006/main" xmlns:w14="http://schemas.microsoft.com/office/word/2010/wordml" xmlns:w15="http://schemas.microsoft.com/office/word/2012/wordml" xmlns:w16cei="http://schemas.microsoft.com/office/word/2026/wordml/cei" xmlns:w16cex="http://schemas.microsoft.com/office/word/2018/wordml/cex" xmlns:w16cid="http://schemas.microsoft.com/office/word/2016/wordml/cid" xmlns:w16="http://schemas.microsoft.com/office/word/2018/wordml" xmlns:w16du="http://schemas.microsoft.com/office/word/2023/wordml/word16du" xmlns:w16sdtdh="http://schemas.microsoft.com/office/word/2020/wordml/sdtdatahash" xmlns:w16sdtfl="http://schemas.microsoft.com/office/word/2024/wordml/sdtformatlock" xmlns:w16se="http://schemas.microsoft.com/office/word/2015/wordml/symex" xmlns:wpg="http://schemas.microsoft.com/office/word/2010/wordprocessingGroup" xmlns:wpi="http://schemas.microsoft.com/office/word/2010/wordprocessingInk" xmlns:wne="http://schemas.microsoft.com/office/word/2006/wordml" xmlns:wps="http://schemas.microsoft.com/office/word/2010/wordprocessingShape" mc:Ignorable="w14 w15 w16se w16cid w16 w16cex w16sdtdh w16sdtfl w16du wp14">
+  <w:abstractNum w:abstractNumId="0" w15:restartNumberingAfterBreak="0">
+    <w:nsid w:val="66050F78"/>
+    <w:multiLevelType w:val="singleLevel"/>
+    <w:tmpl w:val="0409000F"/>
+    <w:lvl w:ilvl="0">
+      <w:start w:val="1"/>
+      <w:numFmt w:val="decimal"/>
+      <w:lvlText w:val="%1."/>
+      <w:lvlJc w:val="left"/>
+      <w:pPr>
+        <w:ind w:left="720" w:hanging="360"/>
+      </w:pPr>
+    </w:lvl>
+  </w:abstractNum>
+  <w:num w:numId="1" w16cid:durableId="474953019">
+    <w:abstractNumId w:val="0"/>
+  </w:num>
+</w:numbering>
 </file>
 
 <file path=word/styles.xml><?xml version="1.0" encoding="utf-8"?>
@@ -1809,7 +1919,7 @@
     <w:link w:val="Heading1Char"/>
     <w:uiPriority w:val="9"/>
     <w:qFormat/>
-    <w:rsid w:val="00362565"/>
+    <w:rsid w:val="002627CA"/>
     <w:pPr>
       <w:keepNext/>
       <w:keepLines/>
@@ -1832,7 +1942,7 @@
     <w:semiHidden/>
     <w:unhideWhenUsed/>
     <w:qFormat/>
-    <w:rsid w:val="00362565"/>
+    <w:rsid w:val="002627CA"/>
     <w:pPr>
       <w:keepNext/>
       <w:keepLines/>
@@ -1855,7 +1965,7 @@
     <w:semiHidden/>
     <w:unhideWhenUsed/>
     <w:qFormat/>
-    <w:rsid w:val="00362565"/>
+    <w:rsid w:val="002627CA"/>
     <w:pPr>
       <w:keepNext/>
       <w:keepLines/>
@@ -1878,7 +1988,7 @@
     <w:semiHidden/>
     <w:unhideWhenUsed/>
     <w:qFormat/>
-    <w:rsid w:val="00362565"/>
+    <w:rsid w:val="002627CA"/>
     <w:pPr>
       <w:keepNext/>
       <w:keepLines/>
@@ -1901,7 +2011,7 @@
     <w:semiHidden/>
     <w:unhideWhenUsed/>
     <w:qFormat/>
-    <w:rsid w:val="00362565"/>
+    <w:rsid w:val="002627CA"/>
     <w:pPr>
       <w:keepNext/>
       <w:keepLines/>
@@ -1922,7 +2032,7 @@
     <w:semiHidden/>
     <w:unhideWhenUsed/>
     <w:qFormat/>
-    <w:rsid w:val="00362565"/>
+    <w:rsid w:val="002627CA"/>
     <w:pPr>
       <w:keepNext/>
       <w:keepLines/>
@@ -1945,7 +2055,7 @@
     <w:semiHidden/>
     <w:unhideWhenUsed/>
     <w:qFormat/>
-    <w:rsid w:val="00362565"/>
+    <w:rsid w:val="002627CA"/>
     <w:pPr>
       <w:keepNext/>
       <w:keepLines/>
@@ -1966,7 +2076,7 @@
     <w:semiHidden/>
     <w:unhideWhenUsed/>
     <w:qFormat/>
-    <w:rsid w:val="00362565"/>
+    <w:rsid w:val="002627CA"/>
     <w:pPr>
       <w:keepNext/>
       <w:keepLines/>
@@ -1989,7 +2099,7 @@
     <w:semiHidden/>
     <w:unhideWhenUsed/>
     <w:qFormat/>
-    <w:rsid w:val="00362565"/>
+    <w:rsid w:val="002627CA"/>
     <w:pPr>
       <w:keepNext/>
       <w:keepLines/>
@@ -2033,7 +2143,7 @@
     <w:basedOn w:val="DefaultParagraphFont"/>
     <w:link w:val="Heading1"/>
     <w:uiPriority w:val="9"/>
-    <w:rsid w:val="00362565"/>
+    <w:rsid w:val="002627CA"/>
     <w:rPr>
       <w:rFonts w:asciiTheme="majorHAnsi" w:eastAsiaTheme="majorEastAsia" w:hAnsiTheme="majorHAnsi" w:cstheme="majorBidi"/>
       <w:color w:val="0F4761" w:themeColor="accent1" w:themeShade="BF"/>
@@ -2047,7 +2157,7 @@
     <w:link w:val="Heading2"/>
     <w:uiPriority w:val="9"/>
     <w:semiHidden/>
-    <w:rsid w:val="00362565"/>
+    <w:rsid w:val="002627CA"/>
     <w:rPr>
       <w:rFonts w:asciiTheme="majorHAnsi" w:eastAsiaTheme="majorEastAsia" w:hAnsiTheme="majorHAnsi" w:cstheme="majorBidi"/>
       <w:color w:val="0F4761" w:themeColor="accent1" w:themeShade="BF"/>
@@ -2061,7 +2171,7 @@
     <w:link w:val="Heading3"/>
     <w:uiPriority w:val="9"/>
     <w:semiHidden/>
-    <w:rsid w:val="00362565"/>
+    <w:rsid w:val="002627CA"/>
     <w:rPr>
       <w:rFonts w:asciiTheme="minorHAnsi" w:eastAsiaTheme="majorEastAsia" w:hAnsiTheme="minorHAnsi" w:cstheme="majorBidi"/>
       <w:color w:val="0F4761" w:themeColor="accent1" w:themeShade="BF"/>
@@ -2075,7 +2185,7 @@
     <w:link w:val="Heading4"/>
     <w:uiPriority w:val="9"/>
     <w:semiHidden/>
-    <w:rsid w:val="00362565"/>
+    <w:rsid w:val="002627CA"/>
     <w:rPr>
       <w:rFonts w:asciiTheme="minorHAnsi" w:eastAsiaTheme="majorEastAsia" w:hAnsiTheme="minorHAnsi" w:cstheme="majorBidi"/>
       <w:i/>
@@ -2089,7 +2199,7 @@
     <w:link w:val="Heading5"/>
     <w:uiPriority w:val="9"/>
     <w:semiHidden/>
-    <w:rsid w:val="00362565"/>
+    <w:rsid w:val="002627CA"/>
     <w:rPr>
       <w:rFonts w:asciiTheme="minorHAnsi" w:eastAsiaTheme="majorEastAsia" w:hAnsiTheme="minorHAnsi" w:cstheme="majorBidi"/>
       <w:color w:val="0F4761" w:themeColor="accent1" w:themeShade="BF"/>
@@ -2101,7 +2211,7 @@
     <w:link w:val="Heading6"/>
     <w:uiPriority w:val="9"/>
     <w:semiHidden/>
-    <w:rsid w:val="00362565"/>
+    <w:rsid w:val="002627CA"/>
     <w:rPr>
       <w:rFonts w:asciiTheme="minorHAnsi" w:eastAsiaTheme="majorEastAsia" w:hAnsiTheme="minorHAnsi" w:cstheme="majorBidi"/>
       <w:i/>
@@ -2115,7 +2225,7 @@
     <w:link w:val="Heading7"/>
     <w:uiPriority w:val="9"/>
     <w:semiHidden/>
-    <w:rsid w:val="00362565"/>
+    <w:rsid w:val="002627CA"/>
     <w:rPr>
       <w:rFonts w:asciiTheme="minorHAnsi" w:eastAsiaTheme="majorEastAsia" w:hAnsiTheme="minorHAnsi" w:cstheme="majorBidi"/>
       <w:color w:val="595959" w:themeColor="text1" w:themeTint="A6"/>
@@ -2127,7 +2237,7 @@
     <w:link w:val="Heading8"/>
     <w:uiPriority w:val="9"/>
     <w:semiHidden/>
-    <w:rsid w:val="00362565"/>
+    <w:rsid w:val="002627CA"/>
     <w:rPr>
       <w:rFonts w:asciiTheme="minorHAnsi" w:eastAsiaTheme="majorEastAsia" w:hAnsiTheme="minorHAnsi" w:cstheme="majorBidi"/>
       <w:i/>
@@ -2141,7 +2251,7 @@
     <w:link w:val="Heading9"/>
     <w:uiPriority w:val="9"/>
     <w:semiHidden/>
-    <w:rsid w:val="00362565"/>
+    <w:rsid w:val="002627CA"/>
     <w:rPr>
       <w:rFonts w:asciiTheme="minorHAnsi" w:eastAsiaTheme="majorEastAsia" w:hAnsiTheme="minorHAnsi" w:cstheme="majorBidi"/>
       <w:color w:val="272727" w:themeColor="text1" w:themeTint="D8"/>
@@ -2154,7 +2264,7 @@
     <w:link w:val="TitleChar"/>
     <w:uiPriority w:val="10"/>
     <w:qFormat/>
-    <w:rsid w:val="00362565"/>
+    <w:rsid w:val="002627CA"/>
     <w:pPr>
       <w:spacing w:after="80" w:line="240" w:lineRule="auto"/>
       <w:contextualSpacing/>
@@ -2172,7 +2282,7 @@
     <w:basedOn w:val="DefaultParagraphFont"/>
     <w:link w:val="Title"/>
     <w:uiPriority w:val="10"/>
-    <w:rsid w:val="00362565"/>
+    <w:rsid w:val="002627CA"/>
     <w:rPr>
       <w:rFonts w:asciiTheme="majorHAnsi" w:eastAsiaTheme="majorEastAsia" w:hAnsiTheme="majorHAnsi" w:cstheme="majorBidi"/>
       <w:spacing w:val="-10"/>
@@ -2188,7 +2298,7 @@
     <w:link w:val="SubtitleChar"/>
     <w:uiPriority w:val="11"/>
     <w:qFormat/>
-    <w:rsid w:val="00362565"/>
+    <w:rsid w:val="002627CA"/>
     <w:pPr>
       <w:numPr>
         <w:ilvl w:val="1"/>
@@ -2207,7 +2317,7 @@
     <w:basedOn w:val="DefaultParagraphFont"/>
     <w:link w:val="Subtitle"/>
     <w:uiPriority w:val="11"/>
-    <w:rsid w:val="00362565"/>
+    <w:rsid w:val="002627CA"/>
     <w:rPr>
       <w:rFonts w:asciiTheme="minorHAnsi" w:eastAsiaTheme="majorEastAsia" w:hAnsiTheme="minorHAnsi" w:cstheme="majorBidi"/>
       <w:color w:val="595959" w:themeColor="text1" w:themeTint="A6"/>
@@ -2223,7 +2333,7 @@
     <w:link w:val="QuoteChar"/>
     <w:uiPriority w:val="29"/>
     <w:qFormat/>
-    <w:rsid w:val="00362565"/>
+    <w:rsid w:val="002627CA"/>
     <w:pPr>
       <w:spacing w:before="160"/>
       <w:jc w:val="center"/>
@@ -2239,7 +2349,7 @@
     <w:basedOn w:val="DefaultParagraphFont"/>
     <w:link w:val="Quote"/>
     <w:uiPriority w:val="29"/>
-    <w:rsid w:val="00362565"/>
+    <w:rsid w:val="002627CA"/>
     <w:rPr>
       <w:i/>
       <w:iCs/>
@@ -2251,7 +2361,7 @@
     <w:basedOn w:val="Normal"/>
     <w:uiPriority w:val="34"/>
     <w:qFormat/>
-    <w:rsid w:val="00362565"/>
+    <w:rsid w:val="002627CA"/>
     <w:pPr>
       <w:ind w:left="720"/>
       <w:contextualSpacing/>
@@ -2262,7 +2372,7 @@
     <w:basedOn w:val="DefaultParagraphFont"/>
     <w:uiPriority w:val="21"/>
     <w:qFormat/>
-    <w:rsid w:val="00362565"/>
+    <w:rsid w:val="002627CA"/>
     <w:rPr>
       <w:i/>
       <w:iCs/>
@@ -2276,7 +2386,7 @@
     <w:link w:val="IntenseQuoteChar"/>
     <w:uiPriority w:val="30"/>
     <w:qFormat/>
-    <w:rsid w:val="00362565"/>
+    <w:rsid w:val="002627CA"/>
     <w:pPr>
       <w:pBdr>
         <w:top w:val="single" w:sz="4" w:space="10" w:color="0F4761" w:themeColor="accent1" w:themeShade="BF"/>
@@ -2297,7 +2407,7 @@
     <w:basedOn w:val="DefaultParagraphFont"/>
     <w:link w:val="IntenseQuote"/>
     <w:uiPriority w:val="30"/>
-    <w:rsid w:val="00362565"/>
+    <w:rsid w:val="002627CA"/>
     <w:rPr>
       <w:i/>
       <w:iCs/>
@@ -2309,7 +2419,7 @@
     <w:basedOn w:val="DefaultParagraphFont"/>
     <w:uiPriority w:val="32"/>
     <w:qFormat/>
-    <w:rsid w:val="00362565"/>
+    <w:rsid w:val="002627CA"/>
     <w:rPr>
       <w:b/>
       <w:bCs/>
@@ -2324,7 +2434,7 @@
     <w:link w:val="HeaderChar"/>
     <w:uiPriority w:val="99"/>
     <w:unhideWhenUsed/>
-    <w:rsid w:val="00362565"/>
+    <w:rsid w:val="002627CA"/>
     <w:pPr>
       <w:tabs>
         <w:tab w:val="center" w:pos="4680"/>
@@ -2338,7 +2448,7 @@
     <w:basedOn w:val="DefaultParagraphFont"/>
     <w:link w:val="Header"/>
     <w:uiPriority w:val="99"/>
-    <w:rsid w:val="00362565"/>
+    <w:rsid w:val="002627CA"/>
   </w:style>
   <w:style w:type="paragraph" w:styleId="Footer">
     <w:name w:val="footer"/>
@@ -2346,7 +2456,7 @@
     <w:link w:val="FooterChar"/>
     <w:uiPriority w:val="99"/>
     <w:unhideWhenUsed/>
-    <w:rsid w:val="00362565"/>
+    <w:rsid w:val="002627CA"/>
     <w:pPr>
       <w:tabs>
         <w:tab w:val="center" w:pos="4680"/>
@@ -2360,7 +2470,7 @@
     <w:basedOn w:val="DefaultParagraphFont"/>
     <w:link w:val="Footer"/>
     <w:uiPriority w:val="99"/>
-    <w:rsid w:val="00362565"/>
+    <w:rsid w:val="002627CA"/>
   </w:style>
 </w:styles>
 </file>

</xml_diff>

<commit_message>
fix: make native list numbers bold by default, separated by space instead of tab, and remove list numbering on non-question P1 lines
</commit_message>
<xml_diff>
--- a/output/uln_document.docx
+++ b/output/uln_document.docx
@@ -47,6 +47,7 @@
           <w:numId w:val="1"/>
         </w:numPr>
         <w:spacing w:before="120" w:after="80"/>
+        <w:ind w:left="0" w:firstLine="0"/>
         <w:rPr>
           <w:b/>
           <w:sz w:val="24"/>
@@ -151,6 +152,7 @@
           <w:numId w:val="1"/>
         </w:numPr>
         <w:spacing w:before="120" w:after="80"/>
+        <w:ind w:left="0" w:firstLine="0"/>
         <w:rPr>
           <w:sz w:val="24"/>
         </w:rPr>
@@ -254,6 +256,7 @@
           <w:numId w:val="1"/>
         </w:numPr>
         <w:spacing w:before="120" w:after="80"/>
+        <w:ind w:left="0" w:firstLine="0"/>
         <w:rPr>
           <w:sz w:val="24"/>
         </w:rPr>
@@ -385,6 +388,7 @@
           <w:numId w:val="1"/>
         </w:numPr>
         <w:spacing w:before="120" w:after="80"/>
+        <w:ind w:left="0" w:firstLine="0"/>
         <w:rPr>
           <w:sz w:val="24"/>
         </w:rPr>
@@ -488,6 +492,7 @@
           <w:numId w:val="1"/>
         </w:numPr>
         <w:spacing w:before="120" w:after="80"/>
+        <w:ind w:left="0" w:firstLine="0"/>
         <w:rPr>
           <w:sz w:val="24"/>
         </w:rPr>
@@ -606,7 +611,7 @@
         <mc:AlternateContent>
           <mc:Choice Requires="wps">
             <w:drawing>
-              <wp:anchor distT="0" distB="0" distL="114300" distR="114300" simplePos="0" relativeHeight="251659264" behindDoc="0" locked="0" layoutInCell="1" allowOverlap="1" wp14:anchorId="2B34B278" wp14:editId="1FAF6835">
+              <wp:anchor distT="0" distB="0" distL="114300" distR="114300" simplePos="0" relativeHeight="251659264" behindDoc="0" locked="0" layoutInCell="1" allowOverlap="1" wp14:anchorId="518E563A" wp14:editId="5C8EC516">
                 <wp:simplePos x="0" y="0"/>
                 <wp:positionH relativeFrom="margin">
                   <wp:posOffset>1331595</wp:posOffset>
@@ -617,7 +622,7 @@
                 <wp:extent cx="3276600" cy="355600"/>
                 <wp:effectExtent l="0" t="0" r="19050" b="25400"/>
                 <wp:wrapNone/>
-                <wp:docPr id="1211450012" name="Rectangle: Rounded Corners 1"/>
+                <wp:docPr id="1574767411" name="Rectangle: Rounded Corners 1"/>
                 <wp:cNvGraphicFramePr/>
                 <a:graphic xmlns:a="http://schemas.openxmlformats.org/drawingml/2006/main">
                   <a:graphicData uri="http://schemas.microsoft.com/office/word/2010/wordprocessingShape">
@@ -680,7 +685,7 @@
           </mc:Choice>
           <mc:Fallback>
             <w:pict>
-              <v:roundrect w14:anchorId="64262990" id="Rectangle: Rounded Corners 1" o:spid="_x0000_s1026" style="position:absolute;margin-left:104.85pt;margin-top:-6pt;width:258pt;height:28pt;z-index:251659264;visibility:visible;mso-wrap-style:square;mso-wrap-distance-left:9pt;mso-wrap-distance-top:0;mso-wrap-distance-right:9pt;mso-wrap-distance-bottom:0;mso-position-horizontal:absolute;mso-position-horizontal-relative:margin;mso-position-vertical:absolute;mso-position-vertical-relative:text;v-text-anchor:middle" arcsize="10923f" o:gfxdata="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" filled="f" fillcolor="#156082 [3204]" strokeweight="1pt">
+              <v:roundrect w14:anchorId="18ED42A4" id="Rectangle: Rounded Corners 1" o:spid="_x0000_s1026" style="position:absolute;margin-left:104.85pt;margin-top:-6pt;width:258pt;height:28pt;z-index:251659264;visibility:visible;mso-wrap-style:square;mso-wrap-distance-left:9pt;mso-wrap-distance-top:0;mso-wrap-distance-right:9pt;mso-wrap-distance-bottom:0;mso-position-horizontal:absolute;mso-position-horizontal-relative:margin;mso-position-vertical:absolute;mso-position-vertical-relative:text;v-text-anchor:middle" arcsize="10923f" o:gfxdata="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" filled="f" fillcolor="#156082 [3204]" strokeweight="1pt">
                 <v:stroke joinstyle="miter"/>
                 <w10:wrap anchorx="margin"/>
               </v:roundrect>
@@ -727,13 +732,14 @@
         <w:pStyle w:val="ListParagraph"/>
         <w:numPr>
           <w:ilvl w:val="0"/>
-          <w:numId w:val="1"/>
+          <w:numId w:val="2"/>
         </w:numPr>
         <w:tabs>
           <w:tab w:val="left" w:pos="4137"/>
           <w:tab w:val="left" w:pos="6057"/>
         </w:tabs>
         <w:spacing w:before="120" w:after="80" w:line="480" w:lineRule="auto"/>
+        <w:ind w:left="0" w:firstLine="0"/>
         <w:rPr>
           <w:b/>
           <w:sz w:val="24"/>
@@ -855,9 +861,10 @@
         <w:pStyle w:val="ListParagraph"/>
         <w:numPr>
           <w:ilvl w:val="0"/>
-          <w:numId w:val="1"/>
+          <w:numId w:val="3"/>
         </w:numPr>
         <w:spacing w:before="120" w:after="80" w:line="480" w:lineRule="auto"/>
+        <w:ind w:left="0" w:firstLine="0"/>
         <w:rPr>
           <w:sz w:val="24"/>
         </w:rPr>
@@ -959,16 +966,22 @@
     </w:p>
     <w:p>
       <w:pPr>
+        <w:pStyle w:val="ListParagraph"/>
+        <w:numPr>
+          <w:ilvl w:val="0"/>
+          <w:numId w:val="3"/>
+        </w:numPr>
         <w:spacing w:before="60" w:after="60" w:line="240" w:lineRule="auto"/>
-        <w:rPr>
-          <w:sz w:val="24"/>
-        </w:rPr>
-      </w:pPr>
-      <w:r>
-        <w:rPr>
-          <w:sz w:val="24"/>
-        </w:rPr>
-        <w:t>#8. What does this traffic sign indicate?</w:t>
+        <w:ind w:left="0" w:firstLine="0"/>
+        <w:rPr>
+          <w:sz w:val="24"/>
+        </w:rPr>
+      </w:pPr>
+      <w:r>
+        <w:rPr>
+          <w:sz w:val="24"/>
+        </w:rPr>
+        <w:t>What does this traffic sign indicate?</w:t>
       </w:r>
     </w:p>
     <w:p>
@@ -986,7 +999,7 @@
           <w:sz w:val="24"/>
         </w:rPr>
         <w:drawing>
-          <wp:anchor distT="0" distB="0" distL="114300" distR="114300" simplePos="0" relativeHeight="251660288" behindDoc="0" locked="0" layoutInCell="1" allowOverlap="1" wp14:anchorId="273D7F17" wp14:editId="7D4153EB">
+          <wp:anchor distT="0" distB="0" distL="114300" distR="114300" simplePos="0" relativeHeight="251660288" behindDoc="0" locked="0" layoutInCell="1" allowOverlap="1" wp14:anchorId="6C2BCAE9" wp14:editId="67143864">
             <wp:simplePos x="0" y="0"/>
             <wp:positionH relativeFrom="margin">
               <wp:posOffset>4679950</wp:posOffset>
@@ -997,7 +1010,7 @@
             <wp:extent cx="1260000" cy="1008000"/>
             <wp:effectExtent l="0" t="0" r="0" b="1905"/>
             <wp:wrapNone/>
-            <wp:docPr id="1698498844" name="Picture 2"/>
+            <wp:docPr id="1717438928" name="Picture 2"/>
             <wp:cNvGraphicFramePr>
               <a:graphicFrameLocks xmlns:a="http://schemas.openxmlformats.org/drawingml/2006/main"/>
             </wp:cNvGraphicFramePr>
@@ -1005,7 +1018,7 @@
               <a:graphicData uri="http://schemas.openxmlformats.org/drawingml/2006/picture">
                 <pic:pic xmlns:pic="http://schemas.openxmlformats.org/drawingml/2006/picture">
                   <pic:nvPicPr>
-                    <pic:cNvPr id="1698498844" name=""/>
+                    <pic:cNvPr id="1717438928" name=""/>
                     <pic:cNvPicPr/>
                   </pic:nvPicPr>
                   <pic:blipFill>
@@ -1090,6 +1103,7 @@
           <w:b/>
           <w:sz w:val="24"/>
         </w:rPr>
+        <w:lastRenderedPageBreak/>
         <w:t xml:space="preserve">C. </w:t>
       </w:r>
       <w:r>
@@ -1134,7 +1148,6 @@
           <w:b/>
           <w:sz w:val="24"/>
         </w:rPr>
-        <w:lastRenderedPageBreak/>
         <w:t>II. ERROR CORRECTION</w:t>
       </w:r>
     </w:p>
@@ -1156,19 +1169,26 @@
     </w:p>
     <w:p>
       <w:pPr>
+        <w:pStyle w:val="ListParagraph"/>
+        <w:numPr>
+          <w:ilvl w:val="0"/>
+          <w:numId w:val="4"/>
+        </w:numPr>
         <w:tabs>
           <w:tab w:val="right" w:leader="heavy" w:pos="9354"/>
         </w:tabs>
         <w:spacing w:before="60" w:after="60" w:line="240" w:lineRule="auto"/>
-        <w:rPr>
-          <w:sz w:val="24"/>
-        </w:rPr>
-      </w:pPr>
-      <w:r>
-        <w:rPr>
-          <w:sz w:val="24"/>
-        </w:rPr>
-        <w:t xml:space="preserve">9. Nam is my </w:t>
+        <w:ind w:left="0" w:firstLine="0"/>
+        <w:rPr>
+          <w:b/>
+          <w:sz w:val="24"/>
+        </w:rPr>
+      </w:pPr>
+      <w:r>
+        <w:rPr>
+          <w:sz w:val="24"/>
+        </w:rPr>
+        <w:t xml:space="preserve">Nam is my </w:t>
       </w:r>
       <w:r>
         <w:rPr>
@@ -1227,9 +1247,10 @@
         <w:pStyle w:val="ListParagraph"/>
         <w:numPr>
           <w:ilvl w:val="0"/>
-          <w:numId w:val="1"/>
+          <w:numId w:val="5"/>
         </w:numPr>
         <w:spacing w:before="120" w:after="80" w:line="240" w:lineRule="auto"/>
+        <w:ind w:left="0" w:firstLine="0"/>
         <w:rPr>
           <w:b/>
           <w:sz w:val="24"/>
@@ -1247,7 +1268,7 @@
         <w:pStyle w:val="ListParagraph"/>
         <w:numPr>
           <w:ilvl w:val="0"/>
-          <w:numId w:val="1"/>
+          <w:numId w:val="5"/>
         </w:numPr>
         <w:tabs>
           <w:tab w:val="right" w:leader="heavy" w:pos="9354"/>
@@ -1285,7 +1306,7 @@
         <w:pStyle w:val="ListParagraph"/>
         <w:numPr>
           <w:ilvl w:val="0"/>
-          <w:numId w:val="1"/>
+          <w:numId w:val="5"/>
         </w:numPr>
         <w:spacing w:before="80" w:after="60" w:line="240" w:lineRule="auto"/>
         <w:ind w:left="283" w:firstLine="0"/>
@@ -1492,7 +1513,7 @@
 <file path=word/numbering.xml><?xml version="1.0" encoding="utf-8"?>
 <w:numbering xmlns:wpc="http://schemas.microsoft.com/office/word/2010/wordprocessingCanvas" xmlns:cx="http://schemas.microsoft.com/office/drawing/2014/chartex" xmlns:cx1="http://schemas.microsoft.com/office/drawing/2015/9/8/chartex" xmlns:cx2="http://schemas.microsoft.com/office/drawing/2015/10/21/chartex" xmlns:cx3="http://schemas.microsoft.com/office/drawing/2016/5/9/chartex" xmlns:cx4="http://schemas.microsoft.com/office/drawing/2016/5/10/chartex" xmlns:cx5="http://schemas.microsoft.com/office/drawing/2016/5/11/chartex" xmlns:cx6="http://schemas.microsoft.com/office/drawing/2016/5/12/chartex" xmlns:cx7="http://schemas.microsoft.com/office/drawing/2016/5/13/chartex" xmlns:cx8="http://schemas.microsoft.com/office/drawing/2016/5/14/chartex" xmlns:mc="http://schemas.openxmlformats.org/markup-compatibility/2006" xmlns:aink="http://schemas.microsoft.com/office/drawing/2016/ink" xmlns:am3d="http://schemas.microsoft.com/office/drawing/2017/model3d" xmlns:o="urn:schemas-microsoft-com:office:office" xmlns:oel="http://schemas.microsoft.com/office/2019/extlst" xmlns:r="http://schemas.openxmlformats.org/officeDocument/2006/relationships" xmlns:m="http://schemas.openxmlformats.org/officeDocument/2006/math" xmlns:v="urn:schemas-microsoft-com:vml" xmlns:wp14="http://schemas.microsoft.com/office/word/2010/wordprocessingDrawing" xmlns:wp="http://schemas.openxmlformats.org/drawingml/2006/wordprocessingDrawing" xmlns:w10="urn:schemas-microsoft-com:office:word" xmlns:w="http://schemas.openxmlformats.org/wordprocessingml/2006/main" xmlns:w14="http://schemas.microsoft.com/office/word/2010/wordml" xmlns:w15="http://schemas.microsoft.com/office/word/2012/wordml" xmlns:w16cei="http://schemas.microsoft.com/office/word/2026/wordml/cei" xmlns:w16cex="http://schemas.microsoft.com/office/word/2018/wordml/cex" xmlns:w16cid="http://schemas.microsoft.com/office/word/2016/wordml/cid" xmlns:w16="http://schemas.microsoft.com/office/word/2018/wordml" xmlns:w16du="http://schemas.microsoft.com/office/word/2023/wordml/word16du" xmlns:w16sdtdh="http://schemas.microsoft.com/office/word/2020/wordml/sdtdatahash" xmlns:w16sdtfl="http://schemas.microsoft.com/office/word/2024/wordml/sdtformatlock" xmlns:w16se="http://schemas.microsoft.com/office/word/2015/wordml/symex" xmlns:wpg="http://schemas.microsoft.com/office/word/2010/wordprocessingGroup" xmlns:wpi="http://schemas.microsoft.com/office/word/2010/wordprocessingInk" xmlns:wne="http://schemas.microsoft.com/office/word/2006/wordml" xmlns:wps="http://schemas.microsoft.com/office/word/2010/wordprocessingShape" mc:Ignorable="w14 w15 w16se w16cid w16 w16cex w16sdtdh w16sdtfl w16du wp14">
   <w:abstractNum w:abstractNumId="0" w15:restartNumberingAfterBreak="0">
-    <w:nsid w:val="66050F78"/>
+    <w:nsid w:val="126321DD"/>
     <w:multiLevelType w:val="singleLevel"/>
     <w:tmpl w:val="0409000F"/>
     <w:lvl w:ilvl="0">
@@ -1503,9 +1524,92 @@
       <w:pPr>
         <w:ind w:left="720" w:hanging="360"/>
       </w:pPr>
+      <w:rPr>
+        <w:rFonts w:hint="default"/>
+      </w:rPr>
     </w:lvl>
   </w:abstractNum>
-  <w:num w:numId="1" w16cid:durableId="474953019">
+  <w:abstractNum w:abstractNumId="1" w15:restartNumberingAfterBreak="0">
+    <w:nsid w:val="315B3488"/>
+    <w:multiLevelType w:val="singleLevel"/>
+    <w:tmpl w:val="0409000F"/>
+    <w:lvl w:ilvl="0">
+      <w:start w:val="1"/>
+      <w:numFmt w:val="decimal"/>
+      <w:lvlText w:val="%1."/>
+      <w:lvlJc w:val="left"/>
+      <w:pPr>
+        <w:ind w:left="720" w:hanging="360"/>
+      </w:pPr>
+      <w:rPr>
+        <w:rFonts w:hint="default"/>
+      </w:rPr>
+    </w:lvl>
+  </w:abstractNum>
+  <w:abstractNum w:abstractNumId="2" w15:restartNumberingAfterBreak="0">
+    <w:nsid w:val="39605DF7"/>
+    <w:multiLevelType w:val="singleLevel"/>
+    <w:tmpl w:val="0409000F"/>
+    <w:lvl w:ilvl="0">
+      <w:start w:val="1"/>
+      <w:numFmt w:val="decimal"/>
+      <w:lvlText w:val="%1."/>
+      <w:lvlJc w:val="left"/>
+      <w:pPr>
+        <w:ind w:left="720" w:hanging="360"/>
+      </w:pPr>
+      <w:rPr>
+        <w:rFonts w:hint="default"/>
+      </w:rPr>
+    </w:lvl>
+  </w:abstractNum>
+  <w:abstractNum w:abstractNumId="3" w15:restartNumberingAfterBreak="0">
+    <w:nsid w:val="63A150A5"/>
+    <w:multiLevelType w:val="singleLevel"/>
+    <w:tmpl w:val="0409000F"/>
+    <w:lvl w:ilvl="0">
+      <w:start w:val="1"/>
+      <w:numFmt w:val="decimal"/>
+      <w:lvlText w:val="%1."/>
+      <w:lvlJc w:val="left"/>
+      <w:pPr>
+        <w:ind w:left="720" w:hanging="360"/>
+      </w:pPr>
+      <w:rPr>
+        <w:rFonts w:hint="default"/>
+      </w:rPr>
+    </w:lvl>
+  </w:abstractNum>
+  <w:abstractNum w:abstractNumId="4" w15:restartNumberingAfterBreak="0">
+    <w:nsid w:val="6D1E6D73"/>
+    <w:multiLevelType w:val="singleLevel"/>
+    <w:tmpl w:val="0409000F"/>
+    <w:lvl w:ilvl="0">
+      <w:start w:val="1"/>
+      <w:numFmt w:val="decimal"/>
+      <w:lvlText w:val="%1."/>
+      <w:lvlJc w:val="left"/>
+      <w:pPr>
+        <w:ind w:left="720" w:hanging="360"/>
+      </w:pPr>
+      <w:rPr>
+        <w:rFonts w:hint="default"/>
+      </w:rPr>
+    </w:lvl>
+  </w:abstractNum>
+  <w:num w:numId="1" w16cid:durableId="153842928">
+    <w:abstractNumId w:val="3"/>
+  </w:num>
+  <w:num w:numId="2" w16cid:durableId="384763836">
+    <w:abstractNumId w:val="4"/>
+  </w:num>
+  <w:num w:numId="3" w16cid:durableId="1764110506">
+    <w:abstractNumId w:val="1"/>
+  </w:num>
+  <w:num w:numId="4" w16cid:durableId="461383226">
+    <w:abstractNumId w:val="2"/>
+  </w:num>
+  <w:num w:numId="5" w16cid:durableId="979652056">
     <w:abstractNumId w:val="0"/>
   </w:num>
 </w:numbering>
@@ -1919,7 +2023,7 @@
     <w:link w:val="Heading1Char"/>
     <w:uiPriority w:val="9"/>
     <w:qFormat/>
-    <w:rsid w:val="002627CA"/>
+    <w:rsid w:val="0039794A"/>
     <w:pPr>
       <w:keepNext/>
       <w:keepLines/>
@@ -1942,7 +2046,7 @@
     <w:semiHidden/>
     <w:unhideWhenUsed/>
     <w:qFormat/>
-    <w:rsid w:val="002627CA"/>
+    <w:rsid w:val="0039794A"/>
     <w:pPr>
       <w:keepNext/>
       <w:keepLines/>
@@ -1965,7 +2069,7 @@
     <w:semiHidden/>
     <w:unhideWhenUsed/>
     <w:qFormat/>
-    <w:rsid w:val="002627CA"/>
+    <w:rsid w:val="0039794A"/>
     <w:pPr>
       <w:keepNext/>
       <w:keepLines/>
@@ -1988,7 +2092,7 @@
     <w:semiHidden/>
     <w:unhideWhenUsed/>
     <w:qFormat/>
-    <w:rsid w:val="002627CA"/>
+    <w:rsid w:val="0039794A"/>
     <w:pPr>
       <w:keepNext/>
       <w:keepLines/>
@@ -2011,7 +2115,7 @@
     <w:semiHidden/>
     <w:unhideWhenUsed/>
     <w:qFormat/>
-    <w:rsid w:val="002627CA"/>
+    <w:rsid w:val="0039794A"/>
     <w:pPr>
       <w:keepNext/>
       <w:keepLines/>
@@ -2032,7 +2136,7 @@
     <w:semiHidden/>
     <w:unhideWhenUsed/>
     <w:qFormat/>
-    <w:rsid w:val="002627CA"/>
+    <w:rsid w:val="0039794A"/>
     <w:pPr>
       <w:keepNext/>
       <w:keepLines/>
@@ -2055,7 +2159,7 @@
     <w:semiHidden/>
     <w:unhideWhenUsed/>
     <w:qFormat/>
-    <w:rsid w:val="002627CA"/>
+    <w:rsid w:val="0039794A"/>
     <w:pPr>
       <w:keepNext/>
       <w:keepLines/>
@@ -2076,7 +2180,7 @@
     <w:semiHidden/>
     <w:unhideWhenUsed/>
     <w:qFormat/>
-    <w:rsid w:val="002627CA"/>
+    <w:rsid w:val="0039794A"/>
     <w:pPr>
       <w:keepNext/>
       <w:keepLines/>
@@ -2099,7 +2203,7 @@
     <w:semiHidden/>
     <w:unhideWhenUsed/>
     <w:qFormat/>
-    <w:rsid w:val="002627CA"/>
+    <w:rsid w:val="0039794A"/>
     <w:pPr>
       <w:keepNext/>
       <w:keepLines/>
@@ -2143,7 +2247,7 @@
     <w:basedOn w:val="DefaultParagraphFont"/>
     <w:link w:val="Heading1"/>
     <w:uiPriority w:val="9"/>
-    <w:rsid w:val="002627CA"/>
+    <w:rsid w:val="0039794A"/>
     <w:rPr>
       <w:rFonts w:asciiTheme="majorHAnsi" w:eastAsiaTheme="majorEastAsia" w:hAnsiTheme="majorHAnsi" w:cstheme="majorBidi"/>
       <w:color w:val="0F4761" w:themeColor="accent1" w:themeShade="BF"/>
@@ -2157,7 +2261,7 @@
     <w:link w:val="Heading2"/>
     <w:uiPriority w:val="9"/>
     <w:semiHidden/>
-    <w:rsid w:val="002627CA"/>
+    <w:rsid w:val="0039794A"/>
     <w:rPr>
       <w:rFonts w:asciiTheme="majorHAnsi" w:eastAsiaTheme="majorEastAsia" w:hAnsiTheme="majorHAnsi" w:cstheme="majorBidi"/>
       <w:color w:val="0F4761" w:themeColor="accent1" w:themeShade="BF"/>
@@ -2171,7 +2275,7 @@
     <w:link w:val="Heading3"/>
     <w:uiPriority w:val="9"/>
     <w:semiHidden/>
-    <w:rsid w:val="002627CA"/>
+    <w:rsid w:val="0039794A"/>
     <w:rPr>
       <w:rFonts w:asciiTheme="minorHAnsi" w:eastAsiaTheme="majorEastAsia" w:hAnsiTheme="minorHAnsi" w:cstheme="majorBidi"/>
       <w:color w:val="0F4761" w:themeColor="accent1" w:themeShade="BF"/>
@@ -2185,7 +2289,7 @@
     <w:link w:val="Heading4"/>
     <w:uiPriority w:val="9"/>
     <w:semiHidden/>
-    <w:rsid w:val="002627CA"/>
+    <w:rsid w:val="0039794A"/>
     <w:rPr>
       <w:rFonts w:asciiTheme="minorHAnsi" w:eastAsiaTheme="majorEastAsia" w:hAnsiTheme="minorHAnsi" w:cstheme="majorBidi"/>
       <w:i/>
@@ -2199,7 +2303,7 @@
     <w:link w:val="Heading5"/>
     <w:uiPriority w:val="9"/>
     <w:semiHidden/>
-    <w:rsid w:val="002627CA"/>
+    <w:rsid w:val="0039794A"/>
     <w:rPr>
       <w:rFonts w:asciiTheme="minorHAnsi" w:eastAsiaTheme="majorEastAsia" w:hAnsiTheme="minorHAnsi" w:cstheme="majorBidi"/>
       <w:color w:val="0F4761" w:themeColor="accent1" w:themeShade="BF"/>
@@ -2211,7 +2315,7 @@
     <w:link w:val="Heading6"/>
     <w:uiPriority w:val="9"/>
     <w:semiHidden/>
-    <w:rsid w:val="002627CA"/>
+    <w:rsid w:val="0039794A"/>
     <w:rPr>
       <w:rFonts w:asciiTheme="minorHAnsi" w:eastAsiaTheme="majorEastAsia" w:hAnsiTheme="minorHAnsi" w:cstheme="majorBidi"/>
       <w:i/>
@@ -2225,7 +2329,7 @@
     <w:link w:val="Heading7"/>
     <w:uiPriority w:val="9"/>
     <w:semiHidden/>
-    <w:rsid w:val="002627CA"/>
+    <w:rsid w:val="0039794A"/>
     <w:rPr>
       <w:rFonts w:asciiTheme="minorHAnsi" w:eastAsiaTheme="majorEastAsia" w:hAnsiTheme="minorHAnsi" w:cstheme="majorBidi"/>
       <w:color w:val="595959" w:themeColor="text1" w:themeTint="A6"/>
@@ -2237,7 +2341,7 @@
     <w:link w:val="Heading8"/>
     <w:uiPriority w:val="9"/>
     <w:semiHidden/>
-    <w:rsid w:val="002627CA"/>
+    <w:rsid w:val="0039794A"/>
     <w:rPr>
       <w:rFonts w:asciiTheme="minorHAnsi" w:eastAsiaTheme="majorEastAsia" w:hAnsiTheme="minorHAnsi" w:cstheme="majorBidi"/>
       <w:i/>
@@ -2251,7 +2355,7 @@
     <w:link w:val="Heading9"/>
     <w:uiPriority w:val="9"/>
     <w:semiHidden/>
-    <w:rsid w:val="002627CA"/>
+    <w:rsid w:val="0039794A"/>
     <w:rPr>
       <w:rFonts w:asciiTheme="minorHAnsi" w:eastAsiaTheme="majorEastAsia" w:hAnsiTheme="minorHAnsi" w:cstheme="majorBidi"/>
       <w:color w:val="272727" w:themeColor="text1" w:themeTint="D8"/>
@@ -2264,7 +2368,7 @@
     <w:link w:val="TitleChar"/>
     <w:uiPriority w:val="10"/>
     <w:qFormat/>
-    <w:rsid w:val="002627CA"/>
+    <w:rsid w:val="0039794A"/>
     <w:pPr>
       <w:spacing w:after="80" w:line="240" w:lineRule="auto"/>
       <w:contextualSpacing/>
@@ -2282,7 +2386,7 @@
     <w:basedOn w:val="DefaultParagraphFont"/>
     <w:link w:val="Title"/>
     <w:uiPriority w:val="10"/>
-    <w:rsid w:val="002627CA"/>
+    <w:rsid w:val="0039794A"/>
     <w:rPr>
       <w:rFonts w:asciiTheme="majorHAnsi" w:eastAsiaTheme="majorEastAsia" w:hAnsiTheme="majorHAnsi" w:cstheme="majorBidi"/>
       <w:spacing w:val="-10"/>
@@ -2298,7 +2402,7 @@
     <w:link w:val="SubtitleChar"/>
     <w:uiPriority w:val="11"/>
     <w:qFormat/>
-    <w:rsid w:val="002627CA"/>
+    <w:rsid w:val="0039794A"/>
     <w:pPr>
       <w:numPr>
         <w:ilvl w:val="1"/>
@@ -2317,7 +2421,7 @@
     <w:basedOn w:val="DefaultParagraphFont"/>
     <w:link w:val="Subtitle"/>
     <w:uiPriority w:val="11"/>
-    <w:rsid w:val="002627CA"/>
+    <w:rsid w:val="0039794A"/>
     <w:rPr>
       <w:rFonts w:asciiTheme="minorHAnsi" w:eastAsiaTheme="majorEastAsia" w:hAnsiTheme="minorHAnsi" w:cstheme="majorBidi"/>
       <w:color w:val="595959" w:themeColor="text1" w:themeTint="A6"/>
@@ -2333,7 +2437,7 @@
     <w:link w:val="QuoteChar"/>
     <w:uiPriority w:val="29"/>
     <w:qFormat/>
-    <w:rsid w:val="002627CA"/>
+    <w:rsid w:val="0039794A"/>
     <w:pPr>
       <w:spacing w:before="160"/>
       <w:jc w:val="center"/>
@@ -2349,7 +2453,7 @@
     <w:basedOn w:val="DefaultParagraphFont"/>
     <w:link w:val="Quote"/>
     <w:uiPriority w:val="29"/>
-    <w:rsid w:val="002627CA"/>
+    <w:rsid w:val="0039794A"/>
     <w:rPr>
       <w:i/>
       <w:iCs/>
@@ -2361,7 +2465,7 @@
     <w:basedOn w:val="Normal"/>
     <w:uiPriority w:val="34"/>
     <w:qFormat/>
-    <w:rsid w:val="002627CA"/>
+    <w:rsid w:val="0039794A"/>
     <w:pPr>
       <w:ind w:left="720"/>
       <w:contextualSpacing/>
@@ -2372,7 +2476,7 @@
     <w:basedOn w:val="DefaultParagraphFont"/>
     <w:uiPriority w:val="21"/>
     <w:qFormat/>
-    <w:rsid w:val="002627CA"/>
+    <w:rsid w:val="0039794A"/>
     <w:rPr>
       <w:i/>
       <w:iCs/>
@@ -2386,7 +2490,7 @@
     <w:link w:val="IntenseQuoteChar"/>
     <w:uiPriority w:val="30"/>
     <w:qFormat/>
-    <w:rsid w:val="002627CA"/>
+    <w:rsid w:val="0039794A"/>
     <w:pPr>
       <w:pBdr>
         <w:top w:val="single" w:sz="4" w:space="10" w:color="0F4761" w:themeColor="accent1" w:themeShade="BF"/>
@@ -2407,7 +2511,7 @@
     <w:basedOn w:val="DefaultParagraphFont"/>
     <w:link w:val="IntenseQuote"/>
     <w:uiPriority w:val="30"/>
-    <w:rsid w:val="002627CA"/>
+    <w:rsid w:val="0039794A"/>
     <w:rPr>
       <w:i/>
       <w:iCs/>
@@ -2419,7 +2523,7 @@
     <w:basedOn w:val="DefaultParagraphFont"/>
     <w:uiPriority w:val="32"/>
     <w:qFormat/>
-    <w:rsid w:val="002627CA"/>
+    <w:rsid w:val="0039794A"/>
     <w:rPr>
       <w:b/>
       <w:bCs/>
@@ -2434,7 +2538,7 @@
     <w:link w:val="HeaderChar"/>
     <w:uiPriority w:val="99"/>
     <w:unhideWhenUsed/>
-    <w:rsid w:val="002627CA"/>
+    <w:rsid w:val="0039794A"/>
     <w:pPr>
       <w:tabs>
         <w:tab w:val="center" w:pos="4680"/>
@@ -2448,7 +2552,7 @@
     <w:basedOn w:val="DefaultParagraphFont"/>
     <w:link w:val="Header"/>
     <w:uiPriority w:val="99"/>
-    <w:rsid w:val="002627CA"/>
+    <w:rsid w:val="0039794A"/>
   </w:style>
   <w:style w:type="paragraph" w:styleId="Footer">
     <w:name w:val="footer"/>
@@ -2456,7 +2560,7 @@
     <w:link w:val="FooterChar"/>
     <w:uiPriority w:val="99"/>
     <w:unhideWhenUsed/>
-    <w:rsid w:val="002627CA"/>
+    <w:rsid w:val="0039794A"/>
     <w:pPr>
       <w:tabs>
         <w:tab w:val="center" w:pos="4680"/>
@@ -2470,7 +2574,7 @@
     <w:basedOn w:val="DefaultParagraphFont"/>
     <w:link w:val="Footer"/>
     <w:uiPriority w:val="99"/>
-    <w:rsid w:val="002627CA"/>
+    <w:rsid w:val="0039794A"/>
   </w:style>
 </w:styles>
 </file>

</xml_diff>

<commit_message>
fix: change ListGalleries index from 1 (bullets gallery) to 2 (numbered list gallery)
</commit_message>
<xml_diff>
--- a/output/uln_document.docx
+++ b/output/uln_document.docx
@@ -44,10 +44,9 @@
         <w:pStyle w:val="ListParagraph"/>
         <w:numPr>
           <w:ilvl w:val="0"/>
-          <w:numId w:val="1"/>
+          <w:numId w:val="2"/>
         </w:numPr>
         <w:spacing w:before="120" w:after="80"/>
-        <w:ind w:left="0" w:firstLine="0"/>
         <w:rPr>
           <w:b/>
           <w:sz w:val="24"/>
@@ -149,10 +148,9 @@
         <w:pStyle w:val="ListParagraph"/>
         <w:numPr>
           <w:ilvl w:val="0"/>
-          <w:numId w:val="1"/>
+          <w:numId w:val="3"/>
         </w:numPr>
         <w:spacing w:before="120" w:after="80"/>
-        <w:ind w:left="0" w:firstLine="0"/>
         <w:rPr>
           <w:sz w:val="24"/>
         </w:rPr>
@@ -253,10 +251,9 @@
         <w:pStyle w:val="ListParagraph"/>
         <w:numPr>
           <w:ilvl w:val="0"/>
-          <w:numId w:val="1"/>
+          <w:numId w:val="4"/>
         </w:numPr>
         <w:spacing w:before="120" w:after="80"/>
-        <w:ind w:left="0" w:firstLine="0"/>
         <w:rPr>
           <w:sz w:val="24"/>
         </w:rPr>
@@ -385,10 +382,9 @@
         <w:pStyle w:val="ListParagraph"/>
         <w:numPr>
           <w:ilvl w:val="0"/>
-          <w:numId w:val="1"/>
+          <w:numId w:val="5"/>
         </w:numPr>
         <w:spacing w:before="120" w:after="80"/>
-        <w:ind w:left="0" w:firstLine="0"/>
         <w:rPr>
           <w:sz w:val="24"/>
         </w:rPr>
@@ -489,10 +485,9 @@
         <w:pStyle w:val="ListParagraph"/>
         <w:numPr>
           <w:ilvl w:val="0"/>
-          <w:numId w:val="1"/>
+          <w:numId w:val="6"/>
         </w:numPr>
         <w:spacing w:before="120" w:after="80"/>
-        <w:ind w:left="0" w:firstLine="0"/>
         <w:rPr>
           <w:sz w:val="24"/>
         </w:rPr>
@@ -611,7 +606,7 @@
         <mc:AlternateContent>
           <mc:Choice Requires="wps">
             <w:drawing>
-              <wp:anchor distT="0" distB="0" distL="114300" distR="114300" simplePos="0" relativeHeight="251659264" behindDoc="0" locked="0" layoutInCell="1" allowOverlap="1" wp14:anchorId="518E563A" wp14:editId="5C8EC516">
+              <wp:anchor distT="0" distB="0" distL="114300" distR="114300" simplePos="0" relativeHeight="251659264" behindDoc="0" locked="0" layoutInCell="1" allowOverlap="1" wp14:anchorId="3B571880" wp14:editId="76E79FD2">
                 <wp:simplePos x="0" y="0"/>
                 <wp:positionH relativeFrom="margin">
                   <wp:posOffset>1331595</wp:posOffset>
@@ -622,7 +617,7 @@
                 <wp:extent cx="3276600" cy="355600"/>
                 <wp:effectExtent l="0" t="0" r="19050" b="25400"/>
                 <wp:wrapNone/>
-                <wp:docPr id="1574767411" name="Rectangle: Rounded Corners 1"/>
+                <wp:docPr id="1692625690" name="Rectangle: Rounded Corners 1"/>
                 <wp:cNvGraphicFramePr/>
                 <a:graphic xmlns:a="http://schemas.openxmlformats.org/drawingml/2006/main">
                   <a:graphicData uri="http://schemas.microsoft.com/office/word/2010/wordprocessingShape">
@@ -685,7 +680,7 @@
           </mc:Choice>
           <mc:Fallback>
             <w:pict>
-              <v:roundrect w14:anchorId="18ED42A4" id="Rectangle: Rounded Corners 1" o:spid="_x0000_s1026" style="position:absolute;margin-left:104.85pt;margin-top:-6pt;width:258pt;height:28pt;z-index:251659264;visibility:visible;mso-wrap-style:square;mso-wrap-distance-left:9pt;mso-wrap-distance-top:0;mso-wrap-distance-right:9pt;mso-wrap-distance-bottom:0;mso-position-horizontal:absolute;mso-position-horizontal-relative:margin;mso-position-vertical:absolute;mso-position-vertical-relative:text;v-text-anchor:middle" arcsize="10923f" o:gfxdata="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" filled="f" fillcolor="#156082 [3204]" strokeweight="1pt">
+              <v:roundrect w14:anchorId="480E7A23" id="Rectangle: Rounded Corners 1" o:spid="_x0000_s1026" style="position:absolute;margin-left:104.85pt;margin-top:-6pt;width:258pt;height:28pt;z-index:251659264;visibility:visible;mso-wrap-style:square;mso-wrap-distance-left:9pt;mso-wrap-distance-top:0;mso-wrap-distance-right:9pt;mso-wrap-distance-bottom:0;mso-position-horizontal:absolute;mso-position-horizontal-relative:margin;mso-position-vertical:absolute;mso-position-vertical-relative:text;v-text-anchor:middle" arcsize="10923f" o:gfxdata="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" filled="f" fillcolor="#156082 [3204]" strokeweight="1pt">
                 <v:stroke joinstyle="miter"/>
                 <w10:wrap anchorx="margin"/>
               </v:roundrect>
@@ -732,14 +727,13 @@
         <w:pStyle w:val="ListParagraph"/>
         <w:numPr>
           <w:ilvl w:val="0"/>
-          <w:numId w:val="2"/>
+          <w:numId w:val="8"/>
         </w:numPr>
         <w:tabs>
           <w:tab w:val="left" w:pos="4137"/>
           <w:tab w:val="left" w:pos="6057"/>
         </w:tabs>
         <w:spacing w:before="120" w:after="80" w:line="480" w:lineRule="auto"/>
-        <w:ind w:left="0" w:firstLine="0"/>
         <w:rPr>
           <w:b/>
           <w:sz w:val="24"/>
@@ -861,10 +855,9 @@
         <w:pStyle w:val="ListParagraph"/>
         <w:numPr>
           <w:ilvl w:val="0"/>
-          <w:numId w:val="3"/>
+          <w:numId w:val="10"/>
         </w:numPr>
         <w:spacing w:before="120" w:after="80" w:line="480" w:lineRule="auto"/>
-        <w:ind w:left="0" w:firstLine="0"/>
         <w:rPr>
           <w:sz w:val="24"/>
         </w:rPr>
@@ -969,7 +962,7 @@
         <w:pStyle w:val="ListParagraph"/>
         <w:numPr>
           <w:ilvl w:val="0"/>
-          <w:numId w:val="3"/>
+          <w:numId w:val="11"/>
         </w:numPr>
         <w:spacing w:before="60" w:after="60" w:line="240" w:lineRule="auto"/>
         <w:ind w:left="0" w:firstLine="0"/>
@@ -999,7 +992,7 @@
           <w:sz w:val="24"/>
         </w:rPr>
         <w:drawing>
-          <wp:anchor distT="0" distB="0" distL="114300" distR="114300" simplePos="0" relativeHeight="251660288" behindDoc="0" locked="0" layoutInCell="1" allowOverlap="1" wp14:anchorId="6C2BCAE9" wp14:editId="67143864">
+          <wp:anchor distT="0" distB="0" distL="114300" distR="114300" simplePos="0" relativeHeight="251660288" behindDoc="0" locked="0" layoutInCell="1" allowOverlap="1" wp14:anchorId="42ED32FF" wp14:editId="3433453B">
             <wp:simplePos x="0" y="0"/>
             <wp:positionH relativeFrom="margin">
               <wp:posOffset>4679950</wp:posOffset>
@@ -1010,7 +1003,7 @@
             <wp:extent cx="1260000" cy="1008000"/>
             <wp:effectExtent l="0" t="0" r="0" b="1905"/>
             <wp:wrapNone/>
-            <wp:docPr id="1717438928" name="Picture 2"/>
+            <wp:docPr id="1183956848" name="Picture 2"/>
             <wp:cNvGraphicFramePr>
               <a:graphicFrameLocks xmlns:a="http://schemas.openxmlformats.org/drawingml/2006/main"/>
             </wp:cNvGraphicFramePr>
@@ -1018,11 +1011,11 @@
               <a:graphicData uri="http://schemas.openxmlformats.org/drawingml/2006/picture">
                 <pic:pic xmlns:pic="http://schemas.openxmlformats.org/drawingml/2006/picture">
                   <pic:nvPicPr>
-                    <pic:cNvPr id="1717438928" name=""/>
+                    <pic:cNvPr id="1183956848" name=""/>
                     <pic:cNvPicPr/>
                   </pic:nvPicPr>
                   <pic:blipFill>
-                    <a:blip r:embed="rId7">
+                    <a:blip r:embed="rId7" cstate="print">
                       <a:extLst>
                         <a:ext uri="{28A0092B-C50C-407E-A947-70E740481C1C}">
                           <a14:useLocalDpi xmlns:a14="http://schemas.microsoft.com/office/drawing/2010/main" val="0"/>
@@ -1103,7 +1096,6 @@
           <w:b/>
           <w:sz w:val="24"/>
         </w:rPr>
-        <w:lastRenderedPageBreak/>
         <w:t xml:space="preserve">C. </w:t>
       </w:r>
       <w:r>
@@ -1148,6 +1140,7 @@
           <w:b/>
           <w:sz w:val="24"/>
         </w:rPr>
+        <w:lastRenderedPageBreak/>
         <w:t>II. ERROR CORRECTION</w:t>
       </w:r>
     </w:p>
@@ -1172,7 +1165,7 @@
         <w:pStyle w:val="ListParagraph"/>
         <w:numPr>
           <w:ilvl w:val="0"/>
-          <w:numId w:val="4"/>
+          <w:numId w:val="12"/>
         </w:numPr>
         <w:tabs>
           <w:tab w:val="right" w:leader="heavy" w:pos="9354"/>
@@ -1247,10 +1240,9 @@
         <w:pStyle w:val="ListParagraph"/>
         <w:numPr>
           <w:ilvl w:val="0"/>
-          <w:numId w:val="5"/>
+          <w:numId w:val="14"/>
         </w:numPr>
         <w:spacing w:before="120" w:after="80" w:line="240" w:lineRule="auto"/>
-        <w:ind w:left="0" w:firstLine="0"/>
         <w:rPr>
           <w:b/>
           <w:sz w:val="24"/>
@@ -1265,18 +1257,12 @@
     </w:p>
     <w:p>
       <w:pPr>
-        <w:pStyle w:val="ListParagraph"/>
-        <w:numPr>
-          <w:ilvl w:val="0"/>
-          <w:numId w:val="5"/>
-        </w:numPr>
         <w:tabs>
           <w:tab w:val="right" w:leader="heavy" w:pos="9354"/>
         </w:tabs>
         <w:spacing w:before="80" w:after="60" w:line="240" w:lineRule="auto"/>
-        <w:ind w:left="283" w:firstLine="0"/>
-        <w:rPr>
-          <w:b/>
+        <w:ind w:left="283"/>
+        <w:rPr>
           <w:sz w:val="24"/>
         </w:rPr>
       </w:pPr>
@@ -1303,15 +1289,9 @@
     </w:p>
     <w:p>
       <w:pPr>
-        <w:pStyle w:val="ListParagraph"/>
-        <w:numPr>
-          <w:ilvl w:val="0"/>
-          <w:numId w:val="5"/>
-        </w:numPr>
         <w:spacing w:before="80" w:after="60" w:line="240" w:lineRule="auto"/>
-        <w:ind w:left="283" w:firstLine="0"/>
-        <w:rPr>
-          <w:b/>
+        <w:ind w:left="283"/>
+        <w:rPr>
           <w:sz w:val="24"/>
         </w:rPr>
       </w:pPr>
@@ -1513,7 +1493,26 @@
 <file path=word/numbering.xml><?xml version="1.0" encoding="utf-8"?>
 <w:numbering xmlns:wpc="http://schemas.microsoft.com/office/word/2010/wordprocessingCanvas" xmlns:cx="http://schemas.microsoft.com/office/drawing/2014/chartex" xmlns:cx1="http://schemas.microsoft.com/office/drawing/2015/9/8/chartex" xmlns:cx2="http://schemas.microsoft.com/office/drawing/2015/10/21/chartex" xmlns:cx3="http://schemas.microsoft.com/office/drawing/2016/5/9/chartex" xmlns:cx4="http://schemas.microsoft.com/office/drawing/2016/5/10/chartex" xmlns:cx5="http://schemas.microsoft.com/office/drawing/2016/5/11/chartex" xmlns:cx6="http://schemas.microsoft.com/office/drawing/2016/5/12/chartex" xmlns:cx7="http://schemas.microsoft.com/office/drawing/2016/5/13/chartex" xmlns:cx8="http://schemas.microsoft.com/office/drawing/2016/5/14/chartex" xmlns:mc="http://schemas.openxmlformats.org/markup-compatibility/2006" xmlns:aink="http://schemas.microsoft.com/office/drawing/2016/ink" xmlns:am3d="http://schemas.microsoft.com/office/drawing/2017/model3d" xmlns:o="urn:schemas-microsoft-com:office:office" xmlns:oel="http://schemas.microsoft.com/office/2019/extlst" xmlns:r="http://schemas.openxmlformats.org/officeDocument/2006/relationships" xmlns:m="http://schemas.openxmlformats.org/officeDocument/2006/math" xmlns:v="urn:schemas-microsoft-com:vml" xmlns:wp14="http://schemas.microsoft.com/office/word/2010/wordprocessingDrawing" xmlns:wp="http://schemas.openxmlformats.org/drawingml/2006/wordprocessingDrawing" xmlns:w10="urn:schemas-microsoft-com:office:word" xmlns:w="http://schemas.openxmlformats.org/wordprocessingml/2006/main" xmlns:w14="http://schemas.microsoft.com/office/word/2010/wordml" xmlns:w15="http://schemas.microsoft.com/office/word/2012/wordml" xmlns:w16cei="http://schemas.microsoft.com/office/word/2026/wordml/cei" xmlns:w16cex="http://schemas.microsoft.com/office/word/2018/wordml/cex" xmlns:w16cid="http://schemas.microsoft.com/office/word/2016/wordml/cid" xmlns:w16="http://schemas.microsoft.com/office/word/2018/wordml" xmlns:w16du="http://schemas.microsoft.com/office/word/2023/wordml/word16du" xmlns:w16sdtdh="http://schemas.microsoft.com/office/word/2020/wordml/sdtdatahash" xmlns:w16sdtfl="http://schemas.microsoft.com/office/word/2024/wordml/sdtformatlock" xmlns:w16se="http://schemas.microsoft.com/office/word/2015/wordml/symex" xmlns:wpg="http://schemas.microsoft.com/office/word/2010/wordprocessingGroup" xmlns:wpi="http://schemas.microsoft.com/office/word/2010/wordprocessingInk" xmlns:wne="http://schemas.microsoft.com/office/word/2006/wordml" xmlns:wps="http://schemas.microsoft.com/office/word/2010/wordprocessingShape" mc:Ignorable="w14 w15 w16se w16cid w16 w16cex w16sdtdh w16sdtfl w16du wp14">
   <w:abstractNum w:abstractNumId="0" w15:restartNumberingAfterBreak="0">
-    <w:nsid w:val="126321DD"/>
+    <w:nsid w:val="0AD54344"/>
+    <w:multiLevelType w:val="singleLevel"/>
+    <w:tmpl w:val="DC9A9A80"/>
+    <w:lvl w:ilvl="0">
+      <w:start w:val="1"/>
+      <w:numFmt w:val="bullet"/>
+      <w:suff w:val="nothing"/>
+      <w:lvlText w:val=""/>
+      <w:lvlJc w:val="left"/>
+      <w:pPr>
+        <w:ind w:left="0" w:firstLine="0"/>
+      </w:pPr>
+      <w:rPr>
+        <w:rFonts w:ascii="Symbol" w:hAnsi="Symbol" w:hint="default"/>
+        <w:b/>
+      </w:rPr>
+    </w:lvl>
+  </w:abstractNum>
+  <w:abstractNum w:abstractNumId="1" w15:restartNumberingAfterBreak="0">
+    <w:nsid w:val="0D041160"/>
     <w:multiLevelType w:val="singleLevel"/>
     <w:tmpl w:val="0409000F"/>
     <w:lvl w:ilvl="0">
@@ -1526,11 +1525,183 @@
       </w:pPr>
       <w:rPr>
         <w:rFonts w:hint="default"/>
+        <w:b/>
       </w:rPr>
     </w:lvl>
   </w:abstractNum>
-  <w:abstractNum w:abstractNumId="1" w15:restartNumberingAfterBreak="0">
-    <w:nsid w:val="315B3488"/>
+  <w:abstractNum w:abstractNumId="2" w15:restartNumberingAfterBreak="0">
+    <w:nsid w:val="15DB33D5"/>
+    <w:multiLevelType w:val="singleLevel"/>
+    <w:tmpl w:val="DC9A9A80"/>
+    <w:lvl w:ilvl="0">
+      <w:start w:val="1"/>
+      <w:numFmt w:val="bullet"/>
+      <w:suff w:val="nothing"/>
+      <w:lvlText w:val=""/>
+      <w:lvlJc w:val="left"/>
+      <w:pPr>
+        <w:ind w:left="0" w:firstLine="0"/>
+      </w:pPr>
+      <w:rPr>
+        <w:rFonts w:ascii="Symbol" w:hAnsi="Symbol" w:hint="default"/>
+        <w:b/>
+      </w:rPr>
+    </w:lvl>
+  </w:abstractNum>
+  <w:abstractNum w:abstractNumId="3" w15:restartNumberingAfterBreak="0">
+    <w:nsid w:val="26913F00"/>
+    <w:multiLevelType w:val="singleLevel"/>
+    <w:tmpl w:val="DC9A9A80"/>
+    <w:lvl w:ilvl="0">
+      <w:start w:val="1"/>
+      <w:numFmt w:val="bullet"/>
+      <w:suff w:val="nothing"/>
+      <w:lvlText w:val=""/>
+      <w:lvlJc w:val="left"/>
+      <w:pPr>
+        <w:ind w:left="0" w:firstLine="0"/>
+      </w:pPr>
+      <w:rPr>
+        <w:rFonts w:ascii="Symbol" w:hAnsi="Symbol" w:hint="default"/>
+        <w:b/>
+      </w:rPr>
+    </w:lvl>
+  </w:abstractNum>
+  <w:abstractNum w:abstractNumId="4" w15:restartNumberingAfterBreak="0">
+    <w:nsid w:val="32CA2CA9"/>
+    <w:multiLevelType w:val="singleLevel"/>
+    <w:tmpl w:val="DC9A9A80"/>
+    <w:lvl w:ilvl="0">
+      <w:start w:val="1"/>
+      <w:numFmt w:val="bullet"/>
+      <w:suff w:val="nothing"/>
+      <w:lvlText w:val=""/>
+      <w:lvlJc w:val="left"/>
+      <w:pPr>
+        <w:ind w:left="0" w:firstLine="0"/>
+      </w:pPr>
+      <w:rPr>
+        <w:rFonts w:ascii="Symbol" w:hAnsi="Symbol" w:hint="default"/>
+        <w:b/>
+      </w:rPr>
+    </w:lvl>
+  </w:abstractNum>
+  <w:abstractNum w:abstractNumId="5" w15:restartNumberingAfterBreak="0">
+    <w:nsid w:val="34113E93"/>
+    <w:multiLevelType w:val="singleLevel"/>
+    <w:tmpl w:val="DC9A9A80"/>
+    <w:lvl w:ilvl="0">
+      <w:start w:val="1"/>
+      <w:numFmt w:val="bullet"/>
+      <w:suff w:val="nothing"/>
+      <w:lvlText w:val=""/>
+      <w:lvlJc w:val="left"/>
+      <w:pPr>
+        <w:ind w:left="0" w:firstLine="0"/>
+      </w:pPr>
+      <w:rPr>
+        <w:rFonts w:ascii="Symbol" w:hAnsi="Symbol" w:hint="default"/>
+        <w:b/>
+      </w:rPr>
+    </w:lvl>
+  </w:abstractNum>
+  <w:abstractNum w:abstractNumId="6" w15:restartNumberingAfterBreak="0">
+    <w:nsid w:val="35EF4FFB"/>
+    <w:multiLevelType w:val="singleLevel"/>
+    <w:tmpl w:val="DC9A9A80"/>
+    <w:lvl w:ilvl="0">
+      <w:start w:val="1"/>
+      <w:numFmt w:val="bullet"/>
+      <w:suff w:val="nothing"/>
+      <w:lvlText w:val=""/>
+      <w:lvlJc w:val="left"/>
+      <w:pPr>
+        <w:ind w:left="0" w:firstLine="0"/>
+      </w:pPr>
+      <w:rPr>
+        <w:rFonts w:ascii="Symbol" w:hAnsi="Symbol" w:hint="default"/>
+        <w:b/>
+      </w:rPr>
+    </w:lvl>
+  </w:abstractNum>
+  <w:abstractNum w:abstractNumId="7" w15:restartNumberingAfterBreak="0">
+    <w:nsid w:val="396F1999"/>
+    <w:multiLevelType w:val="singleLevel"/>
+    <w:tmpl w:val="DC9A9A80"/>
+    <w:lvl w:ilvl="0">
+      <w:start w:val="1"/>
+      <w:numFmt w:val="bullet"/>
+      <w:suff w:val="nothing"/>
+      <w:lvlText w:val=""/>
+      <w:lvlJc w:val="left"/>
+      <w:pPr>
+        <w:ind w:left="0" w:firstLine="0"/>
+      </w:pPr>
+      <w:rPr>
+        <w:rFonts w:ascii="Symbol" w:hAnsi="Symbol" w:hint="default"/>
+        <w:b/>
+      </w:rPr>
+    </w:lvl>
+  </w:abstractNum>
+  <w:abstractNum w:abstractNumId="8" w15:restartNumberingAfterBreak="0">
+    <w:nsid w:val="3A6F6ACD"/>
+    <w:multiLevelType w:val="singleLevel"/>
+    <w:tmpl w:val="DC9A9A80"/>
+    <w:lvl w:ilvl="0">
+      <w:start w:val="1"/>
+      <w:numFmt w:val="bullet"/>
+      <w:suff w:val="nothing"/>
+      <w:lvlText w:val=""/>
+      <w:lvlJc w:val="left"/>
+      <w:pPr>
+        <w:ind w:left="0" w:firstLine="0"/>
+      </w:pPr>
+      <w:rPr>
+        <w:rFonts w:ascii="Symbol" w:hAnsi="Symbol" w:hint="default"/>
+        <w:b/>
+      </w:rPr>
+    </w:lvl>
+  </w:abstractNum>
+  <w:abstractNum w:abstractNumId="9" w15:restartNumberingAfterBreak="0">
+    <w:nsid w:val="3CB53EAD"/>
+    <w:multiLevelType w:val="singleLevel"/>
+    <w:tmpl w:val="DC9A9A80"/>
+    <w:lvl w:ilvl="0">
+      <w:start w:val="1"/>
+      <w:numFmt w:val="bullet"/>
+      <w:suff w:val="nothing"/>
+      <w:lvlText w:val=""/>
+      <w:lvlJc w:val="left"/>
+      <w:pPr>
+        <w:ind w:left="0" w:firstLine="0"/>
+      </w:pPr>
+      <w:rPr>
+        <w:rFonts w:ascii="Symbol" w:hAnsi="Symbol" w:hint="default"/>
+        <w:b/>
+      </w:rPr>
+    </w:lvl>
+  </w:abstractNum>
+  <w:abstractNum w:abstractNumId="10" w15:restartNumberingAfterBreak="0">
+    <w:nsid w:val="592815D7"/>
+    <w:multiLevelType w:val="singleLevel"/>
+    <w:tmpl w:val="DC9A9A80"/>
+    <w:lvl w:ilvl="0">
+      <w:start w:val="1"/>
+      <w:numFmt w:val="bullet"/>
+      <w:suff w:val="nothing"/>
+      <w:lvlText w:val=""/>
+      <w:lvlJc w:val="left"/>
+      <w:pPr>
+        <w:ind w:left="0" w:firstLine="0"/>
+      </w:pPr>
+      <w:rPr>
+        <w:rFonts w:ascii="Symbol" w:hAnsi="Symbol" w:hint="default"/>
+        <w:b/>
+      </w:rPr>
+    </w:lvl>
+  </w:abstractNum>
+  <w:abstractNum w:abstractNumId="11" w15:restartNumberingAfterBreak="0">
+    <w:nsid w:val="65233379"/>
     <w:multiLevelType w:val="singleLevel"/>
     <w:tmpl w:val="0409000F"/>
     <w:lvl w:ilvl="0">
@@ -1541,76 +1712,87 @@
       <w:pPr>
         <w:ind w:left="720" w:hanging="360"/>
       </w:pPr>
+    </w:lvl>
+  </w:abstractNum>
+  <w:abstractNum w:abstractNumId="12" w15:restartNumberingAfterBreak="0">
+    <w:nsid w:val="72F45BAD"/>
+    <w:multiLevelType w:val="singleLevel"/>
+    <w:tmpl w:val="DC9A9A80"/>
+    <w:lvl w:ilvl="0">
+      <w:start w:val="1"/>
+      <w:numFmt w:val="bullet"/>
+      <w:suff w:val="nothing"/>
+      <w:lvlText w:val=""/>
+      <w:lvlJc w:val="left"/>
+      <w:pPr>
+        <w:ind w:left="0" w:firstLine="0"/>
+      </w:pPr>
       <w:rPr>
-        <w:rFonts w:hint="default"/>
+        <w:rFonts w:ascii="Symbol" w:hAnsi="Symbol" w:hint="default"/>
+        <w:b/>
       </w:rPr>
     </w:lvl>
   </w:abstractNum>
-  <w:abstractNum w:abstractNumId="2" w15:restartNumberingAfterBreak="0">
-    <w:nsid w:val="39605DF7"/>
+  <w:abstractNum w:abstractNumId="13" w15:restartNumberingAfterBreak="0">
+    <w:nsid w:val="7C7619F1"/>
     <w:multiLevelType w:val="singleLevel"/>
-    <w:tmpl w:val="0409000F"/>
+    <w:tmpl w:val="DC9A9A80"/>
     <w:lvl w:ilvl="0">
       <w:start w:val="1"/>
-      <w:numFmt w:val="decimal"/>
-      <w:lvlText w:val="%1."/>
+      <w:numFmt w:val="bullet"/>
+      <w:suff w:val="nothing"/>
+      <w:lvlText w:val=""/>
       <w:lvlJc w:val="left"/>
       <w:pPr>
-        <w:ind w:left="720" w:hanging="360"/>
+        <w:ind w:left="0" w:firstLine="0"/>
       </w:pPr>
       <w:rPr>
-        <w:rFonts w:hint="default"/>
+        <w:rFonts w:ascii="Symbol" w:hAnsi="Symbol" w:hint="default"/>
+        <w:b/>
       </w:rPr>
     </w:lvl>
   </w:abstractNum>
-  <w:abstractNum w:abstractNumId="3" w15:restartNumberingAfterBreak="0">
-    <w:nsid w:val="63A150A5"/>
-    <w:multiLevelType w:val="singleLevel"/>
-    <w:tmpl w:val="0409000F"/>
-    <w:lvl w:ilvl="0">
-      <w:start w:val="1"/>
-      <w:numFmt w:val="decimal"/>
-      <w:lvlText w:val="%1."/>
-      <w:lvlJc w:val="left"/>
-      <w:pPr>
-        <w:ind w:left="720" w:hanging="360"/>
-      </w:pPr>
-      <w:rPr>
-        <w:rFonts w:hint="default"/>
-      </w:rPr>
-    </w:lvl>
-  </w:abstractNum>
-  <w:abstractNum w:abstractNumId="4" w15:restartNumberingAfterBreak="0">
-    <w:nsid w:val="6D1E6D73"/>
-    <w:multiLevelType w:val="singleLevel"/>
-    <w:tmpl w:val="0409000F"/>
-    <w:lvl w:ilvl="0">
-      <w:start w:val="1"/>
-      <w:numFmt w:val="decimal"/>
-      <w:lvlText w:val="%1."/>
-      <w:lvlJc w:val="left"/>
-      <w:pPr>
-        <w:ind w:left="720" w:hanging="360"/>
-      </w:pPr>
-      <w:rPr>
-        <w:rFonts w:hint="default"/>
-      </w:rPr>
-    </w:lvl>
-  </w:abstractNum>
-  <w:num w:numId="1" w16cid:durableId="153842928">
+  <w:num w:numId="1" w16cid:durableId="268467764">
+    <w:abstractNumId w:val="10"/>
+  </w:num>
+  <w:num w:numId="2" w16cid:durableId="704791267">
+    <w:abstractNumId w:val="9"/>
+  </w:num>
+  <w:num w:numId="3" w16cid:durableId="373041257">
+    <w:abstractNumId w:val="0"/>
+  </w:num>
+  <w:num w:numId="4" w16cid:durableId="1687440401">
+    <w:abstractNumId w:val="13"/>
+  </w:num>
+  <w:num w:numId="5" w16cid:durableId="1178426932">
+    <w:abstractNumId w:val="6"/>
+  </w:num>
+  <w:num w:numId="6" w16cid:durableId="1367827887">
+    <w:abstractNumId w:val="4"/>
+  </w:num>
+  <w:num w:numId="7" w16cid:durableId="827131140">
     <w:abstractNumId w:val="3"/>
   </w:num>
-  <w:num w:numId="2" w16cid:durableId="384763836">
-    <w:abstractNumId w:val="4"/>
+  <w:num w:numId="8" w16cid:durableId="1391853911">
+    <w:abstractNumId w:val="2"/>
   </w:num>
-  <w:num w:numId="3" w16cid:durableId="1764110506">
+  <w:num w:numId="9" w16cid:durableId="344018528">
+    <w:abstractNumId w:val="12"/>
+  </w:num>
+  <w:num w:numId="10" w16cid:durableId="1623068947">
+    <w:abstractNumId w:val="5"/>
+  </w:num>
+  <w:num w:numId="11" w16cid:durableId="1373069867">
+    <w:abstractNumId w:val="11"/>
+  </w:num>
+  <w:num w:numId="12" w16cid:durableId="1999766261">
     <w:abstractNumId w:val="1"/>
   </w:num>
-  <w:num w:numId="4" w16cid:durableId="461383226">
-    <w:abstractNumId w:val="2"/>
+  <w:num w:numId="13" w16cid:durableId="221330336">
+    <w:abstractNumId w:val="7"/>
   </w:num>
-  <w:num w:numId="5" w16cid:durableId="979652056">
-    <w:abstractNumId w:val="0"/>
+  <w:num w:numId="14" w16cid:durableId="465976381">
+    <w:abstractNumId w:val="8"/>
   </w:num>
 </w:numbering>
 </file>
@@ -2023,7 +2205,7 @@
     <w:link w:val="Heading1Char"/>
     <w:uiPriority w:val="9"/>
     <w:qFormat/>
-    <w:rsid w:val="0039794A"/>
+    <w:rsid w:val="00E74D9E"/>
     <w:pPr>
       <w:keepNext/>
       <w:keepLines/>
@@ -2046,7 +2228,7 @@
     <w:semiHidden/>
     <w:unhideWhenUsed/>
     <w:qFormat/>
-    <w:rsid w:val="0039794A"/>
+    <w:rsid w:val="00E74D9E"/>
     <w:pPr>
       <w:keepNext/>
       <w:keepLines/>
@@ -2069,7 +2251,7 @@
     <w:semiHidden/>
     <w:unhideWhenUsed/>
     <w:qFormat/>
-    <w:rsid w:val="0039794A"/>
+    <w:rsid w:val="00E74D9E"/>
     <w:pPr>
       <w:keepNext/>
       <w:keepLines/>
@@ -2092,7 +2274,7 @@
     <w:semiHidden/>
     <w:unhideWhenUsed/>
     <w:qFormat/>
-    <w:rsid w:val="0039794A"/>
+    <w:rsid w:val="00E74D9E"/>
     <w:pPr>
       <w:keepNext/>
       <w:keepLines/>
@@ -2115,7 +2297,7 @@
     <w:semiHidden/>
     <w:unhideWhenUsed/>
     <w:qFormat/>
-    <w:rsid w:val="0039794A"/>
+    <w:rsid w:val="00E74D9E"/>
     <w:pPr>
       <w:keepNext/>
       <w:keepLines/>
@@ -2136,7 +2318,7 @@
     <w:semiHidden/>
     <w:unhideWhenUsed/>
     <w:qFormat/>
-    <w:rsid w:val="0039794A"/>
+    <w:rsid w:val="00E74D9E"/>
     <w:pPr>
       <w:keepNext/>
       <w:keepLines/>
@@ -2159,7 +2341,7 @@
     <w:semiHidden/>
     <w:unhideWhenUsed/>
     <w:qFormat/>
-    <w:rsid w:val="0039794A"/>
+    <w:rsid w:val="00E74D9E"/>
     <w:pPr>
       <w:keepNext/>
       <w:keepLines/>
@@ -2180,7 +2362,7 @@
     <w:semiHidden/>
     <w:unhideWhenUsed/>
     <w:qFormat/>
-    <w:rsid w:val="0039794A"/>
+    <w:rsid w:val="00E74D9E"/>
     <w:pPr>
       <w:keepNext/>
       <w:keepLines/>
@@ -2203,7 +2385,7 @@
     <w:semiHidden/>
     <w:unhideWhenUsed/>
     <w:qFormat/>
-    <w:rsid w:val="0039794A"/>
+    <w:rsid w:val="00E74D9E"/>
     <w:pPr>
       <w:keepNext/>
       <w:keepLines/>
@@ -2247,7 +2429,7 @@
     <w:basedOn w:val="DefaultParagraphFont"/>
     <w:link w:val="Heading1"/>
     <w:uiPriority w:val="9"/>
-    <w:rsid w:val="0039794A"/>
+    <w:rsid w:val="00E74D9E"/>
     <w:rPr>
       <w:rFonts w:asciiTheme="majorHAnsi" w:eastAsiaTheme="majorEastAsia" w:hAnsiTheme="majorHAnsi" w:cstheme="majorBidi"/>
       <w:color w:val="0F4761" w:themeColor="accent1" w:themeShade="BF"/>
@@ -2261,7 +2443,7 @@
     <w:link w:val="Heading2"/>
     <w:uiPriority w:val="9"/>
     <w:semiHidden/>
-    <w:rsid w:val="0039794A"/>
+    <w:rsid w:val="00E74D9E"/>
     <w:rPr>
       <w:rFonts w:asciiTheme="majorHAnsi" w:eastAsiaTheme="majorEastAsia" w:hAnsiTheme="majorHAnsi" w:cstheme="majorBidi"/>
       <w:color w:val="0F4761" w:themeColor="accent1" w:themeShade="BF"/>
@@ -2275,7 +2457,7 @@
     <w:link w:val="Heading3"/>
     <w:uiPriority w:val="9"/>
     <w:semiHidden/>
-    <w:rsid w:val="0039794A"/>
+    <w:rsid w:val="00E74D9E"/>
     <w:rPr>
       <w:rFonts w:asciiTheme="minorHAnsi" w:eastAsiaTheme="majorEastAsia" w:hAnsiTheme="minorHAnsi" w:cstheme="majorBidi"/>
       <w:color w:val="0F4761" w:themeColor="accent1" w:themeShade="BF"/>
@@ -2289,7 +2471,7 @@
     <w:link w:val="Heading4"/>
     <w:uiPriority w:val="9"/>
     <w:semiHidden/>
-    <w:rsid w:val="0039794A"/>
+    <w:rsid w:val="00E74D9E"/>
     <w:rPr>
       <w:rFonts w:asciiTheme="minorHAnsi" w:eastAsiaTheme="majorEastAsia" w:hAnsiTheme="minorHAnsi" w:cstheme="majorBidi"/>
       <w:i/>
@@ -2303,7 +2485,7 @@
     <w:link w:val="Heading5"/>
     <w:uiPriority w:val="9"/>
     <w:semiHidden/>
-    <w:rsid w:val="0039794A"/>
+    <w:rsid w:val="00E74D9E"/>
     <w:rPr>
       <w:rFonts w:asciiTheme="minorHAnsi" w:eastAsiaTheme="majorEastAsia" w:hAnsiTheme="minorHAnsi" w:cstheme="majorBidi"/>
       <w:color w:val="0F4761" w:themeColor="accent1" w:themeShade="BF"/>
@@ -2315,7 +2497,7 @@
     <w:link w:val="Heading6"/>
     <w:uiPriority w:val="9"/>
     <w:semiHidden/>
-    <w:rsid w:val="0039794A"/>
+    <w:rsid w:val="00E74D9E"/>
     <w:rPr>
       <w:rFonts w:asciiTheme="minorHAnsi" w:eastAsiaTheme="majorEastAsia" w:hAnsiTheme="minorHAnsi" w:cstheme="majorBidi"/>
       <w:i/>
@@ -2329,7 +2511,7 @@
     <w:link w:val="Heading7"/>
     <w:uiPriority w:val="9"/>
     <w:semiHidden/>
-    <w:rsid w:val="0039794A"/>
+    <w:rsid w:val="00E74D9E"/>
     <w:rPr>
       <w:rFonts w:asciiTheme="minorHAnsi" w:eastAsiaTheme="majorEastAsia" w:hAnsiTheme="minorHAnsi" w:cstheme="majorBidi"/>
       <w:color w:val="595959" w:themeColor="text1" w:themeTint="A6"/>
@@ -2341,7 +2523,7 @@
     <w:link w:val="Heading8"/>
     <w:uiPriority w:val="9"/>
     <w:semiHidden/>
-    <w:rsid w:val="0039794A"/>
+    <w:rsid w:val="00E74D9E"/>
     <w:rPr>
       <w:rFonts w:asciiTheme="minorHAnsi" w:eastAsiaTheme="majorEastAsia" w:hAnsiTheme="minorHAnsi" w:cstheme="majorBidi"/>
       <w:i/>
@@ -2355,7 +2537,7 @@
     <w:link w:val="Heading9"/>
     <w:uiPriority w:val="9"/>
     <w:semiHidden/>
-    <w:rsid w:val="0039794A"/>
+    <w:rsid w:val="00E74D9E"/>
     <w:rPr>
       <w:rFonts w:asciiTheme="minorHAnsi" w:eastAsiaTheme="majorEastAsia" w:hAnsiTheme="minorHAnsi" w:cstheme="majorBidi"/>
       <w:color w:val="272727" w:themeColor="text1" w:themeTint="D8"/>
@@ -2368,7 +2550,7 @@
     <w:link w:val="TitleChar"/>
     <w:uiPriority w:val="10"/>
     <w:qFormat/>
-    <w:rsid w:val="0039794A"/>
+    <w:rsid w:val="00E74D9E"/>
     <w:pPr>
       <w:spacing w:after="80" w:line="240" w:lineRule="auto"/>
       <w:contextualSpacing/>
@@ -2386,7 +2568,7 @@
     <w:basedOn w:val="DefaultParagraphFont"/>
     <w:link w:val="Title"/>
     <w:uiPriority w:val="10"/>
-    <w:rsid w:val="0039794A"/>
+    <w:rsid w:val="00E74D9E"/>
     <w:rPr>
       <w:rFonts w:asciiTheme="majorHAnsi" w:eastAsiaTheme="majorEastAsia" w:hAnsiTheme="majorHAnsi" w:cstheme="majorBidi"/>
       <w:spacing w:val="-10"/>
@@ -2402,7 +2584,7 @@
     <w:link w:val="SubtitleChar"/>
     <w:uiPriority w:val="11"/>
     <w:qFormat/>
-    <w:rsid w:val="0039794A"/>
+    <w:rsid w:val="00E74D9E"/>
     <w:pPr>
       <w:numPr>
         <w:ilvl w:val="1"/>
@@ -2421,7 +2603,7 @@
     <w:basedOn w:val="DefaultParagraphFont"/>
     <w:link w:val="Subtitle"/>
     <w:uiPriority w:val="11"/>
-    <w:rsid w:val="0039794A"/>
+    <w:rsid w:val="00E74D9E"/>
     <w:rPr>
       <w:rFonts w:asciiTheme="minorHAnsi" w:eastAsiaTheme="majorEastAsia" w:hAnsiTheme="minorHAnsi" w:cstheme="majorBidi"/>
       <w:color w:val="595959" w:themeColor="text1" w:themeTint="A6"/>
@@ -2437,7 +2619,7 @@
     <w:link w:val="QuoteChar"/>
     <w:uiPriority w:val="29"/>
     <w:qFormat/>
-    <w:rsid w:val="0039794A"/>
+    <w:rsid w:val="00E74D9E"/>
     <w:pPr>
       <w:spacing w:before="160"/>
       <w:jc w:val="center"/>
@@ -2453,7 +2635,7 @@
     <w:basedOn w:val="DefaultParagraphFont"/>
     <w:link w:val="Quote"/>
     <w:uiPriority w:val="29"/>
-    <w:rsid w:val="0039794A"/>
+    <w:rsid w:val="00E74D9E"/>
     <w:rPr>
       <w:i/>
       <w:iCs/>
@@ -2465,7 +2647,7 @@
     <w:basedOn w:val="Normal"/>
     <w:uiPriority w:val="34"/>
     <w:qFormat/>
-    <w:rsid w:val="0039794A"/>
+    <w:rsid w:val="00E74D9E"/>
     <w:pPr>
       <w:ind w:left="720"/>
       <w:contextualSpacing/>
@@ -2476,7 +2658,7 @@
     <w:basedOn w:val="DefaultParagraphFont"/>
     <w:uiPriority w:val="21"/>
     <w:qFormat/>
-    <w:rsid w:val="0039794A"/>
+    <w:rsid w:val="00E74D9E"/>
     <w:rPr>
       <w:i/>
       <w:iCs/>
@@ -2490,7 +2672,7 @@
     <w:link w:val="IntenseQuoteChar"/>
     <w:uiPriority w:val="30"/>
     <w:qFormat/>
-    <w:rsid w:val="0039794A"/>
+    <w:rsid w:val="00E74D9E"/>
     <w:pPr>
       <w:pBdr>
         <w:top w:val="single" w:sz="4" w:space="10" w:color="0F4761" w:themeColor="accent1" w:themeShade="BF"/>
@@ -2511,7 +2693,7 @@
     <w:basedOn w:val="DefaultParagraphFont"/>
     <w:link w:val="IntenseQuote"/>
     <w:uiPriority w:val="30"/>
-    <w:rsid w:val="0039794A"/>
+    <w:rsid w:val="00E74D9E"/>
     <w:rPr>
       <w:i/>
       <w:iCs/>
@@ -2523,7 +2705,7 @@
     <w:basedOn w:val="DefaultParagraphFont"/>
     <w:uiPriority w:val="32"/>
     <w:qFormat/>
-    <w:rsid w:val="0039794A"/>
+    <w:rsid w:val="00E74D9E"/>
     <w:rPr>
       <w:b/>
       <w:bCs/>
@@ -2538,7 +2720,7 @@
     <w:link w:val="HeaderChar"/>
     <w:uiPriority w:val="99"/>
     <w:unhideWhenUsed/>
-    <w:rsid w:val="0039794A"/>
+    <w:rsid w:val="00E74D9E"/>
     <w:pPr>
       <w:tabs>
         <w:tab w:val="center" w:pos="4680"/>
@@ -2552,7 +2734,7 @@
     <w:basedOn w:val="DefaultParagraphFont"/>
     <w:link w:val="Header"/>
     <w:uiPriority w:val="99"/>
-    <w:rsid w:val="0039794A"/>
+    <w:rsid w:val="00E74D9E"/>
   </w:style>
   <w:style w:type="paragraph" w:styleId="Footer">
     <w:name w:val="footer"/>
@@ -2560,7 +2742,7 @@
     <w:link w:val="FooterChar"/>
     <w:uiPriority w:val="99"/>
     <w:unhideWhenUsed/>
-    <w:rsid w:val="0039794A"/>
+    <w:rsid w:val="00E74D9E"/>
     <w:pPr>
       <w:tabs>
         <w:tab w:val="center" w:pos="4680"/>
@@ -2574,7 +2756,7 @@
     <w:basedOn w:val="DefaultParagraphFont"/>
     <w:link w:val="Footer"/>
     <w:uiPriority w:val="99"/>
-    <w:rsid w:val="0039794A"/>
+    <w:rsid w:val="00E74D9E"/>
   </w:style>
 </w:styles>
 </file>

</xml_diff>

<commit_message>
fix: toggle ContinuePreviousList for sequential list incrementing and update TAB2 col2_is_blank for clean 2-column answer line layout
</commit_message>
<xml_diff>
--- a/output/uln_document.docx
+++ b/output/uln_document.docx
@@ -44,7 +44,7 @@
         <w:pStyle w:val="ListParagraph"/>
         <w:numPr>
           <w:ilvl w:val="0"/>
-          <w:numId w:val="2"/>
+          <w:numId w:val="1"/>
         </w:numPr>
         <w:spacing w:before="120" w:after="80"/>
         <w:rPr>
@@ -148,7 +148,7 @@
         <w:pStyle w:val="ListParagraph"/>
         <w:numPr>
           <w:ilvl w:val="0"/>
-          <w:numId w:val="3"/>
+          <w:numId w:val="2"/>
         </w:numPr>
         <w:spacing w:before="120" w:after="80"/>
         <w:rPr>
@@ -251,7 +251,7 @@
         <w:pStyle w:val="ListParagraph"/>
         <w:numPr>
           <w:ilvl w:val="0"/>
-          <w:numId w:val="4"/>
+          <w:numId w:val="3"/>
         </w:numPr>
         <w:spacing w:before="120" w:after="80"/>
         <w:rPr>
@@ -382,7 +382,7 @@
         <w:pStyle w:val="ListParagraph"/>
         <w:numPr>
           <w:ilvl w:val="0"/>
-          <w:numId w:val="5"/>
+          <w:numId w:val="4"/>
         </w:numPr>
         <w:spacing w:before="120" w:after="80"/>
         <w:rPr>
@@ -485,7 +485,7 @@
         <w:pStyle w:val="ListParagraph"/>
         <w:numPr>
           <w:ilvl w:val="0"/>
-          <w:numId w:val="6"/>
+          <w:numId w:val="5"/>
         </w:numPr>
         <w:spacing w:before="120" w:after="80"/>
         <w:rPr>
@@ -606,7 +606,7 @@
         <mc:AlternateContent>
           <mc:Choice Requires="wps">
             <w:drawing>
-              <wp:anchor distT="0" distB="0" distL="114300" distR="114300" simplePos="0" relativeHeight="251659264" behindDoc="0" locked="0" layoutInCell="1" allowOverlap="1" wp14:anchorId="3B571880" wp14:editId="76E79FD2">
+              <wp:anchor distT="0" distB="0" distL="114300" distR="114300" simplePos="0" relativeHeight="251659264" behindDoc="0" locked="0" layoutInCell="1" allowOverlap="1" wp14:anchorId="39E3E939" wp14:editId="42017EE6">
                 <wp:simplePos x="0" y="0"/>
                 <wp:positionH relativeFrom="margin">
                   <wp:posOffset>1331595</wp:posOffset>
@@ -617,7 +617,7 @@
                 <wp:extent cx="3276600" cy="355600"/>
                 <wp:effectExtent l="0" t="0" r="19050" b="25400"/>
                 <wp:wrapNone/>
-                <wp:docPr id="1692625690" name="Rectangle: Rounded Corners 1"/>
+                <wp:docPr id="961671717" name="Rectangle: Rounded Corners 1"/>
                 <wp:cNvGraphicFramePr/>
                 <a:graphic xmlns:a="http://schemas.openxmlformats.org/drawingml/2006/main">
                   <a:graphicData uri="http://schemas.microsoft.com/office/word/2010/wordprocessingShape">
@@ -680,7 +680,7 @@
           </mc:Choice>
           <mc:Fallback>
             <w:pict>
-              <v:roundrect w14:anchorId="480E7A23" id="Rectangle: Rounded Corners 1" o:spid="_x0000_s1026" style="position:absolute;margin-left:104.85pt;margin-top:-6pt;width:258pt;height:28pt;z-index:251659264;visibility:visible;mso-wrap-style:square;mso-wrap-distance-left:9pt;mso-wrap-distance-top:0;mso-wrap-distance-right:9pt;mso-wrap-distance-bottom:0;mso-position-horizontal:absolute;mso-position-horizontal-relative:margin;mso-position-vertical:absolute;mso-position-vertical-relative:text;v-text-anchor:middle" arcsize="10923f" o:gfxdata="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" filled="f" fillcolor="#156082 [3204]" strokeweight="1pt">
+              <v:roundrect w14:anchorId="15ABF30F" id="Rectangle: Rounded Corners 1" o:spid="_x0000_s1026" style="position:absolute;margin-left:104.85pt;margin-top:-6pt;width:258pt;height:28pt;z-index:251659264;visibility:visible;mso-wrap-style:square;mso-wrap-distance-left:9pt;mso-wrap-distance-top:0;mso-wrap-distance-right:9pt;mso-wrap-distance-bottom:0;mso-position-horizontal:absolute;mso-position-horizontal-relative:margin;mso-position-vertical:absolute;mso-position-vertical-relative:text;v-text-anchor:middle" arcsize="10923f" o:gfxdata="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" filled="f" fillcolor="#156082 [3204]" strokeweight="1pt">
                 <v:stroke joinstyle="miter"/>
                 <w10:wrap anchorx="margin"/>
               </v:roundrect>
@@ -727,7 +727,7 @@
         <w:pStyle w:val="ListParagraph"/>
         <w:numPr>
           <w:ilvl w:val="0"/>
-          <w:numId w:val="8"/>
+          <w:numId w:val="7"/>
         </w:numPr>
         <w:tabs>
           <w:tab w:val="left" w:pos="4137"/>
@@ -855,7 +855,7 @@
         <w:pStyle w:val="ListParagraph"/>
         <w:numPr>
           <w:ilvl w:val="0"/>
-          <w:numId w:val="10"/>
+          <w:numId w:val="9"/>
         </w:numPr>
         <w:spacing w:before="120" w:after="80" w:line="480" w:lineRule="auto"/>
         <w:rPr>
@@ -962,10 +962,9 @@
         <w:pStyle w:val="ListParagraph"/>
         <w:numPr>
           <w:ilvl w:val="0"/>
-          <w:numId w:val="11"/>
+          <w:numId w:val="9"/>
         </w:numPr>
         <w:spacing w:before="60" w:after="60" w:line="240" w:lineRule="auto"/>
-        <w:ind w:left="0" w:firstLine="0"/>
         <w:rPr>
           <w:sz w:val="24"/>
         </w:rPr>
@@ -992,7 +991,7 @@
           <w:sz w:val="24"/>
         </w:rPr>
         <w:drawing>
-          <wp:anchor distT="0" distB="0" distL="114300" distR="114300" simplePos="0" relativeHeight="251660288" behindDoc="0" locked="0" layoutInCell="1" allowOverlap="1" wp14:anchorId="42ED32FF" wp14:editId="3433453B">
+          <wp:anchor distT="0" distB="0" distL="114300" distR="114300" simplePos="0" relativeHeight="251660288" behindDoc="0" locked="0" layoutInCell="1" allowOverlap="1" wp14:anchorId="1BBD8886" wp14:editId="30CF66EB">
             <wp:simplePos x="0" y="0"/>
             <wp:positionH relativeFrom="margin">
               <wp:posOffset>4679950</wp:posOffset>
@@ -1003,7 +1002,7 @@
             <wp:extent cx="1260000" cy="1008000"/>
             <wp:effectExtent l="0" t="0" r="0" b="1905"/>
             <wp:wrapNone/>
-            <wp:docPr id="1183956848" name="Picture 2"/>
+            <wp:docPr id="853730217" name="Picture 2"/>
             <wp:cNvGraphicFramePr>
               <a:graphicFrameLocks xmlns:a="http://schemas.openxmlformats.org/drawingml/2006/main"/>
             </wp:cNvGraphicFramePr>
@@ -1011,11 +1010,11 @@
               <a:graphicData uri="http://schemas.openxmlformats.org/drawingml/2006/picture">
                 <pic:pic xmlns:pic="http://schemas.openxmlformats.org/drawingml/2006/picture">
                   <pic:nvPicPr>
-                    <pic:cNvPr id="1183956848" name=""/>
+                    <pic:cNvPr id="853730217" name=""/>
                     <pic:cNvPicPr/>
                   </pic:nvPicPr>
                   <pic:blipFill>
-                    <a:blip r:embed="rId7" cstate="print">
+                    <a:blip r:embed="rId7">
                       <a:extLst>
                         <a:ext uri="{28A0092B-C50C-407E-A947-70E740481C1C}">
                           <a14:useLocalDpi xmlns:a14="http://schemas.microsoft.com/office/drawing/2010/main" val="0"/>
@@ -1162,85 +1161,78 @@
     </w:p>
     <w:p>
       <w:pPr>
+        <w:tabs>
+          <w:tab w:val="right" w:leader="heavy" w:pos="9354"/>
+        </w:tabs>
+        <w:spacing w:before="60" w:after="60" w:line="240" w:lineRule="auto"/>
+        <w:rPr>
+          <w:sz w:val="24"/>
+        </w:rPr>
+      </w:pPr>
+      <w:r>
+        <w:rPr>
+          <w:sz w:val="24"/>
+        </w:rPr>
+        <w:t xml:space="preserve">Nam is my </w:t>
+      </w:r>
+      <w:r>
+        <w:rPr>
+          <w:sz w:val="24"/>
+          <w:u w:val="single"/>
+        </w:rPr>
+        <w:t>classmates</w:t>
+      </w:r>
+      <w:r>
+        <w:rPr>
+          <w:sz w:val="24"/>
+        </w:rPr>
+        <w:t>. He watches TV every night.</w:t>
+      </w:r>
+      <w:r>
+        <w:rPr>
+          <w:sz w:val="24"/>
+        </w:rPr>
+        <w:tab/>
+      </w:r>
+    </w:p>
+    <w:p>
+      <w:pPr>
+        <w:spacing w:before="120" w:after="80" w:line="240" w:lineRule="auto"/>
+        <w:rPr>
+          <w:b/>
+          <w:sz w:val="24"/>
+        </w:rPr>
+      </w:pPr>
+      <w:r>
+        <w:rPr>
+          <w:b/>
+          <w:sz w:val="24"/>
+        </w:rPr>
+        <w:t>III. SENTENCE TRANSFORMATION</w:t>
+      </w:r>
+    </w:p>
+    <w:p>
+      <w:pPr>
+        <w:spacing w:before="120" w:after="80" w:line="240" w:lineRule="auto"/>
+        <w:rPr>
+          <w:b/>
+          <w:sz w:val="24"/>
+        </w:rPr>
+      </w:pPr>
+      <w:r>
+        <w:rPr>
+          <w:b/>
+          <w:sz w:val="24"/>
+        </w:rPr>
+        <w:t>Complete the second sentence so that it has the same meaning as the first.</w:t>
+      </w:r>
+    </w:p>
+    <w:p>
+      <w:pPr>
         <w:pStyle w:val="ListParagraph"/>
         <w:numPr>
           <w:ilvl w:val="0"/>
           <w:numId w:val="12"/>
-        </w:numPr>
-        <w:tabs>
-          <w:tab w:val="right" w:leader="heavy" w:pos="9354"/>
-        </w:tabs>
-        <w:spacing w:before="60" w:after="60" w:line="240" w:lineRule="auto"/>
-        <w:ind w:left="0" w:firstLine="0"/>
-        <w:rPr>
-          <w:b/>
-          <w:sz w:val="24"/>
-        </w:rPr>
-      </w:pPr>
-      <w:r>
-        <w:rPr>
-          <w:sz w:val="24"/>
-        </w:rPr>
-        <w:t xml:space="preserve">Nam is my </w:t>
-      </w:r>
-      <w:r>
-        <w:rPr>
-          <w:sz w:val="24"/>
-          <w:u w:val="single"/>
-        </w:rPr>
-        <w:t>classmates</w:t>
-      </w:r>
-      <w:r>
-        <w:rPr>
-          <w:sz w:val="24"/>
-        </w:rPr>
-        <w:t>. He watches TV every night.</w:t>
-      </w:r>
-      <w:r>
-        <w:rPr>
-          <w:sz w:val="24"/>
-        </w:rPr>
-        <w:tab/>
-      </w:r>
-    </w:p>
-    <w:p>
-      <w:pPr>
-        <w:spacing w:before="120" w:after="80" w:line="240" w:lineRule="auto"/>
-        <w:rPr>
-          <w:b/>
-          <w:sz w:val="24"/>
-        </w:rPr>
-      </w:pPr>
-      <w:r>
-        <w:rPr>
-          <w:b/>
-          <w:sz w:val="24"/>
-        </w:rPr>
-        <w:t>III. SENTENCE TRANSFORMATION</w:t>
-      </w:r>
-    </w:p>
-    <w:p>
-      <w:pPr>
-        <w:spacing w:before="120" w:after="80" w:line="240" w:lineRule="auto"/>
-        <w:rPr>
-          <w:b/>
-          <w:sz w:val="24"/>
-        </w:rPr>
-      </w:pPr>
-      <w:r>
-        <w:rPr>
-          <w:b/>
-          <w:sz w:val="24"/>
-        </w:rPr>
-        <w:t>Complete the second sentence so that it has the same meaning as the first.</w:t>
-      </w:r>
-    </w:p>
-    <w:p>
-      <w:pPr>
-        <w:pStyle w:val="ListParagraph"/>
-        <w:numPr>
-          <w:ilvl w:val="0"/>
-          <w:numId w:val="14"/>
         </w:numPr>
         <w:spacing w:before="120" w:after="80" w:line="240" w:lineRule="auto"/>
         <w:rPr>
@@ -1493,305 +1485,255 @@
 <file path=word/numbering.xml><?xml version="1.0" encoding="utf-8"?>
 <w:numbering xmlns:wpc="http://schemas.microsoft.com/office/word/2010/wordprocessingCanvas" xmlns:cx="http://schemas.microsoft.com/office/drawing/2014/chartex" xmlns:cx1="http://schemas.microsoft.com/office/drawing/2015/9/8/chartex" xmlns:cx2="http://schemas.microsoft.com/office/drawing/2015/10/21/chartex" xmlns:cx3="http://schemas.microsoft.com/office/drawing/2016/5/9/chartex" xmlns:cx4="http://schemas.microsoft.com/office/drawing/2016/5/10/chartex" xmlns:cx5="http://schemas.microsoft.com/office/drawing/2016/5/11/chartex" xmlns:cx6="http://schemas.microsoft.com/office/drawing/2016/5/12/chartex" xmlns:cx7="http://schemas.microsoft.com/office/drawing/2016/5/13/chartex" xmlns:cx8="http://schemas.microsoft.com/office/drawing/2016/5/14/chartex" xmlns:mc="http://schemas.openxmlformats.org/markup-compatibility/2006" xmlns:aink="http://schemas.microsoft.com/office/drawing/2016/ink" xmlns:am3d="http://schemas.microsoft.com/office/drawing/2017/model3d" xmlns:o="urn:schemas-microsoft-com:office:office" xmlns:oel="http://schemas.microsoft.com/office/2019/extlst" xmlns:r="http://schemas.openxmlformats.org/officeDocument/2006/relationships" xmlns:m="http://schemas.openxmlformats.org/officeDocument/2006/math" xmlns:v="urn:schemas-microsoft-com:vml" xmlns:wp14="http://schemas.microsoft.com/office/word/2010/wordprocessingDrawing" xmlns:wp="http://schemas.openxmlformats.org/drawingml/2006/wordprocessingDrawing" xmlns:w10="urn:schemas-microsoft-com:office:word" xmlns:w="http://schemas.openxmlformats.org/wordprocessingml/2006/main" xmlns:w14="http://schemas.microsoft.com/office/word/2010/wordml" xmlns:w15="http://schemas.microsoft.com/office/word/2012/wordml" xmlns:w16cei="http://schemas.microsoft.com/office/word/2026/wordml/cei" xmlns:w16cex="http://schemas.microsoft.com/office/word/2018/wordml/cex" xmlns:w16cid="http://schemas.microsoft.com/office/word/2016/wordml/cid" xmlns:w16="http://schemas.microsoft.com/office/word/2018/wordml" xmlns:w16du="http://schemas.microsoft.com/office/word/2023/wordml/word16du" xmlns:w16sdtdh="http://schemas.microsoft.com/office/word/2020/wordml/sdtdatahash" xmlns:w16sdtfl="http://schemas.microsoft.com/office/word/2024/wordml/sdtformatlock" xmlns:w16se="http://schemas.microsoft.com/office/word/2015/wordml/symex" xmlns:wpg="http://schemas.microsoft.com/office/word/2010/wordprocessingGroup" xmlns:wpi="http://schemas.microsoft.com/office/word/2010/wordprocessingInk" xmlns:wne="http://schemas.microsoft.com/office/word/2006/wordml" xmlns:wps="http://schemas.microsoft.com/office/word/2010/wordprocessingShape" mc:Ignorable="w14 w15 w16se w16cid w16 w16cex w16sdtdh w16sdtfl w16du wp14">
   <w:abstractNum w:abstractNumId="0" w15:restartNumberingAfterBreak="0">
-    <w:nsid w:val="0AD54344"/>
+    <w:nsid w:val="13F02490"/>
     <w:multiLevelType w:val="singleLevel"/>
-    <w:tmpl w:val="DC9A9A80"/>
+    <w:tmpl w:val="3B940644"/>
     <w:lvl w:ilvl="0">
       <w:start w:val="1"/>
-      <w:numFmt w:val="bullet"/>
+      <w:numFmt w:val="decimal"/>
       <w:suff w:val="nothing"/>
-      <w:lvlText w:val=""/>
+      <w:lvlText w:val="%1."/>
       <w:lvlJc w:val="left"/>
       <w:pPr>
         <w:ind w:left="0" w:firstLine="0"/>
       </w:pPr>
       <w:rPr>
-        <w:rFonts w:ascii="Symbol" w:hAnsi="Symbol" w:hint="default"/>
         <w:b/>
       </w:rPr>
     </w:lvl>
   </w:abstractNum>
   <w:abstractNum w:abstractNumId="1" w15:restartNumberingAfterBreak="0">
-    <w:nsid w:val="0D041160"/>
+    <w:nsid w:val="1A6F52B0"/>
     <w:multiLevelType w:val="singleLevel"/>
-    <w:tmpl w:val="0409000F"/>
+    <w:tmpl w:val="3B940644"/>
     <w:lvl w:ilvl="0">
       <w:start w:val="1"/>
       <w:numFmt w:val="decimal"/>
+      <w:suff w:val="nothing"/>
       <w:lvlText w:val="%1."/>
       <w:lvlJc w:val="left"/>
       <w:pPr>
-        <w:ind w:left="720" w:hanging="360"/>
+        <w:ind w:left="0" w:firstLine="0"/>
       </w:pPr>
       <w:rPr>
-        <w:rFonts w:hint="default"/>
         <w:b/>
       </w:rPr>
     </w:lvl>
   </w:abstractNum>
   <w:abstractNum w:abstractNumId="2" w15:restartNumberingAfterBreak="0">
-    <w:nsid w:val="15DB33D5"/>
+    <w:nsid w:val="251E37A6"/>
     <w:multiLevelType w:val="singleLevel"/>
-    <w:tmpl w:val="DC9A9A80"/>
+    <w:tmpl w:val="3B940644"/>
     <w:lvl w:ilvl="0">
       <w:start w:val="1"/>
-      <w:numFmt w:val="bullet"/>
+      <w:numFmt w:val="decimal"/>
       <w:suff w:val="nothing"/>
-      <w:lvlText w:val=""/>
+      <w:lvlText w:val="%1."/>
       <w:lvlJc w:val="left"/>
       <w:pPr>
         <w:ind w:left="0" w:firstLine="0"/>
       </w:pPr>
       <w:rPr>
-        <w:rFonts w:ascii="Symbol" w:hAnsi="Symbol" w:hint="default"/>
         <w:b/>
       </w:rPr>
     </w:lvl>
   </w:abstractNum>
   <w:abstractNum w:abstractNumId="3" w15:restartNumberingAfterBreak="0">
-    <w:nsid w:val="26913F00"/>
+    <w:nsid w:val="28491FEC"/>
     <w:multiLevelType w:val="singleLevel"/>
-    <w:tmpl w:val="DC9A9A80"/>
+    <w:tmpl w:val="3B940644"/>
     <w:lvl w:ilvl="0">
       <w:start w:val="1"/>
-      <w:numFmt w:val="bullet"/>
+      <w:numFmt w:val="decimal"/>
       <w:suff w:val="nothing"/>
-      <w:lvlText w:val=""/>
+      <w:lvlText w:val="%1."/>
       <w:lvlJc w:val="left"/>
       <w:pPr>
         <w:ind w:left="0" w:firstLine="0"/>
       </w:pPr>
       <w:rPr>
-        <w:rFonts w:ascii="Symbol" w:hAnsi="Symbol" w:hint="default"/>
         <w:b/>
       </w:rPr>
     </w:lvl>
   </w:abstractNum>
   <w:abstractNum w:abstractNumId="4" w15:restartNumberingAfterBreak="0">
-    <w:nsid w:val="32CA2CA9"/>
+    <w:nsid w:val="3A05002A"/>
     <w:multiLevelType w:val="singleLevel"/>
-    <w:tmpl w:val="DC9A9A80"/>
+    <w:tmpl w:val="3B940644"/>
     <w:lvl w:ilvl="0">
       <w:start w:val="1"/>
-      <w:numFmt w:val="bullet"/>
+      <w:numFmt w:val="decimal"/>
       <w:suff w:val="nothing"/>
-      <w:lvlText w:val=""/>
+      <w:lvlText w:val="%1."/>
       <w:lvlJc w:val="left"/>
       <w:pPr>
         <w:ind w:left="0" w:firstLine="0"/>
       </w:pPr>
       <w:rPr>
-        <w:rFonts w:ascii="Symbol" w:hAnsi="Symbol" w:hint="default"/>
         <w:b/>
       </w:rPr>
     </w:lvl>
   </w:abstractNum>
   <w:abstractNum w:abstractNumId="5" w15:restartNumberingAfterBreak="0">
-    <w:nsid w:val="34113E93"/>
+    <w:nsid w:val="3DD0221E"/>
     <w:multiLevelType w:val="singleLevel"/>
-    <w:tmpl w:val="DC9A9A80"/>
+    <w:tmpl w:val="3B940644"/>
     <w:lvl w:ilvl="0">
       <w:start w:val="1"/>
-      <w:numFmt w:val="bullet"/>
+      <w:numFmt w:val="decimal"/>
       <w:suff w:val="nothing"/>
-      <w:lvlText w:val=""/>
+      <w:lvlText w:val="%1."/>
       <w:lvlJc w:val="left"/>
       <w:pPr>
         <w:ind w:left="0" w:firstLine="0"/>
       </w:pPr>
       <w:rPr>
-        <w:rFonts w:ascii="Symbol" w:hAnsi="Symbol" w:hint="default"/>
         <w:b/>
       </w:rPr>
     </w:lvl>
   </w:abstractNum>
   <w:abstractNum w:abstractNumId="6" w15:restartNumberingAfterBreak="0">
-    <w:nsid w:val="35EF4FFB"/>
+    <w:nsid w:val="53883F34"/>
     <w:multiLevelType w:val="singleLevel"/>
-    <w:tmpl w:val="DC9A9A80"/>
+    <w:tmpl w:val="3B940644"/>
     <w:lvl w:ilvl="0">
       <w:start w:val="1"/>
-      <w:numFmt w:val="bullet"/>
+      <w:numFmt w:val="decimal"/>
       <w:suff w:val="nothing"/>
-      <w:lvlText w:val=""/>
+      <w:lvlText w:val="%1."/>
       <w:lvlJc w:val="left"/>
       <w:pPr>
         <w:ind w:left="0" w:firstLine="0"/>
       </w:pPr>
       <w:rPr>
-        <w:rFonts w:ascii="Symbol" w:hAnsi="Symbol" w:hint="default"/>
         <w:b/>
       </w:rPr>
     </w:lvl>
   </w:abstractNum>
   <w:abstractNum w:abstractNumId="7" w15:restartNumberingAfterBreak="0">
-    <w:nsid w:val="396F1999"/>
+    <w:nsid w:val="5EC5689B"/>
     <w:multiLevelType w:val="singleLevel"/>
-    <w:tmpl w:val="DC9A9A80"/>
+    <w:tmpl w:val="3B940644"/>
     <w:lvl w:ilvl="0">
       <w:start w:val="1"/>
-      <w:numFmt w:val="bullet"/>
+      <w:numFmt w:val="decimal"/>
       <w:suff w:val="nothing"/>
-      <w:lvlText w:val=""/>
+      <w:lvlText w:val="%1."/>
       <w:lvlJc w:val="left"/>
       <w:pPr>
         <w:ind w:left="0" w:firstLine="0"/>
       </w:pPr>
       <w:rPr>
-        <w:rFonts w:ascii="Symbol" w:hAnsi="Symbol" w:hint="default"/>
         <w:b/>
       </w:rPr>
     </w:lvl>
   </w:abstractNum>
   <w:abstractNum w:abstractNumId="8" w15:restartNumberingAfterBreak="0">
-    <w:nsid w:val="3A6F6ACD"/>
+    <w:nsid w:val="6B9D311D"/>
     <w:multiLevelType w:val="singleLevel"/>
-    <w:tmpl w:val="DC9A9A80"/>
+    <w:tmpl w:val="3B940644"/>
     <w:lvl w:ilvl="0">
       <w:start w:val="1"/>
-      <w:numFmt w:val="bullet"/>
+      <w:numFmt w:val="decimal"/>
       <w:suff w:val="nothing"/>
-      <w:lvlText w:val=""/>
+      <w:lvlText w:val="%1."/>
       <w:lvlJc w:val="left"/>
       <w:pPr>
         <w:ind w:left="0" w:firstLine="0"/>
       </w:pPr>
       <w:rPr>
-        <w:rFonts w:ascii="Symbol" w:hAnsi="Symbol" w:hint="default"/>
         <w:b/>
       </w:rPr>
     </w:lvl>
   </w:abstractNum>
   <w:abstractNum w:abstractNumId="9" w15:restartNumberingAfterBreak="0">
-    <w:nsid w:val="3CB53EAD"/>
+    <w:nsid w:val="6C263094"/>
     <w:multiLevelType w:val="singleLevel"/>
-    <w:tmpl w:val="DC9A9A80"/>
+    <w:tmpl w:val="3B940644"/>
     <w:lvl w:ilvl="0">
       <w:start w:val="1"/>
-      <w:numFmt w:val="bullet"/>
+      <w:numFmt w:val="decimal"/>
       <w:suff w:val="nothing"/>
-      <w:lvlText w:val=""/>
+      <w:lvlText w:val="%1."/>
       <w:lvlJc w:val="left"/>
       <w:pPr>
         <w:ind w:left="0" w:firstLine="0"/>
       </w:pPr>
       <w:rPr>
-        <w:rFonts w:ascii="Symbol" w:hAnsi="Symbol" w:hint="default"/>
         <w:b/>
       </w:rPr>
     </w:lvl>
   </w:abstractNum>
   <w:abstractNum w:abstractNumId="10" w15:restartNumberingAfterBreak="0">
-    <w:nsid w:val="592815D7"/>
+    <w:nsid w:val="719C4766"/>
     <w:multiLevelType w:val="singleLevel"/>
-    <w:tmpl w:val="DC9A9A80"/>
+    <w:tmpl w:val="3B940644"/>
     <w:lvl w:ilvl="0">
       <w:start w:val="1"/>
-      <w:numFmt w:val="bullet"/>
+      <w:numFmt w:val="decimal"/>
       <w:suff w:val="nothing"/>
-      <w:lvlText w:val=""/>
+      <w:lvlText w:val="%1."/>
       <w:lvlJc w:val="left"/>
       <w:pPr>
         <w:ind w:left="0" w:firstLine="0"/>
       </w:pPr>
       <w:rPr>
-        <w:rFonts w:ascii="Symbol" w:hAnsi="Symbol" w:hint="default"/>
         <w:b/>
       </w:rPr>
     </w:lvl>
   </w:abstractNum>
   <w:abstractNum w:abstractNumId="11" w15:restartNumberingAfterBreak="0">
-    <w:nsid w:val="65233379"/>
+    <w:nsid w:val="721A3070"/>
     <w:multiLevelType w:val="singleLevel"/>
-    <w:tmpl w:val="0409000F"/>
+    <w:tmpl w:val="3B940644"/>
     <w:lvl w:ilvl="0">
       <w:start w:val="1"/>
       <w:numFmt w:val="decimal"/>
+      <w:suff w:val="nothing"/>
       <w:lvlText w:val="%1."/>
       <w:lvlJc w:val="left"/>
       <w:pPr>
-        <w:ind w:left="720" w:hanging="360"/>
-      </w:pPr>
-    </w:lvl>
-  </w:abstractNum>
-  <w:abstractNum w:abstractNumId="12" w15:restartNumberingAfterBreak="0">
-    <w:nsid w:val="72F45BAD"/>
-    <w:multiLevelType w:val="singleLevel"/>
-    <w:tmpl w:val="DC9A9A80"/>
-    <w:lvl w:ilvl="0">
-      <w:start w:val="1"/>
-      <w:numFmt w:val="bullet"/>
-      <w:suff w:val="nothing"/>
-      <w:lvlText w:val=""/>
-      <w:lvlJc w:val="left"/>
-      <w:pPr>
         <w:ind w:left="0" w:firstLine="0"/>
       </w:pPr>
       <w:rPr>
-        <w:rFonts w:ascii="Symbol" w:hAnsi="Symbol" w:hint="default"/>
         <w:b/>
       </w:rPr>
     </w:lvl>
   </w:abstractNum>
-  <w:abstractNum w:abstractNumId="13" w15:restartNumberingAfterBreak="0">
-    <w:nsid w:val="7C7619F1"/>
-    <w:multiLevelType w:val="singleLevel"/>
-    <w:tmpl w:val="DC9A9A80"/>
-    <w:lvl w:ilvl="0">
-      <w:start w:val="1"/>
-      <w:numFmt w:val="bullet"/>
-      <w:suff w:val="nothing"/>
-      <w:lvlText w:val=""/>
-      <w:lvlJc w:val="left"/>
-      <w:pPr>
-        <w:ind w:left="0" w:firstLine="0"/>
-      </w:pPr>
-      <w:rPr>
-        <w:rFonts w:ascii="Symbol" w:hAnsi="Symbol" w:hint="default"/>
-        <w:b/>
-      </w:rPr>
-    </w:lvl>
-  </w:abstractNum>
-  <w:num w:numId="1" w16cid:durableId="268467764">
+  <w:num w:numId="1" w16cid:durableId="1393044150">
+    <w:abstractNumId w:val="4"/>
+  </w:num>
+  <w:num w:numId="2" w16cid:durableId="1217618262">
+    <w:abstractNumId w:val="7"/>
+  </w:num>
+  <w:num w:numId="3" w16cid:durableId="254098353">
+    <w:abstractNumId w:val="3"/>
+  </w:num>
+  <w:num w:numId="4" w16cid:durableId="371075115">
+    <w:abstractNumId w:val="2"/>
+  </w:num>
+  <w:num w:numId="5" w16cid:durableId="866328323">
+    <w:abstractNumId w:val="9"/>
+  </w:num>
+  <w:num w:numId="6" w16cid:durableId="2022848925">
     <w:abstractNumId w:val="10"/>
   </w:num>
-  <w:num w:numId="2" w16cid:durableId="704791267">
-    <w:abstractNumId w:val="9"/>
+  <w:num w:numId="7" w16cid:durableId="249896265">
+    <w:abstractNumId w:val="5"/>
   </w:num>
-  <w:num w:numId="3" w16cid:durableId="373041257">
+  <w:num w:numId="8" w16cid:durableId="1042483880">
+    <w:abstractNumId w:val="11"/>
+  </w:num>
+  <w:num w:numId="9" w16cid:durableId="1650397161">
     <w:abstractNumId w:val="0"/>
   </w:num>
-  <w:num w:numId="4" w16cid:durableId="1687440401">
-    <w:abstractNumId w:val="13"/>
+  <w:num w:numId="10" w16cid:durableId="1070885021">
+    <w:abstractNumId w:val="1"/>
   </w:num>
-  <w:num w:numId="5" w16cid:durableId="1178426932">
+  <w:num w:numId="11" w16cid:durableId="290207889">
     <w:abstractNumId w:val="6"/>
   </w:num>
-  <w:num w:numId="6" w16cid:durableId="1367827887">
-    <w:abstractNumId w:val="4"/>
-  </w:num>
-  <w:num w:numId="7" w16cid:durableId="827131140">
-    <w:abstractNumId w:val="3"/>
-  </w:num>
-  <w:num w:numId="8" w16cid:durableId="1391853911">
-    <w:abstractNumId w:val="2"/>
-  </w:num>
-  <w:num w:numId="9" w16cid:durableId="344018528">
-    <w:abstractNumId w:val="12"/>
-  </w:num>
-  <w:num w:numId="10" w16cid:durableId="1623068947">
-    <w:abstractNumId w:val="5"/>
-  </w:num>
-  <w:num w:numId="11" w16cid:durableId="1373069867">
-    <w:abstractNumId w:val="11"/>
-  </w:num>
-  <w:num w:numId="12" w16cid:durableId="1999766261">
-    <w:abstractNumId w:val="1"/>
-  </w:num>
-  <w:num w:numId="13" w16cid:durableId="221330336">
-    <w:abstractNumId w:val="7"/>
-  </w:num>
-  <w:num w:numId="14" w16cid:durableId="465976381">
+  <w:num w:numId="12" w16cid:durableId="172842833">
     <w:abstractNumId w:val="8"/>
   </w:num>
 </w:numbering>
@@ -2205,7 +2147,7 @@
     <w:link w:val="Heading1Char"/>
     <w:uiPriority w:val="9"/>
     <w:qFormat/>
-    <w:rsid w:val="00E74D9E"/>
+    <w:rsid w:val="00035B5C"/>
     <w:pPr>
       <w:keepNext/>
       <w:keepLines/>
@@ -2228,7 +2170,7 @@
     <w:semiHidden/>
     <w:unhideWhenUsed/>
     <w:qFormat/>
-    <w:rsid w:val="00E74D9E"/>
+    <w:rsid w:val="00035B5C"/>
     <w:pPr>
       <w:keepNext/>
       <w:keepLines/>
@@ -2251,7 +2193,7 @@
     <w:semiHidden/>
     <w:unhideWhenUsed/>
     <w:qFormat/>
-    <w:rsid w:val="00E74D9E"/>
+    <w:rsid w:val="00035B5C"/>
     <w:pPr>
       <w:keepNext/>
       <w:keepLines/>
@@ -2274,7 +2216,7 @@
     <w:semiHidden/>
     <w:unhideWhenUsed/>
     <w:qFormat/>
-    <w:rsid w:val="00E74D9E"/>
+    <w:rsid w:val="00035B5C"/>
     <w:pPr>
       <w:keepNext/>
       <w:keepLines/>
@@ -2297,7 +2239,7 @@
     <w:semiHidden/>
     <w:unhideWhenUsed/>
     <w:qFormat/>
-    <w:rsid w:val="00E74D9E"/>
+    <w:rsid w:val="00035B5C"/>
     <w:pPr>
       <w:keepNext/>
       <w:keepLines/>
@@ -2318,7 +2260,7 @@
     <w:semiHidden/>
     <w:unhideWhenUsed/>
     <w:qFormat/>
-    <w:rsid w:val="00E74D9E"/>
+    <w:rsid w:val="00035B5C"/>
     <w:pPr>
       <w:keepNext/>
       <w:keepLines/>
@@ -2341,7 +2283,7 @@
     <w:semiHidden/>
     <w:unhideWhenUsed/>
     <w:qFormat/>
-    <w:rsid w:val="00E74D9E"/>
+    <w:rsid w:val="00035B5C"/>
     <w:pPr>
       <w:keepNext/>
       <w:keepLines/>
@@ -2362,7 +2304,7 @@
     <w:semiHidden/>
     <w:unhideWhenUsed/>
     <w:qFormat/>
-    <w:rsid w:val="00E74D9E"/>
+    <w:rsid w:val="00035B5C"/>
     <w:pPr>
       <w:keepNext/>
       <w:keepLines/>
@@ -2385,7 +2327,7 @@
     <w:semiHidden/>
     <w:unhideWhenUsed/>
     <w:qFormat/>
-    <w:rsid w:val="00E74D9E"/>
+    <w:rsid w:val="00035B5C"/>
     <w:pPr>
       <w:keepNext/>
       <w:keepLines/>
@@ -2429,7 +2371,7 @@
     <w:basedOn w:val="DefaultParagraphFont"/>
     <w:link w:val="Heading1"/>
     <w:uiPriority w:val="9"/>
-    <w:rsid w:val="00E74D9E"/>
+    <w:rsid w:val="00035B5C"/>
     <w:rPr>
       <w:rFonts w:asciiTheme="majorHAnsi" w:eastAsiaTheme="majorEastAsia" w:hAnsiTheme="majorHAnsi" w:cstheme="majorBidi"/>
       <w:color w:val="0F4761" w:themeColor="accent1" w:themeShade="BF"/>
@@ -2443,7 +2385,7 @@
     <w:link w:val="Heading2"/>
     <w:uiPriority w:val="9"/>
     <w:semiHidden/>
-    <w:rsid w:val="00E74D9E"/>
+    <w:rsid w:val="00035B5C"/>
     <w:rPr>
       <w:rFonts w:asciiTheme="majorHAnsi" w:eastAsiaTheme="majorEastAsia" w:hAnsiTheme="majorHAnsi" w:cstheme="majorBidi"/>
       <w:color w:val="0F4761" w:themeColor="accent1" w:themeShade="BF"/>
@@ -2457,7 +2399,7 @@
     <w:link w:val="Heading3"/>
     <w:uiPriority w:val="9"/>
     <w:semiHidden/>
-    <w:rsid w:val="00E74D9E"/>
+    <w:rsid w:val="00035B5C"/>
     <w:rPr>
       <w:rFonts w:asciiTheme="minorHAnsi" w:eastAsiaTheme="majorEastAsia" w:hAnsiTheme="minorHAnsi" w:cstheme="majorBidi"/>
       <w:color w:val="0F4761" w:themeColor="accent1" w:themeShade="BF"/>
@@ -2471,7 +2413,7 @@
     <w:link w:val="Heading4"/>
     <w:uiPriority w:val="9"/>
     <w:semiHidden/>
-    <w:rsid w:val="00E74D9E"/>
+    <w:rsid w:val="00035B5C"/>
     <w:rPr>
       <w:rFonts w:asciiTheme="minorHAnsi" w:eastAsiaTheme="majorEastAsia" w:hAnsiTheme="minorHAnsi" w:cstheme="majorBidi"/>
       <w:i/>
@@ -2485,7 +2427,7 @@
     <w:link w:val="Heading5"/>
     <w:uiPriority w:val="9"/>
     <w:semiHidden/>
-    <w:rsid w:val="00E74D9E"/>
+    <w:rsid w:val="00035B5C"/>
     <w:rPr>
       <w:rFonts w:asciiTheme="minorHAnsi" w:eastAsiaTheme="majorEastAsia" w:hAnsiTheme="minorHAnsi" w:cstheme="majorBidi"/>
       <w:color w:val="0F4761" w:themeColor="accent1" w:themeShade="BF"/>
@@ -2497,7 +2439,7 @@
     <w:link w:val="Heading6"/>
     <w:uiPriority w:val="9"/>
     <w:semiHidden/>
-    <w:rsid w:val="00E74D9E"/>
+    <w:rsid w:val="00035B5C"/>
     <w:rPr>
       <w:rFonts w:asciiTheme="minorHAnsi" w:eastAsiaTheme="majorEastAsia" w:hAnsiTheme="minorHAnsi" w:cstheme="majorBidi"/>
       <w:i/>
@@ -2511,7 +2453,7 @@
     <w:link w:val="Heading7"/>
     <w:uiPriority w:val="9"/>
     <w:semiHidden/>
-    <w:rsid w:val="00E74D9E"/>
+    <w:rsid w:val="00035B5C"/>
     <w:rPr>
       <w:rFonts w:asciiTheme="minorHAnsi" w:eastAsiaTheme="majorEastAsia" w:hAnsiTheme="minorHAnsi" w:cstheme="majorBidi"/>
       <w:color w:val="595959" w:themeColor="text1" w:themeTint="A6"/>
@@ -2523,7 +2465,7 @@
     <w:link w:val="Heading8"/>
     <w:uiPriority w:val="9"/>
     <w:semiHidden/>
-    <w:rsid w:val="00E74D9E"/>
+    <w:rsid w:val="00035B5C"/>
     <w:rPr>
       <w:rFonts w:asciiTheme="minorHAnsi" w:eastAsiaTheme="majorEastAsia" w:hAnsiTheme="minorHAnsi" w:cstheme="majorBidi"/>
       <w:i/>
@@ -2537,7 +2479,7 @@
     <w:link w:val="Heading9"/>
     <w:uiPriority w:val="9"/>
     <w:semiHidden/>
-    <w:rsid w:val="00E74D9E"/>
+    <w:rsid w:val="00035B5C"/>
     <w:rPr>
       <w:rFonts w:asciiTheme="minorHAnsi" w:eastAsiaTheme="majorEastAsia" w:hAnsiTheme="minorHAnsi" w:cstheme="majorBidi"/>
       <w:color w:val="272727" w:themeColor="text1" w:themeTint="D8"/>
@@ -2550,7 +2492,7 @@
     <w:link w:val="TitleChar"/>
     <w:uiPriority w:val="10"/>
     <w:qFormat/>
-    <w:rsid w:val="00E74D9E"/>
+    <w:rsid w:val="00035B5C"/>
     <w:pPr>
       <w:spacing w:after="80" w:line="240" w:lineRule="auto"/>
       <w:contextualSpacing/>
@@ -2568,7 +2510,7 @@
     <w:basedOn w:val="DefaultParagraphFont"/>
     <w:link w:val="Title"/>
     <w:uiPriority w:val="10"/>
-    <w:rsid w:val="00E74D9E"/>
+    <w:rsid w:val="00035B5C"/>
     <w:rPr>
       <w:rFonts w:asciiTheme="majorHAnsi" w:eastAsiaTheme="majorEastAsia" w:hAnsiTheme="majorHAnsi" w:cstheme="majorBidi"/>
       <w:spacing w:val="-10"/>
@@ -2584,7 +2526,7 @@
     <w:link w:val="SubtitleChar"/>
     <w:uiPriority w:val="11"/>
     <w:qFormat/>
-    <w:rsid w:val="00E74D9E"/>
+    <w:rsid w:val="00035B5C"/>
     <w:pPr>
       <w:numPr>
         <w:ilvl w:val="1"/>
@@ -2603,7 +2545,7 @@
     <w:basedOn w:val="DefaultParagraphFont"/>
     <w:link w:val="Subtitle"/>
     <w:uiPriority w:val="11"/>
-    <w:rsid w:val="00E74D9E"/>
+    <w:rsid w:val="00035B5C"/>
     <w:rPr>
       <w:rFonts w:asciiTheme="minorHAnsi" w:eastAsiaTheme="majorEastAsia" w:hAnsiTheme="minorHAnsi" w:cstheme="majorBidi"/>
       <w:color w:val="595959" w:themeColor="text1" w:themeTint="A6"/>
@@ -2619,7 +2561,7 @@
     <w:link w:val="QuoteChar"/>
     <w:uiPriority w:val="29"/>
     <w:qFormat/>
-    <w:rsid w:val="00E74D9E"/>
+    <w:rsid w:val="00035B5C"/>
     <w:pPr>
       <w:spacing w:before="160"/>
       <w:jc w:val="center"/>
@@ -2635,7 +2577,7 @@
     <w:basedOn w:val="DefaultParagraphFont"/>
     <w:link w:val="Quote"/>
     <w:uiPriority w:val="29"/>
-    <w:rsid w:val="00E74D9E"/>
+    <w:rsid w:val="00035B5C"/>
     <w:rPr>
       <w:i/>
       <w:iCs/>
@@ -2647,7 +2589,7 @@
     <w:basedOn w:val="Normal"/>
     <w:uiPriority w:val="34"/>
     <w:qFormat/>
-    <w:rsid w:val="00E74D9E"/>
+    <w:rsid w:val="00035B5C"/>
     <w:pPr>
       <w:ind w:left="720"/>
       <w:contextualSpacing/>
@@ -2658,7 +2600,7 @@
     <w:basedOn w:val="DefaultParagraphFont"/>
     <w:uiPriority w:val="21"/>
     <w:qFormat/>
-    <w:rsid w:val="00E74D9E"/>
+    <w:rsid w:val="00035B5C"/>
     <w:rPr>
       <w:i/>
       <w:iCs/>
@@ -2672,7 +2614,7 @@
     <w:link w:val="IntenseQuoteChar"/>
     <w:uiPriority w:val="30"/>
     <w:qFormat/>
-    <w:rsid w:val="00E74D9E"/>
+    <w:rsid w:val="00035B5C"/>
     <w:pPr>
       <w:pBdr>
         <w:top w:val="single" w:sz="4" w:space="10" w:color="0F4761" w:themeColor="accent1" w:themeShade="BF"/>
@@ -2693,7 +2635,7 @@
     <w:basedOn w:val="DefaultParagraphFont"/>
     <w:link w:val="IntenseQuote"/>
     <w:uiPriority w:val="30"/>
-    <w:rsid w:val="00E74D9E"/>
+    <w:rsid w:val="00035B5C"/>
     <w:rPr>
       <w:i/>
       <w:iCs/>
@@ -2705,7 +2647,7 @@
     <w:basedOn w:val="DefaultParagraphFont"/>
     <w:uiPriority w:val="32"/>
     <w:qFormat/>
-    <w:rsid w:val="00E74D9E"/>
+    <w:rsid w:val="00035B5C"/>
     <w:rPr>
       <w:b/>
       <w:bCs/>
@@ -2720,7 +2662,7 @@
     <w:link w:val="HeaderChar"/>
     <w:uiPriority w:val="99"/>
     <w:unhideWhenUsed/>
-    <w:rsid w:val="00E74D9E"/>
+    <w:rsid w:val="00035B5C"/>
     <w:pPr>
       <w:tabs>
         <w:tab w:val="center" w:pos="4680"/>
@@ -2734,7 +2676,7 @@
     <w:basedOn w:val="DefaultParagraphFont"/>
     <w:link w:val="Header"/>
     <w:uiPriority w:val="99"/>
-    <w:rsid w:val="00E74D9E"/>
+    <w:rsid w:val="00035B5C"/>
   </w:style>
   <w:style w:type="paragraph" w:styleId="Footer">
     <w:name w:val="footer"/>
@@ -2742,7 +2684,7 @@
     <w:link w:val="FooterChar"/>
     <w:uiPriority w:val="99"/>
     <w:unhideWhenUsed/>
-    <w:rsid w:val="00E74D9E"/>
+    <w:rsid w:val="00035B5C"/>
     <w:pPr>
       <w:tabs>
         <w:tab w:val="center" w:pos="4680"/>
@@ -2756,7 +2698,7 @@
     <w:basedOn w:val="DefaultParagraphFont"/>
     <w:link w:val="Footer"/>
     <w:uiPriority w:val="99"/>
-    <w:rsid w:val="00E74D9E"/>
+    <w:rsid w:val="00035B5C"/>
   </w:style>
 </w:styles>
 </file>

</xml_diff>

<commit_message>
fix: set TrailingCharacter=1 for 'Follow number with: Space' and dynamically scale TAB2 col2 answer line (max 3.5cm) based on longest col1 sentence
</commit_message>
<xml_diff>
--- a/output/uln_document.docx
+++ b/output/uln_document.docx
@@ -148,7 +148,7 @@
         <w:pStyle w:val="ListParagraph"/>
         <w:numPr>
           <w:ilvl w:val="0"/>
-          <w:numId w:val="2"/>
+          <w:numId w:val="1"/>
         </w:numPr>
         <w:spacing w:before="120" w:after="80"/>
         <w:rPr>
@@ -251,7 +251,7 @@
         <w:pStyle w:val="ListParagraph"/>
         <w:numPr>
           <w:ilvl w:val="0"/>
-          <w:numId w:val="3"/>
+          <w:numId w:val="1"/>
         </w:numPr>
         <w:spacing w:before="120" w:after="80"/>
         <w:rPr>
@@ -382,7 +382,7 @@
         <w:pStyle w:val="ListParagraph"/>
         <w:numPr>
           <w:ilvl w:val="0"/>
-          <w:numId w:val="4"/>
+          <w:numId w:val="1"/>
         </w:numPr>
         <w:spacing w:before="120" w:after="80"/>
         <w:rPr>
@@ -485,7 +485,7 @@
         <w:pStyle w:val="ListParagraph"/>
         <w:numPr>
           <w:ilvl w:val="0"/>
-          <w:numId w:val="5"/>
+          <w:numId w:val="1"/>
         </w:numPr>
         <w:spacing w:before="120" w:after="80"/>
         <w:rPr>
@@ -606,7 +606,7 @@
         <mc:AlternateContent>
           <mc:Choice Requires="wps">
             <w:drawing>
-              <wp:anchor distT="0" distB="0" distL="114300" distR="114300" simplePos="0" relativeHeight="251659264" behindDoc="0" locked="0" layoutInCell="1" allowOverlap="1" wp14:anchorId="39E3E939" wp14:editId="42017EE6">
+              <wp:anchor distT="0" distB="0" distL="114300" distR="114300" simplePos="0" relativeHeight="251659264" behindDoc="0" locked="0" layoutInCell="1" allowOverlap="1" wp14:anchorId="4C4C6C22" wp14:editId="7FB87699">
                 <wp:simplePos x="0" y="0"/>
                 <wp:positionH relativeFrom="margin">
                   <wp:posOffset>1331595</wp:posOffset>
@@ -617,7 +617,7 @@
                 <wp:extent cx="3276600" cy="355600"/>
                 <wp:effectExtent l="0" t="0" r="19050" b="25400"/>
                 <wp:wrapNone/>
-                <wp:docPr id="961671717" name="Rectangle: Rounded Corners 1"/>
+                <wp:docPr id="1488707291" name="Rectangle: Rounded Corners 1"/>
                 <wp:cNvGraphicFramePr/>
                 <a:graphic xmlns:a="http://schemas.openxmlformats.org/drawingml/2006/main">
                   <a:graphicData uri="http://schemas.microsoft.com/office/word/2010/wordprocessingShape">
@@ -680,7 +680,7 @@
           </mc:Choice>
           <mc:Fallback>
             <w:pict>
-              <v:roundrect w14:anchorId="15ABF30F" id="Rectangle: Rounded Corners 1" o:spid="_x0000_s1026" style="position:absolute;margin-left:104.85pt;margin-top:-6pt;width:258pt;height:28pt;z-index:251659264;visibility:visible;mso-wrap-style:square;mso-wrap-distance-left:9pt;mso-wrap-distance-top:0;mso-wrap-distance-right:9pt;mso-wrap-distance-bottom:0;mso-position-horizontal:absolute;mso-position-horizontal-relative:margin;mso-position-vertical:absolute;mso-position-vertical-relative:text;v-text-anchor:middle" arcsize="10923f" o:gfxdata="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" filled="f" fillcolor="#156082 [3204]" strokeweight="1pt">
+              <v:roundrect w14:anchorId="0E0B3912" id="Rectangle: Rounded Corners 1" o:spid="_x0000_s1026" style="position:absolute;margin-left:104.85pt;margin-top:-6pt;width:258pt;height:28pt;z-index:251659264;visibility:visible;mso-wrap-style:square;mso-wrap-distance-left:9pt;mso-wrap-distance-top:0;mso-wrap-distance-right:9pt;mso-wrap-distance-bottom:0;mso-position-horizontal:absolute;mso-position-horizontal-relative:margin;mso-position-vertical:absolute;mso-position-vertical-relative:text;v-text-anchor:middle" arcsize="10923f" o:gfxdata="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" filled="f" fillcolor="#156082 [3204]" strokeweight="1pt">
                 <v:stroke joinstyle="miter"/>
                 <w10:wrap anchorx="margin"/>
               </v:roundrect>
@@ -727,7 +727,7 @@
         <w:pStyle w:val="ListParagraph"/>
         <w:numPr>
           <w:ilvl w:val="0"/>
-          <w:numId w:val="7"/>
+          <w:numId w:val="2"/>
         </w:numPr>
         <w:tabs>
           <w:tab w:val="left" w:pos="4137"/>
@@ -855,7 +855,7 @@
         <w:pStyle w:val="ListParagraph"/>
         <w:numPr>
           <w:ilvl w:val="0"/>
-          <w:numId w:val="9"/>
+          <w:numId w:val="3"/>
         </w:numPr>
         <w:spacing w:before="120" w:after="80" w:line="480" w:lineRule="auto"/>
         <w:rPr>
@@ -962,7 +962,7 @@
         <w:pStyle w:val="ListParagraph"/>
         <w:numPr>
           <w:ilvl w:val="0"/>
-          <w:numId w:val="9"/>
+          <w:numId w:val="3"/>
         </w:numPr>
         <w:spacing w:before="60" w:after="60" w:line="240" w:lineRule="auto"/>
         <w:rPr>
@@ -991,7 +991,7 @@
           <w:sz w:val="24"/>
         </w:rPr>
         <w:drawing>
-          <wp:anchor distT="0" distB="0" distL="114300" distR="114300" simplePos="0" relativeHeight="251660288" behindDoc="0" locked="0" layoutInCell="1" allowOverlap="1" wp14:anchorId="1BBD8886" wp14:editId="30CF66EB">
+          <wp:anchor distT="0" distB="0" distL="114300" distR="114300" simplePos="0" relativeHeight="251660288" behindDoc="0" locked="0" layoutInCell="1" allowOverlap="1" wp14:anchorId="592D1526" wp14:editId="00C08145">
             <wp:simplePos x="0" y="0"/>
             <wp:positionH relativeFrom="margin">
               <wp:posOffset>4679950</wp:posOffset>
@@ -1002,7 +1002,7 @@
             <wp:extent cx="1260000" cy="1008000"/>
             <wp:effectExtent l="0" t="0" r="0" b="1905"/>
             <wp:wrapNone/>
-            <wp:docPr id="853730217" name="Picture 2"/>
+            <wp:docPr id="1488864657" name="Picture 2"/>
             <wp:cNvGraphicFramePr>
               <a:graphicFrameLocks xmlns:a="http://schemas.openxmlformats.org/drawingml/2006/main"/>
             </wp:cNvGraphicFramePr>
@@ -1010,7 +1010,7 @@
               <a:graphicData uri="http://schemas.openxmlformats.org/drawingml/2006/picture">
                 <pic:pic xmlns:pic="http://schemas.openxmlformats.org/drawingml/2006/picture">
                   <pic:nvPicPr>
-                    <pic:cNvPr id="853730217" name=""/>
+                    <pic:cNvPr id="1488864657" name=""/>
                     <pic:cNvPicPr/>
                   </pic:nvPicPr>
                   <pic:blipFill>
@@ -1161,78 +1161,85 @@
     </w:p>
     <w:p>
       <w:pPr>
-        <w:tabs>
-          <w:tab w:val="right" w:leader="heavy" w:pos="9354"/>
-        </w:tabs>
-        <w:spacing w:before="60" w:after="60" w:line="240" w:lineRule="auto"/>
-        <w:rPr>
-          <w:sz w:val="24"/>
-        </w:rPr>
-      </w:pPr>
-      <w:r>
-        <w:rPr>
-          <w:sz w:val="24"/>
-        </w:rPr>
-        <w:t xml:space="preserve">Nam is my </w:t>
-      </w:r>
-      <w:r>
-        <w:rPr>
-          <w:sz w:val="24"/>
-          <w:u w:val="single"/>
-        </w:rPr>
-        <w:t>classmates</w:t>
-      </w:r>
-      <w:r>
-        <w:rPr>
-          <w:sz w:val="24"/>
-        </w:rPr>
-        <w:t>. He watches TV every night.</w:t>
-      </w:r>
-      <w:r>
-        <w:rPr>
-          <w:sz w:val="24"/>
-        </w:rPr>
-        <w:tab/>
-      </w:r>
-    </w:p>
-    <w:p>
-      <w:pPr>
-        <w:spacing w:before="120" w:after="80" w:line="240" w:lineRule="auto"/>
-        <w:rPr>
-          <w:b/>
-          <w:sz w:val="24"/>
-        </w:rPr>
-      </w:pPr>
-      <w:r>
-        <w:rPr>
-          <w:b/>
-          <w:sz w:val="24"/>
-        </w:rPr>
-        <w:t>III. SENTENCE TRANSFORMATION</w:t>
-      </w:r>
-    </w:p>
-    <w:p>
-      <w:pPr>
-        <w:spacing w:before="120" w:after="80" w:line="240" w:lineRule="auto"/>
-        <w:rPr>
-          <w:b/>
-          <w:sz w:val="24"/>
-        </w:rPr>
-      </w:pPr>
-      <w:r>
-        <w:rPr>
-          <w:b/>
-          <w:sz w:val="24"/>
-        </w:rPr>
-        <w:t>Complete the second sentence so that it has the same meaning as the first.</w:t>
-      </w:r>
-    </w:p>
-    <w:p>
-      <w:pPr>
         <w:pStyle w:val="ListParagraph"/>
         <w:numPr>
           <w:ilvl w:val="0"/>
-          <w:numId w:val="12"/>
+          <w:numId w:val="4"/>
+        </w:numPr>
+        <w:tabs>
+          <w:tab w:val="left" w:pos="7087"/>
+        </w:tabs>
+        <w:spacing w:before="60" w:after="60" w:line="240" w:lineRule="auto"/>
+        <w:rPr>
+          <w:b/>
+          <w:sz w:val="24"/>
+        </w:rPr>
+      </w:pPr>
+      <w:r>
+        <w:rPr>
+          <w:sz w:val="24"/>
+        </w:rPr>
+        <w:t xml:space="preserve">Nam is my </w:t>
+      </w:r>
+      <w:r>
+        <w:rPr>
+          <w:sz w:val="24"/>
+          <w:u w:val="single"/>
+        </w:rPr>
+        <w:t>classmates</w:t>
+      </w:r>
+      <w:r>
+        <w:rPr>
+          <w:sz w:val="24"/>
+        </w:rPr>
+        <w:t>. He watches TV every night.</w:t>
+      </w:r>
+      <w:r>
+        <w:rPr>
+          <w:sz w:val="24"/>
+        </w:rPr>
+        <w:tab/>
+        <w:t>___________</w:t>
+      </w:r>
+    </w:p>
+    <w:p>
+      <w:pPr>
+        <w:spacing w:before="120" w:after="80" w:line="240" w:lineRule="auto"/>
+        <w:rPr>
+          <w:b/>
+          <w:sz w:val="24"/>
+        </w:rPr>
+      </w:pPr>
+      <w:r>
+        <w:rPr>
+          <w:b/>
+          <w:sz w:val="24"/>
+        </w:rPr>
+        <w:t>III. SENTENCE TRANSFORMATION</w:t>
+      </w:r>
+    </w:p>
+    <w:p>
+      <w:pPr>
+        <w:spacing w:before="120" w:after="80" w:line="240" w:lineRule="auto"/>
+        <w:rPr>
+          <w:b/>
+          <w:sz w:val="24"/>
+        </w:rPr>
+      </w:pPr>
+      <w:r>
+        <w:rPr>
+          <w:b/>
+          <w:sz w:val="24"/>
+        </w:rPr>
+        <w:t>Complete the second sentence so that it has the same meaning as the first.</w:t>
+      </w:r>
+    </w:p>
+    <w:p>
+      <w:pPr>
+        <w:pStyle w:val="ListParagraph"/>
+        <w:numPr>
+          <w:ilvl w:val="0"/>
+          <w:numId w:val="5"/>
         </w:numPr>
         <w:spacing w:before="120" w:after="80" w:line="240" w:lineRule="auto"/>
         <w:rPr>
@@ -1485,9 +1492,9 @@
 <file path=word/numbering.xml><?xml version="1.0" encoding="utf-8"?>
 <w:numbering xmlns:wpc="http://schemas.microsoft.com/office/word/2010/wordprocessingCanvas" xmlns:cx="http://schemas.microsoft.com/office/drawing/2014/chartex" xmlns:cx1="http://schemas.microsoft.com/office/drawing/2015/9/8/chartex" xmlns:cx2="http://schemas.microsoft.com/office/drawing/2015/10/21/chartex" xmlns:cx3="http://schemas.microsoft.com/office/drawing/2016/5/9/chartex" xmlns:cx4="http://schemas.microsoft.com/office/drawing/2016/5/10/chartex" xmlns:cx5="http://schemas.microsoft.com/office/drawing/2016/5/11/chartex" xmlns:cx6="http://schemas.microsoft.com/office/drawing/2016/5/12/chartex" xmlns:cx7="http://schemas.microsoft.com/office/drawing/2016/5/13/chartex" xmlns:cx8="http://schemas.microsoft.com/office/drawing/2016/5/14/chartex" xmlns:mc="http://schemas.openxmlformats.org/markup-compatibility/2006" xmlns:aink="http://schemas.microsoft.com/office/drawing/2016/ink" xmlns:am3d="http://schemas.microsoft.com/office/drawing/2017/model3d" xmlns:o="urn:schemas-microsoft-com:office:office" xmlns:oel="http://schemas.microsoft.com/office/2019/extlst" xmlns:r="http://schemas.openxmlformats.org/officeDocument/2006/relationships" xmlns:m="http://schemas.openxmlformats.org/officeDocument/2006/math" xmlns:v="urn:schemas-microsoft-com:vml" xmlns:wp14="http://schemas.microsoft.com/office/word/2010/wordprocessingDrawing" xmlns:wp="http://schemas.openxmlformats.org/drawingml/2006/wordprocessingDrawing" xmlns:w10="urn:schemas-microsoft-com:office:word" xmlns:w="http://schemas.openxmlformats.org/wordprocessingml/2006/main" xmlns:w14="http://schemas.microsoft.com/office/word/2010/wordml" xmlns:w15="http://schemas.microsoft.com/office/word/2012/wordml" xmlns:w16cei="http://schemas.microsoft.com/office/word/2026/wordml/cei" xmlns:w16cex="http://schemas.microsoft.com/office/word/2018/wordml/cex" xmlns:w16cid="http://schemas.microsoft.com/office/word/2016/wordml/cid" xmlns:w16="http://schemas.microsoft.com/office/word/2018/wordml" xmlns:w16du="http://schemas.microsoft.com/office/word/2023/wordml/word16du" xmlns:w16sdtdh="http://schemas.microsoft.com/office/word/2020/wordml/sdtdatahash" xmlns:w16sdtfl="http://schemas.microsoft.com/office/word/2024/wordml/sdtformatlock" xmlns:w16se="http://schemas.microsoft.com/office/word/2015/wordml/symex" xmlns:wpg="http://schemas.microsoft.com/office/word/2010/wordprocessingGroup" xmlns:wpi="http://schemas.microsoft.com/office/word/2010/wordprocessingInk" xmlns:wne="http://schemas.microsoft.com/office/word/2006/wordml" xmlns:wps="http://schemas.microsoft.com/office/word/2010/wordprocessingShape" mc:Ignorable="w14 w15 w16se w16cid w16 w16cex w16sdtdh w16sdtfl w16du wp14">
   <w:abstractNum w:abstractNumId="0" w15:restartNumberingAfterBreak="0">
-    <w:nsid w:val="13F02490"/>
+    <w:nsid w:val="051A6F6A"/>
     <w:multiLevelType w:val="singleLevel"/>
-    <w:tmpl w:val="3B940644"/>
+    <w:tmpl w:val="F5D0F73C"/>
     <w:lvl w:ilvl="0">
       <w:start w:val="1"/>
       <w:numFmt w:val="decimal"/>
@@ -1503,9 +1510,9 @@
     </w:lvl>
   </w:abstractNum>
   <w:abstractNum w:abstractNumId="1" w15:restartNumberingAfterBreak="0">
-    <w:nsid w:val="1A6F52B0"/>
+    <w:nsid w:val="0E0E68DF"/>
     <w:multiLevelType w:val="singleLevel"/>
-    <w:tmpl w:val="3B940644"/>
+    <w:tmpl w:val="F5D0F73C"/>
     <w:lvl w:ilvl="0">
       <w:start w:val="1"/>
       <w:numFmt w:val="decimal"/>
@@ -1521,9 +1528,9 @@
     </w:lvl>
   </w:abstractNum>
   <w:abstractNum w:abstractNumId="2" w15:restartNumberingAfterBreak="0">
-    <w:nsid w:val="251E37A6"/>
+    <w:nsid w:val="1F693A4E"/>
     <w:multiLevelType w:val="singleLevel"/>
-    <w:tmpl w:val="3B940644"/>
+    <w:tmpl w:val="F5D0F73C"/>
     <w:lvl w:ilvl="0">
       <w:start w:val="1"/>
       <w:numFmt w:val="decimal"/>
@@ -1539,9 +1546,9 @@
     </w:lvl>
   </w:abstractNum>
   <w:abstractNum w:abstractNumId="3" w15:restartNumberingAfterBreak="0">
-    <w:nsid w:val="28491FEC"/>
+    <w:nsid w:val="45C00FFA"/>
     <w:multiLevelType w:val="singleLevel"/>
-    <w:tmpl w:val="3B940644"/>
+    <w:tmpl w:val="F5D0F73C"/>
     <w:lvl w:ilvl="0">
       <w:start w:val="1"/>
       <w:numFmt w:val="decimal"/>
@@ -1557,9 +1564,9 @@
     </w:lvl>
   </w:abstractNum>
   <w:abstractNum w:abstractNumId="4" w15:restartNumberingAfterBreak="0">
-    <w:nsid w:val="3A05002A"/>
+    <w:nsid w:val="7A417528"/>
     <w:multiLevelType w:val="singleLevel"/>
-    <w:tmpl w:val="3B940644"/>
+    <w:tmpl w:val="F5D0F73C"/>
     <w:lvl w:ilvl="0">
       <w:start w:val="1"/>
       <w:numFmt w:val="decimal"/>
@@ -1574,167 +1581,20 @@
       </w:rPr>
     </w:lvl>
   </w:abstractNum>
-  <w:abstractNum w:abstractNumId="5" w15:restartNumberingAfterBreak="0">
-    <w:nsid w:val="3DD0221E"/>
-    <w:multiLevelType w:val="singleLevel"/>
-    <w:tmpl w:val="3B940644"/>
-    <w:lvl w:ilvl="0">
-      <w:start w:val="1"/>
-      <w:numFmt w:val="decimal"/>
-      <w:suff w:val="nothing"/>
-      <w:lvlText w:val="%1."/>
-      <w:lvlJc w:val="left"/>
-      <w:pPr>
-        <w:ind w:left="0" w:firstLine="0"/>
-      </w:pPr>
-      <w:rPr>
-        <w:b/>
-      </w:rPr>
-    </w:lvl>
-  </w:abstractNum>
-  <w:abstractNum w:abstractNumId="6" w15:restartNumberingAfterBreak="0">
-    <w:nsid w:val="53883F34"/>
-    <w:multiLevelType w:val="singleLevel"/>
-    <w:tmpl w:val="3B940644"/>
-    <w:lvl w:ilvl="0">
-      <w:start w:val="1"/>
-      <w:numFmt w:val="decimal"/>
-      <w:suff w:val="nothing"/>
-      <w:lvlText w:val="%1."/>
-      <w:lvlJc w:val="left"/>
-      <w:pPr>
-        <w:ind w:left="0" w:firstLine="0"/>
-      </w:pPr>
-      <w:rPr>
-        <w:b/>
-      </w:rPr>
-    </w:lvl>
-  </w:abstractNum>
-  <w:abstractNum w:abstractNumId="7" w15:restartNumberingAfterBreak="0">
-    <w:nsid w:val="5EC5689B"/>
-    <w:multiLevelType w:val="singleLevel"/>
-    <w:tmpl w:val="3B940644"/>
-    <w:lvl w:ilvl="0">
-      <w:start w:val="1"/>
-      <w:numFmt w:val="decimal"/>
-      <w:suff w:val="nothing"/>
-      <w:lvlText w:val="%1."/>
-      <w:lvlJc w:val="left"/>
-      <w:pPr>
-        <w:ind w:left="0" w:firstLine="0"/>
-      </w:pPr>
-      <w:rPr>
-        <w:b/>
-      </w:rPr>
-    </w:lvl>
-  </w:abstractNum>
-  <w:abstractNum w:abstractNumId="8" w15:restartNumberingAfterBreak="0">
-    <w:nsid w:val="6B9D311D"/>
-    <w:multiLevelType w:val="singleLevel"/>
-    <w:tmpl w:val="3B940644"/>
-    <w:lvl w:ilvl="0">
-      <w:start w:val="1"/>
-      <w:numFmt w:val="decimal"/>
-      <w:suff w:val="nothing"/>
-      <w:lvlText w:val="%1."/>
-      <w:lvlJc w:val="left"/>
-      <w:pPr>
-        <w:ind w:left="0" w:firstLine="0"/>
-      </w:pPr>
-      <w:rPr>
-        <w:b/>
-      </w:rPr>
-    </w:lvl>
-  </w:abstractNum>
-  <w:abstractNum w:abstractNumId="9" w15:restartNumberingAfterBreak="0">
-    <w:nsid w:val="6C263094"/>
-    <w:multiLevelType w:val="singleLevel"/>
-    <w:tmpl w:val="3B940644"/>
-    <w:lvl w:ilvl="0">
-      <w:start w:val="1"/>
-      <w:numFmt w:val="decimal"/>
-      <w:suff w:val="nothing"/>
-      <w:lvlText w:val="%1."/>
-      <w:lvlJc w:val="left"/>
-      <w:pPr>
-        <w:ind w:left="0" w:firstLine="0"/>
-      </w:pPr>
-      <w:rPr>
-        <w:b/>
-      </w:rPr>
-    </w:lvl>
-  </w:abstractNum>
-  <w:abstractNum w:abstractNumId="10" w15:restartNumberingAfterBreak="0">
-    <w:nsid w:val="719C4766"/>
-    <w:multiLevelType w:val="singleLevel"/>
-    <w:tmpl w:val="3B940644"/>
-    <w:lvl w:ilvl="0">
-      <w:start w:val="1"/>
-      <w:numFmt w:val="decimal"/>
-      <w:suff w:val="nothing"/>
-      <w:lvlText w:val="%1."/>
-      <w:lvlJc w:val="left"/>
-      <w:pPr>
-        <w:ind w:left="0" w:firstLine="0"/>
-      </w:pPr>
-      <w:rPr>
-        <w:b/>
-      </w:rPr>
-    </w:lvl>
-  </w:abstractNum>
-  <w:abstractNum w:abstractNumId="11" w15:restartNumberingAfterBreak="0">
-    <w:nsid w:val="721A3070"/>
-    <w:multiLevelType w:val="singleLevel"/>
-    <w:tmpl w:val="3B940644"/>
-    <w:lvl w:ilvl="0">
-      <w:start w:val="1"/>
-      <w:numFmt w:val="decimal"/>
-      <w:suff w:val="nothing"/>
-      <w:lvlText w:val="%1."/>
-      <w:lvlJc w:val="left"/>
-      <w:pPr>
-        <w:ind w:left="0" w:firstLine="0"/>
-      </w:pPr>
-      <w:rPr>
-        <w:b/>
-      </w:rPr>
-    </w:lvl>
-  </w:abstractNum>
-  <w:num w:numId="1" w16cid:durableId="1393044150">
+  <w:num w:numId="1" w16cid:durableId="755632568">
     <w:abstractNumId w:val="4"/>
   </w:num>
-  <w:num w:numId="2" w16cid:durableId="1217618262">
-    <w:abstractNumId w:val="7"/>
+  <w:num w:numId="2" w16cid:durableId="2061324596">
+    <w:abstractNumId w:val="1"/>
   </w:num>
-  <w:num w:numId="3" w16cid:durableId="254098353">
+  <w:num w:numId="3" w16cid:durableId="909387768">
+    <w:abstractNumId w:val="0"/>
+  </w:num>
+  <w:num w:numId="4" w16cid:durableId="1413233288">
     <w:abstractNumId w:val="3"/>
   </w:num>
-  <w:num w:numId="4" w16cid:durableId="371075115">
+  <w:num w:numId="5" w16cid:durableId="477770435">
     <w:abstractNumId w:val="2"/>
-  </w:num>
-  <w:num w:numId="5" w16cid:durableId="866328323">
-    <w:abstractNumId w:val="9"/>
-  </w:num>
-  <w:num w:numId="6" w16cid:durableId="2022848925">
-    <w:abstractNumId w:val="10"/>
-  </w:num>
-  <w:num w:numId="7" w16cid:durableId="249896265">
-    <w:abstractNumId w:val="5"/>
-  </w:num>
-  <w:num w:numId="8" w16cid:durableId="1042483880">
-    <w:abstractNumId w:val="11"/>
-  </w:num>
-  <w:num w:numId="9" w16cid:durableId="1650397161">
-    <w:abstractNumId w:val="0"/>
-  </w:num>
-  <w:num w:numId="10" w16cid:durableId="1070885021">
-    <w:abstractNumId w:val="1"/>
-  </w:num>
-  <w:num w:numId="11" w16cid:durableId="290207889">
-    <w:abstractNumId w:val="6"/>
-  </w:num>
-  <w:num w:numId="12" w16cid:durableId="172842833">
-    <w:abstractNumId w:val="8"/>
   </w:num>
 </w:numbering>
 </file>
@@ -2147,7 +2007,7 @@
     <w:link w:val="Heading1Char"/>
     <w:uiPriority w:val="9"/>
     <w:qFormat/>
-    <w:rsid w:val="00035B5C"/>
+    <w:rsid w:val="00232A5A"/>
     <w:pPr>
       <w:keepNext/>
       <w:keepLines/>
@@ -2170,7 +2030,7 @@
     <w:semiHidden/>
     <w:unhideWhenUsed/>
     <w:qFormat/>
-    <w:rsid w:val="00035B5C"/>
+    <w:rsid w:val="00232A5A"/>
     <w:pPr>
       <w:keepNext/>
       <w:keepLines/>
@@ -2193,7 +2053,7 @@
     <w:semiHidden/>
     <w:unhideWhenUsed/>
     <w:qFormat/>
-    <w:rsid w:val="00035B5C"/>
+    <w:rsid w:val="00232A5A"/>
     <w:pPr>
       <w:keepNext/>
       <w:keepLines/>
@@ -2216,7 +2076,7 @@
     <w:semiHidden/>
     <w:unhideWhenUsed/>
     <w:qFormat/>
-    <w:rsid w:val="00035B5C"/>
+    <w:rsid w:val="00232A5A"/>
     <w:pPr>
       <w:keepNext/>
       <w:keepLines/>
@@ -2239,7 +2099,7 @@
     <w:semiHidden/>
     <w:unhideWhenUsed/>
     <w:qFormat/>
-    <w:rsid w:val="00035B5C"/>
+    <w:rsid w:val="00232A5A"/>
     <w:pPr>
       <w:keepNext/>
       <w:keepLines/>
@@ -2260,7 +2120,7 @@
     <w:semiHidden/>
     <w:unhideWhenUsed/>
     <w:qFormat/>
-    <w:rsid w:val="00035B5C"/>
+    <w:rsid w:val="00232A5A"/>
     <w:pPr>
       <w:keepNext/>
       <w:keepLines/>
@@ -2283,7 +2143,7 @@
     <w:semiHidden/>
     <w:unhideWhenUsed/>
     <w:qFormat/>
-    <w:rsid w:val="00035B5C"/>
+    <w:rsid w:val="00232A5A"/>
     <w:pPr>
       <w:keepNext/>
       <w:keepLines/>
@@ -2304,7 +2164,7 @@
     <w:semiHidden/>
     <w:unhideWhenUsed/>
     <w:qFormat/>
-    <w:rsid w:val="00035B5C"/>
+    <w:rsid w:val="00232A5A"/>
     <w:pPr>
       <w:keepNext/>
       <w:keepLines/>
@@ -2327,7 +2187,7 @@
     <w:semiHidden/>
     <w:unhideWhenUsed/>
     <w:qFormat/>
-    <w:rsid w:val="00035B5C"/>
+    <w:rsid w:val="00232A5A"/>
     <w:pPr>
       <w:keepNext/>
       <w:keepLines/>
@@ -2371,7 +2231,7 @@
     <w:basedOn w:val="DefaultParagraphFont"/>
     <w:link w:val="Heading1"/>
     <w:uiPriority w:val="9"/>
-    <w:rsid w:val="00035B5C"/>
+    <w:rsid w:val="00232A5A"/>
     <w:rPr>
       <w:rFonts w:asciiTheme="majorHAnsi" w:eastAsiaTheme="majorEastAsia" w:hAnsiTheme="majorHAnsi" w:cstheme="majorBidi"/>
       <w:color w:val="0F4761" w:themeColor="accent1" w:themeShade="BF"/>
@@ -2385,7 +2245,7 @@
     <w:link w:val="Heading2"/>
     <w:uiPriority w:val="9"/>
     <w:semiHidden/>
-    <w:rsid w:val="00035B5C"/>
+    <w:rsid w:val="00232A5A"/>
     <w:rPr>
       <w:rFonts w:asciiTheme="majorHAnsi" w:eastAsiaTheme="majorEastAsia" w:hAnsiTheme="majorHAnsi" w:cstheme="majorBidi"/>
       <w:color w:val="0F4761" w:themeColor="accent1" w:themeShade="BF"/>
@@ -2399,7 +2259,7 @@
     <w:link w:val="Heading3"/>
     <w:uiPriority w:val="9"/>
     <w:semiHidden/>
-    <w:rsid w:val="00035B5C"/>
+    <w:rsid w:val="00232A5A"/>
     <w:rPr>
       <w:rFonts w:asciiTheme="minorHAnsi" w:eastAsiaTheme="majorEastAsia" w:hAnsiTheme="minorHAnsi" w:cstheme="majorBidi"/>
       <w:color w:val="0F4761" w:themeColor="accent1" w:themeShade="BF"/>
@@ -2413,7 +2273,7 @@
     <w:link w:val="Heading4"/>
     <w:uiPriority w:val="9"/>
     <w:semiHidden/>
-    <w:rsid w:val="00035B5C"/>
+    <w:rsid w:val="00232A5A"/>
     <w:rPr>
       <w:rFonts w:asciiTheme="minorHAnsi" w:eastAsiaTheme="majorEastAsia" w:hAnsiTheme="minorHAnsi" w:cstheme="majorBidi"/>
       <w:i/>
@@ -2427,7 +2287,7 @@
     <w:link w:val="Heading5"/>
     <w:uiPriority w:val="9"/>
     <w:semiHidden/>
-    <w:rsid w:val="00035B5C"/>
+    <w:rsid w:val="00232A5A"/>
     <w:rPr>
       <w:rFonts w:asciiTheme="minorHAnsi" w:eastAsiaTheme="majorEastAsia" w:hAnsiTheme="minorHAnsi" w:cstheme="majorBidi"/>
       <w:color w:val="0F4761" w:themeColor="accent1" w:themeShade="BF"/>
@@ -2439,7 +2299,7 @@
     <w:link w:val="Heading6"/>
     <w:uiPriority w:val="9"/>
     <w:semiHidden/>
-    <w:rsid w:val="00035B5C"/>
+    <w:rsid w:val="00232A5A"/>
     <w:rPr>
       <w:rFonts w:asciiTheme="minorHAnsi" w:eastAsiaTheme="majorEastAsia" w:hAnsiTheme="minorHAnsi" w:cstheme="majorBidi"/>
       <w:i/>
@@ -2453,7 +2313,7 @@
     <w:link w:val="Heading7"/>
     <w:uiPriority w:val="9"/>
     <w:semiHidden/>
-    <w:rsid w:val="00035B5C"/>
+    <w:rsid w:val="00232A5A"/>
     <w:rPr>
       <w:rFonts w:asciiTheme="minorHAnsi" w:eastAsiaTheme="majorEastAsia" w:hAnsiTheme="minorHAnsi" w:cstheme="majorBidi"/>
       <w:color w:val="595959" w:themeColor="text1" w:themeTint="A6"/>
@@ -2465,7 +2325,7 @@
     <w:link w:val="Heading8"/>
     <w:uiPriority w:val="9"/>
     <w:semiHidden/>
-    <w:rsid w:val="00035B5C"/>
+    <w:rsid w:val="00232A5A"/>
     <w:rPr>
       <w:rFonts w:asciiTheme="minorHAnsi" w:eastAsiaTheme="majorEastAsia" w:hAnsiTheme="minorHAnsi" w:cstheme="majorBidi"/>
       <w:i/>
@@ -2479,7 +2339,7 @@
     <w:link w:val="Heading9"/>
     <w:uiPriority w:val="9"/>
     <w:semiHidden/>
-    <w:rsid w:val="00035B5C"/>
+    <w:rsid w:val="00232A5A"/>
     <w:rPr>
       <w:rFonts w:asciiTheme="minorHAnsi" w:eastAsiaTheme="majorEastAsia" w:hAnsiTheme="minorHAnsi" w:cstheme="majorBidi"/>
       <w:color w:val="272727" w:themeColor="text1" w:themeTint="D8"/>
@@ -2492,7 +2352,7 @@
     <w:link w:val="TitleChar"/>
     <w:uiPriority w:val="10"/>
     <w:qFormat/>
-    <w:rsid w:val="00035B5C"/>
+    <w:rsid w:val="00232A5A"/>
     <w:pPr>
       <w:spacing w:after="80" w:line="240" w:lineRule="auto"/>
       <w:contextualSpacing/>
@@ -2510,7 +2370,7 @@
     <w:basedOn w:val="DefaultParagraphFont"/>
     <w:link w:val="Title"/>
     <w:uiPriority w:val="10"/>
-    <w:rsid w:val="00035B5C"/>
+    <w:rsid w:val="00232A5A"/>
     <w:rPr>
       <w:rFonts w:asciiTheme="majorHAnsi" w:eastAsiaTheme="majorEastAsia" w:hAnsiTheme="majorHAnsi" w:cstheme="majorBidi"/>
       <w:spacing w:val="-10"/>
@@ -2526,7 +2386,7 @@
     <w:link w:val="SubtitleChar"/>
     <w:uiPriority w:val="11"/>
     <w:qFormat/>
-    <w:rsid w:val="00035B5C"/>
+    <w:rsid w:val="00232A5A"/>
     <w:pPr>
       <w:numPr>
         <w:ilvl w:val="1"/>
@@ -2545,7 +2405,7 @@
     <w:basedOn w:val="DefaultParagraphFont"/>
     <w:link w:val="Subtitle"/>
     <w:uiPriority w:val="11"/>
-    <w:rsid w:val="00035B5C"/>
+    <w:rsid w:val="00232A5A"/>
     <w:rPr>
       <w:rFonts w:asciiTheme="minorHAnsi" w:eastAsiaTheme="majorEastAsia" w:hAnsiTheme="minorHAnsi" w:cstheme="majorBidi"/>
       <w:color w:val="595959" w:themeColor="text1" w:themeTint="A6"/>
@@ -2561,7 +2421,7 @@
     <w:link w:val="QuoteChar"/>
     <w:uiPriority w:val="29"/>
     <w:qFormat/>
-    <w:rsid w:val="00035B5C"/>
+    <w:rsid w:val="00232A5A"/>
     <w:pPr>
       <w:spacing w:before="160"/>
       <w:jc w:val="center"/>
@@ -2577,7 +2437,7 @@
     <w:basedOn w:val="DefaultParagraphFont"/>
     <w:link w:val="Quote"/>
     <w:uiPriority w:val="29"/>
-    <w:rsid w:val="00035B5C"/>
+    <w:rsid w:val="00232A5A"/>
     <w:rPr>
       <w:i/>
       <w:iCs/>
@@ -2589,7 +2449,7 @@
     <w:basedOn w:val="Normal"/>
     <w:uiPriority w:val="34"/>
     <w:qFormat/>
-    <w:rsid w:val="00035B5C"/>
+    <w:rsid w:val="00232A5A"/>
     <w:pPr>
       <w:ind w:left="720"/>
       <w:contextualSpacing/>
@@ -2600,7 +2460,7 @@
     <w:basedOn w:val="DefaultParagraphFont"/>
     <w:uiPriority w:val="21"/>
     <w:qFormat/>
-    <w:rsid w:val="00035B5C"/>
+    <w:rsid w:val="00232A5A"/>
     <w:rPr>
       <w:i/>
       <w:iCs/>
@@ -2614,7 +2474,7 @@
     <w:link w:val="IntenseQuoteChar"/>
     <w:uiPriority w:val="30"/>
     <w:qFormat/>
-    <w:rsid w:val="00035B5C"/>
+    <w:rsid w:val="00232A5A"/>
     <w:pPr>
       <w:pBdr>
         <w:top w:val="single" w:sz="4" w:space="10" w:color="0F4761" w:themeColor="accent1" w:themeShade="BF"/>
@@ -2635,7 +2495,7 @@
     <w:basedOn w:val="DefaultParagraphFont"/>
     <w:link w:val="IntenseQuote"/>
     <w:uiPriority w:val="30"/>
-    <w:rsid w:val="00035B5C"/>
+    <w:rsid w:val="00232A5A"/>
     <w:rPr>
       <w:i/>
       <w:iCs/>
@@ -2647,7 +2507,7 @@
     <w:basedOn w:val="DefaultParagraphFont"/>
     <w:uiPriority w:val="32"/>
     <w:qFormat/>
-    <w:rsid w:val="00035B5C"/>
+    <w:rsid w:val="00232A5A"/>
     <w:rPr>
       <w:b/>
       <w:bCs/>
@@ -2662,7 +2522,7 @@
     <w:link w:val="HeaderChar"/>
     <w:uiPriority w:val="99"/>
     <w:unhideWhenUsed/>
-    <w:rsid w:val="00035B5C"/>
+    <w:rsid w:val="00232A5A"/>
     <w:pPr>
       <w:tabs>
         <w:tab w:val="center" w:pos="4680"/>
@@ -2676,7 +2536,7 @@
     <w:basedOn w:val="DefaultParagraphFont"/>
     <w:link w:val="Header"/>
     <w:uiPriority w:val="99"/>
-    <w:rsid w:val="00035B5C"/>
+    <w:rsid w:val="00232A5A"/>
   </w:style>
   <w:style w:type="paragraph" w:styleId="Footer">
     <w:name w:val="footer"/>
@@ -2684,7 +2544,7 @@
     <w:link w:val="FooterChar"/>
     <w:uiPriority w:val="99"/>
     <w:unhideWhenUsed/>
-    <w:rsid w:val="00035B5C"/>
+    <w:rsid w:val="00232A5A"/>
     <w:pPr>
       <w:tabs>
         <w:tab w:val="center" w:pos="4680"/>
@@ -2698,7 +2558,7 @@
     <w:basedOn w:val="DefaultParagraphFont"/>
     <w:link w:val="Footer"/>
     <w:uiPriority w:val="99"/>
-    <w:rsid w:val="00035B5C"/>
+    <w:rsid w:val="00232A5A"/>
   </w:style>
 </w:styles>
 </file>

</xml_diff>